<commit_message>
feat: Thêm sơ đồ Class
</commit_message>
<xml_diff>
--- a/docs/BaoCao/BaoCao.docx
+++ b/docs/BaoCao/BaoCao.docx
@@ -3455,7 +3455,7 @@
         </w:rPr>
         <w:fldChar w:fldCharType="separate"/>
       </w:r>
-      <w:hyperlink w:anchor="_Toc235642702" w:history="1">
+      <w:hyperlink w:anchor="_Toc235724442" w:history="1">
         <w:r>
           <w:rPr>
             <w:rStyle w:val="Hyperlink"/>
@@ -3483,7 +3483,7 @@
             <w:noProof/>
             <w:webHidden/>
           </w:rPr>
-          <w:instrText xml:space="preserve"> PAGEREF _Toc235642702 \h </w:instrText>
+          <w:instrText xml:space="preserve"> PAGEREF _Toc235724442 \h </w:instrText>
         </w:r>
         <w:r>
           <w:rPr>
@@ -3503,7 +3503,77 @@
             <w:noProof/>
             <w:webHidden/>
           </w:rPr>
-          <w:t>19</w:t>
+          <w:t>23</w:t>
+        </w:r>
+        <w:r>
+          <w:rPr>
+            <w:noProof/>
+            <w:webHidden/>
+          </w:rPr>
+          <w:fldChar w:fldCharType="end"/>
+        </w:r>
+      </w:hyperlink>
+    </w:p>
+    <w:p>
+      <w:pPr>
+        <w:pStyle w:val="TableofFigures"/>
+        <w:tabs>
+          <w:tab w:val="right" w:leader="dot" w:pos="9111"/>
+        </w:tabs>
+        <w:rPr>
+          <w:rFonts w:eastAsiaTheme="minorEastAsia"/>
+          <w:noProof/>
+        </w:rPr>
+      </w:pPr>
+      <w:hyperlink w:anchor="_Toc235724443" w:history="1">
+        <w:r>
+          <w:rPr>
+            <w:rStyle w:val="Hyperlink"/>
+            <w:rFonts w:ascii="Times New Roman" w:hAnsi="Times New Roman" w:cs="Times New Roman"/>
+            <w:noProof/>
+          </w:rPr>
+          <w:t>Hình 2: Class Diagram</w:t>
+        </w:r>
+        <w:r>
+          <w:rPr>
+            <w:noProof/>
+            <w:webHidden/>
+          </w:rPr>
+          <w:tab/>
+        </w:r>
+        <w:r>
+          <w:rPr>
+            <w:noProof/>
+            <w:webHidden/>
+          </w:rPr>
+          <w:fldChar w:fldCharType="begin"/>
+        </w:r>
+        <w:r>
+          <w:rPr>
+            <w:noProof/>
+            <w:webHidden/>
+          </w:rPr>
+          <w:instrText xml:space="preserve"> PAGEREF _Toc235724443 \h </w:instrText>
+        </w:r>
+        <w:r>
+          <w:rPr>
+            <w:noProof/>
+            <w:webHidden/>
+          </w:rPr>
+        </w:r>
+        <w:r>
+          <w:rPr>
+            <w:noProof/>
+            <w:webHidden/>
+          </w:rPr>
+          <w:fldChar w:fldCharType="separate"/>
+        </w:r>
+        <w:r>
+          <w:rPr>
+            <w:noProof/>
+            <w:webHidden/>
+          </w:rPr>
+          <w:t>28</w:t>
         </w:r>
         <w:r>
           <w:rPr>
@@ -4360,42 +4430,8 @@
       <w:r>
         <w:fldChar w:fldCharType="end"/>
       </w:r>
-      <w:r>
-        <w:fldChar w:fldCharType="begin"/>
-      </w:r>
-      <w:r>
-        <w:instrText xml:space="preserve"> TOC \h \z \c "B</w:instrText>
-      </w:r>
-      <w:r>
-        <w:instrText>ả</w:instrText>
-      </w:r>
-      <w:r>
-        <w:instrText xml:space="preserve">ng" </w:instrText>
-      </w:r>
-      <w:r>
-        <w:fldChar w:fldCharType="separate"/>
-      </w:r>
-      <w:r>
-        <w:fldChar w:fldCharType="end"/>
-      </w:r>
-      <w:r>
-        <w:fldChar w:fldCharType="begin"/>
-      </w:r>
-      <w:r>
-        <w:instrText xml:space="preserve"> TOC \h \z \c "B</w:instrText>
-      </w:r>
-      <w:r>
-        <w:instrText>ả</w:instrText>
-      </w:r>
-      <w:r>
-        <w:instrText xml:space="preserve">ng" </w:instrText>
-      </w:r>
-      <w:r>
-        <w:fldChar w:fldCharType="separate"/>
-      </w:r>
-      <w:r>
-        <w:fldChar w:fldCharType="end"/>
-      </w:r>
+      <w:fldSimple w:instr=" TOC \h \z \c &quot;Bảng&quot; "/>
+      <w:fldSimple w:instr=" TOC \h \z \c &quot;Bảng&quot; "/>
       <w:r>
         <w:br w:type="page"/>
       </w:r>
@@ -7824,7 +7860,16 @@
           <w:sz w:val="26"/>
           <w:szCs w:val="26"/>
         </w:rPr>
-        <w:t>Prisma hoạt động dựa trên tệp schema.pri</w:t>
+        <w:t xml:space="preserve">Prisma hoạt động dựa trên tệp </w:t>
+      </w:r>
+      <w:proofErr w:type="gramStart"/>
+      <w:r>
+        <w:rPr>
+          <w:rFonts w:ascii="Times New Roman" w:hAnsi="Times New Roman" w:cs="Times New Roman"/>
+          <w:sz w:val="26"/>
+          <w:szCs w:val="26"/>
+        </w:rPr>
+        <w:t>schema.pri</w:t>
       </w:r>
       <w:r>
         <w:rPr>
@@ -7840,7 +7885,16 @@
           <w:sz w:val="26"/>
           <w:szCs w:val="26"/>
         </w:rPr>
-        <w:t xml:space="preserve">ma nơi định nghĩa các Model và thông tin kết nối đến cơ sở dữ liệu. Dựa trên tệp này, Prisma sẽ sinh ra </w:t>
+        <w:t>ma</w:t>
+      </w:r>
+      <w:proofErr w:type="gramEnd"/>
+      <w:r>
+        <w:rPr>
+          <w:rFonts w:ascii="Times New Roman" w:hAnsi="Times New Roman" w:cs="Times New Roman"/>
+          <w:sz w:val="26"/>
+          <w:szCs w:val="26"/>
+        </w:rPr>
+        <w:t xml:space="preserve"> nơi định nghĩa các Model và thông tin kết nối đến cơ sở dữ liệu. Dựa trên tệp này, Prisma sẽ sinh ra </w:t>
       </w:r>
       <w:r>
         <w:rPr>
@@ -9375,7 +9429,7 @@
         </w:rPr>
       </w:pPr>
       <w:bookmarkStart w:id="57" w:name="_Toc235641387"/>
-      <w:bookmarkStart w:id="58" w:name="_Toc235642702"/>
+      <w:bookmarkStart w:id="58" w:name="_Toc235724442"/>
       <w:r>
         <w:rPr>
           <w:rFonts w:ascii="Times New Roman" w:hAnsi="Times New Roman" w:cs="Times New Roman"/>
@@ -9398,7 +9452,7 @@
           <w:sz w:val="26"/>
           <w:szCs w:val="26"/>
         </w:rPr>
-        <w:instrText xml:space="preserve"> SEQ Hình \* ARABIC \s 1 </w:instrText>
+        <w:instrText xml:space="preserve"> SEQ Hình \* ARABIC </w:instrText>
       </w:r>
       <w:r>
         <w:rPr>
@@ -10731,6 +10785,7 @@
         </w:rPr>
         <w:t>UC</w:t>
       </w:r>
+      <w:proofErr w:type="gramStart"/>
       <w:r>
         <w:rPr>
           <w:rFonts w:ascii="Times New Roman" w:hAnsi="Times New Roman" w:cs="Times New Roman"/>
@@ -10753,7 +10808,16 @@
           <w:sz w:val="26"/>
           <w:szCs w:val="26"/>
         </w:rPr>
-        <w:t>Quản lý Lead</w:t>
+        <w:t>Quản</w:t>
+      </w:r>
+      <w:proofErr w:type="gramEnd"/>
+      <w:r>
+        <w:rPr>
+          <w:rFonts w:ascii="Times New Roman" w:hAnsi="Times New Roman" w:cs="Times New Roman"/>
+          <w:sz w:val="26"/>
+          <w:szCs w:val="26"/>
+        </w:rPr>
+        <w:t xml:space="preserve"> lý Lead</w:t>
       </w:r>
       <w:bookmarkEnd w:id="62"/>
     </w:p>
@@ -15064,12 +15128,404 @@
     </w:p>
     <w:p>
       <w:pPr>
-        <w:rPr>
-          <w:rFonts w:ascii="Times New Roman" w:hAnsi="Times New Roman" w:cs="Times New Roman"/>
-          <w:sz w:val="26"/>
-          <w:szCs w:val="26"/>
-        </w:rPr>
-      </w:pPr>
+        <w:keepNext/>
+      </w:pPr>
+      <w:r>
+        <w:rPr>
+          <w:rFonts w:ascii="Times New Roman" w:hAnsi="Times New Roman" w:cs="Times New Roman"/>
+          <w:noProof/>
+          <w:sz w:val="26"/>
+          <w:szCs w:val="26"/>
+        </w:rPr>
+        <w:drawing>
+          <wp:inline distT="0" distB="0" distL="0" distR="0" wp14:anchorId="4128DC87" wp14:editId="34F0435E">
+            <wp:extent cx="5791835" cy="5562600"/>
+            <wp:effectExtent l="0" t="0" r="0" b="0"/>
+            <wp:docPr id="3" name="Picture 3"/>
+            <wp:cNvGraphicFramePr>
+              <a:graphicFrameLocks xmlns:a="http://schemas.openxmlformats.org/drawingml/2006/main" noChangeAspect="1"/>
+            </wp:cNvGraphicFramePr>
+            <a:graphic xmlns:a="http://schemas.openxmlformats.org/drawingml/2006/main">
+              <a:graphicData uri="http://schemas.openxmlformats.org/drawingml/2006/picture">
+                <pic:pic xmlns:pic="http://schemas.openxmlformats.org/drawingml/2006/picture">
+                  <pic:nvPicPr>
+                    <pic:cNvPr id="3" name="Picture 3"/>
+                    <pic:cNvPicPr/>
+                  </pic:nvPicPr>
+                  <pic:blipFill>
+                    <a:blip r:embed="rId10">
+                      <a:extLst>
+                        <a:ext uri="{28A0092B-C50C-407E-A947-70E740481C1C}">
+                          <a14:useLocalDpi xmlns:a14="http://schemas.microsoft.com/office/drawing/2010/main" val="0"/>
+                        </a:ext>
+                      </a:extLst>
+                    </a:blip>
+                    <a:stretch>
+                      <a:fillRect/>
+                    </a:stretch>
+                  </pic:blipFill>
+                  <pic:spPr>
+                    <a:xfrm>
+                      <a:off x="0" y="0"/>
+                      <a:ext cx="5791835" cy="5562600"/>
+                    </a:xfrm>
+                    <a:prstGeom prst="rect">
+                      <a:avLst/>
+                    </a:prstGeom>
+                  </pic:spPr>
+                </pic:pic>
+              </a:graphicData>
+            </a:graphic>
+          </wp:inline>
+        </w:drawing>
+      </w:r>
+    </w:p>
+    <w:p>
+      <w:pPr>
+        <w:pStyle w:val="Caption"/>
+        <w:rPr>
+          <w:rFonts w:ascii="Times New Roman" w:hAnsi="Times New Roman" w:cs="Times New Roman"/>
+          <w:sz w:val="26"/>
+          <w:szCs w:val="26"/>
+        </w:rPr>
+      </w:pPr>
+      <w:bookmarkStart w:id="77" w:name="_Toc235724443"/>
+      <w:r>
+        <w:rPr>
+          <w:rFonts w:ascii="Times New Roman" w:hAnsi="Times New Roman" w:cs="Times New Roman"/>
+          <w:sz w:val="26"/>
+          <w:szCs w:val="26"/>
+        </w:rPr>
+        <w:t xml:space="preserve">Hình </w:t>
+      </w:r>
+      <w:r>
+        <w:rPr>
+          <w:rFonts w:ascii="Times New Roman" w:hAnsi="Times New Roman" w:cs="Times New Roman"/>
+          <w:sz w:val="26"/>
+          <w:szCs w:val="26"/>
+        </w:rPr>
+        <w:fldChar w:fldCharType="begin"/>
+      </w:r>
+      <w:r>
+        <w:rPr>
+          <w:rFonts w:ascii="Times New Roman" w:hAnsi="Times New Roman" w:cs="Times New Roman"/>
+          <w:sz w:val="26"/>
+          <w:szCs w:val="26"/>
+        </w:rPr>
+        <w:instrText xml:space="preserve"> SEQ Hình \* ARABIC </w:instrText>
+      </w:r>
+      <w:r>
+        <w:rPr>
+          <w:rFonts w:ascii="Times New Roman" w:hAnsi="Times New Roman" w:cs="Times New Roman"/>
+          <w:sz w:val="26"/>
+          <w:szCs w:val="26"/>
+        </w:rPr>
+        <w:fldChar w:fldCharType="separate"/>
+      </w:r>
+      <w:r>
+        <w:rPr>
+          <w:rFonts w:ascii="Times New Roman" w:hAnsi="Times New Roman" w:cs="Times New Roman"/>
+          <w:noProof/>
+          <w:sz w:val="26"/>
+          <w:szCs w:val="26"/>
+        </w:rPr>
+        <w:t>2</w:t>
+      </w:r>
+      <w:r>
+        <w:rPr>
+          <w:rFonts w:ascii="Times New Roman" w:hAnsi="Times New Roman" w:cs="Times New Roman"/>
+          <w:sz w:val="26"/>
+          <w:szCs w:val="26"/>
+        </w:rPr>
+        <w:fldChar w:fldCharType="end"/>
+      </w:r>
+      <w:r>
+        <w:rPr>
+          <w:rFonts w:ascii="Times New Roman" w:hAnsi="Times New Roman" w:cs="Times New Roman"/>
+          <w:sz w:val="26"/>
+          <w:szCs w:val="26"/>
+        </w:rPr>
+        <w:t>: Class Diagram</w:t>
+      </w:r>
+      <w:bookmarkEnd w:id="77"/>
+    </w:p>
+    <w:p>
+      <w:pPr>
+        <w:rPr>
+          <w:rFonts w:ascii="Times New Roman" w:hAnsi="Times New Roman" w:cs="Times New Roman"/>
+          <w:sz w:val="26"/>
+          <w:szCs w:val="26"/>
+        </w:rPr>
+      </w:pPr>
+      <w:r>
+        <w:rPr>
+          <w:rFonts w:ascii="Times New Roman" w:hAnsi="Times New Roman" w:cs="Times New Roman"/>
+          <w:sz w:val="26"/>
+          <w:szCs w:val="26"/>
+        </w:rPr>
+        <w:t>Class Diagram mô tả cấu trúc tĩnh của hệ thống CRM, bao gồm các lớp chính: Users, Roles, Leads, Customers, Deals, Quotes, QuoteDetails, Products, Tasks, Activities, Notifications, ActivityLogs. Các lớp này được kết nối với nhau thông qua quan hệ association và comcomposition:</w:t>
+      </w:r>
+    </w:p>
+    <w:p>
+      <w:pPr>
+        <w:pStyle w:val="ListParagraph"/>
+        <w:numPr>
+          <w:ilvl w:val="0"/>
+          <w:numId w:val="1"/>
+        </w:numPr>
+        <w:rPr>
+          <w:rFonts w:ascii="Times New Roman" w:hAnsi="Times New Roman" w:cs="Times New Roman"/>
+          <w:sz w:val="26"/>
+          <w:szCs w:val="26"/>
+        </w:rPr>
+      </w:pPr>
+      <w:r>
+        <w:rPr>
+          <w:rFonts w:ascii="Times New Roman" w:hAnsi="Times New Roman" w:cs="Times New Roman"/>
+          <w:sz w:val="26"/>
+          <w:szCs w:val="26"/>
+        </w:rPr>
+        <w:lastRenderedPageBreak/>
+        <w:t>Roles – Users: có quan hệ one-to-many vì một vai trò có thể được gán cho nhiều người dùng và mỗi người dùng chỉ có một vai trò.</w:t>
+      </w:r>
+    </w:p>
+    <w:p>
+      <w:pPr>
+        <w:pStyle w:val="ListParagraph"/>
+        <w:numPr>
+          <w:ilvl w:val="0"/>
+          <w:numId w:val="1"/>
+        </w:numPr>
+        <w:rPr>
+          <w:rFonts w:ascii="Times New Roman" w:hAnsi="Times New Roman" w:cs="Times New Roman"/>
+          <w:sz w:val="26"/>
+          <w:szCs w:val="26"/>
+        </w:rPr>
+      </w:pPr>
+      <w:r>
+        <w:rPr>
+          <w:rFonts w:ascii="Times New Roman" w:hAnsi="Times New Roman" w:cs="Times New Roman"/>
+          <w:sz w:val="26"/>
+          <w:szCs w:val="26"/>
+        </w:rPr>
+        <w:t>LeadSources – Leads: có quan hệ one-to-many vì một khách hàng tiềm năng có thể đến từ nhiều nguồn.</w:t>
+      </w:r>
+    </w:p>
+    <w:p>
+      <w:pPr>
+        <w:pStyle w:val="ListParagraph"/>
+        <w:numPr>
+          <w:ilvl w:val="0"/>
+          <w:numId w:val="1"/>
+        </w:numPr>
+        <w:rPr>
+          <w:rFonts w:ascii="Times New Roman" w:hAnsi="Times New Roman" w:cs="Times New Roman"/>
+          <w:sz w:val="26"/>
+          <w:szCs w:val="26"/>
+        </w:rPr>
+      </w:pPr>
+      <w:r>
+        <w:rPr>
+          <w:rFonts w:ascii="Times New Roman" w:hAnsi="Times New Roman" w:cs="Times New Roman"/>
+          <w:sz w:val="26"/>
+          <w:szCs w:val="26"/>
+        </w:rPr>
+        <w:t>Leads – Customers: quan hệ 1-</w:t>
+      </w:r>
+      <w:proofErr w:type="gramStart"/>
+      <w:r>
+        <w:rPr>
+          <w:rFonts w:ascii="Times New Roman" w:hAnsi="Times New Roman" w:cs="Times New Roman"/>
+          <w:sz w:val="26"/>
+          <w:szCs w:val="26"/>
+        </w:rPr>
+        <w:t>0..</w:t>
+      </w:r>
+      <w:proofErr w:type="gramEnd"/>
+      <w:r>
+        <w:rPr>
+          <w:rFonts w:ascii="Times New Roman" w:hAnsi="Times New Roman" w:cs="Times New Roman"/>
+          <w:sz w:val="26"/>
+          <w:szCs w:val="26"/>
+        </w:rPr>
+        <w:t>1, một khách hàng tiềm năng có thể được chuyển thành một khách hàng hoặc không.</w:t>
+      </w:r>
+    </w:p>
+    <w:p>
+      <w:pPr>
+        <w:pStyle w:val="ListParagraph"/>
+        <w:numPr>
+          <w:ilvl w:val="0"/>
+          <w:numId w:val="1"/>
+        </w:numPr>
+        <w:rPr>
+          <w:rFonts w:ascii="Times New Roman" w:hAnsi="Times New Roman" w:cs="Times New Roman"/>
+          <w:sz w:val="26"/>
+          <w:szCs w:val="26"/>
+        </w:rPr>
+      </w:pPr>
+      <w:r>
+        <w:rPr>
+          <w:rFonts w:ascii="Times New Roman" w:hAnsi="Times New Roman" w:cs="Times New Roman"/>
+          <w:sz w:val="26"/>
+          <w:szCs w:val="26"/>
+        </w:rPr>
+        <w:t>Customers – Deals: có quan hệ one-to-many vì một khách hàng có thể có nhiều cơ hội bán hàng và một cơ hội bán hàng chỉ thuộc một khách hàng.</w:t>
+      </w:r>
+    </w:p>
+    <w:p>
+      <w:pPr>
+        <w:pStyle w:val="ListParagraph"/>
+        <w:numPr>
+          <w:ilvl w:val="0"/>
+          <w:numId w:val="1"/>
+        </w:numPr>
+        <w:rPr>
+          <w:rFonts w:ascii="Times New Roman" w:hAnsi="Times New Roman" w:cs="Times New Roman"/>
+          <w:sz w:val="26"/>
+          <w:szCs w:val="26"/>
+        </w:rPr>
+      </w:pPr>
+      <w:r>
+        <w:rPr>
+          <w:rFonts w:ascii="Times New Roman" w:hAnsi="Times New Roman" w:cs="Times New Roman"/>
+          <w:sz w:val="26"/>
+          <w:szCs w:val="26"/>
+        </w:rPr>
+        <w:t>PipilineStages – Deals: quan hệ one-to-many vì mỗi cơ hội bán hàng thuộc một Pipeline trong quy trình bán hàng.</w:t>
+      </w:r>
+    </w:p>
+    <w:p>
+      <w:pPr>
+        <w:pStyle w:val="ListParagraph"/>
+        <w:numPr>
+          <w:ilvl w:val="0"/>
+          <w:numId w:val="1"/>
+        </w:numPr>
+        <w:rPr>
+          <w:rFonts w:ascii="Times New Roman" w:hAnsi="Times New Roman" w:cs="Times New Roman"/>
+          <w:sz w:val="26"/>
+          <w:szCs w:val="26"/>
+        </w:rPr>
+      </w:pPr>
+      <w:r>
+        <w:rPr>
+          <w:rFonts w:ascii="Times New Roman" w:hAnsi="Times New Roman" w:cs="Times New Roman"/>
+          <w:sz w:val="26"/>
+          <w:szCs w:val="26"/>
+        </w:rPr>
+        <w:t>Deals – Activities: quan hệ one-to-many vì một cơ hội bán hàng có nhiều hoạt động chăm sóc khách hàng.</w:t>
+      </w:r>
+    </w:p>
+    <w:p>
+      <w:pPr>
+        <w:pStyle w:val="ListParagraph"/>
+        <w:numPr>
+          <w:ilvl w:val="0"/>
+          <w:numId w:val="1"/>
+        </w:numPr>
+        <w:rPr>
+          <w:rFonts w:ascii="Times New Roman" w:hAnsi="Times New Roman" w:cs="Times New Roman"/>
+          <w:sz w:val="26"/>
+          <w:szCs w:val="26"/>
+        </w:rPr>
+      </w:pPr>
+      <w:r>
+        <w:rPr>
+          <w:rFonts w:ascii="Times New Roman" w:hAnsi="Times New Roman" w:cs="Times New Roman"/>
+          <w:sz w:val="26"/>
+          <w:szCs w:val="26"/>
+        </w:rPr>
+        <w:t>Deals – Tasks: quan hệ one-to-many vì một cơ hội bán hàng có nhiều công việc cần làm.</w:t>
+      </w:r>
+    </w:p>
+    <w:p>
+      <w:pPr>
+        <w:pStyle w:val="ListParagraph"/>
+        <w:numPr>
+          <w:ilvl w:val="0"/>
+          <w:numId w:val="1"/>
+        </w:numPr>
+        <w:rPr>
+          <w:rFonts w:ascii="Times New Roman" w:hAnsi="Times New Roman" w:cs="Times New Roman"/>
+          <w:sz w:val="26"/>
+          <w:szCs w:val="26"/>
+        </w:rPr>
+      </w:pPr>
+      <w:r>
+        <w:rPr>
+          <w:rFonts w:ascii="Times New Roman" w:hAnsi="Times New Roman" w:cs="Times New Roman"/>
+          <w:sz w:val="26"/>
+          <w:szCs w:val="26"/>
+        </w:rPr>
+        <w:t>Deals – Quotes: quan hệ one-to-many vì một cơ hội bán hàng có thế tạo nhiều báo giá.</w:t>
+      </w:r>
+    </w:p>
+    <w:p>
+      <w:pPr>
+        <w:pStyle w:val="ListParagraph"/>
+        <w:numPr>
+          <w:ilvl w:val="0"/>
+          <w:numId w:val="1"/>
+        </w:numPr>
+        <w:rPr>
+          <w:rFonts w:ascii="Times New Roman" w:hAnsi="Times New Roman" w:cs="Times New Roman"/>
+          <w:sz w:val="26"/>
+          <w:szCs w:val="26"/>
+        </w:rPr>
+      </w:pPr>
+      <w:r>
+        <w:rPr>
+          <w:rFonts w:ascii="Times New Roman" w:hAnsi="Times New Roman" w:cs="Times New Roman"/>
+          <w:sz w:val="26"/>
+          <w:szCs w:val="26"/>
+        </w:rPr>
+        <w:t>Quotes – QuoteDetails: quan hệ Composition (one-to-many), mỗi báo giá bao gồm nhiều dòng chi tiết báo giá và các dòng này không thể tồn tại nếu không có báo giá.</w:t>
+      </w:r>
+    </w:p>
+    <w:p>
+      <w:pPr>
+        <w:pStyle w:val="ListParagraph"/>
+        <w:numPr>
+          <w:ilvl w:val="0"/>
+          <w:numId w:val="1"/>
+        </w:numPr>
+        <w:rPr>
+          <w:rFonts w:ascii="Times New Roman" w:hAnsi="Times New Roman" w:cs="Times New Roman"/>
+          <w:sz w:val="26"/>
+          <w:szCs w:val="26"/>
+        </w:rPr>
+      </w:pPr>
+      <w:r>
+        <w:rPr>
+          <w:rFonts w:ascii="Times New Roman" w:hAnsi="Times New Roman" w:cs="Times New Roman"/>
+          <w:sz w:val="26"/>
+          <w:szCs w:val="26"/>
+        </w:rPr>
+        <w:t>Products – QuoteDetails: quan hệ one-to-many vì một sản phẩm có thể có trong nhiều dòng báo giá.</w:t>
+      </w:r>
+    </w:p>
+    <w:p>
+      <w:pPr>
+        <w:pStyle w:val="ListParagraph"/>
+        <w:numPr>
+          <w:ilvl w:val="0"/>
+          <w:numId w:val="1"/>
+        </w:numPr>
+        <w:rPr>
+          <w:rFonts w:ascii="Times New Roman" w:hAnsi="Times New Roman" w:cs="Times New Roman"/>
+          <w:sz w:val="26"/>
+          <w:szCs w:val="26"/>
+        </w:rPr>
+      </w:pPr>
+      <w:r>
+        <w:rPr>
+          <w:rFonts w:ascii="Times New Roman" w:hAnsi="Times New Roman" w:cs="Times New Roman"/>
+          <w:sz w:val="26"/>
+          <w:szCs w:val="26"/>
+        </w:rPr>
+        <w:t>Users có quan hệ one-to-many với các bảng Deals, Tasks, Activities, Notifications, ActivityLogs.</w:t>
+      </w:r>
     </w:p>
     <w:p>
       <w:pPr>
@@ -15078,16 +15534,16 @@
           <w:rFonts w:ascii="Times New Roman" w:hAnsi="Times New Roman" w:cs="Times New Roman"/>
         </w:rPr>
       </w:pPr>
-      <w:bookmarkStart w:id="77" w:name="_Toc235563725"/>
-      <w:bookmarkStart w:id="78" w:name="_Toc235682292"/>
+      <w:bookmarkStart w:id="78" w:name="_Toc235563725"/>
+      <w:bookmarkStart w:id="79" w:name="_Toc235682292"/>
       <w:r>
         <w:rPr>
           <w:rFonts w:ascii="Times New Roman" w:hAnsi="Times New Roman" w:cs="Times New Roman"/>
         </w:rPr>
         <w:t>KIẾN TRÚC HỆ THỐNG</w:t>
       </w:r>
-      <w:bookmarkEnd w:id="77"/>
       <w:bookmarkEnd w:id="78"/>
+      <w:bookmarkEnd w:id="79"/>
     </w:p>
     <w:p>
       <w:pPr>
@@ -15105,16 +15561,16 @@
           <w:rFonts w:ascii="Times New Roman" w:hAnsi="Times New Roman" w:cs="Times New Roman"/>
         </w:rPr>
       </w:pPr>
-      <w:bookmarkStart w:id="79" w:name="_Toc235563726"/>
-      <w:bookmarkStart w:id="80" w:name="_Toc235682293"/>
+      <w:bookmarkStart w:id="80" w:name="_Toc235563726"/>
+      <w:bookmarkStart w:id="81" w:name="_Toc235682293"/>
       <w:r>
         <w:rPr>
           <w:rFonts w:ascii="Times New Roman" w:hAnsi="Times New Roman" w:cs="Times New Roman"/>
         </w:rPr>
         <w:t>ERD</w:t>
       </w:r>
-      <w:bookmarkEnd w:id="79"/>
       <w:bookmarkEnd w:id="80"/>
+      <w:bookmarkEnd w:id="81"/>
     </w:p>
     <w:p>
       <w:pPr>
@@ -15132,16 +15588,16 @@
           <w:rFonts w:ascii="Times New Roman" w:hAnsi="Times New Roman" w:cs="Times New Roman"/>
         </w:rPr>
       </w:pPr>
-      <w:bookmarkStart w:id="81" w:name="_Toc235563727"/>
-      <w:bookmarkStart w:id="82" w:name="_Toc235682294"/>
+      <w:bookmarkStart w:id="82" w:name="_Toc235563727"/>
+      <w:bookmarkStart w:id="83" w:name="_Toc235682294"/>
       <w:r>
         <w:rPr>
           <w:rFonts w:ascii="Times New Roman" w:hAnsi="Times New Roman" w:cs="Times New Roman"/>
         </w:rPr>
         <w:t>WIREFRAME</w:t>
       </w:r>
-      <w:bookmarkEnd w:id="81"/>
       <w:bookmarkEnd w:id="82"/>
+      <w:bookmarkEnd w:id="83"/>
     </w:p>
     <w:p>
       <w:pPr>
@@ -15177,8 +15633,8 @@
           <w:rFonts w:ascii="Times New Roman" w:hAnsi="Times New Roman" w:cs="Times New Roman"/>
         </w:rPr>
       </w:pPr>
-      <w:bookmarkStart w:id="83" w:name="_Toc235563729"/>
-      <w:bookmarkStart w:id="84" w:name="_Toc235682295"/>
+      <w:bookmarkStart w:id="84" w:name="_Toc235563729"/>
+      <w:bookmarkStart w:id="85" w:name="_Toc235682295"/>
       <w:r>
         <w:rPr>
           <w:rFonts w:ascii="Times New Roman" w:hAnsi="Times New Roman" w:cs="Times New Roman"/>
@@ -15186,8 +15642,8 @@
         <w:lastRenderedPageBreak/>
         <w:t>TÀI LIỆU THAM KHẢO</w:t>
       </w:r>
-      <w:bookmarkEnd w:id="83"/>
       <w:bookmarkEnd w:id="84"/>
+      <w:bookmarkEnd w:id="85"/>
     </w:p>
     <w:p>
       <w:pPr>
@@ -15199,7 +15655,7 @@
           <w:szCs w:val="26"/>
         </w:rPr>
       </w:pPr>
-      <w:hyperlink r:id="rId10" w:history="1">
+      <w:hyperlink r:id="rId11" w:history="1">
         <w:r>
           <w:rPr>
             <w:rStyle w:val="Hyperlink"/>
@@ -15218,12 +15674,26 @@
           <w:szCs w:val="26"/>
         </w:rPr>
       </w:pPr>
-      <w:hyperlink r:id="rId11" w:history="1">
+      <w:hyperlink r:id="rId12" w:history="1">
         <w:r>
           <w:rPr>
             <w:rStyle w:val="Hyperlink"/>
           </w:rPr>
-          <w:t>clauderic/dnd-kit: The modern toolkit for building drag and drop interfaces</w:t>
+          <w:t xml:space="preserve">clauderic/dnd-kit: The modern toolkit for building </w:t>
+        </w:r>
+        <w:proofErr w:type="gramStart"/>
+        <w:r>
+          <w:rPr>
+            <w:rStyle w:val="Hyperlink"/>
+          </w:rPr>
+          <w:t>drag</w:t>
+        </w:r>
+        <w:proofErr w:type="gramEnd"/>
+        <w:r>
+          <w:rPr>
+            <w:rStyle w:val="Hyperlink"/>
+          </w:rPr>
+          <w:t xml:space="preserve"> and drop interfaces</w:t>
         </w:r>
       </w:hyperlink>
     </w:p>
@@ -15237,7 +15707,7 @@
           <w:szCs w:val="26"/>
         </w:rPr>
       </w:pPr>
-      <w:hyperlink r:id="rId12" w:history="1">
+      <w:hyperlink r:id="rId13" w:history="1">
         <w:r>
           <w:rPr>
             <w:rStyle w:val="Hyperlink"/>
@@ -15256,7 +15726,7 @@
           <w:szCs w:val="26"/>
         </w:rPr>
       </w:pPr>
-      <w:hyperlink r:id="rId13" w:history="1">
+      <w:hyperlink r:id="rId14" w:history="1">
         <w:r>
           <w:rPr>
             <w:rStyle w:val="Hyperlink"/>
@@ -15275,7 +15745,7 @@
           <w:szCs w:val="26"/>
         </w:rPr>
       </w:pPr>
-      <w:hyperlink r:id="rId14" w:history="1">
+      <w:hyperlink r:id="rId15" w:history="1">
         <w:r>
           <w:rPr>
             <w:rStyle w:val="Hyperlink"/>
@@ -15289,7 +15759,7 @@
         <w:spacing w:line="360" w:lineRule="auto"/>
         <w:ind w:left="360"/>
       </w:pPr>
-      <w:hyperlink r:id="rId15" w:history="1">
+      <w:hyperlink r:id="rId16" w:history="1">
         <w:r>
           <w:rPr>
             <w:rStyle w:val="Hyperlink"/>
@@ -15309,7 +15779,7 @@
       </w:pPr>
     </w:p>
     <w:sectPr>
-      <w:headerReference w:type="default" r:id="rId16"/>
+      <w:headerReference w:type="default" r:id="rId17"/>
       <w:pgSz w:w="12240" w:h="15840"/>
       <w:pgMar w:top="1134" w:right="1134" w:bottom="1134" w:left="1985" w:header="720" w:footer="720" w:gutter="0"/>
       <w:cols w:space="720"/>

</xml_diff>

<commit_message>
feat: cập nhật ERD
</commit_message>
<xml_diff>
--- a/docs/BaoCao/BaoCao.docx
+++ b/docs/BaoCao/BaoCao.docx
@@ -3455,7 +3455,7 @@
         </w:rPr>
         <w:fldChar w:fldCharType="separate"/>
       </w:r>
-      <w:hyperlink w:anchor="_Toc235724442" w:history="1">
+      <w:hyperlink w:anchor="_Toc235727304" w:history="1">
         <w:r>
           <w:rPr>
             <w:rStyle w:val="Hyperlink"/>
@@ -3483,7 +3483,7 @@
             <w:noProof/>
             <w:webHidden/>
           </w:rPr>
-          <w:instrText xml:space="preserve"> PAGEREF _Toc235724442 \h </w:instrText>
+          <w:instrText xml:space="preserve"> PAGEREF _Toc235727304 \h </w:instrText>
         </w:r>
         <w:r>
           <w:rPr>
@@ -3525,7 +3525,7 @@
           <w:noProof/>
         </w:rPr>
       </w:pPr>
-      <w:hyperlink w:anchor="_Toc235724443" w:history="1">
+      <w:hyperlink w:anchor="_Toc235727305" w:history="1">
         <w:r>
           <w:rPr>
             <w:rStyle w:val="Hyperlink"/>
@@ -3553,7 +3553,7 @@
             <w:noProof/>
             <w:webHidden/>
           </w:rPr>
-          <w:instrText xml:space="preserve"> PAGEREF _Toc235724443 \h </w:instrText>
+          <w:instrText xml:space="preserve"> PAGEREF _Toc235727305 \h </w:instrText>
         </w:r>
         <w:r>
           <w:rPr>
@@ -3574,6 +3574,76 @@
             <w:webHidden/>
           </w:rPr>
           <w:t>28</w:t>
+        </w:r>
+        <w:r>
+          <w:rPr>
+            <w:noProof/>
+            <w:webHidden/>
+          </w:rPr>
+          <w:fldChar w:fldCharType="end"/>
+        </w:r>
+      </w:hyperlink>
+    </w:p>
+    <w:p>
+      <w:pPr>
+        <w:pStyle w:val="TableofFigures"/>
+        <w:tabs>
+          <w:tab w:val="right" w:leader="dot" w:pos="9111"/>
+        </w:tabs>
+        <w:rPr>
+          <w:rFonts w:eastAsiaTheme="minorEastAsia"/>
+          <w:noProof/>
+        </w:rPr>
+      </w:pPr>
+      <w:hyperlink w:anchor="_Toc235727306" w:history="1">
+        <w:r>
+          <w:rPr>
+            <w:rStyle w:val="Hyperlink"/>
+            <w:rFonts w:ascii="Times New Roman" w:hAnsi="Times New Roman" w:cs="Times New Roman"/>
+            <w:noProof/>
+          </w:rPr>
+          <w:t>Hình 3: Entity Relationshop Diagram</w:t>
+        </w:r>
+        <w:r>
+          <w:rPr>
+            <w:noProof/>
+            <w:webHidden/>
+          </w:rPr>
+          <w:tab/>
+        </w:r>
+        <w:r>
+          <w:rPr>
+            <w:noProof/>
+            <w:webHidden/>
+          </w:rPr>
+          <w:fldChar w:fldCharType="begin"/>
+        </w:r>
+        <w:r>
+          <w:rPr>
+            <w:noProof/>
+            <w:webHidden/>
+          </w:rPr>
+          <w:instrText xml:space="preserve"> PAGEREF _Toc235727306 \h </w:instrText>
+        </w:r>
+        <w:r>
+          <w:rPr>
+            <w:noProof/>
+            <w:webHidden/>
+          </w:rPr>
+        </w:r>
+        <w:r>
+          <w:rPr>
+            <w:noProof/>
+            <w:webHidden/>
+          </w:rPr>
+          <w:fldChar w:fldCharType="separate"/>
+        </w:r>
+        <w:r>
+          <w:rPr>
+            <w:noProof/>
+            <w:webHidden/>
+          </w:rPr>
+          <w:t>30</w:t>
         </w:r>
         <w:r>
           <w:rPr>
@@ -4430,8 +4500,42 @@
       <w:r>
         <w:fldChar w:fldCharType="end"/>
       </w:r>
-      <w:fldSimple w:instr=" TOC \h \z \c &quot;Bảng&quot; "/>
-      <w:fldSimple w:instr=" TOC \h \z \c &quot;Bảng&quot; "/>
+      <w:r>
+        <w:fldChar w:fldCharType="begin"/>
+      </w:r>
+      <w:r>
+        <w:instrText xml:space="preserve"> TOC \h \z \c "B</w:instrText>
+      </w:r>
+      <w:r>
+        <w:instrText>ả</w:instrText>
+      </w:r>
+      <w:r>
+        <w:instrText xml:space="preserve">ng" </w:instrText>
+      </w:r>
+      <w:r>
+        <w:fldChar w:fldCharType="separate"/>
+      </w:r>
+      <w:r>
+        <w:fldChar w:fldCharType="end"/>
+      </w:r>
+      <w:r>
+        <w:fldChar w:fldCharType="begin"/>
+      </w:r>
+      <w:r>
+        <w:instrText xml:space="preserve"> TOC \h \z \c "B</w:instrText>
+      </w:r>
+      <w:r>
+        <w:instrText>ả</w:instrText>
+      </w:r>
+      <w:r>
+        <w:instrText xml:space="preserve">ng" </w:instrText>
+      </w:r>
+      <w:r>
+        <w:fldChar w:fldCharType="separate"/>
+      </w:r>
+      <w:r>
+        <w:fldChar w:fldCharType="end"/>
+      </w:r>
       <w:r>
         <w:br w:type="page"/>
       </w:r>
@@ -7860,16 +7964,7 @@
           <w:sz w:val="26"/>
           <w:szCs w:val="26"/>
         </w:rPr>
-        <w:t xml:space="preserve">Prisma hoạt động dựa trên tệp </w:t>
-      </w:r>
-      <w:proofErr w:type="gramStart"/>
-      <w:r>
-        <w:rPr>
-          <w:rFonts w:ascii="Times New Roman" w:hAnsi="Times New Roman" w:cs="Times New Roman"/>
-          <w:sz w:val="26"/>
-          <w:szCs w:val="26"/>
-        </w:rPr>
-        <w:t>schema.pri</w:t>
+        <w:t>Prisma hoạt động dựa trên tệp schema.pri</w:t>
       </w:r>
       <w:r>
         <w:rPr>
@@ -7885,16 +7980,7 @@
           <w:sz w:val="26"/>
           <w:szCs w:val="26"/>
         </w:rPr>
-        <w:t>ma</w:t>
-      </w:r>
-      <w:proofErr w:type="gramEnd"/>
-      <w:r>
-        <w:rPr>
-          <w:rFonts w:ascii="Times New Roman" w:hAnsi="Times New Roman" w:cs="Times New Roman"/>
-          <w:sz w:val="26"/>
-          <w:szCs w:val="26"/>
-        </w:rPr>
-        <w:t xml:space="preserve"> nơi định nghĩa các Model và thông tin kết nối đến cơ sở dữ liệu. Dựa trên tệp này, Prisma sẽ sinh ra </w:t>
+        <w:t xml:space="preserve">ma nơi định nghĩa các Model và thông tin kết nối đến cơ sở dữ liệu. Dựa trên tệp này, Prisma sẽ sinh ra </w:t>
       </w:r>
       <w:r>
         <w:rPr>
@@ -9429,7 +9515,7 @@
         </w:rPr>
       </w:pPr>
       <w:bookmarkStart w:id="57" w:name="_Toc235641387"/>
-      <w:bookmarkStart w:id="58" w:name="_Toc235724442"/>
+      <w:bookmarkStart w:id="58" w:name="_Toc235727304"/>
       <w:r>
         <w:rPr>
           <w:rFonts w:ascii="Times New Roman" w:hAnsi="Times New Roman" w:cs="Times New Roman"/>
@@ -10785,7 +10871,6 @@
         </w:rPr>
         <w:t>UC</w:t>
       </w:r>
-      <w:proofErr w:type="gramStart"/>
       <w:r>
         <w:rPr>
           <w:rFonts w:ascii="Times New Roman" w:hAnsi="Times New Roman" w:cs="Times New Roman"/>
@@ -10808,16 +10893,7 @@
           <w:sz w:val="26"/>
           <w:szCs w:val="26"/>
         </w:rPr>
-        <w:t>Quản</w:t>
-      </w:r>
-      <w:proofErr w:type="gramEnd"/>
-      <w:r>
-        <w:rPr>
-          <w:rFonts w:ascii="Times New Roman" w:hAnsi="Times New Roman" w:cs="Times New Roman"/>
-          <w:sz w:val="26"/>
-          <w:szCs w:val="26"/>
-        </w:rPr>
-        <w:t xml:space="preserve"> lý Lead</w:t>
+        <w:t>Quản lý Lead</w:t>
       </w:r>
       <w:bookmarkEnd w:id="62"/>
     </w:p>
@@ -15189,7 +15265,7 @@
           <w:szCs w:val="26"/>
         </w:rPr>
       </w:pPr>
-      <w:bookmarkStart w:id="77" w:name="_Toc235724443"/>
+      <w:bookmarkStart w:id="77" w:name="_Toc235727305"/>
       <w:r>
         <w:rPr>
           <w:rFonts w:ascii="Times New Roman" w:hAnsi="Times New Roman" w:cs="Times New Roman"/>
@@ -15330,25 +15406,7 @@
           <w:sz w:val="26"/>
           <w:szCs w:val="26"/>
         </w:rPr>
-        <w:t>Leads – Customers: quan hệ 1-</w:t>
-      </w:r>
-      <w:proofErr w:type="gramStart"/>
-      <w:r>
-        <w:rPr>
-          <w:rFonts w:ascii="Times New Roman" w:hAnsi="Times New Roman" w:cs="Times New Roman"/>
-          <w:sz w:val="26"/>
-          <w:szCs w:val="26"/>
-        </w:rPr>
-        <w:t>0..</w:t>
-      </w:r>
-      <w:proofErr w:type="gramEnd"/>
-      <w:r>
-        <w:rPr>
-          <w:rFonts w:ascii="Times New Roman" w:hAnsi="Times New Roman" w:cs="Times New Roman"/>
-          <w:sz w:val="26"/>
-          <w:szCs w:val="26"/>
-        </w:rPr>
-        <w:t>1, một khách hàng tiềm năng có thể được chuyển thành một khách hàng hoặc không.</w:t>
+        <w:t>Leads – Customers: quan hệ 1-0..1, một khách hàng tiềm năng có thể được chuyển thành một khách hàng hoặc không.</w:t>
       </w:r>
     </w:p>
     <w:p>
@@ -15561,43 +15619,188 @@
           <w:rFonts w:ascii="Times New Roman" w:hAnsi="Times New Roman" w:cs="Times New Roman"/>
         </w:rPr>
       </w:pPr>
-      <w:bookmarkStart w:id="80" w:name="_Toc235563726"/>
-      <w:bookmarkStart w:id="81" w:name="_Toc235682293"/>
-      <w:r>
-        <w:rPr>
-          <w:rFonts w:ascii="Times New Roman" w:hAnsi="Times New Roman" w:cs="Times New Roman"/>
-        </w:rPr>
-        <w:t>ERD</w:t>
+      <w:r>
+        <w:rPr>
+          <w:rFonts w:ascii="Times New Roman" w:hAnsi="Times New Roman" w:cs="Times New Roman"/>
+        </w:rPr>
+        <w:lastRenderedPageBreak/>
+        <w:t>ENTITY RELATIONSHIP DIAGRAM</w:t>
+      </w:r>
+    </w:p>
+    <w:p>
+      <w:pPr>
+        <w:keepNext/>
+      </w:pPr>
+      <w:r>
+        <w:rPr>
+          <w:rFonts w:ascii="Times New Roman" w:hAnsi="Times New Roman" w:cs="Times New Roman"/>
+          <w:noProof/>
+          <w:sz w:val="26"/>
+          <w:szCs w:val="26"/>
+        </w:rPr>
+        <w:drawing>
+          <wp:inline distT="0" distB="0" distL="0" distR="0" wp14:anchorId="5843E903" wp14:editId="09492068">
+            <wp:extent cx="5791835" cy="4128770"/>
+            <wp:effectExtent l="0" t="0" r="0" b="5080"/>
+            <wp:docPr id="4" name="Picture 4"/>
+            <wp:cNvGraphicFramePr>
+              <a:graphicFrameLocks xmlns:a="http://schemas.openxmlformats.org/drawingml/2006/main" noChangeAspect="1"/>
+            </wp:cNvGraphicFramePr>
+            <a:graphic xmlns:a="http://schemas.openxmlformats.org/drawingml/2006/main">
+              <a:graphicData uri="http://schemas.openxmlformats.org/drawingml/2006/picture">
+                <pic:pic xmlns:pic="http://schemas.openxmlformats.org/drawingml/2006/picture">
+                  <pic:nvPicPr>
+                    <pic:cNvPr id="4" name="Picture 4"/>
+                    <pic:cNvPicPr/>
+                  </pic:nvPicPr>
+                  <pic:blipFill>
+                    <a:blip r:embed="rId11" cstate="print">
+                      <a:extLst>
+                        <a:ext uri="{28A0092B-C50C-407E-A947-70E740481C1C}">
+                          <a14:useLocalDpi xmlns:a14="http://schemas.microsoft.com/office/drawing/2010/main" val="0"/>
+                        </a:ext>
+                      </a:extLst>
+                    </a:blip>
+                    <a:stretch>
+                      <a:fillRect/>
+                    </a:stretch>
+                  </pic:blipFill>
+                  <pic:spPr>
+                    <a:xfrm>
+                      <a:off x="0" y="0"/>
+                      <a:ext cx="5791835" cy="4128770"/>
+                    </a:xfrm>
+                    <a:prstGeom prst="rect">
+                      <a:avLst/>
+                    </a:prstGeom>
+                  </pic:spPr>
+                </pic:pic>
+              </a:graphicData>
+            </a:graphic>
+          </wp:inline>
+        </w:drawing>
+      </w:r>
+    </w:p>
+    <w:p>
+      <w:pPr>
+        <w:pStyle w:val="Caption"/>
+        <w:rPr>
+          <w:rFonts w:ascii="Times New Roman" w:hAnsi="Times New Roman" w:cs="Times New Roman"/>
+          <w:sz w:val="26"/>
+          <w:szCs w:val="26"/>
+        </w:rPr>
+      </w:pPr>
+      <w:bookmarkStart w:id="80" w:name="_Toc235727306"/>
+      <w:r>
+        <w:rPr>
+          <w:rFonts w:ascii="Times New Roman" w:hAnsi="Times New Roman" w:cs="Times New Roman"/>
+          <w:sz w:val="26"/>
+          <w:szCs w:val="26"/>
+        </w:rPr>
+        <w:t xml:space="preserve">Hình </w:t>
+      </w:r>
+      <w:r>
+        <w:rPr>
+          <w:rFonts w:ascii="Times New Roman" w:hAnsi="Times New Roman" w:cs="Times New Roman"/>
+          <w:sz w:val="26"/>
+          <w:szCs w:val="26"/>
+        </w:rPr>
+        <w:fldChar w:fldCharType="begin"/>
+      </w:r>
+      <w:r>
+        <w:rPr>
+          <w:rFonts w:ascii="Times New Roman" w:hAnsi="Times New Roman" w:cs="Times New Roman"/>
+          <w:sz w:val="26"/>
+          <w:szCs w:val="26"/>
+        </w:rPr>
+        <w:instrText xml:space="preserve"> SEQ Hình \* ARABIC </w:instrText>
+      </w:r>
+      <w:r>
+        <w:rPr>
+          <w:rFonts w:ascii="Times New Roman" w:hAnsi="Times New Roman" w:cs="Times New Roman"/>
+          <w:sz w:val="26"/>
+          <w:szCs w:val="26"/>
+        </w:rPr>
+        <w:fldChar w:fldCharType="separate"/>
+      </w:r>
+      <w:r>
+        <w:rPr>
+          <w:rFonts w:ascii="Times New Roman" w:hAnsi="Times New Roman" w:cs="Times New Roman"/>
+          <w:noProof/>
+          <w:sz w:val="26"/>
+          <w:szCs w:val="26"/>
+        </w:rPr>
+        <w:t>3</w:t>
+      </w:r>
+      <w:r>
+        <w:rPr>
+          <w:rFonts w:ascii="Times New Roman" w:hAnsi="Times New Roman" w:cs="Times New Roman"/>
+          <w:sz w:val="26"/>
+          <w:szCs w:val="26"/>
+        </w:rPr>
+        <w:fldChar w:fldCharType="end"/>
+      </w:r>
+      <w:r>
+        <w:rPr>
+          <w:rFonts w:ascii="Times New Roman" w:hAnsi="Times New Roman" w:cs="Times New Roman"/>
+          <w:sz w:val="26"/>
+          <w:szCs w:val="26"/>
+        </w:rPr>
+        <w:t>: Entity Relationshop Diagram</w:t>
       </w:r>
       <w:bookmarkEnd w:id="80"/>
+    </w:p>
+    <w:p>
+      <w:pPr>
+        <w:rPr>
+          <w:rFonts w:ascii="Times New Roman" w:hAnsi="Times New Roman" w:cs="Times New Roman"/>
+          <w:sz w:val="26"/>
+          <w:szCs w:val="26"/>
+        </w:rPr>
+      </w:pPr>
+      <w:r>
+        <w:rPr>
+          <w:rFonts w:ascii="Times New Roman" w:hAnsi="Times New Roman" w:cs="Times New Roman"/>
+          <w:sz w:val="26"/>
+          <w:szCs w:val="26"/>
+        </w:rPr>
+        <w:t>ERD mô tả mô hình cơ sở dữ liệu hệ thống CRM. Cơ sở dữ liệu bao gồm 14 bảng được liên kết với nhau thông qua khóa chính và khóa ngoại nhằm đảm bảo tính toàn vẹn dữ liệu.</w:t>
+      </w:r>
+    </w:p>
+    <w:p>
+      <w:pPr>
+        <w:rPr>
+          <w:rFonts w:ascii="Times New Roman" w:hAnsi="Times New Roman" w:cs="Times New Roman"/>
+          <w:sz w:val="26"/>
+          <w:szCs w:val="26"/>
+        </w:rPr>
+      </w:pPr>
+      <w:r>
+        <w:rPr>
+          <w:rFonts w:ascii="Times New Roman" w:hAnsi="Times New Roman" w:cs="Times New Roman"/>
+          <w:sz w:val="26"/>
+          <w:szCs w:val="26"/>
+        </w:rPr>
+        <w:t>Trong đó, bảng Users lưu thông tin các nhân viên thực hiện các thao tác trong hệ thống và được phân quyền thông qua bảng Roles. Bảng Leads lưu thông tin khách hàng tiềm năng, sau đó sẽ được chuyển đổi thành Customer. Mỗi Customer sẽ phát sinh nhiều Deal, mỗi Deal bao gồm Activity, Task và Quote. Báo giá được lưu trong bảng Quotes và chi tiết sản phẩm được lưu trong bảng QuoteDetails.</w:t>
+      </w:r>
+    </w:p>
+    <w:p>
+      <w:pPr>
+        <w:pStyle w:val="Heading2"/>
+        <w:rPr>
+          <w:rFonts w:ascii="Times New Roman" w:hAnsi="Times New Roman" w:cs="Times New Roman"/>
+        </w:rPr>
+      </w:pPr>
+      <w:bookmarkStart w:id="81" w:name="_Toc235563727"/>
+      <w:bookmarkStart w:id="82" w:name="_Toc235682294"/>
+      <w:r>
+        <w:rPr>
+          <w:rFonts w:ascii="Times New Roman" w:hAnsi="Times New Roman" w:cs="Times New Roman"/>
+        </w:rPr>
+        <w:t>WIREFRAME</w:t>
+      </w:r>
       <w:bookmarkEnd w:id="81"/>
-    </w:p>
-    <w:p>
-      <w:pPr>
-        <w:rPr>
-          <w:rFonts w:ascii="Times New Roman" w:hAnsi="Times New Roman" w:cs="Times New Roman"/>
-          <w:sz w:val="26"/>
-          <w:szCs w:val="26"/>
-        </w:rPr>
-      </w:pPr>
-    </w:p>
-    <w:p>
-      <w:pPr>
-        <w:pStyle w:val="Heading2"/>
-        <w:rPr>
-          <w:rFonts w:ascii="Times New Roman" w:hAnsi="Times New Roman" w:cs="Times New Roman"/>
-        </w:rPr>
-      </w:pPr>
-      <w:bookmarkStart w:id="82" w:name="_Toc235563727"/>
-      <w:bookmarkStart w:id="83" w:name="_Toc235682294"/>
-      <w:r>
-        <w:rPr>
-          <w:rFonts w:ascii="Times New Roman" w:hAnsi="Times New Roman" w:cs="Times New Roman"/>
-        </w:rPr>
-        <w:t>WIREFRAME</w:t>
-      </w:r>
       <w:bookmarkEnd w:id="82"/>
-      <w:bookmarkEnd w:id="83"/>
     </w:p>
     <w:p>
       <w:pPr>
@@ -15633,8 +15836,8 @@
           <w:rFonts w:ascii="Times New Roman" w:hAnsi="Times New Roman" w:cs="Times New Roman"/>
         </w:rPr>
       </w:pPr>
-      <w:bookmarkStart w:id="84" w:name="_Toc235563729"/>
-      <w:bookmarkStart w:id="85" w:name="_Toc235682295"/>
+      <w:bookmarkStart w:id="83" w:name="_Toc235563729"/>
+      <w:bookmarkStart w:id="84" w:name="_Toc235682295"/>
       <w:r>
         <w:rPr>
           <w:rFonts w:ascii="Times New Roman" w:hAnsi="Times New Roman" w:cs="Times New Roman"/>
@@ -15642,8 +15845,8 @@
         <w:lastRenderedPageBreak/>
         <w:t>TÀI LIỆU THAM KHẢO</w:t>
       </w:r>
+      <w:bookmarkEnd w:id="83"/>
       <w:bookmarkEnd w:id="84"/>
-      <w:bookmarkEnd w:id="85"/>
     </w:p>
     <w:p>
       <w:pPr>
@@ -15655,7 +15858,7 @@
           <w:szCs w:val="26"/>
         </w:rPr>
       </w:pPr>
-      <w:hyperlink r:id="rId11" w:history="1">
+      <w:hyperlink r:id="rId12" w:history="1">
         <w:r>
           <w:rPr>
             <w:rStyle w:val="Hyperlink"/>
@@ -15674,26 +15877,12 @@
           <w:szCs w:val="26"/>
         </w:rPr>
       </w:pPr>
-      <w:hyperlink r:id="rId12" w:history="1">
+      <w:hyperlink r:id="rId13" w:history="1">
         <w:r>
           <w:rPr>
             <w:rStyle w:val="Hyperlink"/>
           </w:rPr>
-          <w:t xml:space="preserve">clauderic/dnd-kit: The modern toolkit for building </w:t>
-        </w:r>
-        <w:proofErr w:type="gramStart"/>
-        <w:r>
-          <w:rPr>
-            <w:rStyle w:val="Hyperlink"/>
-          </w:rPr>
-          <w:t>drag</w:t>
-        </w:r>
-        <w:proofErr w:type="gramEnd"/>
-        <w:r>
-          <w:rPr>
-            <w:rStyle w:val="Hyperlink"/>
-          </w:rPr>
-          <w:t xml:space="preserve"> and drop interfaces</w:t>
+          <w:t>clauderic/dnd-kit: The modern toolkit for building drag and drop interfaces</w:t>
         </w:r>
       </w:hyperlink>
     </w:p>
@@ -15707,7 +15896,7 @@
           <w:szCs w:val="26"/>
         </w:rPr>
       </w:pPr>
-      <w:hyperlink r:id="rId13" w:history="1">
+      <w:hyperlink r:id="rId14" w:history="1">
         <w:r>
           <w:rPr>
             <w:rStyle w:val="Hyperlink"/>
@@ -15726,7 +15915,7 @@
           <w:szCs w:val="26"/>
         </w:rPr>
       </w:pPr>
-      <w:hyperlink r:id="rId14" w:history="1">
+      <w:hyperlink r:id="rId15" w:history="1">
         <w:r>
           <w:rPr>
             <w:rStyle w:val="Hyperlink"/>
@@ -15745,7 +15934,7 @@
           <w:szCs w:val="26"/>
         </w:rPr>
       </w:pPr>
-      <w:hyperlink r:id="rId15" w:history="1">
+      <w:hyperlink r:id="rId16" w:history="1">
         <w:r>
           <w:rPr>
             <w:rStyle w:val="Hyperlink"/>
@@ -15759,7 +15948,7 @@
         <w:spacing w:line="360" w:lineRule="auto"/>
         <w:ind w:left="360"/>
       </w:pPr>
-      <w:hyperlink r:id="rId16" w:history="1">
+      <w:hyperlink r:id="rId17" w:history="1">
         <w:r>
           <w:rPr>
             <w:rStyle w:val="Hyperlink"/>
@@ -15779,7 +15968,7 @@
       </w:pPr>
     </w:p>
     <w:sectPr>
-      <w:headerReference w:type="default" r:id="rId17"/>
+      <w:headerReference w:type="default" r:id="rId18"/>
       <w:pgSz w:w="12240" w:h="15840"/>
       <w:pgMar w:top="1134" w:right="1134" w:bottom="1134" w:left="1985" w:header="720" w:footer="720" w:gutter="0"/>
       <w:cols w:space="720"/>

</xml_diff>

<commit_message>
feat: báo cáo Activity Diagram
</commit_message>
<xml_diff>
--- a/docs/BaoCao/BaoCao.docx
+++ b/docs/BaoCao/BaoCao.docx
@@ -3455,7 +3455,7 @@
         </w:rPr>
         <w:fldChar w:fldCharType="separate"/>
       </w:r>
-      <w:hyperlink w:anchor="_Toc235727304" w:history="1">
+      <w:hyperlink w:anchor="_Toc235739348" w:history="1">
         <w:r>
           <w:rPr>
             <w:rStyle w:val="Hyperlink"/>
@@ -3483,7 +3483,7 @@
             <w:noProof/>
             <w:webHidden/>
           </w:rPr>
-          <w:instrText xml:space="preserve"> PAGEREF _Toc235727304 \h </w:instrText>
+          <w:instrText xml:space="preserve"> PAGEREF _Toc235739348 \h </w:instrText>
         </w:r>
         <w:r>
           <w:rPr>
@@ -3525,14 +3525,30 @@
           <w:noProof/>
         </w:rPr>
       </w:pPr>
-      <w:hyperlink w:anchor="_Toc235727305" w:history="1">
+      <w:hyperlink w:anchor="_Toc235739349" w:history="1">
         <w:r>
           <w:rPr>
             <w:rStyle w:val="Hyperlink"/>
             <w:rFonts w:ascii="Times New Roman" w:hAnsi="Times New Roman" w:cs="Times New Roman"/>
             <w:noProof/>
           </w:rPr>
-          <w:t>Hình 2: Class Diagram</w:t>
+          <w:t>Hình 2: Activity Diagram mô t</w:t>
+        </w:r>
+        <w:r>
+          <w:rPr>
+            <w:rStyle w:val="Hyperlink"/>
+            <w:rFonts w:ascii="Times New Roman" w:hAnsi="Times New Roman" w:cs="Times New Roman"/>
+            <w:noProof/>
+          </w:rPr>
+          <w:t>ả</w:t>
+        </w:r>
+        <w:r>
+          <w:rPr>
+            <w:rStyle w:val="Hyperlink"/>
+            <w:rFonts w:ascii="Times New Roman" w:hAnsi="Times New Roman" w:cs="Times New Roman"/>
+            <w:noProof/>
+          </w:rPr>
+          <w:t xml:space="preserve"> đăng nhập hệ thống</w:t>
         </w:r>
         <w:r>
           <w:rPr>
@@ -3553,7 +3569,7 @@
             <w:noProof/>
             <w:webHidden/>
           </w:rPr>
-          <w:instrText xml:space="preserve"> PAGEREF _Toc235727305 \h </w:instrText>
+          <w:instrText xml:space="preserve"> PAGEREF _Toc235739349 \h </w:instrText>
         </w:r>
         <w:r>
           <w:rPr>
@@ -3595,14 +3611,14 @@
           <w:noProof/>
         </w:rPr>
       </w:pPr>
-      <w:hyperlink w:anchor="_Toc235727306" w:history="1">
+      <w:hyperlink w:anchor="_Toc235739350" w:history="1">
         <w:r>
           <w:rPr>
             <w:rStyle w:val="Hyperlink"/>
             <w:rFonts w:ascii="Times New Roman" w:hAnsi="Times New Roman" w:cs="Times New Roman"/>
             <w:noProof/>
           </w:rPr>
-          <w:t>Hình 3: Entity Relationshop Diagram</w:t>
+          <w:t>Hình 3: Activity Diagram mô tả Chuyển Lead thành Customer</w:t>
         </w:r>
         <w:r>
           <w:rPr>
@@ -3623,7 +3639,217 @@
             <w:noProof/>
             <w:webHidden/>
           </w:rPr>
-          <w:instrText xml:space="preserve"> PAGEREF _Toc235727306 \h </w:instrText>
+          <w:instrText xml:space="preserve"> PAGEREF _Toc235739350 \h </w:instrText>
+        </w:r>
+        <w:r>
+          <w:rPr>
+            <w:noProof/>
+            <w:webHidden/>
+          </w:rPr>
+        </w:r>
+        <w:r>
+          <w:rPr>
+            <w:noProof/>
+            <w:webHidden/>
+          </w:rPr>
+          <w:fldChar w:fldCharType="separate"/>
+        </w:r>
+        <w:r>
+          <w:rPr>
+            <w:noProof/>
+            <w:webHidden/>
+          </w:rPr>
+          <w:t>28</w:t>
+        </w:r>
+        <w:r>
+          <w:rPr>
+            <w:noProof/>
+            <w:webHidden/>
+          </w:rPr>
+          <w:fldChar w:fldCharType="end"/>
+        </w:r>
+      </w:hyperlink>
+    </w:p>
+    <w:p>
+      <w:pPr>
+        <w:pStyle w:val="TableofFigures"/>
+        <w:tabs>
+          <w:tab w:val="right" w:leader="dot" w:pos="9111"/>
+        </w:tabs>
+        <w:rPr>
+          <w:rFonts w:eastAsiaTheme="minorEastAsia"/>
+          <w:noProof/>
+        </w:rPr>
+      </w:pPr>
+      <w:hyperlink w:anchor="_Toc235739351" w:history="1">
+        <w:r>
+          <w:rPr>
+            <w:rStyle w:val="Hyperlink"/>
+            <w:rFonts w:ascii="Times New Roman" w:hAnsi="Times New Roman" w:cs="Times New Roman"/>
+            <w:noProof/>
+          </w:rPr>
+          <w:t>Hình 4: Activity Diagram mô tả tạo Deal</w:t>
+        </w:r>
+        <w:r>
+          <w:rPr>
+            <w:noProof/>
+            <w:webHidden/>
+          </w:rPr>
+          <w:tab/>
+        </w:r>
+        <w:r>
+          <w:rPr>
+            <w:noProof/>
+            <w:webHidden/>
+          </w:rPr>
+          <w:fldChar w:fldCharType="begin"/>
+        </w:r>
+        <w:r>
+          <w:rPr>
+            <w:noProof/>
+            <w:webHidden/>
+          </w:rPr>
+          <w:instrText xml:space="preserve"> PAGEREF _Toc235739351 \h </w:instrText>
+        </w:r>
+        <w:r>
+          <w:rPr>
+            <w:noProof/>
+            <w:webHidden/>
+          </w:rPr>
+        </w:r>
+        <w:r>
+          <w:rPr>
+            <w:noProof/>
+            <w:webHidden/>
+          </w:rPr>
+          <w:fldChar w:fldCharType="separate"/>
+        </w:r>
+        <w:r>
+          <w:rPr>
+            <w:noProof/>
+            <w:webHidden/>
+          </w:rPr>
+          <w:t>29</w:t>
+        </w:r>
+        <w:r>
+          <w:rPr>
+            <w:noProof/>
+            <w:webHidden/>
+          </w:rPr>
+          <w:fldChar w:fldCharType="end"/>
+        </w:r>
+      </w:hyperlink>
+    </w:p>
+    <w:p>
+      <w:pPr>
+        <w:pStyle w:val="TableofFigures"/>
+        <w:tabs>
+          <w:tab w:val="right" w:leader="dot" w:pos="9111"/>
+        </w:tabs>
+        <w:rPr>
+          <w:rFonts w:eastAsiaTheme="minorEastAsia"/>
+          <w:noProof/>
+        </w:rPr>
+      </w:pPr>
+      <w:hyperlink w:anchor="_Toc235739352" w:history="1">
+        <w:r>
+          <w:rPr>
+            <w:rStyle w:val="Hyperlink"/>
+            <w:rFonts w:ascii="Times New Roman" w:hAnsi="Times New Roman" w:cs="Times New Roman"/>
+            <w:noProof/>
+          </w:rPr>
+          <w:t>Hình 5: Activity Diagram mô tả tạo báo giá</w:t>
+        </w:r>
+        <w:r>
+          <w:rPr>
+            <w:noProof/>
+            <w:webHidden/>
+          </w:rPr>
+          <w:tab/>
+        </w:r>
+        <w:r>
+          <w:rPr>
+            <w:noProof/>
+            <w:webHidden/>
+          </w:rPr>
+          <w:fldChar w:fldCharType="begin"/>
+        </w:r>
+        <w:r>
+          <w:rPr>
+            <w:noProof/>
+            <w:webHidden/>
+          </w:rPr>
+          <w:instrText xml:space="preserve"> PAGEREF _Toc235739352 \h </w:instrText>
+        </w:r>
+        <w:r>
+          <w:rPr>
+            <w:noProof/>
+            <w:webHidden/>
+          </w:rPr>
+        </w:r>
+        <w:r>
+          <w:rPr>
+            <w:noProof/>
+            <w:webHidden/>
+          </w:rPr>
+          <w:fldChar w:fldCharType="separate"/>
+        </w:r>
+        <w:r>
+          <w:rPr>
+            <w:noProof/>
+            <w:webHidden/>
+          </w:rPr>
+          <w:t>29</w:t>
+        </w:r>
+        <w:r>
+          <w:rPr>
+            <w:noProof/>
+            <w:webHidden/>
+          </w:rPr>
+          <w:fldChar w:fldCharType="end"/>
+        </w:r>
+      </w:hyperlink>
+    </w:p>
+    <w:p>
+      <w:pPr>
+        <w:pStyle w:val="TableofFigures"/>
+        <w:tabs>
+          <w:tab w:val="right" w:leader="dot" w:pos="9111"/>
+        </w:tabs>
+        <w:rPr>
+          <w:rFonts w:eastAsiaTheme="minorEastAsia"/>
+          <w:noProof/>
+        </w:rPr>
+      </w:pPr>
+      <w:hyperlink w:anchor="_Toc235739353" w:history="1">
+        <w:r>
+          <w:rPr>
+            <w:rStyle w:val="Hyperlink"/>
+            <w:rFonts w:ascii="Times New Roman" w:hAnsi="Times New Roman" w:cs="Times New Roman"/>
+            <w:noProof/>
+          </w:rPr>
+          <w:t>Hình 6: Activity Diagram mô tả chuyển đổi giai đoạn Pipeline</w:t>
+        </w:r>
+        <w:r>
+          <w:rPr>
+            <w:noProof/>
+            <w:webHidden/>
+          </w:rPr>
+          <w:tab/>
+        </w:r>
+        <w:r>
+          <w:rPr>
+            <w:noProof/>
+            <w:webHidden/>
+          </w:rPr>
+          <w:fldChar w:fldCharType="begin"/>
+        </w:r>
+        <w:r>
+          <w:rPr>
+            <w:noProof/>
+            <w:webHidden/>
+          </w:rPr>
+          <w:instrText xml:space="preserve"> PAGEREF _Toc235739353 \h </w:instrText>
         </w:r>
         <w:r>
           <w:rPr>
@@ -3644,6 +3870,146 @@
             <w:webHidden/>
           </w:rPr>
           <w:t>30</w:t>
+        </w:r>
+        <w:r>
+          <w:rPr>
+            <w:noProof/>
+            <w:webHidden/>
+          </w:rPr>
+          <w:fldChar w:fldCharType="end"/>
+        </w:r>
+      </w:hyperlink>
+    </w:p>
+    <w:p>
+      <w:pPr>
+        <w:pStyle w:val="TableofFigures"/>
+        <w:tabs>
+          <w:tab w:val="right" w:leader="dot" w:pos="9111"/>
+        </w:tabs>
+        <w:rPr>
+          <w:rFonts w:eastAsiaTheme="minorEastAsia"/>
+          <w:noProof/>
+        </w:rPr>
+      </w:pPr>
+      <w:hyperlink w:anchor="_Toc235739354" w:history="1">
+        <w:r>
+          <w:rPr>
+            <w:rStyle w:val="Hyperlink"/>
+            <w:rFonts w:ascii="Times New Roman" w:hAnsi="Times New Roman" w:cs="Times New Roman"/>
+            <w:noProof/>
+          </w:rPr>
+          <w:t>Hình 7: Class Diagram</w:t>
+        </w:r>
+        <w:r>
+          <w:rPr>
+            <w:noProof/>
+            <w:webHidden/>
+          </w:rPr>
+          <w:tab/>
+        </w:r>
+        <w:r>
+          <w:rPr>
+            <w:noProof/>
+            <w:webHidden/>
+          </w:rPr>
+          <w:fldChar w:fldCharType="begin"/>
+        </w:r>
+        <w:r>
+          <w:rPr>
+            <w:noProof/>
+            <w:webHidden/>
+          </w:rPr>
+          <w:instrText xml:space="preserve"> PAGEREF _Toc235739354 \h </w:instrText>
+        </w:r>
+        <w:r>
+          <w:rPr>
+            <w:noProof/>
+            <w:webHidden/>
+          </w:rPr>
+        </w:r>
+        <w:r>
+          <w:rPr>
+            <w:noProof/>
+            <w:webHidden/>
+          </w:rPr>
+          <w:fldChar w:fldCharType="separate"/>
+        </w:r>
+        <w:r>
+          <w:rPr>
+            <w:noProof/>
+            <w:webHidden/>
+          </w:rPr>
+          <w:t>31</w:t>
+        </w:r>
+        <w:r>
+          <w:rPr>
+            <w:noProof/>
+            <w:webHidden/>
+          </w:rPr>
+          <w:fldChar w:fldCharType="end"/>
+        </w:r>
+      </w:hyperlink>
+    </w:p>
+    <w:p>
+      <w:pPr>
+        <w:pStyle w:val="TableofFigures"/>
+        <w:tabs>
+          <w:tab w:val="right" w:leader="dot" w:pos="9111"/>
+        </w:tabs>
+        <w:rPr>
+          <w:rFonts w:eastAsiaTheme="minorEastAsia"/>
+          <w:noProof/>
+        </w:rPr>
+      </w:pPr>
+      <w:hyperlink w:anchor="_Toc235739355" w:history="1">
+        <w:r>
+          <w:rPr>
+            <w:rStyle w:val="Hyperlink"/>
+            <w:rFonts w:ascii="Times New Roman" w:hAnsi="Times New Roman" w:cs="Times New Roman"/>
+            <w:noProof/>
+          </w:rPr>
+          <w:t>Hình 8: Entity Relationshop Diagram</w:t>
+        </w:r>
+        <w:r>
+          <w:rPr>
+            <w:noProof/>
+            <w:webHidden/>
+          </w:rPr>
+          <w:tab/>
+        </w:r>
+        <w:r>
+          <w:rPr>
+            <w:noProof/>
+            <w:webHidden/>
+          </w:rPr>
+          <w:fldChar w:fldCharType="begin"/>
+        </w:r>
+        <w:r>
+          <w:rPr>
+            <w:noProof/>
+            <w:webHidden/>
+          </w:rPr>
+          <w:instrText xml:space="preserve"> PAGEREF _Toc235739355 \h </w:instrText>
+        </w:r>
+        <w:r>
+          <w:rPr>
+            <w:noProof/>
+            <w:webHidden/>
+          </w:rPr>
+        </w:r>
+        <w:r>
+          <w:rPr>
+            <w:noProof/>
+            <w:webHidden/>
+          </w:rPr>
+          <w:fldChar w:fldCharType="separate"/>
+        </w:r>
+        <w:r>
+          <w:rPr>
+            <w:noProof/>
+            <w:webHidden/>
+          </w:rPr>
+          <w:t>33</w:t>
         </w:r>
         <w:r>
           <w:rPr>
@@ -4500,42 +4866,8 @@
       <w:r>
         <w:fldChar w:fldCharType="end"/>
       </w:r>
-      <w:r>
-        <w:fldChar w:fldCharType="begin"/>
-      </w:r>
-      <w:r>
-        <w:instrText xml:space="preserve"> TOC \h \z \c "B</w:instrText>
-      </w:r>
-      <w:r>
-        <w:instrText>ả</w:instrText>
-      </w:r>
-      <w:r>
-        <w:instrText xml:space="preserve">ng" </w:instrText>
-      </w:r>
-      <w:r>
-        <w:fldChar w:fldCharType="separate"/>
-      </w:r>
-      <w:r>
-        <w:fldChar w:fldCharType="end"/>
-      </w:r>
-      <w:r>
-        <w:fldChar w:fldCharType="begin"/>
-      </w:r>
-      <w:r>
-        <w:instrText xml:space="preserve"> TOC \h \z \c "B</w:instrText>
-      </w:r>
-      <w:r>
-        <w:instrText>ả</w:instrText>
-      </w:r>
-      <w:r>
-        <w:instrText xml:space="preserve">ng" </w:instrText>
-      </w:r>
-      <w:r>
-        <w:fldChar w:fldCharType="separate"/>
-      </w:r>
-      <w:r>
-        <w:fldChar w:fldCharType="end"/>
-      </w:r>
+      <w:fldSimple w:instr=" TOC \h \z \c &quot;Bảng&quot; "/>
+      <w:fldSimple w:instr=" TOC \h \z \c &quot;Bảng&quot; "/>
       <w:r>
         <w:br w:type="page"/>
       </w:r>
@@ -9515,7 +9847,7 @@
         </w:rPr>
       </w:pPr>
       <w:bookmarkStart w:id="57" w:name="_Toc235641387"/>
-      <w:bookmarkStart w:id="58" w:name="_Toc235727304"/>
+      <w:bookmarkStart w:id="58" w:name="_Toc235739348"/>
       <w:r>
         <w:rPr>
           <w:rFonts w:ascii="Times New Roman" w:hAnsi="Times New Roman" w:cs="Times New Roman"/>
@@ -15150,12 +15482,734 @@
     </w:p>
     <w:p>
       <w:pPr>
-        <w:rPr>
-          <w:rFonts w:ascii="Times New Roman" w:hAnsi="Times New Roman" w:cs="Times New Roman"/>
-          <w:sz w:val="26"/>
-          <w:szCs w:val="26"/>
-        </w:rPr>
-      </w:pPr>
+        <w:keepNext/>
+      </w:pPr>
+      <w:r>
+        <w:rPr>
+          <w:rFonts w:ascii="Times New Roman" w:hAnsi="Times New Roman" w:cs="Times New Roman"/>
+          <w:noProof/>
+          <w:sz w:val="26"/>
+          <w:szCs w:val="26"/>
+        </w:rPr>
+        <w:drawing>
+          <wp:inline distT="0" distB="0" distL="0" distR="0" wp14:anchorId="19A9E3A9" wp14:editId="270C9583">
+            <wp:extent cx="5791835" cy="2471420"/>
+            <wp:effectExtent l="0" t="0" r="0" b="5080"/>
+            <wp:docPr id="5" name="Picture 5"/>
+            <wp:cNvGraphicFramePr>
+              <a:graphicFrameLocks xmlns:a="http://schemas.openxmlformats.org/drawingml/2006/main" noChangeAspect="1"/>
+            </wp:cNvGraphicFramePr>
+            <a:graphic xmlns:a="http://schemas.openxmlformats.org/drawingml/2006/main">
+              <a:graphicData uri="http://schemas.openxmlformats.org/drawingml/2006/picture">
+                <pic:pic xmlns:pic="http://schemas.openxmlformats.org/drawingml/2006/picture">
+                  <pic:nvPicPr>
+                    <pic:cNvPr id="5" name="Picture 5"/>
+                    <pic:cNvPicPr/>
+                  </pic:nvPicPr>
+                  <pic:blipFill>
+                    <a:blip r:embed="rId10">
+                      <a:extLst>
+                        <a:ext uri="{28A0092B-C50C-407E-A947-70E740481C1C}">
+                          <a14:useLocalDpi xmlns:a14="http://schemas.microsoft.com/office/drawing/2010/main" val="0"/>
+                        </a:ext>
+                      </a:extLst>
+                    </a:blip>
+                    <a:stretch>
+                      <a:fillRect/>
+                    </a:stretch>
+                  </pic:blipFill>
+                  <pic:spPr>
+                    <a:xfrm>
+                      <a:off x="0" y="0"/>
+                      <a:ext cx="5791835" cy="2471420"/>
+                    </a:xfrm>
+                    <a:prstGeom prst="rect">
+                      <a:avLst/>
+                    </a:prstGeom>
+                  </pic:spPr>
+                </pic:pic>
+              </a:graphicData>
+            </a:graphic>
+          </wp:inline>
+        </w:drawing>
+      </w:r>
+    </w:p>
+    <w:p>
+      <w:pPr>
+        <w:pStyle w:val="Caption"/>
+        <w:rPr>
+          <w:rFonts w:ascii="Times New Roman" w:hAnsi="Times New Roman" w:cs="Times New Roman"/>
+          <w:sz w:val="26"/>
+          <w:szCs w:val="26"/>
+        </w:rPr>
+      </w:pPr>
+      <w:bookmarkStart w:id="73" w:name="_Toc235739349"/>
+      <w:r>
+        <w:rPr>
+          <w:rFonts w:ascii="Times New Roman" w:hAnsi="Times New Roman" w:cs="Times New Roman"/>
+          <w:sz w:val="26"/>
+          <w:szCs w:val="26"/>
+        </w:rPr>
+        <w:t xml:space="preserve">Hình </w:t>
+      </w:r>
+      <w:r>
+        <w:rPr>
+          <w:rFonts w:ascii="Times New Roman" w:hAnsi="Times New Roman" w:cs="Times New Roman"/>
+          <w:sz w:val="26"/>
+          <w:szCs w:val="26"/>
+        </w:rPr>
+        <w:fldChar w:fldCharType="begin"/>
+      </w:r>
+      <w:r>
+        <w:rPr>
+          <w:rFonts w:ascii="Times New Roman" w:hAnsi="Times New Roman" w:cs="Times New Roman"/>
+          <w:sz w:val="26"/>
+          <w:szCs w:val="26"/>
+        </w:rPr>
+        <w:instrText xml:space="preserve"> SEQ Hình \* ARABIC </w:instrText>
+      </w:r>
+      <w:r>
+        <w:rPr>
+          <w:rFonts w:ascii="Times New Roman" w:hAnsi="Times New Roman" w:cs="Times New Roman"/>
+          <w:sz w:val="26"/>
+          <w:szCs w:val="26"/>
+        </w:rPr>
+        <w:fldChar w:fldCharType="separate"/>
+      </w:r>
+      <w:r>
+        <w:rPr>
+          <w:rFonts w:ascii="Times New Roman" w:hAnsi="Times New Roman" w:cs="Times New Roman"/>
+          <w:noProof/>
+          <w:sz w:val="26"/>
+          <w:szCs w:val="26"/>
+        </w:rPr>
+        <w:t>2</w:t>
+      </w:r>
+      <w:r>
+        <w:rPr>
+          <w:rFonts w:ascii="Times New Roman" w:hAnsi="Times New Roman" w:cs="Times New Roman"/>
+          <w:sz w:val="26"/>
+          <w:szCs w:val="26"/>
+        </w:rPr>
+        <w:fldChar w:fldCharType="end"/>
+      </w:r>
+      <w:r>
+        <w:rPr>
+          <w:rFonts w:ascii="Times New Roman" w:hAnsi="Times New Roman" w:cs="Times New Roman"/>
+          <w:sz w:val="26"/>
+          <w:szCs w:val="26"/>
+        </w:rPr>
+        <w:t xml:space="preserve">: Activity </w:t>
+      </w:r>
+      <w:r>
+        <w:rPr>
+          <w:rFonts w:ascii="Times New Roman" w:hAnsi="Times New Roman" w:cs="Times New Roman"/>
+          <w:sz w:val="26"/>
+          <w:szCs w:val="26"/>
+        </w:rPr>
+        <w:t xml:space="preserve">Diagram </w:t>
+      </w:r>
+      <w:r>
+        <w:rPr>
+          <w:rFonts w:ascii="Times New Roman" w:hAnsi="Times New Roman" w:cs="Times New Roman"/>
+          <w:sz w:val="26"/>
+          <w:szCs w:val="26"/>
+        </w:rPr>
+        <w:t>mô tả đăng nhập hệ thống</w:t>
+      </w:r>
+      <w:bookmarkEnd w:id="73"/>
+    </w:p>
+    <w:p>
+      <w:pPr>
+        <w:rPr>
+          <w:rFonts w:ascii="Times New Roman" w:hAnsi="Times New Roman" w:cs="Times New Roman"/>
+          <w:sz w:val="26"/>
+          <w:szCs w:val="26"/>
+        </w:rPr>
+      </w:pPr>
+      <w:r>
+        <w:rPr>
+          <w:rFonts w:ascii="Times New Roman" w:hAnsi="Times New Roman" w:cs="Times New Roman"/>
+          <w:sz w:val="26"/>
+          <w:szCs w:val="26"/>
+        </w:rPr>
+        <w:t>Thao tác đăng nhập vào hệ thống CRM cho phép người dùng nhập email và mật khẩu, hệ thống sẽ xác thực thông tin đăng nhập nếu đúng thì tạo phiên làm việc và chuyển hướng người dùng đến trang Dashboard theo quyền đã được phân công, nếu không thành công thì hệ thống sẽ báo lỗi và buộc người dùng đăng nhập lại.</w:t>
+      </w:r>
+    </w:p>
+    <w:p>
+      <w:pPr>
+        <w:keepNext/>
+      </w:pPr>
+      <w:r>
+        <w:rPr>
+          <w:noProof/>
+        </w:rPr>
+        <w:drawing>
+          <wp:inline distT="0" distB="0" distL="0" distR="0" wp14:anchorId="32AD9F75" wp14:editId="098CD108">
+            <wp:extent cx="5791835" cy="2533015"/>
+            <wp:effectExtent l="0" t="0" r="0" b="635"/>
+            <wp:docPr id="10" name="Picture 10"/>
+            <wp:cNvGraphicFramePr>
+              <a:graphicFrameLocks xmlns:a="http://schemas.openxmlformats.org/drawingml/2006/main" noChangeAspect="1"/>
+            </wp:cNvGraphicFramePr>
+            <a:graphic xmlns:a="http://schemas.openxmlformats.org/drawingml/2006/main">
+              <a:graphicData uri="http://schemas.openxmlformats.org/drawingml/2006/picture">
+                <pic:pic xmlns:pic="http://schemas.openxmlformats.org/drawingml/2006/picture">
+                  <pic:nvPicPr>
+                    <pic:cNvPr id="10" name="Picture 10"/>
+                    <pic:cNvPicPr/>
+                  </pic:nvPicPr>
+                  <pic:blipFill>
+                    <a:blip r:embed="rId11">
+                      <a:extLst>
+                        <a:ext uri="{28A0092B-C50C-407E-A947-70E740481C1C}">
+                          <a14:useLocalDpi xmlns:a14="http://schemas.microsoft.com/office/drawing/2010/main" val="0"/>
+                        </a:ext>
+                      </a:extLst>
+                    </a:blip>
+                    <a:stretch>
+                      <a:fillRect/>
+                    </a:stretch>
+                  </pic:blipFill>
+                  <pic:spPr>
+                    <a:xfrm>
+                      <a:off x="0" y="0"/>
+                      <a:ext cx="5791835" cy="2533015"/>
+                    </a:xfrm>
+                    <a:prstGeom prst="rect">
+                      <a:avLst/>
+                    </a:prstGeom>
+                  </pic:spPr>
+                </pic:pic>
+              </a:graphicData>
+            </a:graphic>
+          </wp:inline>
+        </w:drawing>
+      </w:r>
+    </w:p>
+    <w:p>
+      <w:pPr>
+        <w:pStyle w:val="Caption"/>
+        <w:rPr>
+          <w:rFonts w:ascii="Times New Roman" w:hAnsi="Times New Roman" w:cs="Times New Roman"/>
+          <w:sz w:val="26"/>
+          <w:szCs w:val="26"/>
+        </w:rPr>
+      </w:pPr>
+      <w:bookmarkStart w:id="74" w:name="_Toc235739350"/>
+      <w:r>
+        <w:rPr>
+          <w:rFonts w:ascii="Times New Roman" w:hAnsi="Times New Roman" w:cs="Times New Roman"/>
+          <w:sz w:val="26"/>
+          <w:szCs w:val="26"/>
+        </w:rPr>
+        <w:t xml:space="preserve">Hình </w:t>
+      </w:r>
+      <w:r>
+        <w:rPr>
+          <w:rFonts w:ascii="Times New Roman" w:hAnsi="Times New Roman" w:cs="Times New Roman"/>
+          <w:sz w:val="26"/>
+          <w:szCs w:val="26"/>
+        </w:rPr>
+        <w:fldChar w:fldCharType="begin"/>
+      </w:r>
+      <w:r>
+        <w:rPr>
+          <w:rFonts w:ascii="Times New Roman" w:hAnsi="Times New Roman" w:cs="Times New Roman"/>
+          <w:sz w:val="26"/>
+          <w:szCs w:val="26"/>
+        </w:rPr>
+        <w:instrText xml:space="preserve"> SEQ Hình \* ARABIC </w:instrText>
+      </w:r>
+      <w:r>
+        <w:rPr>
+          <w:rFonts w:ascii="Times New Roman" w:hAnsi="Times New Roman" w:cs="Times New Roman"/>
+          <w:sz w:val="26"/>
+          <w:szCs w:val="26"/>
+        </w:rPr>
+        <w:fldChar w:fldCharType="separate"/>
+      </w:r>
+      <w:r>
+        <w:rPr>
+          <w:rFonts w:ascii="Times New Roman" w:hAnsi="Times New Roman" w:cs="Times New Roman"/>
+          <w:noProof/>
+          <w:sz w:val="26"/>
+          <w:szCs w:val="26"/>
+        </w:rPr>
+        <w:t>3</w:t>
+      </w:r>
+      <w:r>
+        <w:rPr>
+          <w:rFonts w:ascii="Times New Roman" w:hAnsi="Times New Roman" w:cs="Times New Roman"/>
+          <w:sz w:val="26"/>
+          <w:szCs w:val="26"/>
+        </w:rPr>
+        <w:fldChar w:fldCharType="end"/>
+      </w:r>
+      <w:r>
+        <w:rPr>
+          <w:rFonts w:ascii="Times New Roman" w:hAnsi="Times New Roman" w:cs="Times New Roman"/>
+          <w:sz w:val="26"/>
+          <w:szCs w:val="26"/>
+        </w:rPr>
+        <w:t>: Activity Diagram mô tả Chuyển Lead thành Customer</w:t>
+      </w:r>
+      <w:bookmarkEnd w:id="74"/>
+    </w:p>
+    <w:p>
+      <w:pPr>
+        <w:rPr>
+          <w:rFonts w:ascii="Times New Roman" w:hAnsi="Times New Roman" w:cs="Times New Roman"/>
+          <w:sz w:val="26"/>
+          <w:szCs w:val="26"/>
+        </w:rPr>
+      </w:pPr>
+      <w:r>
+        <w:rPr>
+          <w:rFonts w:ascii="Times New Roman" w:hAnsi="Times New Roman" w:cs="Times New Roman"/>
+          <w:sz w:val="26"/>
+          <w:szCs w:val="26"/>
+        </w:rPr>
+        <w:t>Quy trình chuyển đổi Lead thành Customer diễn ra khi Sales chọn một Lead và bấm chuyển đổim hệ thống sẽ kiểm tra điều kiện. Nếu Lead đáp ứng yêu cầu thì hệ thống sẽ tạo một dòng Customer mới trong cơ sở dữ liệu, cập nhật trạng thái của Lead thành Converted và ghi nhận vào nhật ký hoạt động. Cuối cùng hệ thống sẽ thông báo kết quả cho người dùng.</w:t>
+      </w:r>
+    </w:p>
+    <w:p>
+      <w:pPr>
+        <w:keepNext/>
+      </w:pPr>
+      <w:r>
+        <w:rPr>
+          <w:rFonts w:ascii="Times New Roman" w:hAnsi="Times New Roman" w:cs="Times New Roman"/>
+          <w:noProof/>
+          <w:sz w:val="26"/>
+          <w:szCs w:val="26"/>
+        </w:rPr>
+        <w:lastRenderedPageBreak/>
+        <w:drawing>
+          <wp:inline distT="0" distB="0" distL="0" distR="0" wp14:anchorId="624132DA" wp14:editId="2EAAEE01">
+            <wp:extent cx="5791835" cy="2430145"/>
+            <wp:effectExtent l="0" t="0" r="0" b="8255"/>
+            <wp:docPr id="7" name="Picture 7"/>
+            <wp:cNvGraphicFramePr>
+              <a:graphicFrameLocks xmlns:a="http://schemas.openxmlformats.org/drawingml/2006/main" noChangeAspect="1"/>
+            </wp:cNvGraphicFramePr>
+            <a:graphic xmlns:a="http://schemas.openxmlformats.org/drawingml/2006/main">
+              <a:graphicData uri="http://schemas.openxmlformats.org/drawingml/2006/picture">
+                <pic:pic xmlns:pic="http://schemas.openxmlformats.org/drawingml/2006/picture">
+                  <pic:nvPicPr>
+                    <pic:cNvPr id="7" name="Picture 7"/>
+                    <pic:cNvPicPr/>
+                  </pic:nvPicPr>
+                  <pic:blipFill>
+                    <a:blip r:embed="rId12">
+                      <a:extLst>
+                        <a:ext uri="{28A0092B-C50C-407E-A947-70E740481C1C}">
+                          <a14:useLocalDpi xmlns:a14="http://schemas.microsoft.com/office/drawing/2010/main" val="0"/>
+                        </a:ext>
+                      </a:extLst>
+                    </a:blip>
+                    <a:stretch>
+                      <a:fillRect/>
+                    </a:stretch>
+                  </pic:blipFill>
+                  <pic:spPr>
+                    <a:xfrm>
+                      <a:off x="0" y="0"/>
+                      <a:ext cx="5791835" cy="2430145"/>
+                    </a:xfrm>
+                    <a:prstGeom prst="rect">
+                      <a:avLst/>
+                    </a:prstGeom>
+                  </pic:spPr>
+                </pic:pic>
+              </a:graphicData>
+            </a:graphic>
+          </wp:inline>
+        </w:drawing>
+      </w:r>
+    </w:p>
+    <w:p>
+      <w:pPr>
+        <w:pStyle w:val="Caption"/>
+        <w:rPr>
+          <w:rFonts w:ascii="Times New Roman" w:hAnsi="Times New Roman" w:cs="Times New Roman"/>
+          <w:sz w:val="26"/>
+          <w:szCs w:val="26"/>
+        </w:rPr>
+      </w:pPr>
+      <w:bookmarkStart w:id="75" w:name="_Toc235739351"/>
+      <w:r>
+        <w:rPr>
+          <w:rFonts w:ascii="Times New Roman" w:hAnsi="Times New Roman" w:cs="Times New Roman"/>
+          <w:sz w:val="26"/>
+          <w:szCs w:val="26"/>
+        </w:rPr>
+        <w:t xml:space="preserve">Hình </w:t>
+      </w:r>
+      <w:r>
+        <w:rPr>
+          <w:rFonts w:ascii="Times New Roman" w:hAnsi="Times New Roman" w:cs="Times New Roman"/>
+          <w:sz w:val="26"/>
+          <w:szCs w:val="26"/>
+        </w:rPr>
+        <w:fldChar w:fldCharType="begin"/>
+      </w:r>
+      <w:r>
+        <w:rPr>
+          <w:rFonts w:ascii="Times New Roman" w:hAnsi="Times New Roman" w:cs="Times New Roman"/>
+          <w:sz w:val="26"/>
+          <w:szCs w:val="26"/>
+        </w:rPr>
+        <w:instrText xml:space="preserve"> SEQ Hình \* ARABIC </w:instrText>
+      </w:r>
+      <w:r>
+        <w:rPr>
+          <w:rFonts w:ascii="Times New Roman" w:hAnsi="Times New Roman" w:cs="Times New Roman"/>
+          <w:sz w:val="26"/>
+          <w:szCs w:val="26"/>
+        </w:rPr>
+        <w:fldChar w:fldCharType="separate"/>
+      </w:r>
+      <w:r>
+        <w:rPr>
+          <w:rFonts w:ascii="Times New Roman" w:hAnsi="Times New Roman" w:cs="Times New Roman"/>
+          <w:noProof/>
+          <w:sz w:val="26"/>
+          <w:szCs w:val="26"/>
+        </w:rPr>
+        <w:t>4</w:t>
+      </w:r>
+      <w:r>
+        <w:rPr>
+          <w:rFonts w:ascii="Times New Roman" w:hAnsi="Times New Roman" w:cs="Times New Roman"/>
+          <w:sz w:val="26"/>
+          <w:szCs w:val="26"/>
+        </w:rPr>
+        <w:fldChar w:fldCharType="end"/>
+      </w:r>
+      <w:r>
+        <w:rPr>
+          <w:rFonts w:ascii="Times New Roman" w:hAnsi="Times New Roman" w:cs="Times New Roman"/>
+          <w:sz w:val="26"/>
+          <w:szCs w:val="26"/>
+        </w:rPr>
+        <w:t>: Activity Diagram mô tả tạo Deal</w:t>
+      </w:r>
+      <w:bookmarkEnd w:id="75"/>
+    </w:p>
+    <w:p>
+      <w:pPr>
+        <w:rPr>
+          <w:rFonts w:ascii="Times New Roman" w:hAnsi="Times New Roman" w:cs="Times New Roman"/>
+          <w:sz w:val="26"/>
+          <w:szCs w:val="26"/>
+        </w:rPr>
+      </w:pPr>
+      <w:r>
+        <w:rPr>
+          <w:rFonts w:ascii="Times New Roman" w:hAnsi="Times New Roman" w:cs="Times New Roman"/>
+          <w:sz w:val="26"/>
+          <w:szCs w:val="26"/>
+        </w:rPr>
+        <w:t>Sơ đồ mô tả quá trình tạo Deal. Sales nhập thông tin của Deal, lựa chọn Customer và Pipeline Stage, sau đó hệ thống sẽ xác thực thông tin</w:t>
+      </w:r>
+      <w:r>
+        <w:rPr>
+          <w:rFonts w:ascii="Times New Roman" w:hAnsi="Times New Roman" w:cs="Times New Roman"/>
+          <w:sz w:val="26"/>
+          <w:szCs w:val="26"/>
+        </w:rPr>
+        <w:t>, tính doanh thu kỳ vọng dựa trên giá trị Deal và xác suất thành công, sau đó lưu thông tin vào cơ sở dữ liệu và thông báo kết quả cho người dùng. Nếu không thành công thì sẽ báo lỗi.</w:t>
+      </w:r>
+    </w:p>
+    <w:p>
+      <w:pPr>
+        <w:keepNext/>
+      </w:pPr>
+      <w:r>
+        <w:rPr>
+          <w:rFonts w:ascii="Times New Roman" w:hAnsi="Times New Roman" w:cs="Times New Roman"/>
+          <w:noProof/>
+          <w:sz w:val="26"/>
+          <w:szCs w:val="26"/>
+        </w:rPr>
+        <w:drawing>
+          <wp:inline distT="0" distB="0" distL="0" distR="0" wp14:anchorId="1BDB0F67" wp14:editId="07751B62">
+            <wp:extent cx="5791835" cy="2178685"/>
+            <wp:effectExtent l="0" t="0" r="0" b="0"/>
+            <wp:docPr id="8" name="Picture 8"/>
+            <wp:cNvGraphicFramePr>
+              <a:graphicFrameLocks xmlns:a="http://schemas.openxmlformats.org/drawingml/2006/main" noChangeAspect="1"/>
+            </wp:cNvGraphicFramePr>
+            <a:graphic xmlns:a="http://schemas.openxmlformats.org/drawingml/2006/main">
+              <a:graphicData uri="http://schemas.openxmlformats.org/drawingml/2006/picture">
+                <pic:pic xmlns:pic="http://schemas.openxmlformats.org/drawingml/2006/picture">
+                  <pic:nvPicPr>
+                    <pic:cNvPr id="8" name="Picture 8"/>
+                    <pic:cNvPicPr/>
+                  </pic:nvPicPr>
+                  <pic:blipFill>
+                    <a:blip r:embed="rId13">
+                      <a:extLst>
+                        <a:ext uri="{28A0092B-C50C-407E-A947-70E740481C1C}">
+                          <a14:useLocalDpi xmlns:a14="http://schemas.microsoft.com/office/drawing/2010/main" val="0"/>
+                        </a:ext>
+                      </a:extLst>
+                    </a:blip>
+                    <a:stretch>
+                      <a:fillRect/>
+                    </a:stretch>
+                  </pic:blipFill>
+                  <pic:spPr>
+                    <a:xfrm>
+                      <a:off x="0" y="0"/>
+                      <a:ext cx="5791835" cy="2178685"/>
+                    </a:xfrm>
+                    <a:prstGeom prst="rect">
+                      <a:avLst/>
+                    </a:prstGeom>
+                  </pic:spPr>
+                </pic:pic>
+              </a:graphicData>
+            </a:graphic>
+          </wp:inline>
+        </w:drawing>
+      </w:r>
+    </w:p>
+    <w:p>
+      <w:pPr>
+        <w:pStyle w:val="Caption"/>
+        <w:rPr>
+          <w:rFonts w:ascii="Times New Roman" w:hAnsi="Times New Roman" w:cs="Times New Roman"/>
+          <w:sz w:val="26"/>
+          <w:szCs w:val="26"/>
+        </w:rPr>
+      </w:pPr>
+      <w:bookmarkStart w:id="76" w:name="_Toc235739352"/>
+      <w:r>
+        <w:rPr>
+          <w:rFonts w:ascii="Times New Roman" w:hAnsi="Times New Roman" w:cs="Times New Roman"/>
+          <w:sz w:val="26"/>
+          <w:szCs w:val="26"/>
+        </w:rPr>
+        <w:t xml:space="preserve">Hình </w:t>
+      </w:r>
+      <w:r>
+        <w:rPr>
+          <w:rFonts w:ascii="Times New Roman" w:hAnsi="Times New Roman" w:cs="Times New Roman"/>
+          <w:sz w:val="26"/>
+          <w:szCs w:val="26"/>
+        </w:rPr>
+        <w:fldChar w:fldCharType="begin"/>
+      </w:r>
+      <w:r>
+        <w:rPr>
+          <w:rFonts w:ascii="Times New Roman" w:hAnsi="Times New Roman" w:cs="Times New Roman"/>
+          <w:sz w:val="26"/>
+          <w:szCs w:val="26"/>
+        </w:rPr>
+        <w:instrText xml:space="preserve"> SEQ Hình \* ARABIC </w:instrText>
+      </w:r>
+      <w:r>
+        <w:rPr>
+          <w:rFonts w:ascii="Times New Roman" w:hAnsi="Times New Roman" w:cs="Times New Roman"/>
+          <w:sz w:val="26"/>
+          <w:szCs w:val="26"/>
+        </w:rPr>
+        <w:fldChar w:fldCharType="separate"/>
+      </w:r>
+      <w:r>
+        <w:rPr>
+          <w:rFonts w:ascii="Times New Roman" w:hAnsi="Times New Roman" w:cs="Times New Roman"/>
+          <w:noProof/>
+          <w:sz w:val="26"/>
+          <w:szCs w:val="26"/>
+        </w:rPr>
+        <w:t>5</w:t>
+      </w:r>
+      <w:r>
+        <w:rPr>
+          <w:rFonts w:ascii="Times New Roman" w:hAnsi="Times New Roman" w:cs="Times New Roman"/>
+          <w:sz w:val="26"/>
+          <w:szCs w:val="26"/>
+        </w:rPr>
+        <w:fldChar w:fldCharType="end"/>
+      </w:r>
+      <w:r>
+        <w:rPr>
+          <w:rFonts w:ascii="Times New Roman" w:hAnsi="Times New Roman" w:cs="Times New Roman"/>
+          <w:sz w:val="26"/>
+          <w:szCs w:val="26"/>
+        </w:rPr>
+        <w:t>: Activity Diagram mô tả tạo báo giá</w:t>
+      </w:r>
+      <w:bookmarkEnd w:id="76"/>
+    </w:p>
+    <w:p>
+      <w:pPr>
+        <w:rPr>
+          <w:rFonts w:ascii="Times New Roman" w:hAnsi="Times New Roman" w:cs="Times New Roman"/>
+          <w:sz w:val="26"/>
+          <w:szCs w:val="26"/>
+        </w:rPr>
+      </w:pPr>
+      <w:r>
+        <w:rPr>
+          <w:rFonts w:ascii="Times New Roman" w:hAnsi="Times New Roman" w:cs="Times New Roman"/>
+          <w:sz w:val="26"/>
+          <w:szCs w:val="26"/>
+        </w:rPr>
+        <w:t xml:space="preserve">Sơ đồ mô tỏ quá trình tạo báo giá cho khách hàng. Sale chọn Deal cần báo giá, thêm sản phẩm, nhập số lượng. Hệ thống sẽ kiểm tra </w:t>
+      </w:r>
+      <w:r>
+        <w:rPr>
+          <w:rFonts w:ascii="Times New Roman" w:hAnsi="Times New Roman" w:cs="Times New Roman"/>
+          <w:sz w:val="26"/>
+          <w:szCs w:val="26"/>
+        </w:rPr>
+        <w:t>thông tin, tính tổng giá trị và lưu thông tin vào cơ sở dữ liệu, sau đó hiển thị thông báo thành công. Nếu không thành công thì sẽ hiện thông báo thất bại.</w:t>
+      </w:r>
+    </w:p>
+    <w:p>
+      <w:pPr>
+        <w:keepNext/>
+      </w:pPr>
+      <w:r>
+        <w:rPr>
+          <w:rFonts w:ascii="Times New Roman" w:hAnsi="Times New Roman" w:cs="Times New Roman"/>
+          <w:noProof/>
+          <w:sz w:val="26"/>
+          <w:szCs w:val="26"/>
+        </w:rPr>
+        <w:lastRenderedPageBreak/>
+        <w:drawing>
+          <wp:inline distT="0" distB="0" distL="0" distR="0" wp14:anchorId="1639577D" wp14:editId="62F22A0A">
+            <wp:extent cx="5791835" cy="2414905"/>
+            <wp:effectExtent l="0" t="0" r="0" b="4445"/>
+            <wp:docPr id="9" name="Picture 9"/>
+            <wp:cNvGraphicFramePr>
+              <a:graphicFrameLocks xmlns:a="http://schemas.openxmlformats.org/drawingml/2006/main" noChangeAspect="1"/>
+            </wp:cNvGraphicFramePr>
+            <a:graphic xmlns:a="http://schemas.openxmlformats.org/drawingml/2006/main">
+              <a:graphicData uri="http://schemas.openxmlformats.org/drawingml/2006/picture">
+                <pic:pic xmlns:pic="http://schemas.openxmlformats.org/drawingml/2006/picture">
+                  <pic:nvPicPr>
+                    <pic:cNvPr id="9" name="Picture 9"/>
+                    <pic:cNvPicPr/>
+                  </pic:nvPicPr>
+                  <pic:blipFill>
+                    <a:blip r:embed="rId14">
+                      <a:extLst>
+                        <a:ext uri="{28A0092B-C50C-407E-A947-70E740481C1C}">
+                          <a14:useLocalDpi xmlns:a14="http://schemas.microsoft.com/office/drawing/2010/main" val="0"/>
+                        </a:ext>
+                      </a:extLst>
+                    </a:blip>
+                    <a:stretch>
+                      <a:fillRect/>
+                    </a:stretch>
+                  </pic:blipFill>
+                  <pic:spPr>
+                    <a:xfrm>
+                      <a:off x="0" y="0"/>
+                      <a:ext cx="5791835" cy="2414905"/>
+                    </a:xfrm>
+                    <a:prstGeom prst="rect">
+                      <a:avLst/>
+                    </a:prstGeom>
+                  </pic:spPr>
+                </pic:pic>
+              </a:graphicData>
+            </a:graphic>
+          </wp:inline>
+        </w:drawing>
+      </w:r>
+    </w:p>
+    <w:p>
+      <w:pPr>
+        <w:pStyle w:val="Caption"/>
+        <w:rPr>
+          <w:rFonts w:ascii="Times New Roman" w:hAnsi="Times New Roman" w:cs="Times New Roman"/>
+          <w:sz w:val="26"/>
+          <w:szCs w:val="26"/>
+        </w:rPr>
+      </w:pPr>
+      <w:bookmarkStart w:id="77" w:name="_Toc235739353"/>
+      <w:r>
+        <w:rPr>
+          <w:rFonts w:ascii="Times New Roman" w:hAnsi="Times New Roman" w:cs="Times New Roman"/>
+          <w:sz w:val="26"/>
+          <w:szCs w:val="26"/>
+        </w:rPr>
+        <w:t xml:space="preserve">Hình </w:t>
+      </w:r>
+      <w:r>
+        <w:rPr>
+          <w:rFonts w:ascii="Times New Roman" w:hAnsi="Times New Roman" w:cs="Times New Roman"/>
+          <w:sz w:val="26"/>
+          <w:szCs w:val="26"/>
+        </w:rPr>
+        <w:fldChar w:fldCharType="begin"/>
+      </w:r>
+      <w:r>
+        <w:rPr>
+          <w:rFonts w:ascii="Times New Roman" w:hAnsi="Times New Roman" w:cs="Times New Roman"/>
+          <w:sz w:val="26"/>
+          <w:szCs w:val="26"/>
+        </w:rPr>
+        <w:instrText xml:space="preserve"> SEQ Hình \* ARABIC </w:instrText>
+      </w:r>
+      <w:r>
+        <w:rPr>
+          <w:rFonts w:ascii="Times New Roman" w:hAnsi="Times New Roman" w:cs="Times New Roman"/>
+          <w:sz w:val="26"/>
+          <w:szCs w:val="26"/>
+        </w:rPr>
+        <w:fldChar w:fldCharType="separate"/>
+      </w:r>
+      <w:r>
+        <w:rPr>
+          <w:rFonts w:ascii="Times New Roman" w:hAnsi="Times New Roman" w:cs="Times New Roman"/>
+          <w:noProof/>
+          <w:sz w:val="26"/>
+          <w:szCs w:val="26"/>
+        </w:rPr>
+        <w:t>6</w:t>
+      </w:r>
+      <w:r>
+        <w:rPr>
+          <w:rFonts w:ascii="Times New Roman" w:hAnsi="Times New Roman" w:cs="Times New Roman"/>
+          <w:sz w:val="26"/>
+          <w:szCs w:val="26"/>
+        </w:rPr>
+        <w:fldChar w:fldCharType="end"/>
+      </w:r>
+      <w:r>
+        <w:rPr>
+          <w:rFonts w:ascii="Times New Roman" w:hAnsi="Times New Roman" w:cs="Times New Roman"/>
+          <w:sz w:val="26"/>
+          <w:szCs w:val="26"/>
+        </w:rPr>
+        <w:t>: Activity Diagram mô tả chuyển đổi giai đoạn Pipeline</w:t>
+      </w:r>
+      <w:bookmarkEnd w:id="77"/>
+    </w:p>
+    <w:p>
+      <w:pPr>
+        <w:rPr>
+          <w:rFonts w:ascii="Times New Roman" w:hAnsi="Times New Roman" w:cs="Times New Roman"/>
+          <w:sz w:val="26"/>
+          <w:szCs w:val="26"/>
+        </w:rPr>
+      </w:pPr>
+      <w:r>
+        <w:rPr>
+          <w:rFonts w:ascii="Times New Roman" w:hAnsi="Times New Roman" w:cs="Times New Roman"/>
+          <w:sz w:val="26"/>
+          <w:szCs w:val="26"/>
+        </w:rPr>
+        <w:t>Quy trình chuyển đổi giai đoạn Pipeline được mô tả ở sơ đồ trên. Sales kéo thả Deal sang giai đoạn mới, hệ thống kiểm tra tính hợp lệ của thao tác, nếu đúng thì sẽ cập nhật Pipeline Stage, tính lại doanh thu kỳ vọng và ghi nhận vào nhật ký hoạt động. Nếu thất bại thì hệ thống sẽ khôi phục trạng thái trước đó và hiển thị thông báo lỗi.</w:t>
+      </w:r>
     </w:p>
     <w:p>
       <w:pPr>
@@ -15164,16 +16218,16 @@
           <w:rFonts w:ascii="Times New Roman" w:hAnsi="Times New Roman" w:cs="Times New Roman"/>
         </w:rPr>
       </w:pPr>
-      <w:bookmarkStart w:id="73" w:name="_Toc235563723"/>
-      <w:bookmarkStart w:id="74" w:name="_Toc235682290"/>
+      <w:bookmarkStart w:id="78" w:name="_Toc235563723"/>
+      <w:bookmarkStart w:id="79" w:name="_Toc235682290"/>
       <w:r>
         <w:rPr>
           <w:rFonts w:ascii="Times New Roman" w:hAnsi="Times New Roman" w:cs="Times New Roman"/>
         </w:rPr>
         <w:t>SEQUECE DIAGRAM</w:t>
       </w:r>
-      <w:bookmarkEnd w:id="73"/>
-      <w:bookmarkEnd w:id="74"/>
+      <w:bookmarkEnd w:id="78"/>
+      <w:bookmarkEnd w:id="79"/>
     </w:p>
     <w:p>
       <w:pPr>
@@ -15191,16 +16245,17 @@
           <w:rFonts w:ascii="Times New Roman" w:hAnsi="Times New Roman" w:cs="Times New Roman"/>
         </w:rPr>
       </w:pPr>
-      <w:bookmarkStart w:id="75" w:name="_Toc235563724"/>
-      <w:bookmarkStart w:id="76" w:name="_Toc235682291"/>
-      <w:r>
-        <w:rPr>
-          <w:rFonts w:ascii="Times New Roman" w:hAnsi="Times New Roman" w:cs="Times New Roman"/>
-        </w:rPr>
+      <w:bookmarkStart w:id="80" w:name="_Toc235563724"/>
+      <w:bookmarkStart w:id="81" w:name="_Toc235682291"/>
+      <w:r>
+        <w:rPr>
+          <w:rFonts w:ascii="Times New Roman" w:hAnsi="Times New Roman" w:cs="Times New Roman"/>
+        </w:rPr>
+        <w:lastRenderedPageBreak/>
         <w:t>CLASS DIAGRAM</w:t>
       </w:r>
-      <w:bookmarkEnd w:id="75"/>
-      <w:bookmarkEnd w:id="76"/>
+      <w:bookmarkEnd w:id="80"/>
+      <w:bookmarkEnd w:id="81"/>
     </w:p>
     <w:p>
       <w:pPr>
@@ -15229,7 +16284,7 @@
                     <pic:cNvPicPr/>
                   </pic:nvPicPr>
                   <pic:blipFill>
-                    <a:blip r:embed="rId10">
+                    <a:blip r:embed="rId15">
                       <a:extLst>
                         <a:ext uri="{28A0092B-C50C-407E-A947-70E740481C1C}">
                           <a14:useLocalDpi xmlns:a14="http://schemas.microsoft.com/office/drawing/2010/main" val="0"/>
@@ -15265,7 +16320,7 @@
           <w:szCs w:val="26"/>
         </w:rPr>
       </w:pPr>
-      <w:bookmarkStart w:id="77" w:name="_Toc235727305"/>
+      <w:bookmarkStart w:id="82" w:name="_Toc235739354"/>
       <w:r>
         <w:rPr>
           <w:rFonts w:ascii="Times New Roman" w:hAnsi="Times New Roman" w:cs="Times New Roman"/>
@@ -15305,7 +16360,7 @@
           <w:sz w:val="26"/>
           <w:szCs w:val="26"/>
         </w:rPr>
-        <w:t>2</w:t>
+        <w:t>7</w:t>
       </w:r>
       <w:r>
         <w:rPr>
@@ -15323,7 +16378,7 @@
         </w:rPr>
         <w:t>: Class Diagram</w:t>
       </w:r>
-      <w:bookmarkEnd w:id="77"/>
+      <w:bookmarkEnd w:id="82"/>
     </w:p>
     <w:p>
       <w:pPr>
@@ -15361,7 +16416,6 @@
           <w:sz w:val="26"/>
           <w:szCs w:val="26"/>
         </w:rPr>
-        <w:lastRenderedPageBreak/>
         <w:t>Roles – Users: có quan hệ one-to-many vì một vai trò có thể được gán cho nhiều người dùng và mỗi người dùng chỉ có một vai trò.</w:t>
       </w:r>
     </w:p>
@@ -15428,6 +16482,7 @@
           <w:sz w:val="26"/>
           <w:szCs w:val="26"/>
         </w:rPr>
+        <w:lastRenderedPageBreak/>
         <w:t>Customers – Deals: có quan hệ one-to-many vì một khách hàng có thể có nhiều cơ hội bán hàng và một cơ hội bán hàng chỉ thuộc một khách hàng.</w:t>
       </w:r>
     </w:p>
@@ -15592,16 +16647,16 @@
           <w:rFonts w:ascii="Times New Roman" w:hAnsi="Times New Roman" w:cs="Times New Roman"/>
         </w:rPr>
       </w:pPr>
-      <w:bookmarkStart w:id="78" w:name="_Toc235563725"/>
-      <w:bookmarkStart w:id="79" w:name="_Toc235682292"/>
+      <w:bookmarkStart w:id="83" w:name="_Toc235563725"/>
+      <w:bookmarkStart w:id="84" w:name="_Toc235682292"/>
       <w:r>
         <w:rPr>
           <w:rFonts w:ascii="Times New Roman" w:hAnsi="Times New Roman" w:cs="Times New Roman"/>
         </w:rPr>
         <w:t>KIẾN TRÚC HỆ THỐNG</w:t>
       </w:r>
-      <w:bookmarkEnd w:id="78"/>
-      <w:bookmarkEnd w:id="79"/>
+      <w:bookmarkEnd w:id="83"/>
+      <w:bookmarkEnd w:id="84"/>
     </w:p>
     <w:p>
       <w:pPr>
@@ -15654,7 +16709,7 @@
                     <pic:cNvPicPr/>
                   </pic:nvPicPr>
                   <pic:blipFill>
-                    <a:blip r:embed="rId11" cstate="print">
+                    <a:blip r:embed="rId16" cstate="print">
                       <a:extLst>
                         <a:ext uri="{28A0092B-C50C-407E-A947-70E740481C1C}">
                           <a14:useLocalDpi xmlns:a14="http://schemas.microsoft.com/office/drawing/2010/main" val="0"/>
@@ -15690,7 +16745,7 @@
           <w:szCs w:val="26"/>
         </w:rPr>
       </w:pPr>
-      <w:bookmarkStart w:id="80" w:name="_Toc235727306"/>
+      <w:bookmarkStart w:id="85" w:name="_Toc235739355"/>
       <w:r>
         <w:rPr>
           <w:rFonts w:ascii="Times New Roman" w:hAnsi="Times New Roman" w:cs="Times New Roman"/>
@@ -15730,7 +16785,7 @@
           <w:sz w:val="26"/>
           <w:szCs w:val="26"/>
         </w:rPr>
-        <w:t>3</w:t>
+        <w:t>8</w:t>
       </w:r>
       <w:r>
         <w:rPr>
@@ -15748,7 +16803,7 @@
         </w:rPr>
         <w:t>: Entity Relationshop Diagram</w:t>
       </w:r>
-      <w:bookmarkEnd w:id="80"/>
+      <w:bookmarkEnd w:id="85"/>
     </w:p>
     <w:p>
       <w:pPr>
@@ -15791,16 +16846,16 @@
           <w:rFonts w:ascii="Times New Roman" w:hAnsi="Times New Roman" w:cs="Times New Roman"/>
         </w:rPr>
       </w:pPr>
-      <w:bookmarkStart w:id="81" w:name="_Toc235563727"/>
-      <w:bookmarkStart w:id="82" w:name="_Toc235682294"/>
+      <w:bookmarkStart w:id="86" w:name="_Toc235563727"/>
+      <w:bookmarkStart w:id="87" w:name="_Toc235682294"/>
       <w:r>
         <w:rPr>
           <w:rFonts w:ascii="Times New Roman" w:hAnsi="Times New Roman" w:cs="Times New Roman"/>
         </w:rPr>
         <w:t>WIREFRAME</w:t>
       </w:r>
-      <w:bookmarkEnd w:id="81"/>
-      <w:bookmarkEnd w:id="82"/>
+      <w:bookmarkEnd w:id="86"/>
+      <w:bookmarkEnd w:id="87"/>
     </w:p>
     <w:p>
       <w:pPr>
@@ -15836,8 +16891,8 @@
           <w:rFonts w:ascii="Times New Roman" w:hAnsi="Times New Roman" w:cs="Times New Roman"/>
         </w:rPr>
       </w:pPr>
-      <w:bookmarkStart w:id="83" w:name="_Toc235563729"/>
-      <w:bookmarkStart w:id="84" w:name="_Toc235682295"/>
+      <w:bookmarkStart w:id="88" w:name="_Toc235563729"/>
+      <w:bookmarkStart w:id="89" w:name="_Toc235682295"/>
       <w:r>
         <w:rPr>
           <w:rFonts w:ascii="Times New Roman" w:hAnsi="Times New Roman" w:cs="Times New Roman"/>
@@ -15845,8 +16900,8 @@
         <w:lastRenderedPageBreak/>
         <w:t>TÀI LIỆU THAM KHẢO</w:t>
       </w:r>
-      <w:bookmarkEnd w:id="83"/>
-      <w:bookmarkEnd w:id="84"/>
+      <w:bookmarkEnd w:id="88"/>
+      <w:bookmarkEnd w:id="89"/>
     </w:p>
     <w:p>
       <w:pPr>
@@ -15858,7 +16913,7 @@
           <w:szCs w:val="26"/>
         </w:rPr>
       </w:pPr>
-      <w:hyperlink r:id="rId12" w:history="1">
+      <w:hyperlink r:id="rId17" w:history="1">
         <w:r>
           <w:rPr>
             <w:rStyle w:val="Hyperlink"/>
@@ -15877,7 +16932,7 @@
           <w:szCs w:val="26"/>
         </w:rPr>
       </w:pPr>
-      <w:hyperlink r:id="rId13" w:history="1">
+      <w:hyperlink r:id="rId18" w:history="1">
         <w:r>
           <w:rPr>
             <w:rStyle w:val="Hyperlink"/>
@@ -15896,7 +16951,7 @@
           <w:szCs w:val="26"/>
         </w:rPr>
       </w:pPr>
-      <w:hyperlink r:id="rId14" w:history="1">
+      <w:hyperlink r:id="rId19" w:history="1">
         <w:r>
           <w:rPr>
             <w:rStyle w:val="Hyperlink"/>
@@ -15915,7 +16970,7 @@
           <w:szCs w:val="26"/>
         </w:rPr>
       </w:pPr>
-      <w:hyperlink r:id="rId15" w:history="1">
+      <w:hyperlink r:id="rId20" w:history="1">
         <w:r>
           <w:rPr>
             <w:rStyle w:val="Hyperlink"/>
@@ -15934,7 +16989,7 @@
           <w:szCs w:val="26"/>
         </w:rPr>
       </w:pPr>
-      <w:hyperlink r:id="rId16" w:history="1">
+      <w:hyperlink r:id="rId21" w:history="1">
         <w:r>
           <w:rPr>
             <w:rStyle w:val="Hyperlink"/>
@@ -15948,7 +17003,7 @@
         <w:spacing w:line="360" w:lineRule="auto"/>
         <w:ind w:left="360"/>
       </w:pPr>
-      <w:hyperlink r:id="rId17" w:history="1">
+      <w:hyperlink r:id="rId22" w:history="1">
         <w:r>
           <w:rPr>
             <w:rStyle w:val="Hyperlink"/>
@@ -15968,7 +17023,7 @@
       </w:pPr>
     </w:p>
     <w:sectPr>
-      <w:headerReference w:type="default" r:id="rId18"/>
+      <w:headerReference w:type="default" r:id="rId23"/>
       <w:pgSz w:w="12240" w:h="15840"/>
       <w:pgMar w:top="1134" w:right="1134" w:bottom="1134" w:left="1985" w:header="720" w:footer="720" w:gutter="0"/>
       <w:cols w:space="720"/>

</xml_diff>

<commit_message>
feat: báo cáo kiến trúc hệ thống
</commit_message>
<xml_diff>
--- a/docs/BaoCao/BaoCao.docx
+++ b/docs/BaoCao/BaoCao.docx
@@ -5,7 +5,6 @@
     <w:p>
       <w:pPr>
         <w:spacing w:line="360" w:lineRule="auto"/>
-        <w:jc w:val="center"/>
         <w:rPr>
           <w:rFonts w:ascii="Times New Roman" w:hAnsi="Times New Roman" w:cs="Times New Roman"/>
           <w:sz w:val="26"/>
@@ -359,7 +358,7 @@
         </w:rPr>
       </w:pPr>
       <w:bookmarkStart w:id="0" w:name="_Toc235563698"/>
-      <w:bookmarkStart w:id="1" w:name="_Toc235682255"/>
+      <w:bookmarkStart w:id="1" w:name="_Toc235741217"/>
       <w:r>
         <w:rPr>
           <w:rFonts w:ascii="Times New Roman" w:hAnsi="Times New Roman" w:cs="Times New Roman"/>
@@ -397,7 +396,7 @@
         </w:rPr>
       </w:pPr>
       <w:bookmarkStart w:id="2" w:name="_Toc235563699"/>
-      <w:bookmarkStart w:id="3" w:name="_Toc235682256"/>
+      <w:bookmarkStart w:id="3" w:name="_Toc235741218"/>
       <w:r>
         <w:rPr>
           <w:rFonts w:ascii="Times New Roman" w:hAnsi="Times New Roman" w:cs="Times New Roman"/>
@@ -418,7 +417,7 @@
       <w:r>
         <w:br w:type="page"/>
       </w:r>
-      <w:bookmarkStart w:id="4" w:name="_Toc235682257"/>
+      <w:bookmarkStart w:id="4" w:name="_Toc235741219"/>
       <w:r>
         <w:rPr>
           <w:rFonts w:ascii="Times New Roman" w:hAnsi="Times New Roman" w:cs="Times New Roman"/>
@@ -526,7 +525,7 @@
             </w:rPr>
             <w:fldChar w:fldCharType="separate"/>
           </w:r>
-          <w:hyperlink w:anchor="_Toc235682255" w:history="1">
+          <w:hyperlink w:anchor="_Toc235741217" w:history="1">
             <w:r>
               <w:rPr>
                 <w:rStyle w:val="Hyperlink"/>
@@ -554,7 +553,7 @@
                 <w:noProof/>
                 <w:webHidden/>
               </w:rPr>
-              <w:instrText xml:space="preserve"> PAGEREF _Toc235682255 \h </w:instrText>
+              <w:instrText xml:space="preserve"> PAGEREF _Toc235741217 \h </w:instrText>
             </w:r>
             <w:r>
               <w:rPr>
@@ -596,7 +595,7 @@
               <w:noProof/>
             </w:rPr>
           </w:pPr>
-          <w:hyperlink w:anchor="_Toc235682256" w:history="1">
+          <w:hyperlink w:anchor="_Toc235741218" w:history="1">
             <w:r>
               <w:rPr>
                 <w:rStyle w:val="Hyperlink"/>
@@ -624,7 +623,7 @@
                 <w:noProof/>
                 <w:webHidden/>
               </w:rPr>
-              <w:instrText xml:space="preserve"> PAGEREF _Toc235682256 \h </w:instrText>
+              <w:instrText xml:space="preserve"> PAGEREF _Toc235741218 \h </w:instrText>
             </w:r>
             <w:r>
               <w:rPr>
@@ -666,7 +665,7 @@
               <w:noProof/>
             </w:rPr>
           </w:pPr>
-          <w:hyperlink w:anchor="_Toc235682257" w:history="1">
+          <w:hyperlink w:anchor="_Toc235741219" w:history="1">
             <w:r>
               <w:rPr>
                 <w:rStyle w:val="Hyperlink"/>
@@ -694,7 +693,7 @@
                 <w:noProof/>
                 <w:webHidden/>
               </w:rPr>
-              <w:instrText xml:space="preserve"> PAGEREF _Toc235682257 \h </w:instrText>
+              <w:instrText xml:space="preserve"> PAGEREF _Toc235741219 \h </w:instrText>
             </w:r>
             <w:r>
               <w:rPr>
@@ -736,7 +735,7 @@
               <w:noProof/>
             </w:rPr>
           </w:pPr>
-          <w:hyperlink w:anchor="_Toc235682258" w:history="1">
+          <w:hyperlink w:anchor="_Toc235741220" w:history="1">
             <w:r>
               <w:rPr>
                 <w:rStyle w:val="Hyperlink"/>
@@ -764,7 +763,7 @@
                 <w:noProof/>
                 <w:webHidden/>
               </w:rPr>
-              <w:instrText xml:space="preserve"> PAGEREF _Toc235682258 \h </w:instrText>
+              <w:instrText xml:space="preserve"> PAGEREF _Toc235741220 \h </w:instrText>
             </w:r>
             <w:r>
               <w:rPr>
@@ -806,7 +805,7 @@
               <w:noProof/>
             </w:rPr>
           </w:pPr>
-          <w:hyperlink w:anchor="_Toc235682259" w:history="1">
+          <w:hyperlink w:anchor="_Toc235741221" w:history="1">
             <w:r>
               <w:rPr>
                 <w:rStyle w:val="Hyperlink"/>
@@ -834,7 +833,7 @@
                 <w:noProof/>
                 <w:webHidden/>
               </w:rPr>
-              <w:instrText xml:space="preserve"> PAGEREF _Toc235682259 \h </w:instrText>
+              <w:instrText xml:space="preserve"> PAGEREF _Toc235741221 \h </w:instrText>
             </w:r>
             <w:r>
               <w:rPr>
@@ -876,7 +875,7 @@
               <w:noProof/>
             </w:rPr>
           </w:pPr>
-          <w:hyperlink w:anchor="_Toc235682260" w:history="1">
+          <w:hyperlink w:anchor="_Toc235741222" w:history="1">
             <w:r>
               <w:rPr>
                 <w:rStyle w:val="Hyperlink"/>
@@ -904,7 +903,7 @@
                 <w:noProof/>
                 <w:webHidden/>
               </w:rPr>
-              <w:instrText xml:space="preserve"> PAGEREF _Toc235682260 \h </w:instrText>
+              <w:instrText xml:space="preserve"> PAGEREF _Toc235741222 \h </w:instrText>
             </w:r>
             <w:r>
               <w:rPr>
@@ -946,7 +945,7 @@
               <w:noProof/>
             </w:rPr>
           </w:pPr>
-          <w:hyperlink w:anchor="_Toc235682261" w:history="1">
+          <w:hyperlink w:anchor="_Toc235741223" w:history="1">
             <w:r>
               <w:rPr>
                 <w:rStyle w:val="Hyperlink"/>
@@ -974,7 +973,7 @@
                 <w:noProof/>
                 <w:webHidden/>
               </w:rPr>
-              <w:instrText xml:space="preserve"> PAGEREF _Toc235682261 \h </w:instrText>
+              <w:instrText xml:space="preserve"> PAGEREF _Toc235741223 \h </w:instrText>
             </w:r>
             <w:r>
               <w:rPr>
@@ -1016,7 +1015,7 @@
               <w:noProof/>
             </w:rPr>
           </w:pPr>
-          <w:hyperlink w:anchor="_Toc235682262" w:history="1">
+          <w:hyperlink w:anchor="_Toc235741224" w:history="1">
             <w:r>
               <w:rPr>
                 <w:rStyle w:val="Hyperlink"/>
@@ -1044,7 +1043,7 @@
                 <w:noProof/>
                 <w:webHidden/>
               </w:rPr>
-              <w:instrText xml:space="preserve"> PAGEREF _Toc235682262 \h </w:instrText>
+              <w:instrText xml:space="preserve"> PAGEREF _Toc235741224 \h </w:instrText>
             </w:r>
             <w:r>
               <w:rPr>
@@ -1086,7 +1085,7 @@
               <w:noProof/>
             </w:rPr>
           </w:pPr>
-          <w:hyperlink w:anchor="_Toc235682263" w:history="1">
+          <w:hyperlink w:anchor="_Toc235741225" w:history="1">
             <w:r>
               <w:rPr>
                 <w:rStyle w:val="Hyperlink"/>
@@ -1114,7 +1113,7 @@
                 <w:noProof/>
                 <w:webHidden/>
               </w:rPr>
-              <w:instrText xml:space="preserve"> PAGEREF _Toc235682263 \h </w:instrText>
+              <w:instrText xml:space="preserve"> PAGEREF _Toc235741225 \h </w:instrText>
             </w:r>
             <w:r>
               <w:rPr>
@@ -1156,7 +1155,7 @@
               <w:noProof/>
             </w:rPr>
           </w:pPr>
-          <w:hyperlink w:anchor="_Toc235682264" w:history="1">
+          <w:hyperlink w:anchor="_Toc235741226" w:history="1">
             <w:r>
               <w:rPr>
                 <w:rStyle w:val="Hyperlink"/>
@@ -1184,7 +1183,7 @@
                 <w:noProof/>
                 <w:webHidden/>
               </w:rPr>
-              <w:instrText xml:space="preserve"> PAGEREF _Toc235682264 \h </w:instrText>
+              <w:instrText xml:space="preserve"> PAGEREF _Toc235741226 \h </w:instrText>
             </w:r>
             <w:r>
               <w:rPr>
@@ -1226,7 +1225,7 @@
               <w:noProof/>
             </w:rPr>
           </w:pPr>
-          <w:hyperlink w:anchor="_Toc235682265" w:history="1">
+          <w:hyperlink w:anchor="_Toc235741227" w:history="1">
             <w:r>
               <w:rPr>
                 <w:rStyle w:val="Hyperlink"/>
@@ -1254,7 +1253,7 @@
                 <w:noProof/>
                 <w:webHidden/>
               </w:rPr>
-              <w:instrText xml:space="preserve"> PAGEREF _Toc235682265 \h </w:instrText>
+              <w:instrText xml:space="preserve"> PAGEREF _Toc235741227 \h </w:instrText>
             </w:r>
             <w:r>
               <w:rPr>
@@ -1296,7 +1295,7 @@
               <w:noProof/>
             </w:rPr>
           </w:pPr>
-          <w:hyperlink w:anchor="_Toc235682266" w:history="1">
+          <w:hyperlink w:anchor="_Toc235741228" w:history="1">
             <w:r>
               <w:rPr>
                 <w:rStyle w:val="Hyperlink"/>
@@ -1324,7 +1323,7 @@
                 <w:noProof/>
                 <w:webHidden/>
               </w:rPr>
-              <w:instrText xml:space="preserve"> PAGEREF _Toc235682266 \h </w:instrText>
+              <w:instrText xml:space="preserve"> PAGEREF _Toc235741228 \h </w:instrText>
             </w:r>
             <w:r>
               <w:rPr>
@@ -1366,7 +1365,7 @@
               <w:noProof/>
             </w:rPr>
           </w:pPr>
-          <w:hyperlink w:anchor="_Toc235682267" w:history="1">
+          <w:hyperlink w:anchor="_Toc235741229" w:history="1">
             <w:r>
               <w:rPr>
                 <w:rStyle w:val="Hyperlink"/>
@@ -1394,7 +1393,7 @@
                 <w:noProof/>
                 <w:webHidden/>
               </w:rPr>
-              <w:instrText xml:space="preserve"> PAGEREF _Toc235682267 \h </w:instrText>
+              <w:instrText xml:space="preserve"> PAGEREF _Toc235741229 \h </w:instrText>
             </w:r>
             <w:r>
               <w:rPr>
@@ -1436,7 +1435,7 @@
               <w:noProof/>
             </w:rPr>
           </w:pPr>
-          <w:hyperlink w:anchor="_Toc235682268" w:history="1">
+          <w:hyperlink w:anchor="_Toc235741230" w:history="1">
             <w:r>
               <w:rPr>
                 <w:rStyle w:val="Hyperlink"/>
@@ -1464,7 +1463,7 @@
                 <w:noProof/>
                 <w:webHidden/>
               </w:rPr>
-              <w:instrText xml:space="preserve"> PAGEREF _Toc235682268 \h </w:instrText>
+              <w:instrText xml:space="preserve"> PAGEREF _Toc235741230 \h </w:instrText>
             </w:r>
             <w:r>
               <w:rPr>
@@ -1506,7 +1505,7 @@
               <w:noProof/>
             </w:rPr>
           </w:pPr>
-          <w:hyperlink w:anchor="_Toc235682269" w:history="1">
+          <w:hyperlink w:anchor="_Toc235741231" w:history="1">
             <w:r>
               <w:rPr>
                 <w:rStyle w:val="Hyperlink"/>
@@ -1534,7 +1533,7 @@
                 <w:noProof/>
                 <w:webHidden/>
               </w:rPr>
-              <w:instrText xml:space="preserve"> PAGEREF _Toc235682269 \h </w:instrText>
+              <w:instrText xml:space="preserve"> PAGEREF _Toc235741231 \h </w:instrText>
             </w:r>
             <w:r>
               <w:rPr>
@@ -1576,7 +1575,7 @@
               <w:noProof/>
             </w:rPr>
           </w:pPr>
-          <w:hyperlink w:anchor="_Toc235682270" w:history="1">
+          <w:hyperlink w:anchor="_Toc235741232" w:history="1">
             <w:r>
               <w:rPr>
                 <w:rStyle w:val="Hyperlink"/>
@@ -1604,7 +1603,7 @@
                 <w:noProof/>
                 <w:webHidden/>
               </w:rPr>
-              <w:instrText xml:space="preserve"> PAGEREF _Toc235682270 \h </w:instrText>
+              <w:instrText xml:space="preserve"> PAGEREF _Toc235741232 \h </w:instrText>
             </w:r>
             <w:r>
               <w:rPr>
@@ -1646,7 +1645,7 @@
               <w:noProof/>
             </w:rPr>
           </w:pPr>
-          <w:hyperlink w:anchor="_Toc235682271" w:history="1">
+          <w:hyperlink w:anchor="_Toc235741233" w:history="1">
             <w:r>
               <w:rPr>
                 <w:rStyle w:val="Hyperlink"/>
@@ -1674,7 +1673,7 @@
                 <w:noProof/>
                 <w:webHidden/>
               </w:rPr>
-              <w:instrText xml:space="preserve"> PAGEREF _Toc235682271 \h </w:instrText>
+              <w:instrText xml:space="preserve"> PAGEREF _Toc235741233 \h </w:instrText>
             </w:r>
             <w:r>
               <w:rPr>
@@ -1716,7 +1715,7 @@
               <w:noProof/>
             </w:rPr>
           </w:pPr>
-          <w:hyperlink w:anchor="_Toc235682272" w:history="1">
+          <w:hyperlink w:anchor="_Toc235741234" w:history="1">
             <w:r>
               <w:rPr>
                 <w:rStyle w:val="Hyperlink"/>
@@ -1744,7 +1743,7 @@
                 <w:noProof/>
                 <w:webHidden/>
               </w:rPr>
-              <w:instrText xml:space="preserve"> PAGEREF _Toc235682272 \h </w:instrText>
+              <w:instrText xml:space="preserve"> PAGEREF _Toc235741234 \h </w:instrText>
             </w:r>
             <w:r>
               <w:rPr>
@@ -1786,7 +1785,7 @@
               <w:noProof/>
             </w:rPr>
           </w:pPr>
-          <w:hyperlink w:anchor="_Toc235682273" w:history="1">
+          <w:hyperlink w:anchor="_Toc235741235" w:history="1">
             <w:r>
               <w:rPr>
                 <w:rStyle w:val="Hyperlink"/>
@@ -1814,7 +1813,7 @@
                 <w:noProof/>
                 <w:webHidden/>
               </w:rPr>
-              <w:instrText xml:space="preserve"> PAGEREF _Toc235682273 \h </w:instrText>
+              <w:instrText xml:space="preserve"> PAGEREF _Toc235741235 \h </w:instrText>
             </w:r>
             <w:r>
               <w:rPr>
@@ -1856,7 +1855,7 @@
               <w:noProof/>
             </w:rPr>
           </w:pPr>
-          <w:hyperlink w:anchor="_Toc235682274" w:history="1">
+          <w:hyperlink w:anchor="_Toc235741236" w:history="1">
             <w:r>
               <w:rPr>
                 <w:rStyle w:val="Hyperlink"/>
@@ -1884,7 +1883,7 @@
                 <w:noProof/>
                 <w:webHidden/>
               </w:rPr>
-              <w:instrText xml:space="preserve"> PAGEREF _Toc235682274 \h </w:instrText>
+              <w:instrText xml:space="preserve"> PAGEREF _Toc235741236 \h </w:instrText>
             </w:r>
             <w:r>
               <w:rPr>
@@ -1926,7 +1925,7 @@
               <w:noProof/>
             </w:rPr>
           </w:pPr>
-          <w:hyperlink w:anchor="_Toc235682275" w:history="1">
+          <w:hyperlink w:anchor="_Toc235741237" w:history="1">
             <w:r>
               <w:rPr>
                 <w:rStyle w:val="Hyperlink"/>
@@ -1954,7 +1953,7 @@
                 <w:noProof/>
                 <w:webHidden/>
               </w:rPr>
-              <w:instrText xml:space="preserve"> PAGEREF _Toc235682275 \h </w:instrText>
+              <w:instrText xml:space="preserve"> PAGEREF _Toc235741237 \h </w:instrText>
             </w:r>
             <w:r>
               <w:rPr>
@@ -1996,7 +1995,7 @@
               <w:noProof/>
             </w:rPr>
           </w:pPr>
-          <w:hyperlink w:anchor="_Toc235682276" w:history="1">
+          <w:hyperlink w:anchor="_Toc235741238" w:history="1">
             <w:r>
               <w:rPr>
                 <w:rStyle w:val="Hyperlink"/>
@@ -2024,7 +2023,7 @@
                 <w:noProof/>
                 <w:webHidden/>
               </w:rPr>
-              <w:instrText xml:space="preserve"> PAGEREF _Toc235682276 \h </w:instrText>
+              <w:instrText xml:space="preserve"> PAGEREF _Toc235741238 \h </w:instrText>
             </w:r>
             <w:r>
               <w:rPr>
@@ -2066,7 +2065,7 @@
               <w:noProof/>
             </w:rPr>
           </w:pPr>
-          <w:hyperlink w:anchor="_Toc235682277" w:history="1">
+          <w:hyperlink w:anchor="_Toc235741239" w:history="1">
             <w:r>
               <w:rPr>
                 <w:rStyle w:val="Hyperlink"/>
@@ -2094,7 +2093,7 @@
                 <w:noProof/>
                 <w:webHidden/>
               </w:rPr>
-              <w:instrText xml:space="preserve"> PAGEREF _Toc235682277 \h </w:instrText>
+              <w:instrText xml:space="preserve"> PAGEREF _Toc235741239 \h </w:instrText>
             </w:r>
             <w:r>
               <w:rPr>
@@ -2136,7 +2135,7 @@
               <w:noProof/>
             </w:rPr>
           </w:pPr>
-          <w:hyperlink w:anchor="_Toc235682278" w:history="1">
+          <w:hyperlink w:anchor="_Toc235741240" w:history="1">
             <w:r>
               <w:rPr>
                 <w:rStyle w:val="Hyperlink"/>
@@ -2164,7 +2163,7 @@
                 <w:noProof/>
                 <w:webHidden/>
               </w:rPr>
-              <w:instrText xml:space="preserve"> PAGEREF _Toc235682278 \h </w:instrText>
+              <w:instrText xml:space="preserve"> PAGEREF _Toc235741240 \h </w:instrText>
             </w:r>
             <w:r>
               <w:rPr>
@@ -2206,7 +2205,7 @@
               <w:noProof/>
             </w:rPr>
           </w:pPr>
-          <w:hyperlink w:anchor="_Toc235682279" w:history="1">
+          <w:hyperlink w:anchor="_Toc235741241" w:history="1">
             <w:r>
               <w:rPr>
                 <w:rStyle w:val="Hyperlink"/>
@@ -2234,7 +2233,7 @@
                 <w:noProof/>
                 <w:webHidden/>
               </w:rPr>
-              <w:instrText xml:space="preserve"> PAGEREF _Toc235682279 \h </w:instrText>
+              <w:instrText xml:space="preserve"> PAGEREF _Toc235741241 \h </w:instrText>
             </w:r>
             <w:r>
               <w:rPr>
@@ -2276,7 +2275,7 @@
               <w:noProof/>
             </w:rPr>
           </w:pPr>
-          <w:hyperlink w:anchor="_Toc235682280" w:history="1">
+          <w:hyperlink w:anchor="_Toc235741242" w:history="1">
             <w:r>
               <w:rPr>
                 <w:rStyle w:val="Hyperlink"/>
@@ -2304,7 +2303,7 @@
                 <w:noProof/>
                 <w:webHidden/>
               </w:rPr>
-              <w:instrText xml:space="preserve"> PAGEREF _Toc235682280 \h </w:instrText>
+              <w:instrText xml:space="preserve"> PAGEREF _Toc235741242 \h </w:instrText>
             </w:r>
             <w:r>
               <w:rPr>
@@ -2346,7 +2345,7 @@
               <w:noProof/>
             </w:rPr>
           </w:pPr>
-          <w:hyperlink w:anchor="_Toc235682281" w:history="1">
+          <w:hyperlink w:anchor="_Toc235741243" w:history="1">
             <w:r>
               <w:rPr>
                 <w:rStyle w:val="Hyperlink"/>
@@ -2374,7 +2373,7 @@
                 <w:noProof/>
                 <w:webHidden/>
               </w:rPr>
-              <w:instrText xml:space="preserve"> PAGEREF _Toc235682281 \h </w:instrText>
+              <w:instrText xml:space="preserve"> PAGEREF _Toc235741243 \h </w:instrText>
             </w:r>
             <w:r>
               <w:rPr>
@@ -2416,7 +2415,7 @@
               <w:noProof/>
             </w:rPr>
           </w:pPr>
-          <w:hyperlink w:anchor="_Toc235682282" w:history="1">
+          <w:hyperlink w:anchor="_Toc235741244" w:history="1">
             <w:r>
               <w:rPr>
                 <w:rStyle w:val="Hyperlink"/>
@@ -2444,7 +2443,7 @@
                 <w:noProof/>
                 <w:webHidden/>
               </w:rPr>
-              <w:instrText xml:space="preserve"> PAGEREF _Toc235682282 \h </w:instrText>
+              <w:instrText xml:space="preserve"> PAGEREF _Toc235741244 \h </w:instrText>
             </w:r>
             <w:r>
               <w:rPr>
@@ -2486,7 +2485,7 @@
               <w:noProof/>
             </w:rPr>
           </w:pPr>
-          <w:hyperlink w:anchor="_Toc235682283" w:history="1">
+          <w:hyperlink w:anchor="_Toc235741245" w:history="1">
             <w:r>
               <w:rPr>
                 <w:rStyle w:val="Hyperlink"/>
@@ -2514,7 +2513,7 @@
                 <w:noProof/>
                 <w:webHidden/>
               </w:rPr>
-              <w:instrText xml:space="preserve"> PAGEREF _Toc235682283 \h </w:instrText>
+              <w:instrText xml:space="preserve"> PAGEREF _Toc235741245 \h </w:instrText>
             </w:r>
             <w:r>
               <w:rPr>
@@ -2556,7 +2555,7 @@
               <w:noProof/>
             </w:rPr>
           </w:pPr>
-          <w:hyperlink w:anchor="_Toc235682284" w:history="1">
+          <w:hyperlink w:anchor="_Toc235741246" w:history="1">
             <w:r>
               <w:rPr>
                 <w:rStyle w:val="Hyperlink"/>
@@ -2584,7 +2583,7 @@
                 <w:noProof/>
                 <w:webHidden/>
               </w:rPr>
-              <w:instrText xml:space="preserve"> PAGEREF _Toc235682284 \h </w:instrText>
+              <w:instrText xml:space="preserve"> PAGEREF _Toc235741246 \h </w:instrText>
             </w:r>
             <w:r>
               <w:rPr>
@@ -2626,7 +2625,7 @@
               <w:noProof/>
             </w:rPr>
           </w:pPr>
-          <w:hyperlink w:anchor="_Toc235682285" w:history="1">
+          <w:hyperlink w:anchor="_Toc235741247" w:history="1">
             <w:r>
               <w:rPr>
                 <w:rStyle w:val="Hyperlink"/>
@@ -2654,7 +2653,7 @@
                 <w:noProof/>
                 <w:webHidden/>
               </w:rPr>
-              <w:instrText xml:space="preserve"> PAGEREF _Toc235682285 \h </w:instrText>
+              <w:instrText xml:space="preserve"> PAGEREF _Toc235741247 \h </w:instrText>
             </w:r>
             <w:r>
               <w:rPr>
@@ -2696,7 +2695,7 @@
               <w:noProof/>
             </w:rPr>
           </w:pPr>
-          <w:hyperlink w:anchor="_Toc235682286" w:history="1">
+          <w:hyperlink w:anchor="_Toc235741248" w:history="1">
             <w:r>
               <w:rPr>
                 <w:rStyle w:val="Hyperlink"/>
@@ -2724,7 +2723,7 @@
                 <w:noProof/>
                 <w:webHidden/>
               </w:rPr>
-              <w:instrText xml:space="preserve"> PAGEREF _Toc235682286 \h </w:instrText>
+              <w:instrText xml:space="preserve"> PAGEREF _Toc235741248 \h </w:instrText>
             </w:r>
             <w:r>
               <w:rPr>
@@ -2766,7 +2765,7 @@
               <w:noProof/>
             </w:rPr>
           </w:pPr>
-          <w:hyperlink w:anchor="_Toc235682287" w:history="1">
+          <w:hyperlink w:anchor="_Toc235741249" w:history="1">
             <w:r>
               <w:rPr>
                 <w:rStyle w:val="Hyperlink"/>
@@ -2794,7 +2793,7 @@
                 <w:noProof/>
                 <w:webHidden/>
               </w:rPr>
-              <w:instrText xml:space="preserve"> PAGEREF _Toc235682287 \h </w:instrText>
+              <w:instrText xml:space="preserve"> PAGEREF _Toc235741249 \h </w:instrText>
             </w:r>
             <w:r>
               <w:rPr>
@@ -2836,7 +2835,7 @@
               <w:noProof/>
             </w:rPr>
           </w:pPr>
-          <w:hyperlink w:anchor="_Toc235682288" w:history="1">
+          <w:hyperlink w:anchor="_Toc235741250" w:history="1">
             <w:r>
               <w:rPr>
                 <w:rStyle w:val="Hyperlink"/>
@@ -2864,7 +2863,7 @@
                 <w:noProof/>
                 <w:webHidden/>
               </w:rPr>
-              <w:instrText xml:space="preserve"> PAGEREF _Toc235682288 \h </w:instrText>
+              <w:instrText xml:space="preserve"> PAGEREF _Toc235741250 \h </w:instrText>
             </w:r>
             <w:r>
               <w:rPr>
@@ -2906,7 +2905,7 @@
               <w:noProof/>
             </w:rPr>
           </w:pPr>
-          <w:hyperlink w:anchor="_Toc235682289" w:history="1">
+          <w:hyperlink w:anchor="_Toc235741251" w:history="1">
             <w:r>
               <w:rPr>
                 <w:rStyle w:val="Hyperlink"/>
@@ -2934,7 +2933,7 @@
                 <w:noProof/>
                 <w:webHidden/>
               </w:rPr>
-              <w:instrText xml:space="preserve"> PAGEREF _Toc235682289 \h </w:instrText>
+              <w:instrText xml:space="preserve"> PAGEREF _Toc235741251 \h </w:instrText>
             </w:r>
             <w:r>
               <w:rPr>
@@ -2976,7 +2975,7 @@
               <w:noProof/>
             </w:rPr>
           </w:pPr>
-          <w:hyperlink w:anchor="_Toc235682290" w:history="1">
+          <w:hyperlink w:anchor="_Toc235741252" w:history="1">
             <w:r>
               <w:rPr>
                 <w:rStyle w:val="Hyperlink"/>
@@ -3004,7 +3003,7 @@
                 <w:noProof/>
                 <w:webHidden/>
               </w:rPr>
-              <w:instrText xml:space="preserve"> PAGEREF _Toc235682290 \h </w:instrText>
+              <w:instrText xml:space="preserve"> PAGEREF _Toc235741252 \h </w:instrText>
             </w:r>
             <w:r>
               <w:rPr>
@@ -3024,7 +3023,7 @@
                 <w:noProof/>
                 <w:webHidden/>
               </w:rPr>
-              <w:t>28</w:t>
+              <w:t>30</w:t>
             </w:r>
             <w:r>
               <w:rPr>
@@ -3046,7 +3045,7 @@
               <w:noProof/>
             </w:rPr>
           </w:pPr>
-          <w:hyperlink w:anchor="_Toc235682291" w:history="1">
+          <w:hyperlink w:anchor="_Toc235741253" w:history="1">
             <w:r>
               <w:rPr>
                 <w:rStyle w:val="Hyperlink"/>
@@ -3074,7 +3073,7 @@
                 <w:noProof/>
                 <w:webHidden/>
               </w:rPr>
-              <w:instrText xml:space="preserve"> PAGEREF _Toc235682291 \h </w:instrText>
+              <w:instrText xml:space="preserve"> PAGEREF _Toc235741253 \h </w:instrText>
             </w:r>
             <w:r>
               <w:rPr>
@@ -3094,7 +3093,7 @@
                 <w:noProof/>
                 <w:webHidden/>
               </w:rPr>
-              <w:t>28</w:t>
+              <w:t>31</w:t>
             </w:r>
             <w:r>
               <w:rPr>
@@ -3116,14 +3115,14 @@
               <w:noProof/>
             </w:rPr>
           </w:pPr>
-          <w:hyperlink w:anchor="_Toc235682292" w:history="1">
+          <w:hyperlink w:anchor="_Toc235741254" w:history="1">
             <w:r>
               <w:rPr>
                 <w:rStyle w:val="Hyperlink"/>
                 <w:rFonts w:ascii="Times New Roman" w:hAnsi="Times New Roman" w:cs="Times New Roman"/>
                 <w:noProof/>
               </w:rPr>
-              <w:t>KIẾN TRÚC HỆ THỐNG</w:t>
+              <w:t>ENTITY RELATIONSHIP DIAGRAM</w:t>
             </w:r>
             <w:r>
               <w:rPr>
@@ -3144,7 +3143,7 @@
                 <w:noProof/>
                 <w:webHidden/>
               </w:rPr>
-              <w:instrText xml:space="preserve"> PAGEREF _Toc235682292 \h </w:instrText>
+              <w:instrText xml:space="preserve"> PAGEREF _Toc235741254 \h </w:instrText>
             </w:r>
             <w:r>
               <w:rPr>
@@ -3164,7 +3163,7 @@
                 <w:noProof/>
                 <w:webHidden/>
               </w:rPr>
-              <w:t>28</w:t>
+              <w:t>32</w:t>
             </w:r>
             <w:r>
               <w:rPr>
@@ -3186,14 +3185,30 @@
               <w:noProof/>
             </w:rPr>
           </w:pPr>
-          <w:hyperlink w:anchor="_Toc235682293" w:history="1">
+          <w:hyperlink w:anchor="_Toc235741255" w:history="1">
             <w:r>
               <w:rPr>
                 <w:rStyle w:val="Hyperlink"/>
                 <w:rFonts w:ascii="Times New Roman" w:hAnsi="Times New Roman" w:cs="Times New Roman"/>
                 <w:noProof/>
               </w:rPr>
-              <w:t>ERD</w:t>
+              <w:t>KIỂN TRÚC HỆ T</w:t>
+            </w:r>
+            <w:r>
+              <w:rPr>
+                <w:rStyle w:val="Hyperlink"/>
+                <w:rFonts w:ascii="Times New Roman" w:hAnsi="Times New Roman" w:cs="Times New Roman"/>
+                <w:noProof/>
+              </w:rPr>
+              <w:t>H</w:t>
+            </w:r>
+            <w:r>
+              <w:rPr>
+                <w:rStyle w:val="Hyperlink"/>
+                <w:rFonts w:ascii="Times New Roman" w:hAnsi="Times New Roman" w:cs="Times New Roman"/>
+                <w:noProof/>
+              </w:rPr>
+              <w:t>ỐNG</w:t>
             </w:r>
             <w:r>
               <w:rPr>
@@ -3214,7 +3229,7 @@
                 <w:noProof/>
                 <w:webHidden/>
               </w:rPr>
-              <w:instrText xml:space="preserve"> PAGEREF _Toc235682293 \h </w:instrText>
+              <w:instrText xml:space="preserve"> PAGEREF _Toc235741255 \h </w:instrText>
             </w:r>
             <w:r>
               <w:rPr>
@@ -3234,7 +3249,7 @@
                 <w:noProof/>
                 <w:webHidden/>
               </w:rPr>
-              <w:t>28</w:t>
+              <w:t>33</w:t>
             </w:r>
             <w:r>
               <w:rPr>
@@ -3256,7 +3271,7 @@
               <w:noProof/>
             </w:rPr>
           </w:pPr>
-          <w:hyperlink w:anchor="_Toc235682294" w:history="1">
+          <w:hyperlink w:anchor="_Toc235741256" w:history="1">
             <w:r>
               <w:rPr>
                 <w:rStyle w:val="Hyperlink"/>
@@ -3284,7 +3299,7 @@
                 <w:noProof/>
                 <w:webHidden/>
               </w:rPr>
-              <w:instrText xml:space="preserve"> PAGEREF _Toc235682294 \h </w:instrText>
+              <w:instrText xml:space="preserve"> PAGEREF _Toc235741256 \h </w:instrText>
             </w:r>
             <w:r>
               <w:rPr>
@@ -3304,7 +3319,7 @@
                 <w:noProof/>
                 <w:webHidden/>
               </w:rPr>
-              <w:t>28</w:t>
+              <w:t>33</w:t>
             </w:r>
             <w:r>
               <w:rPr>
@@ -3326,7 +3341,7 @@
               <w:noProof/>
             </w:rPr>
           </w:pPr>
-          <w:hyperlink w:anchor="_Toc235682295" w:history="1">
+          <w:hyperlink w:anchor="_Toc235741257" w:history="1">
             <w:r>
               <w:rPr>
                 <w:rStyle w:val="Hyperlink"/>
@@ -3354,7 +3369,7 @@
                 <w:noProof/>
                 <w:webHidden/>
               </w:rPr>
-              <w:instrText xml:space="preserve"> PAGEREF _Toc235682295 \h </w:instrText>
+              <w:instrText xml:space="preserve"> PAGEREF _Toc235741257 \h </w:instrText>
             </w:r>
             <w:r>
               <w:rPr>
@@ -3374,7 +3389,7 @@
                 <w:noProof/>
                 <w:webHidden/>
               </w:rPr>
-              <w:t>29</w:t>
+              <w:t>34</w:t>
             </w:r>
             <w:r>
               <w:rPr>
@@ -3410,7 +3425,7 @@
       <w:r>
         <w:br w:type="page"/>
       </w:r>
-      <w:bookmarkStart w:id="5" w:name="_Toc235682258"/>
+      <w:bookmarkStart w:id="5" w:name="_Toc235741220"/>
       <w:r>
         <w:rPr>
           <w:rFonts w:ascii="Times New Roman" w:hAnsi="Times New Roman" w:cs="Times New Roman"/>
@@ -3532,23 +3547,7 @@
             <w:rFonts w:ascii="Times New Roman" w:hAnsi="Times New Roman" w:cs="Times New Roman"/>
             <w:noProof/>
           </w:rPr>
-          <w:t>Hình 2: Activity Diagram mô t</w:t>
-        </w:r>
-        <w:r>
-          <w:rPr>
-            <w:rStyle w:val="Hyperlink"/>
-            <w:rFonts w:ascii="Times New Roman" w:hAnsi="Times New Roman" w:cs="Times New Roman"/>
-            <w:noProof/>
-          </w:rPr>
-          <w:t>ả</w:t>
-        </w:r>
-        <w:r>
-          <w:rPr>
-            <w:rStyle w:val="Hyperlink"/>
-            <w:rFonts w:ascii="Times New Roman" w:hAnsi="Times New Roman" w:cs="Times New Roman"/>
-            <w:noProof/>
-          </w:rPr>
-          <w:t xml:space="preserve"> đăng nhập hệ thống</w:t>
+          <w:t>Hình 2: Activity Diagram mô tả đăng nhập hệ thống</w:t>
         </w:r>
         <w:r>
           <w:rPr>
@@ -4052,7 +4051,7 @@
           <w:rFonts w:ascii="Times New Roman" w:hAnsi="Times New Roman" w:cs="Times New Roman"/>
         </w:rPr>
       </w:pPr>
-      <w:bookmarkStart w:id="6" w:name="_Toc235682259"/>
+      <w:bookmarkStart w:id="6" w:name="_Toc235741221"/>
       <w:r>
         <w:rPr>
           <w:rFonts w:ascii="Times New Roman" w:hAnsi="Times New Roman" w:cs="Times New Roman"/>
@@ -4866,12 +4865,46 @@
       <w:r>
         <w:fldChar w:fldCharType="end"/>
       </w:r>
-      <w:fldSimple w:instr=" TOC \h \z \c &quot;Bảng&quot; "/>
-      <w:fldSimple w:instr=" TOC \h \z \c &quot;Bảng&quot; "/>
+      <w:r>
+        <w:fldChar w:fldCharType="begin"/>
+      </w:r>
+      <w:r>
+        <w:instrText xml:space="preserve"> TOC \h \z \c "B</w:instrText>
+      </w:r>
+      <w:r>
+        <w:instrText>ả</w:instrText>
+      </w:r>
+      <w:r>
+        <w:instrText xml:space="preserve">ng" </w:instrText>
+      </w:r>
+      <w:r>
+        <w:fldChar w:fldCharType="separate"/>
+      </w:r>
+      <w:r>
+        <w:fldChar w:fldCharType="end"/>
+      </w:r>
+      <w:r>
+        <w:fldChar w:fldCharType="begin"/>
+      </w:r>
+      <w:r>
+        <w:instrText xml:space="preserve"> TOC \h \z \c "B</w:instrText>
+      </w:r>
+      <w:r>
+        <w:instrText>ả</w:instrText>
+      </w:r>
+      <w:r>
+        <w:instrText xml:space="preserve">ng" </w:instrText>
+      </w:r>
+      <w:r>
+        <w:fldChar w:fldCharType="separate"/>
+      </w:r>
+      <w:r>
+        <w:fldChar w:fldCharType="end"/>
+      </w:r>
       <w:r>
         <w:br w:type="page"/>
       </w:r>
-      <w:bookmarkStart w:id="7" w:name="_Toc235682260"/>
+      <w:bookmarkStart w:id="7" w:name="_Toc235741222"/>
       <w:r>
         <w:rPr>
           <w:rFonts w:ascii="Times New Roman" w:hAnsi="Times New Roman" w:cs="Times New Roman"/>
@@ -4924,7 +4957,7 @@
         </w:rPr>
       </w:pPr>
       <w:bookmarkStart w:id="8" w:name="_Toc235563700"/>
-      <w:bookmarkStart w:id="9" w:name="_Toc235682261"/>
+      <w:bookmarkStart w:id="9" w:name="_Toc235741223"/>
       <w:r>
         <w:rPr>
           <w:rFonts w:ascii="Times New Roman" w:hAnsi="Times New Roman" w:cs="Times New Roman"/>
@@ -4943,7 +4976,7 @@
         </w:rPr>
       </w:pPr>
       <w:bookmarkStart w:id="10" w:name="_Toc235563701"/>
-      <w:bookmarkStart w:id="11" w:name="_Toc235682262"/>
+      <w:bookmarkStart w:id="11" w:name="_Toc235741224"/>
       <w:r>
         <w:rPr>
           <w:rFonts w:ascii="Times New Roman" w:hAnsi="Times New Roman" w:cs="Times New Roman"/>
@@ -4986,7 +5019,7 @@
         </w:rPr>
       </w:pPr>
       <w:bookmarkStart w:id="12" w:name="_Toc235563702"/>
-      <w:bookmarkStart w:id="13" w:name="_Toc235682263"/>
+      <w:bookmarkStart w:id="13" w:name="_Toc235741225"/>
       <w:r>
         <w:rPr>
           <w:rFonts w:ascii="Times New Roman" w:hAnsi="Times New Roman" w:cs="Times New Roman"/>
@@ -5023,7 +5056,7 @@
         </w:rPr>
       </w:pPr>
       <w:bookmarkStart w:id="14" w:name="_Toc235563703"/>
-      <w:bookmarkStart w:id="15" w:name="_Toc235682264"/>
+      <w:bookmarkStart w:id="15" w:name="_Toc235741226"/>
       <w:r>
         <w:rPr>
           <w:rFonts w:ascii="Times New Roman" w:hAnsi="Times New Roman" w:cs="Times New Roman"/>
@@ -5204,7 +5237,7 @@
         </w:rPr>
       </w:pPr>
       <w:bookmarkStart w:id="16" w:name="_Toc235563704"/>
-      <w:bookmarkStart w:id="17" w:name="_Toc235682265"/>
+      <w:bookmarkStart w:id="17" w:name="_Toc235741227"/>
       <w:r>
         <w:rPr>
           <w:rFonts w:ascii="Times New Roman" w:hAnsi="Times New Roman" w:cs="Times New Roman"/>
@@ -5351,7 +5384,7 @@
         </w:rPr>
       </w:pPr>
       <w:bookmarkStart w:id="18" w:name="_Toc235563705"/>
-      <w:bookmarkStart w:id="19" w:name="_Toc235682266"/>
+      <w:bookmarkStart w:id="19" w:name="_Toc235741228"/>
       <w:r>
         <w:rPr>
           <w:rFonts w:ascii="Times New Roman" w:hAnsi="Times New Roman" w:cs="Times New Roman"/>
@@ -5371,7 +5404,7 @@
         </w:rPr>
       </w:pPr>
       <w:bookmarkStart w:id="20" w:name="_Toc235563706"/>
-      <w:bookmarkStart w:id="21" w:name="_Toc235682267"/>
+      <w:bookmarkStart w:id="21" w:name="_Toc235741229"/>
       <w:r>
         <w:rPr>
           <w:rFonts w:ascii="Times New Roman" w:hAnsi="Times New Roman" w:cs="Times New Roman"/>
@@ -5390,7 +5423,7 @@
         </w:rPr>
       </w:pPr>
       <w:bookmarkStart w:id="22" w:name="_Toc235563707"/>
-      <w:bookmarkStart w:id="23" w:name="_Toc235682268"/>
+      <w:bookmarkStart w:id="23" w:name="_Toc235741230"/>
       <w:r>
         <w:rPr>
           <w:rFonts w:ascii="Times New Roman" w:hAnsi="Times New Roman" w:cs="Times New Roman"/>
@@ -5820,7 +5853,7 @@
         </w:rPr>
       </w:pPr>
       <w:bookmarkStart w:id="24" w:name="_Toc235563708"/>
-      <w:bookmarkStart w:id="25" w:name="_Toc235682269"/>
+      <w:bookmarkStart w:id="25" w:name="_Toc235741231"/>
       <w:r>
         <w:rPr>
           <w:rFonts w:ascii="Times New Roman" w:hAnsi="Times New Roman" w:cs="Times New Roman"/>
@@ -6908,7 +6941,7 @@
           <w:rFonts w:ascii="Times New Roman" w:hAnsi="Times New Roman" w:cs="Times New Roman"/>
         </w:rPr>
       </w:pPr>
-      <w:bookmarkStart w:id="27" w:name="_Toc235682270"/>
+      <w:bookmarkStart w:id="27" w:name="_Toc235741232"/>
       <w:r>
         <w:rPr>
           <w:rFonts w:ascii="Times New Roman" w:hAnsi="Times New Roman" w:cs="Times New Roman"/>
@@ -6924,7 +6957,7 @@
           <w:rFonts w:ascii="Times New Roman" w:hAnsi="Times New Roman" w:cs="Times New Roman"/>
         </w:rPr>
       </w:pPr>
-      <w:bookmarkStart w:id="28" w:name="_Toc235682271"/>
+      <w:bookmarkStart w:id="28" w:name="_Toc235741233"/>
       <w:r>
         <w:rPr>
           <w:rFonts w:ascii="Times New Roman" w:hAnsi="Times New Roman" w:cs="Times New Roman"/>
@@ -7073,7 +7106,7 @@
           <w:rFonts w:ascii="Times New Roman" w:hAnsi="Times New Roman" w:cs="Times New Roman"/>
         </w:rPr>
       </w:pPr>
-      <w:bookmarkStart w:id="29" w:name="_Toc235682272"/>
+      <w:bookmarkStart w:id="29" w:name="_Toc235741234"/>
       <w:r>
         <w:rPr>
           <w:rFonts w:ascii="Times New Roman" w:hAnsi="Times New Roman" w:cs="Times New Roman"/>
@@ -7221,7 +7254,7 @@
           <w:rFonts w:ascii="Times New Roman" w:hAnsi="Times New Roman" w:cs="Times New Roman"/>
         </w:rPr>
       </w:pPr>
-      <w:bookmarkStart w:id="30" w:name="_Toc235682273"/>
+      <w:bookmarkStart w:id="30" w:name="_Toc235741235"/>
       <w:r>
         <w:rPr>
           <w:rFonts w:ascii="Times New Roman" w:hAnsi="Times New Roman" w:cs="Times New Roman"/>
@@ -7352,7 +7385,7 @@
           <w:rFonts w:ascii="Times New Roman" w:hAnsi="Times New Roman" w:cs="Times New Roman"/>
         </w:rPr>
       </w:pPr>
-      <w:bookmarkStart w:id="31" w:name="_Toc235682274"/>
+      <w:bookmarkStart w:id="31" w:name="_Toc235741236"/>
       <w:r>
         <w:rPr>
           <w:rFonts w:ascii="Times New Roman" w:hAnsi="Times New Roman" w:cs="Times New Roman"/>
@@ -7568,7 +7601,7 @@
           <w:rFonts w:ascii="Times New Roman" w:hAnsi="Times New Roman" w:cs="Times New Roman"/>
         </w:rPr>
       </w:pPr>
-      <w:bookmarkStart w:id="32" w:name="_Toc235682275"/>
+      <w:bookmarkStart w:id="32" w:name="_Toc235741237"/>
       <w:r>
         <w:rPr>
           <w:rFonts w:ascii="Times New Roman" w:hAnsi="Times New Roman" w:cs="Times New Roman"/>
@@ -7748,7 +7781,7 @@
         </w:rPr>
       </w:pPr>
       <w:bookmarkStart w:id="33" w:name="_Toc235563709"/>
-      <w:bookmarkStart w:id="34" w:name="_Toc235682276"/>
+      <w:bookmarkStart w:id="34" w:name="_Toc235741238"/>
       <w:r>
         <w:rPr>
           <w:rFonts w:ascii="Times New Roman" w:hAnsi="Times New Roman" w:cs="Times New Roman"/>
@@ -7767,7 +7800,7 @@
         </w:rPr>
       </w:pPr>
       <w:bookmarkStart w:id="35" w:name="_Toc235563710"/>
-      <w:bookmarkStart w:id="36" w:name="_Toc235682277"/>
+      <w:bookmarkStart w:id="36" w:name="_Toc235741239"/>
       <w:r>
         <w:rPr>
           <w:rFonts w:ascii="Times New Roman" w:hAnsi="Times New Roman" w:cs="Times New Roman"/>
@@ -8035,7 +8068,7 @@
         </w:rPr>
       </w:pPr>
       <w:bookmarkStart w:id="37" w:name="_Toc235563711"/>
-      <w:bookmarkStart w:id="38" w:name="_Toc235682278"/>
+      <w:bookmarkStart w:id="38" w:name="_Toc235741240"/>
       <w:r>
         <w:rPr>
           <w:rFonts w:ascii="Times New Roman" w:hAnsi="Times New Roman" w:cs="Times New Roman"/>
@@ -8296,7 +8329,16 @@
           <w:sz w:val="26"/>
           <w:szCs w:val="26"/>
         </w:rPr>
-        <w:t>Prisma hoạt động dựa trên tệp schema.pri</w:t>
+        <w:t xml:space="preserve">Prisma hoạt động dựa trên tệp </w:t>
+      </w:r>
+      <w:proofErr w:type="gramStart"/>
+      <w:r>
+        <w:rPr>
+          <w:rFonts w:ascii="Times New Roman" w:hAnsi="Times New Roman" w:cs="Times New Roman"/>
+          <w:sz w:val="26"/>
+          <w:szCs w:val="26"/>
+        </w:rPr>
+        <w:t>schema.pri</w:t>
       </w:r>
       <w:r>
         <w:rPr>
@@ -8312,7 +8354,16 @@
           <w:sz w:val="26"/>
           <w:szCs w:val="26"/>
         </w:rPr>
-        <w:t xml:space="preserve">ma nơi định nghĩa các Model và thông tin kết nối đến cơ sở dữ liệu. Dựa trên tệp này, Prisma sẽ sinh ra </w:t>
+        <w:t>ma</w:t>
+      </w:r>
+      <w:proofErr w:type="gramEnd"/>
+      <w:r>
+        <w:rPr>
+          <w:rFonts w:ascii="Times New Roman" w:hAnsi="Times New Roman" w:cs="Times New Roman"/>
+          <w:sz w:val="26"/>
+          <w:szCs w:val="26"/>
+        </w:rPr>
+        <w:t xml:space="preserve"> nơi định nghĩa các Model và thông tin kết nối đến cơ sở dữ liệu. Dựa trên tệp này, Prisma sẽ sinh ra </w:t>
       </w:r>
       <w:r>
         <w:rPr>
@@ -8378,7 +8429,7 @@
         </w:rPr>
       </w:pPr>
       <w:bookmarkStart w:id="39" w:name="_Toc235563712"/>
-      <w:bookmarkStart w:id="40" w:name="_Toc235682279"/>
+      <w:bookmarkStart w:id="40" w:name="_Toc235741241"/>
       <w:r>
         <w:rPr>
           <w:rFonts w:ascii="Times New Roman" w:hAnsi="Times New Roman" w:cs="Times New Roman"/>
@@ -8520,7 +8571,7 @@
         </w:rPr>
       </w:pPr>
       <w:bookmarkStart w:id="41" w:name="_Toc235563713"/>
-      <w:bookmarkStart w:id="42" w:name="_Toc235682280"/>
+      <w:bookmarkStart w:id="42" w:name="_Toc235741242"/>
       <w:r>
         <w:rPr>
           <w:rFonts w:ascii="Times New Roman" w:hAnsi="Times New Roman" w:cs="Times New Roman"/>
@@ -8539,7 +8590,7 @@
         </w:rPr>
       </w:pPr>
       <w:bookmarkStart w:id="43" w:name="_Toc235563714"/>
-      <w:bookmarkStart w:id="44" w:name="_Toc235682281"/>
+      <w:bookmarkStart w:id="44" w:name="_Toc235741243"/>
       <w:r>
         <w:rPr>
           <w:rFonts w:ascii="Times New Roman" w:hAnsi="Times New Roman" w:cs="Times New Roman"/>
@@ -8557,7 +8608,7 @@
         </w:rPr>
       </w:pPr>
       <w:bookmarkStart w:id="45" w:name="_Toc235563715"/>
-      <w:bookmarkStart w:id="46" w:name="_Toc235682282"/>
+      <w:bookmarkStart w:id="46" w:name="_Toc235741244"/>
       <w:r>
         <w:rPr>
           <w:rFonts w:ascii="Times New Roman" w:hAnsi="Times New Roman" w:cs="Times New Roman"/>
@@ -8593,7 +8644,7 @@
         </w:rPr>
       </w:pPr>
       <w:bookmarkStart w:id="47" w:name="_Toc235563716"/>
-      <w:bookmarkStart w:id="48" w:name="_Toc235682283"/>
+      <w:bookmarkStart w:id="48" w:name="_Toc235741245"/>
       <w:r>
         <w:rPr>
           <w:rFonts w:ascii="Times New Roman" w:hAnsi="Times New Roman" w:cs="Times New Roman"/>
@@ -8665,7 +8716,7 @@
         </w:rPr>
       </w:pPr>
       <w:bookmarkStart w:id="49" w:name="_Toc235563717"/>
-      <w:bookmarkStart w:id="50" w:name="_Toc235682284"/>
+      <w:bookmarkStart w:id="50" w:name="_Toc235741246"/>
       <w:r>
         <w:rPr>
           <w:rFonts w:ascii="Times New Roman" w:hAnsi="Times New Roman" w:cs="Times New Roman"/>
@@ -8773,7 +8824,7 @@
         </w:rPr>
       </w:pPr>
       <w:bookmarkStart w:id="51" w:name="_Toc235563718"/>
-      <w:bookmarkStart w:id="52" w:name="_Toc235682285"/>
+      <w:bookmarkStart w:id="52" w:name="_Toc235741247"/>
       <w:r>
         <w:rPr>
           <w:rFonts w:ascii="Times New Roman" w:hAnsi="Times New Roman" w:cs="Times New Roman"/>
@@ -9666,7 +9717,7 @@
         </w:rPr>
       </w:pPr>
       <w:bookmarkStart w:id="53" w:name="_Toc235563719"/>
-      <w:bookmarkStart w:id="54" w:name="_Toc235682286"/>
+      <w:bookmarkStart w:id="54" w:name="_Toc235741248"/>
       <w:r>
         <w:rPr>
           <w:rFonts w:ascii="Times New Roman" w:hAnsi="Times New Roman" w:cs="Times New Roman"/>
@@ -9773,7 +9824,7 @@
         </w:rPr>
       </w:pPr>
       <w:bookmarkStart w:id="55" w:name="_Toc235563720"/>
-      <w:bookmarkStart w:id="56" w:name="_Toc235682287"/>
+      <w:bookmarkStart w:id="56" w:name="_Toc235741249"/>
       <w:r>
         <w:rPr>
           <w:rFonts w:ascii="Times New Roman" w:hAnsi="Times New Roman" w:cs="Times New Roman"/>
@@ -9916,7 +9967,7 @@
         </w:rPr>
       </w:pPr>
       <w:bookmarkStart w:id="59" w:name="_Toc235563721"/>
-      <w:bookmarkStart w:id="60" w:name="_Toc235682288"/>
+      <w:bookmarkStart w:id="60" w:name="_Toc235741250"/>
       <w:r>
         <w:rPr>
           <w:rFonts w:ascii="Times New Roman" w:hAnsi="Times New Roman" w:cs="Times New Roman"/>
@@ -11203,6 +11254,7 @@
         </w:rPr>
         <w:t>UC</w:t>
       </w:r>
+      <w:proofErr w:type="gramStart"/>
       <w:r>
         <w:rPr>
           <w:rFonts w:ascii="Times New Roman" w:hAnsi="Times New Roman" w:cs="Times New Roman"/>
@@ -11225,7 +11277,16 @@
           <w:sz w:val="26"/>
           <w:szCs w:val="26"/>
         </w:rPr>
-        <w:t>Quản lý Lead</w:t>
+        <w:t>Quản</w:t>
+      </w:r>
+      <w:proofErr w:type="gramEnd"/>
+      <w:r>
+        <w:rPr>
+          <w:rFonts w:ascii="Times New Roman" w:hAnsi="Times New Roman" w:cs="Times New Roman"/>
+          <w:sz w:val="26"/>
+          <w:szCs w:val="26"/>
+        </w:rPr>
+        <w:t xml:space="preserve"> lý Lead</w:t>
       </w:r>
       <w:bookmarkEnd w:id="62"/>
     </w:p>
@@ -15469,7 +15530,7 @@
         </w:rPr>
       </w:pPr>
       <w:bookmarkStart w:id="71" w:name="_Toc235563722"/>
-      <w:bookmarkStart w:id="72" w:name="_Toc235682289"/>
+      <w:bookmarkStart w:id="72" w:name="_Toc235741251"/>
       <w:r>
         <w:rPr>
           <w:rFonts w:ascii="Times New Roman" w:hAnsi="Times New Roman" w:cs="Times New Roman"/>
@@ -16219,7 +16280,7 @@
         </w:rPr>
       </w:pPr>
       <w:bookmarkStart w:id="78" w:name="_Toc235563723"/>
-      <w:bookmarkStart w:id="79" w:name="_Toc235682290"/>
+      <w:bookmarkStart w:id="79" w:name="_Toc235741252"/>
       <w:r>
         <w:rPr>
           <w:rFonts w:ascii="Times New Roman" w:hAnsi="Times New Roman" w:cs="Times New Roman"/>
@@ -16246,7 +16307,7 @@
         </w:rPr>
       </w:pPr>
       <w:bookmarkStart w:id="80" w:name="_Toc235563724"/>
-      <w:bookmarkStart w:id="81" w:name="_Toc235682291"/>
+      <w:bookmarkStart w:id="81" w:name="_Toc235741253"/>
       <w:r>
         <w:rPr>
           <w:rFonts w:ascii="Times New Roman" w:hAnsi="Times New Roman" w:cs="Times New Roman"/>
@@ -16460,7 +16521,25 @@
           <w:sz w:val="26"/>
           <w:szCs w:val="26"/>
         </w:rPr>
-        <w:t>Leads – Customers: quan hệ 1-0..1, một khách hàng tiềm năng có thể được chuyển thành một khách hàng hoặc không.</w:t>
+        <w:t>Leads – Customers: quan hệ 1-</w:t>
+      </w:r>
+      <w:proofErr w:type="gramStart"/>
+      <w:r>
+        <w:rPr>
+          <w:rFonts w:ascii="Times New Roman" w:hAnsi="Times New Roman" w:cs="Times New Roman"/>
+          <w:sz w:val="26"/>
+          <w:szCs w:val="26"/>
+        </w:rPr>
+        <w:t>0..</w:t>
+      </w:r>
+      <w:proofErr w:type="gramEnd"/>
+      <w:r>
+        <w:rPr>
+          <w:rFonts w:ascii="Times New Roman" w:hAnsi="Times New Roman" w:cs="Times New Roman"/>
+          <w:sz w:val="26"/>
+          <w:szCs w:val="26"/>
+        </w:rPr>
+        <w:t>1, một khách hàng tiềm năng có thể được chuyển thành một khách hàng hoặc không.</w:t>
       </w:r>
     </w:p>
     <w:p>
@@ -16647,40 +16726,14 @@
           <w:rFonts w:ascii="Times New Roman" w:hAnsi="Times New Roman" w:cs="Times New Roman"/>
         </w:rPr>
       </w:pPr>
-      <w:bookmarkStart w:id="83" w:name="_Toc235563725"/>
-      <w:bookmarkStart w:id="84" w:name="_Toc235682292"/>
-      <w:r>
-        <w:rPr>
-          <w:rFonts w:ascii="Times New Roman" w:hAnsi="Times New Roman" w:cs="Times New Roman"/>
-        </w:rPr>
-        <w:t>KIẾN TRÚC HỆ THỐNG</w:t>
+      <w:bookmarkStart w:id="83" w:name="_Toc235741254"/>
+      <w:r>
+        <w:rPr>
+          <w:rFonts w:ascii="Times New Roman" w:hAnsi="Times New Roman" w:cs="Times New Roman"/>
+        </w:rPr>
+        <w:t>ENTITY RELATIONSHIP DIAGRAM</w:t>
       </w:r>
       <w:bookmarkEnd w:id="83"/>
-      <w:bookmarkEnd w:id="84"/>
-    </w:p>
-    <w:p>
-      <w:pPr>
-        <w:rPr>
-          <w:rFonts w:ascii="Times New Roman" w:hAnsi="Times New Roman" w:cs="Times New Roman"/>
-          <w:sz w:val="26"/>
-          <w:szCs w:val="26"/>
-        </w:rPr>
-      </w:pPr>
-    </w:p>
-    <w:p>
-      <w:pPr>
-        <w:pStyle w:val="Heading2"/>
-        <w:rPr>
-          <w:rFonts w:ascii="Times New Roman" w:hAnsi="Times New Roman" w:cs="Times New Roman"/>
-        </w:rPr>
-      </w:pPr>
-      <w:r>
-        <w:rPr>
-          <w:rFonts w:ascii="Times New Roman" w:hAnsi="Times New Roman" w:cs="Times New Roman"/>
-        </w:rPr>
-        <w:lastRenderedPageBreak/>
-        <w:t>ENTITY RELATIONSHIP DIAGRAM</w:t>
-      </w:r>
     </w:p>
     <w:p>
       <w:pPr>
@@ -16694,9 +16747,9 @@
           <w:szCs w:val="26"/>
         </w:rPr>
         <w:drawing>
-          <wp:inline distT="0" distB="0" distL="0" distR="0" wp14:anchorId="5843E903" wp14:editId="09492068">
-            <wp:extent cx="5791835" cy="4128770"/>
-            <wp:effectExtent l="0" t="0" r="0" b="5080"/>
+          <wp:inline distT="0" distB="0" distL="0" distR="0" wp14:anchorId="5843E903" wp14:editId="0E750C96">
+            <wp:extent cx="6092919" cy="4343400"/>
+            <wp:effectExtent l="0" t="0" r="3175" b="0"/>
             <wp:docPr id="4" name="Picture 4"/>
             <wp:cNvGraphicFramePr>
               <a:graphicFrameLocks xmlns:a="http://schemas.openxmlformats.org/drawingml/2006/main" noChangeAspect="1"/>
@@ -16723,7 +16776,7 @@
                   <pic:spPr>
                     <a:xfrm>
                       <a:off x="0" y="0"/>
-                      <a:ext cx="5791835" cy="4128770"/>
+                      <a:ext cx="6115742" cy="4359670"/>
                     </a:xfrm>
                     <a:prstGeom prst="rect">
                       <a:avLst/>
@@ -16745,7 +16798,7 @@
           <w:szCs w:val="26"/>
         </w:rPr>
       </w:pPr>
-      <w:bookmarkStart w:id="85" w:name="_Toc235739355"/>
+      <w:bookmarkStart w:id="84" w:name="_Toc235739355"/>
       <w:r>
         <w:rPr>
           <w:rFonts w:ascii="Times New Roman" w:hAnsi="Times New Roman" w:cs="Times New Roman"/>
@@ -16803,6 +16856,57 @@
         </w:rPr>
         <w:t>: Entity Relationshop Diagram</w:t>
       </w:r>
+      <w:bookmarkEnd w:id="84"/>
+    </w:p>
+    <w:p>
+      <w:pPr>
+        <w:rPr>
+          <w:rFonts w:ascii="Times New Roman" w:hAnsi="Times New Roman" w:cs="Times New Roman"/>
+          <w:sz w:val="26"/>
+          <w:szCs w:val="26"/>
+        </w:rPr>
+      </w:pPr>
+      <w:r>
+        <w:rPr>
+          <w:rFonts w:ascii="Times New Roman" w:hAnsi="Times New Roman" w:cs="Times New Roman"/>
+          <w:sz w:val="26"/>
+          <w:szCs w:val="26"/>
+        </w:rPr>
+        <w:lastRenderedPageBreak/>
+        <w:t>ERD mô tả mô hình cơ sở dữ liệu hệ thống CRM. Cơ sở dữ liệu bao gồm 14 bảng được liên kết với nhau thông qua khóa chính và khóa ngoại nhằm đảm bảo tính toàn vẹn dữ liệu.</w:t>
+      </w:r>
+    </w:p>
+    <w:p>
+      <w:pPr>
+        <w:rPr>
+          <w:rFonts w:ascii="Times New Roman" w:hAnsi="Times New Roman" w:cs="Times New Roman"/>
+          <w:sz w:val="26"/>
+          <w:szCs w:val="26"/>
+        </w:rPr>
+      </w:pPr>
+      <w:r>
+        <w:rPr>
+          <w:rFonts w:ascii="Times New Roman" w:hAnsi="Times New Roman" w:cs="Times New Roman"/>
+          <w:sz w:val="26"/>
+          <w:szCs w:val="26"/>
+        </w:rPr>
+        <w:t>Trong đó, bảng Users lưu thông tin các nhân viên thực hiện các thao tác trong hệ thống và được phân quyền thông qua bảng Roles. Bảng Leads lưu thông tin khách hàng tiềm năng, sau đó sẽ được chuyển đổi thành Customer. Mỗi Customer sẽ phát sinh nhiều Deal, mỗi Deal bao gồm Activity, Task và Quote. Báo giá được lưu trong bảng Quotes và chi tiết sản phẩm được lưu trong bảng QuoteDetails.</w:t>
+      </w:r>
+    </w:p>
+    <w:p>
+      <w:pPr>
+        <w:pStyle w:val="Heading2"/>
+        <w:rPr>
+          <w:rFonts w:ascii="Times New Roman" w:hAnsi="Times New Roman" w:cs="Times New Roman"/>
+        </w:rPr>
+      </w:pPr>
+      <w:bookmarkStart w:id="85" w:name="_Toc235741255"/>
+      <w:r>
+        <w:rPr>
+          <w:rFonts w:ascii="Times New Roman" w:hAnsi="Times New Roman" w:cs="Times New Roman"/>
+        </w:rPr>
+        <w:t>KIỂN TRÚC HỆ THỐNG</w:t>
+      </w:r>
       <w:bookmarkEnd w:id="85"/>
     </w:p>
     <w:p>
@@ -16813,31 +16917,6 @@
           <w:szCs w:val="26"/>
         </w:rPr>
       </w:pPr>
-      <w:r>
-        <w:rPr>
-          <w:rFonts w:ascii="Times New Roman" w:hAnsi="Times New Roman" w:cs="Times New Roman"/>
-          <w:sz w:val="26"/>
-          <w:szCs w:val="26"/>
-        </w:rPr>
-        <w:t>ERD mô tả mô hình cơ sở dữ liệu hệ thống CRM. Cơ sở dữ liệu bao gồm 14 bảng được liên kết với nhau thông qua khóa chính và khóa ngoại nhằm đảm bảo tính toàn vẹn dữ liệu.</w:t>
-      </w:r>
-    </w:p>
-    <w:p>
-      <w:pPr>
-        <w:rPr>
-          <w:rFonts w:ascii="Times New Roman" w:hAnsi="Times New Roman" w:cs="Times New Roman"/>
-          <w:sz w:val="26"/>
-          <w:szCs w:val="26"/>
-        </w:rPr>
-      </w:pPr>
-      <w:r>
-        <w:rPr>
-          <w:rFonts w:ascii="Times New Roman" w:hAnsi="Times New Roman" w:cs="Times New Roman"/>
-          <w:sz w:val="26"/>
-          <w:szCs w:val="26"/>
-        </w:rPr>
-        <w:t>Trong đó, bảng Users lưu thông tin các nhân viên thực hiện các thao tác trong hệ thống và được phân quyền thông qua bảng Roles. Bảng Leads lưu thông tin khách hàng tiềm năng, sau đó sẽ được chuyển đổi thành Customer. Mỗi Customer sẽ phát sinh nhiều Deal, mỗi Deal bao gồm Activity, Task và Quote. Báo giá được lưu trong bảng Quotes và chi tiết sản phẩm được lưu trong bảng QuoteDetails.</w:t>
-      </w:r>
     </w:p>
     <w:p>
       <w:pPr>
@@ -16847,7 +16926,7 @@
         </w:rPr>
       </w:pPr>
       <w:bookmarkStart w:id="86" w:name="_Toc235563727"/>
-      <w:bookmarkStart w:id="87" w:name="_Toc235682294"/>
+      <w:bookmarkStart w:id="87" w:name="_Toc235741256"/>
       <w:r>
         <w:rPr>
           <w:rFonts w:ascii="Times New Roman" w:hAnsi="Times New Roman" w:cs="Times New Roman"/>
@@ -16892,7 +16971,7 @@
         </w:rPr>
       </w:pPr>
       <w:bookmarkStart w:id="88" w:name="_Toc235563729"/>
-      <w:bookmarkStart w:id="89" w:name="_Toc235682295"/>
+      <w:bookmarkStart w:id="89" w:name="_Toc235741257"/>
       <w:r>
         <w:rPr>
           <w:rFonts w:ascii="Times New Roman" w:hAnsi="Times New Roman" w:cs="Times New Roman"/>
@@ -16937,7 +17016,21 @@
           <w:rPr>
             <w:rStyle w:val="Hyperlink"/>
           </w:rPr>
-          <w:t>clauderic/dnd-kit: The modern toolkit for building drag and drop interfaces</w:t>
+          <w:t xml:space="preserve">clauderic/dnd-kit: The modern toolkit for building </w:t>
+        </w:r>
+        <w:proofErr w:type="gramStart"/>
+        <w:r>
+          <w:rPr>
+            <w:rStyle w:val="Hyperlink"/>
+          </w:rPr>
+          <w:t>drag</w:t>
+        </w:r>
+        <w:proofErr w:type="gramEnd"/>
+        <w:r>
+          <w:rPr>
+            <w:rStyle w:val="Hyperlink"/>
+          </w:rPr>
+          <w:t xml:space="preserve"> and drop interfaces</w:t>
         </w:r>
       </w:hyperlink>
     </w:p>

</xml_diff>

<commit_message>
feat: cập nhật kiến trúc hệ thống
</commit_message>
<xml_diff>
--- a/docs/BaoCao/BaoCao.docx
+++ b/docs/BaoCao/BaoCao.docx
@@ -3192,23 +3192,7 @@
                 <w:rFonts w:ascii="Times New Roman" w:hAnsi="Times New Roman" w:cs="Times New Roman"/>
                 <w:noProof/>
               </w:rPr>
-              <w:t>KIỂN TRÚC HỆ T</w:t>
-            </w:r>
-            <w:r>
-              <w:rPr>
-                <w:rStyle w:val="Hyperlink"/>
-                <w:rFonts w:ascii="Times New Roman" w:hAnsi="Times New Roman" w:cs="Times New Roman"/>
-                <w:noProof/>
-              </w:rPr>
-              <w:t>H</w:t>
-            </w:r>
-            <w:r>
-              <w:rPr>
-                <w:rStyle w:val="Hyperlink"/>
-                <w:rFonts w:ascii="Times New Roman" w:hAnsi="Times New Roman" w:cs="Times New Roman"/>
-                <w:noProof/>
-              </w:rPr>
-              <w:t>ỐNG</w:t>
+              <w:t>KIỂN TRÚC HỆ THỐNG</w:t>
             </w:r>
             <w:r>
               <w:rPr>
@@ -3470,7 +3454,7 @@
         </w:rPr>
         <w:fldChar w:fldCharType="separate"/>
       </w:r>
-      <w:hyperlink w:anchor="_Toc235739348" w:history="1">
+      <w:hyperlink w:anchor="_Toc235770285" w:history="1">
         <w:r>
           <w:rPr>
             <w:rStyle w:val="Hyperlink"/>
@@ -3498,7 +3482,7 @@
             <w:noProof/>
             <w:webHidden/>
           </w:rPr>
-          <w:instrText xml:space="preserve"> PAGEREF _Toc235739348 \h </w:instrText>
+          <w:instrText xml:space="preserve"> PAGEREF _Toc235770285 \h </w:instrText>
         </w:r>
         <w:r>
           <w:rPr>
@@ -3540,7 +3524,7 @@
           <w:noProof/>
         </w:rPr>
       </w:pPr>
-      <w:hyperlink w:anchor="_Toc235739349" w:history="1">
+      <w:hyperlink w:anchor="_Toc235770286" w:history="1">
         <w:r>
           <w:rPr>
             <w:rStyle w:val="Hyperlink"/>
@@ -3568,7 +3552,7 @@
             <w:noProof/>
             <w:webHidden/>
           </w:rPr>
-          <w:instrText xml:space="preserve"> PAGEREF _Toc235739349 \h </w:instrText>
+          <w:instrText xml:space="preserve"> PAGEREF _Toc235770286 \h </w:instrText>
         </w:r>
         <w:r>
           <w:rPr>
@@ -3610,7 +3594,7 @@
           <w:noProof/>
         </w:rPr>
       </w:pPr>
-      <w:hyperlink w:anchor="_Toc235739350" w:history="1">
+      <w:hyperlink w:anchor="_Toc235770287" w:history="1">
         <w:r>
           <w:rPr>
             <w:rStyle w:val="Hyperlink"/>
@@ -3638,7 +3622,7 @@
             <w:noProof/>
             <w:webHidden/>
           </w:rPr>
-          <w:instrText xml:space="preserve"> PAGEREF _Toc235739350 \h </w:instrText>
+          <w:instrText xml:space="preserve"> PAGEREF _Toc235770287 \h </w:instrText>
         </w:r>
         <w:r>
           <w:rPr>
@@ -3680,7 +3664,7 @@
           <w:noProof/>
         </w:rPr>
       </w:pPr>
-      <w:hyperlink w:anchor="_Toc235739351" w:history="1">
+      <w:hyperlink w:anchor="_Toc235770288" w:history="1">
         <w:r>
           <w:rPr>
             <w:rStyle w:val="Hyperlink"/>
@@ -3708,7 +3692,7 @@
             <w:noProof/>
             <w:webHidden/>
           </w:rPr>
-          <w:instrText xml:space="preserve"> PAGEREF _Toc235739351 \h </w:instrText>
+          <w:instrText xml:space="preserve"> PAGEREF _Toc235770288 \h </w:instrText>
         </w:r>
         <w:r>
           <w:rPr>
@@ -3750,7 +3734,7 @@
           <w:noProof/>
         </w:rPr>
       </w:pPr>
-      <w:hyperlink w:anchor="_Toc235739352" w:history="1">
+      <w:hyperlink w:anchor="_Toc235770289" w:history="1">
         <w:r>
           <w:rPr>
             <w:rStyle w:val="Hyperlink"/>
@@ -3778,7 +3762,7 @@
             <w:noProof/>
             <w:webHidden/>
           </w:rPr>
-          <w:instrText xml:space="preserve"> PAGEREF _Toc235739352 \h </w:instrText>
+          <w:instrText xml:space="preserve"> PAGEREF _Toc235770289 \h </w:instrText>
         </w:r>
         <w:r>
           <w:rPr>
@@ -3820,7 +3804,7 @@
           <w:noProof/>
         </w:rPr>
       </w:pPr>
-      <w:hyperlink w:anchor="_Toc235739353" w:history="1">
+      <w:hyperlink w:anchor="_Toc235770290" w:history="1">
         <w:r>
           <w:rPr>
             <w:rStyle w:val="Hyperlink"/>
@@ -3848,7 +3832,7 @@
             <w:noProof/>
             <w:webHidden/>
           </w:rPr>
-          <w:instrText xml:space="preserve"> PAGEREF _Toc235739353 \h </w:instrText>
+          <w:instrText xml:space="preserve"> PAGEREF _Toc235770290 \h </w:instrText>
         </w:r>
         <w:r>
           <w:rPr>
@@ -3890,7 +3874,7 @@
           <w:noProof/>
         </w:rPr>
       </w:pPr>
-      <w:hyperlink w:anchor="_Toc235739354" w:history="1">
+      <w:hyperlink w:anchor="_Toc235770291" w:history="1">
         <w:r>
           <w:rPr>
             <w:rStyle w:val="Hyperlink"/>
@@ -3918,7 +3902,7 @@
             <w:noProof/>
             <w:webHidden/>
           </w:rPr>
-          <w:instrText xml:space="preserve"> PAGEREF _Toc235739354 \h </w:instrText>
+          <w:instrText xml:space="preserve"> PAGEREF _Toc235770291 \h </w:instrText>
         </w:r>
         <w:r>
           <w:rPr>
@@ -3960,7 +3944,7 @@
           <w:noProof/>
         </w:rPr>
       </w:pPr>
-      <w:hyperlink w:anchor="_Toc235739355" w:history="1">
+      <w:hyperlink w:anchor="_Toc235770292" w:history="1">
         <w:r>
           <w:rPr>
             <w:rStyle w:val="Hyperlink"/>
@@ -3988,7 +3972,77 @@
             <w:noProof/>
             <w:webHidden/>
           </w:rPr>
-          <w:instrText xml:space="preserve"> PAGEREF _Toc235739355 \h </w:instrText>
+          <w:instrText xml:space="preserve"> PAGEREF _Toc235770292 \h </w:instrText>
+        </w:r>
+        <w:r>
+          <w:rPr>
+            <w:noProof/>
+            <w:webHidden/>
+          </w:rPr>
+        </w:r>
+        <w:r>
+          <w:rPr>
+            <w:noProof/>
+            <w:webHidden/>
+          </w:rPr>
+          <w:fldChar w:fldCharType="separate"/>
+        </w:r>
+        <w:r>
+          <w:rPr>
+            <w:noProof/>
+            <w:webHidden/>
+          </w:rPr>
+          <w:t>32</w:t>
+        </w:r>
+        <w:r>
+          <w:rPr>
+            <w:noProof/>
+            <w:webHidden/>
+          </w:rPr>
+          <w:fldChar w:fldCharType="end"/>
+        </w:r>
+      </w:hyperlink>
+    </w:p>
+    <w:p>
+      <w:pPr>
+        <w:pStyle w:val="TableofFigures"/>
+        <w:tabs>
+          <w:tab w:val="right" w:leader="dot" w:pos="9111"/>
+        </w:tabs>
+        <w:rPr>
+          <w:rFonts w:eastAsiaTheme="minorEastAsia"/>
+          <w:noProof/>
+        </w:rPr>
+      </w:pPr>
+      <w:hyperlink r:id="rId9" w:anchor="_Toc235770293" w:history="1">
+        <w:r>
+          <w:rPr>
+            <w:rStyle w:val="Hyperlink"/>
+            <w:rFonts w:ascii="Times New Roman" w:hAnsi="Times New Roman" w:cs="Times New Roman"/>
+            <w:noProof/>
+          </w:rPr>
+          <w:t>Hình 9: Kiến trúc tổng thể</w:t>
+        </w:r>
+        <w:r>
+          <w:rPr>
+            <w:noProof/>
+            <w:webHidden/>
+          </w:rPr>
+          <w:tab/>
+        </w:r>
+        <w:r>
+          <w:rPr>
+            <w:noProof/>
+            <w:webHidden/>
+          </w:rPr>
+          <w:fldChar w:fldCharType="begin"/>
+        </w:r>
+        <w:r>
+          <w:rPr>
+            <w:noProof/>
+            <w:webHidden/>
+          </w:rPr>
+          <w:instrText xml:space="preserve"> PAGEREF _Toc235770293 \h </w:instrText>
         </w:r>
         <w:r>
           <w:rPr>
@@ -4021,48 +4075,6 @@
     </w:p>
     <w:p>
       <w:pPr>
-        <w:rPr>
-          <w:rFonts w:ascii="Times New Roman" w:hAnsi="Times New Roman" w:cs="Times New Roman"/>
-          <w:sz w:val="26"/>
-          <w:szCs w:val="26"/>
-        </w:rPr>
-      </w:pPr>
-      <w:r>
-        <w:rPr>
-          <w:rFonts w:ascii="Times New Roman" w:hAnsi="Times New Roman" w:cs="Times New Roman"/>
-          <w:sz w:val="26"/>
-          <w:szCs w:val="26"/>
-        </w:rPr>
-        <w:fldChar w:fldCharType="end"/>
-      </w:r>
-      <w:r>
-        <w:rPr>
-          <w:rFonts w:ascii="Times New Roman" w:hAnsi="Times New Roman" w:cs="Times New Roman"/>
-          <w:sz w:val="26"/>
-          <w:szCs w:val="26"/>
-        </w:rPr>
-        <w:br w:type="page"/>
-      </w:r>
-    </w:p>
-    <w:p>
-      <w:pPr>
-        <w:pStyle w:val="Heading1"/>
-        <w:rPr>
-          <w:rFonts w:ascii="Times New Roman" w:hAnsi="Times New Roman" w:cs="Times New Roman"/>
-        </w:rPr>
-      </w:pPr>
-      <w:bookmarkStart w:id="6" w:name="_Toc235741221"/>
-      <w:r>
-        <w:rPr>
-          <w:rFonts w:ascii="Times New Roman" w:hAnsi="Times New Roman" w:cs="Times New Roman"/>
-        </w:rPr>
-        <w:lastRenderedPageBreak/>
-        <w:t>DANH MỤC BẢNG</w:t>
-      </w:r>
-      <w:bookmarkEnd w:id="6"/>
-    </w:p>
-    <w:p>
-      <w:pPr>
         <w:pStyle w:val="TableofFigures"/>
         <w:tabs>
           <w:tab w:val="right" w:leader="dot" w:pos="9111"/>
@@ -4072,6 +4084,328 @@
           <w:noProof/>
         </w:rPr>
       </w:pPr>
+      <w:hyperlink w:anchor="_Toc235770294" w:history="1">
+        <w:r>
+          <w:rPr>
+            <w:rStyle w:val="Hyperlink"/>
+            <w:rFonts w:ascii="Times New Roman" w:hAnsi="Times New Roman" w:cs="Times New Roman"/>
+            <w:noProof/>
+          </w:rPr>
+          <w:t>Hình 10: Kiến trúc Modular</w:t>
+        </w:r>
+        <w:r>
+          <w:rPr>
+            <w:noProof/>
+            <w:webHidden/>
+          </w:rPr>
+          <w:tab/>
+        </w:r>
+        <w:r>
+          <w:rPr>
+            <w:noProof/>
+            <w:webHidden/>
+          </w:rPr>
+          <w:fldChar w:fldCharType="begin"/>
+        </w:r>
+        <w:r>
+          <w:rPr>
+            <w:noProof/>
+            <w:webHidden/>
+          </w:rPr>
+          <w:instrText xml:space="preserve"> PAGEREF _Toc235770294 \h </w:instrText>
+        </w:r>
+        <w:r>
+          <w:rPr>
+            <w:noProof/>
+            <w:webHidden/>
+          </w:rPr>
+        </w:r>
+        <w:r>
+          <w:rPr>
+            <w:noProof/>
+            <w:webHidden/>
+          </w:rPr>
+          <w:fldChar w:fldCharType="separate"/>
+        </w:r>
+        <w:r>
+          <w:rPr>
+            <w:noProof/>
+            <w:webHidden/>
+          </w:rPr>
+          <w:t>34</w:t>
+        </w:r>
+        <w:r>
+          <w:rPr>
+            <w:noProof/>
+            <w:webHidden/>
+          </w:rPr>
+          <w:fldChar w:fldCharType="end"/>
+        </w:r>
+      </w:hyperlink>
+    </w:p>
+    <w:p>
+      <w:pPr>
+        <w:pStyle w:val="TableofFigures"/>
+        <w:tabs>
+          <w:tab w:val="right" w:leader="dot" w:pos="9111"/>
+        </w:tabs>
+        <w:rPr>
+          <w:rFonts w:eastAsiaTheme="minorEastAsia"/>
+          <w:noProof/>
+        </w:rPr>
+      </w:pPr>
+      <w:hyperlink w:anchor="_Toc235770295" w:history="1">
+        <w:r>
+          <w:rPr>
+            <w:rStyle w:val="Hyperlink"/>
+            <w:rFonts w:ascii="Times New Roman" w:hAnsi="Times New Roman" w:cs="Times New Roman"/>
+            <w:noProof/>
+          </w:rPr>
+          <w:t>Hình 11: Kiến trúc của một Module</w:t>
+        </w:r>
+        <w:r>
+          <w:rPr>
+            <w:noProof/>
+            <w:webHidden/>
+          </w:rPr>
+          <w:tab/>
+        </w:r>
+        <w:r>
+          <w:rPr>
+            <w:noProof/>
+            <w:webHidden/>
+          </w:rPr>
+          <w:fldChar w:fldCharType="begin"/>
+        </w:r>
+        <w:r>
+          <w:rPr>
+            <w:noProof/>
+            <w:webHidden/>
+          </w:rPr>
+          <w:instrText xml:space="preserve"> PAGEREF _Toc235770295 \h </w:instrText>
+        </w:r>
+        <w:r>
+          <w:rPr>
+            <w:noProof/>
+            <w:webHidden/>
+          </w:rPr>
+        </w:r>
+        <w:r>
+          <w:rPr>
+            <w:noProof/>
+            <w:webHidden/>
+          </w:rPr>
+          <w:fldChar w:fldCharType="separate"/>
+        </w:r>
+        <w:r>
+          <w:rPr>
+            <w:noProof/>
+            <w:webHidden/>
+          </w:rPr>
+          <w:t>34</w:t>
+        </w:r>
+        <w:r>
+          <w:rPr>
+            <w:noProof/>
+            <w:webHidden/>
+          </w:rPr>
+          <w:fldChar w:fldCharType="end"/>
+        </w:r>
+      </w:hyperlink>
+    </w:p>
+    <w:p>
+      <w:pPr>
+        <w:pStyle w:val="TableofFigures"/>
+        <w:tabs>
+          <w:tab w:val="right" w:leader="dot" w:pos="9111"/>
+        </w:tabs>
+        <w:rPr>
+          <w:rFonts w:eastAsiaTheme="minorEastAsia"/>
+          <w:noProof/>
+        </w:rPr>
+      </w:pPr>
+      <w:hyperlink w:anchor="_Toc235770296" w:history="1">
+        <w:r>
+          <w:rPr>
+            <w:rStyle w:val="Hyperlink"/>
+            <w:rFonts w:ascii="Times New Roman" w:hAnsi="Times New Roman" w:cs="Times New Roman"/>
+            <w:noProof/>
+          </w:rPr>
+          <w:t>Hình 12: Luồng xử lý yêu cầu đăng nhập thông qua RESTful API</w:t>
+        </w:r>
+        <w:r>
+          <w:rPr>
+            <w:noProof/>
+            <w:webHidden/>
+          </w:rPr>
+          <w:tab/>
+        </w:r>
+        <w:r>
+          <w:rPr>
+            <w:noProof/>
+            <w:webHidden/>
+          </w:rPr>
+          <w:fldChar w:fldCharType="begin"/>
+        </w:r>
+        <w:r>
+          <w:rPr>
+            <w:noProof/>
+            <w:webHidden/>
+          </w:rPr>
+          <w:instrText xml:space="preserve"> PAGEREF _Toc235770296 \h </w:instrText>
+        </w:r>
+        <w:r>
+          <w:rPr>
+            <w:noProof/>
+            <w:webHidden/>
+          </w:rPr>
+        </w:r>
+        <w:r>
+          <w:rPr>
+            <w:noProof/>
+            <w:webHidden/>
+          </w:rPr>
+          <w:fldChar w:fldCharType="separate"/>
+        </w:r>
+        <w:r>
+          <w:rPr>
+            <w:noProof/>
+            <w:webHidden/>
+          </w:rPr>
+          <w:t>35</w:t>
+        </w:r>
+        <w:r>
+          <w:rPr>
+            <w:noProof/>
+            <w:webHidden/>
+          </w:rPr>
+          <w:fldChar w:fldCharType="end"/>
+        </w:r>
+      </w:hyperlink>
+    </w:p>
+    <w:p>
+      <w:pPr>
+        <w:pStyle w:val="TableofFigures"/>
+        <w:tabs>
+          <w:tab w:val="right" w:leader="dot" w:pos="9111"/>
+        </w:tabs>
+        <w:rPr>
+          <w:rFonts w:eastAsiaTheme="minorEastAsia"/>
+          <w:noProof/>
+        </w:rPr>
+      </w:pPr>
+      <w:hyperlink w:anchor="_Toc235770297" w:history="1">
+        <w:r>
+          <w:rPr>
+            <w:rStyle w:val="Hyperlink"/>
+            <w:rFonts w:ascii="Times New Roman" w:hAnsi="Times New Roman" w:cs="Times New Roman"/>
+            <w:noProof/>
+          </w:rPr>
+          <w:t>Hình 13: Luồng xử lý dữ liệu</w:t>
+        </w:r>
+        <w:r>
+          <w:rPr>
+            <w:noProof/>
+            <w:webHidden/>
+          </w:rPr>
+          <w:tab/>
+        </w:r>
+        <w:r>
+          <w:rPr>
+            <w:noProof/>
+            <w:webHidden/>
+          </w:rPr>
+          <w:fldChar w:fldCharType="begin"/>
+        </w:r>
+        <w:r>
+          <w:rPr>
+            <w:noProof/>
+            <w:webHidden/>
+          </w:rPr>
+          <w:instrText xml:space="preserve"> PAGEREF _Toc235770297 \h </w:instrText>
+        </w:r>
+        <w:r>
+          <w:rPr>
+            <w:noProof/>
+            <w:webHidden/>
+          </w:rPr>
+        </w:r>
+        <w:r>
+          <w:rPr>
+            <w:noProof/>
+            <w:webHidden/>
+          </w:rPr>
+          <w:fldChar w:fldCharType="separate"/>
+        </w:r>
+        <w:r>
+          <w:rPr>
+            <w:noProof/>
+            <w:webHidden/>
+          </w:rPr>
+          <w:t>35</w:t>
+        </w:r>
+        <w:r>
+          <w:rPr>
+            <w:noProof/>
+            <w:webHidden/>
+          </w:rPr>
+          <w:fldChar w:fldCharType="end"/>
+        </w:r>
+      </w:hyperlink>
+    </w:p>
+    <w:p>
+      <w:pPr>
+        <w:rPr>
+          <w:rFonts w:ascii="Times New Roman" w:hAnsi="Times New Roman" w:cs="Times New Roman"/>
+          <w:sz w:val="26"/>
+          <w:szCs w:val="26"/>
+        </w:rPr>
+      </w:pPr>
+      <w:r>
+        <w:rPr>
+          <w:rFonts w:ascii="Times New Roman" w:hAnsi="Times New Roman" w:cs="Times New Roman"/>
+          <w:sz w:val="26"/>
+          <w:szCs w:val="26"/>
+        </w:rPr>
+        <w:fldChar w:fldCharType="end"/>
+      </w:r>
+      <w:r>
+        <w:rPr>
+          <w:rFonts w:ascii="Times New Roman" w:hAnsi="Times New Roman" w:cs="Times New Roman"/>
+          <w:sz w:val="26"/>
+          <w:szCs w:val="26"/>
+        </w:rPr>
+        <w:br w:type="page"/>
+      </w:r>
+    </w:p>
+    <w:p>
+      <w:pPr>
+        <w:pStyle w:val="Heading1"/>
+        <w:rPr>
+          <w:rFonts w:ascii="Times New Roman" w:hAnsi="Times New Roman" w:cs="Times New Roman"/>
+        </w:rPr>
+      </w:pPr>
+      <w:bookmarkStart w:id="6" w:name="_Toc235741221"/>
+      <w:r>
+        <w:rPr>
+          <w:rFonts w:ascii="Times New Roman" w:hAnsi="Times New Roman" w:cs="Times New Roman"/>
+        </w:rPr>
+        <w:lastRenderedPageBreak/>
+        <w:t>DANH MỤC BẢNG</w:t>
+      </w:r>
+      <w:bookmarkEnd w:id="6"/>
+    </w:p>
+    <w:p>
+      <w:pPr>
+        <w:pStyle w:val="TableofFigures"/>
+        <w:tabs>
+          <w:tab w:val="right" w:leader="dot" w:pos="9111"/>
+        </w:tabs>
+        <w:rPr>
+          <w:rFonts w:eastAsiaTheme="minorEastAsia"/>
+          <w:noProof/>
+        </w:rPr>
+      </w:pPr>
       <w:r>
         <w:rPr>
           <w:rFonts w:ascii="Times New Roman" w:hAnsi="Times New Roman" w:cs="Times New Roman"/>
@@ -4096,7 +4430,7 @@
         </w:rPr>
         <w:fldChar w:fldCharType="separate"/>
       </w:r>
-      <w:hyperlink w:anchor="_Toc235647593" w:history="1">
+      <w:hyperlink w:anchor="_Toc235770271" w:history="1">
         <w:r>
           <w:rPr>
             <w:rStyle w:val="Hyperlink"/>
@@ -4124,7 +4458,7 @@
             <w:noProof/>
             <w:webHidden/>
           </w:rPr>
-          <w:instrText xml:space="preserve"> PAGEREF _Toc235647593 \h </w:instrText>
+          <w:instrText xml:space="preserve"> PAGEREF _Toc235770271 \h </w:instrText>
         </w:r>
         <w:r>
           <w:rPr>
@@ -4166,7 +4500,7 @@
           <w:noProof/>
         </w:rPr>
       </w:pPr>
-      <w:hyperlink w:anchor="_Toc235647594" w:history="1">
+      <w:hyperlink w:anchor="_Toc235770272" w:history="1">
         <w:r>
           <w:rPr>
             <w:rStyle w:val="Hyperlink"/>
@@ -4194,497 +4528,7 @@
             <w:noProof/>
             <w:webHidden/>
           </w:rPr>
-          <w:instrText xml:space="preserve"> PAGEREF _Toc235647594 \h </w:instrText>
-        </w:r>
-        <w:r>
-          <w:rPr>
-            <w:noProof/>
-            <w:webHidden/>
-          </w:rPr>
-        </w:r>
-        <w:r>
-          <w:rPr>
-            <w:noProof/>
-            <w:webHidden/>
-          </w:rPr>
-          <w:fldChar w:fldCharType="separate"/>
-        </w:r>
-        <w:r>
-          <w:rPr>
-            <w:noProof/>
-            <w:webHidden/>
-          </w:rPr>
-          <w:t>21</w:t>
-        </w:r>
-        <w:r>
-          <w:rPr>
-            <w:noProof/>
-            <w:webHidden/>
-          </w:rPr>
-          <w:fldChar w:fldCharType="end"/>
-        </w:r>
-      </w:hyperlink>
-    </w:p>
-    <w:p>
-      <w:pPr>
-        <w:pStyle w:val="TableofFigures"/>
-        <w:tabs>
-          <w:tab w:val="right" w:leader="dot" w:pos="9111"/>
-        </w:tabs>
-        <w:rPr>
-          <w:rFonts w:eastAsiaTheme="minorEastAsia"/>
-          <w:noProof/>
-        </w:rPr>
-      </w:pPr>
-      <w:hyperlink w:anchor="_Toc235647595" w:history="1">
-        <w:r>
-          <w:rPr>
-            <w:rStyle w:val="Hyperlink"/>
-            <w:rFonts w:ascii="Times New Roman" w:hAnsi="Times New Roman" w:cs="Times New Roman"/>
-            <w:noProof/>
-          </w:rPr>
-          <w:t>Bảng 3: UC2:Quản lý Lead</w:t>
-        </w:r>
-        <w:r>
-          <w:rPr>
-            <w:noProof/>
-            <w:webHidden/>
-          </w:rPr>
-          <w:tab/>
-        </w:r>
-        <w:r>
-          <w:rPr>
-            <w:noProof/>
-            <w:webHidden/>
-          </w:rPr>
-          <w:fldChar w:fldCharType="begin"/>
-        </w:r>
-        <w:r>
-          <w:rPr>
-            <w:noProof/>
-            <w:webHidden/>
-          </w:rPr>
-          <w:instrText xml:space="preserve"> PAGEREF _Toc235647595 \h </w:instrText>
-        </w:r>
-        <w:r>
-          <w:rPr>
-            <w:noProof/>
-            <w:webHidden/>
-          </w:rPr>
-        </w:r>
-        <w:r>
-          <w:rPr>
-            <w:noProof/>
-            <w:webHidden/>
-          </w:rPr>
-          <w:fldChar w:fldCharType="separate"/>
-        </w:r>
-        <w:r>
-          <w:rPr>
-            <w:noProof/>
-            <w:webHidden/>
-          </w:rPr>
-          <w:t>21</w:t>
-        </w:r>
-        <w:r>
-          <w:rPr>
-            <w:noProof/>
-            <w:webHidden/>
-          </w:rPr>
-          <w:fldChar w:fldCharType="end"/>
-        </w:r>
-      </w:hyperlink>
-    </w:p>
-    <w:p>
-      <w:pPr>
-        <w:pStyle w:val="TableofFigures"/>
-        <w:tabs>
-          <w:tab w:val="right" w:leader="dot" w:pos="9111"/>
-        </w:tabs>
-        <w:rPr>
-          <w:rFonts w:eastAsiaTheme="minorEastAsia"/>
-          <w:noProof/>
-        </w:rPr>
-      </w:pPr>
-      <w:hyperlink w:anchor="_Toc235647596" w:history="1">
-        <w:r>
-          <w:rPr>
-            <w:rStyle w:val="Hyperlink"/>
-            <w:rFonts w:ascii="Times New Roman" w:hAnsi="Times New Roman" w:cs="Times New Roman"/>
-            <w:noProof/>
-          </w:rPr>
-          <w:t>Bảng 4: UC3: Chuyển Lead thành Customer</w:t>
-        </w:r>
-        <w:r>
-          <w:rPr>
-            <w:noProof/>
-            <w:webHidden/>
-          </w:rPr>
-          <w:tab/>
-        </w:r>
-        <w:r>
-          <w:rPr>
-            <w:noProof/>
-            <w:webHidden/>
-          </w:rPr>
-          <w:fldChar w:fldCharType="begin"/>
-        </w:r>
-        <w:r>
-          <w:rPr>
-            <w:noProof/>
-            <w:webHidden/>
-          </w:rPr>
-          <w:instrText xml:space="preserve"> PAGEREF _Toc235647596 \h </w:instrText>
-        </w:r>
-        <w:r>
-          <w:rPr>
-            <w:noProof/>
-            <w:webHidden/>
-          </w:rPr>
-        </w:r>
-        <w:r>
-          <w:rPr>
-            <w:noProof/>
-            <w:webHidden/>
-          </w:rPr>
-          <w:fldChar w:fldCharType="separate"/>
-        </w:r>
-        <w:r>
-          <w:rPr>
-            <w:noProof/>
-            <w:webHidden/>
-          </w:rPr>
-          <w:t>22</w:t>
-        </w:r>
-        <w:r>
-          <w:rPr>
-            <w:noProof/>
-            <w:webHidden/>
-          </w:rPr>
-          <w:fldChar w:fldCharType="end"/>
-        </w:r>
-      </w:hyperlink>
-    </w:p>
-    <w:p>
-      <w:pPr>
-        <w:pStyle w:val="TableofFigures"/>
-        <w:tabs>
-          <w:tab w:val="right" w:leader="dot" w:pos="9111"/>
-        </w:tabs>
-        <w:rPr>
-          <w:rFonts w:eastAsiaTheme="minorEastAsia"/>
-          <w:noProof/>
-        </w:rPr>
-      </w:pPr>
-      <w:hyperlink w:anchor="_Toc235647597" w:history="1">
-        <w:r>
-          <w:rPr>
-            <w:rStyle w:val="Hyperlink"/>
-            <w:rFonts w:ascii="Times New Roman" w:hAnsi="Times New Roman" w:cs="Times New Roman"/>
-            <w:noProof/>
-          </w:rPr>
-          <w:t>Bảng 5: UC4: Quản lý Deal</w:t>
-        </w:r>
-        <w:r>
-          <w:rPr>
-            <w:noProof/>
-            <w:webHidden/>
-          </w:rPr>
-          <w:tab/>
-        </w:r>
-        <w:r>
-          <w:rPr>
-            <w:noProof/>
-            <w:webHidden/>
-          </w:rPr>
-          <w:fldChar w:fldCharType="begin"/>
-        </w:r>
-        <w:r>
-          <w:rPr>
-            <w:noProof/>
-            <w:webHidden/>
-          </w:rPr>
-          <w:instrText xml:space="preserve"> PAGEREF _Toc235647597 \h </w:instrText>
-        </w:r>
-        <w:r>
-          <w:rPr>
-            <w:noProof/>
-            <w:webHidden/>
-          </w:rPr>
-        </w:r>
-        <w:r>
-          <w:rPr>
-            <w:noProof/>
-            <w:webHidden/>
-          </w:rPr>
-          <w:fldChar w:fldCharType="separate"/>
-        </w:r>
-        <w:r>
-          <w:rPr>
-            <w:noProof/>
-            <w:webHidden/>
-          </w:rPr>
-          <w:t>22</w:t>
-        </w:r>
-        <w:r>
-          <w:rPr>
-            <w:noProof/>
-            <w:webHidden/>
-          </w:rPr>
-          <w:fldChar w:fldCharType="end"/>
-        </w:r>
-      </w:hyperlink>
-    </w:p>
-    <w:p>
-      <w:pPr>
-        <w:pStyle w:val="TableofFigures"/>
-        <w:tabs>
-          <w:tab w:val="right" w:leader="dot" w:pos="9111"/>
-        </w:tabs>
-        <w:rPr>
-          <w:rFonts w:eastAsiaTheme="minorEastAsia"/>
-          <w:noProof/>
-        </w:rPr>
-      </w:pPr>
-      <w:hyperlink w:anchor="_Toc235647598" w:history="1">
-        <w:r>
-          <w:rPr>
-            <w:rStyle w:val="Hyperlink"/>
-            <w:rFonts w:ascii="Times New Roman" w:hAnsi="Times New Roman" w:cs="Times New Roman"/>
-            <w:noProof/>
-          </w:rPr>
-          <w:t>Bảng 6: UC5: Phân công Deal</w:t>
-        </w:r>
-        <w:r>
-          <w:rPr>
-            <w:noProof/>
-            <w:webHidden/>
-          </w:rPr>
-          <w:tab/>
-        </w:r>
-        <w:r>
-          <w:rPr>
-            <w:noProof/>
-            <w:webHidden/>
-          </w:rPr>
-          <w:fldChar w:fldCharType="begin"/>
-        </w:r>
-        <w:r>
-          <w:rPr>
-            <w:noProof/>
-            <w:webHidden/>
-          </w:rPr>
-          <w:instrText xml:space="preserve"> PAGEREF _Toc235647598 \h </w:instrText>
-        </w:r>
-        <w:r>
-          <w:rPr>
-            <w:noProof/>
-            <w:webHidden/>
-          </w:rPr>
-        </w:r>
-        <w:r>
-          <w:rPr>
-            <w:noProof/>
-            <w:webHidden/>
-          </w:rPr>
-          <w:fldChar w:fldCharType="separate"/>
-        </w:r>
-        <w:r>
-          <w:rPr>
-            <w:noProof/>
-            <w:webHidden/>
-          </w:rPr>
-          <w:t>22</w:t>
-        </w:r>
-        <w:r>
-          <w:rPr>
-            <w:noProof/>
-            <w:webHidden/>
-          </w:rPr>
-          <w:fldChar w:fldCharType="end"/>
-        </w:r>
-      </w:hyperlink>
-    </w:p>
-    <w:p>
-      <w:pPr>
-        <w:pStyle w:val="TableofFigures"/>
-        <w:tabs>
-          <w:tab w:val="right" w:leader="dot" w:pos="9111"/>
-        </w:tabs>
-        <w:rPr>
-          <w:rFonts w:eastAsiaTheme="minorEastAsia"/>
-          <w:noProof/>
-        </w:rPr>
-      </w:pPr>
-      <w:hyperlink w:anchor="_Toc235647599" w:history="1">
-        <w:r>
-          <w:rPr>
-            <w:rStyle w:val="Hyperlink"/>
-            <w:rFonts w:ascii="Times New Roman" w:hAnsi="Times New Roman" w:cs="Times New Roman"/>
-            <w:noProof/>
-          </w:rPr>
-          <w:t>Bảng 7: UC6: Thay đổi trạng thái Pipeline</w:t>
-        </w:r>
-        <w:r>
-          <w:rPr>
-            <w:noProof/>
-            <w:webHidden/>
-          </w:rPr>
-          <w:tab/>
-        </w:r>
-        <w:r>
-          <w:rPr>
-            <w:noProof/>
-            <w:webHidden/>
-          </w:rPr>
-          <w:fldChar w:fldCharType="begin"/>
-        </w:r>
-        <w:r>
-          <w:rPr>
-            <w:noProof/>
-            <w:webHidden/>
-          </w:rPr>
-          <w:instrText xml:space="preserve"> PAGEREF _Toc235647599 \h </w:instrText>
-        </w:r>
-        <w:r>
-          <w:rPr>
-            <w:noProof/>
-            <w:webHidden/>
-          </w:rPr>
-        </w:r>
-        <w:r>
-          <w:rPr>
-            <w:noProof/>
-            <w:webHidden/>
-          </w:rPr>
-          <w:fldChar w:fldCharType="separate"/>
-        </w:r>
-        <w:r>
-          <w:rPr>
-            <w:noProof/>
-            <w:webHidden/>
-          </w:rPr>
-          <w:t>23</w:t>
-        </w:r>
-        <w:r>
-          <w:rPr>
-            <w:noProof/>
-            <w:webHidden/>
-          </w:rPr>
-          <w:fldChar w:fldCharType="end"/>
-        </w:r>
-      </w:hyperlink>
-    </w:p>
-    <w:p>
-      <w:pPr>
-        <w:pStyle w:val="TableofFigures"/>
-        <w:tabs>
-          <w:tab w:val="right" w:leader="dot" w:pos="9111"/>
-        </w:tabs>
-        <w:rPr>
-          <w:rFonts w:eastAsiaTheme="minorEastAsia"/>
-          <w:noProof/>
-        </w:rPr>
-      </w:pPr>
-      <w:hyperlink w:anchor="_Toc235647600" w:history="1">
-        <w:r>
-          <w:rPr>
-            <w:rStyle w:val="Hyperlink"/>
-            <w:rFonts w:ascii="Times New Roman" w:hAnsi="Times New Roman" w:cs="Times New Roman"/>
-            <w:noProof/>
-          </w:rPr>
-          <w:t>Bảng 8: UC7: Tạo Quote</w:t>
-        </w:r>
-        <w:r>
-          <w:rPr>
-            <w:noProof/>
-            <w:webHidden/>
-          </w:rPr>
-          <w:tab/>
-        </w:r>
-        <w:r>
-          <w:rPr>
-            <w:noProof/>
-            <w:webHidden/>
-          </w:rPr>
-          <w:fldChar w:fldCharType="begin"/>
-        </w:r>
-        <w:r>
-          <w:rPr>
-            <w:noProof/>
-            <w:webHidden/>
-          </w:rPr>
-          <w:instrText xml:space="preserve"> PAGEREF _Toc235647600 \h </w:instrText>
-        </w:r>
-        <w:r>
-          <w:rPr>
-            <w:noProof/>
-            <w:webHidden/>
-          </w:rPr>
-        </w:r>
-        <w:r>
-          <w:rPr>
-            <w:noProof/>
-            <w:webHidden/>
-          </w:rPr>
-          <w:fldChar w:fldCharType="separate"/>
-        </w:r>
-        <w:r>
-          <w:rPr>
-            <w:noProof/>
-            <w:webHidden/>
-          </w:rPr>
-          <w:t>23</w:t>
-        </w:r>
-        <w:r>
-          <w:rPr>
-            <w:noProof/>
-            <w:webHidden/>
-          </w:rPr>
-          <w:fldChar w:fldCharType="end"/>
-        </w:r>
-      </w:hyperlink>
-    </w:p>
-    <w:p>
-      <w:pPr>
-        <w:pStyle w:val="TableofFigures"/>
-        <w:tabs>
-          <w:tab w:val="right" w:leader="dot" w:pos="9111"/>
-        </w:tabs>
-        <w:rPr>
-          <w:rFonts w:eastAsiaTheme="minorEastAsia"/>
-          <w:noProof/>
-        </w:rPr>
-      </w:pPr>
-      <w:hyperlink w:anchor="_Toc235647601" w:history="1">
-        <w:r>
-          <w:rPr>
-            <w:rStyle w:val="Hyperlink"/>
-            <w:rFonts w:ascii="Times New Roman" w:hAnsi="Times New Roman" w:cs="Times New Roman"/>
-            <w:noProof/>
-          </w:rPr>
-          <w:t>Bảng 9: UC8: Quản lý Task</w:t>
-        </w:r>
-        <w:r>
-          <w:rPr>
-            <w:noProof/>
-            <w:webHidden/>
-          </w:rPr>
-          <w:tab/>
-        </w:r>
-        <w:r>
-          <w:rPr>
-            <w:noProof/>
-            <w:webHidden/>
-          </w:rPr>
-          <w:fldChar w:fldCharType="begin"/>
-        </w:r>
-        <w:r>
-          <w:rPr>
-            <w:noProof/>
-            <w:webHidden/>
-          </w:rPr>
-          <w:instrText xml:space="preserve"> PAGEREF _Toc235647601 \h </w:instrText>
+          <w:instrText xml:space="preserve"> PAGEREF _Toc235770272 \h </w:instrText>
         </w:r>
         <w:r>
           <w:rPr>
@@ -4726,14 +4570,14 @@
           <w:noProof/>
         </w:rPr>
       </w:pPr>
-      <w:hyperlink w:anchor="_Toc235647602" w:history="1">
+      <w:hyperlink w:anchor="_Toc235770273" w:history="1">
         <w:r>
           <w:rPr>
             <w:rStyle w:val="Hyperlink"/>
             <w:rFonts w:ascii="Times New Roman" w:hAnsi="Times New Roman" w:cs="Times New Roman"/>
             <w:noProof/>
           </w:rPr>
-          <w:t>Bảng 10: UC9: Dashboard</w:t>
+          <w:t>Bảng 3: UC2:Quản lý Lead</w:t>
         </w:r>
         <w:r>
           <w:rPr>
@@ -4754,7 +4598,7 @@
             <w:noProof/>
             <w:webHidden/>
           </w:rPr>
-          <w:instrText xml:space="preserve"> PAGEREF _Toc235647602 \h </w:instrText>
+          <w:instrText xml:space="preserve"> PAGEREF _Toc235770273 \h </w:instrText>
         </w:r>
         <w:r>
           <w:rPr>
@@ -4796,7 +4640,497 @@
           <w:noProof/>
         </w:rPr>
       </w:pPr>
-      <w:hyperlink w:anchor="_Toc235647603" w:history="1">
+      <w:hyperlink w:anchor="_Toc235770274" w:history="1">
+        <w:r>
+          <w:rPr>
+            <w:rStyle w:val="Hyperlink"/>
+            <w:rFonts w:ascii="Times New Roman" w:hAnsi="Times New Roman" w:cs="Times New Roman"/>
+            <w:noProof/>
+          </w:rPr>
+          <w:t>Bảng 4: UC3: Chuyển Lead thành Customer</w:t>
+        </w:r>
+        <w:r>
+          <w:rPr>
+            <w:noProof/>
+            <w:webHidden/>
+          </w:rPr>
+          <w:tab/>
+        </w:r>
+        <w:r>
+          <w:rPr>
+            <w:noProof/>
+            <w:webHidden/>
+          </w:rPr>
+          <w:fldChar w:fldCharType="begin"/>
+        </w:r>
+        <w:r>
+          <w:rPr>
+            <w:noProof/>
+            <w:webHidden/>
+          </w:rPr>
+          <w:instrText xml:space="preserve"> PAGEREF _Toc235770274 \h </w:instrText>
+        </w:r>
+        <w:r>
+          <w:rPr>
+            <w:noProof/>
+            <w:webHidden/>
+          </w:rPr>
+        </w:r>
+        <w:r>
+          <w:rPr>
+            <w:noProof/>
+            <w:webHidden/>
+          </w:rPr>
+          <w:fldChar w:fldCharType="separate"/>
+        </w:r>
+        <w:r>
+          <w:rPr>
+            <w:noProof/>
+            <w:webHidden/>
+          </w:rPr>
+          <w:t>25</w:t>
+        </w:r>
+        <w:r>
+          <w:rPr>
+            <w:noProof/>
+            <w:webHidden/>
+          </w:rPr>
+          <w:fldChar w:fldCharType="end"/>
+        </w:r>
+      </w:hyperlink>
+    </w:p>
+    <w:p>
+      <w:pPr>
+        <w:pStyle w:val="TableofFigures"/>
+        <w:tabs>
+          <w:tab w:val="right" w:leader="dot" w:pos="9111"/>
+        </w:tabs>
+        <w:rPr>
+          <w:rFonts w:eastAsiaTheme="minorEastAsia"/>
+          <w:noProof/>
+        </w:rPr>
+      </w:pPr>
+      <w:hyperlink w:anchor="_Toc235770275" w:history="1">
+        <w:r>
+          <w:rPr>
+            <w:rStyle w:val="Hyperlink"/>
+            <w:rFonts w:ascii="Times New Roman" w:hAnsi="Times New Roman" w:cs="Times New Roman"/>
+            <w:noProof/>
+          </w:rPr>
+          <w:t>Bảng 5: UC4: Quản lý Deal</w:t>
+        </w:r>
+        <w:r>
+          <w:rPr>
+            <w:noProof/>
+            <w:webHidden/>
+          </w:rPr>
+          <w:tab/>
+        </w:r>
+        <w:r>
+          <w:rPr>
+            <w:noProof/>
+            <w:webHidden/>
+          </w:rPr>
+          <w:fldChar w:fldCharType="begin"/>
+        </w:r>
+        <w:r>
+          <w:rPr>
+            <w:noProof/>
+            <w:webHidden/>
+          </w:rPr>
+          <w:instrText xml:space="preserve"> PAGEREF _Toc235770275 \h </w:instrText>
+        </w:r>
+        <w:r>
+          <w:rPr>
+            <w:noProof/>
+            <w:webHidden/>
+          </w:rPr>
+        </w:r>
+        <w:r>
+          <w:rPr>
+            <w:noProof/>
+            <w:webHidden/>
+          </w:rPr>
+          <w:fldChar w:fldCharType="separate"/>
+        </w:r>
+        <w:r>
+          <w:rPr>
+            <w:noProof/>
+            <w:webHidden/>
+          </w:rPr>
+          <w:t>25</w:t>
+        </w:r>
+        <w:r>
+          <w:rPr>
+            <w:noProof/>
+            <w:webHidden/>
+          </w:rPr>
+          <w:fldChar w:fldCharType="end"/>
+        </w:r>
+      </w:hyperlink>
+    </w:p>
+    <w:p>
+      <w:pPr>
+        <w:pStyle w:val="TableofFigures"/>
+        <w:tabs>
+          <w:tab w:val="right" w:leader="dot" w:pos="9111"/>
+        </w:tabs>
+        <w:rPr>
+          <w:rFonts w:eastAsiaTheme="minorEastAsia"/>
+          <w:noProof/>
+        </w:rPr>
+      </w:pPr>
+      <w:hyperlink w:anchor="_Toc235770276" w:history="1">
+        <w:r>
+          <w:rPr>
+            <w:rStyle w:val="Hyperlink"/>
+            <w:rFonts w:ascii="Times New Roman" w:hAnsi="Times New Roman" w:cs="Times New Roman"/>
+            <w:noProof/>
+          </w:rPr>
+          <w:t>Bảng 6: UC5: Phân công Deal</w:t>
+        </w:r>
+        <w:r>
+          <w:rPr>
+            <w:noProof/>
+            <w:webHidden/>
+          </w:rPr>
+          <w:tab/>
+        </w:r>
+        <w:r>
+          <w:rPr>
+            <w:noProof/>
+            <w:webHidden/>
+          </w:rPr>
+          <w:fldChar w:fldCharType="begin"/>
+        </w:r>
+        <w:r>
+          <w:rPr>
+            <w:noProof/>
+            <w:webHidden/>
+          </w:rPr>
+          <w:instrText xml:space="preserve"> PAGEREF _Toc235770276 \h </w:instrText>
+        </w:r>
+        <w:r>
+          <w:rPr>
+            <w:noProof/>
+            <w:webHidden/>
+          </w:rPr>
+        </w:r>
+        <w:r>
+          <w:rPr>
+            <w:noProof/>
+            <w:webHidden/>
+          </w:rPr>
+          <w:fldChar w:fldCharType="separate"/>
+        </w:r>
+        <w:r>
+          <w:rPr>
+            <w:noProof/>
+            <w:webHidden/>
+          </w:rPr>
+          <w:t>25</w:t>
+        </w:r>
+        <w:r>
+          <w:rPr>
+            <w:noProof/>
+            <w:webHidden/>
+          </w:rPr>
+          <w:fldChar w:fldCharType="end"/>
+        </w:r>
+      </w:hyperlink>
+    </w:p>
+    <w:p>
+      <w:pPr>
+        <w:pStyle w:val="TableofFigures"/>
+        <w:tabs>
+          <w:tab w:val="right" w:leader="dot" w:pos="9111"/>
+        </w:tabs>
+        <w:rPr>
+          <w:rFonts w:eastAsiaTheme="minorEastAsia"/>
+          <w:noProof/>
+        </w:rPr>
+      </w:pPr>
+      <w:hyperlink w:anchor="_Toc235770277" w:history="1">
+        <w:r>
+          <w:rPr>
+            <w:rStyle w:val="Hyperlink"/>
+            <w:rFonts w:ascii="Times New Roman" w:hAnsi="Times New Roman" w:cs="Times New Roman"/>
+            <w:noProof/>
+          </w:rPr>
+          <w:t>Bảng 7: UC6: Thay đổi trạng thái Pipeline</w:t>
+        </w:r>
+        <w:r>
+          <w:rPr>
+            <w:noProof/>
+            <w:webHidden/>
+          </w:rPr>
+          <w:tab/>
+        </w:r>
+        <w:r>
+          <w:rPr>
+            <w:noProof/>
+            <w:webHidden/>
+          </w:rPr>
+          <w:fldChar w:fldCharType="begin"/>
+        </w:r>
+        <w:r>
+          <w:rPr>
+            <w:noProof/>
+            <w:webHidden/>
+          </w:rPr>
+          <w:instrText xml:space="preserve"> PAGEREF _Toc235770277 \h </w:instrText>
+        </w:r>
+        <w:r>
+          <w:rPr>
+            <w:noProof/>
+            <w:webHidden/>
+          </w:rPr>
+        </w:r>
+        <w:r>
+          <w:rPr>
+            <w:noProof/>
+            <w:webHidden/>
+          </w:rPr>
+          <w:fldChar w:fldCharType="separate"/>
+        </w:r>
+        <w:r>
+          <w:rPr>
+            <w:noProof/>
+            <w:webHidden/>
+          </w:rPr>
+          <w:t>26</w:t>
+        </w:r>
+        <w:r>
+          <w:rPr>
+            <w:noProof/>
+            <w:webHidden/>
+          </w:rPr>
+          <w:fldChar w:fldCharType="end"/>
+        </w:r>
+      </w:hyperlink>
+    </w:p>
+    <w:p>
+      <w:pPr>
+        <w:pStyle w:val="TableofFigures"/>
+        <w:tabs>
+          <w:tab w:val="right" w:leader="dot" w:pos="9111"/>
+        </w:tabs>
+        <w:rPr>
+          <w:rFonts w:eastAsiaTheme="minorEastAsia"/>
+          <w:noProof/>
+        </w:rPr>
+      </w:pPr>
+      <w:hyperlink w:anchor="_Toc235770278" w:history="1">
+        <w:r>
+          <w:rPr>
+            <w:rStyle w:val="Hyperlink"/>
+            <w:rFonts w:ascii="Times New Roman" w:hAnsi="Times New Roman" w:cs="Times New Roman"/>
+            <w:noProof/>
+          </w:rPr>
+          <w:t>Bảng 8: UC7: Tạo Quote</w:t>
+        </w:r>
+        <w:r>
+          <w:rPr>
+            <w:noProof/>
+            <w:webHidden/>
+          </w:rPr>
+          <w:tab/>
+        </w:r>
+        <w:r>
+          <w:rPr>
+            <w:noProof/>
+            <w:webHidden/>
+          </w:rPr>
+          <w:fldChar w:fldCharType="begin"/>
+        </w:r>
+        <w:r>
+          <w:rPr>
+            <w:noProof/>
+            <w:webHidden/>
+          </w:rPr>
+          <w:instrText xml:space="preserve"> PAGEREF _Toc235770278 \h </w:instrText>
+        </w:r>
+        <w:r>
+          <w:rPr>
+            <w:noProof/>
+            <w:webHidden/>
+          </w:rPr>
+        </w:r>
+        <w:r>
+          <w:rPr>
+            <w:noProof/>
+            <w:webHidden/>
+          </w:rPr>
+          <w:fldChar w:fldCharType="separate"/>
+        </w:r>
+        <w:r>
+          <w:rPr>
+            <w:noProof/>
+            <w:webHidden/>
+          </w:rPr>
+          <w:t>26</w:t>
+        </w:r>
+        <w:r>
+          <w:rPr>
+            <w:noProof/>
+            <w:webHidden/>
+          </w:rPr>
+          <w:fldChar w:fldCharType="end"/>
+        </w:r>
+      </w:hyperlink>
+    </w:p>
+    <w:p>
+      <w:pPr>
+        <w:pStyle w:val="TableofFigures"/>
+        <w:tabs>
+          <w:tab w:val="right" w:leader="dot" w:pos="9111"/>
+        </w:tabs>
+        <w:rPr>
+          <w:rFonts w:eastAsiaTheme="minorEastAsia"/>
+          <w:noProof/>
+        </w:rPr>
+      </w:pPr>
+      <w:hyperlink w:anchor="_Toc235770279" w:history="1">
+        <w:r>
+          <w:rPr>
+            <w:rStyle w:val="Hyperlink"/>
+            <w:rFonts w:ascii="Times New Roman" w:hAnsi="Times New Roman" w:cs="Times New Roman"/>
+            <w:noProof/>
+          </w:rPr>
+          <w:t>Bảng 9: UC8: Quản lý Task</w:t>
+        </w:r>
+        <w:r>
+          <w:rPr>
+            <w:noProof/>
+            <w:webHidden/>
+          </w:rPr>
+          <w:tab/>
+        </w:r>
+        <w:r>
+          <w:rPr>
+            <w:noProof/>
+            <w:webHidden/>
+          </w:rPr>
+          <w:fldChar w:fldCharType="begin"/>
+        </w:r>
+        <w:r>
+          <w:rPr>
+            <w:noProof/>
+            <w:webHidden/>
+          </w:rPr>
+          <w:instrText xml:space="preserve"> PAGEREF _Toc235770279 \h </w:instrText>
+        </w:r>
+        <w:r>
+          <w:rPr>
+            <w:noProof/>
+            <w:webHidden/>
+          </w:rPr>
+        </w:r>
+        <w:r>
+          <w:rPr>
+            <w:noProof/>
+            <w:webHidden/>
+          </w:rPr>
+          <w:fldChar w:fldCharType="separate"/>
+        </w:r>
+        <w:r>
+          <w:rPr>
+            <w:noProof/>
+            <w:webHidden/>
+          </w:rPr>
+          <w:t>27</w:t>
+        </w:r>
+        <w:r>
+          <w:rPr>
+            <w:noProof/>
+            <w:webHidden/>
+          </w:rPr>
+          <w:fldChar w:fldCharType="end"/>
+        </w:r>
+      </w:hyperlink>
+    </w:p>
+    <w:p>
+      <w:pPr>
+        <w:pStyle w:val="TableofFigures"/>
+        <w:tabs>
+          <w:tab w:val="right" w:leader="dot" w:pos="9111"/>
+        </w:tabs>
+        <w:rPr>
+          <w:rFonts w:eastAsiaTheme="minorEastAsia"/>
+          <w:noProof/>
+        </w:rPr>
+      </w:pPr>
+      <w:hyperlink w:anchor="_Toc235770280" w:history="1">
+        <w:r>
+          <w:rPr>
+            <w:rStyle w:val="Hyperlink"/>
+            <w:rFonts w:ascii="Times New Roman" w:hAnsi="Times New Roman" w:cs="Times New Roman"/>
+            <w:noProof/>
+          </w:rPr>
+          <w:t>Bảng 10: UC9: Dashboard</w:t>
+        </w:r>
+        <w:r>
+          <w:rPr>
+            <w:noProof/>
+            <w:webHidden/>
+          </w:rPr>
+          <w:tab/>
+        </w:r>
+        <w:r>
+          <w:rPr>
+            <w:noProof/>
+            <w:webHidden/>
+          </w:rPr>
+          <w:fldChar w:fldCharType="begin"/>
+        </w:r>
+        <w:r>
+          <w:rPr>
+            <w:noProof/>
+            <w:webHidden/>
+          </w:rPr>
+          <w:instrText xml:space="preserve"> PAGEREF _Toc235770280 \h </w:instrText>
+        </w:r>
+        <w:r>
+          <w:rPr>
+            <w:noProof/>
+            <w:webHidden/>
+          </w:rPr>
+        </w:r>
+        <w:r>
+          <w:rPr>
+            <w:noProof/>
+            <w:webHidden/>
+          </w:rPr>
+          <w:fldChar w:fldCharType="separate"/>
+        </w:r>
+        <w:r>
+          <w:rPr>
+            <w:noProof/>
+            <w:webHidden/>
+          </w:rPr>
+          <w:t>27</w:t>
+        </w:r>
+        <w:r>
+          <w:rPr>
+            <w:noProof/>
+            <w:webHidden/>
+          </w:rPr>
+          <w:fldChar w:fldCharType="end"/>
+        </w:r>
+      </w:hyperlink>
+    </w:p>
+    <w:p>
+      <w:pPr>
+        <w:pStyle w:val="TableofFigures"/>
+        <w:tabs>
+          <w:tab w:val="right" w:leader="dot" w:pos="9111"/>
+        </w:tabs>
+        <w:rPr>
+          <w:rFonts w:eastAsiaTheme="minorEastAsia"/>
+          <w:noProof/>
+        </w:rPr>
+      </w:pPr>
+      <w:hyperlink w:anchor="_Toc235770281" w:history="1">
         <w:r>
           <w:rPr>
             <w:rStyle w:val="Hyperlink"/>
@@ -4824,7 +5158,7 @@
             <w:noProof/>
             <w:webHidden/>
           </w:rPr>
-          <w:instrText xml:space="preserve"> PAGEREF _Toc235647603 \h </w:instrText>
+          <w:instrText xml:space="preserve"> PAGEREF _Toc235770281 \h </w:instrText>
         </w:r>
         <w:r>
           <w:rPr>
@@ -4844,7 +5178,7 @@
             <w:noProof/>
             <w:webHidden/>
           </w:rPr>
-          <w:t>24</w:t>
+          <w:t>27</w:t>
         </w:r>
         <w:r>
           <w:rPr>
@@ -4857,6 +5191,76 @@
     </w:p>
     <w:p>
       <w:pPr>
+        <w:pStyle w:val="TableofFigures"/>
+        <w:tabs>
+          <w:tab w:val="right" w:leader="dot" w:pos="9111"/>
+        </w:tabs>
+        <w:rPr>
+          <w:rFonts w:eastAsiaTheme="minorEastAsia"/>
+          <w:noProof/>
+        </w:rPr>
+      </w:pPr>
+      <w:hyperlink w:anchor="_Toc235770282" w:history="1">
+        <w:r>
+          <w:rPr>
+            <w:rStyle w:val="Hyperlink"/>
+            <w:rFonts w:ascii="Times New Roman" w:hAnsi="Times New Roman" w:cs="Times New Roman"/>
+            <w:noProof/>
+          </w:rPr>
+          <w:t>Bảng 12: Chức năng của từng Module</w:t>
+        </w:r>
+        <w:r>
+          <w:rPr>
+            <w:noProof/>
+            <w:webHidden/>
+          </w:rPr>
+          <w:tab/>
+        </w:r>
+        <w:r>
+          <w:rPr>
+            <w:noProof/>
+            <w:webHidden/>
+          </w:rPr>
+          <w:fldChar w:fldCharType="begin"/>
+        </w:r>
+        <w:r>
+          <w:rPr>
+            <w:noProof/>
+            <w:webHidden/>
+          </w:rPr>
+          <w:instrText xml:space="preserve"> PAGEREF _Toc235770282 \h </w:instrText>
+        </w:r>
+        <w:r>
+          <w:rPr>
+            <w:noProof/>
+            <w:webHidden/>
+          </w:rPr>
+        </w:r>
+        <w:r>
+          <w:rPr>
+            <w:noProof/>
+            <w:webHidden/>
+          </w:rPr>
+          <w:fldChar w:fldCharType="separate"/>
+        </w:r>
+        <w:r>
+          <w:rPr>
+            <w:noProof/>
+            <w:webHidden/>
+          </w:rPr>
+          <w:t>34</w:t>
+        </w:r>
+        <w:r>
+          <w:rPr>
+            <w:noProof/>
+            <w:webHidden/>
+          </w:rPr>
+          <w:fldChar w:fldCharType="end"/>
+        </w:r>
+      </w:hyperlink>
+    </w:p>
+    <w:p>
+      <w:pPr>
         <w:pStyle w:val="Heading1"/>
         <w:rPr>
           <w:rFonts w:ascii="Times New Roman" w:hAnsi="Times New Roman" w:cs="Times New Roman"/>
@@ -4865,42 +5269,8 @@
       <w:r>
         <w:fldChar w:fldCharType="end"/>
       </w:r>
-      <w:r>
-        <w:fldChar w:fldCharType="begin"/>
-      </w:r>
-      <w:r>
-        <w:instrText xml:space="preserve"> TOC \h \z \c "B</w:instrText>
-      </w:r>
-      <w:r>
-        <w:instrText>ả</w:instrText>
-      </w:r>
-      <w:r>
-        <w:instrText xml:space="preserve">ng" </w:instrText>
-      </w:r>
-      <w:r>
-        <w:fldChar w:fldCharType="separate"/>
-      </w:r>
-      <w:r>
-        <w:fldChar w:fldCharType="end"/>
-      </w:r>
-      <w:r>
-        <w:fldChar w:fldCharType="begin"/>
-      </w:r>
-      <w:r>
-        <w:instrText xml:space="preserve"> TOC \h \z \c "B</w:instrText>
-      </w:r>
-      <w:r>
-        <w:instrText>ả</w:instrText>
-      </w:r>
-      <w:r>
-        <w:instrText xml:space="preserve">ng" </w:instrText>
-      </w:r>
-      <w:r>
-        <w:fldChar w:fldCharType="separate"/>
-      </w:r>
-      <w:r>
-        <w:fldChar w:fldCharType="end"/>
-      </w:r>
+      <w:fldSimple w:instr=" TOC \h \z \c &quot;Bảng&quot; "/>
+      <w:fldSimple w:instr=" TOC \h \z \c &quot;Bảng&quot; "/>
       <w:r>
         <w:br w:type="page"/>
       </w:r>
@@ -6874,7 +7244,7 @@
           <w:szCs w:val="26"/>
         </w:rPr>
       </w:pPr>
-      <w:bookmarkStart w:id="26" w:name="_Toc235647593"/>
+      <w:bookmarkStart w:id="26" w:name="_Toc235770271"/>
       <w:r>
         <w:rPr>
           <w:rFonts w:ascii="Times New Roman" w:hAnsi="Times New Roman" w:cs="Times New Roman"/>
@@ -8329,16 +8699,7 @@
           <w:sz w:val="26"/>
           <w:szCs w:val="26"/>
         </w:rPr>
-        <w:t xml:space="preserve">Prisma hoạt động dựa trên tệp </w:t>
-      </w:r>
-      <w:proofErr w:type="gramStart"/>
-      <w:r>
-        <w:rPr>
-          <w:rFonts w:ascii="Times New Roman" w:hAnsi="Times New Roman" w:cs="Times New Roman"/>
-          <w:sz w:val="26"/>
-          <w:szCs w:val="26"/>
-        </w:rPr>
-        <w:t>schema.pri</w:t>
+        <w:t>Prisma hoạt động dựa trên tệp schema.pri</w:t>
       </w:r>
       <w:r>
         <w:rPr>
@@ -8354,16 +8715,7 @@
           <w:sz w:val="26"/>
           <w:szCs w:val="26"/>
         </w:rPr>
-        <w:t>ma</w:t>
-      </w:r>
-      <w:proofErr w:type="gramEnd"/>
-      <w:r>
-        <w:rPr>
-          <w:rFonts w:ascii="Times New Roman" w:hAnsi="Times New Roman" w:cs="Times New Roman"/>
-          <w:sz w:val="26"/>
-          <w:szCs w:val="26"/>
-        </w:rPr>
-        <w:t xml:space="preserve"> nơi định nghĩa các Model và thông tin kết nối đến cơ sở dữ liệu. Dựa trên tệp này, Prisma sẽ sinh ra </w:t>
+        <w:t xml:space="preserve">ma nơi định nghĩa các Model và thông tin kết nối đến cơ sở dữ liệu. Dựa trên tệp này, Prisma sẽ sinh ra </w:t>
       </w:r>
       <w:r>
         <w:rPr>
@@ -9861,7 +10213,7 @@
                     <pic:cNvPicPr/>
                   </pic:nvPicPr>
                   <pic:blipFill>
-                    <a:blip r:embed="rId9">
+                    <a:blip r:embed="rId10">
                       <a:extLst>
                         <a:ext uri="{28A0092B-C50C-407E-A947-70E740481C1C}">
                           <a14:useLocalDpi xmlns:a14="http://schemas.microsoft.com/office/drawing/2010/main" val="0"/>
@@ -9898,7 +10250,7 @@
         </w:rPr>
       </w:pPr>
       <w:bookmarkStart w:id="57" w:name="_Toc235641387"/>
-      <w:bookmarkStart w:id="58" w:name="_Toc235739348"/>
+      <w:bookmarkStart w:id="58" w:name="_Toc235770285"/>
       <w:r>
         <w:rPr>
           <w:rFonts w:ascii="Times New Roman" w:hAnsi="Times New Roman" w:cs="Times New Roman"/>
@@ -10487,7 +10839,7 @@
           <w:szCs w:val="26"/>
         </w:rPr>
       </w:pPr>
-      <w:bookmarkStart w:id="61" w:name="_Toc235647594"/>
+      <w:bookmarkStart w:id="61" w:name="_Toc235770272"/>
       <w:r>
         <w:rPr>
           <w:rFonts w:ascii="Times New Roman" w:hAnsi="Times New Roman" w:cs="Times New Roman"/>
@@ -11188,7 +11540,7 @@
           <w:szCs w:val="26"/>
         </w:rPr>
       </w:pPr>
-      <w:bookmarkStart w:id="62" w:name="_Toc235647595"/>
+      <w:bookmarkStart w:id="62" w:name="_Toc235770273"/>
       <w:r>
         <w:rPr>
           <w:rFonts w:ascii="Times New Roman" w:hAnsi="Times New Roman" w:cs="Times New Roman"/>
@@ -11254,7 +11606,6 @@
         </w:rPr>
         <w:t>UC</w:t>
       </w:r>
-      <w:proofErr w:type="gramStart"/>
       <w:r>
         <w:rPr>
           <w:rFonts w:ascii="Times New Roman" w:hAnsi="Times New Roman" w:cs="Times New Roman"/>
@@ -11277,16 +11628,7 @@
           <w:sz w:val="26"/>
           <w:szCs w:val="26"/>
         </w:rPr>
-        <w:t>Quản</w:t>
-      </w:r>
-      <w:proofErr w:type="gramEnd"/>
-      <w:r>
-        <w:rPr>
-          <w:rFonts w:ascii="Times New Roman" w:hAnsi="Times New Roman" w:cs="Times New Roman"/>
-          <w:sz w:val="26"/>
-          <w:szCs w:val="26"/>
-        </w:rPr>
-        <w:t xml:space="preserve"> lý Lead</w:t>
+        <w:t>Quản lý Lead</w:t>
       </w:r>
       <w:bookmarkEnd w:id="62"/>
     </w:p>
@@ -11815,7 +12157,7 @@
           <w:szCs w:val="26"/>
         </w:rPr>
       </w:pPr>
-      <w:bookmarkStart w:id="63" w:name="_Toc235647596"/>
+      <w:bookmarkStart w:id="63" w:name="_Toc235770274"/>
       <w:r>
         <w:rPr>
           <w:rFonts w:ascii="Times New Roman" w:hAnsi="Times New Roman" w:cs="Times New Roman"/>
@@ -12460,7 +12802,7 @@
           <w:szCs w:val="26"/>
         </w:rPr>
       </w:pPr>
-      <w:bookmarkStart w:id="64" w:name="_Toc235647597"/>
+      <w:bookmarkStart w:id="64" w:name="_Toc235770275"/>
       <w:r>
         <w:rPr>
           <w:rFonts w:ascii="Times New Roman" w:hAnsi="Times New Roman" w:cs="Times New Roman"/>
@@ -12910,7 +13252,7 @@
           <w:szCs w:val="26"/>
         </w:rPr>
       </w:pPr>
-      <w:bookmarkStart w:id="65" w:name="_Toc235647598"/>
+      <w:bookmarkStart w:id="65" w:name="_Toc235770276"/>
       <w:r>
         <w:rPr>
           <w:rFonts w:ascii="Times New Roman" w:hAnsi="Times New Roman" w:cs="Times New Roman"/>
@@ -13357,7 +13699,7 @@
           <w:szCs w:val="26"/>
         </w:rPr>
       </w:pPr>
-      <w:bookmarkStart w:id="66" w:name="_Toc235647599"/>
+      <w:bookmarkStart w:id="66" w:name="_Toc235770277"/>
       <w:r>
         <w:rPr>
           <w:rFonts w:ascii="Times New Roman" w:hAnsi="Times New Roman" w:cs="Times New Roman"/>
@@ -13939,7 +14281,7 @@
           <w:szCs w:val="26"/>
         </w:rPr>
       </w:pPr>
-      <w:bookmarkStart w:id="67" w:name="_Toc235647600"/>
+      <w:bookmarkStart w:id="67" w:name="_Toc235770278"/>
       <w:r>
         <w:rPr>
           <w:rFonts w:ascii="Times New Roman" w:hAnsi="Times New Roman" w:cs="Times New Roman"/>
@@ -14566,7 +14908,7 @@
           <w:szCs w:val="26"/>
         </w:rPr>
       </w:pPr>
-      <w:bookmarkStart w:id="68" w:name="_Toc235647601"/>
+      <w:bookmarkStart w:id="68" w:name="_Toc235770279"/>
       <w:r>
         <w:rPr>
           <w:rFonts w:ascii="Times New Roman" w:hAnsi="Times New Roman" w:cs="Times New Roman"/>
@@ -15036,7 +15378,7 @@
           <w:szCs w:val="26"/>
         </w:rPr>
       </w:pPr>
-      <w:bookmarkStart w:id="69" w:name="_Toc235647602"/>
+      <w:bookmarkStart w:id="69" w:name="_Toc235770280"/>
       <w:r>
         <w:rPr>
           <w:rFonts w:ascii="Times New Roman" w:hAnsi="Times New Roman" w:cs="Times New Roman"/>
@@ -15462,7 +15804,7 @@
           <w:szCs w:val="26"/>
         </w:rPr>
       </w:pPr>
-      <w:bookmarkStart w:id="70" w:name="_Toc235647603"/>
+      <w:bookmarkStart w:id="70" w:name="_Toc235770281"/>
       <w:r>
         <w:rPr>
           <w:rFonts w:ascii="Times New Roman" w:hAnsi="Times New Roman" w:cs="Times New Roman"/>
@@ -15568,7 +15910,7 @@
                     <pic:cNvPicPr/>
                   </pic:nvPicPr>
                   <pic:blipFill>
-                    <a:blip r:embed="rId10">
+                    <a:blip r:embed="rId11">
                       <a:extLst>
                         <a:ext uri="{28A0092B-C50C-407E-A947-70E740481C1C}">
                           <a14:useLocalDpi xmlns:a14="http://schemas.microsoft.com/office/drawing/2010/main" val="0"/>
@@ -15604,7 +15946,7 @@
           <w:szCs w:val="26"/>
         </w:rPr>
       </w:pPr>
-      <w:bookmarkStart w:id="73" w:name="_Toc235739349"/>
+      <w:bookmarkStart w:id="73" w:name="_Toc235770286"/>
       <w:r>
         <w:rPr>
           <w:rFonts w:ascii="Times New Roman" w:hAnsi="Times New Roman" w:cs="Times New Roman"/>
@@ -15721,7 +16063,7 @@
                     <pic:cNvPicPr/>
                   </pic:nvPicPr>
                   <pic:blipFill>
-                    <a:blip r:embed="rId11">
+                    <a:blip r:embed="rId12">
                       <a:extLst>
                         <a:ext uri="{28A0092B-C50C-407E-A947-70E740481C1C}">
                           <a14:useLocalDpi xmlns:a14="http://schemas.microsoft.com/office/drawing/2010/main" val="0"/>
@@ -15757,7 +16099,7 @@
           <w:szCs w:val="26"/>
         </w:rPr>
       </w:pPr>
-      <w:bookmarkStart w:id="74" w:name="_Toc235739350"/>
+      <w:bookmarkStart w:id="74" w:name="_Toc235770287"/>
       <w:r>
         <w:rPr>
           <w:rFonts w:ascii="Times New Roman" w:hAnsi="Times New Roman" w:cs="Times New Roman"/>
@@ -15862,7 +16204,7 @@
                     <pic:cNvPicPr/>
                   </pic:nvPicPr>
                   <pic:blipFill>
-                    <a:blip r:embed="rId12">
+                    <a:blip r:embed="rId13">
                       <a:extLst>
                         <a:ext uri="{28A0092B-C50C-407E-A947-70E740481C1C}">
                           <a14:useLocalDpi xmlns:a14="http://schemas.microsoft.com/office/drawing/2010/main" val="0"/>
@@ -15898,7 +16240,7 @@
           <w:szCs w:val="26"/>
         </w:rPr>
       </w:pPr>
-      <w:bookmarkStart w:id="75" w:name="_Toc235739351"/>
+      <w:bookmarkStart w:id="75" w:name="_Toc235770288"/>
       <w:r>
         <w:rPr>
           <w:rFonts w:ascii="Times New Roman" w:hAnsi="Times New Roman" w:cs="Times New Roman"/>
@@ -16010,7 +16352,7 @@
                     <pic:cNvPicPr/>
                   </pic:nvPicPr>
                   <pic:blipFill>
-                    <a:blip r:embed="rId13">
+                    <a:blip r:embed="rId14">
                       <a:extLst>
                         <a:ext uri="{28A0092B-C50C-407E-A947-70E740481C1C}">
                           <a14:useLocalDpi xmlns:a14="http://schemas.microsoft.com/office/drawing/2010/main" val="0"/>
@@ -16046,7 +16388,7 @@
           <w:szCs w:val="26"/>
         </w:rPr>
       </w:pPr>
-      <w:bookmarkStart w:id="76" w:name="_Toc235739352"/>
+      <w:bookmarkStart w:id="76" w:name="_Toc235770289"/>
       <w:r>
         <w:rPr>
           <w:rFonts w:ascii="Times New Roman" w:hAnsi="Times New Roman" w:cs="Times New Roman"/>
@@ -16159,7 +16501,7 @@
                     <pic:cNvPicPr/>
                   </pic:nvPicPr>
                   <pic:blipFill>
-                    <a:blip r:embed="rId14">
+                    <a:blip r:embed="rId15">
                       <a:extLst>
                         <a:ext uri="{28A0092B-C50C-407E-A947-70E740481C1C}">
                           <a14:useLocalDpi xmlns:a14="http://schemas.microsoft.com/office/drawing/2010/main" val="0"/>
@@ -16195,7 +16537,7 @@
           <w:szCs w:val="26"/>
         </w:rPr>
       </w:pPr>
-      <w:bookmarkStart w:id="77" w:name="_Toc235739353"/>
+      <w:bookmarkStart w:id="77" w:name="_Toc235770290"/>
       <w:r>
         <w:rPr>
           <w:rFonts w:ascii="Times New Roman" w:hAnsi="Times New Roman" w:cs="Times New Roman"/>
@@ -16345,7 +16687,7 @@
                     <pic:cNvPicPr/>
                   </pic:nvPicPr>
                   <pic:blipFill>
-                    <a:blip r:embed="rId15">
+                    <a:blip r:embed="rId16">
                       <a:extLst>
                         <a:ext uri="{28A0092B-C50C-407E-A947-70E740481C1C}">
                           <a14:useLocalDpi xmlns:a14="http://schemas.microsoft.com/office/drawing/2010/main" val="0"/>
@@ -16381,7 +16723,7 @@
           <w:szCs w:val="26"/>
         </w:rPr>
       </w:pPr>
-      <w:bookmarkStart w:id="82" w:name="_Toc235739354"/>
+      <w:bookmarkStart w:id="82" w:name="_Toc235770291"/>
       <w:r>
         <w:rPr>
           <w:rFonts w:ascii="Times New Roman" w:hAnsi="Times New Roman" w:cs="Times New Roman"/>
@@ -16521,25 +16863,7 @@
           <w:sz w:val="26"/>
           <w:szCs w:val="26"/>
         </w:rPr>
-        <w:t>Leads – Customers: quan hệ 1-</w:t>
-      </w:r>
-      <w:proofErr w:type="gramStart"/>
-      <w:r>
-        <w:rPr>
-          <w:rFonts w:ascii="Times New Roman" w:hAnsi="Times New Roman" w:cs="Times New Roman"/>
-          <w:sz w:val="26"/>
-          <w:szCs w:val="26"/>
-        </w:rPr>
-        <w:t>0..</w:t>
-      </w:r>
-      <w:proofErr w:type="gramEnd"/>
-      <w:r>
-        <w:rPr>
-          <w:rFonts w:ascii="Times New Roman" w:hAnsi="Times New Roman" w:cs="Times New Roman"/>
-          <w:sz w:val="26"/>
-          <w:szCs w:val="26"/>
-        </w:rPr>
-        <w:t>1, một khách hàng tiềm năng có thể được chuyển thành một khách hàng hoặc không.</w:t>
+        <w:t>Leads – Customers: quan hệ 1-0..1, một khách hàng tiềm năng có thể được chuyển thành một khách hàng hoặc không.</w:t>
       </w:r>
     </w:p>
     <w:p>
@@ -16762,7 +17086,7 @@
                     <pic:cNvPicPr/>
                   </pic:nvPicPr>
                   <pic:blipFill>
-                    <a:blip r:embed="rId16" cstate="print">
+                    <a:blip r:embed="rId17" cstate="print">
                       <a:extLst>
                         <a:ext uri="{28A0092B-C50C-407E-A947-70E740481C1C}">
                           <a14:useLocalDpi xmlns:a14="http://schemas.microsoft.com/office/drawing/2010/main" val="0"/>
@@ -16798,7 +17122,7 @@
           <w:szCs w:val="26"/>
         </w:rPr>
       </w:pPr>
-      <w:bookmarkStart w:id="84" w:name="_Toc235739355"/>
+      <w:bookmarkStart w:id="84" w:name="_Toc235770292"/>
       <w:r>
         <w:rPr>
           <w:rFonts w:ascii="Times New Roman" w:hAnsi="Times New Roman" w:cs="Times New Roman"/>
@@ -16911,12 +17235,1525 @@
     </w:p>
     <w:p>
       <w:pPr>
-        <w:rPr>
-          <w:rFonts w:ascii="Times New Roman" w:hAnsi="Times New Roman" w:cs="Times New Roman"/>
-          <w:sz w:val="26"/>
-          <w:szCs w:val="26"/>
-        </w:rPr>
-      </w:pPr>
+        <w:pStyle w:val="Heading3"/>
+        <w:rPr>
+          <w:rFonts w:ascii="Times New Roman" w:hAnsi="Times New Roman" w:cs="Times New Roman"/>
+        </w:rPr>
+      </w:pPr>
+      <w:r>
+        <w:rPr>
+          <w:rFonts w:ascii="Times New Roman" w:hAnsi="Times New Roman" w:cs="Times New Roman"/>
+        </w:rPr>
+        <w:t>Kiến trúc tổng thể</w:t>
+      </w:r>
+    </w:p>
+    <w:p>
+      <w:pPr>
+        <w:rPr>
+          <w:rFonts w:ascii="Times New Roman" w:hAnsi="Times New Roman" w:cs="Times New Roman"/>
+          <w:sz w:val="26"/>
+          <w:szCs w:val="26"/>
+        </w:rPr>
+      </w:pPr>
+      <w:r>
+        <w:rPr>
+          <w:noProof/>
+        </w:rPr>
+        <mc:AlternateContent>
+          <mc:Choice Requires="wps">
+            <w:drawing>
+              <wp:anchor distT="0" distB="0" distL="114300" distR="114300" simplePos="0" relativeHeight="251660288" behindDoc="0" locked="0" layoutInCell="1" allowOverlap="1" wp14:anchorId="0FD8DF74" wp14:editId="5E41F144">
+                <wp:simplePos x="0" y="0"/>
+                <wp:positionH relativeFrom="column">
+                  <wp:posOffset>1187450</wp:posOffset>
+                </wp:positionH>
+                <wp:positionV relativeFrom="paragraph">
+                  <wp:posOffset>5329555</wp:posOffset>
+                </wp:positionV>
+                <wp:extent cx="2876550" cy="635"/>
+                <wp:effectExtent l="0" t="0" r="0" b="0"/>
+                <wp:wrapTopAndBottom/>
+                <wp:docPr id="11" name="Text Box 11"/>
+                <wp:cNvGraphicFramePr/>
+                <a:graphic xmlns:a="http://schemas.openxmlformats.org/drawingml/2006/main">
+                  <a:graphicData uri="http://schemas.microsoft.com/office/word/2010/wordprocessingShape">
+                    <wps:wsp>
+                      <wps:cNvSpPr txBox="1"/>
+                      <wps:spPr>
+                        <a:xfrm>
+                          <a:off x="0" y="0"/>
+                          <a:ext cx="2876550" cy="635"/>
+                        </a:xfrm>
+                        <a:prstGeom prst="rect">
+                          <a:avLst/>
+                        </a:prstGeom>
+                        <a:solidFill>
+                          <a:prstClr val="white"/>
+                        </a:solidFill>
+                        <a:ln>
+                          <a:noFill/>
+                        </a:ln>
+                      </wps:spPr>
+                      <wps:txbx>
+                        <w:txbxContent>
+                          <w:p>
+                            <w:pPr>
+                              <w:pStyle w:val="Caption"/>
+                              <w:rPr>
+                                <w:rFonts w:ascii="Times New Roman" w:hAnsi="Times New Roman" w:cs="Times New Roman"/>
+                                <w:noProof/>
+                                <w:sz w:val="26"/>
+                                <w:szCs w:val="26"/>
+                              </w:rPr>
+                            </w:pPr>
+                            <w:bookmarkStart w:id="86" w:name="_Toc235770293"/>
+                            <w:r>
+                              <w:rPr>
+                                <w:rFonts w:ascii="Times New Roman" w:hAnsi="Times New Roman" w:cs="Times New Roman"/>
+                                <w:sz w:val="26"/>
+                                <w:szCs w:val="26"/>
+                              </w:rPr>
+                              <w:t xml:space="preserve">Hình </w:t>
+                            </w:r>
+                            <w:r>
+                              <w:rPr>
+                                <w:rFonts w:ascii="Times New Roman" w:hAnsi="Times New Roman" w:cs="Times New Roman"/>
+                                <w:sz w:val="26"/>
+                                <w:szCs w:val="26"/>
+                              </w:rPr>
+                              <w:fldChar w:fldCharType="begin"/>
+                            </w:r>
+                            <w:r>
+                              <w:rPr>
+                                <w:rFonts w:ascii="Times New Roman" w:hAnsi="Times New Roman" w:cs="Times New Roman"/>
+                                <w:sz w:val="26"/>
+                                <w:szCs w:val="26"/>
+                              </w:rPr>
+                              <w:instrText xml:space="preserve"> SEQ Hình \* ARABIC </w:instrText>
+                            </w:r>
+                            <w:r>
+                              <w:rPr>
+                                <w:rFonts w:ascii="Times New Roman" w:hAnsi="Times New Roman" w:cs="Times New Roman"/>
+                                <w:sz w:val="26"/>
+                                <w:szCs w:val="26"/>
+                              </w:rPr>
+                              <w:fldChar w:fldCharType="separate"/>
+                            </w:r>
+                            <w:r>
+                              <w:rPr>
+                                <w:rFonts w:ascii="Times New Roman" w:hAnsi="Times New Roman" w:cs="Times New Roman"/>
+                                <w:noProof/>
+                                <w:sz w:val="26"/>
+                                <w:szCs w:val="26"/>
+                              </w:rPr>
+                              <w:t>9</w:t>
+                            </w:r>
+                            <w:r>
+                              <w:rPr>
+                                <w:rFonts w:ascii="Times New Roman" w:hAnsi="Times New Roman" w:cs="Times New Roman"/>
+                                <w:sz w:val="26"/>
+                                <w:szCs w:val="26"/>
+                              </w:rPr>
+                              <w:fldChar w:fldCharType="end"/>
+                            </w:r>
+                            <w:r>
+                              <w:rPr>
+                                <w:rFonts w:ascii="Times New Roman" w:hAnsi="Times New Roman" w:cs="Times New Roman"/>
+                                <w:sz w:val="26"/>
+                                <w:szCs w:val="26"/>
+                              </w:rPr>
+                              <w:t>: Kiến trúc tổng thể</w:t>
+                            </w:r>
+                            <w:bookmarkEnd w:id="86"/>
+                          </w:p>
+                        </w:txbxContent>
+                      </wps:txbx>
+                      <wps:bodyPr rot="0" spcFirstLastPara="0" vertOverflow="overflow" horzOverflow="overflow" vert="horz" wrap="square" lIns="0" tIns="0" rIns="0" bIns="0" numCol="1" spcCol="0" rtlCol="0" fromWordArt="0" anchor="t" anchorCtr="0" forceAA="0" compatLnSpc="1">
+                        <a:prstTxWarp prst="textNoShape">
+                          <a:avLst/>
+                        </a:prstTxWarp>
+                        <a:spAutoFit/>
+                      </wps:bodyPr>
+                    </wps:wsp>
+                  </a:graphicData>
+                </a:graphic>
+              </wp:anchor>
+            </w:drawing>
+          </mc:Choice>
+          <mc:Fallback>
+            <w:pict>
+              <v:shapetype w14:anchorId="0FD8DF74" id="_x0000_t202" coordsize="21600,21600" o:spt="202" path="m,l,21600r21600,l21600,xe">
+                <v:stroke joinstyle="miter"/>
+                <v:path gradientshapeok="t" o:connecttype="rect"/>
+              </v:shapetype>
+              <v:shape id="Text Box 11" o:spid="_x0000_s1026" type="#_x0000_t202" style="position:absolute;margin-left:93.5pt;margin-top:419.65pt;width:226.5pt;height:.05pt;z-index:251660288;visibility:visible;mso-wrap-style:square;mso-wrap-distance-left:9pt;mso-wrap-distance-top:0;mso-wrap-distance-right:9pt;mso-wrap-distance-bottom:0;mso-position-horizontal:absolute;mso-position-horizontal-relative:text;mso-position-vertical:absolute;mso-position-vertical-relative:text;v-text-anchor:top" o:gfxdata="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" stroked="f">
+                <v:textbox style="mso-fit-shape-to-text:t" inset="0,0,0,0">
+                  <w:txbxContent>
+                    <w:p>
+                      <w:pPr>
+                        <w:pStyle w:val="Caption"/>
+                        <w:rPr>
+                          <w:rFonts w:ascii="Times New Roman" w:hAnsi="Times New Roman" w:cs="Times New Roman"/>
+                          <w:noProof/>
+                          <w:sz w:val="26"/>
+                          <w:szCs w:val="26"/>
+                        </w:rPr>
+                      </w:pPr>
+                      <w:bookmarkStart w:id="87" w:name="_Toc235770293"/>
+                      <w:r>
+                        <w:rPr>
+                          <w:rFonts w:ascii="Times New Roman" w:hAnsi="Times New Roman" w:cs="Times New Roman"/>
+                          <w:sz w:val="26"/>
+                          <w:szCs w:val="26"/>
+                        </w:rPr>
+                        <w:t xml:space="preserve">Hình </w:t>
+                      </w:r>
+                      <w:r>
+                        <w:rPr>
+                          <w:rFonts w:ascii="Times New Roman" w:hAnsi="Times New Roman" w:cs="Times New Roman"/>
+                          <w:sz w:val="26"/>
+                          <w:szCs w:val="26"/>
+                        </w:rPr>
+                        <w:fldChar w:fldCharType="begin"/>
+                      </w:r>
+                      <w:r>
+                        <w:rPr>
+                          <w:rFonts w:ascii="Times New Roman" w:hAnsi="Times New Roman" w:cs="Times New Roman"/>
+                          <w:sz w:val="26"/>
+                          <w:szCs w:val="26"/>
+                        </w:rPr>
+                        <w:instrText xml:space="preserve"> SEQ Hình \* ARABIC </w:instrText>
+                      </w:r>
+                      <w:r>
+                        <w:rPr>
+                          <w:rFonts w:ascii="Times New Roman" w:hAnsi="Times New Roman" w:cs="Times New Roman"/>
+                          <w:sz w:val="26"/>
+                          <w:szCs w:val="26"/>
+                        </w:rPr>
+                        <w:fldChar w:fldCharType="separate"/>
+                      </w:r>
+                      <w:r>
+                        <w:rPr>
+                          <w:rFonts w:ascii="Times New Roman" w:hAnsi="Times New Roman" w:cs="Times New Roman"/>
+                          <w:noProof/>
+                          <w:sz w:val="26"/>
+                          <w:szCs w:val="26"/>
+                        </w:rPr>
+                        <w:t>9</w:t>
+                      </w:r>
+                      <w:r>
+                        <w:rPr>
+                          <w:rFonts w:ascii="Times New Roman" w:hAnsi="Times New Roman" w:cs="Times New Roman"/>
+                          <w:sz w:val="26"/>
+                          <w:szCs w:val="26"/>
+                        </w:rPr>
+                        <w:fldChar w:fldCharType="end"/>
+                      </w:r>
+                      <w:r>
+                        <w:rPr>
+                          <w:rFonts w:ascii="Times New Roman" w:hAnsi="Times New Roman" w:cs="Times New Roman"/>
+                          <w:sz w:val="26"/>
+                          <w:szCs w:val="26"/>
+                        </w:rPr>
+                        <w:t>: Kiến trúc tổng thể</w:t>
+                      </w:r>
+                      <w:bookmarkEnd w:id="87"/>
+                    </w:p>
+                  </w:txbxContent>
+                </v:textbox>
+                <w10:wrap type="topAndBottom"/>
+              </v:shape>
+            </w:pict>
+          </mc:Fallback>
+        </mc:AlternateContent>
+      </w:r>
+      <w:r>
+        <w:rPr>
+          <w:rFonts w:ascii="Times New Roman" w:hAnsi="Times New Roman" w:cs="Times New Roman"/>
+          <w:noProof/>
+          <w:sz w:val="26"/>
+          <w:szCs w:val="26"/>
+        </w:rPr>
+        <w:drawing>
+          <wp:anchor distT="0" distB="0" distL="114300" distR="114300" simplePos="0" relativeHeight="251658240" behindDoc="1" locked="0" layoutInCell="1" allowOverlap="1" wp14:anchorId="12CA03A8" wp14:editId="227065EC">
+            <wp:simplePos x="0" y="0"/>
+            <wp:positionH relativeFrom="page">
+              <wp:align>center</wp:align>
+            </wp:positionH>
+            <wp:positionV relativeFrom="paragraph">
+              <wp:posOffset>1157605</wp:posOffset>
+            </wp:positionV>
+            <wp:extent cx="2876550" cy="4114800"/>
+            <wp:effectExtent l="0" t="0" r="0" b="0"/>
+            <wp:wrapTopAndBottom/>
+            <wp:docPr id="6" name="Picture 6"/>
+            <wp:cNvGraphicFramePr>
+              <a:graphicFrameLocks xmlns:a="http://schemas.openxmlformats.org/drawingml/2006/main" noChangeAspect="1"/>
+            </wp:cNvGraphicFramePr>
+            <a:graphic xmlns:a="http://schemas.openxmlformats.org/drawingml/2006/main">
+              <a:graphicData uri="http://schemas.openxmlformats.org/drawingml/2006/picture">
+                <pic:pic xmlns:pic="http://schemas.openxmlformats.org/drawingml/2006/picture">
+                  <pic:nvPicPr>
+                    <pic:cNvPr id="6" name="Picture 6"/>
+                    <pic:cNvPicPr/>
+                  </pic:nvPicPr>
+                  <pic:blipFill>
+                    <a:blip r:embed="rId18">
+                      <a:extLst>
+                        <a:ext uri="{28A0092B-C50C-407E-A947-70E740481C1C}">
+                          <a14:useLocalDpi xmlns:a14="http://schemas.microsoft.com/office/drawing/2010/main" val="0"/>
+                        </a:ext>
+                      </a:extLst>
+                    </a:blip>
+                    <a:stretch>
+                      <a:fillRect/>
+                    </a:stretch>
+                  </pic:blipFill>
+                  <pic:spPr>
+                    <a:xfrm>
+                      <a:off x="0" y="0"/>
+                      <a:ext cx="2876550" cy="4114800"/>
+                    </a:xfrm>
+                    <a:prstGeom prst="rect">
+                      <a:avLst/>
+                    </a:prstGeom>
+                  </pic:spPr>
+                </pic:pic>
+              </a:graphicData>
+            </a:graphic>
+          </wp:anchor>
+        </w:drawing>
+      </w:r>
+      <w:r>
+        <w:rPr>
+          <w:rFonts w:ascii="Times New Roman" w:hAnsi="Times New Roman" w:cs="Times New Roman"/>
+          <w:sz w:val="26"/>
+          <w:szCs w:val="26"/>
+        </w:rPr>
+        <w:t>Kiển trúc tổng thể của hệ thống CRM được xây dựng theo mô hình Client – Server. Người dùng truy cập hệ thống thông qua trình duyệt web và thao tác trên giao diện được phát triển bởi Next.js. Các thao tác và yêu cầu của người dùng sẽ được gửi đến back-end thông qua RESTful API. Back-end được xây dựng bằng NestJS theo kiến trúc Modular để xử lý nghiệp vụ và sử dụng Prisma ORM để truy cập vào PostgreSQL.</w:t>
+      </w:r>
+    </w:p>
+    <w:p>
+      <w:pPr>
+        <w:pStyle w:val="Heading3"/>
+        <w:rPr>
+          <w:rFonts w:ascii="Times New Roman" w:hAnsi="Times New Roman" w:cs="Times New Roman"/>
+        </w:rPr>
+      </w:pPr>
+      <w:r>
+        <w:rPr>
+          <w:rFonts w:ascii="Times New Roman" w:hAnsi="Times New Roman" w:cs="Times New Roman"/>
+        </w:rPr>
+        <w:lastRenderedPageBreak/>
+        <w:t>Kiến trúc Modular</w:t>
+      </w:r>
+    </w:p>
+    <w:p>
+      <w:pPr>
+        <w:keepNext/>
+      </w:pPr>
+      <w:r>
+        <w:rPr>
+          <w:rFonts w:ascii="Times New Roman" w:hAnsi="Times New Roman" w:cs="Times New Roman"/>
+          <w:noProof/>
+          <w:sz w:val="26"/>
+          <w:szCs w:val="26"/>
+        </w:rPr>
+        <w:drawing>
+          <wp:inline distT="0" distB="0" distL="0" distR="0" wp14:anchorId="758A5033" wp14:editId="4A3F4E67">
+            <wp:extent cx="5791835" cy="462915"/>
+            <wp:effectExtent l="0" t="0" r="0" b="7620"/>
+            <wp:docPr id="12" name="Picture 12"/>
+            <wp:cNvGraphicFramePr>
+              <a:graphicFrameLocks xmlns:a="http://schemas.openxmlformats.org/drawingml/2006/main" noChangeAspect="1"/>
+            </wp:cNvGraphicFramePr>
+            <a:graphic xmlns:a="http://schemas.openxmlformats.org/drawingml/2006/main">
+              <a:graphicData uri="http://schemas.openxmlformats.org/drawingml/2006/picture">
+                <pic:pic xmlns:pic="http://schemas.openxmlformats.org/drawingml/2006/picture">
+                  <pic:nvPicPr>
+                    <pic:cNvPr id="12" name="Picture 12"/>
+                    <pic:cNvPicPr/>
+                  </pic:nvPicPr>
+                  <pic:blipFill>
+                    <a:blip r:embed="rId19" cstate="print">
+                      <a:extLst>
+                        <a:ext uri="{28A0092B-C50C-407E-A947-70E740481C1C}">
+                          <a14:useLocalDpi xmlns:a14="http://schemas.microsoft.com/office/drawing/2010/main" val="0"/>
+                        </a:ext>
+                      </a:extLst>
+                    </a:blip>
+                    <a:stretch>
+                      <a:fillRect/>
+                    </a:stretch>
+                  </pic:blipFill>
+                  <pic:spPr>
+                    <a:xfrm>
+                      <a:off x="0" y="0"/>
+                      <a:ext cx="5791835" cy="462915"/>
+                    </a:xfrm>
+                    <a:prstGeom prst="rect">
+                      <a:avLst/>
+                    </a:prstGeom>
+                  </pic:spPr>
+                </pic:pic>
+              </a:graphicData>
+            </a:graphic>
+          </wp:inline>
+        </w:drawing>
+      </w:r>
+    </w:p>
+    <w:p>
+      <w:pPr>
+        <w:pStyle w:val="Caption"/>
+        <w:rPr>
+          <w:rFonts w:ascii="Times New Roman" w:hAnsi="Times New Roman" w:cs="Times New Roman"/>
+          <w:sz w:val="26"/>
+          <w:szCs w:val="26"/>
+        </w:rPr>
+      </w:pPr>
+      <w:bookmarkStart w:id="88" w:name="_Toc235770294"/>
+      <w:r>
+        <w:rPr>
+          <w:rFonts w:ascii="Times New Roman" w:hAnsi="Times New Roman" w:cs="Times New Roman"/>
+          <w:sz w:val="26"/>
+          <w:szCs w:val="26"/>
+        </w:rPr>
+        <w:t xml:space="preserve">Hình </w:t>
+      </w:r>
+      <w:r>
+        <w:rPr>
+          <w:rFonts w:ascii="Times New Roman" w:hAnsi="Times New Roman" w:cs="Times New Roman"/>
+          <w:sz w:val="26"/>
+          <w:szCs w:val="26"/>
+        </w:rPr>
+        <w:fldChar w:fldCharType="begin"/>
+      </w:r>
+      <w:r>
+        <w:rPr>
+          <w:rFonts w:ascii="Times New Roman" w:hAnsi="Times New Roman" w:cs="Times New Roman"/>
+          <w:sz w:val="26"/>
+          <w:szCs w:val="26"/>
+        </w:rPr>
+        <w:instrText xml:space="preserve"> SEQ Hình \* ARABIC </w:instrText>
+      </w:r>
+      <w:r>
+        <w:rPr>
+          <w:rFonts w:ascii="Times New Roman" w:hAnsi="Times New Roman" w:cs="Times New Roman"/>
+          <w:sz w:val="26"/>
+          <w:szCs w:val="26"/>
+        </w:rPr>
+        <w:fldChar w:fldCharType="separate"/>
+      </w:r>
+      <w:r>
+        <w:rPr>
+          <w:rFonts w:ascii="Times New Roman" w:hAnsi="Times New Roman" w:cs="Times New Roman"/>
+          <w:noProof/>
+          <w:sz w:val="26"/>
+          <w:szCs w:val="26"/>
+        </w:rPr>
+        <w:t>10</w:t>
+      </w:r>
+      <w:r>
+        <w:rPr>
+          <w:rFonts w:ascii="Times New Roman" w:hAnsi="Times New Roman" w:cs="Times New Roman"/>
+          <w:sz w:val="26"/>
+          <w:szCs w:val="26"/>
+        </w:rPr>
+        <w:fldChar w:fldCharType="end"/>
+      </w:r>
+      <w:r>
+        <w:rPr>
+          <w:rFonts w:ascii="Times New Roman" w:hAnsi="Times New Roman" w:cs="Times New Roman"/>
+          <w:sz w:val="26"/>
+          <w:szCs w:val="26"/>
+        </w:rPr>
+        <w:t>: Kiến trúc Modular</w:t>
+      </w:r>
+      <w:bookmarkEnd w:id="88"/>
+    </w:p>
+    <w:p>
+      <w:pPr>
+        <w:rPr>
+          <w:rFonts w:ascii="Times New Roman" w:hAnsi="Times New Roman" w:cs="Times New Roman"/>
+          <w:sz w:val="26"/>
+          <w:szCs w:val="26"/>
+        </w:rPr>
+      </w:pPr>
+    </w:p>
+    <w:p>
+      <w:pPr>
+        <w:keepNext/>
+      </w:pPr>
+      <w:r>
+        <w:rPr>
+          <w:rFonts w:ascii="Times New Roman" w:hAnsi="Times New Roman" w:cs="Times New Roman"/>
+          <w:noProof/>
+          <w:sz w:val="26"/>
+          <w:szCs w:val="26"/>
+        </w:rPr>
+        <w:drawing>
+          <wp:inline distT="0" distB="0" distL="0" distR="0" wp14:anchorId="559F1327" wp14:editId="0F9A8FFB">
+            <wp:extent cx="5791835" cy="2200275"/>
+            <wp:effectExtent l="0" t="0" r="0" b="9525"/>
+            <wp:docPr id="13" name="Picture 13"/>
+            <wp:cNvGraphicFramePr>
+              <a:graphicFrameLocks xmlns:a="http://schemas.openxmlformats.org/drawingml/2006/main" noChangeAspect="1"/>
+            </wp:cNvGraphicFramePr>
+            <a:graphic xmlns:a="http://schemas.openxmlformats.org/drawingml/2006/main">
+              <a:graphicData uri="http://schemas.openxmlformats.org/drawingml/2006/picture">
+                <pic:pic xmlns:pic="http://schemas.openxmlformats.org/drawingml/2006/picture">
+                  <pic:nvPicPr>
+                    <pic:cNvPr id="13" name="Picture 13"/>
+                    <pic:cNvPicPr/>
+                  </pic:nvPicPr>
+                  <pic:blipFill>
+                    <a:blip r:embed="rId20" cstate="print">
+                      <a:extLst>
+                        <a:ext uri="{28A0092B-C50C-407E-A947-70E740481C1C}">
+                          <a14:useLocalDpi xmlns:a14="http://schemas.microsoft.com/office/drawing/2010/main" val="0"/>
+                        </a:ext>
+                      </a:extLst>
+                    </a:blip>
+                    <a:stretch>
+                      <a:fillRect/>
+                    </a:stretch>
+                  </pic:blipFill>
+                  <pic:spPr>
+                    <a:xfrm>
+                      <a:off x="0" y="0"/>
+                      <a:ext cx="5791835" cy="2200275"/>
+                    </a:xfrm>
+                    <a:prstGeom prst="rect">
+                      <a:avLst/>
+                    </a:prstGeom>
+                  </pic:spPr>
+                </pic:pic>
+              </a:graphicData>
+            </a:graphic>
+          </wp:inline>
+        </w:drawing>
+      </w:r>
+    </w:p>
+    <w:p>
+      <w:pPr>
+        <w:pStyle w:val="Caption"/>
+        <w:rPr>
+          <w:rFonts w:ascii="Times New Roman" w:hAnsi="Times New Roman" w:cs="Times New Roman"/>
+          <w:sz w:val="26"/>
+          <w:szCs w:val="26"/>
+        </w:rPr>
+      </w:pPr>
+      <w:bookmarkStart w:id="89" w:name="_Toc235770295"/>
+      <w:r>
+        <w:rPr>
+          <w:rFonts w:ascii="Times New Roman" w:hAnsi="Times New Roman" w:cs="Times New Roman"/>
+          <w:sz w:val="26"/>
+          <w:szCs w:val="26"/>
+        </w:rPr>
+        <w:t xml:space="preserve">Hình </w:t>
+      </w:r>
+      <w:r>
+        <w:rPr>
+          <w:rFonts w:ascii="Times New Roman" w:hAnsi="Times New Roman" w:cs="Times New Roman"/>
+          <w:sz w:val="26"/>
+          <w:szCs w:val="26"/>
+        </w:rPr>
+        <w:fldChar w:fldCharType="begin"/>
+      </w:r>
+      <w:r>
+        <w:rPr>
+          <w:rFonts w:ascii="Times New Roman" w:hAnsi="Times New Roman" w:cs="Times New Roman"/>
+          <w:sz w:val="26"/>
+          <w:szCs w:val="26"/>
+        </w:rPr>
+        <w:instrText xml:space="preserve"> SEQ Hình \* ARABIC </w:instrText>
+      </w:r>
+      <w:r>
+        <w:rPr>
+          <w:rFonts w:ascii="Times New Roman" w:hAnsi="Times New Roman" w:cs="Times New Roman"/>
+          <w:sz w:val="26"/>
+          <w:szCs w:val="26"/>
+        </w:rPr>
+        <w:fldChar w:fldCharType="separate"/>
+      </w:r>
+      <w:r>
+        <w:rPr>
+          <w:rFonts w:ascii="Times New Roman" w:hAnsi="Times New Roman" w:cs="Times New Roman"/>
+          <w:noProof/>
+          <w:sz w:val="26"/>
+          <w:szCs w:val="26"/>
+        </w:rPr>
+        <w:t>11</w:t>
+      </w:r>
+      <w:r>
+        <w:rPr>
+          <w:rFonts w:ascii="Times New Roman" w:hAnsi="Times New Roman" w:cs="Times New Roman"/>
+          <w:sz w:val="26"/>
+          <w:szCs w:val="26"/>
+        </w:rPr>
+        <w:fldChar w:fldCharType="end"/>
+      </w:r>
+      <w:r>
+        <w:rPr>
+          <w:rFonts w:ascii="Times New Roman" w:hAnsi="Times New Roman" w:cs="Times New Roman"/>
+          <w:sz w:val="26"/>
+          <w:szCs w:val="26"/>
+        </w:rPr>
+        <w:t>: Kiến trúc của một Module</w:t>
+      </w:r>
+      <w:bookmarkEnd w:id="89"/>
+    </w:p>
+    <w:p>
+      <w:pPr>
+        <w:rPr>
+          <w:rFonts w:ascii="Times New Roman" w:hAnsi="Times New Roman" w:cs="Times New Roman"/>
+          <w:sz w:val="26"/>
+          <w:szCs w:val="26"/>
+        </w:rPr>
+      </w:pPr>
+      <w:r>
+        <w:rPr>
+          <w:rFonts w:ascii="Times New Roman" w:hAnsi="Times New Roman" w:cs="Times New Roman"/>
+          <w:sz w:val="26"/>
+          <w:szCs w:val="26"/>
+        </w:rPr>
+        <w:t>Hệ thống được tổ chức theo kiến trúc Modular. Mỗi module đảm nhận một hoặc một nhóm chức năng độc lập. Mỗi module bao gồm các thành phần Controller, Service, Repository</w:t>
+      </w:r>
+    </w:p>
+    <w:tbl>
+      <w:tblPr>
+        <w:tblStyle w:val="TableGrid"/>
+        <w:tblW w:w="0" w:type="auto"/>
+        <w:tblLook w:val="04A0" w:firstRow="1" w:lastRow="0" w:firstColumn="1" w:lastColumn="0" w:noHBand="0" w:noVBand="1"/>
+      </w:tblPr>
+      <w:tblGrid>
+        <w:gridCol w:w="4566"/>
+        <w:gridCol w:w="4545"/>
+      </w:tblGrid>
+      <w:tr>
+        <w:tc>
+          <w:tcPr>
+            <w:tcW w:w="4675" w:type="dxa"/>
+          </w:tcPr>
+          <w:p>
+            <w:pPr>
+              <w:jc w:val="center"/>
+              <w:rPr>
+                <w:rFonts w:ascii="Times New Roman" w:hAnsi="Times New Roman" w:cs="Times New Roman"/>
+                <w:b/>
+                <w:bCs/>
+                <w:sz w:val="26"/>
+                <w:szCs w:val="26"/>
+              </w:rPr>
+            </w:pPr>
+            <w:r>
+              <w:rPr>
+                <w:rFonts w:ascii="Times New Roman" w:hAnsi="Times New Roman" w:cs="Times New Roman"/>
+                <w:b/>
+                <w:bCs/>
+                <w:sz w:val="26"/>
+                <w:szCs w:val="26"/>
+              </w:rPr>
+              <w:t>Module</w:t>
+            </w:r>
+          </w:p>
+        </w:tc>
+        <w:tc>
+          <w:tcPr>
+            <w:tcW w:w="4675" w:type="dxa"/>
+          </w:tcPr>
+          <w:p>
+            <w:pPr>
+              <w:jc w:val="center"/>
+              <w:rPr>
+                <w:rFonts w:ascii="Times New Roman" w:hAnsi="Times New Roman" w:cs="Times New Roman"/>
+                <w:b/>
+                <w:bCs/>
+                <w:sz w:val="26"/>
+                <w:szCs w:val="26"/>
+              </w:rPr>
+            </w:pPr>
+            <w:r>
+              <w:rPr>
+                <w:rFonts w:ascii="Times New Roman" w:hAnsi="Times New Roman" w:cs="Times New Roman"/>
+                <w:b/>
+                <w:bCs/>
+                <w:sz w:val="26"/>
+                <w:szCs w:val="26"/>
+              </w:rPr>
+              <w:t>Chức năng</w:t>
+            </w:r>
+          </w:p>
+        </w:tc>
+      </w:tr>
+      <w:tr>
+        <w:tc>
+          <w:tcPr>
+            <w:tcW w:w="4675" w:type="dxa"/>
+          </w:tcPr>
+          <w:p>
+            <w:pPr>
+              <w:rPr>
+                <w:rFonts w:ascii="Times New Roman" w:hAnsi="Times New Roman" w:cs="Times New Roman"/>
+                <w:sz w:val="26"/>
+                <w:szCs w:val="26"/>
+              </w:rPr>
+            </w:pPr>
+            <w:r>
+              <w:rPr>
+                <w:rFonts w:ascii="Times New Roman" w:hAnsi="Times New Roman" w:cs="Times New Roman"/>
+                <w:sz w:val="26"/>
+                <w:szCs w:val="26"/>
+              </w:rPr>
+              <w:t>Authentication</w:t>
+            </w:r>
+          </w:p>
+        </w:tc>
+        <w:tc>
+          <w:tcPr>
+            <w:tcW w:w="4675" w:type="dxa"/>
+          </w:tcPr>
+          <w:p>
+            <w:pPr>
+              <w:rPr>
+                <w:rFonts w:ascii="Times New Roman" w:hAnsi="Times New Roman" w:cs="Times New Roman"/>
+                <w:sz w:val="26"/>
+                <w:szCs w:val="26"/>
+              </w:rPr>
+            </w:pPr>
+            <w:r>
+              <w:rPr>
+                <w:rFonts w:ascii="Times New Roman" w:hAnsi="Times New Roman" w:cs="Times New Roman"/>
+                <w:sz w:val="26"/>
+                <w:szCs w:val="26"/>
+              </w:rPr>
+              <w:t>Đăng nhập và xác thực</w:t>
+            </w:r>
+          </w:p>
+        </w:tc>
+      </w:tr>
+      <w:tr>
+        <w:tc>
+          <w:tcPr>
+            <w:tcW w:w="4675" w:type="dxa"/>
+          </w:tcPr>
+          <w:p>
+            <w:pPr>
+              <w:rPr>
+                <w:rFonts w:ascii="Times New Roman" w:hAnsi="Times New Roman" w:cs="Times New Roman"/>
+                <w:sz w:val="26"/>
+                <w:szCs w:val="26"/>
+              </w:rPr>
+            </w:pPr>
+            <w:r>
+              <w:rPr>
+                <w:rFonts w:ascii="Times New Roman" w:hAnsi="Times New Roman" w:cs="Times New Roman"/>
+                <w:sz w:val="26"/>
+                <w:szCs w:val="26"/>
+              </w:rPr>
+              <w:t>User</w:t>
+            </w:r>
+          </w:p>
+        </w:tc>
+        <w:tc>
+          <w:tcPr>
+            <w:tcW w:w="4675" w:type="dxa"/>
+          </w:tcPr>
+          <w:p>
+            <w:pPr>
+              <w:rPr>
+                <w:rFonts w:ascii="Times New Roman" w:hAnsi="Times New Roman" w:cs="Times New Roman"/>
+                <w:sz w:val="26"/>
+                <w:szCs w:val="26"/>
+              </w:rPr>
+            </w:pPr>
+            <w:r>
+              <w:rPr>
+                <w:rFonts w:ascii="Times New Roman" w:hAnsi="Times New Roman" w:cs="Times New Roman"/>
+                <w:sz w:val="26"/>
+                <w:szCs w:val="26"/>
+              </w:rPr>
+              <w:t>Quản lý người dùng</w:t>
+            </w:r>
+          </w:p>
+        </w:tc>
+      </w:tr>
+      <w:tr>
+        <w:tc>
+          <w:tcPr>
+            <w:tcW w:w="4675" w:type="dxa"/>
+          </w:tcPr>
+          <w:p>
+            <w:pPr>
+              <w:rPr>
+                <w:rFonts w:ascii="Times New Roman" w:hAnsi="Times New Roman" w:cs="Times New Roman"/>
+                <w:sz w:val="26"/>
+                <w:szCs w:val="26"/>
+              </w:rPr>
+            </w:pPr>
+            <w:r>
+              <w:rPr>
+                <w:rFonts w:ascii="Times New Roman" w:hAnsi="Times New Roman" w:cs="Times New Roman"/>
+                <w:sz w:val="26"/>
+                <w:szCs w:val="26"/>
+              </w:rPr>
+              <w:t>Lead</w:t>
+            </w:r>
+          </w:p>
+        </w:tc>
+        <w:tc>
+          <w:tcPr>
+            <w:tcW w:w="4675" w:type="dxa"/>
+          </w:tcPr>
+          <w:p>
+            <w:pPr>
+              <w:rPr>
+                <w:rFonts w:ascii="Times New Roman" w:hAnsi="Times New Roman" w:cs="Times New Roman"/>
+                <w:sz w:val="26"/>
+                <w:szCs w:val="26"/>
+              </w:rPr>
+            </w:pPr>
+            <w:r>
+              <w:rPr>
+                <w:rFonts w:ascii="Times New Roman" w:hAnsi="Times New Roman" w:cs="Times New Roman"/>
+                <w:sz w:val="26"/>
+                <w:szCs w:val="26"/>
+              </w:rPr>
+              <w:t>Quản lý Lead</w:t>
+            </w:r>
+          </w:p>
+        </w:tc>
+      </w:tr>
+      <w:tr>
+        <w:tc>
+          <w:tcPr>
+            <w:tcW w:w="4675" w:type="dxa"/>
+          </w:tcPr>
+          <w:p>
+            <w:pPr>
+              <w:rPr>
+                <w:rFonts w:ascii="Times New Roman" w:hAnsi="Times New Roman" w:cs="Times New Roman"/>
+                <w:sz w:val="26"/>
+                <w:szCs w:val="26"/>
+              </w:rPr>
+            </w:pPr>
+            <w:r>
+              <w:rPr>
+                <w:rFonts w:ascii="Times New Roman" w:hAnsi="Times New Roman" w:cs="Times New Roman"/>
+                <w:sz w:val="26"/>
+                <w:szCs w:val="26"/>
+              </w:rPr>
+              <w:t>Customer</w:t>
+            </w:r>
+          </w:p>
+        </w:tc>
+        <w:tc>
+          <w:tcPr>
+            <w:tcW w:w="4675" w:type="dxa"/>
+          </w:tcPr>
+          <w:p>
+            <w:pPr>
+              <w:rPr>
+                <w:rFonts w:ascii="Times New Roman" w:hAnsi="Times New Roman" w:cs="Times New Roman"/>
+                <w:sz w:val="26"/>
+                <w:szCs w:val="26"/>
+              </w:rPr>
+            </w:pPr>
+            <w:r>
+              <w:rPr>
+                <w:rFonts w:ascii="Times New Roman" w:hAnsi="Times New Roman" w:cs="Times New Roman"/>
+                <w:sz w:val="26"/>
+                <w:szCs w:val="26"/>
+              </w:rPr>
+              <w:t>Quản lý Customer</w:t>
+            </w:r>
+          </w:p>
+        </w:tc>
+      </w:tr>
+      <w:tr>
+        <w:tc>
+          <w:tcPr>
+            <w:tcW w:w="4675" w:type="dxa"/>
+          </w:tcPr>
+          <w:p>
+            <w:pPr>
+              <w:rPr>
+                <w:rFonts w:ascii="Times New Roman" w:hAnsi="Times New Roman" w:cs="Times New Roman"/>
+                <w:sz w:val="26"/>
+                <w:szCs w:val="26"/>
+              </w:rPr>
+            </w:pPr>
+            <w:r>
+              <w:rPr>
+                <w:rFonts w:ascii="Times New Roman" w:hAnsi="Times New Roman" w:cs="Times New Roman"/>
+                <w:sz w:val="26"/>
+                <w:szCs w:val="26"/>
+              </w:rPr>
+              <w:t>Deal</w:t>
+            </w:r>
+          </w:p>
+        </w:tc>
+        <w:tc>
+          <w:tcPr>
+            <w:tcW w:w="4675" w:type="dxa"/>
+          </w:tcPr>
+          <w:p>
+            <w:pPr>
+              <w:rPr>
+                <w:rFonts w:ascii="Times New Roman" w:hAnsi="Times New Roman" w:cs="Times New Roman"/>
+                <w:sz w:val="26"/>
+                <w:szCs w:val="26"/>
+              </w:rPr>
+            </w:pPr>
+            <w:r>
+              <w:rPr>
+                <w:rFonts w:ascii="Times New Roman" w:hAnsi="Times New Roman" w:cs="Times New Roman"/>
+                <w:sz w:val="26"/>
+                <w:szCs w:val="26"/>
+              </w:rPr>
+              <w:t>Quản lý Deal</w:t>
+            </w:r>
+          </w:p>
+        </w:tc>
+      </w:tr>
+      <w:tr>
+        <w:tc>
+          <w:tcPr>
+            <w:tcW w:w="4675" w:type="dxa"/>
+          </w:tcPr>
+          <w:p>
+            <w:pPr>
+              <w:rPr>
+                <w:rFonts w:ascii="Times New Roman" w:hAnsi="Times New Roman" w:cs="Times New Roman"/>
+                <w:sz w:val="26"/>
+                <w:szCs w:val="26"/>
+              </w:rPr>
+            </w:pPr>
+            <w:r>
+              <w:rPr>
+                <w:rFonts w:ascii="Times New Roman" w:hAnsi="Times New Roman" w:cs="Times New Roman"/>
+                <w:sz w:val="26"/>
+                <w:szCs w:val="26"/>
+              </w:rPr>
+              <w:t>Activity</w:t>
+            </w:r>
+          </w:p>
+        </w:tc>
+        <w:tc>
+          <w:tcPr>
+            <w:tcW w:w="4675" w:type="dxa"/>
+          </w:tcPr>
+          <w:p>
+            <w:pPr>
+              <w:rPr>
+                <w:rFonts w:ascii="Times New Roman" w:hAnsi="Times New Roman" w:cs="Times New Roman"/>
+                <w:sz w:val="26"/>
+                <w:szCs w:val="26"/>
+              </w:rPr>
+            </w:pPr>
+            <w:r>
+              <w:rPr>
+                <w:rFonts w:ascii="Times New Roman" w:hAnsi="Times New Roman" w:cs="Times New Roman"/>
+                <w:sz w:val="26"/>
+                <w:szCs w:val="26"/>
+              </w:rPr>
+              <w:t>Quản lý lịch sử chăm sóc</w:t>
+            </w:r>
+          </w:p>
+        </w:tc>
+      </w:tr>
+      <w:tr>
+        <w:tc>
+          <w:tcPr>
+            <w:tcW w:w="4675" w:type="dxa"/>
+          </w:tcPr>
+          <w:p>
+            <w:pPr>
+              <w:rPr>
+                <w:rFonts w:ascii="Times New Roman" w:hAnsi="Times New Roman" w:cs="Times New Roman"/>
+                <w:sz w:val="26"/>
+                <w:szCs w:val="26"/>
+              </w:rPr>
+            </w:pPr>
+            <w:r>
+              <w:rPr>
+                <w:rFonts w:ascii="Times New Roman" w:hAnsi="Times New Roman" w:cs="Times New Roman"/>
+                <w:sz w:val="26"/>
+                <w:szCs w:val="26"/>
+              </w:rPr>
+              <w:t>Task</w:t>
+            </w:r>
+          </w:p>
+        </w:tc>
+        <w:tc>
+          <w:tcPr>
+            <w:tcW w:w="4675" w:type="dxa"/>
+          </w:tcPr>
+          <w:p>
+            <w:pPr>
+              <w:rPr>
+                <w:rFonts w:ascii="Times New Roman" w:hAnsi="Times New Roman" w:cs="Times New Roman"/>
+                <w:sz w:val="26"/>
+                <w:szCs w:val="26"/>
+              </w:rPr>
+            </w:pPr>
+            <w:r>
+              <w:rPr>
+                <w:rFonts w:ascii="Times New Roman" w:hAnsi="Times New Roman" w:cs="Times New Roman"/>
+                <w:sz w:val="26"/>
+                <w:szCs w:val="26"/>
+              </w:rPr>
+              <w:t>Quản lý công việc</w:t>
+            </w:r>
+          </w:p>
+        </w:tc>
+      </w:tr>
+      <w:tr>
+        <w:tc>
+          <w:tcPr>
+            <w:tcW w:w="4675" w:type="dxa"/>
+          </w:tcPr>
+          <w:p>
+            <w:pPr>
+              <w:rPr>
+                <w:rFonts w:ascii="Times New Roman" w:hAnsi="Times New Roman" w:cs="Times New Roman"/>
+                <w:sz w:val="26"/>
+                <w:szCs w:val="26"/>
+              </w:rPr>
+            </w:pPr>
+            <w:r>
+              <w:rPr>
+                <w:rFonts w:ascii="Times New Roman" w:hAnsi="Times New Roman" w:cs="Times New Roman"/>
+                <w:sz w:val="26"/>
+                <w:szCs w:val="26"/>
+              </w:rPr>
+              <w:t>Product</w:t>
+            </w:r>
+          </w:p>
+        </w:tc>
+        <w:tc>
+          <w:tcPr>
+            <w:tcW w:w="4675" w:type="dxa"/>
+          </w:tcPr>
+          <w:p>
+            <w:pPr>
+              <w:rPr>
+                <w:rFonts w:ascii="Times New Roman" w:hAnsi="Times New Roman" w:cs="Times New Roman"/>
+                <w:sz w:val="26"/>
+                <w:szCs w:val="26"/>
+              </w:rPr>
+            </w:pPr>
+            <w:r>
+              <w:rPr>
+                <w:rFonts w:ascii="Times New Roman" w:hAnsi="Times New Roman" w:cs="Times New Roman"/>
+                <w:sz w:val="26"/>
+                <w:szCs w:val="26"/>
+              </w:rPr>
+              <w:t>Quản lý sản phẩm</w:t>
+            </w:r>
+          </w:p>
+        </w:tc>
+      </w:tr>
+      <w:tr>
+        <w:tc>
+          <w:tcPr>
+            <w:tcW w:w="4675" w:type="dxa"/>
+          </w:tcPr>
+          <w:p>
+            <w:pPr>
+              <w:rPr>
+                <w:rFonts w:ascii="Times New Roman" w:hAnsi="Times New Roman" w:cs="Times New Roman"/>
+                <w:sz w:val="26"/>
+                <w:szCs w:val="26"/>
+              </w:rPr>
+            </w:pPr>
+            <w:r>
+              <w:rPr>
+                <w:rFonts w:ascii="Times New Roman" w:hAnsi="Times New Roman" w:cs="Times New Roman"/>
+                <w:sz w:val="26"/>
+                <w:szCs w:val="26"/>
+              </w:rPr>
+              <w:t>Quote</w:t>
+            </w:r>
+          </w:p>
+        </w:tc>
+        <w:tc>
+          <w:tcPr>
+            <w:tcW w:w="4675" w:type="dxa"/>
+          </w:tcPr>
+          <w:p>
+            <w:pPr>
+              <w:rPr>
+                <w:rFonts w:ascii="Times New Roman" w:hAnsi="Times New Roman" w:cs="Times New Roman"/>
+                <w:sz w:val="26"/>
+                <w:szCs w:val="26"/>
+              </w:rPr>
+            </w:pPr>
+            <w:r>
+              <w:rPr>
+                <w:rFonts w:ascii="Times New Roman" w:hAnsi="Times New Roman" w:cs="Times New Roman"/>
+                <w:sz w:val="26"/>
+                <w:szCs w:val="26"/>
+              </w:rPr>
+              <w:t>Quản lý báo giá</w:t>
+            </w:r>
+          </w:p>
+        </w:tc>
+      </w:tr>
+      <w:tr>
+        <w:tc>
+          <w:tcPr>
+            <w:tcW w:w="4675" w:type="dxa"/>
+          </w:tcPr>
+          <w:p>
+            <w:pPr>
+              <w:rPr>
+                <w:rFonts w:ascii="Times New Roman" w:hAnsi="Times New Roman" w:cs="Times New Roman"/>
+                <w:sz w:val="26"/>
+                <w:szCs w:val="26"/>
+              </w:rPr>
+            </w:pPr>
+            <w:r>
+              <w:rPr>
+                <w:rFonts w:ascii="Times New Roman" w:hAnsi="Times New Roman" w:cs="Times New Roman"/>
+                <w:sz w:val="26"/>
+                <w:szCs w:val="26"/>
+              </w:rPr>
+              <w:t>Dashboard</w:t>
+            </w:r>
+          </w:p>
+        </w:tc>
+        <w:tc>
+          <w:tcPr>
+            <w:tcW w:w="4675" w:type="dxa"/>
+          </w:tcPr>
+          <w:p>
+            <w:pPr>
+              <w:rPr>
+                <w:rFonts w:ascii="Times New Roman" w:hAnsi="Times New Roman" w:cs="Times New Roman"/>
+                <w:sz w:val="26"/>
+                <w:szCs w:val="26"/>
+              </w:rPr>
+            </w:pPr>
+            <w:r>
+              <w:rPr>
+                <w:rFonts w:ascii="Times New Roman" w:hAnsi="Times New Roman" w:cs="Times New Roman"/>
+                <w:sz w:val="26"/>
+                <w:szCs w:val="26"/>
+              </w:rPr>
+              <w:t>Báo cáo và Forecase</w:t>
+            </w:r>
+          </w:p>
+        </w:tc>
+      </w:tr>
+      <w:tr>
+        <w:tc>
+          <w:tcPr>
+            <w:tcW w:w="4675" w:type="dxa"/>
+          </w:tcPr>
+          <w:p>
+            <w:pPr>
+              <w:rPr>
+                <w:rFonts w:ascii="Times New Roman" w:hAnsi="Times New Roman" w:cs="Times New Roman"/>
+                <w:sz w:val="26"/>
+                <w:szCs w:val="26"/>
+              </w:rPr>
+            </w:pPr>
+            <w:r>
+              <w:rPr>
+                <w:rFonts w:ascii="Times New Roman" w:hAnsi="Times New Roman" w:cs="Times New Roman"/>
+                <w:sz w:val="26"/>
+                <w:szCs w:val="26"/>
+              </w:rPr>
+              <w:t>Notification</w:t>
+            </w:r>
+          </w:p>
+        </w:tc>
+        <w:tc>
+          <w:tcPr>
+            <w:tcW w:w="4675" w:type="dxa"/>
+          </w:tcPr>
+          <w:p>
+            <w:pPr>
+              <w:keepNext/>
+              <w:rPr>
+                <w:rFonts w:ascii="Times New Roman" w:hAnsi="Times New Roman" w:cs="Times New Roman"/>
+                <w:sz w:val="26"/>
+                <w:szCs w:val="26"/>
+              </w:rPr>
+            </w:pPr>
+            <w:r>
+              <w:rPr>
+                <w:rFonts w:ascii="Times New Roman" w:hAnsi="Times New Roman" w:cs="Times New Roman"/>
+                <w:sz w:val="26"/>
+                <w:szCs w:val="26"/>
+              </w:rPr>
+              <w:t>Quản lý thông báo</w:t>
+            </w:r>
+          </w:p>
+        </w:tc>
+      </w:tr>
+    </w:tbl>
+    <w:p>
+      <w:pPr>
+        <w:pStyle w:val="Caption"/>
+        <w:rPr>
+          <w:rFonts w:ascii="Times New Roman" w:hAnsi="Times New Roman" w:cs="Times New Roman"/>
+          <w:sz w:val="26"/>
+          <w:szCs w:val="26"/>
+        </w:rPr>
+      </w:pPr>
+      <w:bookmarkStart w:id="90" w:name="_Toc235770282"/>
+      <w:r>
+        <w:rPr>
+          <w:rFonts w:ascii="Times New Roman" w:hAnsi="Times New Roman" w:cs="Times New Roman"/>
+          <w:sz w:val="26"/>
+          <w:szCs w:val="26"/>
+        </w:rPr>
+        <w:t xml:space="preserve">Bảng </w:t>
+      </w:r>
+      <w:r>
+        <w:rPr>
+          <w:rFonts w:ascii="Times New Roman" w:hAnsi="Times New Roman" w:cs="Times New Roman"/>
+          <w:sz w:val="26"/>
+          <w:szCs w:val="26"/>
+        </w:rPr>
+        <w:fldChar w:fldCharType="begin"/>
+      </w:r>
+      <w:r>
+        <w:rPr>
+          <w:rFonts w:ascii="Times New Roman" w:hAnsi="Times New Roman" w:cs="Times New Roman"/>
+          <w:sz w:val="26"/>
+          <w:szCs w:val="26"/>
+        </w:rPr>
+        <w:instrText xml:space="preserve"> SEQ Bảng \* ARABIC </w:instrText>
+      </w:r>
+      <w:r>
+        <w:rPr>
+          <w:rFonts w:ascii="Times New Roman" w:hAnsi="Times New Roman" w:cs="Times New Roman"/>
+          <w:sz w:val="26"/>
+          <w:szCs w:val="26"/>
+        </w:rPr>
+        <w:fldChar w:fldCharType="separate"/>
+      </w:r>
+      <w:r>
+        <w:rPr>
+          <w:rFonts w:ascii="Times New Roman" w:hAnsi="Times New Roman" w:cs="Times New Roman"/>
+          <w:noProof/>
+          <w:sz w:val="26"/>
+          <w:szCs w:val="26"/>
+        </w:rPr>
+        <w:t>12</w:t>
+      </w:r>
+      <w:r>
+        <w:rPr>
+          <w:rFonts w:ascii="Times New Roman" w:hAnsi="Times New Roman" w:cs="Times New Roman"/>
+          <w:sz w:val="26"/>
+          <w:szCs w:val="26"/>
+        </w:rPr>
+        <w:fldChar w:fldCharType="end"/>
+      </w:r>
+      <w:r>
+        <w:rPr>
+          <w:rFonts w:ascii="Times New Roman" w:hAnsi="Times New Roman" w:cs="Times New Roman"/>
+          <w:sz w:val="26"/>
+          <w:szCs w:val="26"/>
+        </w:rPr>
+        <w:t>: Chức năng của từng Module</w:t>
+      </w:r>
+      <w:bookmarkEnd w:id="90"/>
+    </w:p>
+    <w:p>
+      <w:pPr>
+        <w:pStyle w:val="Heading3"/>
+        <w:rPr>
+          <w:rFonts w:ascii="Times New Roman" w:hAnsi="Times New Roman" w:cs="Times New Roman"/>
+        </w:rPr>
+      </w:pPr>
+      <w:r>
+        <w:rPr>
+          <w:rFonts w:ascii="Times New Roman" w:hAnsi="Times New Roman" w:cs="Times New Roman"/>
+        </w:rPr>
+        <w:lastRenderedPageBreak/>
+        <w:t>RESTful API</w:t>
+      </w:r>
+    </w:p>
+    <w:p>
+      <w:pPr>
+        <w:keepNext/>
+      </w:pPr>
+      <w:r>
+        <w:rPr>
+          <w:rFonts w:ascii="Times New Roman" w:hAnsi="Times New Roman" w:cs="Times New Roman"/>
+          <w:noProof/>
+          <w:sz w:val="26"/>
+          <w:szCs w:val="26"/>
+        </w:rPr>
+        <w:drawing>
+          <wp:inline distT="0" distB="0" distL="0" distR="0" wp14:anchorId="4881D446" wp14:editId="4E041C83">
+            <wp:extent cx="5791835" cy="3990340"/>
+            <wp:effectExtent l="0" t="0" r="0" b="0"/>
+            <wp:docPr id="14" name="Picture 14"/>
+            <wp:cNvGraphicFramePr>
+              <a:graphicFrameLocks xmlns:a="http://schemas.openxmlformats.org/drawingml/2006/main" noChangeAspect="1"/>
+            </wp:cNvGraphicFramePr>
+            <a:graphic xmlns:a="http://schemas.openxmlformats.org/drawingml/2006/main">
+              <a:graphicData uri="http://schemas.openxmlformats.org/drawingml/2006/picture">
+                <pic:pic xmlns:pic="http://schemas.openxmlformats.org/drawingml/2006/picture">
+                  <pic:nvPicPr>
+                    <pic:cNvPr id="14" name="Picture 14"/>
+                    <pic:cNvPicPr/>
+                  </pic:nvPicPr>
+                  <pic:blipFill>
+                    <a:blip r:embed="rId21" cstate="print">
+                      <a:extLst>
+                        <a:ext uri="{28A0092B-C50C-407E-A947-70E740481C1C}">
+                          <a14:useLocalDpi xmlns:a14="http://schemas.microsoft.com/office/drawing/2010/main" val="0"/>
+                        </a:ext>
+                      </a:extLst>
+                    </a:blip>
+                    <a:stretch>
+                      <a:fillRect/>
+                    </a:stretch>
+                  </pic:blipFill>
+                  <pic:spPr>
+                    <a:xfrm>
+                      <a:off x="0" y="0"/>
+                      <a:ext cx="5791835" cy="3990340"/>
+                    </a:xfrm>
+                    <a:prstGeom prst="rect">
+                      <a:avLst/>
+                    </a:prstGeom>
+                  </pic:spPr>
+                </pic:pic>
+              </a:graphicData>
+            </a:graphic>
+          </wp:inline>
+        </w:drawing>
+      </w:r>
+    </w:p>
+    <w:p>
+      <w:pPr>
+        <w:pStyle w:val="Caption"/>
+        <w:rPr>
+          <w:rFonts w:ascii="Times New Roman" w:hAnsi="Times New Roman" w:cs="Times New Roman"/>
+          <w:sz w:val="26"/>
+          <w:szCs w:val="26"/>
+        </w:rPr>
+      </w:pPr>
+      <w:bookmarkStart w:id="91" w:name="_Toc235770296"/>
+      <w:r>
+        <w:rPr>
+          <w:rFonts w:ascii="Times New Roman" w:hAnsi="Times New Roman" w:cs="Times New Roman"/>
+          <w:sz w:val="26"/>
+          <w:szCs w:val="26"/>
+        </w:rPr>
+        <w:t xml:space="preserve">Hình </w:t>
+      </w:r>
+      <w:r>
+        <w:rPr>
+          <w:rFonts w:ascii="Times New Roman" w:hAnsi="Times New Roman" w:cs="Times New Roman"/>
+          <w:sz w:val="26"/>
+          <w:szCs w:val="26"/>
+        </w:rPr>
+        <w:fldChar w:fldCharType="begin"/>
+      </w:r>
+      <w:r>
+        <w:rPr>
+          <w:rFonts w:ascii="Times New Roman" w:hAnsi="Times New Roman" w:cs="Times New Roman"/>
+          <w:sz w:val="26"/>
+          <w:szCs w:val="26"/>
+        </w:rPr>
+        <w:instrText xml:space="preserve"> SEQ Hình \* ARABIC </w:instrText>
+      </w:r>
+      <w:r>
+        <w:rPr>
+          <w:rFonts w:ascii="Times New Roman" w:hAnsi="Times New Roman" w:cs="Times New Roman"/>
+          <w:sz w:val="26"/>
+          <w:szCs w:val="26"/>
+        </w:rPr>
+        <w:fldChar w:fldCharType="separate"/>
+      </w:r>
+      <w:r>
+        <w:rPr>
+          <w:rFonts w:ascii="Times New Roman" w:hAnsi="Times New Roman" w:cs="Times New Roman"/>
+          <w:noProof/>
+          <w:sz w:val="26"/>
+          <w:szCs w:val="26"/>
+        </w:rPr>
+        <w:t>12</w:t>
+      </w:r>
+      <w:r>
+        <w:rPr>
+          <w:rFonts w:ascii="Times New Roman" w:hAnsi="Times New Roman" w:cs="Times New Roman"/>
+          <w:sz w:val="26"/>
+          <w:szCs w:val="26"/>
+        </w:rPr>
+        <w:fldChar w:fldCharType="end"/>
+      </w:r>
+      <w:r>
+        <w:rPr>
+          <w:rFonts w:ascii="Times New Roman" w:hAnsi="Times New Roman" w:cs="Times New Roman"/>
+          <w:sz w:val="26"/>
+          <w:szCs w:val="26"/>
+        </w:rPr>
+        <w:t>: Luồng xử lý yêu cầu đăng nhập thông qua RESTful API</w:t>
+      </w:r>
+      <w:bookmarkEnd w:id="91"/>
+    </w:p>
+    <w:p>
+      <w:pPr>
+        <w:rPr>
+          <w:rFonts w:ascii="Times New Roman" w:hAnsi="Times New Roman" w:cs="Times New Roman"/>
+          <w:sz w:val="26"/>
+          <w:szCs w:val="26"/>
+        </w:rPr>
+      </w:pPr>
+      <w:r>
+        <w:rPr>
+          <w:rFonts w:ascii="Times New Roman" w:hAnsi="Times New Roman" w:cs="Times New Roman"/>
+          <w:sz w:val="26"/>
+          <w:szCs w:val="26"/>
+        </w:rPr>
+        <w:t>Hệ thống CRM sử dụng RESTful API làm cơ chế giao tiếp giữa Front-end và Back-end. Mỗi thao tác từ giao diện người dùng được gửi đến Controller thông qua các phương thức HTTP như GET, POST, PUT, DELETE. Controller tiếp nhận và chuyển cho Service xử lý nghiệp vụ. Khi hoàn tất, dữ liệu được trả về dưới dạng JSON để giao diện cập nhật lại mà không cần tải lại trang.</w:t>
+      </w:r>
+    </w:p>
+    <w:p>
+      <w:pPr>
+        <w:pStyle w:val="Heading3"/>
+        <w:rPr>
+          <w:rFonts w:ascii="Times New Roman" w:hAnsi="Times New Roman" w:cs="Times New Roman"/>
+        </w:rPr>
+      </w:pPr>
+      <w:r>
+        <w:rPr>
+          <w:rFonts w:ascii="Times New Roman" w:hAnsi="Times New Roman" w:cs="Times New Roman"/>
+        </w:rPr>
+        <w:t>Luồng xử lý dữ liệu</w:t>
+      </w:r>
+    </w:p>
+    <w:p>
+      <w:pPr>
+        <w:keepNext/>
+      </w:pPr>
+      <w:r>
+        <w:rPr>
+          <w:rFonts w:ascii="Times New Roman" w:hAnsi="Times New Roman" w:cs="Times New Roman"/>
+          <w:noProof/>
+          <w:sz w:val="26"/>
+          <w:szCs w:val="26"/>
+        </w:rPr>
+        <w:drawing>
+          <wp:inline distT="0" distB="0" distL="0" distR="0" wp14:anchorId="3D249699" wp14:editId="0501DC21">
+            <wp:extent cx="5791835" cy="1982470"/>
+            <wp:effectExtent l="0" t="0" r="0" b="0"/>
+            <wp:docPr id="15" name="Picture 15"/>
+            <wp:cNvGraphicFramePr>
+              <a:graphicFrameLocks xmlns:a="http://schemas.openxmlformats.org/drawingml/2006/main" noChangeAspect="1"/>
+            </wp:cNvGraphicFramePr>
+            <a:graphic xmlns:a="http://schemas.openxmlformats.org/drawingml/2006/main">
+              <a:graphicData uri="http://schemas.openxmlformats.org/drawingml/2006/picture">
+                <pic:pic xmlns:pic="http://schemas.openxmlformats.org/drawingml/2006/picture">
+                  <pic:nvPicPr>
+                    <pic:cNvPr id="15" name="Picture 15"/>
+                    <pic:cNvPicPr/>
+                  </pic:nvPicPr>
+                  <pic:blipFill>
+                    <a:blip r:embed="rId22" cstate="print">
+                      <a:extLst>
+                        <a:ext uri="{28A0092B-C50C-407E-A947-70E740481C1C}">
+                          <a14:useLocalDpi xmlns:a14="http://schemas.microsoft.com/office/drawing/2010/main" val="0"/>
+                        </a:ext>
+                      </a:extLst>
+                    </a:blip>
+                    <a:stretch>
+                      <a:fillRect/>
+                    </a:stretch>
+                  </pic:blipFill>
+                  <pic:spPr>
+                    <a:xfrm>
+                      <a:off x="0" y="0"/>
+                      <a:ext cx="5791835" cy="1982470"/>
+                    </a:xfrm>
+                    <a:prstGeom prst="rect">
+                      <a:avLst/>
+                    </a:prstGeom>
+                  </pic:spPr>
+                </pic:pic>
+              </a:graphicData>
+            </a:graphic>
+          </wp:inline>
+        </w:drawing>
+      </w:r>
+    </w:p>
+    <w:p>
+      <w:pPr>
+        <w:pStyle w:val="Caption"/>
+        <w:rPr>
+          <w:rFonts w:ascii="Times New Roman" w:hAnsi="Times New Roman" w:cs="Times New Roman"/>
+          <w:sz w:val="26"/>
+          <w:szCs w:val="26"/>
+        </w:rPr>
+      </w:pPr>
+      <w:bookmarkStart w:id="92" w:name="_Toc235770297"/>
+      <w:r>
+        <w:rPr>
+          <w:rFonts w:ascii="Times New Roman" w:hAnsi="Times New Roman" w:cs="Times New Roman"/>
+          <w:sz w:val="26"/>
+          <w:szCs w:val="26"/>
+        </w:rPr>
+        <w:t xml:space="preserve">Hình </w:t>
+      </w:r>
+      <w:r>
+        <w:rPr>
+          <w:rFonts w:ascii="Times New Roman" w:hAnsi="Times New Roman" w:cs="Times New Roman"/>
+          <w:sz w:val="26"/>
+          <w:szCs w:val="26"/>
+        </w:rPr>
+        <w:fldChar w:fldCharType="begin"/>
+      </w:r>
+      <w:r>
+        <w:rPr>
+          <w:rFonts w:ascii="Times New Roman" w:hAnsi="Times New Roman" w:cs="Times New Roman"/>
+          <w:sz w:val="26"/>
+          <w:szCs w:val="26"/>
+        </w:rPr>
+        <w:instrText xml:space="preserve"> SEQ Hình \* ARABIC </w:instrText>
+      </w:r>
+      <w:r>
+        <w:rPr>
+          <w:rFonts w:ascii="Times New Roman" w:hAnsi="Times New Roman" w:cs="Times New Roman"/>
+          <w:sz w:val="26"/>
+          <w:szCs w:val="26"/>
+        </w:rPr>
+        <w:fldChar w:fldCharType="separate"/>
+      </w:r>
+      <w:r>
+        <w:rPr>
+          <w:rFonts w:ascii="Times New Roman" w:hAnsi="Times New Roman" w:cs="Times New Roman"/>
+          <w:noProof/>
+          <w:sz w:val="26"/>
+          <w:szCs w:val="26"/>
+        </w:rPr>
+        <w:t>13</w:t>
+      </w:r>
+      <w:r>
+        <w:rPr>
+          <w:rFonts w:ascii="Times New Roman" w:hAnsi="Times New Roman" w:cs="Times New Roman"/>
+          <w:sz w:val="26"/>
+          <w:szCs w:val="26"/>
+        </w:rPr>
+        <w:fldChar w:fldCharType="end"/>
+      </w:r>
+      <w:r>
+        <w:rPr>
+          <w:rFonts w:ascii="Times New Roman" w:hAnsi="Times New Roman" w:cs="Times New Roman"/>
+          <w:sz w:val="26"/>
+          <w:szCs w:val="26"/>
+        </w:rPr>
+        <w:t>: Luồng xử lý dữ liệu</w:t>
+      </w:r>
+      <w:bookmarkEnd w:id="92"/>
     </w:p>
     <w:p>
       <w:pPr>
@@ -16925,16 +18762,17 @@
           <w:rFonts w:ascii="Times New Roman" w:hAnsi="Times New Roman" w:cs="Times New Roman"/>
         </w:rPr>
       </w:pPr>
-      <w:bookmarkStart w:id="86" w:name="_Toc235563727"/>
-      <w:bookmarkStart w:id="87" w:name="_Toc235741256"/>
-      <w:r>
-        <w:rPr>
-          <w:rFonts w:ascii="Times New Roman" w:hAnsi="Times New Roman" w:cs="Times New Roman"/>
-        </w:rPr>
+      <w:bookmarkStart w:id="93" w:name="_Toc235563727"/>
+      <w:bookmarkStart w:id="94" w:name="_Toc235741256"/>
+      <w:r>
+        <w:rPr>
+          <w:rFonts w:ascii="Times New Roman" w:hAnsi="Times New Roman" w:cs="Times New Roman"/>
+        </w:rPr>
+        <w:lastRenderedPageBreak/>
         <w:t>WIREFRAME</w:t>
       </w:r>
-      <w:bookmarkEnd w:id="86"/>
-      <w:bookmarkEnd w:id="87"/>
+      <w:bookmarkEnd w:id="93"/>
+      <w:bookmarkEnd w:id="94"/>
     </w:p>
     <w:p>
       <w:pPr>
@@ -16970,8 +18808,8 @@
           <w:rFonts w:ascii="Times New Roman" w:hAnsi="Times New Roman" w:cs="Times New Roman"/>
         </w:rPr>
       </w:pPr>
-      <w:bookmarkStart w:id="88" w:name="_Toc235563729"/>
-      <w:bookmarkStart w:id="89" w:name="_Toc235741257"/>
+      <w:bookmarkStart w:id="95" w:name="_Toc235563729"/>
+      <w:bookmarkStart w:id="96" w:name="_Toc235741257"/>
       <w:r>
         <w:rPr>
           <w:rFonts w:ascii="Times New Roman" w:hAnsi="Times New Roman" w:cs="Times New Roman"/>
@@ -16979,8 +18817,8 @@
         <w:lastRenderedPageBreak/>
         <w:t>TÀI LIỆU THAM KHẢO</w:t>
       </w:r>
-      <w:bookmarkEnd w:id="88"/>
-      <w:bookmarkEnd w:id="89"/>
+      <w:bookmarkEnd w:id="95"/>
+      <w:bookmarkEnd w:id="96"/>
     </w:p>
     <w:p>
       <w:pPr>
@@ -16992,7 +18830,7 @@
           <w:szCs w:val="26"/>
         </w:rPr>
       </w:pPr>
-      <w:hyperlink r:id="rId17" w:history="1">
+      <w:hyperlink r:id="rId23" w:history="1">
         <w:r>
           <w:rPr>
             <w:rStyle w:val="Hyperlink"/>
@@ -17011,26 +18849,12 @@
           <w:szCs w:val="26"/>
         </w:rPr>
       </w:pPr>
-      <w:hyperlink r:id="rId18" w:history="1">
+      <w:hyperlink r:id="rId24" w:history="1">
         <w:r>
           <w:rPr>
             <w:rStyle w:val="Hyperlink"/>
           </w:rPr>
-          <w:t xml:space="preserve">clauderic/dnd-kit: The modern toolkit for building </w:t>
-        </w:r>
-        <w:proofErr w:type="gramStart"/>
-        <w:r>
-          <w:rPr>
-            <w:rStyle w:val="Hyperlink"/>
-          </w:rPr>
-          <w:t>drag</w:t>
-        </w:r>
-        <w:proofErr w:type="gramEnd"/>
-        <w:r>
-          <w:rPr>
-            <w:rStyle w:val="Hyperlink"/>
-          </w:rPr>
-          <w:t xml:space="preserve"> and drop interfaces</w:t>
+          <w:t>clauderic/dnd-kit: The modern toolkit for building drag and drop interfaces</w:t>
         </w:r>
       </w:hyperlink>
     </w:p>
@@ -17044,7 +18868,7 @@
           <w:szCs w:val="26"/>
         </w:rPr>
       </w:pPr>
-      <w:hyperlink r:id="rId19" w:history="1">
+      <w:hyperlink r:id="rId25" w:history="1">
         <w:r>
           <w:rPr>
             <w:rStyle w:val="Hyperlink"/>
@@ -17063,7 +18887,7 @@
           <w:szCs w:val="26"/>
         </w:rPr>
       </w:pPr>
-      <w:hyperlink r:id="rId20" w:history="1">
+      <w:hyperlink r:id="rId26" w:history="1">
         <w:r>
           <w:rPr>
             <w:rStyle w:val="Hyperlink"/>
@@ -17082,7 +18906,7 @@
           <w:szCs w:val="26"/>
         </w:rPr>
       </w:pPr>
-      <w:hyperlink r:id="rId21" w:history="1">
+      <w:hyperlink r:id="rId27" w:history="1">
         <w:r>
           <w:rPr>
             <w:rStyle w:val="Hyperlink"/>
@@ -17096,7 +18920,7 @@
         <w:spacing w:line="360" w:lineRule="auto"/>
         <w:ind w:left="360"/>
       </w:pPr>
-      <w:hyperlink r:id="rId22" w:history="1">
+      <w:hyperlink r:id="rId28" w:history="1">
         <w:r>
           <w:rPr>
             <w:rStyle w:val="Hyperlink"/>
@@ -17116,7 +18940,7 @@
       </w:pPr>
     </w:p>
     <w:sectPr>
-      <w:headerReference w:type="default" r:id="rId23"/>
+      <w:headerReference w:type="default" r:id="rId29"/>
       <w:pgSz w:w="12240" w:h="15840"/>
       <w:pgMar w:top="1134" w:right="1134" w:bottom="1134" w:left="1985" w:header="720" w:footer="720" w:gutter="0"/>
       <w:cols w:space="720"/>

</xml_diff>

<commit_message>
feat: báo cáo Sequence Diagram
</commit_message>
<xml_diff>
--- a/docs/BaoCao/BaoCao.docx
+++ b/docs/BaoCao/BaoCao.docx
@@ -2772,7 +2772,23 @@
                 <w:rFonts w:ascii="Times New Roman" w:hAnsi="Times New Roman" w:cs="Times New Roman"/>
                 <w:noProof/>
               </w:rPr>
-              <w:t>USE-CASE DIAGRAM</w:t>
+              <w:t>USE-CASE</w:t>
+            </w:r>
+            <w:r>
+              <w:rPr>
+                <w:rStyle w:val="Hyperlink"/>
+                <w:rFonts w:ascii="Times New Roman" w:hAnsi="Times New Roman" w:cs="Times New Roman"/>
+                <w:noProof/>
+              </w:rPr>
+              <w:t xml:space="preserve"> </w:t>
+            </w:r>
+            <w:r>
+              <w:rPr>
+                <w:rStyle w:val="Hyperlink"/>
+                <w:rFonts w:ascii="Times New Roman" w:hAnsi="Times New Roman" w:cs="Times New Roman"/>
+                <w:noProof/>
+              </w:rPr>
+              <w:t>DIAGRAM</w:t>
             </w:r>
             <w:r>
               <w:rPr>
@@ -3454,7 +3470,7 @@
         </w:rPr>
         <w:fldChar w:fldCharType="separate"/>
       </w:r>
-      <w:hyperlink w:anchor="_Toc235770285" w:history="1">
+      <w:hyperlink w:anchor="_Toc235777006" w:history="1">
         <w:r>
           <w:rPr>
             <w:rStyle w:val="Hyperlink"/>
@@ -3482,7 +3498,7 @@
             <w:noProof/>
             <w:webHidden/>
           </w:rPr>
-          <w:instrText xml:space="preserve"> PAGEREF _Toc235770285 \h </w:instrText>
+          <w:instrText xml:space="preserve"> PAGEREF _Toc235777006 \h </w:instrText>
         </w:r>
         <w:r>
           <w:rPr>
@@ -3524,7 +3540,7 @@
           <w:noProof/>
         </w:rPr>
       </w:pPr>
-      <w:hyperlink w:anchor="_Toc235770286" w:history="1">
+      <w:hyperlink w:anchor="_Toc235777007" w:history="1">
         <w:r>
           <w:rPr>
             <w:rStyle w:val="Hyperlink"/>
@@ -3552,7 +3568,7 @@
             <w:noProof/>
             <w:webHidden/>
           </w:rPr>
-          <w:instrText xml:space="preserve"> PAGEREF _Toc235770286 \h </w:instrText>
+          <w:instrText xml:space="preserve"> PAGEREF _Toc235777007 \h </w:instrText>
         </w:r>
         <w:r>
           <w:rPr>
@@ -3594,7 +3610,7 @@
           <w:noProof/>
         </w:rPr>
       </w:pPr>
-      <w:hyperlink w:anchor="_Toc235770287" w:history="1">
+      <w:hyperlink w:anchor="_Toc235777008" w:history="1">
         <w:r>
           <w:rPr>
             <w:rStyle w:val="Hyperlink"/>
@@ -3622,7 +3638,7 @@
             <w:noProof/>
             <w:webHidden/>
           </w:rPr>
-          <w:instrText xml:space="preserve"> PAGEREF _Toc235770287 \h </w:instrText>
+          <w:instrText xml:space="preserve"> PAGEREF _Toc235777008 \h </w:instrText>
         </w:r>
         <w:r>
           <w:rPr>
@@ -3664,7 +3680,7 @@
           <w:noProof/>
         </w:rPr>
       </w:pPr>
-      <w:hyperlink w:anchor="_Toc235770288" w:history="1">
+      <w:hyperlink w:anchor="_Toc235777009" w:history="1">
         <w:r>
           <w:rPr>
             <w:rStyle w:val="Hyperlink"/>
@@ -3692,7 +3708,7 @@
             <w:noProof/>
             <w:webHidden/>
           </w:rPr>
-          <w:instrText xml:space="preserve"> PAGEREF _Toc235770288 \h </w:instrText>
+          <w:instrText xml:space="preserve"> PAGEREF _Toc235777009 \h </w:instrText>
         </w:r>
         <w:r>
           <w:rPr>
@@ -3734,7 +3750,7 @@
           <w:noProof/>
         </w:rPr>
       </w:pPr>
-      <w:hyperlink w:anchor="_Toc235770289" w:history="1">
+      <w:hyperlink w:anchor="_Toc235777010" w:history="1">
         <w:r>
           <w:rPr>
             <w:rStyle w:val="Hyperlink"/>
@@ -3762,7 +3778,7 @@
             <w:noProof/>
             <w:webHidden/>
           </w:rPr>
-          <w:instrText xml:space="preserve"> PAGEREF _Toc235770289 \h </w:instrText>
+          <w:instrText xml:space="preserve"> PAGEREF _Toc235777010 \h </w:instrText>
         </w:r>
         <w:r>
           <w:rPr>
@@ -3804,7 +3820,7 @@
           <w:noProof/>
         </w:rPr>
       </w:pPr>
-      <w:hyperlink w:anchor="_Toc235770290" w:history="1">
+      <w:hyperlink w:anchor="_Toc235777011" w:history="1">
         <w:r>
           <w:rPr>
             <w:rStyle w:val="Hyperlink"/>
@@ -3832,7 +3848,7 @@
             <w:noProof/>
             <w:webHidden/>
           </w:rPr>
-          <w:instrText xml:space="preserve"> PAGEREF _Toc235770290 \h </w:instrText>
+          <w:instrText xml:space="preserve"> PAGEREF _Toc235777011 \h </w:instrText>
         </w:r>
         <w:r>
           <w:rPr>
@@ -3874,14 +3890,14 @@
           <w:noProof/>
         </w:rPr>
       </w:pPr>
-      <w:hyperlink w:anchor="_Toc235770291" w:history="1">
+      <w:hyperlink w:anchor="_Toc235777012" w:history="1">
         <w:r>
           <w:rPr>
             <w:rStyle w:val="Hyperlink"/>
             <w:rFonts w:ascii="Times New Roman" w:hAnsi="Times New Roman" w:cs="Times New Roman"/>
             <w:noProof/>
           </w:rPr>
-          <w:t>Hình 7: Class Diagram</w:t>
+          <w:t>Hình 7: Sequence Diagram mô tả quy trình chuyển Lead thành Customer</w:t>
         </w:r>
         <w:r>
           <w:rPr>
@@ -3902,7 +3918,7 @@
             <w:noProof/>
             <w:webHidden/>
           </w:rPr>
-          <w:instrText xml:space="preserve"> PAGEREF _Toc235770291 \h </w:instrText>
+          <w:instrText xml:space="preserve"> PAGEREF _Toc235777012 \h </w:instrText>
         </w:r>
         <w:r>
           <w:rPr>
@@ -3944,14 +3960,14 @@
           <w:noProof/>
         </w:rPr>
       </w:pPr>
-      <w:hyperlink w:anchor="_Toc235770292" w:history="1">
+      <w:hyperlink w:anchor="_Toc235777013" w:history="1">
         <w:r>
           <w:rPr>
             <w:rStyle w:val="Hyperlink"/>
             <w:rFonts w:ascii="Times New Roman" w:hAnsi="Times New Roman" w:cs="Times New Roman"/>
             <w:noProof/>
           </w:rPr>
-          <w:t>Hình 8: Entity Relationshop Diagram</w:t>
+          <w:t>Hình 8: Sequence Diagram mô tả quy trình tạo Deal mới</w:t>
         </w:r>
         <w:r>
           <w:rPr>
@@ -3972,7 +3988,7 @@
             <w:noProof/>
             <w:webHidden/>
           </w:rPr>
-          <w:instrText xml:space="preserve"> PAGEREF _Toc235770292 \h </w:instrText>
+          <w:instrText xml:space="preserve"> PAGEREF _Toc235777013 \h </w:instrText>
         </w:r>
         <w:r>
           <w:rPr>
@@ -4014,14 +4030,14 @@
           <w:noProof/>
         </w:rPr>
       </w:pPr>
-      <w:hyperlink r:id="rId9" w:anchor="_Toc235770293" w:history="1">
+      <w:hyperlink w:anchor="_Toc235777014" w:history="1">
         <w:r>
           <w:rPr>
             <w:rStyle w:val="Hyperlink"/>
             <w:rFonts w:ascii="Times New Roman" w:hAnsi="Times New Roman" w:cs="Times New Roman"/>
             <w:noProof/>
           </w:rPr>
-          <w:t>Hình 9: Kiến trúc tổng thể</w:t>
+          <w:t>Hình 9: Sequence Diagram mô tả quy trình thay đổi trạng thái trang Pipeline</w:t>
         </w:r>
         <w:r>
           <w:rPr>
@@ -4042,7 +4058,7 @@
             <w:noProof/>
             <w:webHidden/>
           </w:rPr>
-          <w:instrText xml:space="preserve"> PAGEREF _Toc235770293 \h </w:instrText>
+          <w:instrText xml:space="preserve"> PAGEREF _Toc235777014 \h </w:instrText>
         </w:r>
         <w:r>
           <w:rPr>
@@ -4084,14 +4100,14 @@
           <w:noProof/>
         </w:rPr>
       </w:pPr>
-      <w:hyperlink w:anchor="_Toc235770294" w:history="1">
+      <w:hyperlink w:anchor="_Toc235777015" w:history="1">
         <w:r>
           <w:rPr>
             <w:rStyle w:val="Hyperlink"/>
             <w:rFonts w:ascii="Times New Roman" w:hAnsi="Times New Roman" w:cs="Times New Roman"/>
             <w:noProof/>
           </w:rPr>
-          <w:t>Hình 10: Kiến trúc Modular</w:t>
+          <w:t>Hình 10: Class Diagram</w:t>
         </w:r>
         <w:r>
           <w:rPr>
@@ -4112,7 +4128,7 @@
             <w:noProof/>
             <w:webHidden/>
           </w:rPr>
-          <w:instrText xml:space="preserve"> PAGEREF _Toc235770294 \h </w:instrText>
+          <w:instrText xml:space="preserve"> PAGEREF _Toc235777015 \h </w:instrText>
         </w:r>
         <w:r>
           <w:rPr>
@@ -4154,14 +4170,14 @@
           <w:noProof/>
         </w:rPr>
       </w:pPr>
-      <w:hyperlink w:anchor="_Toc235770295" w:history="1">
+      <w:hyperlink w:anchor="_Toc235777016" w:history="1">
         <w:r>
           <w:rPr>
             <w:rStyle w:val="Hyperlink"/>
             <w:rFonts w:ascii="Times New Roman" w:hAnsi="Times New Roman" w:cs="Times New Roman"/>
             <w:noProof/>
           </w:rPr>
-          <w:t>Hình 11: Kiến trúc của một Module</w:t>
+          <w:t>Hình 11: Entity Relationshop Diagram</w:t>
         </w:r>
         <w:r>
           <w:rPr>
@@ -4182,77 +4198,7 @@
             <w:noProof/>
             <w:webHidden/>
           </w:rPr>
-          <w:instrText xml:space="preserve"> PAGEREF _Toc235770295 \h </w:instrText>
-        </w:r>
-        <w:r>
-          <w:rPr>
-            <w:noProof/>
-            <w:webHidden/>
-          </w:rPr>
-        </w:r>
-        <w:r>
-          <w:rPr>
-            <w:noProof/>
-            <w:webHidden/>
-          </w:rPr>
-          <w:fldChar w:fldCharType="separate"/>
-        </w:r>
-        <w:r>
-          <w:rPr>
-            <w:noProof/>
-            <w:webHidden/>
-          </w:rPr>
-          <w:t>34</w:t>
-        </w:r>
-        <w:r>
-          <w:rPr>
-            <w:noProof/>
-            <w:webHidden/>
-          </w:rPr>
-          <w:fldChar w:fldCharType="end"/>
-        </w:r>
-      </w:hyperlink>
-    </w:p>
-    <w:p>
-      <w:pPr>
-        <w:pStyle w:val="TableofFigures"/>
-        <w:tabs>
-          <w:tab w:val="right" w:leader="dot" w:pos="9111"/>
-        </w:tabs>
-        <w:rPr>
-          <w:rFonts w:eastAsiaTheme="minorEastAsia"/>
-          <w:noProof/>
-        </w:rPr>
-      </w:pPr>
-      <w:hyperlink w:anchor="_Toc235770296" w:history="1">
-        <w:r>
-          <w:rPr>
-            <w:rStyle w:val="Hyperlink"/>
-            <w:rFonts w:ascii="Times New Roman" w:hAnsi="Times New Roman" w:cs="Times New Roman"/>
-            <w:noProof/>
-          </w:rPr>
-          <w:t>Hình 12: Luồng xử lý yêu cầu đăng nhập thông qua RESTful API</w:t>
-        </w:r>
-        <w:r>
-          <w:rPr>
-            <w:noProof/>
-            <w:webHidden/>
-          </w:rPr>
-          <w:tab/>
-        </w:r>
-        <w:r>
-          <w:rPr>
-            <w:noProof/>
-            <w:webHidden/>
-          </w:rPr>
-          <w:fldChar w:fldCharType="begin"/>
-        </w:r>
-        <w:r>
-          <w:rPr>
-            <w:noProof/>
-            <w:webHidden/>
-          </w:rPr>
-          <w:instrText xml:space="preserve"> PAGEREF _Toc235770296 \h </w:instrText>
+          <w:instrText xml:space="preserve"> PAGEREF _Toc235777016 \h </w:instrText>
         </w:r>
         <w:r>
           <w:rPr>
@@ -4294,14 +4240,14 @@
           <w:noProof/>
         </w:rPr>
       </w:pPr>
-      <w:hyperlink w:anchor="_Toc235770297" w:history="1">
+      <w:hyperlink r:id="rId9" w:anchor="_Toc235777017" w:history="1">
         <w:r>
           <w:rPr>
             <w:rStyle w:val="Hyperlink"/>
             <w:rFonts w:ascii="Times New Roman" w:hAnsi="Times New Roman" w:cs="Times New Roman"/>
             <w:noProof/>
           </w:rPr>
-          <w:t>Hình 13: Luồng xử lý dữ liệu</w:t>
+          <w:t>Hình 12: Kiến trúc tổng thể</w:t>
         </w:r>
         <w:r>
           <w:rPr>
@@ -4322,7 +4268,7 @@
             <w:noProof/>
             <w:webHidden/>
           </w:rPr>
-          <w:instrText xml:space="preserve"> PAGEREF _Toc235770297 \h </w:instrText>
+          <w:instrText xml:space="preserve"> PAGEREF _Toc235777017 \h </w:instrText>
         </w:r>
         <w:r>
           <w:rPr>
@@ -4342,7 +4288,287 @@
             <w:noProof/>
             <w:webHidden/>
           </w:rPr>
-          <w:t>35</w:t>
+          <w:t>36</w:t>
+        </w:r>
+        <w:r>
+          <w:rPr>
+            <w:noProof/>
+            <w:webHidden/>
+          </w:rPr>
+          <w:fldChar w:fldCharType="end"/>
+        </w:r>
+      </w:hyperlink>
+    </w:p>
+    <w:p>
+      <w:pPr>
+        <w:pStyle w:val="TableofFigures"/>
+        <w:tabs>
+          <w:tab w:val="right" w:leader="dot" w:pos="9111"/>
+        </w:tabs>
+        <w:rPr>
+          <w:rFonts w:eastAsiaTheme="minorEastAsia"/>
+          <w:noProof/>
+        </w:rPr>
+      </w:pPr>
+      <w:hyperlink w:anchor="_Toc235777018" w:history="1">
+        <w:r>
+          <w:rPr>
+            <w:rStyle w:val="Hyperlink"/>
+            <w:rFonts w:ascii="Times New Roman" w:hAnsi="Times New Roman" w:cs="Times New Roman"/>
+            <w:noProof/>
+          </w:rPr>
+          <w:t>Hình 13: Kiến trúc Modular</w:t>
+        </w:r>
+        <w:r>
+          <w:rPr>
+            <w:noProof/>
+            <w:webHidden/>
+          </w:rPr>
+          <w:tab/>
+        </w:r>
+        <w:r>
+          <w:rPr>
+            <w:noProof/>
+            <w:webHidden/>
+          </w:rPr>
+          <w:fldChar w:fldCharType="begin"/>
+        </w:r>
+        <w:r>
+          <w:rPr>
+            <w:noProof/>
+            <w:webHidden/>
+          </w:rPr>
+          <w:instrText xml:space="preserve"> PAGEREF _Toc235777018 \h </w:instrText>
+        </w:r>
+        <w:r>
+          <w:rPr>
+            <w:noProof/>
+            <w:webHidden/>
+          </w:rPr>
+        </w:r>
+        <w:r>
+          <w:rPr>
+            <w:noProof/>
+            <w:webHidden/>
+          </w:rPr>
+          <w:fldChar w:fldCharType="separate"/>
+        </w:r>
+        <w:r>
+          <w:rPr>
+            <w:noProof/>
+            <w:webHidden/>
+          </w:rPr>
+          <w:t>37</w:t>
+        </w:r>
+        <w:r>
+          <w:rPr>
+            <w:noProof/>
+            <w:webHidden/>
+          </w:rPr>
+          <w:fldChar w:fldCharType="end"/>
+        </w:r>
+      </w:hyperlink>
+    </w:p>
+    <w:p>
+      <w:pPr>
+        <w:pStyle w:val="TableofFigures"/>
+        <w:tabs>
+          <w:tab w:val="right" w:leader="dot" w:pos="9111"/>
+        </w:tabs>
+        <w:rPr>
+          <w:rFonts w:eastAsiaTheme="minorEastAsia"/>
+          <w:noProof/>
+        </w:rPr>
+      </w:pPr>
+      <w:hyperlink w:anchor="_Toc235777019" w:history="1">
+        <w:r>
+          <w:rPr>
+            <w:rStyle w:val="Hyperlink"/>
+            <w:rFonts w:ascii="Times New Roman" w:hAnsi="Times New Roman" w:cs="Times New Roman"/>
+            <w:noProof/>
+          </w:rPr>
+          <w:t>Hình 14: Kiến trúc của một Module</w:t>
+        </w:r>
+        <w:r>
+          <w:rPr>
+            <w:noProof/>
+            <w:webHidden/>
+          </w:rPr>
+          <w:tab/>
+        </w:r>
+        <w:r>
+          <w:rPr>
+            <w:noProof/>
+            <w:webHidden/>
+          </w:rPr>
+          <w:fldChar w:fldCharType="begin"/>
+        </w:r>
+        <w:r>
+          <w:rPr>
+            <w:noProof/>
+            <w:webHidden/>
+          </w:rPr>
+          <w:instrText xml:space="preserve"> PAGEREF _Toc235777019 \h </w:instrText>
+        </w:r>
+        <w:r>
+          <w:rPr>
+            <w:noProof/>
+            <w:webHidden/>
+          </w:rPr>
+        </w:r>
+        <w:r>
+          <w:rPr>
+            <w:noProof/>
+            <w:webHidden/>
+          </w:rPr>
+          <w:fldChar w:fldCharType="separate"/>
+        </w:r>
+        <w:r>
+          <w:rPr>
+            <w:noProof/>
+            <w:webHidden/>
+          </w:rPr>
+          <w:t>37</w:t>
+        </w:r>
+        <w:r>
+          <w:rPr>
+            <w:noProof/>
+            <w:webHidden/>
+          </w:rPr>
+          <w:fldChar w:fldCharType="end"/>
+        </w:r>
+      </w:hyperlink>
+    </w:p>
+    <w:p>
+      <w:pPr>
+        <w:pStyle w:val="TableofFigures"/>
+        <w:tabs>
+          <w:tab w:val="right" w:leader="dot" w:pos="9111"/>
+        </w:tabs>
+        <w:rPr>
+          <w:rFonts w:eastAsiaTheme="minorEastAsia"/>
+          <w:noProof/>
+        </w:rPr>
+      </w:pPr>
+      <w:hyperlink w:anchor="_Toc235777020" w:history="1">
+        <w:r>
+          <w:rPr>
+            <w:rStyle w:val="Hyperlink"/>
+            <w:rFonts w:ascii="Times New Roman" w:hAnsi="Times New Roman" w:cs="Times New Roman"/>
+            <w:noProof/>
+          </w:rPr>
+          <w:t>Hình 15: Luồng xử lý yêu cầu đăng nhập thông qua RESTful API</w:t>
+        </w:r>
+        <w:r>
+          <w:rPr>
+            <w:noProof/>
+            <w:webHidden/>
+          </w:rPr>
+          <w:tab/>
+        </w:r>
+        <w:r>
+          <w:rPr>
+            <w:noProof/>
+            <w:webHidden/>
+          </w:rPr>
+          <w:fldChar w:fldCharType="begin"/>
+        </w:r>
+        <w:r>
+          <w:rPr>
+            <w:noProof/>
+            <w:webHidden/>
+          </w:rPr>
+          <w:instrText xml:space="preserve"> PAGEREF _Toc235777020 \h </w:instrText>
+        </w:r>
+        <w:r>
+          <w:rPr>
+            <w:noProof/>
+            <w:webHidden/>
+          </w:rPr>
+        </w:r>
+        <w:r>
+          <w:rPr>
+            <w:noProof/>
+            <w:webHidden/>
+          </w:rPr>
+          <w:fldChar w:fldCharType="separate"/>
+        </w:r>
+        <w:r>
+          <w:rPr>
+            <w:noProof/>
+            <w:webHidden/>
+          </w:rPr>
+          <w:t>38</w:t>
+        </w:r>
+        <w:r>
+          <w:rPr>
+            <w:noProof/>
+            <w:webHidden/>
+          </w:rPr>
+          <w:fldChar w:fldCharType="end"/>
+        </w:r>
+      </w:hyperlink>
+    </w:p>
+    <w:p>
+      <w:pPr>
+        <w:pStyle w:val="TableofFigures"/>
+        <w:tabs>
+          <w:tab w:val="right" w:leader="dot" w:pos="9111"/>
+        </w:tabs>
+        <w:rPr>
+          <w:rFonts w:eastAsiaTheme="minorEastAsia"/>
+          <w:noProof/>
+        </w:rPr>
+      </w:pPr>
+      <w:hyperlink w:anchor="_Toc235777021" w:history="1">
+        <w:r>
+          <w:rPr>
+            <w:rStyle w:val="Hyperlink"/>
+            <w:rFonts w:ascii="Times New Roman" w:hAnsi="Times New Roman" w:cs="Times New Roman"/>
+            <w:noProof/>
+          </w:rPr>
+          <w:t>Hình 16: Luồng xử lý dữ liệu</w:t>
+        </w:r>
+        <w:r>
+          <w:rPr>
+            <w:noProof/>
+            <w:webHidden/>
+          </w:rPr>
+          <w:tab/>
+        </w:r>
+        <w:r>
+          <w:rPr>
+            <w:noProof/>
+            <w:webHidden/>
+          </w:rPr>
+          <w:fldChar w:fldCharType="begin"/>
+        </w:r>
+        <w:r>
+          <w:rPr>
+            <w:noProof/>
+            <w:webHidden/>
+          </w:rPr>
+          <w:instrText xml:space="preserve"> PAGEREF _Toc235777021 \h </w:instrText>
+        </w:r>
+        <w:r>
+          <w:rPr>
+            <w:noProof/>
+            <w:webHidden/>
+          </w:rPr>
+        </w:r>
+        <w:r>
+          <w:rPr>
+            <w:noProof/>
+            <w:webHidden/>
+          </w:rPr>
+          <w:fldChar w:fldCharType="separate"/>
+        </w:r>
+        <w:r>
+          <w:rPr>
+            <w:noProof/>
+            <w:webHidden/>
+          </w:rPr>
+          <w:t>38</w:t>
         </w:r>
         <w:r>
           <w:rPr>
@@ -5269,8 +5495,42 @@
       <w:r>
         <w:fldChar w:fldCharType="end"/>
       </w:r>
-      <w:fldSimple w:instr=" TOC \h \z \c &quot;Bảng&quot; "/>
-      <w:fldSimple w:instr=" TOC \h \z \c &quot;Bảng&quot; "/>
+      <w:r>
+        <w:fldChar w:fldCharType="begin"/>
+      </w:r>
+      <w:r>
+        <w:instrText xml:space="preserve"> TOC \h \z \c "B</w:instrText>
+      </w:r>
+      <w:r>
+        <w:instrText>ả</w:instrText>
+      </w:r>
+      <w:r>
+        <w:instrText xml:space="preserve">ng" </w:instrText>
+      </w:r>
+      <w:r>
+        <w:fldChar w:fldCharType="separate"/>
+      </w:r>
+      <w:r>
+        <w:fldChar w:fldCharType="end"/>
+      </w:r>
+      <w:r>
+        <w:fldChar w:fldCharType="begin"/>
+      </w:r>
+      <w:r>
+        <w:instrText xml:space="preserve"> TOC \h \z \c "B</w:instrText>
+      </w:r>
+      <w:r>
+        <w:instrText>ả</w:instrText>
+      </w:r>
+      <w:r>
+        <w:instrText xml:space="preserve">ng" </w:instrText>
+      </w:r>
+      <w:r>
+        <w:fldChar w:fldCharType="separate"/>
+      </w:r>
+      <w:r>
+        <w:fldChar w:fldCharType="end"/>
+      </w:r>
       <w:r>
         <w:br w:type="page"/>
       </w:r>
@@ -8699,7 +8959,16 @@
           <w:sz w:val="26"/>
           <w:szCs w:val="26"/>
         </w:rPr>
-        <w:t>Prisma hoạt động dựa trên tệp schema.pri</w:t>
+        <w:t xml:space="preserve">Prisma hoạt động dựa trên tệp </w:t>
+      </w:r>
+      <w:proofErr w:type="gramStart"/>
+      <w:r>
+        <w:rPr>
+          <w:rFonts w:ascii="Times New Roman" w:hAnsi="Times New Roman" w:cs="Times New Roman"/>
+          <w:sz w:val="26"/>
+          <w:szCs w:val="26"/>
+        </w:rPr>
+        <w:t>schema.pri</w:t>
       </w:r>
       <w:r>
         <w:rPr>
@@ -8715,7 +8984,16 @@
           <w:sz w:val="26"/>
           <w:szCs w:val="26"/>
         </w:rPr>
-        <w:t xml:space="preserve">ma nơi định nghĩa các Model và thông tin kết nối đến cơ sở dữ liệu. Dựa trên tệp này, Prisma sẽ sinh ra </w:t>
+        <w:t>ma</w:t>
+      </w:r>
+      <w:proofErr w:type="gramEnd"/>
+      <w:r>
+        <w:rPr>
+          <w:rFonts w:ascii="Times New Roman" w:hAnsi="Times New Roman" w:cs="Times New Roman"/>
+          <w:sz w:val="26"/>
+          <w:szCs w:val="26"/>
+        </w:rPr>
+        <w:t xml:space="preserve"> nơi định nghĩa các Model và thông tin kết nối đến cơ sở dữ liệu. Dựa trên tệp này, Prisma sẽ sinh ra </w:t>
       </w:r>
       <w:r>
         <w:rPr>
@@ -10250,7 +10528,7 @@
         </w:rPr>
       </w:pPr>
       <w:bookmarkStart w:id="57" w:name="_Toc235641387"/>
-      <w:bookmarkStart w:id="58" w:name="_Toc235770285"/>
+      <w:bookmarkStart w:id="58" w:name="_Toc235777006"/>
       <w:r>
         <w:rPr>
           <w:rFonts w:ascii="Times New Roman" w:hAnsi="Times New Roman" w:cs="Times New Roman"/>
@@ -11606,6 +11884,7 @@
         </w:rPr>
         <w:t>UC</w:t>
       </w:r>
+      <w:proofErr w:type="gramStart"/>
       <w:r>
         <w:rPr>
           <w:rFonts w:ascii="Times New Roman" w:hAnsi="Times New Roman" w:cs="Times New Roman"/>
@@ -11628,7 +11907,16 @@
           <w:sz w:val="26"/>
           <w:szCs w:val="26"/>
         </w:rPr>
-        <w:t>Quản lý Lead</w:t>
+        <w:t>Quản</w:t>
+      </w:r>
+      <w:proofErr w:type="gramEnd"/>
+      <w:r>
+        <w:rPr>
+          <w:rFonts w:ascii="Times New Roman" w:hAnsi="Times New Roman" w:cs="Times New Roman"/>
+          <w:sz w:val="26"/>
+          <w:szCs w:val="26"/>
+        </w:rPr>
+        <w:t xml:space="preserve"> lý Lead</w:t>
       </w:r>
       <w:bookmarkEnd w:id="62"/>
     </w:p>
@@ -15946,7 +16234,7 @@
           <w:szCs w:val="26"/>
         </w:rPr>
       </w:pPr>
-      <w:bookmarkStart w:id="73" w:name="_Toc235770286"/>
+      <w:bookmarkStart w:id="73" w:name="_Toc235777007"/>
       <w:r>
         <w:rPr>
           <w:rFonts w:ascii="Times New Roman" w:hAnsi="Times New Roman" w:cs="Times New Roman"/>
@@ -16099,7 +16387,7 @@
           <w:szCs w:val="26"/>
         </w:rPr>
       </w:pPr>
-      <w:bookmarkStart w:id="74" w:name="_Toc235770287"/>
+      <w:bookmarkStart w:id="74" w:name="_Toc235777008"/>
       <w:r>
         <w:rPr>
           <w:rFonts w:ascii="Times New Roman" w:hAnsi="Times New Roman" w:cs="Times New Roman"/>
@@ -16240,7 +16528,7 @@
           <w:szCs w:val="26"/>
         </w:rPr>
       </w:pPr>
-      <w:bookmarkStart w:id="75" w:name="_Toc235770288"/>
+      <w:bookmarkStart w:id="75" w:name="_Toc235777009"/>
       <w:r>
         <w:rPr>
           <w:rFonts w:ascii="Times New Roman" w:hAnsi="Times New Roman" w:cs="Times New Roman"/>
@@ -16388,7 +16676,7 @@
           <w:szCs w:val="26"/>
         </w:rPr>
       </w:pPr>
-      <w:bookmarkStart w:id="76" w:name="_Toc235770289"/>
+      <w:bookmarkStart w:id="76" w:name="_Toc235777010"/>
       <w:r>
         <w:rPr>
           <w:rFonts w:ascii="Times New Roman" w:hAnsi="Times New Roman" w:cs="Times New Roman"/>
@@ -16537,7 +16825,7 @@
           <w:szCs w:val="26"/>
         </w:rPr>
       </w:pPr>
-      <w:bookmarkStart w:id="77" w:name="_Toc235770290"/>
+      <w:bookmarkStart w:id="77" w:name="_Toc235777011"/>
       <w:r>
         <w:rPr>
           <w:rFonts w:ascii="Times New Roman" w:hAnsi="Times New Roman" w:cs="Times New Roman"/>
@@ -16627,6 +16915,7 @@
         <w:rPr>
           <w:rFonts w:ascii="Times New Roman" w:hAnsi="Times New Roman" w:cs="Times New Roman"/>
         </w:rPr>
+        <w:lastRenderedPageBreak/>
         <w:t>SEQUECE DIAGRAM</w:t>
       </w:r>
       <w:bookmarkEnd w:id="78"/>
@@ -16634,12 +16923,425 @@
     </w:p>
     <w:p>
       <w:pPr>
-        <w:rPr>
-          <w:rFonts w:ascii="Times New Roman" w:hAnsi="Times New Roman" w:cs="Times New Roman"/>
-          <w:sz w:val="26"/>
-          <w:szCs w:val="26"/>
-        </w:rPr>
-      </w:pPr>
+        <w:keepNext/>
+      </w:pPr>
+      <w:r>
+        <w:rPr>
+          <w:rFonts w:ascii="Times New Roman" w:hAnsi="Times New Roman" w:cs="Times New Roman"/>
+          <w:noProof/>
+          <w:sz w:val="26"/>
+          <w:szCs w:val="26"/>
+        </w:rPr>
+        <w:drawing>
+          <wp:inline distT="0" distB="0" distL="0" distR="0" wp14:anchorId="337BE23F" wp14:editId="19CF5453">
+            <wp:extent cx="5791835" cy="4916170"/>
+            <wp:effectExtent l="0" t="0" r="0" b="0"/>
+            <wp:docPr id="16" name="Picture 16"/>
+            <wp:cNvGraphicFramePr>
+              <a:graphicFrameLocks xmlns:a="http://schemas.openxmlformats.org/drawingml/2006/main" noChangeAspect="1"/>
+            </wp:cNvGraphicFramePr>
+            <a:graphic xmlns:a="http://schemas.openxmlformats.org/drawingml/2006/main">
+              <a:graphicData uri="http://schemas.openxmlformats.org/drawingml/2006/picture">
+                <pic:pic xmlns:pic="http://schemas.openxmlformats.org/drawingml/2006/picture">
+                  <pic:nvPicPr>
+                    <pic:cNvPr id="16" name="Picture 16"/>
+                    <pic:cNvPicPr/>
+                  </pic:nvPicPr>
+                  <pic:blipFill>
+                    <a:blip r:embed="rId16" cstate="print">
+                      <a:extLst>
+                        <a:ext uri="{28A0092B-C50C-407E-A947-70E740481C1C}">
+                          <a14:useLocalDpi xmlns:a14="http://schemas.microsoft.com/office/drawing/2010/main" val="0"/>
+                        </a:ext>
+                      </a:extLst>
+                    </a:blip>
+                    <a:stretch>
+                      <a:fillRect/>
+                    </a:stretch>
+                  </pic:blipFill>
+                  <pic:spPr>
+                    <a:xfrm>
+                      <a:off x="0" y="0"/>
+                      <a:ext cx="5791835" cy="4916170"/>
+                    </a:xfrm>
+                    <a:prstGeom prst="rect">
+                      <a:avLst/>
+                    </a:prstGeom>
+                  </pic:spPr>
+                </pic:pic>
+              </a:graphicData>
+            </a:graphic>
+          </wp:inline>
+        </w:drawing>
+      </w:r>
+    </w:p>
+    <w:p>
+      <w:pPr>
+        <w:pStyle w:val="Caption"/>
+        <w:rPr>
+          <w:rFonts w:ascii="Times New Roman" w:hAnsi="Times New Roman" w:cs="Times New Roman"/>
+          <w:sz w:val="26"/>
+          <w:szCs w:val="26"/>
+        </w:rPr>
+      </w:pPr>
+      <w:bookmarkStart w:id="80" w:name="_Toc235777012"/>
+      <w:r>
+        <w:rPr>
+          <w:rFonts w:ascii="Times New Roman" w:hAnsi="Times New Roman" w:cs="Times New Roman"/>
+          <w:sz w:val="26"/>
+          <w:szCs w:val="26"/>
+        </w:rPr>
+        <w:t xml:space="preserve">Hình </w:t>
+      </w:r>
+      <w:r>
+        <w:rPr>
+          <w:rFonts w:ascii="Times New Roman" w:hAnsi="Times New Roman" w:cs="Times New Roman"/>
+          <w:sz w:val="26"/>
+          <w:szCs w:val="26"/>
+        </w:rPr>
+        <w:fldChar w:fldCharType="begin"/>
+      </w:r>
+      <w:r>
+        <w:rPr>
+          <w:rFonts w:ascii="Times New Roman" w:hAnsi="Times New Roman" w:cs="Times New Roman"/>
+          <w:sz w:val="26"/>
+          <w:szCs w:val="26"/>
+        </w:rPr>
+        <w:instrText xml:space="preserve"> SEQ Hình \* ARABIC </w:instrText>
+      </w:r>
+      <w:r>
+        <w:rPr>
+          <w:rFonts w:ascii="Times New Roman" w:hAnsi="Times New Roman" w:cs="Times New Roman"/>
+          <w:sz w:val="26"/>
+          <w:szCs w:val="26"/>
+        </w:rPr>
+        <w:fldChar w:fldCharType="separate"/>
+      </w:r>
+      <w:r>
+        <w:rPr>
+          <w:rFonts w:ascii="Times New Roman" w:hAnsi="Times New Roman" w:cs="Times New Roman"/>
+          <w:noProof/>
+          <w:sz w:val="26"/>
+          <w:szCs w:val="26"/>
+        </w:rPr>
+        <w:t>7</w:t>
+      </w:r>
+      <w:r>
+        <w:rPr>
+          <w:rFonts w:ascii="Times New Roman" w:hAnsi="Times New Roman" w:cs="Times New Roman"/>
+          <w:sz w:val="26"/>
+          <w:szCs w:val="26"/>
+        </w:rPr>
+        <w:fldChar w:fldCharType="end"/>
+      </w:r>
+      <w:r>
+        <w:rPr>
+          <w:rFonts w:ascii="Times New Roman" w:hAnsi="Times New Roman" w:cs="Times New Roman"/>
+          <w:sz w:val="26"/>
+          <w:szCs w:val="26"/>
+        </w:rPr>
+        <w:t>: Sequence Diagram mô tả quy trình chuyển Lead thành Customer</w:t>
+      </w:r>
+      <w:bookmarkEnd w:id="80"/>
+    </w:p>
+    <w:p>
+      <w:pPr>
+        <w:rPr>
+          <w:rFonts w:ascii="Times New Roman" w:hAnsi="Times New Roman" w:cs="Times New Roman"/>
+          <w:sz w:val="26"/>
+          <w:szCs w:val="26"/>
+        </w:rPr>
+      </w:pPr>
+      <w:r>
+        <w:rPr>
+          <w:rFonts w:ascii="Times New Roman" w:hAnsi="Times New Roman" w:cs="Times New Roman"/>
+          <w:sz w:val="26"/>
+          <w:szCs w:val="26"/>
+        </w:rPr>
+        <w:t>Khi Sales bấm nút chuyển đổi trên giao diện, yêu cầu sẽ được gửi đến LeadController thông qua RESTful API. LeadController chuyển yêu cầu cho LeadService để kiểm tra điều kiện chuyển đổi. Nếu hợp lệ thì LeadService sẽ gọi LeadReponsitory để tạo Customer, cập nhật trạng thái Lead thành Converted và ghi vào nhật ký hoạt động. Sau khi hoàn tất, kết quả được trả về giao diện hiển thị thông báo. Nếu thất bại thì sẽ không tạo Customer và hiển thị thông báo lỗi.</w:t>
+      </w:r>
+    </w:p>
+    <w:p>
+      <w:pPr>
+        <w:keepNext/>
+      </w:pPr>
+      <w:r>
+        <w:rPr>
+          <w:rFonts w:ascii="Times New Roman" w:hAnsi="Times New Roman" w:cs="Times New Roman"/>
+          <w:noProof/>
+          <w:sz w:val="26"/>
+          <w:szCs w:val="26"/>
+        </w:rPr>
+        <w:lastRenderedPageBreak/>
+        <w:drawing>
+          <wp:inline distT="0" distB="0" distL="0" distR="0" wp14:anchorId="37831289" wp14:editId="55485390">
+            <wp:extent cx="5791835" cy="4830445"/>
+            <wp:effectExtent l="0" t="0" r="0" b="8255"/>
+            <wp:docPr id="17" name="Picture 17"/>
+            <wp:cNvGraphicFramePr>
+              <a:graphicFrameLocks xmlns:a="http://schemas.openxmlformats.org/drawingml/2006/main" noChangeAspect="1"/>
+            </wp:cNvGraphicFramePr>
+            <a:graphic xmlns:a="http://schemas.openxmlformats.org/drawingml/2006/main">
+              <a:graphicData uri="http://schemas.openxmlformats.org/drawingml/2006/picture">
+                <pic:pic xmlns:pic="http://schemas.openxmlformats.org/drawingml/2006/picture">
+                  <pic:nvPicPr>
+                    <pic:cNvPr id="17" name="Picture 17"/>
+                    <pic:cNvPicPr/>
+                  </pic:nvPicPr>
+                  <pic:blipFill>
+                    <a:blip r:embed="rId17" cstate="print">
+                      <a:extLst>
+                        <a:ext uri="{28A0092B-C50C-407E-A947-70E740481C1C}">
+                          <a14:useLocalDpi xmlns:a14="http://schemas.microsoft.com/office/drawing/2010/main" val="0"/>
+                        </a:ext>
+                      </a:extLst>
+                    </a:blip>
+                    <a:stretch>
+                      <a:fillRect/>
+                    </a:stretch>
+                  </pic:blipFill>
+                  <pic:spPr>
+                    <a:xfrm>
+                      <a:off x="0" y="0"/>
+                      <a:ext cx="5791835" cy="4830445"/>
+                    </a:xfrm>
+                    <a:prstGeom prst="rect">
+                      <a:avLst/>
+                    </a:prstGeom>
+                  </pic:spPr>
+                </pic:pic>
+              </a:graphicData>
+            </a:graphic>
+          </wp:inline>
+        </w:drawing>
+      </w:r>
+    </w:p>
+    <w:p>
+      <w:pPr>
+        <w:pStyle w:val="Caption"/>
+        <w:rPr>
+          <w:rFonts w:ascii="Times New Roman" w:hAnsi="Times New Roman" w:cs="Times New Roman"/>
+          <w:sz w:val="26"/>
+          <w:szCs w:val="26"/>
+        </w:rPr>
+      </w:pPr>
+      <w:bookmarkStart w:id="81" w:name="_Toc235777013"/>
+      <w:r>
+        <w:rPr>
+          <w:rFonts w:ascii="Times New Roman" w:hAnsi="Times New Roman" w:cs="Times New Roman"/>
+          <w:sz w:val="26"/>
+          <w:szCs w:val="26"/>
+        </w:rPr>
+        <w:t xml:space="preserve">Hình </w:t>
+      </w:r>
+      <w:r>
+        <w:rPr>
+          <w:rFonts w:ascii="Times New Roman" w:hAnsi="Times New Roman" w:cs="Times New Roman"/>
+          <w:sz w:val="26"/>
+          <w:szCs w:val="26"/>
+        </w:rPr>
+        <w:fldChar w:fldCharType="begin"/>
+      </w:r>
+      <w:r>
+        <w:rPr>
+          <w:rFonts w:ascii="Times New Roman" w:hAnsi="Times New Roman" w:cs="Times New Roman"/>
+          <w:sz w:val="26"/>
+          <w:szCs w:val="26"/>
+        </w:rPr>
+        <w:instrText xml:space="preserve"> SEQ Hình \* ARABIC </w:instrText>
+      </w:r>
+      <w:r>
+        <w:rPr>
+          <w:rFonts w:ascii="Times New Roman" w:hAnsi="Times New Roman" w:cs="Times New Roman"/>
+          <w:sz w:val="26"/>
+          <w:szCs w:val="26"/>
+        </w:rPr>
+        <w:fldChar w:fldCharType="separate"/>
+      </w:r>
+      <w:r>
+        <w:rPr>
+          <w:rFonts w:ascii="Times New Roman" w:hAnsi="Times New Roman" w:cs="Times New Roman"/>
+          <w:noProof/>
+          <w:sz w:val="26"/>
+          <w:szCs w:val="26"/>
+        </w:rPr>
+        <w:t>8</w:t>
+      </w:r>
+      <w:r>
+        <w:rPr>
+          <w:rFonts w:ascii="Times New Roman" w:hAnsi="Times New Roman" w:cs="Times New Roman"/>
+          <w:sz w:val="26"/>
+          <w:szCs w:val="26"/>
+        </w:rPr>
+        <w:fldChar w:fldCharType="end"/>
+      </w:r>
+      <w:r>
+        <w:rPr>
+          <w:rFonts w:ascii="Times New Roman" w:hAnsi="Times New Roman" w:cs="Times New Roman"/>
+          <w:sz w:val="26"/>
+          <w:szCs w:val="26"/>
+        </w:rPr>
+        <w:t>: Sequence Diagram mô tả quy trình tạo Deal mới</w:t>
+      </w:r>
+      <w:bookmarkEnd w:id="81"/>
+    </w:p>
+    <w:p>
+      <w:pPr>
+        <w:rPr>
+          <w:rFonts w:ascii="Times New Roman" w:hAnsi="Times New Roman" w:cs="Times New Roman"/>
+          <w:sz w:val="26"/>
+          <w:szCs w:val="26"/>
+        </w:rPr>
+      </w:pPr>
+      <w:r>
+        <w:rPr>
+          <w:rFonts w:ascii="Times New Roman" w:hAnsi="Times New Roman" w:cs="Times New Roman"/>
+          <w:sz w:val="26"/>
+          <w:szCs w:val="26"/>
+        </w:rPr>
+        <w:t>Sales nhập thông tin Deal bằng giao diện và bấm tạo Deal, yêu cầu sẽ được gửi đến DealController, sau đó sẽ chuyển cho DealService. DealService kiểm tra thông tin Customer, tính toán doanh thu kỳ vọng, sau đó lưu trữ dữ liệu vào PostgreSQL thông qua DealReponsitory. Sau khi tạo Deal thành công, hệ thống ghi nhận nhật ký và gửi thông báo cho người dùng.</w:t>
+      </w:r>
+    </w:p>
+    <w:p>
+      <w:pPr>
+        <w:keepNext/>
+      </w:pPr>
+      <w:r>
+        <w:rPr>
+          <w:rFonts w:ascii="Times New Roman" w:hAnsi="Times New Roman" w:cs="Times New Roman"/>
+          <w:noProof/>
+          <w:sz w:val="26"/>
+          <w:szCs w:val="26"/>
+        </w:rPr>
+        <w:lastRenderedPageBreak/>
+        <w:drawing>
+          <wp:inline distT="0" distB="0" distL="0" distR="0" wp14:anchorId="326EB39B" wp14:editId="173FBDAC">
+            <wp:extent cx="5791835" cy="4097020"/>
+            <wp:effectExtent l="0" t="0" r="0" b="0"/>
+            <wp:docPr id="18" name="Picture 18"/>
+            <wp:cNvGraphicFramePr>
+              <a:graphicFrameLocks xmlns:a="http://schemas.openxmlformats.org/drawingml/2006/main" noChangeAspect="1"/>
+            </wp:cNvGraphicFramePr>
+            <a:graphic xmlns:a="http://schemas.openxmlformats.org/drawingml/2006/main">
+              <a:graphicData uri="http://schemas.openxmlformats.org/drawingml/2006/picture">
+                <pic:pic xmlns:pic="http://schemas.openxmlformats.org/drawingml/2006/picture">
+                  <pic:nvPicPr>
+                    <pic:cNvPr id="18" name="Picture 18"/>
+                    <pic:cNvPicPr/>
+                  </pic:nvPicPr>
+                  <pic:blipFill>
+                    <a:blip r:embed="rId18" cstate="print">
+                      <a:extLst>
+                        <a:ext uri="{28A0092B-C50C-407E-A947-70E740481C1C}">
+                          <a14:useLocalDpi xmlns:a14="http://schemas.microsoft.com/office/drawing/2010/main" val="0"/>
+                        </a:ext>
+                      </a:extLst>
+                    </a:blip>
+                    <a:stretch>
+                      <a:fillRect/>
+                    </a:stretch>
+                  </pic:blipFill>
+                  <pic:spPr>
+                    <a:xfrm>
+                      <a:off x="0" y="0"/>
+                      <a:ext cx="5791835" cy="4097020"/>
+                    </a:xfrm>
+                    <a:prstGeom prst="rect">
+                      <a:avLst/>
+                    </a:prstGeom>
+                  </pic:spPr>
+                </pic:pic>
+              </a:graphicData>
+            </a:graphic>
+          </wp:inline>
+        </w:drawing>
+      </w:r>
+    </w:p>
+    <w:p>
+      <w:pPr>
+        <w:pStyle w:val="Caption"/>
+        <w:rPr>
+          <w:rFonts w:ascii="Times New Roman" w:hAnsi="Times New Roman" w:cs="Times New Roman"/>
+          <w:sz w:val="26"/>
+          <w:szCs w:val="26"/>
+        </w:rPr>
+      </w:pPr>
+      <w:bookmarkStart w:id="82" w:name="_Toc235777014"/>
+      <w:r>
+        <w:rPr>
+          <w:rFonts w:ascii="Times New Roman" w:hAnsi="Times New Roman" w:cs="Times New Roman"/>
+          <w:sz w:val="26"/>
+          <w:szCs w:val="26"/>
+        </w:rPr>
+        <w:t xml:space="preserve">Hình </w:t>
+      </w:r>
+      <w:r>
+        <w:rPr>
+          <w:rFonts w:ascii="Times New Roman" w:hAnsi="Times New Roman" w:cs="Times New Roman"/>
+          <w:sz w:val="26"/>
+          <w:szCs w:val="26"/>
+        </w:rPr>
+        <w:fldChar w:fldCharType="begin"/>
+      </w:r>
+      <w:r>
+        <w:rPr>
+          <w:rFonts w:ascii="Times New Roman" w:hAnsi="Times New Roman" w:cs="Times New Roman"/>
+          <w:sz w:val="26"/>
+          <w:szCs w:val="26"/>
+        </w:rPr>
+        <w:instrText xml:space="preserve"> SEQ Hình \* ARABIC </w:instrText>
+      </w:r>
+      <w:r>
+        <w:rPr>
+          <w:rFonts w:ascii="Times New Roman" w:hAnsi="Times New Roman" w:cs="Times New Roman"/>
+          <w:sz w:val="26"/>
+          <w:szCs w:val="26"/>
+        </w:rPr>
+        <w:fldChar w:fldCharType="separate"/>
+      </w:r>
+      <w:r>
+        <w:rPr>
+          <w:rFonts w:ascii="Times New Roman" w:hAnsi="Times New Roman" w:cs="Times New Roman"/>
+          <w:noProof/>
+          <w:sz w:val="26"/>
+          <w:szCs w:val="26"/>
+        </w:rPr>
+        <w:t>9</w:t>
+      </w:r>
+      <w:r>
+        <w:rPr>
+          <w:rFonts w:ascii="Times New Roman" w:hAnsi="Times New Roman" w:cs="Times New Roman"/>
+          <w:sz w:val="26"/>
+          <w:szCs w:val="26"/>
+        </w:rPr>
+        <w:fldChar w:fldCharType="end"/>
+      </w:r>
+      <w:r>
+        <w:rPr>
+          <w:rFonts w:ascii="Times New Roman" w:hAnsi="Times New Roman" w:cs="Times New Roman"/>
+          <w:sz w:val="26"/>
+          <w:szCs w:val="26"/>
+        </w:rPr>
+        <w:t>: Sequence Diagram mô tả quy trình thay đổi trạng thái trang Pipeline</w:t>
+      </w:r>
+      <w:bookmarkEnd w:id="82"/>
+    </w:p>
+    <w:p>
+      <w:pPr>
+        <w:rPr>
+          <w:rFonts w:ascii="Times New Roman" w:hAnsi="Times New Roman" w:cs="Times New Roman"/>
+          <w:sz w:val="26"/>
+          <w:szCs w:val="26"/>
+        </w:rPr>
+      </w:pPr>
+      <w:r>
+        <w:rPr>
+          <w:rFonts w:ascii="Times New Roman" w:hAnsi="Times New Roman" w:cs="Times New Roman"/>
+          <w:sz w:val="26"/>
+          <w:szCs w:val="26"/>
+        </w:rPr>
+        <w:t>Sales kéo thả Deal sang trạng thái mới, giao diện gửi yêu cầu cập nhật đến DealController sau đó sẽ được chuyển cho DealService. DealService sẽ kiểm tra thông tin Deal, cập nhật StageID trong cơ sở dữ liệu, tính toán lại doanh thu kỳ vọng, và lưu vào nhật ký. Khi hoàn thành thông báo sẽ được gửi cho người dùng và trả kết quả về giao diện.</w:t>
+      </w:r>
     </w:p>
     <w:p>
       <w:pPr>
@@ -16648,8 +17350,8 @@
           <w:rFonts w:ascii="Times New Roman" w:hAnsi="Times New Roman" w:cs="Times New Roman"/>
         </w:rPr>
       </w:pPr>
-      <w:bookmarkStart w:id="80" w:name="_Toc235563724"/>
-      <w:bookmarkStart w:id="81" w:name="_Toc235741253"/>
+      <w:bookmarkStart w:id="83" w:name="_Toc235563724"/>
+      <w:bookmarkStart w:id="84" w:name="_Toc235741253"/>
       <w:r>
         <w:rPr>
           <w:rFonts w:ascii="Times New Roman" w:hAnsi="Times New Roman" w:cs="Times New Roman"/>
@@ -16657,8 +17359,8 @@
         <w:lastRenderedPageBreak/>
         <w:t>CLASS DIAGRAM</w:t>
       </w:r>
-      <w:bookmarkEnd w:id="80"/>
-      <w:bookmarkEnd w:id="81"/>
+      <w:bookmarkEnd w:id="83"/>
+      <w:bookmarkEnd w:id="84"/>
     </w:p>
     <w:p>
       <w:pPr>
@@ -16687,7 +17389,7 @@
                     <pic:cNvPicPr/>
                   </pic:nvPicPr>
                   <pic:blipFill>
-                    <a:blip r:embed="rId16">
+                    <a:blip r:embed="rId19">
                       <a:extLst>
                         <a:ext uri="{28A0092B-C50C-407E-A947-70E740481C1C}">
                           <a14:useLocalDpi xmlns:a14="http://schemas.microsoft.com/office/drawing/2010/main" val="0"/>
@@ -16723,7 +17425,7 @@
           <w:szCs w:val="26"/>
         </w:rPr>
       </w:pPr>
-      <w:bookmarkStart w:id="82" w:name="_Toc235770291"/>
+      <w:bookmarkStart w:id="85" w:name="_Toc235777015"/>
       <w:r>
         <w:rPr>
           <w:rFonts w:ascii="Times New Roman" w:hAnsi="Times New Roman" w:cs="Times New Roman"/>
@@ -16763,7 +17465,7 @@
           <w:sz w:val="26"/>
           <w:szCs w:val="26"/>
         </w:rPr>
-        <w:t>7</w:t>
+        <w:t>10</w:t>
       </w:r>
       <w:r>
         <w:rPr>
@@ -16781,7 +17483,7 @@
         </w:rPr>
         <w:t>: Class Diagram</w:t>
       </w:r>
-      <w:bookmarkEnd w:id="82"/>
+      <w:bookmarkEnd w:id="85"/>
     </w:p>
     <w:p>
       <w:pPr>
@@ -16863,7 +17565,25 @@
           <w:sz w:val="26"/>
           <w:szCs w:val="26"/>
         </w:rPr>
-        <w:t>Leads – Customers: quan hệ 1-0..1, một khách hàng tiềm năng có thể được chuyển thành một khách hàng hoặc không.</w:t>
+        <w:t>Leads – Customers: quan hệ 1-</w:t>
+      </w:r>
+      <w:proofErr w:type="gramStart"/>
+      <w:r>
+        <w:rPr>
+          <w:rFonts w:ascii="Times New Roman" w:hAnsi="Times New Roman" w:cs="Times New Roman"/>
+          <w:sz w:val="26"/>
+          <w:szCs w:val="26"/>
+        </w:rPr>
+        <w:t>0..</w:t>
+      </w:r>
+      <w:proofErr w:type="gramEnd"/>
+      <w:r>
+        <w:rPr>
+          <w:rFonts w:ascii="Times New Roman" w:hAnsi="Times New Roman" w:cs="Times New Roman"/>
+          <w:sz w:val="26"/>
+          <w:szCs w:val="26"/>
+        </w:rPr>
+        <w:t>1, một khách hàng tiềm năng có thể được chuyển thành một khách hàng hoặc không.</w:t>
       </w:r>
     </w:p>
     <w:p>
@@ -17050,14 +17770,14 @@
           <w:rFonts w:ascii="Times New Roman" w:hAnsi="Times New Roman" w:cs="Times New Roman"/>
         </w:rPr>
       </w:pPr>
-      <w:bookmarkStart w:id="83" w:name="_Toc235741254"/>
+      <w:bookmarkStart w:id="86" w:name="_Toc235741254"/>
       <w:r>
         <w:rPr>
           <w:rFonts w:ascii="Times New Roman" w:hAnsi="Times New Roman" w:cs="Times New Roman"/>
         </w:rPr>
         <w:t>ENTITY RELATIONSHIP DIAGRAM</w:t>
       </w:r>
-      <w:bookmarkEnd w:id="83"/>
+      <w:bookmarkEnd w:id="86"/>
     </w:p>
     <w:p>
       <w:pPr>
@@ -17086,7 +17806,7 @@
                     <pic:cNvPicPr/>
                   </pic:nvPicPr>
                   <pic:blipFill>
-                    <a:blip r:embed="rId17" cstate="print">
+                    <a:blip r:embed="rId20" cstate="print">
                       <a:extLst>
                         <a:ext uri="{28A0092B-C50C-407E-A947-70E740481C1C}">
                           <a14:useLocalDpi xmlns:a14="http://schemas.microsoft.com/office/drawing/2010/main" val="0"/>
@@ -17122,7 +17842,7 @@
           <w:szCs w:val="26"/>
         </w:rPr>
       </w:pPr>
-      <w:bookmarkStart w:id="84" w:name="_Toc235770292"/>
+      <w:bookmarkStart w:id="87" w:name="_Toc235777016"/>
       <w:r>
         <w:rPr>
           <w:rFonts w:ascii="Times New Roman" w:hAnsi="Times New Roman" w:cs="Times New Roman"/>
@@ -17162,7 +17882,7 @@
           <w:sz w:val="26"/>
           <w:szCs w:val="26"/>
         </w:rPr>
-        <w:t>8</w:t>
+        <w:t>11</w:t>
       </w:r>
       <w:r>
         <w:rPr>
@@ -17180,7 +17900,7 @@
         </w:rPr>
         <w:t>: Entity Relationshop Diagram</w:t>
       </w:r>
-      <w:bookmarkEnd w:id="84"/>
+      <w:bookmarkEnd w:id="87"/>
     </w:p>
     <w:p>
       <w:pPr>
@@ -17224,14 +17944,14 @@
           <w:rFonts w:ascii="Times New Roman" w:hAnsi="Times New Roman" w:cs="Times New Roman"/>
         </w:rPr>
       </w:pPr>
-      <w:bookmarkStart w:id="85" w:name="_Toc235741255"/>
+      <w:bookmarkStart w:id="88" w:name="_Toc235741255"/>
       <w:r>
         <w:rPr>
           <w:rFonts w:ascii="Times New Roman" w:hAnsi="Times New Roman" w:cs="Times New Roman"/>
         </w:rPr>
         <w:t>KIỂN TRÚC HỆ THỐNG</w:t>
       </w:r>
-      <w:bookmarkEnd w:id="85"/>
+      <w:bookmarkEnd w:id="88"/>
     </w:p>
     <w:p>
       <w:pPr>
@@ -17306,7 +18026,7 @@
                                 <w:szCs w:val="26"/>
                               </w:rPr>
                             </w:pPr>
-                            <w:bookmarkStart w:id="86" w:name="_Toc235770293"/>
+                            <w:bookmarkStart w:id="89" w:name="_Toc235777017"/>
                             <w:r>
                               <w:rPr>
                                 <w:rFonts w:ascii="Times New Roman" w:hAnsi="Times New Roman" w:cs="Times New Roman"/>
@@ -17346,7 +18066,7 @@
                                 <w:sz w:val="26"/>
                                 <w:szCs w:val="26"/>
                               </w:rPr>
-                              <w:t>9</w:t>
+                              <w:t>12</w:t>
                             </w:r>
                             <w:r>
                               <w:rPr>
@@ -17364,7 +18084,7 @@
                               </w:rPr>
                               <w:t>: Kiến trúc tổng thể</w:t>
                             </w:r>
-                            <w:bookmarkEnd w:id="86"/>
+                            <w:bookmarkEnd w:id="89"/>
                           </w:p>
                         </w:txbxContent>
                       </wps:txbx>
@@ -17399,7 +18119,7 @@
                           <w:szCs w:val="26"/>
                         </w:rPr>
                       </w:pPr>
-                      <w:bookmarkStart w:id="87" w:name="_Toc235770293"/>
+                      <w:bookmarkStart w:id="90" w:name="_Toc235777017"/>
                       <w:r>
                         <w:rPr>
                           <w:rFonts w:ascii="Times New Roman" w:hAnsi="Times New Roman" w:cs="Times New Roman"/>
@@ -17439,7 +18159,7 @@
                           <w:sz w:val="26"/>
                           <w:szCs w:val="26"/>
                         </w:rPr>
-                        <w:t>9</w:t>
+                        <w:t>12</w:t>
                       </w:r>
                       <w:r>
                         <w:rPr>
@@ -17457,7 +18177,7 @@
                         </w:rPr>
                         <w:t>: Kiến trúc tổng thể</w:t>
                       </w:r>
-                      <w:bookmarkEnd w:id="87"/>
+                      <w:bookmarkEnd w:id="90"/>
                     </w:p>
                   </w:txbxContent>
                 </v:textbox>
@@ -17498,7 +18218,7 @@
                     <pic:cNvPicPr/>
                   </pic:nvPicPr>
                   <pic:blipFill>
-                    <a:blip r:embed="rId18">
+                    <a:blip r:embed="rId21">
                       <a:extLst>
                         <a:ext uri="{28A0092B-C50C-407E-A947-70E740481C1C}">
                           <a14:useLocalDpi xmlns:a14="http://schemas.microsoft.com/office/drawing/2010/main" val="0"/>
@@ -17575,7 +18295,7 @@
                     <pic:cNvPicPr/>
                   </pic:nvPicPr>
                   <pic:blipFill>
-                    <a:blip r:embed="rId19" cstate="print">
+                    <a:blip r:embed="rId22" cstate="print">
                       <a:extLst>
                         <a:ext uri="{28A0092B-C50C-407E-A947-70E740481C1C}">
                           <a14:useLocalDpi xmlns:a14="http://schemas.microsoft.com/office/drawing/2010/main" val="0"/>
@@ -17611,7 +18331,7 @@
           <w:szCs w:val="26"/>
         </w:rPr>
       </w:pPr>
-      <w:bookmarkStart w:id="88" w:name="_Toc235770294"/>
+      <w:bookmarkStart w:id="91" w:name="_Toc235777018"/>
       <w:r>
         <w:rPr>
           <w:rFonts w:ascii="Times New Roman" w:hAnsi="Times New Roman" w:cs="Times New Roman"/>
@@ -17651,7 +18371,7 @@
           <w:sz w:val="26"/>
           <w:szCs w:val="26"/>
         </w:rPr>
-        <w:t>10</w:t>
+        <w:t>13</w:t>
       </w:r>
       <w:r>
         <w:rPr>
@@ -17669,7 +18389,7 @@
         </w:rPr>
         <w:t>: Kiến trúc Modular</w:t>
       </w:r>
-      <w:bookmarkEnd w:id="88"/>
+      <w:bookmarkEnd w:id="91"/>
     </w:p>
     <w:p>
       <w:pPr>
@@ -17707,7 +18427,7 @@
                     <pic:cNvPicPr/>
                   </pic:nvPicPr>
                   <pic:blipFill>
-                    <a:blip r:embed="rId20" cstate="print">
+                    <a:blip r:embed="rId23" cstate="print">
                       <a:extLst>
                         <a:ext uri="{28A0092B-C50C-407E-A947-70E740481C1C}">
                           <a14:useLocalDpi xmlns:a14="http://schemas.microsoft.com/office/drawing/2010/main" val="0"/>
@@ -17743,7 +18463,7 @@
           <w:szCs w:val="26"/>
         </w:rPr>
       </w:pPr>
-      <w:bookmarkStart w:id="89" w:name="_Toc235770295"/>
+      <w:bookmarkStart w:id="92" w:name="_Toc235777019"/>
       <w:r>
         <w:rPr>
           <w:rFonts w:ascii="Times New Roman" w:hAnsi="Times New Roman" w:cs="Times New Roman"/>
@@ -17783,7 +18503,7 @@
           <w:sz w:val="26"/>
           <w:szCs w:val="26"/>
         </w:rPr>
-        <w:t>11</w:t>
+        <w:t>14</w:t>
       </w:r>
       <w:r>
         <w:rPr>
@@ -17801,7 +18521,7 @@
         </w:rPr>
         <w:t>: Kiến trúc của một Module</w:t>
       </w:r>
-      <w:bookmarkEnd w:id="89"/>
+      <w:bookmarkEnd w:id="92"/>
     </w:p>
     <w:p>
       <w:pPr>
@@ -18403,7 +19123,7 @@
           <w:szCs w:val="26"/>
         </w:rPr>
       </w:pPr>
-      <w:bookmarkStart w:id="90" w:name="_Toc235770282"/>
+      <w:bookmarkStart w:id="93" w:name="_Toc235770282"/>
       <w:r>
         <w:rPr>
           <w:rFonts w:ascii="Times New Roman" w:hAnsi="Times New Roman" w:cs="Times New Roman"/>
@@ -18461,7 +19181,7 @@
         </w:rPr>
         <w:t>: Chức năng của từng Module</w:t>
       </w:r>
-      <w:bookmarkEnd w:id="90"/>
+      <w:bookmarkEnd w:id="93"/>
     </w:p>
     <w:p>
       <w:pPr>
@@ -18505,7 +19225,7 @@
                     <pic:cNvPicPr/>
                   </pic:nvPicPr>
                   <pic:blipFill>
-                    <a:blip r:embed="rId21" cstate="print">
+                    <a:blip r:embed="rId24" cstate="print">
                       <a:extLst>
                         <a:ext uri="{28A0092B-C50C-407E-A947-70E740481C1C}">
                           <a14:useLocalDpi xmlns:a14="http://schemas.microsoft.com/office/drawing/2010/main" val="0"/>
@@ -18541,7 +19261,7 @@
           <w:szCs w:val="26"/>
         </w:rPr>
       </w:pPr>
-      <w:bookmarkStart w:id="91" w:name="_Toc235770296"/>
+      <w:bookmarkStart w:id="94" w:name="_Toc235777020"/>
       <w:r>
         <w:rPr>
           <w:rFonts w:ascii="Times New Roman" w:hAnsi="Times New Roman" w:cs="Times New Roman"/>
@@ -18581,7 +19301,7 @@
           <w:sz w:val="26"/>
           <w:szCs w:val="26"/>
         </w:rPr>
-        <w:t>12</w:t>
+        <w:t>15</w:t>
       </w:r>
       <w:r>
         <w:rPr>
@@ -18599,7 +19319,7 @@
         </w:rPr>
         <w:t>: Luồng xử lý yêu cầu đăng nhập thông qua RESTful API</w:t>
       </w:r>
-      <w:bookmarkEnd w:id="91"/>
+      <w:bookmarkEnd w:id="94"/>
     </w:p>
     <w:p>
       <w:pPr>
@@ -18659,7 +19379,7 @@
                     <pic:cNvPicPr/>
                   </pic:nvPicPr>
                   <pic:blipFill>
-                    <a:blip r:embed="rId22" cstate="print">
+                    <a:blip r:embed="rId25" cstate="print">
                       <a:extLst>
                         <a:ext uri="{28A0092B-C50C-407E-A947-70E740481C1C}">
                           <a14:useLocalDpi xmlns:a14="http://schemas.microsoft.com/office/drawing/2010/main" val="0"/>
@@ -18695,7 +19415,7 @@
           <w:szCs w:val="26"/>
         </w:rPr>
       </w:pPr>
-      <w:bookmarkStart w:id="92" w:name="_Toc235770297"/>
+      <w:bookmarkStart w:id="95" w:name="_Toc235777021"/>
       <w:r>
         <w:rPr>
           <w:rFonts w:ascii="Times New Roman" w:hAnsi="Times New Roman" w:cs="Times New Roman"/>
@@ -18735,7 +19455,7 @@
           <w:sz w:val="26"/>
           <w:szCs w:val="26"/>
         </w:rPr>
-        <w:t>13</w:t>
+        <w:t>16</w:t>
       </w:r>
       <w:r>
         <w:rPr>
@@ -18753,7 +19473,7 @@
         </w:rPr>
         <w:t>: Luồng xử lý dữ liệu</w:t>
       </w:r>
-      <w:bookmarkEnd w:id="92"/>
+      <w:bookmarkEnd w:id="95"/>
     </w:p>
     <w:p>
       <w:pPr>
@@ -18762,8 +19482,8 @@
           <w:rFonts w:ascii="Times New Roman" w:hAnsi="Times New Roman" w:cs="Times New Roman"/>
         </w:rPr>
       </w:pPr>
-      <w:bookmarkStart w:id="93" w:name="_Toc235563727"/>
-      <w:bookmarkStart w:id="94" w:name="_Toc235741256"/>
+      <w:bookmarkStart w:id="96" w:name="_Toc235563727"/>
+      <w:bookmarkStart w:id="97" w:name="_Toc235741256"/>
       <w:r>
         <w:rPr>
           <w:rFonts w:ascii="Times New Roman" w:hAnsi="Times New Roman" w:cs="Times New Roman"/>
@@ -18771,8 +19491,8 @@
         <w:lastRenderedPageBreak/>
         <w:t>WIREFRAME</w:t>
       </w:r>
-      <w:bookmarkEnd w:id="93"/>
-      <w:bookmarkEnd w:id="94"/>
+      <w:bookmarkEnd w:id="96"/>
+      <w:bookmarkEnd w:id="97"/>
     </w:p>
     <w:p>
       <w:pPr>
@@ -18808,8 +19528,8 @@
           <w:rFonts w:ascii="Times New Roman" w:hAnsi="Times New Roman" w:cs="Times New Roman"/>
         </w:rPr>
       </w:pPr>
-      <w:bookmarkStart w:id="95" w:name="_Toc235563729"/>
-      <w:bookmarkStart w:id="96" w:name="_Toc235741257"/>
+      <w:bookmarkStart w:id="98" w:name="_Toc235563729"/>
+      <w:bookmarkStart w:id="99" w:name="_Toc235741257"/>
       <w:r>
         <w:rPr>
           <w:rFonts w:ascii="Times New Roman" w:hAnsi="Times New Roman" w:cs="Times New Roman"/>
@@ -18817,8 +19537,8 @@
         <w:lastRenderedPageBreak/>
         <w:t>TÀI LIỆU THAM KHẢO</w:t>
       </w:r>
-      <w:bookmarkEnd w:id="95"/>
-      <w:bookmarkEnd w:id="96"/>
+      <w:bookmarkEnd w:id="98"/>
+      <w:bookmarkEnd w:id="99"/>
     </w:p>
     <w:p>
       <w:pPr>
@@ -18830,7 +19550,7 @@
           <w:szCs w:val="26"/>
         </w:rPr>
       </w:pPr>
-      <w:hyperlink r:id="rId23" w:history="1">
+      <w:hyperlink r:id="rId26" w:history="1">
         <w:r>
           <w:rPr>
             <w:rStyle w:val="Hyperlink"/>
@@ -18849,12 +19569,26 @@
           <w:szCs w:val="26"/>
         </w:rPr>
       </w:pPr>
-      <w:hyperlink r:id="rId24" w:history="1">
+      <w:hyperlink r:id="rId27" w:history="1">
         <w:r>
           <w:rPr>
             <w:rStyle w:val="Hyperlink"/>
           </w:rPr>
-          <w:t>clauderic/dnd-kit: The modern toolkit for building drag and drop interfaces</w:t>
+          <w:t xml:space="preserve">clauderic/dnd-kit: The modern toolkit for building </w:t>
+        </w:r>
+        <w:proofErr w:type="gramStart"/>
+        <w:r>
+          <w:rPr>
+            <w:rStyle w:val="Hyperlink"/>
+          </w:rPr>
+          <w:t>drag</w:t>
+        </w:r>
+        <w:proofErr w:type="gramEnd"/>
+        <w:r>
+          <w:rPr>
+            <w:rStyle w:val="Hyperlink"/>
+          </w:rPr>
+          <w:t xml:space="preserve"> and drop interfaces</w:t>
         </w:r>
       </w:hyperlink>
     </w:p>
@@ -18868,7 +19602,7 @@
           <w:szCs w:val="26"/>
         </w:rPr>
       </w:pPr>
-      <w:hyperlink r:id="rId25" w:history="1">
+      <w:hyperlink r:id="rId28" w:history="1">
         <w:r>
           <w:rPr>
             <w:rStyle w:val="Hyperlink"/>
@@ -18887,7 +19621,7 @@
           <w:szCs w:val="26"/>
         </w:rPr>
       </w:pPr>
-      <w:hyperlink r:id="rId26" w:history="1">
+      <w:hyperlink r:id="rId29" w:history="1">
         <w:r>
           <w:rPr>
             <w:rStyle w:val="Hyperlink"/>
@@ -18906,7 +19640,7 @@
           <w:szCs w:val="26"/>
         </w:rPr>
       </w:pPr>
-      <w:hyperlink r:id="rId27" w:history="1">
+      <w:hyperlink r:id="rId30" w:history="1">
         <w:r>
           <w:rPr>
             <w:rStyle w:val="Hyperlink"/>
@@ -18920,7 +19654,7 @@
         <w:spacing w:line="360" w:lineRule="auto"/>
         <w:ind w:left="360"/>
       </w:pPr>
-      <w:hyperlink r:id="rId28" w:history="1">
+      <w:hyperlink r:id="rId31" w:history="1">
         <w:r>
           <w:rPr>
             <w:rStyle w:val="Hyperlink"/>
@@ -18940,7 +19674,7 @@
       </w:pPr>
     </w:p>
     <w:sectPr>
-      <w:headerReference w:type="default" r:id="rId29"/>
+      <w:headerReference w:type="default" r:id="rId32"/>
       <w:pgSz w:w="12240" w:h="15840"/>
       <w:pgMar w:top="1134" w:right="1134" w:bottom="1134" w:left="1985" w:header="720" w:footer="720" w:gutter="0"/>
       <w:cols w:space="720"/>

</xml_diff>

<commit_message>
feat: báo cáo wireframe và lời cảm ơn
</commit_message>
<xml_diff>
--- a/docs/BaoCao/BaoCao.docx
+++ b/docs/BaoCao/BaoCao.docx
@@ -358,13 +358,25 @@
         </w:rPr>
       </w:pPr>
       <w:bookmarkStart w:id="0" w:name="_Toc235563698"/>
-      <w:bookmarkStart w:id="1" w:name="_Toc235741217"/>
+      <w:bookmarkStart w:id="1" w:name="_Toc235800755"/>
       <w:r>
         <w:rPr>
           <w:rFonts w:ascii="Times New Roman" w:hAnsi="Times New Roman" w:cs="Times New Roman"/>
         </w:rPr>
         <w:lastRenderedPageBreak/>
-        <w:t>LỜI CÁM ƠN</w:t>
+        <w:t>LỜI C</w:t>
+      </w:r>
+      <w:r>
+        <w:rPr>
+          <w:rFonts w:ascii="Times New Roman" w:hAnsi="Times New Roman" w:cs="Times New Roman"/>
+        </w:rPr>
+        <w:t>Ả</w:t>
+      </w:r>
+      <w:r>
+        <w:rPr>
+          <w:rFonts w:ascii="Times New Roman" w:hAnsi="Times New Roman" w:cs="Times New Roman"/>
+        </w:rPr>
+        <w:t>M ƠN</w:t>
       </w:r>
       <w:bookmarkEnd w:id="0"/>
       <w:bookmarkEnd w:id="1"/>
@@ -384,6 +396,112 @@
           <w:sz w:val="26"/>
           <w:szCs w:val="26"/>
         </w:rPr>
+        <w:t xml:space="preserve">Trước hết, em xin gửi lời cảm ơn chân thành đến Ban giám hiệu Trường Đại học Mở Thành phố Hồ Chí Minh cùng quý thầy cô Khoa Công nghệ thông tin đã tạo điều kiện thuận lợi và truyền đạt những kiến thức quý giá cho em trong quá trình học tập. Những kiến thức mà thầy cô đã truyền tải sẽ là nền tảng giúp em thực hiện đồ án này và </w:t>
+      </w:r>
+      <w:r>
+        <w:rPr>
+          <w:rFonts w:ascii="Times New Roman" w:hAnsi="Times New Roman" w:cs="Times New Roman"/>
+          <w:sz w:val="26"/>
+          <w:szCs w:val="26"/>
+        </w:rPr>
+        <w:t>đảm nhiệm các công việc trong tương lai.</w:t>
+      </w:r>
+    </w:p>
+    <w:p>
+      <w:pPr>
+        <w:spacing w:line="360" w:lineRule="auto"/>
+        <w:rPr>
+          <w:rFonts w:ascii="Times New Roman" w:hAnsi="Times New Roman" w:cs="Times New Roman"/>
+          <w:sz w:val="26"/>
+          <w:szCs w:val="26"/>
+        </w:rPr>
+      </w:pPr>
+      <w:r>
+        <w:rPr>
+          <w:rFonts w:ascii="Times New Roman" w:hAnsi="Times New Roman" w:cs="Times New Roman"/>
+          <w:sz w:val="26"/>
+          <w:szCs w:val="26"/>
+        </w:rPr>
+        <w:t>Đặc biệt, em xin bày tỏ lòng biết ơn sâu sắc đến Thầy Võ Minh Khoa – giáo viên hướng dẫn, người đã tận tính hướng dẫn, góp ý và hỗ trợ em trong suốt quá trình thực hiện, thiết kế và xây dựng đề tài “Hệ thống CRM và quản lý phễu bán hàng cho doanh nghiệp nhỏ”. Những lời nhận xét của Thầy đã giúp em nắm rõ hơn về đề tài mà em nghiên cứu cả về nội dung lẫn hình thức.</w:t>
+      </w:r>
+    </w:p>
+    <w:p>
+      <w:pPr>
+        <w:spacing w:line="360" w:lineRule="auto"/>
+        <w:rPr>
+          <w:rFonts w:ascii="Times New Roman" w:hAnsi="Times New Roman" w:cs="Times New Roman"/>
+          <w:sz w:val="26"/>
+          <w:szCs w:val="26"/>
+        </w:rPr>
+      </w:pPr>
+      <w:r>
+        <w:rPr>
+          <w:rFonts w:ascii="Times New Roman" w:hAnsi="Times New Roman" w:cs="Times New Roman"/>
+          <w:sz w:val="26"/>
+          <w:szCs w:val="26"/>
+        </w:rPr>
+        <w:t>Bên cạnh đó, em xin gửi lời cảm ơn đến gia đình và bạn bè đã luôn khích lệ và tạo điều kiện cho em trong suốt quá trình học tập và thời gian làm đồ án để em có thể tập trung thực hiện đồ án đúng tiến độ.</w:t>
+      </w:r>
+    </w:p>
+    <w:p>
+      <w:pPr>
+        <w:spacing w:line="360" w:lineRule="auto"/>
+        <w:rPr>
+          <w:rFonts w:ascii="Times New Roman" w:hAnsi="Times New Roman" w:cs="Times New Roman"/>
+          <w:sz w:val="26"/>
+          <w:szCs w:val="26"/>
+        </w:rPr>
+      </w:pPr>
+      <w:r>
+        <w:rPr>
+          <w:rFonts w:ascii="Times New Roman" w:hAnsi="Times New Roman" w:cs="Times New Roman"/>
+          <w:sz w:val="26"/>
+          <w:szCs w:val="26"/>
+        </w:rPr>
+        <w:t>Mặc dù em đã cố gắng hoàn thành đề tài của mình với tất cả nỗ lực của bản thân, nhưng vì thời gian thực hiện và kinh nghiệp còn hạn chế nên có thể bài báo cáo sẽ gặp những thiếu sót không tránh khỏi. Em rất mong nhận được ý kiến nhận xét từ quý thầy cô để có thể tiếp tục hoàn thiện kiến thức.</w:t>
+      </w:r>
+    </w:p>
+    <w:p>
+      <w:pPr>
+        <w:spacing w:line="360" w:lineRule="auto"/>
+        <w:rPr>
+          <w:rFonts w:ascii="Times New Roman" w:hAnsi="Times New Roman" w:cs="Times New Roman"/>
+          <w:sz w:val="26"/>
+          <w:szCs w:val="26"/>
+        </w:rPr>
+      </w:pPr>
+      <w:r>
+        <w:rPr>
+          <w:rFonts w:ascii="Times New Roman" w:hAnsi="Times New Roman" w:cs="Times New Roman"/>
+          <w:sz w:val="26"/>
+          <w:szCs w:val="26"/>
+        </w:rPr>
+        <w:t>Cuối cùng, em xin kính chúc quý thầy cô luôn dồi dào sức khỏe, hạnh phúc và thành công trong công tác giảng dạy nhưng như nghiên cứu.</w:t>
+      </w:r>
+    </w:p>
+    <w:p>
+      <w:pPr>
+        <w:spacing w:line="360" w:lineRule="auto"/>
+        <w:rPr>
+          <w:rFonts w:ascii="Times New Roman" w:hAnsi="Times New Roman" w:cs="Times New Roman"/>
+          <w:sz w:val="26"/>
+          <w:szCs w:val="26"/>
+        </w:rPr>
+      </w:pPr>
+      <w:r>
+        <w:rPr>
+          <w:rFonts w:ascii="Times New Roman" w:hAnsi="Times New Roman" w:cs="Times New Roman"/>
+          <w:sz w:val="26"/>
+          <w:szCs w:val="26"/>
+        </w:rPr>
+        <w:t>Em xin chân thành cảm ơn!</w:t>
+      </w:r>
+      <w:r>
+        <w:rPr>
+          <w:rFonts w:ascii="Times New Roman" w:hAnsi="Times New Roman" w:cs="Times New Roman"/>
+          <w:sz w:val="26"/>
+          <w:szCs w:val="26"/>
+        </w:rPr>
         <w:br w:type="page"/>
       </w:r>
     </w:p>
@@ -396,7 +514,7 @@
         </w:rPr>
       </w:pPr>
       <w:bookmarkStart w:id="2" w:name="_Toc235563699"/>
-      <w:bookmarkStart w:id="3" w:name="_Toc235741218"/>
+      <w:bookmarkStart w:id="3" w:name="_Toc235800756"/>
       <w:r>
         <w:rPr>
           <w:rFonts w:ascii="Times New Roman" w:hAnsi="Times New Roman" w:cs="Times New Roman"/>
@@ -417,7 +535,7 @@
       <w:r>
         <w:br w:type="page"/>
       </w:r>
-      <w:bookmarkStart w:id="4" w:name="_Toc235741219"/>
+      <w:bookmarkStart w:id="4" w:name="_Toc235800757"/>
       <w:r>
         <w:rPr>
           <w:rFonts w:ascii="Times New Roman" w:hAnsi="Times New Roman" w:cs="Times New Roman"/>
@@ -525,14 +643,14 @@
             </w:rPr>
             <w:fldChar w:fldCharType="separate"/>
           </w:r>
-          <w:hyperlink w:anchor="_Toc235741217" w:history="1">
+          <w:hyperlink w:anchor="_Toc235800755" w:history="1">
             <w:r>
               <w:rPr>
                 <w:rStyle w:val="Hyperlink"/>
                 <w:rFonts w:ascii="Times New Roman" w:hAnsi="Times New Roman" w:cs="Times New Roman"/>
                 <w:noProof/>
               </w:rPr>
-              <w:t>LỜI CÁM ƠN</w:t>
+              <w:t>LỜI CẢM ƠN</w:t>
             </w:r>
             <w:r>
               <w:rPr>
@@ -553,7 +671,7 @@
                 <w:noProof/>
                 <w:webHidden/>
               </w:rPr>
-              <w:instrText xml:space="preserve"> PAGEREF _Toc235741217 \h </w:instrText>
+              <w:instrText xml:space="preserve"> PAGEREF _Toc235800755 \h </w:instrText>
             </w:r>
             <w:r>
               <w:rPr>
@@ -595,7 +713,7 @@
               <w:noProof/>
             </w:rPr>
           </w:pPr>
-          <w:hyperlink w:anchor="_Toc235741218" w:history="1">
+          <w:hyperlink w:anchor="_Toc235800756" w:history="1">
             <w:r>
               <w:rPr>
                 <w:rStyle w:val="Hyperlink"/>
@@ -623,7 +741,7 @@
                 <w:noProof/>
                 <w:webHidden/>
               </w:rPr>
-              <w:instrText xml:space="preserve"> PAGEREF _Toc235741218 \h </w:instrText>
+              <w:instrText xml:space="preserve"> PAGEREF _Toc235800756 \h </w:instrText>
             </w:r>
             <w:r>
               <w:rPr>
@@ -665,7 +783,7 @@
               <w:noProof/>
             </w:rPr>
           </w:pPr>
-          <w:hyperlink w:anchor="_Toc235741219" w:history="1">
+          <w:hyperlink w:anchor="_Toc235800757" w:history="1">
             <w:r>
               <w:rPr>
                 <w:rStyle w:val="Hyperlink"/>
@@ -693,7 +811,7 @@
                 <w:noProof/>
                 <w:webHidden/>
               </w:rPr>
-              <w:instrText xml:space="preserve"> PAGEREF _Toc235741219 \h </w:instrText>
+              <w:instrText xml:space="preserve"> PAGEREF _Toc235800757 \h </w:instrText>
             </w:r>
             <w:r>
               <w:rPr>
@@ -735,7 +853,7 @@
               <w:noProof/>
             </w:rPr>
           </w:pPr>
-          <w:hyperlink w:anchor="_Toc235741220" w:history="1">
+          <w:hyperlink w:anchor="_Toc235800758" w:history="1">
             <w:r>
               <w:rPr>
                 <w:rStyle w:val="Hyperlink"/>
@@ -763,7 +881,7 @@
                 <w:noProof/>
                 <w:webHidden/>
               </w:rPr>
-              <w:instrText xml:space="preserve"> PAGEREF _Toc235741220 \h </w:instrText>
+              <w:instrText xml:space="preserve"> PAGEREF _Toc235800758 \h </w:instrText>
             </w:r>
             <w:r>
               <w:rPr>
@@ -805,7 +923,7 @@
               <w:noProof/>
             </w:rPr>
           </w:pPr>
-          <w:hyperlink w:anchor="_Toc235741221" w:history="1">
+          <w:hyperlink w:anchor="_Toc235800759" w:history="1">
             <w:r>
               <w:rPr>
                 <w:rStyle w:val="Hyperlink"/>
@@ -833,7 +951,7 @@
                 <w:noProof/>
                 <w:webHidden/>
               </w:rPr>
-              <w:instrText xml:space="preserve"> PAGEREF _Toc235741221 \h </w:instrText>
+              <w:instrText xml:space="preserve"> PAGEREF _Toc235800759 \h </w:instrText>
             </w:r>
             <w:r>
               <w:rPr>
@@ -875,7 +993,7 @@
               <w:noProof/>
             </w:rPr>
           </w:pPr>
-          <w:hyperlink w:anchor="_Toc235741222" w:history="1">
+          <w:hyperlink w:anchor="_Toc235800760" w:history="1">
             <w:r>
               <w:rPr>
                 <w:rStyle w:val="Hyperlink"/>
@@ -903,7 +1021,7 @@
                 <w:noProof/>
                 <w:webHidden/>
               </w:rPr>
-              <w:instrText xml:space="preserve"> PAGEREF _Toc235741222 \h </w:instrText>
+              <w:instrText xml:space="preserve"> PAGEREF _Toc235800760 \h </w:instrText>
             </w:r>
             <w:r>
               <w:rPr>
@@ -945,7 +1063,7 @@
               <w:noProof/>
             </w:rPr>
           </w:pPr>
-          <w:hyperlink w:anchor="_Toc235741223" w:history="1">
+          <w:hyperlink w:anchor="_Toc235800761" w:history="1">
             <w:r>
               <w:rPr>
                 <w:rStyle w:val="Hyperlink"/>
@@ -973,7 +1091,7 @@
                 <w:noProof/>
                 <w:webHidden/>
               </w:rPr>
-              <w:instrText xml:space="preserve"> PAGEREF _Toc235741223 \h </w:instrText>
+              <w:instrText xml:space="preserve"> PAGEREF _Toc235800761 \h </w:instrText>
             </w:r>
             <w:r>
               <w:rPr>
@@ -1015,7 +1133,7 @@
               <w:noProof/>
             </w:rPr>
           </w:pPr>
-          <w:hyperlink w:anchor="_Toc235741224" w:history="1">
+          <w:hyperlink w:anchor="_Toc235800762" w:history="1">
             <w:r>
               <w:rPr>
                 <w:rStyle w:val="Hyperlink"/>
@@ -1043,7 +1161,7 @@
                 <w:noProof/>
                 <w:webHidden/>
               </w:rPr>
-              <w:instrText xml:space="preserve"> PAGEREF _Toc235741224 \h </w:instrText>
+              <w:instrText xml:space="preserve"> PAGEREF _Toc235800762 \h </w:instrText>
             </w:r>
             <w:r>
               <w:rPr>
@@ -1085,7 +1203,7 @@
               <w:noProof/>
             </w:rPr>
           </w:pPr>
-          <w:hyperlink w:anchor="_Toc235741225" w:history="1">
+          <w:hyperlink w:anchor="_Toc235800763" w:history="1">
             <w:r>
               <w:rPr>
                 <w:rStyle w:val="Hyperlink"/>
@@ -1113,7 +1231,7 @@
                 <w:noProof/>
                 <w:webHidden/>
               </w:rPr>
-              <w:instrText xml:space="preserve"> PAGEREF _Toc235741225 \h </w:instrText>
+              <w:instrText xml:space="preserve"> PAGEREF _Toc235800763 \h </w:instrText>
             </w:r>
             <w:r>
               <w:rPr>
@@ -1155,7 +1273,7 @@
               <w:noProof/>
             </w:rPr>
           </w:pPr>
-          <w:hyperlink w:anchor="_Toc235741226" w:history="1">
+          <w:hyperlink w:anchor="_Toc235800764" w:history="1">
             <w:r>
               <w:rPr>
                 <w:rStyle w:val="Hyperlink"/>
@@ -1183,7 +1301,7 @@
                 <w:noProof/>
                 <w:webHidden/>
               </w:rPr>
-              <w:instrText xml:space="preserve"> PAGEREF _Toc235741226 \h </w:instrText>
+              <w:instrText xml:space="preserve"> PAGEREF _Toc235800764 \h </w:instrText>
             </w:r>
             <w:r>
               <w:rPr>
@@ -1225,7 +1343,7 @@
               <w:noProof/>
             </w:rPr>
           </w:pPr>
-          <w:hyperlink w:anchor="_Toc235741227" w:history="1">
+          <w:hyperlink w:anchor="_Toc235800765" w:history="1">
             <w:r>
               <w:rPr>
                 <w:rStyle w:val="Hyperlink"/>
@@ -1253,7 +1371,7 @@
                 <w:noProof/>
                 <w:webHidden/>
               </w:rPr>
-              <w:instrText xml:space="preserve"> PAGEREF _Toc235741227 \h </w:instrText>
+              <w:instrText xml:space="preserve"> PAGEREF _Toc235800765 \h </w:instrText>
             </w:r>
             <w:r>
               <w:rPr>
@@ -1295,7 +1413,7 @@
               <w:noProof/>
             </w:rPr>
           </w:pPr>
-          <w:hyperlink w:anchor="_Toc235741228" w:history="1">
+          <w:hyperlink w:anchor="_Toc235800766" w:history="1">
             <w:r>
               <w:rPr>
                 <w:rStyle w:val="Hyperlink"/>
@@ -1323,7 +1441,7 @@
                 <w:noProof/>
                 <w:webHidden/>
               </w:rPr>
-              <w:instrText xml:space="preserve"> PAGEREF _Toc235741228 \h </w:instrText>
+              <w:instrText xml:space="preserve"> PAGEREF _Toc235800766 \h </w:instrText>
             </w:r>
             <w:r>
               <w:rPr>
@@ -1365,7 +1483,7 @@
               <w:noProof/>
             </w:rPr>
           </w:pPr>
-          <w:hyperlink w:anchor="_Toc235741229" w:history="1">
+          <w:hyperlink w:anchor="_Toc235800767" w:history="1">
             <w:r>
               <w:rPr>
                 <w:rStyle w:val="Hyperlink"/>
@@ -1393,7 +1511,7 @@
                 <w:noProof/>
                 <w:webHidden/>
               </w:rPr>
-              <w:instrText xml:space="preserve"> PAGEREF _Toc235741229 \h </w:instrText>
+              <w:instrText xml:space="preserve"> PAGEREF _Toc235800767 \h </w:instrText>
             </w:r>
             <w:r>
               <w:rPr>
@@ -1435,7 +1553,7 @@
               <w:noProof/>
             </w:rPr>
           </w:pPr>
-          <w:hyperlink w:anchor="_Toc235741230" w:history="1">
+          <w:hyperlink w:anchor="_Toc235800768" w:history="1">
             <w:r>
               <w:rPr>
                 <w:rStyle w:val="Hyperlink"/>
@@ -1463,7 +1581,7 @@
                 <w:noProof/>
                 <w:webHidden/>
               </w:rPr>
-              <w:instrText xml:space="preserve"> PAGEREF _Toc235741230 \h </w:instrText>
+              <w:instrText xml:space="preserve"> PAGEREF _Toc235800768 \h </w:instrText>
             </w:r>
             <w:r>
               <w:rPr>
@@ -1505,7 +1623,7 @@
               <w:noProof/>
             </w:rPr>
           </w:pPr>
-          <w:hyperlink w:anchor="_Toc235741231" w:history="1">
+          <w:hyperlink w:anchor="_Toc235800769" w:history="1">
             <w:r>
               <w:rPr>
                 <w:rStyle w:val="Hyperlink"/>
@@ -1533,7 +1651,7 @@
                 <w:noProof/>
                 <w:webHidden/>
               </w:rPr>
-              <w:instrText xml:space="preserve"> PAGEREF _Toc235741231 \h </w:instrText>
+              <w:instrText xml:space="preserve"> PAGEREF _Toc235800769 \h </w:instrText>
             </w:r>
             <w:r>
               <w:rPr>
@@ -1575,7 +1693,7 @@
               <w:noProof/>
             </w:rPr>
           </w:pPr>
-          <w:hyperlink w:anchor="_Toc235741232" w:history="1">
+          <w:hyperlink w:anchor="_Toc235800770" w:history="1">
             <w:r>
               <w:rPr>
                 <w:rStyle w:val="Hyperlink"/>
@@ -1603,7 +1721,7 @@
                 <w:noProof/>
                 <w:webHidden/>
               </w:rPr>
-              <w:instrText xml:space="preserve"> PAGEREF _Toc235741232 \h </w:instrText>
+              <w:instrText xml:space="preserve"> PAGEREF _Toc235800770 \h </w:instrText>
             </w:r>
             <w:r>
               <w:rPr>
@@ -1645,7 +1763,7 @@
               <w:noProof/>
             </w:rPr>
           </w:pPr>
-          <w:hyperlink w:anchor="_Toc235741233" w:history="1">
+          <w:hyperlink w:anchor="_Toc235800771" w:history="1">
             <w:r>
               <w:rPr>
                 <w:rStyle w:val="Hyperlink"/>
@@ -1673,7 +1791,7 @@
                 <w:noProof/>
                 <w:webHidden/>
               </w:rPr>
-              <w:instrText xml:space="preserve"> PAGEREF _Toc235741233 \h </w:instrText>
+              <w:instrText xml:space="preserve"> PAGEREF _Toc235800771 \h </w:instrText>
             </w:r>
             <w:r>
               <w:rPr>
@@ -1715,7 +1833,7 @@
               <w:noProof/>
             </w:rPr>
           </w:pPr>
-          <w:hyperlink w:anchor="_Toc235741234" w:history="1">
+          <w:hyperlink w:anchor="_Toc235800772" w:history="1">
             <w:r>
               <w:rPr>
                 <w:rStyle w:val="Hyperlink"/>
@@ -1743,7 +1861,7 @@
                 <w:noProof/>
                 <w:webHidden/>
               </w:rPr>
-              <w:instrText xml:space="preserve"> PAGEREF _Toc235741234 \h </w:instrText>
+              <w:instrText xml:space="preserve"> PAGEREF _Toc235800772 \h </w:instrText>
             </w:r>
             <w:r>
               <w:rPr>
@@ -1785,7 +1903,7 @@
               <w:noProof/>
             </w:rPr>
           </w:pPr>
-          <w:hyperlink w:anchor="_Toc235741235" w:history="1">
+          <w:hyperlink w:anchor="_Toc235800773" w:history="1">
             <w:r>
               <w:rPr>
                 <w:rStyle w:val="Hyperlink"/>
@@ -1813,7 +1931,7 @@
                 <w:noProof/>
                 <w:webHidden/>
               </w:rPr>
-              <w:instrText xml:space="preserve"> PAGEREF _Toc235741235 \h </w:instrText>
+              <w:instrText xml:space="preserve"> PAGEREF _Toc235800773 \h </w:instrText>
             </w:r>
             <w:r>
               <w:rPr>
@@ -1855,7 +1973,7 @@
               <w:noProof/>
             </w:rPr>
           </w:pPr>
-          <w:hyperlink w:anchor="_Toc235741236" w:history="1">
+          <w:hyperlink w:anchor="_Toc235800774" w:history="1">
             <w:r>
               <w:rPr>
                 <w:rStyle w:val="Hyperlink"/>
@@ -1883,7 +2001,7 @@
                 <w:noProof/>
                 <w:webHidden/>
               </w:rPr>
-              <w:instrText xml:space="preserve"> PAGEREF _Toc235741236 \h </w:instrText>
+              <w:instrText xml:space="preserve"> PAGEREF _Toc235800774 \h </w:instrText>
             </w:r>
             <w:r>
               <w:rPr>
@@ -1925,7 +2043,7 @@
               <w:noProof/>
             </w:rPr>
           </w:pPr>
-          <w:hyperlink w:anchor="_Toc235741237" w:history="1">
+          <w:hyperlink w:anchor="_Toc235800775" w:history="1">
             <w:r>
               <w:rPr>
                 <w:rStyle w:val="Hyperlink"/>
@@ -1953,7 +2071,7 @@
                 <w:noProof/>
                 <w:webHidden/>
               </w:rPr>
-              <w:instrText xml:space="preserve"> PAGEREF _Toc235741237 \h </w:instrText>
+              <w:instrText xml:space="preserve"> PAGEREF _Toc235800775 \h </w:instrText>
             </w:r>
             <w:r>
               <w:rPr>
@@ -1995,7 +2113,7 @@
               <w:noProof/>
             </w:rPr>
           </w:pPr>
-          <w:hyperlink w:anchor="_Toc235741238" w:history="1">
+          <w:hyperlink w:anchor="_Toc235800776" w:history="1">
             <w:r>
               <w:rPr>
                 <w:rStyle w:val="Hyperlink"/>
@@ -2023,7 +2141,7 @@
                 <w:noProof/>
                 <w:webHidden/>
               </w:rPr>
-              <w:instrText xml:space="preserve"> PAGEREF _Toc235741238 \h </w:instrText>
+              <w:instrText xml:space="preserve"> PAGEREF _Toc235800776 \h </w:instrText>
             </w:r>
             <w:r>
               <w:rPr>
@@ -2065,7 +2183,7 @@
               <w:noProof/>
             </w:rPr>
           </w:pPr>
-          <w:hyperlink w:anchor="_Toc235741239" w:history="1">
+          <w:hyperlink w:anchor="_Toc235800777" w:history="1">
             <w:r>
               <w:rPr>
                 <w:rStyle w:val="Hyperlink"/>
@@ -2093,7 +2211,7 @@
                 <w:noProof/>
                 <w:webHidden/>
               </w:rPr>
-              <w:instrText xml:space="preserve"> PAGEREF _Toc235741239 \h </w:instrText>
+              <w:instrText xml:space="preserve"> PAGEREF _Toc235800777 \h </w:instrText>
             </w:r>
             <w:r>
               <w:rPr>
@@ -2135,7 +2253,7 @@
               <w:noProof/>
             </w:rPr>
           </w:pPr>
-          <w:hyperlink w:anchor="_Toc235741240" w:history="1">
+          <w:hyperlink w:anchor="_Toc235800778" w:history="1">
             <w:r>
               <w:rPr>
                 <w:rStyle w:val="Hyperlink"/>
@@ -2163,7 +2281,7 @@
                 <w:noProof/>
                 <w:webHidden/>
               </w:rPr>
-              <w:instrText xml:space="preserve"> PAGEREF _Toc235741240 \h </w:instrText>
+              <w:instrText xml:space="preserve"> PAGEREF _Toc235800778 \h </w:instrText>
             </w:r>
             <w:r>
               <w:rPr>
@@ -2205,7 +2323,7 @@
               <w:noProof/>
             </w:rPr>
           </w:pPr>
-          <w:hyperlink w:anchor="_Toc235741241" w:history="1">
+          <w:hyperlink w:anchor="_Toc235800779" w:history="1">
             <w:r>
               <w:rPr>
                 <w:rStyle w:val="Hyperlink"/>
@@ -2233,7 +2351,7 @@
                 <w:noProof/>
                 <w:webHidden/>
               </w:rPr>
-              <w:instrText xml:space="preserve"> PAGEREF _Toc235741241 \h </w:instrText>
+              <w:instrText xml:space="preserve"> PAGEREF _Toc235800779 \h </w:instrText>
             </w:r>
             <w:r>
               <w:rPr>
@@ -2275,7 +2393,7 @@
               <w:noProof/>
             </w:rPr>
           </w:pPr>
-          <w:hyperlink w:anchor="_Toc235741242" w:history="1">
+          <w:hyperlink w:anchor="_Toc235800780" w:history="1">
             <w:r>
               <w:rPr>
                 <w:rStyle w:val="Hyperlink"/>
@@ -2303,7 +2421,7 @@
                 <w:noProof/>
                 <w:webHidden/>
               </w:rPr>
-              <w:instrText xml:space="preserve"> PAGEREF _Toc235741242 \h </w:instrText>
+              <w:instrText xml:space="preserve"> PAGEREF _Toc235800780 \h </w:instrText>
             </w:r>
             <w:r>
               <w:rPr>
@@ -2345,7 +2463,7 @@
               <w:noProof/>
             </w:rPr>
           </w:pPr>
-          <w:hyperlink w:anchor="_Toc235741243" w:history="1">
+          <w:hyperlink w:anchor="_Toc235800781" w:history="1">
             <w:r>
               <w:rPr>
                 <w:rStyle w:val="Hyperlink"/>
@@ -2373,7 +2491,7 @@
                 <w:noProof/>
                 <w:webHidden/>
               </w:rPr>
-              <w:instrText xml:space="preserve"> PAGEREF _Toc235741243 \h </w:instrText>
+              <w:instrText xml:space="preserve"> PAGEREF _Toc235800781 \h </w:instrText>
             </w:r>
             <w:r>
               <w:rPr>
@@ -2415,7 +2533,7 @@
               <w:noProof/>
             </w:rPr>
           </w:pPr>
-          <w:hyperlink w:anchor="_Toc235741244" w:history="1">
+          <w:hyperlink w:anchor="_Toc235800782" w:history="1">
             <w:r>
               <w:rPr>
                 <w:rStyle w:val="Hyperlink"/>
@@ -2443,7 +2561,7 @@
                 <w:noProof/>
                 <w:webHidden/>
               </w:rPr>
-              <w:instrText xml:space="preserve"> PAGEREF _Toc235741244 \h </w:instrText>
+              <w:instrText xml:space="preserve"> PAGEREF _Toc235800782 \h </w:instrText>
             </w:r>
             <w:r>
               <w:rPr>
@@ -2485,7 +2603,7 @@
               <w:noProof/>
             </w:rPr>
           </w:pPr>
-          <w:hyperlink w:anchor="_Toc235741245" w:history="1">
+          <w:hyperlink w:anchor="_Toc235800783" w:history="1">
             <w:r>
               <w:rPr>
                 <w:rStyle w:val="Hyperlink"/>
@@ -2513,7 +2631,7 @@
                 <w:noProof/>
                 <w:webHidden/>
               </w:rPr>
-              <w:instrText xml:space="preserve"> PAGEREF _Toc235741245 \h </w:instrText>
+              <w:instrText xml:space="preserve"> PAGEREF _Toc235800783 \h </w:instrText>
             </w:r>
             <w:r>
               <w:rPr>
@@ -2555,7 +2673,7 @@
               <w:noProof/>
             </w:rPr>
           </w:pPr>
-          <w:hyperlink w:anchor="_Toc235741246" w:history="1">
+          <w:hyperlink w:anchor="_Toc235800784" w:history="1">
             <w:r>
               <w:rPr>
                 <w:rStyle w:val="Hyperlink"/>
@@ -2583,7 +2701,7 @@
                 <w:noProof/>
                 <w:webHidden/>
               </w:rPr>
-              <w:instrText xml:space="preserve"> PAGEREF _Toc235741246 \h </w:instrText>
+              <w:instrText xml:space="preserve"> PAGEREF _Toc235800784 \h </w:instrText>
             </w:r>
             <w:r>
               <w:rPr>
@@ -2625,7 +2743,7 @@
               <w:noProof/>
             </w:rPr>
           </w:pPr>
-          <w:hyperlink w:anchor="_Toc235741247" w:history="1">
+          <w:hyperlink w:anchor="_Toc235800785" w:history="1">
             <w:r>
               <w:rPr>
                 <w:rStyle w:val="Hyperlink"/>
@@ -2653,7 +2771,7 @@
                 <w:noProof/>
                 <w:webHidden/>
               </w:rPr>
-              <w:instrText xml:space="preserve"> PAGEREF _Toc235741247 \h </w:instrText>
+              <w:instrText xml:space="preserve"> PAGEREF _Toc235800785 \h </w:instrText>
             </w:r>
             <w:r>
               <w:rPr>
@@ -2695,7 +2813,7 @@
               <w:noProof/>
             </w:rPr>
           </w:pPr>
-          <w:hyperlink w:anchor="_Toc235741248" w:history="1">
+          <w:hyperlink w:anchor="_Toc235800786" w:history="1">
             <w:r>
               <w:rPr>
                 <w:rStyle w:val="Hyperlink"/>
@@ -2723,7 +2841,7 @@
                 <w:noProof/>
                 <w:webHidden/>
               </w:rPr>
-              <w:instrText xml:space="preserve"> PAGEREF _Toc235741248 \h </w:instrText>
+              <w:instrText xml:space="preserve"> PAGEREF _Toc235800786 \h </w:instrText>
             </w:r>
             <w:r>
               <w:rPr>
@@ -2765,30 +2883,14 @@
               <w:noProof/>
             </w:rPr>
           </w:pPr>
-          <w:hyperlink w:anchor="_Toc235741249" w:history="1">
+          <w:hyperlink w:anchor="_Toc235800787" w:history="1">
             <w:r>
               <w:rPr>
                 <w:rStyle w:val="Hyperlink"/>
                 <w:rFonts w:ascii="Times New Roman" w:hAnsi="Times New Roman" w:cs="Times New Roman"/>
                 <w:noProof/>
               </w:rPr>
-              <w:t>USE-CASE</w:t>
-            </w:r>
-            <w:r>
-              <w:rPr>
-                <w:rStyle w:val="Hyperlink"/>
-                <w:rFonts w:ascii="Times New Roman" w:hAnsi="Times New Roman" w:cs="Times New Roman"/>
-                <w:noProof/>
-              </w:rPr>
-              <w:t xml:space="preserve"> </w:t>
-            </w:r>
-            <w:r>
-              <w:rPr>
-                <w:rStyle w:val="Hyperlink"/>
-                <w:rFonts w:ascii="Times New Roman" w:hAnsi="Times New Roman" w:cs="Times New Roman"/>
-                <w:noProof/>
-              </w:rPr>
-              <w:t>DIAGRAM</w:t>
+              <w:t>USE-CASE DIAGRAM</w:t>
             </w:r>
             <w:r>
               <w:rPr>
@@ -2809,7 +2911,7 @@
                 <w:noProof/>
                 <w:webHidden/>
               </w:rPr>
-              <w:instrText xml:space="preserve"> PAGEREF _Toc235741249 \h </w:instrText>
+              <w:instrText xml:space="preserve"> PAGEREF _Toc235800787 \h </w:instrText>
             </w:r>
             <w:r>
               <w:rPr>
@@ -2851,7 +2953,7 @@
               <w:noProof/>
             </w:rPr>
           </w:pPr>
-          <w:hyperlink w:anchor="_Toc235741250" w:history="1">
+          <w:hyperlink w:anchor="_Toc235800788" w:history="1">
             <w:r>
               <w:rPr>
                 <w:rStyle w:val="Hyperlink"/>
@@ -2879,7 +2981,7 @@
                 <w:noProof/>
                 <w:webHidden/>
               </w:rPr>
-              <w:instrText xml:space="preserve"> PAGEREF _Toc235741250 \h </w:instrText>
+              <w:instrText xml:space="preserve"> PAGEREF _Toc235800788 \h </w:instrText>
             </w:r>
             <w:r>
               <w:rPr>
@@ -2921,7 +3023,7 @@
               <w:noProof/>
             </w:rPr>
           </w:pPr>
-          <w:hyperlink w:anchor="_Toc235741251" w:history="1">
+          <w:hyperlink w:anchor="_Toc235800789" w:history="1">
             <w:r>
               <w:rPr>
                 <w:rStyle w:val="Hyperlink"/>
@@ -2949,7 +3051,7 @@
                 <w:noProof/>
                 <w:webHidden/>
               </w:rPr>
-              <w:instrText xml:space="preserve"> PAGEREF _Toc235741251 \h </w:instrText>
+              <w:instrText xml:space="preserve"> PAGEREF _Toc235800789 \h </w:instrText>
             </w:r>
             <w:r>
               <w:rPr>
@@ -2991,7 +3093,7 @@
               <w:noProof/>
             </w:rPr>
           </w:pPr>
-          <w:hyperlink w:anchor="_Toc235741252" w:history="1">
+          <w:hyperlink w:anchor="_Toc235800790" w:history="1">
             <w:r>
               <w:rPr>
                 <w:rStyle w:val="Hyperlink"/>
@@ -3019,7 +3121,7 @@
                 <w:noProof/>
                 <w:webHidden/>
               </w:rPr>
-              <w:instrText xml:space="preserve"> PAGEREF _Toc235741252 \h </w:instrText>
+              <w:instrText xml:space="preserve"> PAGEREF _Toc235800790 \h </w:instrText>
             </w:r>
             <w:r>
               <w:rPr>
@@ -3039,7 +3141,7 @@
                 <w:noProof/>
                 <w:webHidden/>
               </w:rPr>
-              <w:t>30</w:t>
+              <w:t>31</w:t>
             </w:r>
             <w:r>
               <w:rPr>
@@ -3061,7 +3163,7 @@
               <w:noProof/>
             </w:rPr>
           </w:pPr>
-          <w:hyperlink w:anchor="_Toc235741253" w:history="1">
+          <w:hyperlink w:anchor="_Toc235800791" w:history="1">
             <w:r>
               <w:rPr>
                 <w:rStyle w:val="Hyperlink"/>
@@ -3089,7 +3191,7 @@
                 <w:noProof/>
                 <w:webHidden/>
               </w:rPr>
-              <w:instrText xml:space="preserve"> PAGEREF _Toc235741253 \h </w:instrText>
+              <w:instrText xml:space="preserve"> PAGEREF _Toc235800791 \h </w:instrText>
             </w:r>
             <w:r>
               <w:rPr>
@@ -3109,7 +3211,7 @@
                 <w:noProof/>
                 <w:webHidden/>
               </w:rPr>
-              <w:t>31</w:t>
+              <w:t>34</w:t>
             </w:r>
             <w:r>
               <w:rPr>
@@ -3131,7 +3233,7 @@
               <w:noProof/>
             </w:rPr>
           </w:pPr>
-          <w:hyperlink w:anchor="_Toc235741254" w:history="1">
+          <w:hyperlink w:anchor="_Toc235800792" w:history="1">
             <w:r>
               <w:rPr>
                 <w:rStyle w:val="Hyperlink"/>
@@ -3159,7 +3261,7 @@
                 <w:noProof/>
                 <w:webHidden/>
               </w:rPr>
-              <w:instrText xml:space="preserve"> PAGEREF _Toc235741254 \h </w:instrText>
+              <w:instrText xml:space="preserve"> PAGEREF _Toc235800792 \h </w:instrText>
             </w:r>
             <w:r>
               <w:rPr>
@@ -3179,7 +3281,7 @@
                 <w:noProof/>
                 <w:webHidden/>
               </w:rPr>
-              <w:t>32</w:t>
+              <w:t>35</w:t>
             </w:r>
             <w:r>
               <w:rPr>
@@ -3201,7 +3303,7 @@
               <w:noProof/>
             </w:rPr>
           </w:pPr>
-          <w:hyperlink w:anchor="_Toc235741255" w:history="1">
+          <w:hyperlink w:anchor="_Toc235800793" w:history="1">
             <w:r>
               <w:rPr>
                 <w:rStyle w:val="Hyperlink"/>
@@ -3229,7 +3331,7 @@
                 <w:noProof/>
                 <w:webHidden/>
               </w:rPr>
-              <w:instrText xml:space="preserve"> PAGEREF _Toc235741255 \h </w:instrText>
+              <w:instrText xml:space="preserve"> PAGEREF _Toc235800793 \h </w:instrText>
             </w:r>
             <w:r>
               <w:rPr>
@@ -3249,7 +3351,287 @@
                 <w:noProof/>
                 <w:webHidden/>
               </w:rPr>
-              <w:t>33</w:t>
+              <w:t>36</w:t>
+            </w:r>
+            <w:r>
+              <w:rPr>
+                <w:noProof/>
+                <w:webHidden/>
+              </w:rPr>
+              <w:fldChar w:fldCharType="end"/>
+            </w:r>
+          </w:hyperlink>
+        </w:p>
+        <w:p>
+          <w:pPr>
+            <w:pStyle w:val="TOC3"/>
+            <w:tabs>
+              <w:tab w:val="right" w:leader="dot" w:pos="9111"/>
+            </w:tabs>
+            <w:rPr>
+              <w:rFonts w:eastAsiaTheme="minorEastAsia"/>
+              <w:noProof/>
+            </w:rPr>
+          </w:pPr>
+          <w:hyperlink w:anchor="_Toc235800794" w:history="1">
+            <w:r>
+              <w:rPr>
+                <w:rStyle w:val="Hyperlink"/>
+                <w:rFonts w:ascii="Times New Roman" w:hAnsi="Times New Roman" w:cs="Times New Roman"/>
+                <w:noProof/>
+              </w:rPr>
+              <w:t>Kiến trúc tổng thể</w:t>
+            </w:r>
+            <w:r>
+              <w:rPr>
+                <w:noProof/>
+                <w:webHidden/>
+              </w:rPr>
+              <w:tab/>
+            </w:r>
+            <w:r>
+              <w:rPr>
+                <w:noProof/>
+                <w:webHidden/>
+              </w:rPr>
+              <w:fldChar w:fldCharType="begin"/>
+            </w:r>
+            <w:r>
+              <w:rPr>
+                <w:noProof/>
+                <w:webHidden/>
+              </w:rPr>
+              <w:instrText xml:space="preserve"> PAGEREF _Toc235800794 \h </w:instrText>
+            </w:r>
+            <w:r>
+              <w:rPr>
+                <w:noProof/>
+                <w:webHidden/>
+              </w:rPr>
+            </w:r>
+            <w:r>
+              <w:rPr>
+                <w:noProof/>
+                <w:webHidden/>
+              </w:rPr>
+              <w:fldChar w:fldCharType="separate"/>
+            </w:r>
+            <w:r>
+              <w:rPr>
+                <w:noProof/>
+                <w:webHidden/>
+              </w:rPr>
+              <w:t>36</w:t>
+            </w:r>
+            <w:r>
+              <w:rPr>
+                <w:noProof/>
+                <w:webHidden/>
+              </w:rPr>
+              <w:fldChar w:fldCharType="end"/>
+            </w:r>
+          </w:hyperlink>
+        </w:p>
+        <w:p>
+          <w:pPr>
+            <w:pStyle w:val="TOC3"/>
+            <w:tabs>
+              <w:tab w:val="right" w:leader="dot" w:pos="9111"/>
+            </w:tabs>
+            <w:rPr>
+              <w:rFonts w:eastAsiaTheme="minorEastAsia"/>
+              <w:noProof/>
+            </w:rPr>
+          </w:pPr>
+          <w:hyperlink w:anchor="_Toc235800795" w:history="1">
+            <w:r>
+              <w:rPr>
+                <w:rStyle w:val="Hyperlink"/>
+                <w:rFonts w:ascii="Times New Roman" w:hAnsi="Times New Roman" w:cs="Times New Roman"/>
+                <w:noProof/>
+              </w:rPr>
+              <w:t>Kiến trúc Modular</w:t>
+            </w:r>
+            <w:r>
+              <w:rPr>
+                <w:noProof/>
+                <w:webHidden/>
+              </w:rPr>
+              <w:tab/>
+            </w:r>
+            <w:r>
+              <w:rPr>
+                <w:noProof/>
+                <w:webHidden/>
+              </w:rPr>
+              <w:fldChar w:fldCharType="begin"/>
+            </w:r>
+            <w:r>
+              <w:rPr>
+                <w:noProof/>
+                <w:webHidden/>
+              </w:rPr>
+              <w:instrText xml:space="preserve"> PAGEREF _Toc235800795 \h </w:instrText>
+            </w:r>
+            <w:r>
+              <w:rPr>
+                <w:noProof/>
+                <w:webHidden/>
+              </w:rPr>
+            </w:r>
+            <w:r>
+              <w:rPr>
+                <w:noProof/>
+                <w:webHidden/>
+              </w:rPr>
+              <w:fldChar w:fldCharType="separate"/>
+            </w:r>
+            <w:r>
+              <w:rPr>
+                <w:noProof/>
+                <w:webHidden/>
+              </w:rPr>
+              <w:t>37</w:t>
+            </w:r>
+            <w:r>
+              <w:rPr>
+                <w:noProof/>
+                <w:webHidden/>
+              </w:rPr>
+              <w:fldChar w:fldCharType="end"/>
+            </w:r>
+          </w:hyperlink>
+        </w:p>
+        <w:p>
+          <w:pPr>
+            <w:pStyle w:val="TOC3"/>
+            <w:tabs>
+              <w:tab w:val="right" w:leader="dot" w:pos="9111"/>
+            </w:tabs>
+            <w:rPr>
+              <w:rFonts w:eastAsiaTheme="minorEastAsia"/>
+              <w:noProof/>
+            </w:rPr>
+          </w:pPr>
+          <w:hyperlink w:anchor="_Toc235800796" w:history="1">
+            <w:r>
+              <w:rPr>
+                <w:rStyle w:val="Hyperlink"/>
+                <w:rFonts w:ascii="Times New Roman" w:hAnsi="Times New Roman" w:cs="Times New Roman"/>
+                <w:noProof/>
+              </w:rPr>
+              <w:t>RESTful API</w:t>
+            </w:r>
+            <w:r>
+              <w:rPr>
+                <w:noProof/>
+                <w:webHidden/>
+              </w:rPr>
+              <w:tab/>
+            </w:r>
+            <w:r>
+              <w:rPr>
+                <w:noProof/>
+                <w:webHidden/>
+              </w:rPr>
+              <w:fldChar w:fldCharType="begin"/>
+            </w:r>
+            <w:r>
+              <w:rPr>
+                <w:noProof/>
+                <w:webHidden/>
+              </w:rPr>
+              <w:instrText xml:space="preserve"> PAGEREF _Toc235800796 \h </w:instrText>
+            </w:r>
+            <w:r>
+              <w:rPr>
+                <w:noProof/>
+                <w:webHidden/>
+              </w:rPr>
+            </w:r>
+            <w:r>
+              <w:rPr>
+                <w:noProof/>
+                <w:webHidden/>
+              </w:rPr>
+              <w:fldChar w:fldCharType="separate"/>
+            </w:r>
+            <w:r>
+              <w:rPr>
+                <w:noProof/>
+                <w:webHidden/>
+              </w:rPr>
+              <w:t>38</w:t>
+            </w:r>
+            <w:r>
+              <w:rPr>
+                <w:noProof/>
+                <w:webHidden/>
+              </w:rPr>
+              <w:fldChar w:fldCharType="end"/>
+            </w:r>
+          </w:hyperlink>
+        </w:p>
+        <w:p>
+          <w:pPr>
+            <w:pStyle w:val="TOC3"/>
+            <w:tabs>
+              <w:tab w:val="right" w:leader="dot" w:pos="9111"/>
+            </w:tabs>
+            <w:rPr>
+              <w:rFonts w:eastAsiaTheme="minorEastAsia"/>
+              <w:noProof/>
+            </w:rPr>
+          </w:pPr>
+          <w:hyperlink w:anchor="_Toc235800797" w:history="1">
+            <w:r>
+              <w:rPr>
+                <w:rStyle w:val="Hyperlink"/>
+                <w:rFonts w:ascii="Times New Roman" w:hAnsi="Times New Roman" w:cs="Times New Roman"/>
+                <w:noProof/>
+              </w:rPr>
+              <w:t>Luồng xử lý dữ liệu</w:t>
+            </w:r>
+            <w:r>
+              <w:rPr>
+                <w:noProof/>
+                <w:webHidden/>
+              </w:rPr>
+              <w:tab/>
+            </w:r>
+            <w:r>
+              <w:rPr>
+                <w:noProof/>
+                <w:webHidden/>
+              </w:rPr>
+              <w:fldChar w:fldCharType="begin"/>
+            </w:r>
+            <w:r>
+              <w:rPr>
+                <w:noProof/>
+                <w:webHidden/>
+              </w:rPr>
+              <w:instrText xml:space="preserve"> PAGEREF _Toc235800797 \h </w:instrText>
+            </w:r>
+            <w:r>
+              <w:rPr>
+                <w:noProof/>
+                <w:webHidden/>
+              </w:rPr>
+            </w:r>
+            <w:r>
+              <w:rPr>
+                <w:noProof/>
+                <w:webHidden/>
+              </w:rPr>
+              <w:fldChar w:fldCharType="separate"/>
+            </w:r>
+            <w:r>
+              <w:rPr>
+                <w:noProof/>
+                <w:webHidden/>
+              </w:rPr>
+              <w:t>38</w:t>
             </w:r>
             <w:r>
               <w:rPr>
@@ -3271,7 +3653,7 @@
               <w:noProof/>
             </w:rPr>
           </w:pPr>
-          <w:hyperlink w:anchor="_Toc235741256" w:history="1">
+          <w:hyperlink w:anchor="_Toc235800798" w:history="1">
             <w:r>
               <w:rPr>
                 <w:rStyle w:val="Hyperlink"/>
@@ -3299,7 +3681,7 @@
                 <w:noProof/>
                 <w:webHidden/>
               </w:rPr>
-              <w:instrText xml:space="preserve"> PAGEREF _Toc235741256 \h </w:instrText>
+              <w:instrText xml:space="preserve"> PAGEREF _Toc235800798 \h </w:instrText>
             </w:r>
             <w:r>
               <w:rPr>
@@ -3319,7 +3701,7 @@
                 <w:noProof/>
                 <w:webHidden/>
               </w:rPr>
-              <w:t>33</w:t>
+              <w:t>39</w:t>
             </w:r>
             <w:r>
               <w:rPr>
@@ -3341,7 +3723,7 @@
               <w:noProof/>
             </w:rPr>
           </w:pPr>
-          <w:hyperlink w:anchor="_Toc235741257" w:history="1">
+          <w:hyperlink w:anchor="_Toc235800799" w:history="1">
             <w:r>
               <w:rPr>
                 <w:rStyle w:val="Hyperlink"/>
@@ -3369,7 +3751,7 @@
                 <w:noProof/>
                 <w:webHidden/>
               </w:rPr>
-              <w:instrText xml:space="preserve"> PAGEREF _Toc235741257 \h </w:instrText>
+              <w:instrText xml:space="preserve"> PAGEREF _Toc235800799 \h </w:instrText>
             </w:r>
             <w:r>
               <w:rPr>
@@ -3389,7 +3771,7 @@
                 <w:noProof/>
                 <w:webHidden/>
               </w:rPr>
-              <w:t>34</w:t>
+              <w:t>44</w:t>
             </w:r>
             <w:r>
               <w:rPr>
@@ -3425,7 +3807,7 @@
       <w:r>
         <w:br w:type="page"/>
       </w:r>
-      <w:bookmarkStart w:id="5" w:name="_Toc235741220"/>
+      <w:bookmarkStart w:id="5" w:name="_Toc235800758"/>
       <w:r>
         <w:rPr>
           <w:rFonts w:ascii="Times New Roman" w:hAnsi="Times New Roman" w:cs="Times New Roman"/>
@@ -3470,7 +3852,7 @@
         </w:rPr>
         <w:fldChar w:fldCharType="separate"/>
       </w:r>
-      <w:hyperlink w:anchor="_Toc235777006" w:history="1">
+      <w:hyperlink w:anchor="_Toc235797430" w:history="1">
         <w:r>
           <w:rPr>
             <w:rStyle w:val="Hyperlink"/>
@@ -3498,7 +3880,7 @@
             <w:noProof/>
             <w:webHidden/>
           </w:rPr>
-          <w:instrText xml:space="preserve"> PAGEREF _Toc235777006 \h </w:instrText>
+          <w:instrText xml:space="preserve"> PAGEREF _Toc235797430 \h </w:instrText>
         </w:r>
         <w:r>
           <w:rPr>
@@ -3540,7 +3922,7 @@
           <w:noProof/>
         </w:rPr>
       </w:pPr>
-      <w:hyperlink w:anchor="_Toc235777007" w:history="1">
+      <w:hyperlink w:anchor="_Toc235797431" w:history="1">
         <w:r>
           <w:rPr>
             <w:rStyle w:val="Hyperlink"/>
@@ -3568,7 +3950,7 @@
             <w:noProof/>
             <w:webHidden/>
           </w:rPr>
-          <w:instrText xml:space="preserve"> PAGEREF _Toc235777007 \h </w:instrText>
+          <w:instrText xml:space="preserve"> PAGEREF _Toc235797431 \h </w:instrText>
         </w:r>
         <w:r>
           <w:rPr>
@@ -3610,7 +3992,7 @@
           <w:noProof/>
         </w:rPr>
       </w:pPr>
-      <w:hyperlink w:anchor="_Toc235777008" w:history="1">
+      <w:hyperlink w:anchor="_Toc235797432" w:history="1">
         <w:r>
           <w:rPr>
             <w:rStyle w:val="Hyperlink"/>
@@ -3638,7 +4020,7 @@
             <w:noProof/>
             <w:webHidden/>
           </w:rPr>
-          <w:instrText xml:space="preserve"> PAGEREF _Toc235777008 \h </w:instrText>
+          <w:instrText xml:space="preserve"> PAGEREF _Toc235797432 \h </w:instrText>
         </w:r>
         <w:r>
           <w:rPr>
@@ -3680,7 +4062,7 @@
           <w:noProof/>
         </w:rPr>
       </w:pPr>
-      <w:hyperlink w:anchor="_Toc235777009" w:history="1">
+      <w:hyperlink w:anchor="_Toc235797433" w:history="1">
         <w:r>
           <w:rPr>
             <w:rStyle w:val="Hyperlink"/>
@@ -3708,7 +4090,7 @@
             <w:noProof/>
             <w:webHidden/>
           </w:rPr>
-          <w:instrText xml:space="preserve"> PAGEREF _Toc235777009 \h </w:instrText>
+          <w:instrText xml:space="preserve"> PAGEREF _Toc235797433 \h </w:instrText>
         </w:r>
         <w:r>
           <w:rPr>
@@ -3750,7 +4132,7 @@
           <w:noProof/>
         </w:rPr>
       </w:pPr>
-      <w:hyperlink w:anchor="_Toc235777010" w:history="1">
+      <w:hyperlink w:anchor="_Toc235797434" w:history="1">
         <w:r>
           <w:rPr>
             <w:rStyle w:val="Hyperlink"/>
@@ -3778,7 +4160,7 @@
             <w:noProof/>
             <w:webHidden/>
           </w:rPr>
-          <w:instrText xml:space="preserve"> PAGEREF _Toc235777010 \h </w:instrText>
+          <w:instrText xml:space="preserve"> PAGEREF _Toc235797434 \h </w:instrText>
         </w:r>
         <w:r>
           <w:rPr>
@@ -3820,7 +4202,7 @@
           <w:noProof/>
         </w:rPr>
       </w:pPr>
-      <w:hyperlink w:anchor="_Toc235777011" w:history="1">
+      <w:hyperlink w:anchor="_Toc235797435" w:history="1">
         <w:r>
           <w:rPr>
             <w:rStyle w:val="Hyperlink"/>
@@ -3848,7 +4230,7 @@
             <w:noProof/>
             <w:webHidden/>
           </w:rPr>
-          <w:instrText xml:space="preserve"> PAGEREF _Toc235777011 \h </w:instrText>
+          <w:instrText xml:space="preserve"> PAGEREF _Toc235797435 \h </w:instrText>
         </w:r>
         <w:r>
           <w:rPr>
@@ -3890,7 +4272,7 @@
           <w:noProof/>
         </w:rPr>
       </w:pPr>
-      <w:hyperlink w:anchor="_Toc235777012" w:history="1">
+      <w:hyperlink w:anchor="_Toc235797436" w:history="1">
         <w:r>
           <w:rPr>
             <w:rStyle w:val="Hyperlink"/>
@@ -3918,7 +4300,7 @@
             <w:noProof/>
             <w:webHidden/>
           </w:rPr>
-          <w:instrText xml:space="preserve"> PAGEREF _Toc235777012 \h </w:instrText>
+          <w:instrText xml:space="preserve"> PAGEREF _Toc235797436 \h </w:instrText>
         </w:r>
         <w:r>
           <w:rPr>
@@ -3960,7 +4342,7 @@
           <w:noProof/>
         </w:rPr>
       </w:pPr>
-      <w:hyperlink w:anchor="_Toc235777013" w:history="1">
+      <w:hyperlink w:anchor="_Toc235797437" w:history="1">
         <w:r>
           <w:rPr>
             <w:rStyle w:val="Hyperlink"/>
@@ -3988,7 +4370,7 @@
             <w:noProof/>
             <w:webHidden/>
           </w:rPr>
-          <w:instrText xml:space="preserve"> PAGEREF _Toc235777013 \h </w:instrText>
+          <w:instrText xml:space="preserve"> PAGEREF _Toc235797437 \h </w:instrText>
         </w:r>
         <w:r>
           <w:rPr>
@@ -4030,7 +4412,7 @@
           <w:noProof/>
         </w:rPr>
       </w:pPr>
-      <w:hyperlink w:anchor="_Toc235777014" w:history="1">
+      <w:hyperlink w:anchor="_Toc235797438" w:history="1">
         <w:r>
           <w:rPr>
             <w:rStyle w:val="Hyperlink"/>
@@ -4058,7 +4440,7 @@
             <w:noProof/>
             <w:webHidden/>
           </w:rPr>
-          <w:instrText xml:space="preserve"> PAGEREF _Toc235777014 \h </w:instrText>
+          <w:instrText xml:space="preserve"> PAGEREF _Toc235797438 \h </w:instrText>
         </w:r>
         <w:r>
           <w:rPr>
@@ -4100,7 +4482,7 @@
           <w:noProof/>
         </w:rPr>
       </w:pPr>
-      <w:hyperlink w:anchor="_Toc235777015" w:history="1">
+      <w:hyperlink w:anchor="_Toc235797439" w:history="1">
         <w:r>
           <w:rPr>
             <w:rStyle w:val="Hyperlink"/>
@@ -4128,7 +4510,7 @@
             <w:noProof/>
             <w:webHidden/>
           </w:rPr>
-          <w:instrText xml:space="preserve"> PAGEREF _Toc235777015 \h </w:instrText>
+          <w:instrText xml:space="preserve"> PAGEREF _Toc235797439 \h </w:instrText>
         </w:r>
         <w:r>
           <w:rPr>
@@ -4170,7 +4552,7 @@
           <w:noProof/>
         </w:rPr>
       </w:pPr>
-      <w:hyperlink w:anchor="_Toc235777016" w:history="1">
+      <w:hyperlink w:anchor="_Toc235797440" w:history="1">
         <w:r>
           <w:rPr>
             <w:rStyle w:val="Hyperlink"/>
@@ -4198,7 +4580,7 @@
             <w:noProof/>
             <w:webHidden/>
           </w:rPr>
-          <w:instrText xml:space="preserve"> PAGEREF _Toc235777016 \h </w:instrText>
+          <w:instrText xml:space="preserve"> PAGEREF _Toc235797440 \h </w:instrText>
         </w:r>
         <w:r>
           <w:rPr>
@@ -4240,7 +4622,7 @@
           <w:noProof/>
         </w:rPr>
       </w:pPr>
-      <w:hyperlink r:id="rId9" w:anchor="_Toc235777017" w:history="1">
+      <w:hyperlink r:id="rId9" w:anchor="_Toc235797441" w:history="1">
         <w:r>
           <w:rPr>
             <w:rStyle w:val="Hyperlink"/>
@@ -4268,7 +4650,7 @@
             <w:noProof/>
             <w:webHidden/>
           </w:rPr>
-          <w:instrText xml:space="preserve"> PAGEREF _Toc235777017 \h </w:instrText>
+          <w:instrText xml:space="preserve"> PAGEREF _Toc235797441 \h </w:instrText>
         </w:r>
         <w:r>
           <w:rPr>
@@ -4310,7 +4692,7 @@
           <w:noProof/>
         </w:rPr>
       </w:pPr>
-      <w:hyperlink w:anchor="_Toc235777018" w:history="1">
+      <w:hyperlink w:anchor="_Toc235797442" w:history="1">
         <w:r>
           <w:rPr>
             <w:rStyle w:val="Hyperlink"/>
@@ -4338,7 +4720,7 @@
             <w:noProof/>
             <w:webHidden/>
           </w:rPr>
-          <w:instrText xml:space="preserve"> PAGEREF _Toc235777018 \h </w:instrText>
+          <w:instrText xml:space="preserve"> PAGEREF _Toc235797442 \h </w:instrText>
         </w:r>
         <w:r>
           <w:rPr>
@@ -4380,7 +4762,7 @@
           <w:noProof/>
         </w:rPr>
       </w:pPr>
-      <w:hyperlink w:anchor="_Toc235777019" w:history="1">
+      <w:hyperlink w:anchor="_Toc235797443" w:history="1">
         <w:r>
           <w:rPr>
             <w:rStyle w:val="Hyperlink"/>
@@ -4408,7 +4790,7 @@
             <w:noProof/>
             <w:webHidden/>
           </w:rPr>
-          <w:instrText xml:space="preserve"> PAGEREF _Toc235777019 \h </w:instrText>
+          <w:instrText xml:space="preserve"> PAGEREF _Toc235797443 \h </w:instrText>
         </w:r>
         <w:r>
           <w:rPr>
@@ -4450,7 +4832,7 @@
           <w:noProof/>
         </w:rPr>
       </w:pPr>
-      <w:hyperlink w:anchor="_Toc235777020" w:history="1">
+      <w:hyperlink w:anchor="_Toc235797444" w:history="1">
         <w:r>
           <w:rPr>
             <w:rStyle w:val="Hyperlink"/>
@@ -4478,7 +4860,7 @@
             <w:noProof/>
             <w:webHidden/>
           </w:rPr>
-          <w:instrText xml:space="preserve"> PAGEREF _Toc235777020 \h </w:instrText>
+          <w:instrText xml:space="preserve"> PAGEREF _Toc235797444 \h </w:instrText>
         </w:r>
         <w:r>
           <w:rPr>
@@ -4520,7 +4902,7 @@
           <w:noProof/>
         </w:rPr>
       </w:pPr>
-      <w:hyperlink w:anchor="_Toc235777021" w:history="1">
+      <w:hyperlink w:anchor="_Toc235797445" w:history="1">
         <w:r>
           <w:rPr>
             <w:rStyle w:val="Hyperlink"/>
@@ -4548,7 +4930,7 @@
             <w:noProof/>
             <w:webHidden/>
           </w:rPr>
-          <w:instrText xml:space="preserve"> PAGEREF _Toc235777021 \h </w:instrText>
+          <w:instrText xml:space="preserve"> PAGEREF _Toc235797445 \h </w:instrText>
         </w:r>
         <w:r>
           <w:rPr>
@@ -4578,48 +4960,6 @@
           <w:fldChar w:fldCharType="end"/>
         </w:r>
       </w:hyperlink>
-    </w:p>
-    <w:p>
-      <w:pPr>
-        <w:rPr>
-          <w:rFonts w:ascii="Times New Roman" w:hAnsi="Times New Roman" w:cs="Times New Roman"/>
-          <w:sz w:val="26"/>
-          <w:szCs w:val="26"/>
-        </w:rPr>
-      </w:pPr>
-      <w:r>
-        <w:rPr>
-          <w:rFonts w:ascii="Times New Roman" w:hAnsi="Times New Roman" w:cs="Times New Roman"/>
-          <w:sz w:val="26"/>
-          <w:szCs w:val="26"/>
-        </w:rPr>
-        <w:fldChar w:fldCharType="end"/>
-      </w:r>
-      <w:r>
-        <w:rPr>
-          <w:rFonts w:ascii="Times New Roman" w:hAnsi="Times New Roman" w:cs="Times New Roman"/>
-          <w:sz w:val="26"/>
-          <w:szCs w:val="26"/>
-        </w:rPr>
-        <w:br w:type="page"/>
-      </w:r>
-    </w:p>
-    <w:p>
-      <w:pPr>
-        <w:pStyle w:val="Heading1"/>
-        <w:rPr>
-          <w:rFonts w:ascii="Times New Roman" w:hAnsi="Times New Roman" w:cs="Times New Roman"/>
-        </w:rPr>
-      </w:pPr>
-      <w:bookmarkStart w:id="6" w:name="_Toc235741221"/>
-      <w:r>
-        <w:rPr>
-          <w:rFonts w:ascii="Times New Roman" w:hAnsi="Times New Roman" w:cs="Times New Roman"/>
-        </w:rPr>
-        <w:lastRenderedPageBreak/>
-        <w:t>DANH MỤC BẢNG</w:t>
-      </w:r>
-      <w:bookmarkEnd w:id="6"/>
     </w:p>
     <w:p>
       <w:pPr>
@@ -4632,38 +4972,14 @@
           <w:noProof/>
         </w:rPr>
       </w:pPr>
-      <w:r>
-        <w:rPr>
-          <w:rFonts w:ascii="Times New Roman" w:hAnsi="Times New Roman" w:cs="Times New Roman"/>
-          <w:sz w:val="26"/>
-          <w:szCs w:val="26"/>
-        </w:rPr>
-        <w:fldChar w:fldCharType="begin"/>
-      </w:r>
-      <w:r>
-        <w:rPr>
-          <w:rFonts w:ascii="Times New Roman" w:hAnsi="Times New Roman" w:cs="Times New Roman"/>
-          <w:sz w:val="26"/>
-          <w:szCs w:val="26"/>
-        </w:rPr>
-        <w:instrText xml:space="preserve"> TOC \h \z \c "Bảng" </w:instrText>
-      </w:r>
-      <w:r>
-        <w:rPr>
-          <w:rFonts w:ascii="Times New Roman" w:hAnsi="Times New Roman" w:cs="Times New Roman"/>
-          <w:sz w:val="26"/>
-          <w:szCs w:val="26"/>
-        </w:rPr>
-        <w:fldChar w:fldCharType="separate"/>
-      </w:r>
-      <w:hyperlink w:anchor="_Toc235770271" w:history="1">
+      <w:hyperlink w:anchor="_Toc235797446" w:history="1">
         <w:r>
           <w:rPr>
             <w:rStyle w:val="Hyperlink"/>
             <w:rFonts w:ascii="Times New Roman" w:hAnsi="Times New Roman" w:cs="Times New Roman"/>
             <w:noProof/>
           </w:rPr>
-          <w:t>Bảng 1: Bảng so sánh HubSpot và Bizfly</w:t>
+          <w:t>Hình 17: Wireframe đăng nhập hệ thống</w:t>
         </w:r>
         <w:r>
           <w:rPr>
@@ -4684,7 +5000,7 @@
             <w:noProof/>
             <w:webHidden/>
           </w:rPr>
-          <w:instrText xml:space="preserve"> PAGEREF _Toc235770271 \h </w:instrText>
+          <w:instrText xml:space="preserve"> PAGEREF _Toc235797446 \h </w:instrText>
         </w:r>
         <w:r>
           <w:rPr>
@@ -4704,7 +5020,7 @@
             <w:noProof/>
             <w:webHidden/>
           </w:rPr>
-          <w:t>15</w:t>
+          <w:t>39</w:t>
         </w:r>
         <w:r>
           <w:rPr>
@@ -4726,14 +5042,14 @@
           <w:noProof/>
         </w:rPr>
       </w:pPr>
-      <w:hyperlink w:anchor="_Toc235770272" w:history="1">
+      <w:hyperlink w:anchor="_Toc235797447" w:history="1">
         <w:r>
           <w:rPr>
             <w:rStyle w:val="Hyperlink"/>
             <w:rFonts w:ascii="Times New Roman" w:hAnsi="Times New Roman" w:cs="Times New Roman"/>
             <w:noProof/>
           </w:rPr>
-          <w:t>Bảng 2: UC1: Đăng nhập hệ thống</w:t>
+          <w:t>Hình 18: Giao diện Dashboard tổng quan</w:t>
         </w:r>
         <w:r>
           <w:rPr>
@@ -4754,7 +5070,7 @@
             <w:noProof/>
             <w:webHidden/>
           </w:rPr>
-          <w:instrText xml:space="preserve"> PAGEREF _Toc235770272 \h </w:instrText>
+          <w:instrText xml:space="preserve"> PAGEREF _Toc235797447 \h </w:instrText>
         </w:r>
         <w:r>
           <w:rPr>
@@ -4774,7 +5090,7 @@
             <w:noProof/>
             <w:webHidden/>
           </w:rPr>
-          <w:t>24</w:t>
+          <w:t>39</w:t>
         </w:r>
         <w:r>
           <w:rPr>
@@ -4796,14 +5112,14 @@
           <w:noProof/>
         </w:rPr>
       </w:pPr>
-      <w:hyperlink w:anchor="_Toc235770273" w:history="1">
+      <w:hyperlink w:anchor="_Toc235797448" w:history="1">
         <w:r>
           <w:rPr>
             <w:rStyle w:val="Hyperlink"/>
             <w:rFonts w:ascii="Times New Roman" w:hAnsi="Times New Roman" w:cs="Times New Roman"/>
             <w:noProof/>
           </w:rPr>
-          <w:t>Bảng 3: UC2:Quản lý Lead</w:t>
+          <w:t>Hình 19: Dashboard doanh thu bán hàng theo từng năm</w:t>
         </w:r>
         <w:r>
           <w:rPr>
@@ -4824,7 +5140,7 @@
             <w:noProof/>
             <w:webHidden/>
           </w:rPr>
-          <w:instrText xml:space="preserve"> PAGEREF _Toc235770273 \h </w:instrText>
+          <w:instrText xml:space="preserve"> PAGEREF _Toc235797448 \h </w:instrText>
         </w:r>
         <w:r>
           <w:rPr>
@@ -4844,7 +5160,7 @@
             <w:noProof/>
             <w:webHidden/>
           </w:rPr>
-          <w:t>24</w:t>
+          <w:t>40</w:t>
         </w:r>
         <w:r>
           <w:rPr>
@@ -4866,14 +5182,14 @@
           <w:noProof/>
         </w:rPr>
       </w:pPr>
-      <w:hyperlink w:anchor="_Toc235770274" w:history="1">
+      <w:hyperlink w:anchor="_Toc235797449" w:history="1">
         <w:r>
           <w:rPr>
             <w:rStyle w:val="Hyperlink"/>
             <w:rFonts w:ascii="Times New Roman" w:hAnsi="Times New Roman" w:cs="Times New Roman"/>
             <w:noProof/>
           </w:rPr>
-          <w:t>Bảng 4: UC3: Chuyển Lead thành Customer</w:t>
+          <w:t>Hình 20: Dashboard tổng quan các Deal theo giai đoạn và tổng giá trị của Pipeline</w:t>
         </w:r>
         <w:r>
           <w:rPr>
@@ -4894,7 +5210,7 @@
             <w:noProof/>
             <w:webHidden/>
           </w:rPr>
-          <w:instrText xml:space="preserve"> PAGEREF _Toc235770274 \h </w:instrText>
+          <w:instrText xml:space="preserve"> PAGEREF _Toc235797449 \h </w:instrText>
         </w:r>
         <w:r>
           <w:rPr>
@@ -4914,7 +5230,7 @@
             <w:noProof/>
             <w:webHidden/>
           </w:rPr>
-          <w:t>25</w:t>
+          <w:t>40</w:t>
         </w:r>
         <w:r>
           <w:rPr>
@@ -4936,14 +5252,14 @@
           <w:noProof/>
         </w:rPr>
       </w:pPr>
-      <w:hyperlink w:anchor="_Toc235770275" w:history="1">
+      <w:hyperlink w:anchor="_Toc235797450" w:history="1">
         <w:r>
           <w:rPr>
             <w:rStyle w:val="Hyperlink"/>
             <w:rFonts w:ascii="Times New Roman" w:hAnsi="Times New Roman" w:cs="Times New Roman"/>
             <w:noProof/>
           </w:rPr>
-          <w:t>Bảng 5: UC4: Quản lý Deal</w:t>
+          <w:t>Hình 21: Các chỉ số thống kê Lead</w:t>
         </w:r>
         <w:r>
           <w:rPr>
@@ -4964,7 +5280,7 @@
             <w:noProof/>
             <w:webHidden/>
           </w:rPr>
-          <w:instrText xml:space="preserve"> PAGEREF _Toc235770275 \h </w:instrText>
+          <w:instrText xml:space="preserve"> PAGEREF _Toc235797450 \h </w:instrText>
         </w:r>
         <w:r>
           <w:rPr>
@@ -4984,7 +5300,7 @@
             <w:noProof/>
             <w:webHidden/>
           </w:rPr>
-          <w:t>25</w:t>
+          <w:t>41</w:t>
         </w:r>
         <w:r>
           <w:rPr>
@@ -5006,14 +5322,14 @@
           <w:noProof/>
         </w:rPr>
       </w:pPr>
-      <w:hyperlink w:anchor="_Toc235770276" w:history="1">
+      <w:hyperlink w:anchor="_Toc235797451" w:history="1">
         <w:r>
           <w:rPr>
             <w:rStyle w:val="Hyperlink"/>
             <w:rFonts w:ascii="Times New Roman" w:hAnsi="Times New Roman" w:cs="Times New Roman"/>
             <w:noProof/>
           </w:rPr>
-          <w:t>Bảng 6: UC5: Phân công Deal</w:t>
+          <w:t>Hình 22: Danh sách Lead</w:t>
         </w:r>
         <w:r>
           <w:rPr>
@@ -5034,7 +5350,7 @@
             <w:noProof/>
             <w:webHidden/>
           </w:rPr>
-          <w:instrText xml:space="preserve"> PAGEREF _Toc235770276 \h </w:instrText>
+          <w:instrText xml:space="preserve"> PAGEREF _Toc235797451 \h </w:instrText>
         </w:r>
         <w:r>
           <w:rPr>
@@ -5054,7 +5370,7 @@
             <w:noProof/>
             <w:webHidden/>
           </w:rPr>
-          <w:t>25</w:t>
+          <w:t>41</w:t>
         </w:r>
         <w:r>
           <w:rPr>
@@ -5076,14 +5392,14 @@
           <w:noProof/>
         </w:rPr>
       </w:pPr>
-      <w:hyperlink w:anchor="_Toc235770277" w:history="1">
+      <w:hyperlink w:anchor="_Toc235797452" w:history="1">
         <w:r>
           <w:rPr>
             <w:rStyle w:val="Hyperlink"/>
             <w:rFonts w:ascii="Times New Roman" w:hAnsi="Times New Roman" w:cs="Times New Roman"/>
             <w:noProof/>
           </w:rPr>
-          <w:t>Bảng 7: UC6: Thay đổi trạng thái Pipeline</w:t>
+          <w:t>Hình 23: Giao diện quản lý Deal</w:t>
         </w:r>
         <w:r>
           <w:rPr>
@@ -5104,7 +5420,7 @@
             <w:noProof/>
             <w:webHidden/>
           </w:rPr>
-          <w:instrText xml:space="preserve"> PAGEREF _Toc235770277 \h </w:instrText>
+          <w:instrText xml:space="preserve"> PAGEREF _Toc235797452 \h </w:instrText>
         </w:r>
         <w:r>
           <w:rPr>
@@ -5124,7 +5440,7 @@
             <w:noProof/>
             <w:webHidden/>
           </w:rPr>
-          <w:t>26</w:t>
+          <w:t>42</w:t>
         </w:r>
         <w:r>
           <w:rPr>
@@ -5146,14 +5462,14 @@
           <w:noProof/>
         </w:rPr>
       </w:pPr>
-      <w:hyperlink w:anchor="_Toc235770278" w:history="1">
+      <w:hyperlink w:anchor="_Toc235797453" w:history="1">
         <w:r>
           <w:rPr>
             <w:rStyle w:val="Hyperlink"/>
             <w:rFonts w:ascii="Times New Roman" w:hAnsi="Times New Roman" w:cs="Times New Roman"/>
             <w:noProof/>
           </w:rPr>
-          <w:t>Bảng 8: UC7: Tạo Quote</w:t>
+          <w:t>Hình 24: Tổng quan quan lý người dùng</w:t>
         </w:r>
         <w:r>
           <w:rPr>
@@ -5174,7 +5490,7 @@
             <w:noProof/>
             <w:webHidden/>
           </w:rPr>
-          <w:instrText xml:space="preserve"> PAGEREF _Toc235770278 \h </w:instrText>
+          <w:instrText xml:space="preserve"> PAGEREF _Toc235797453 \h </w:instrText>
         </w:r>
         <w:r>
           <w:rPr>
@@ -5194,7 +5510,7 @@
             <w:noProof/>
             <w:webHidden/>
           </w:rPr>
-          <w:t>26</w:t>
+          <w:t>42</w:t>
         </w:r>
         <w:r>
           <w:rPr>
@@ -5216,14 +5532,14 @@
           <w:noProof/>
         </w:rPr>
       </w:pPr>
-      <w:hyperlink w:anchor="_Toc235770279" w:history="1">
+      <w:hyperlink w:anchor="_Toc235797454" w:history="1">
         <w:r>
           <w:rPr>
             <w:rStyle w:val="Hyperlink"/>
             <w:rFonts w:ascii="Times New Roman" w:hAnsi="Times New Roman" w:cs="Times New Roman"/>
             <w:noProof/>
           </w:rPr>
-          <w:t>Bảng 9: UC8: Quản lý Task</w:t>
+          <w:t>Hình 25: Danh sách người dùng</w:t>
         </w:r>
         <w:r>
           <w:rPr>
@@ -5244,7 +5560,7 @@
             <w:noProof/>
             <w:webHidden/>
           </w:rPr>
-          <w:instrText xml:space="preserve"> PAGEREF _Toc235770279 \h </w:instrText>
+          <w:instrText xml:space="preserve"> PAGEREF _Toc235797454 \h </w:instrText>
         </w:r>
         <w:r>
           <w:rPr>
@@ -5264,7 +5580,7 @@
             <w:noProof/>
             <w:webHidden/>
           </w:rPr>
-          <w:t>27</w:t>
+          <w:t>43</w:t>
         </w:r>
         <w:r>
           <w:rPr>
@@ -5274,6 +5590,48 @@
           <w:fldChar w:fldCharType="end"/>
         </w:r>
       </w:hyperlink>
+    </w:p>
+    <w:p>
+      <w:pPr>
+        <w:rPr>
+          <w:rFonts w:ascii="Times New Roman" w:hAnsi="Times New Roman" w:cs="Times New Roman"/>
+          <w:sz w:val="26"/>
+          <w:szCs w:val="26"/>
+        </w:rPr>
+      </w:pPr>
+      <w:r>
+        <w:rPr>
+          <w:rFonts w:ascii="Times New Roman" w:hAnsi="Times New Roman" w:cs="Times New Roman"/>
+          <w:sz w:val="26"/>
+          <w:szCs w:val="26"/>
+        </w:rPr>
+        <w:fldChar w:fldCharType="end"/>
+      </w:r>
+      <w:r>
+        <w:rPr>
+          <w:rFonts w:ascii="Times New Roman" w:hAnsi="Times New Roman" w:cs="Times New Roman"/>
+          <w:sz w:val="26"/>
+          <w:szCs w:val="26"/>
+        </w:rPr>
+        <w:br w:type="page"/>
+      </w:r>
+    </w:p>
+    <w:p>
+      <w:pPr>
+        <w:pStyle w:val="Heading1"/>
+        <w:rPr>
+          <w:rFonts w:ascii="Times New Roman" w:hAnsi="Times New Roman" w:cs="Times New Roman"/>
+        </w:rPr>
+      </w:pPr>
+      <w:bookmarkStart w:id="6" w:name="_Toc235800759"/>
+      <w:r>
+        <w:rPr>
+          <w:rFonts w:ascii="Times New Roman" w:hAnsi="Times New Roman" w:cs="Times New Roman"/>
+        </w:rPr>
+        <w:lastRenderedPageBreak/>
+        <w:t>DANH MỤC BẢNG</w:t>
+      </w:r>
+      <w:bookmarkEnd w:id="6"/>
     </w:p>
     <w:p>
       <w:pPr>
@@ -5286,14 +5644,38 @@
           <w:noProof/>
         </w:rPr>
       </w:pPr>
-      <w:hyperlink w:anchor="_Toc235770280" w:history="1">
+      <w:r>
+        <w:rPr>
+          <w:rFonts w:ascii="Times New Roman" w:hAnsi="Times New Roman" w:cs="Times New Roman"/>
+          <w:sz w:val="26"/>
+          <w:szCs w:val="26"/>
+        </w:rPr>
+        <w:fldChar w:fldCharType="begin"/>
+      </w:r>
+      <w:r>
+        <w:rPr>
+          <w:rFonts w:ascii="Times New Roman" w:hAnsi="Times New Roman" w:cs="Times New Roman"/>
+          <w:sz w:val="26"/>
+          <w:szCs w:val="26"/>
+        </w:rPr>
+        <w:instrText xml:space="preserve"> TOC \h \z \c "Bảng" </w:instrText>
+      </w:r>
+      <w:r>
+        <w:rPr>
+          <w:rFonts w:ascii="Times New Roman" w:hAnsi="Times New Roman" w:cs="Times New Roman"/>
+          <w:sz w:val="26"/>
+          <w:szCs w:val="26"/>
+        </w:rPr>
+        <w:fldChar w:fldCharType="separate"/>
+      </w:r>
+      <w:hyperlink w:anchor="_Toc235797455" w:history="1">
         <w:r>
           <w:rPr>
             <w:rStyle w:val="Hyperlink"/>
             <w:rFonts w:ascii="Times New Roman" w:hAnsi="Times New Roman" w:cs="Times New Roman"/>
             <w:noProof/>
           </w:rPr>
-          <w:t>Bảng 10: UC9: Dashboard</w:t>
+          <w:t>Bảng 1: Bảng so sánh HubSpot và Bizfly</w:t>
         </w:r>
         <w:r>
           <w:rPr>
@@ -5314,7 +5696,7 @@
             <w:noProof/>
             <w:webHidden/>
           </w:rPr>
-          <w:instrText xml:space="preserve"> PAGEREF _Toc235770280 \h </w:instrText>
+          <w:instrText xml:space="preserve"> PAGEREF _Toc235797455 \h </w:instrText>
         </w:r>
         <w:r>
           <w:rPr>
@@ -5334,7 +5716,7 @@
             <w:noProof/>
             <w:webHidden/>
           </w:rPr>
-          <w:t>27</w:t>
+          <w:t>15</w:t>
         </w:r>
         <w:r>
           <w:rPr>
@@ -5356,14 +5738,14 @@
           <w:noProof/>
         </w:rPr>
       </w:pPr>
-      <w:hyperlink w:anchor="_Toc235770281" w:history="1">
+      <w:hyperlink w:anchor="_Toc235797456" w:history="1">
         <w:r>
           <w:rPr>
             <w:rStyle w:val="Hyperlink"/>
             <w:rFonts w:ascii="Times New Roman" w:hAnsi="Times New Roman" w:cs="Times New Roman"/>
             <w:noProof/>
           </w:rPr>
-          <w:t>Bảng 11: UC10: Xem Activity Log</w:t>
+          <w:t>Bảng 2: UC1: Đăng nhập hệ thống</w:t>
         </w:r>
         <w:r>
           <w:rPr>
@@ -5384,7 +5766,7 @@
             <w:noProof/>
             <w:webHidden/>
           </w:rPr>
-          <w:instrText xml:space="preserve"> PAGEREF _Toc235770281 \h </w:instrText>
+          <w:instrText xml:space="preserve"> PAGEREF _Toc235797456 \h </w:instrText>
         </w:r>
         <w:r>
           <w:rPr>
@@ -5404,7 +5786,7 @@
             <w:noProof/>
             <w:webHidden/>
           </w:rPr>
-          <w:t>27</w:t>
+          <w:t>24</w:t>
         </w:r>
         <w:r>
           <w:rPr>
@@ -5426,13 +5808,643 @@
           <w:noProof/>
         </w:rPr>
       </w:pPr>
-      <w:hyperlink w:anchor="_Toc235770282" w:history="1">
+      <w:hyperlink w:anchor="_Toc235797457" w:history="1">
         <w:r>
           <w:rPr>
             <w:rStyle w:val="Hyperlink"/>
             <w:rFonts w:ascii="Times New Roman" w:hAnsi="Times New Roman" w:cs="Times New Roman"/>
             <w:noProof/>
           </w:rPr>
+          <w:t>Bảng 3: UC2:Quản lý Lead</w:t>
+        </w:r>
+        <w:r>
+          <w:rPr>
+            <w:noProof/>
+            <w:webHidden/>
+          </w:rPr>
+          <w:tab/>
+        </w:r>
+        <w:r>
+          <w:rPr>
+            <w:noProof/>
+            <w:webHidden/>
+          </w:rPr>
+          <w:fldChar w:fldCharType="begin"/>
+        </w:r>
+        <w:r>
+          <w:rPr>
+            <w:noProof/>
+            <w:webHidden/>
+          </w:rPr>
+          <w:instrText xml:space="preserve"> PAGEREF _Toc235797457 \h </w:instrText>
+        </w:r>
+        <w:r>
+          <w:rPr>
+            <w:noProof/>
+            <w:webHidden/>
+          </w:rPr>
+        </w:r>
+        <w:r>
+          <w:rPr>
+            <w:noProof/>
+            <w:webHidden/>
+          </w:rPr>
+          <w:fldChar w:fldCharType="separate"/>
+        </w:r>
+        <w:r>
+          <w:rPr>
+            <w:noProof/>
+            <w:webHidden/>
+          </w:rPr>
+          <w:t>24</w:t>
+        </w:r>
+        <w:r>
+          <w:rPr>
+            <w:noProof/>
+            <w:webHidden/>
+          </w:rPr>
+          <w:fldChar w:fldCharType="end"/>
+        </w:r>
+      </w:hyperlink>
+    </w:p>
+    <w:p>
+      <w:pPr>
+        <w:pStyle w:val="TableofFigures"/>
+        <w:tabs>
+          <w:tab w:val="right" w:leader="dot" w:pos="9111"/>
+        </w:tabs>
+        <w:rPr>
+          <w:rFonts w:eastAsiaTheme="minorEastAsia"/>
+          <w:noProof/>
+        </w:rPr>
+      </w:pPr>
+      <w:hyperlink w:anchor="_Toc235797458" w:history="1">
+        <w:r>
+          <w:rPr>
+            <w:rStyle w:val="Hyperlink"/>
+            <w:rFonts w:ascii="Times New Roman" w:hAnsi="Times New Roman" w:cs="Times New Roman"/>
+            <w:noProof/>
+          </w:rPr>
+          <w:t>Bảng 4: UC3: Chuyển Lead thành Customer</w:t>
+        </w:r>
+        <w:r>
+          <w:rPr>
+            <w:noProof/>
+            <w:webHidden/>
+          </w:rPr>
+          <w:tab/>
+        </w:r>
+        <w:r>
+          <w:rPr>
+            <w:noProof/>
+            <w:webHidden/>
+          </w:rPr>
+          <w:fldChar w:fldCharType="begin"/>
+        </w:r>
+        <w:r>
+          <w:rPr>
+            <w:noProof/>
+            <w:webHidden/>
+          </w:rPr>
+          <w:instrText xml:space="preserve"> PAGEREF _Toc235797458 \h </w:instrText>
+        </w:r>
+        <w:r>
+          <w:rPr>
+            <w:noProof/>
+            <w:webHidden/>
+          </w:rPr>
+        </w:r>
+        <w:r>
+          <w:rPr>
+            <w:noProof/>
+            <w:webHidden/>
+          </w:rPr>
+          <w:fldChar w:fldCharType="separate"/>
+        </w:r>
+        <w:r>
+          <w:rPr>
+            <w:noProof/>
+            <w:webHidden/>
+          </w:rPr>
+          <w:t>25</w:t>
+        </w:r>
+        <w:r>
+          <w:rPr>
+            <w:noProof/>
+            <w:webHidden/>
+          </w:rPr>
+          <w:fldChar w:fldCharType="end"/>
+        </w:r>
+      </w:hyperlink>
+    </w:p>
+    <w:p>
+      <w:pPr>
+        <w:pStyle w:val="TableofFigures"/>
+        <w:tabs>
+          <w:tab w:val="right" w:leader="dot" w:pos="9111"/>
+        </w:tabs>
+        <w:rPr>
+          <w:rFonts w:eastAsiaTheme="minorEastAsia"/>
+          <w:noProof/>
+        </w:rPr>
+      </w:pPr>
+      <w:hyperlink w:anchor="_Toc235797459" w:history="1">
+        <w:r>
+          <w:rPr>
+            <w:rStyle w:val="Hyperlink"/>
+            <w:rFonts w:ascii="Times New Roman" w:hAnsi="Times New Roman" w:cs="Times New Roman"/>
+            <w:noProof/>
+          </w:rPr>
+          <w:t>Bảng 5: UC4: Quản lý Deal</w:t>
+        </w:r>
+        <w:r>
+          <w:rPr>
+            <w:noProof/>
+            <w:webHidden/>
+          </w:rPr>
+          <w:tab/>
+        </w:r>
+        <w:r>
+          <w:rPr>
+            <w:noProof/>
+            <w:webHidden/>
+          </w:rPr>
+          <w:fldChar w:fldCharType="begin"/>
+        </w:r>
+        <w:r>
+          <w:rPr>
+            <w:noProof/>
+            <w:webHidden/>
+          </w:rPr>
+          <w:instrText xml:space="preserve"> PAGEREF _Toc235797459 \h </w:instrText>
+        </w:r>
+        <w:r>
+          <w:rPr>
+            <w:noProof/>
+            <w:webHidden/>
+          </w:rPr>
+        </w:r>
+        <w:r>
+          <w:rPr>
+            <w:noProof/>
+            <w:webHidden/>
+          </w:rPr>
+          <w:fldChar w:fldCharType="separate"/>
+        </w:r>
+        <w:r>
+          <w:rPr>
+            <w:noProof/>
+            <w:webHidden/>
+          </w:rPr>
+          <w:t>25</w:t>
+        </w:r>
+        <w:r>
+          <w:rPr>
+            <w:noProof/>
+            <w:webHidden/>
+          </w:rPr>
+          <w:fldChar w:fldCharType="end"/>
+        </w:r>
+      </w:hyperlink>
+    </w:p>
+    <w:p>
+      <w:pPr>
+        <w:pStyle w:val="TableofFigures"/>
+        <w:tabs>
+          <w:tab w:val="right" w:leader="dot" w:pos="9111"/>
+        </w:tabs>
+        <w:rPr>
+          <w:rFonts w:eastAsiaTheme="minorEastAsia"/>
+          <w:noProof/>
+        </w:rPr>
+      </w:pPr>
+      <w:hyperlink w:anchor="_Toc235797460" w:history="1">
+        <w:r>
+          <w:rPr>
+            <w:rStyle w:val="Hyperlink"/>
+            <w:rFonts w:ascii="Times New Roman" w:hAnsi="Times New Roman" w:cs="Times New Roman"/>
+            <w:noProof/>
+          </w:rPr>
+          <w:t>Bảng 6: UC5: Phân công Deal</w:t>
+        </w:r>
+        <w:r>
+          <w:rPr>
+            <w:noProof/>
+            <w:webHidden/>
+          </w:rPr>
+          <w:tab/>
+        </w:r>
+        <w:r>
+          <w:rPr>
+            <w:noProof/>
+            <w:webHidden/>
+          </w:rPr>
+          <w:fldChar w:fldCharType="begin"/>
+        </w:r>
+        <w:r>
+          <w:rPr>
+            <w:noProof/>
+            <w:webHidden/>
+          </w:rPr>
+          <w:instrText xml:space="preserve"> PAGEREF _Toc235797460 \h </w:instrText>
+        </w:r>
+        <w:r>
+          <w:rPr>
+            <w:noProof/>
+            <w:webHidden/>
+          </w:rPr>
+        </w:r>
+        <w:r>
+          <w:rPr>
+            <w:noProof/>
+            <w:webHidden/>
+          </w:rPr>
+          <w:fldChar w:fldCharType="separate"/>
+        </w:r>
+        <w:r>
+          <w:rPr>
+            <w:noProof/>
+            <w:webHidden/>
+          </w:rPr>
+          <w:t>25</w:t>
+        </w:r>
+        <w:r>
+          <w:rPr>
+            <w:noProof/>
+            <w:webHidden/>
+          </w:rPr>
+          <w:fldChar w:fldCharType="end"/>
+        </w:r>
+      </w:hyperlink>
+    </w:p>
+    <w:p>
+      <w:pPr>
+        <w:pStyle w:val="TableofFigures"/>
+        <w:tabs>
+          <w:tab w:val="right" w:leader="dot" w:pos="9111"/>
+        </w:tabs>
+        <w:rPr>
+          <w:rFonts w:eastAsiaTheme="minorEastAsia"/>
+          <w:noProof/>
+        </w:rPr>
+      </w:pPr>
+      <w:hyperlink w:anchor="_Toc235797461" w:history="1">
+        <w:r>
+          <w:rPr>
+            <w:rStyle w:val="Hyperlink"/>
+            <w:rFonts w:ascii="Times New Roman" w:hAnsi="Times New Roman" w:cs="Times New Roman"/>
+            <w:noProof/>
+          </w:rPr>
+          <w:t>Bảng 7: UC6: Thay đổi trạng thái Pipeline</w:t>
+        </w:r>
+        <w:r>
+          <w:rPr>
+            <w:noProof/>
+            <w:webHidden/>
+          </w:rPr>
+          <w:tab/>
+        </w:r>
+        <w:r>
+          <w:rPr>
+            <w:noProof/>
+            <w:webHidden/>
+          </w:rPr>
+          <w:fldChar w:fldCharType="begin"/>
+        </w:r>
+        <w:r>
+          <w:rPr>
+            <w:noProof/>
+            <w:webHidden/>
+          </w:rPr>
+          <w:instrText xml:space="preserve"> PAGEREF _Toc235797461 \h </w:instrText>
+        </w:r>
+        <w:r>
+          <w:rPr>
+            <w:noProof/>
+            <w:webHidden/>
+          </w:rPr>
+        </w:r>
+        <w:r>
+          <w:rPr>
+            <w:noProof/>
+            <w:webHidden/>
+          </w:rPr>
+          <w:fldChar w:fldCharType="separate"/>
+        </w:r>
+        <w:r>
+          <w:rPr>
+            <w:noProof/>
+            <w:webHidden/>
+          </w:rPr>
+          <w:t>26</w:t>
+        </w:r>
+        <w:r>
+          <w:rPr>
+            <w:noProof/>
+            <w:webHidden/>
+          </w:rPr>
+          <w:fldChar w:fldCharType="end"/>
+        </w:r>
+      </w:hyperlink>
+    </w:p>
+    <w:p>
+      <w:pPr>
+        <w:pStyle w:val="TableofFigures"/>
+        <w:tabs>
+          <w:tab w:val="right" w:leader="dot" w:pos="9111"/>
+        </w:tabs>
+        <w:rPr>
+          <w:rFonts w:eastAsiaTheme="minorEastAsia"/>
+          <w:noProof/>
+        </w:rPr>
+      </w:pPr>
+      <w:hyperlink w:anchor="_Toc235797462" w:history="1">
+        <w:r>
+          <w:rPr>
+            <w:rStyle w:val="Hyperlink"/>
+            <w:rFonts w:ascii="Times New Roman" w:hAnsi="Times New Roman" w:cs="Times New Roman"/>
+            <w:noProof/>
+          </w:rPr>
+          <w:t>Bảng 8: UC7: Tạo Quote</w:t>
+        </w:r>
+        <w:r>
+          <w:rPr>
+            <w:noProof/>
+            <w:webHidden/>
+          </w:rPr>
+          <w:tab/>
+        </w:r>
+        <w:r>
+          <w:rPr>
+            <w:noProof/>
+            <w:webHidden/>
+          </w:rPr>
+          <w:fldChar w:fldCharType="begin"/>
+        </w:r>
+        <w:r>
+          <w:rPr>
+            <w:noProof/>
+            <w:webHidden/>
+          </w:rPr>
+          <w:instrText xml:space="preserve"> PAGEREF _Toc235797462 \h </w:instrText>
+        </w:r>
+        <w:r>
+          <w:rPr>
+            <w:noProof/>
+            <w:webHidden/>
+          </w:rPr>
+        </w:r>
+        <w:r>
+          <w:rPr>
+            <w:noProof/>
+            <w:webHidden/>
+          </w:rPr>
+          <w:fldChar w:fldCharType="separate"/>
+        </w:r>
+        <w:r>
+          <w:rPr>
+            <w:noProof/>
+            <w:webHidden/>
+          </w:rPr>
+          <w:t>26</w:t>
+        </w:r>
+        <w:r>
+          <w:rPr>
+            <w:noProof/>
+            <w:webHidden/>
+          </w:rPr>
+          <w:fldChar w:fldCharType="end"/>
+        </w:r>
+      </w:hyperlink>
+    </w:p>
+    <w:p>
+      <w:pPr>
+        <w:pStyle w:val="TableofFigures"/>
+        <w:tabs>
+          <w:tab w:val="right" w:leader="dot" w:pos="9111"/>
+        </w:tabs>
+        <w:rPr>
+          <w:rFonts w:eastAsiaTheme="minorEastAsia"/>
+          <w:noProof/>
+        </w:rPr>
+      </w:pPr>
+      <w:hyperlink w:anchor="_Toc235797463" w:history="1">
+        <w:r>
+          <w:rPr>
+            <w:rStyle w:val="Hyperlink"/>
+            <w:rFonts w:ascii="Times New Roman" w:hAnsi="Times New Roman" w:cs="Times New Roman"/>
+            <w:noProof/>
+          </w:rPr>
+          <w:t>Bảng 9: UC8: Quản lý Task</w:t>
+        </w:r>
+        <w:r>
+          <w:rPr>
+            <w:noProof/>
+            <w:webHidden/>
+          </w:rPr>
+          <w:tab/>
+        </w:r>
+        <w:r>
+          <w:rPr>
+            <w:noProof/>
+            <w:webHidden/>
+          </w:rPr>
+          <w:fldChar w:fldCharType="begin"/>
+        </w:r>
+        <w:r>
+          <w:rPr>
+            <w:noProof/>
+            <w:webHidden/>
+          </w:rPr>
+          <w:instrText xml:space="preserve"> PAGEREF _Toc235797463 \h </w:instrText>
+        </w:r>
+        <w:r>
+          <w:rPr>
+            <w:noProof/>
+            <w:webHidden/>
+          </w:rPr>
+        </w:r>
+        <w:r>
+          <w:rPr>
+            <w:noProof/>
+            <w:webHidden/>
+          </w:rPr>
+          <w:fldChar w:fldCharType="separate"/>
+        </w:r>
+        <w:r>
+          <w:rPr>
+            <w:noProof/>
+            <w:webHidden/>
+          </w:rPr>
+          <w:t>27</w:t>
+        </w:r>
+        <w:r>
+          <w:rPr>
+            <w:noProof/>
+            <w:webHidden/>
+          </w:rPr>
+          <w:fldChar w:fldCharType="end"/>
+        </w:r>
+      </w:hyperlink>
+    </w:p>
+    <w:p>
+      <w:pPr>
+        <w:pStyle w:val="TableofFigures"/>
+        <w:tabs>
+          <w:tab w:val="right" w:leader="dot" w:pos="9111"/>
+        </w:tabs>
+        <w:rPr>
+          <w:rFonts w:eastAsiaTheme="minorEastAsia"/>
+          <w:noProof/>
+        </w:rPr>
+      </w:pPr>
+      <w:hyperlink w:anchor="_Toc235797464" w:history="1">
+        <w:r>
+          <w:rPr>
+            <w:rStyle w:val="Hyperlink"/>
+            <w:rFonts w:ascii="Times New Roman" w:hAnsi="Times New Roman" w:cs="Times New Roman"/>
+            <w:noProof/>
+          </w:rPr>
+          <w:t>Bảng 10: UC9: Dashboard</w:t>
+        </w:r>
+        <w:r>
+          <w:rPr>
+            <w:noProof/>
+            <w:webHidden/>
+          </w:rPr>
+          <w:tab/>
+        </w:r>
+        <w:r>
+          <w:rPr>
+            <w:noProof/>
+            <w:webHidden/>
+          </w:rPr>
+          <w:fldChar w:fldCharType="begin"/>
+        </w:r>
+        <w:r>
+          <w:rPr>
+            <w:noProof/>
+            <w:webHidden/>
+          </w:rPr>
+          <w:instrText xml:space="preserve"> PAGEREF _Toc235797464 \h </w:instrText>
+        </w:r>
+        <w:r>
+          <w:rPr>
+            <w:noProof/>
+            <w:webHidden/>
+          </w:rPr>
+        </w:r>
+        <w:r>
+          <w:rPr>
+            <w:noProof/>
+            <w:webHidden/>
+          </w:rPr>
+          <w:fldChar w:fldCharType="separate"/>
+        </w:r>
+        <w:r>
+          <w:rPr>
+            <w:noProof/>
+            <w:webHidden/>
+          </w:rPr>
+          <w:t>27</w:t>
+        </w:r>
+        <w:r>
+          <w:rPr>
+            <w:noProof/>
+            <w:webHidden/>
+          </w:rPr>
+          <w:fldChar w:fldCharType="end"/>
+        </w:r>
+      </w:hyperlink>
+    </w:p>
+    <w:p>
+      <w:pPr>
+        <w:pStyle w:val="TableofFigures"/>
+        <w:tabs>
+          <w:tab w:val="right" w:leader="dot" w:pos="9111"/>
+        </w:tabs>
+        <w:rPr>
+          <w:rFonts w:eastAsiaTheme="minorEastAsia"/>
+          <w:noProof/>
+        </w:rPr>
+      </w:pPr>
+      <w:hyperlink w:anchor="_Toc235797465" w:history="1">
+        <w:r>
+          <w:rPr>
+            <w:rStyle w:val="Hyperlink"/>
+            <w:rFonts w:ascii="Times New Roman" w:hAnsi="Times New Roman" w:cs="Times New Roman"/>
+            <w:noProof/>
+          </w:rPr>
+          <w:t>Bảng 11: UC10: Xem Activity Log</w:t>
+        </w:r>
+        <w:r>
+          <w:rPr>
+            <w:noProof/>
+            <w:webHidden/>
+          </w:rPr>
+          <w:tab/>
+        </w:r>
+        <w:r>
+          <w:rPr>
+            <w:noProof/>
+            <w:webHidden/>
+          </w:rPr>
+          <w:fldChar w:fldCharType="begin"/>
+        </w:r>
+        <w:r>
+          <w:rPr>
+            <w:noProof/>
+            <w:webHidden/>
+          </w:rPr>
+          <w:instrText xml:space="preserve"> PAGEREF _Toc235797465 \h </w:instrText>
+        </w:r>
+        <w:r>
+          <w:rPr>
+            <w:noProof/>
+            <w:webHidden/>
+          </w:rPr>
+        </w:r>
+        <w:r>
+          <w:rPr>
+            <w:noProof/>
+            <w:webHidden/>
+          </w:rPr>
+          <w:fldChar w:fldCharType="separate"/>
+        </w:r>
+        <w:r>
+          <w:rPr>
+            <w:noProof/>
+            <w:webHidden/>
+          </w:rPr>
+          <w:t>27</w:t>
+        </w:r>
+        <w:r>
+          <w:rPr>
+            <w:noProof/>
+            <w:webHidden/>
+          </w:rPr>
+          <w:fldChar w:fldCharType="end"/>
+        </w:r>
+      </w:hyperlink>
+    </w:p>
+    <w:p>
+      <w:pPr>
+        <w:pStyle w:val="TableofFigures"/>
+        <w:tabs>
+          <w:tab w:val="right" w:leader="dot" w:pos="9111"/>
+        </w:tabs>
+        <w:rPr>
+          <w:rFonts w:eastAsiaTheme="minorEastAsia"/>
+          <w:noProof/>
+        </w:rPr>
+      </w:pPr>
+      <w:hyperlink w:anchor="_Toc235797466" w:history="1">
+        <w:r>
+          <w:rPr>
+            <w:rStyle w:val="Hyperlink"/>
+            <w:rFonts w:ascii="Times New Roman" w:hAnsi="Times New Roman" w:cs="Times New Roman"/>
+            <w:noProof/>
+          </w:rPr>
           <w:t>Bảng 12: Chức năng của từng Module</w:t>
         </w:r>
         <w:r>
@@ -5454,7 +6466,7 @@
             <w:noProof/>
             <w:webHidden/>
           </w:rPr>
-          <w:instrText xml:space="preserve"> PAGEREF _Toc235770282 \h </w:instrText>
+          <w:instrText xml:space="preserve"> PAGEREF _Toc235797466 \h </w:instrText>
         </w:r>
         <w:r>
           <w:rPr>
@@ -5474,7 +6486,7 @@
             <w:noProof/>
             <w:webHidden/>
           </w:rPr>
-          <w:t>34</w:t>
+          <w:t>37</w:t>
         </w:r>
         <w:r>
           <w:rPr>
@@ -5495,46 +6507,12 @@
       <w:r>
         <w:fldChar w:fldCharType="end"/>
       </w:r>
-      <w:r>
-        <w:fldChar w:fldCharType="begin"/>
-      </w:r>
-      <w:r>
-        <w:instrText xml:space="preserve"> TOC \h \z \c "B</w:instrText>
-      </w:r>
-      <w:r>
-        <w:instrText>ả</w:instrText>
-      </w:r>
-      <w:r>
-        <w:instrText xml:space="preserve">ng" </w:instrText>
-      </w:r>
-      <w:r>
-        <w:fldChar w:fldCharType="separate"/>
-      </w:r>
-      <w:r>
-        <w:fldChar w:fldCharType="end"/>
-      </w:r>
-      <w:r>
-        <w:fldChar w:fldCharType="begin"/>
-      </w:r>
-      <w:r>
-        <w:instrText xml:space="preserve"> TOC \h \z \c "B</w:instrText>
-      </w:r>
-      <w:r>
-        <w:instrText>ả</w:instrText>
-      </w:r>
-      <w:r>
-        <w:instrText xml:space="preserve">ng" </w:instrText>
-      </w:r>
-      <w:r>
-        <w:fldChar w:fldCharType="separate"/>
-      </w:r>
-      <w:r>
-        <w:fldChar w:fldCharType="end"/>
-      </w:r>
+      <w:fldSimple w:instr=" TOC \h \z \c &quot;Bảng&quot; "/>
+      <w:fldSimple w:instr=" TOC \h \z \c &quot;Bảng&quot; "/>
       <w:r>
         <w:br w:type="page"/>
       </w:r>
-      <w:bookmarkStart w:id="7" w:name="_Toc235741222"/>
+      <w:bookmarkStart w:id="7" w:name="_Toc235800760"/>
       <w:r>
         <w:rPr>
           <w:rFonts w:ascii="Times New Roman" w:hAnsi="Times New Roman" w:cs="Times New Roman"/>
@@ -5587,7 +6565,7 @@
         </w:rPr>
       </w:pPr>
       <w:bookmarkStart w:id="8" w:name="_Toc235563700"/>
-      <w:bookmarkStart w:id="9" w:name="_Toc235741223"/>
+      <w:bookmarkStart w:id="9" w:name="_Toc235800761"/>
       <w:r>
         <w:rPr>
           <w:rFonts w:ascii="Times New Roman" w:hAnsi="Times New Roman" w:cs="Times New Roman"/>
@@ -5606,7 +6584,7 @@
         </w:rPr>
       </w:pPr>
       <w:bookmarkStart w:id="10" w:name="_Toc235563701"/>
-      <w:bookmarkStart w:id="11" w:name="_Toc235741224"/>
+      <w:bookmarkStart w:id="11" w:name="_Toc235800762"/>
       <w:r>
         <w:rPr>
           <w:rFonts w:ascii="Times New Roman" w:hAnsi="Times New Roman" w:cs="Times New Roman"/>
@@ -5649,7 +6627,7 @@
         </w:rPr>
       </w:pPr>
       <w:bookmarkStart w:id="12" w:name="_Toc235563702"/>
-      <w:bookmarkStart w:id="13" w:name="_Toc235741225"/>
+      <w:bookmarkStart w:id="13" w:name="_Toc235800763"/>
       <w:r>
         <w:rPr>
           <w:rFonts w:ascii="Times New Roman" w:hAnsi="Times New Roman" w:cs="Times New Roman"/>
@@ -5686,7 +6664,7 @@
         </w:rPr>
       </w:pPr>
       <w:bookmarkStart w:id="14" w:name="_Toc235563703"/>
-      <w:bookmarkStart w:id="15" w:name="_Toc235741226"/>
+      <w:bookmarkStart w:id="15" w:name="_Toc235800764"/>
       <w:r>
         <w:rPr>
           <w:rFonts w:ascii="Times New Roman" w:hAnsi="Times New Roman" w:cs="Times New Roman"/>
@@ -5867,7 +6845,7 @@
         </w:rPr>
       </w:pPr>
       <w:bookmarkStart w:id="16" w:name="_Toc235563704"/>
-      <w:bookmarkStart w:id="17" w:name="_Toc235741227"/>
+      <w:bookmarkStart w:id="17" w:name="_Toc235800765"/>
       <w:r>
         <w:rPr>
           <w:rFonts w:ascii="Times New Roman" w:hAnsi="Times New Roman" w:cs="Times New Roman"/>
@@ -6014,7 +6992,7 @@
         </w:rPr>
       </w:pPr>
       <w:bookmarkStart w:id="18" w:name="_Toc235563705"/>
-      <w:bookmarkStart w:id="19" w:name="_Toc235741228"/>
+      <w:bookmarkStart w:id="19" w:name="_Toc235800766"/>
       <w:r>
         <w:rPr>
           <w:rFonts w:ascii="Times New Roman" w:hAnsi="Times New Roman" w:cs="Times New Roman"/>
@@ -6034,7 +7012,7 @@
         </w:rPr>
       </w:pPr>
       <w:bookmarkStart w:id="20" w:name="_Toc235563706"/>
-      <w:bookmarkStart w:id="21" w:name="_Toc235741229"/>
+      <w:bookmarkStart w:id="21" w:name="_Toc235800767"/>
       <w:r>
         <w:rPr>
           <w:rFonts w:ascii="Times New Roman" w:hAnsi="Times New Roman" w:cs="Times New Roman"/>
@@ -6053,7 +7031,7 @@
         </w:rPr>
       </w:pPr>
       <w:bookmarkStart w:id="22" w:name="_Toc235563707"/>
-      <w:bookmarkStart w:id="23" w:name="_Toc235741230"/>
+      <w:bookmarkStart w:id="23" w:name="_Toc235800768"/>
       <w:r>
         <w:rPr>
           <w:rFonts w:ascii="Times New Roman" w:hAnsi="Times New Roman" w:cs="Times New Roman"/>
@@ -6483,7 +7461,7 @@
         </w:rPr>
       </w:pPr>
       <w:bookmarkStart w:id="24" w:name="_Toc235563708"/>
-      <w:bookmarkStart w:id="25" w:name="_Toc235741231"/>
+      <w:bookmarkStart w:id="25" w:name="_Toc235800769"/>
       <w:r>
         <w:rPr>
           <w:rFonts w:ascii="Times New Roman" w:hAnsi="Times New Roman" w:cs="Times New Roman"/>
@@ -7504,7 +8482,7 @@
           <w:szCs w:val="26"/>
         </w:rPr>
       </w:pPr>
-      <w:bookmarkStart w:id="26" w:name="_Toc235770271"/>
+      <w:bookmarkStart w:id="26" w:name="_Toc235797455"/>
       <w:r>
         <w:rPr>
           <w:rFonts w:ascii="Times New Roman" w:hAnsi="Times New Roman" w:cs="Times New Roman"/>
@@ -7571,7 +8549,7 @@
           <w:rFonts w:ascii="Times New Roman" w:hAnsi="Times New Roman" w:cs="Times New Roman"/>
         </w:rPr>
       </w:pPr>
-      <w:bookmarkStart w:id="27" w:name="_Toc235741232"/>
+      <w:bookmarkStart w:id="27" w:name="_Toc235800770"/>
       <w:r>
         <w:rPr>
           <w:rFonts w:ascii="Times New Roman" w:hAnsi="Times New Roman" w:cs="Times New Roman"/>
@@ -7587,7 +8565,7 @@
           <w:rFonts w:ascii="Times New Roman" w:hAnsi="Times New Roman" w:cs="Times New Roman"/>
         </w:rPr>
       </w:pPr>
-      <w:bookmarkStart w:id="28" w:name="_Toc235741233"/>
+      <w:bookmarkStart w:id="28" w:name="_Toc235800771"/>
       <w:r>
         <w:rPr>
           <w:rFonts w:ascii="Times New Roman" w:hAnsi="Times New Roman" w:cs="Times New Roman"/>
@@ -7736,7 +8714,7 @@
           <w:rFonts w:ascii="Times New Roman" w:hAnsi="Times New Roman" w:cs="Times New Roman"/>
         </w:rPr>
       </w:pPr>
-      <w:bookmarkStart w:id="29" w:name="_Toc235741234"/>
+      <w:bookmarkStart w:id="29" w:name="_Toc235800772"/>
       <w:r>
         <w:rPr>
           <w:rFonts w:ascii="Times New Roman" w:hAnsi="Times New Roman" w:cs="Times New Roman"/>
@@ -7884,7 +8862,7 @@
           <w:rFonts w:ascii="Times New Roman" w:hAnsi="Times New Roman" w:cs="Times New Roman"/>
         </w:rPr>
       </w:pPr>
-      <w:bookmarkStart w:id="30" w:name="_Toc235741235"/>
+      <w:bookmarkStart w:id="30" w:name="_Toc235800773"/>
       <w:r>
         <w:rPr>
           <w:rFonts w:ascii="Times New Roman" w:hAnsi="Times New Roman" w:cs="Times New Roman"/>
@@ -8015,7 +8993,7 @@
           <w:rFonts w:ascii="Times New Roman" w:hAnsi="Times New Roman" w:cs="Times New Roman"/>
         </w:rPr>
       </w:pPr>
-      <w:bookmarkStart w:id="31" w:name="_Toc235741236"/>
+      <w:bookmarkStart w:id="31" w:name="_Toc235800774"/>
       <w:r>
         <w:rPr>
           <w:rFonts w:ascii="Times New Roman" w:hAnsi="Times New Roman" w:cs="Times New Roman"/>
@@ -8231,7 +9209,7 @@
           <w:rFonts w:ascii="Times New Roman" w:hAnsi="Times New Roman" w:cs="Times New Roman"/>
         </w:rPr>
       </w:pPr>
-      <w:bookmarkStart w:id="32" w:name="_Toc235741237"/>
+      <w:bookmarkStart w:id="32" w:name="_Toc235800775"/>
       <w:r>
         <w:rPr>
           <w:rFonts w:ascii="Times New Roman" w:hAnsi="Times New Roman" w:cs="Times New Roman"/>
@@ -8411,7 +9389,7 @@
         </w:rPr>
       </w:pPr>
       <w:bookmarkStart w:id="33" w:name="_Toc235563709"/>
-      <w:bookmarkStart w:id="34" w:name="_Toc235741238"/>
+      <w:bookmarkStart w:id="34" w:name="_Toc235800776"/>
       <w:r>
         <w:rPr>
           <w:rFonts w:ascii="Times New Roman" w:hAnsi="Times New Roman" w:cs="Times New Roman"/>
@@ -8430,7 +9408,7 @@
         </w:rPr>
       </w:pPr>
       <w:bookmarkStart w:id="35" w:name="_Toc235563710"/>
-      <w:bookmarkStart w:id="36" w:name="_Toc235741239"/>
+      <w:bookmarkStart w:id="36" w:name="_Toc235800777"/>
       <w:r>
         <w:rPr>
           <w:rFonts w:ascii="Times New Roman" w:hAnsi="Times New Roman" w:cs="Times New Roman"/>
@@ -8698,7 +9676,7 @@
         </w:rPr>
       </w:pPr>
       <w:bookmarkStart w:id="37" w:name="_Toc235563711"/>
-      <w:bookmarkStart w:id="38" w:name="_Toc235741240"/>
+      <w:bookmarkStart w:id="38" w:name="_Toc235800778"/>
       <w:r>
         <w:rPr>
           <w:rFonts w:ascii="Times New Roman" w:hAnsi="Times New Roman" w:cs="Times New Roman"/>
@@ -9059,7 +10037,7 @@
         </w:rPr>
       </w:pPr>
       <w:bookmarkStart w:id="39" w:name="_Toc235563712"/>
-      <w:bookmarkStart w:id="40" w:name="_Toc235741241"/>
+      <w:bookmarkStart w:id="40" w:name="_Toc235800779"/>
       <w:r>
         <w:rPr>
           <w:rFonts w:ascii="Times New Roman" w:hAnsi="Times New Roman" w:cs="Times New Roman"/>
@@ -9201,7 +10179,7 @@
         </w:rPr>
       </w:pPr>
       <w:bookmarkStart w:id="41" w:name="_Toc235563713"/>
-      <w:bookmarkStart w:id="42" w:name="_Toc235741242"/>
+      <w:bookmarkStart w:id="42" w:name="_Toc235800780"/>
       <w:r>
         <w:rPr>
           <w:rFonts w:ascii="Times New Roman" w:hAnsi="Times New Roman" w:cs="Times New Roman"/>
@@ -9220,7 +10198,7 @@
         </w:rPr>
       </w:pPr>
       <w:bookmarkStart w:id="43" w:name="_Toc235563714"/>
-      <w:bookmarkStart w:id="44" w:name="_Toc235741243"/>
+      <w:bookmarkStart w:id="44" w:name="_Toc235800781"/>
       <w:r>
         <w:rPr>
           <w:rFonts w:ascii="Times New Roman" w:hAnsi="Times New Roman" w:cs="Times New Roman"/>
@@ -9238,7 +10216,7 @@
         </w:rPr>
       </w:pPr>
       <w:bookmarkStart w:id="45" w:name="_Toc235563715"/>
-      <w:bookmarkStart w:id="46" w:name="_Toc235741244"/>
+      <w:bookmarkStart w:id="46" w:name="_Toc235800782"/>
       <w:r>
         <w:rPr>
           <w:rFonts w:ascii="Times New Roman" w:hAnsi="Times New Roman" w:cs="Times New Roman"/>
@@ -9274,7 +10252,7 @@
         </w:rPr>
       </w:pPr>
       <w:bookmarkStart w:id="47" w:name="_Toc235563716"/>
-      <w:bookmarkStart w:id="48" w:name="_Toc235741245"/>
+      <w:bookmarkStart w:id="48" w:name="_Toc235800783"/>
       <w:r>
         <w:rPr>
           <w:rFonts w:ascii="Times New Roman" w:hAnsi="Times New Roman" w:cs="Times New Roman"/>
@@ -9346,7 +10324,7 @@
         </w:rPr>
       </w:pPr>
       <w:bookmarkStart w:id="49" w:name="_Toc235563717"/>
-      <w:bookmarkStart w:id="50" w:name="_Toc235741246"/>
+      <w:bookmarkStart w:id="50" w:name="_Toc235800784"/>
       <w:r>
         <w:rPr>
           <w:rFonts w:ascii="Times New Roman" w:hAnsi="Times New Roman" w:cs="Times New Roman"/>
@@ -9454,7 +10432,7 @@
         </w:rPr>
       </w:pPr>
       <w:bookmarkStart w:id="51" w:name="_Toc235563718"/>
-      <w:bookmarkStart w:id="52" w:name="_Toc235741247"/>
+      <w:bookmarkStart w:id="52" w:name="_Toc235800785"/>
       <w:r>
         <w:rPr>
           <w:rFonts w:ascii="Times New Roman" w:hAnsi="Times New Roman" w:cs="Times New Roman"/>
@@ -10347,7 +11325,7 @@
         </w:rPr>
       </w:pPr>
       <w:bookmarkStart w:id="53" w:name="_Toc235563719"/>
-      <w:bookmarkStart w:id="54" w:name="_Toc235741248"/>
+      <w:bookmarkStart w:id="54" w:name="_Toc235800786"/>
       <w:r>
         <w:rPr>
           <w:rFonts w:ascii="Times New Roman" w:hAnsi="Times New Roman" w:cs="Times New Roman"/>
@@ -10454,7 +11432,7 @@
         </w:rPr>
       </w:pPr>
       <w:bookmarkStart w:id="55" w:name="_Toc235563720"/>
-      <w:bookmarkStart w:id="56" w:name="_Toc235741249"/>
+      <w:bookmarkStart w:id="56" w:name="_Toc235800787"/>
       <w:r>
         <w:rPr>
           <w:rFonts w:ascii="Times New Roman" w:hAnsi="Times New Roman" w:cs="Times New Roman"/>
@@ -10528,7 +11506,7 @@
         </w:rPr>
       </w:pPr>
       <w:bookmarkStart w:id="57" w:name="_Toc235641387"/>
-      <w:bookmarkStart w:id="58" w:name="_Toc235777006"/>
+      <w:bookmarkStart w:id="58" w:name="_Toc235797430"/>
       <w:r>
         <w:rPr>
           <w:rFonts w:ascii="Times New Roman" w:hAnsi="Times New Roman" w:cs="Times New Roman"/>
@@ -10597,7 +11575,7 @@
         </w:rPr>
       </w:pPr>
       <w:bookmarkStart w:id="59" w:name="_Toc235563721"/>
-      <w:bookmarkStart w:id="60" w:name="_Toc235741250"/>
+      <w:bookmarkStart w:id="60" w:name="_Toc235800788"/>
       <w:r>
         <w:rPr>
           <w:rFonts w:ascii="Times New Roman" w:hAnsi="Times New Roman" w:cs="Times New Roman"/>
@@ -11117,7 +12095,7 @@
           <w:szCs w:val="26"/>
         </w:rPr>
       </w:pPr>
-      <w:bookmarkStart w:id="61" w:name="_Toc235770272"/>
+      <w:bookmarkStart w:id="61" w:name="_Toc235797456"/>
       <w:r>
         <w:rPr>
           <w:rFonts w:ascii="Times New Roman" w:hAnsi="Times New Roman" w:cs="Times New Roman"/>
@@ -11818,7 +12796,7 @@
           <w:szCs w:val="26"/>
         </w:rPr>
       </w:pPr>
-      <w:bookmarkStart w:id="62" w:name="_Toc235770273"/>
+      <w:bookmarkStart w:id="62" w:name="_Toc235797457"/>
       <w:r>
         <w:rPr>
           <w:rFonts w:ascii="Times New Roman" w:hAnsi="Times New Roman" w:cs="Times New Roman"/>
@@ -12445,7 +13423,7 @@
           <w:szCs w:val="26"/>
         </w:rPr>
       </w:pPr>
-      <w:bookmarkStart w:id="63" w:name="_Toc235770274"/>
+      <w:bookmarkStart w:id="63" w:name="_Toc235797458"/>
       <w:r>
         <w:rPr>
           <w:rFonts w:ascii="Times New Roman" w:hAnsi="Times New Roman" w:cs="Times New Roman"/>
@@ -13090,7 +14068,7 @@
           <w:szCs w:val="26"/>
         </w:rPr>
       </w:pPr>
-      <w:bookmarkStart w:id="64" w:name="_Toc235770275"/>
+      <w:bookmarkStart w:id="64" w:name="_Toc235797459"/>
       <w:r>
         <w:rPr>
           <w:rFonts w:ascii="Times New Roman" w:hAnsi="Times New Roman" w:cs="Times New Roman"/>
@@ -13540,7 +14518,7 @@
           <w:szCs w:val="26"/>
         </w:rPr>
       </w:pPr>
-      <w:bookmarkStart w:id="65" w:name="_Toc235770276"/>
+      <w:bookmarkStart w:id="65" w:name="_Toc235797460"/>
       <w:r>
         <w:rPr>
           <w:rFonts w:ascii="Times New Roman" w:hAnsi="Times New Roman" w:cs="Times New Roman"/>
@@ -13987,7 +14965,7 @@
           <w:szCs w:val="26"/>
         </w:rPr>
       </w:pPr>
-      <w:bookmarkStart w:id="66" w:name="_Toc235770277"/>
+      <w:bookmarkStart w:id="66" w:name="_Toc235797461"/>
       <w:r>
         <w:rPr>
           <w:rFonts w:ascii="Times New Roman" w:hAnsi="Times New Roman" w:cs="Times New Roman"/>
@@ -14569,7 +15547,7 @@
           <w:szCs w:val="26"/>
         </w:rPr>
       </w:pPr>
-      <w:bookmarkStart w:id="67" w:name="_Toc235770278"/>
+      <w:bookmarkStart w:id="67" w:name="_Toc235797462"/>
       <w:r>
         <w:rPr>
           <w:rFonts w:ascii="Times New Roman" w:hAnsi="Times New Roman" w:cs="Times New Roman"/>
@@ -15196,7 +16174,7 @@
           <w:szCs w:val="26"/>
         </w:rPr>
       </w:pPr>
-      <w:bookmarkStart w:id="68" w:name="_Toc235770279"/>
+      <w:bookmarkStart w:id="68" w:name="_Toc235797463"/>
       <w:r>
         <w:rPr>
           <w:rFonts w:ascii="Times New Roman" w:hAnsi="Times New Roman" w:cs="Times New Roman"/>
@@ -15666,7 +16644,7 @@
           <w:szCs w:val="26"/>
         </w:rPr>
       </w:pPr>
-      <w:bookmarkStart w:id="69" w:name="_Toc235770280"/>
+      <w:bookmarkStart w:id="69" w:name="_Toc235797464"/>
       <w:r>
         <w:rPr>
           <w:rFonts w:ascii="Times New Roman" w:hAnsi="Times New Roman" w:cs="Times New Roman"/>
@@ -16092,7 +17070,7 @@
           <w:szCs w:val="26"/>
         </w:rPr>
       </w:pPr>
-      <w:bookmarkStart w:id="70" w:name="_Toc235770281"/>
+      <w:bookmarkStart w:id="70" w:name="_Toc235797465"/>
       <w:r>
         <w:rPr>
           <w:rFonts w:ascii="Times New Roman" w:hAnsi="Times New Roman" w:cs="Times New Roman"/>
@@ -16160,7 +17138,7 @@
         </w:rPr>
       </w:pPr>
       <w:bookmarkStart w:id="71" w:name="_Toc235563722"/>
-      <w:bookmarkStart w:id="72" w:name="_Toc235741251"/>
+      <w:bookmarkStart w:id="72" w:name="_Toc235800789"/>
       <w:r>
         <w:rPr>
           <w:rFonts w:ascii="Times New Roman" w:hAnsi="Times New Roman" w:cs="Times New Roman"/>
@@ -16234,7 +17212,7 @@
           <w:szCs w:val="26"/>
         </w:rPr>
       </w:pPr>
-      <w:bookmarkStart w:id="73" w:name="_Toc235777007"/>
+      <w:bookmarkStart w:id="73" w:name="_Toc235797431"/>
       <w:r>
         <w:rPr>
           <w:rFonts w:ascii="Times New Roman" w:hAnsi="Times New Roman" w:cs="Times New Roman"/>
@@ -16387,7 +17365,7 @@
           <w:szCs w:val="26"/>
         </w:rPr>
       </w:pPr>
-      <w:bookmarkStart w:id="74" w:name="_Toc235777008"/>
+      <w:bookmarkStart w:id="74" w:name="_Toc235797432"/>
       <w:r>
         <w:rPr>
           <w:rFonts w:ascii="Times New Roman" w:hAnsi="Times New Roman" w:cs="Times New Roman"/>
@@ -16528,7 +17506,7 @@
           <w:szCs w:val="26"/>
         </w:rPr>
       </w:pPr>
-      <w:bookmarkStart w:id="75" w:name="_Toc235777009"/>
+      <w:bookmarkStart w:id="75" w:name="_Toc235797433"/>
       <w:r>
         <w:rPr>
           <w:rFonts w:ascii="Times New Roman" w:hAnsi="Times New Roman" w:cs="Times New Roman"/>
@@ -16676,7 +17654,7 @@
           <w:szCs w:val="26"/>
         </w:rPr>
       </w:pPr>
-      <w:bookmarkStart w:id="76" w:name="_Toc235777010"/>
+      <w:bookmarkStart w:id="76" w:name="_Toc235797434"/>
       <w:r>
         <w:rPr>
           <w:rFonts w:ascii="Times New Roman" w:hAnsi="Times New Roman" w:cs="Times New Roman"/>
@@ -16825,7 +17803,7 @@
           <w:szCs w:val="26"/>
         </w:rPr>
       </w:pPr>
-      <w:bookmarkStart w:id="77" w:name="_Toc235777011"/>
+      <w:bookmarkStart w:id="77" w:name="_Toc235797435"/>
       <w:r>
         <w:rPr>
           <w:rFonts w:ascii="Times New Roman" w:hAnsi="Times New Roman" w:cs="Times New Roman"/>
@@ -16910,7 +17888,7 @@
         </w:rPr>
       </w:pPr>
       <w:bookmarkStart w:id="78" w:name="_Toc235563723"/>
-      <w:bookmarkStart w:id="79" w:name="_Toc235741252"/>
+      <w:bookmarkStart w:id="79" w:name="_Toc235800790"/>
       <w:r>
         <w:rPr>
           <w:rFonts w:ascii="Times New Roman" w:hAnsi="Times New Roman" w:cs="Times New Roman"/>
@@ -16984,7 +17962,7 @@
           <w:szCs w:val="26"/>
         </w:rPr>
       </w:pPr>
-      <w:bookmarkStart w:id="80" w:name="_Toc235777012"/>
+      <w:bookmarkStart w:id="80" w:name="_Toc235797436"/>
       <w:r>
         <w:rPr>
           <w:rFonts w:ascii="Times New Roman" w:hAnsi="Times New Roman" w:cs="Times New Roman"/>
@@ -17125,7 +18103,7 @@
           <w:szCs w:val="26"/>
         </w:rPr>
       </w:pPr>
-      <w:bookmarkStart w:id="81" w:name="_Toc235777013"/>
+      <w:bookmarkStart w:id="81" w:name="_Toc235797437"/>
       <w:r>
         <w:rPr>
           <w:rFonts w:ascii="Times New Roman" w:hAnsi="Times New Roman" w:cs="Times New Roman"/>
@@ -17266,7 +18244,7 @@
           <w:szCs w:val="26"/>
         </w:rPr>
       </w:pPr>
-      <w:bookmarkStart w:id="82" w:name="_Toc235777014"/>
+      <w:bookmarkStart w:id="82" w:name="_Toc235797438"/>
       <w:r>
         <w:rPr>
           <w:rFonts w:ascii="Times New Roman" w:hAnsi="Times New Roman" w:cs="Times New Roman"/>
@@ -17351,7 +18329,7 @@
         </w:rPr>
       </w:pPr>
       <w:bookmarkStart w:id="83" w:name="_Toc235563724"/>
-      <w:bookmarkStart w:id="84" w:name="_Toc235741253"/>
+      <w:bookmarkStart w:id="84" w:name="_Toc235800791"/>
       <w:r>
         <w:rPr>
           <w:rFonts w:ascii="Times New Roman" w:hAnsi="Times New Roman" w:cs="Times New Roman"/>
@@ -17425,7 +18403,7 @@
           <w:szCs w:val="26"/>
         </w:rPr>
       </w:pPr>
-      <w:bookmarkStart w:id="85" w:name="_Toc235777015"/>
+      <w:bookmarkStart w:id="85" w:name="_Toc235797439"/>
       <w:r>
         <w:rPr>
           <w:rFonts w:ascii="Times New Roman" w:hAnsi="Times New Roman" w:cs="Times New Roman"/>
@@ -17770,7 +18748,7 @@
           <w:rFonts w:ascii="Times New Roman" w:hAnsi="Times New Roman" w:cs="Times New Roman"/>
         </w:rPr>
       </w:pPr>
-      <w:bookmarkStart w:id="86" w:name="_Toc235741254"/>
+      <w:bookmarkStart w:id="86" w:name="_Toc235800792"/>
       <w:r>
         <w:rPr>
           <w:rFonts w:ascii="Times New Roman" w:hAnsi="Times New Roman" w:cs="Times New Roman"/>
@@ -17842,7 +18820,7 @@
           <w:szCs w:val="26"/>
         </w:rPr>
       </w:pPr>
-      <w:bookmarkStart w:id="87" w:name="_Toc235777016"/>
+      <w:bookmarkStart w:id="87" w:name="_Toc235797440"/>
       <w:r>
         <w:rPr>
           <w:rFonts w:ascii="Times New Roman" w:hAnsi="Times New Roman" w:cs="Times New Roman"/>
@@ -17944,7 +18922,7 @@
           <w:rFonts w:ascii="Times New Roman" w:hAnsi="Times New Roman" w:cs="Times New Roman"/>
         </w:rPr>
       </w:pPr>
-      <w:bookmarkStart w:id="88" w:name="_Toc235741255"/>
+      <w:bookmarkStart w:id="88" w:name="_Toc235800793"/>
       <w:r>
         <w:rPr>
           <w:rFonts w:ascii="Times New Roman" w:hAnsi="Times New Roman" w:cs="Times New Roman"/>
@@ -17960,12 +18938,14 @@
           <w:rFonts w:ascii="Times New Roman" w:hAnsi="Times New Roman" w:cs="Times New Roman"/>
         </w:rPr>
       </w:pPr>
+      <w:bookmarkStart w:id="89" w:name="_Toc235800794"/>
       <w:r>
         <w:rPr>
           <w:rFonts w:ascii="Times New Roman" w:hAnsi="Times New Roman" w:cs="Times New Roman"/>
         </w:rPr>
         <w:t>Kiến trúc tổng thể</w:t>
       </w:r>
+      <w:bookmarkEnd w:id="89"/>
     </w:p>
     <w:p>
       <w:pPr>
@@ -18026,7 +19006,7 @@
                                 <w:szCs w:val="26"/>
                               </w:rPr>
                             </w:pPr>
-                            <w:bookmarkStart w:id="89" w:name="_Toc235777017"/>
+                            <w:bookmarkStart w:id="90" w:name="_Toc235797441"/>
                             <w:r>
                               <w:rPr>
                                 <w:rFonts w:ascii="Times New Roman" w:hAnsi="Times New Roman" w:cs="Times New Roman"/>
@@ -18084,7 +19064,7 @@
                               </w:rPr>
                               <w:t>: Kiến trúc tổng thể</w:t>
                             </w:r>
-                            <w:bookmarkEnd w:id="89"/>
+                            <w:bookmarkEnd w:id="90"/>
                           </w:p>
                         </w:txbxContent>
                       </wps:txbx>
@@ -18119,7 +19099,7 @@
                           <w:szCs w:val="26"/>
                         </w:rPr>
                       </w:pPr>
-                      <w:bookmarkStart w:id="90" w:name="_Toc235777017"/>
+                      <w:bookmarkStart w:id="91" w:name="_Toc235797441"/>
                       <w:r>
                         <w:rPr>
                           <w:rFonts w:ascii="Times New Roman" w:hAnsi="Times New Roman" w:cs="Times New Roman"/>
@@ -18177,7 +19157,7 @@
                         </w:rPr>
                         <w:t>: Kiến trúc tổng thể</w:t>
                       </w:r>
-                      <w:bookmarkEnd w:id="90"/>
+                      <w:bookmarkEnd w:id="91"/>
                     </w:p>
                   </w:txbxContent>
                 </v:textbox>
@@ -18260,6 +19240,7 @@
           <w:rFonts w:ascii="Times New Roman" w:hAnsi="Times New Roman" w:cs="Times New Roman"/>
         </w:rPr>
       </w:pPr>
+      <w:bookmarkStart w:id="92" w:name="_Toc235800795"/>
       <w:r>
         <w:rPr>
           <w:rFonts w:ascii="Times New Roman" w:hAnsi="Times New Roman" w:cs="Times New Roman"/>
@@ -18267,6 +19248,7 @@
         <w:lastRenderedPageBreak/>
         <w:t>Kiến trúc Modular</w:t>
       </w:r>
+      <w:bookmarkEnd w:id="92"/>
     </w:p>
     <w:p>
       <w:pPr>
@@ -18331,7 +19313,7 @@
           <w:szCs w:val="26"/>
         </w:rPr>
       </w:pPr>
-      <w:bookmarkStart w:id="91" w:name="_Toc235777018"/>
+      <w:bookmarkStart w:id="93" w:name="_Toc235797442"/>
       <w:r>
         <w:rPr>
           <w:rFonts w:ascii="Times New Roman" w:hAnsi="Times New Roman" w:cs="Times New Roman"/>
@@ -18389,7 +19371,7 @@
         </w:rPr>
         <w:t>: Kiến trúc Modular</w:t>
       </w:r>
-      <w:bookmarkEnd w:id="91"/>
+      <w:bookmarkEnd w:id="93"/>
     </w:p>
     <w:p>
       <w:pPr>
@@ -18463,7 +19445,7 @@
           <w:szCs w:val="26"/>
         </w:rPr>
       </w:pPr>
-      <w:bookmarkStart w:id="92" w:name="_Toc235777019"/>
+      <w:bookmarkStart w:id="94" w:name="_Toc235797443"/>
       <w:r>
         <w:rPr>
           <w:rFonts w:ascii="Times New Roman" w:hAnsi="Times New Roman" w:cs="Times New Roman"/>
@@ -18521,7 +19503,7 @@
         </w:rPr>
         <w:t>: Kiến trúc của một Module</w:t>
       </w:r>
-      <w:bookmarkEnd w:id="92"/>
+      <w:bookmarkEnd w:id="94"/>
     </w:p>
     <w:p>
       <w:pPr>
@@ -19123,7 +20105,7 @@
           <w:szCs w:val="26"/>
         </w:rPr>
       </w:pPr>
-      <w:bookmarkStart w:id="93" w:name="_Toc235770282"/>
+      <w:bookmarkStart w:id="95" w:name="_Toc235797466"/>
       <w:r>
         <w:rPr>
           <w:rFonts w:ascii="Times New Roman" w:hAnsi="Times New Roman" w:cs="Times New Roman"/>
@@ -19181,7 +20163,7 @@
         </w:rPr>
         <w:t>: Chức năng của từng Module</w:t>
       </w:r>
-      <w:bookmarkEnd w:id="93"/>
+      <w:bookmarkEnd w:id="95"/>
     </w:p>
     <w:p>
       <w:pPr>
@@ -19190,6 +20172,7 @@
           <w:rFonts w:ascii="Times New Roman" w:hAnsi="Times New Roman" w:cs="Times New Roman"/>
         </w:rPr>
       </w:pPr>
+      <w:bookmarkStart w:id="96" w:name="_Toc235800796"/>
       <w:r>
         <w:rPr>
           <w:rFonts w:ascii="Times New Roman" w:hAnsi="Times New Roman" w:cs="Times New Roman"/>
@@ -19197,6 +20180,7 @@
         <w:lastRenderedPageBreak/>
         <w:t>RESTful API</w:t>
       </w:r>
+      <w:bookmarkEnd w:id="96"/>
     </w:p>
     <w:p>
       <w:pPr>
@@ -19261,7 +20245,7 @@
           <w:szCs w:val="26"/>
         </w:rPr>
       </w:pPr>
-      <w:bookmarkStart w:id="94" w:name="_Toc235777020"/>
+      <w:bookmarkStart w:id="97" w:name="_Toc235797444"/>
       <w:r>
         <w:rPr>
           <w:rFonts w:ascii="Times New Roman" w:hAnsi="Times New Roman" w:cs="Times New Roman"/>
@@ -19319,7 +20303,7 @@
         </w:rPr>
         <w:t>: Luồng xử lý yêu cầu đăng nhập thông qua RESTful API</w:t>
       </w:r>
-      <w:bookmarkEnd w:id="94"/>
+      <w:bookmarkEnd w:id="97"/>
     </w:p>
     <w:p>
       <w:pPr>
@@ -19345,12 +20329,14 @@
           <w:rFonts w:ascii="Times New Roman" w:hAnsi="Times New Roman" w:cs="Times New Roman"/>
         </w:rPr>
       </w:pPr>
+      <w:bookmarkStart w:id="98" w:name="_Toc235800797"/>
       <w:r>
         <w:rPr>
           <w:rFonts w:ascii="Times New Roman" w:hAnsi="Times New Roman" w:cs="Times New Roman"/>
         </w:rPr>
         <w:t>Luồng xử lý dữ liệu</w:t>
       </w:r>
+      <w:bookmarkEnd w:id="98"/>
     </w:p>
     <w:p>
       <w:pPr>
@@ -19415,7 +20401,7 @@
           <w:szCs w:val="26"/>
         </w:rPr>
       </w:pPr>
-      <w:bookmarkStart w:id="95" w:name="_Toc235777021"/>
+      <w:bookmarkStart w:id="99" w:name="_Toc235797445"/>
       <w:r>
         <w:rPr>
           <w:rFonts w:ascii="Times New Roman" w:hAnsi="Times New Roman" w:cs="Times New Roman"/>
@@ -19473,7 +20459,7 @@
         </w:rPr>
         <w:t>: Luồng xử lý dữ liệu</w:t>
       </w:r>
-      <w:bookmarkEnd w:id="95"/>
+      <w:bookmarkEnd w:id="99"/>
     </w:p>
     <w:p>
       <w:pPr>
@@ -19482,8 +20468,8 @@
           <w:rFonts w:ascii="Times New Roman" w:hAnsi="Times New Roman" w:cs="Times New Roman"/>
         </w:rPr>
       </w:pPr>
-      <w:bookmarkStart w:id="96" w:name="_Toc235563727"/>
-      <w:bookmarkStart w:id="97" w:name="_Toc235741256"/>
+      <w:bookmarkStart w:id="100" w:name="_Toc235563727"/>
+      <w:bookmarkStart w:id="101" w:name="_Toc235800798"/>
       <w:r>
         <w:rPr>
           <w:rFonts w:ascii="Times New Roman" w:hAnsi="Times New Roman" w:cs="Times New Roman"/>
@@ -19491,26 +20477,1252 @@
         <w:lastRenderedPageBreak/>
         <w:t>WIREFRAME</w:t>
       </w:r>
-      <w:bookmarkEnd w:id="96"/>
-      <w:bookmarkEnd w:id="97"/>
-    </w:p>
-    <w:p>
-      <w:pPr>
-        <w:rPr>
-          <w:rFonts w:ascii="Times New Roman" w:hAnsi="Times New Roman" w:cs="Times New Roman"/>
-          <w:sz w:val="26"/>
-          <w:szCs w:val="26"/>
-        </w:rPr>
-      </w:pPr>
-    </w:p>
-    <w:p>
-      <w:pPr>
-        <w:rPr>
-          <w:rFonts w:ascii="Times New Roman" w:hAnsi="Times New Roman" w:cs="Times New Roman"/>
-          <w:sz w:val="26"/>
-          <w:szCs w:val="26"/>
-        </w:rPr>
-      </w:pPr>
+      <w:bookmarkEnd w:id="100"/>
+      <w:bookmarkEnd w:id="101"/>
+    </w:p>
+    <w:p>
+      <w:pPr>
+        <w:keepNext/>
+      </w:pPr>
+      <w:r>
+        <w:rPr>
+          <w:rFonts w:ascii="Times New Roman" w:hAnsi="Times New Roman" w:cs="Times New Roman"/>
+          <w:noProof/>
+          <w:sz w:val="26"/>
+          <w:szCs w:val="26"/>
+        </w:rPr>
+        <w:drawing>
+          <wp:inline distT="0" distB="0" distL="0" distR="0" wp14:anchorId="3E30FEA2" wp14:editId="2FE8C22F">
+            <wp:extent cx="5791835" cy="3237865"/>
+            <wp:effectExtent l="0" t="0" r="0" b="635"/>
+            <wp:docPr id="19" name="Picture 19"/>
+            <wp:cNvGraphicFramePr>
+              <a:graphicFrameLocks xmlns:a="http://schemas.openxmlformats.org/drawingml/2006/main" noChangeAspect="1"/>
+            </wp:cNvGraphicFramePr>
+            <a:graphic xmlns:a="http://schemas.openxmlformats.org/drawingml/2006/main">
+              <a:graphicData uri="http://schemas.openxmlformats.org/drawingml/2006/picture">
+                <pic:pic xmlns:pic="http://schemas.openxmlformats.org/drawingml/2006/picture">
+                  <pic:nvPicPr>
+                    <pic:cNvPr id="19" name="Picture 19"/>
+                    <pic:cNvPicPr/>
+                  </pic:nvPicPr>
+                  <pic:blipFill>
+                    <a:blip r:embed="rId26" cstate="print">
+                      <a:extLst>
+                        <a:ext uri="{28A0092B-C50C-407E-A947-70E740481C1C}">
+                          <a14:useLocalDpi xmlns:a14="http://schemas.microsoft.com/office/drawing/2010/main" val="0"/>
+                        </a:ext>
+                      </a:extLst>
+                    </a:blip>
+                    <a:stretch>
+                      <a:fillRect/>
+                    </a:stretch>
+                  </pic:blipFill>
+                  <pic:spPr>
+                    <a:xfrm>
+                      <a:off x="0" y="0"/>
+                      <a:ext cx="5791835" cy="3237865"/>
+                    </a:xfrm>
+                    <a:prstGeom prst="rect">
+                      <a:avLst/>
+                    </a:prstGeom>
+                  </pic:spPr>
+                </pic:pic>
+              </a:graphicData>
+            </a:graphic>
+          </wp:inline>
+        </w:drawing>
+      </w:r>
+    </w:p>
+    <w:p>
+      <w:pPr>
+        <w:pStyle w:val="Caption"/>
+        <w:rPr>
+          <w:rFonts w:ascii="Times New Roman" w:hAnsi="Times New Roman" w:cs="Times New Roman"/>
+          <w:sz w:val="26"/>
+          <w:szCs w:val="26"/>
+        </w:rPr>
+      </w:pPr>
+      <w:bookmarkStart w:id="102" w:name="_Toc235797446"/>
+      <w:r>
+        <w:rPr>
+          <w:rFonts w:ascii="Times New Roman" w:hAnsi="Times New Roman" w:cs="Times New Roman"/>
+          <w:sz w:val="26"/>
+          <w:szCs w:val="26"/>
+        </w:rPr>
+        <w:t xml:space="preserve">Hình </w:t>
+      </w:r>
+      <w:r>
+        <w:rPr>
+          <w:rFonts w:ascii="Times New Roman" w:hAnsi="Times New Roman" w:cs="Times New Roman"/>
+          <w:sz w:val="26"/>
+          <w:szCs w:val="26"/>
+        </w:rPr>
+        <w:fldChar w:fldCharType="begin"/>
+      </w:r>
+      <w:r>
+        <w:rPr>
+          <w:rFonts w:ascii="Times New Roman" w:hAnsi="Times New Roman" w:cs="Times New Roman"/>
+          <w:sz w:val="26"/>
+          <w:szCs w:val="26"/>
+        </w:rPr>
+        <w:instrText xml:space="preserve"> SEQ Hình \* ARABIC </w:instrText>
+      </w:r>
+      <w:r>
+        <w:rPr>
+          <w:rFonts w:ascii="Times New Roman" w:hAnsi="Times New Roman" w:cs="Times New Roman"/>
+          <w:sz w:val="26"/>
+          <w:szCs w:val="26"/>
+        </w:rPr>
+        <w:fldChar w:fldCharType="separate"/>
+      </w:r>
+      <w:r>
+        <w:rPr>
+          <w:rFonts w:ascii="Times New Roman" w:hAnsi="Times New Roman" w:cs="Times New Roman"/>
+          <w:noProof/>
+          <w:sz w:val="26"/>
+          <w:szCs w:val="26"/>
+        </w:rPr>
+        <w:t>17</w:t>
+      </w:r>
+      <w:r>
+        <w:rPr>
+          <w:rFonts w:ascii="Times New Roman" w:hAnsi="Times New Roman" w:cs="Times New Roman"/>
+          <w:sz w:val="26"/>
+          <w:szCs w:val="26"/>
+        </w:rPr>
+        <w:fldChar w:fldCharType="end"/>
+      </w:r>
+      <w:r>
+        <w:rPr>
+          <w:rFonts w:ascii="Times New Roman" w:hAnsi="Times New Roman" w:cs="Times New Roman"/>
+          <w:sz w:val="26"/>
+          <w:szCs w:val="26"/>
+        </w:rPr>
+        <w:t>: Wireframe đăng nhập hệ thống</w:t>
+      </w:r>
+      <w:bookmarkEnd w:id="102"/>
+    </w:p>
+    <w:p>
+      <w:pPr>
+        <w:rPr>
+          <w:rFonts w:ascii="Times New Roman" w:hAnsi="Times New Roman" w:cs="Times New Roman"/>
+          <w:sz w:val="26"/>
+          <w:szCs w:val="26"/>
+        </w:rPr>
+      </w:pPr>
+      <w:r>
+        <w:rPr>
+          <w:rFonts w:ascii="Times New Roman" w:hAnsi="Times New Roman" w:cs="Times New Roman"/>
+          <w:sz w:val="26"/>
+          <w:szCs w:val="26"/>
+        </w:rPr>
+        <w:t xml:space="preserve">Nhân viên nhập email và mật khẩu đã được cung cấp để đăng nhập vào hệ thống. Có thể chọn vào ô ghi nhớ đăng nhập để lưu lại thông tin đăng nhập gần nhất. Sau khi được cấp tài khoản thì nhân viên có thể </w:t>
+      </w:r>
+      <w:r>
+        <w:rPr>
+          <w:rFonts w:ascii="Times New Roman" w:hAnsi="Times New Roman" w:cs="Times New Roman"/>
+          <w:sz w:val="26"/>
+          <w:szCs w:val="26"/>
+        </w:rPr>
+        <w:t>đổi mật khẩu bằng cách bấm quên mật khẩu.</w:t>
+      </w:r>
+    </w:p>
+    <w:p>
+      <w:pPr>
+        <w:keepNext/>
+      </w:pPr>
+      <w:r>
+        <w:rPr>
+          <w:rFonts w:ascii="Times New Roman" w:hAnsi="Times New Roman" w:cs="Times New Roman"/>
+          <w:noProof/>
+          <w:sz w:val="26"/>
+          <w:szCs w:val="26"/>
+        </w:rPr>
+        <w:drawing>
+          <wp:inline distT="0" distB="0" distL="0" distR="0" wp14:anchorId="74549407" wp14:editId="2F18B530">
+            <wp:extent cx="5791835" cy="2867660"/>
+            <wp:effectExtent l="0" t="0" r="0" b="8890"/>
+            <wp:docPr id="20" name="Picture 20"/>
+            <wp:cNvGraphicFramePr>
+              <a:graphicFrameLocks xmlns:a="http://schemas.openxmlformats.org/drawingml/2006/main" noChangeAspect="1"/>
+            </wp:cNvGraphicFramePr>
+            <a:graphic xmlns:a="http://schemas.openxmlformats.org/drawingml/2006/main">
+              <a:graphicData uri="http://schemas.openxmlformats.org/drawingml/2006/picture">
+                <pic:pic xmlns:pic="http://schemas.openxmlformats.org/drawingml/2006/picture">
+                  <pic:nvPicPr>
+                    <pic:cNvPr id="20" name="Picture 20"/>
+                    <pic:cNvPicPr/>
+                  </pic:nvPicPr>
+                  <pic:blipFill>
+                    <a:blip r:embed="rId27" cstate="print">
+                      <a:extLst>
+                        <a:ext uri="{28A0092B-C50C-407E-A947-70E740481C1C}">
+                          <a14:useLocalDpi xmlns:a14="http://schemas.microsoft.com/office/drawing/2010/main" val="0"/>
+                        </a:ext>
+                      </a:extLst>
+                    </a:blip>
+                    <a:stretch>
+                      <a:fillRect/>
+                    </a:stretch>
+                  </pic:blipFill>
+                  <pic:spPr>
+                    <a:xfrm>
+                      <a:off x="0" y="0"/>
+                      <a:ext cx="5791835" cy="2867660"/>
+                    </a:xfrm>
+                    <a:prstGeom prst="rect">
+                      <a:avLst/>
+                    </a:prstGeom>
+                  </pic:spPr>
+                </pic:pic>
+              </a:graphicData>
+            </a:graphic>
+          </wp:inline>
+        </w:drawing>
+      </w:r>
+    </w:p>
+    <w:p>
+      <w:pPr>
+        <w:pStyle w:val="Caption"/>
+        <w:rPr>
+          <w:rFonts w:ascii="Times New Roman" w:hAnsi="Times New Roman" w:cs="Times New Roman"/>
+          <w:sz w:val="26"/>
+          <w:szCs w:val="26"/>
+        </w:rPr>
+      </w:pPr>
+      <w:bookmarkStart w:id="103" w:name="_Toc235797447"/>
+      <w:r>
+        <w:rPr>
+          <w:rFonts w:ascii="Times New Roman" w:hAnsi="Times New Roman" w:cs="Times New Roman"/>
+          <w:sz w:val="26"/>
+          <w:szCs w:val="26"/>
+        </w:rPr>
+        <w:t xml:space="preserve">Hình </w:t>
+      </w:r>
+      <w:r>
+        <w:rPr>
+          <w:rFonts w:ascii="Times New Roman" w:hAnsi="Times New Roman" w:cs="Times New Roman"/>
+          <w:sz w:val="26"/>
+          <w:szCs w:val="26"/>
+        </w:rPr>
+        <w:fldChar w:fldCharType="begin"/>
+      </w:r>
+      <w:r>
+        <w:rPr>
+          <w:rFonts w:ascii="Times New Roman" w:hAnsi="Times New Roman" w:cs="Times New Roman"/>
+          <w:sz w:val="26"/>
+          <w:szCs w:val="26"/>
+        </w:rPr>
+        <w:instrText xml:space="preserve"> SEQ Hình \* ARABIC </w:instrText>
+      </w:r>
+      <w:r>
+        <w:rPr>
+          <w:rFonts w:ascii="Times New Roman" w:hAnsi="Times New Roman" w:cs="Times New Roman"/>
+          <w:sz w:val="26"/>
+          <w:szCs w:val="26"/>
+        </w:rPr>
+        <w:fldChar w:fldCharType="separate"/>
+      </w:r>
+      <w:r>
+        <w:rPr>
+          <w:rFonts w:ascii="Times New Roman" w:hAnsi="Times New Roman" w:cs="Times New Roman"/>
+          <w:noProof/>
+          <w:sz w:val="26"/>
+          <w:szCs w:val="26"/>
+        </w:rPr>
+        <w:t>18</w:t>
+      </w:r>
+      <w:r>
+        <w:rPr>
+          <w:rFonts w:ascii="Times New Roman" w:hAnsi="Times New Roman" w:cs="Times New Roman"/>
+          <w:sz w:val="26"/>
+          <w:szCs w:val="26"/>
+        </w:rPr>
+        <w:fldChar w:fldCharType="end"/>
+      </w:r>
+      <w:r>
+        <w:rPr>
+          <w:rFonts w:ascii="Times New Roman" w:hAnsi="Times New Roman" w:cs="Times New Roman"/>
+          <w:sz w:val="26"/>
+          <w:szCs w:val="26"/>
+        </w:rPr>
+        <w:t>: Giao diện Dashboard tổng quan</w:t>
+      </w:r>
+      <w:bookmarkEnd w:id="103"/>
+    </w:p>
+    <w:p>
+      <w:pPr>
+        <w:keepNext/>
+      </w:pPr>
+      <w:r>
+        <w:rPr>
+          <w:rFonts w:ascii="Times New Roman" w:hAnsi="Times New Roman" w:cs="Times New Roman"/>
+          <w:noProof/>
+          <w:sz w:val="26"/>
+          <w:szCs w:val="26"/>
+        </w:rPr>
+        <w:lastRenderedPageBreak/>
+        <w:drawing>
+          <wp:inline distT="0" distB="0" distL="0" distR="0" wp14:anchorId="52CD5764" wp14:editId="61EBC096">
+            <wp:extent cx="5791835" cy="2828290"/>
+            <wp:effectExtent l="0" t="0" r="0" b="0"/>
+            <wp:docPr id="21" name="Picture 21"/>
+            <wp:cNvGraphicFramePr>
+              <a:graphicFrameLocks xmlns:a="http://schemas.openxmlformats.org/drawingml/2006/main" noChangeAspect="1"/>
+            </wp:cNvGraphicFramePr>
+            <a:graphic xmlns:a="http://schemas.openxmlformats.org/drawingml/2006/main">
+              <a:graphicData uri="http://schemas.openxmlformats.org/drawingml/2006/picture">
+                <pic:pic xmlns:pic="http://schemas.openxmlformats.org/drawingml/2006/picture">
+                  <pic:nvPicPr>
+                    <pic:cNvPr id="21" name="Picture 21"/>
+                    <pic:cNvPicPr/>
+                  </pic:nvPicPr>
+                  <pic:blipFill>
+                    <a:blip r:embed="rId28" cstate="print">
+                      <a:extLst>
+                        <a:ext uri="{28A0092B-C50C-407E-A947-70E740481C1C}">
+                          <a14:useLocalDpi xmlns:a14="http://schemas.microsoft.com/office/drawing/2010/main" val="0"/>
+                        </a:ext>
+                      </a:extLst>
+                    </a:blip>
+                    <a:stretch>
+                      <a:fillRect/>
+                    </a:stretch>
+                  </pic:blipFill>
+                  <pic:spPr>
+                    <a:xfrm>
+                      <a:off x="0" y="0"/>
+                      <a:ext cx="5791835" cy="2828290"/>
+                    </a:xfrm>
+                    <a:prstGeom prst="rect">
+                      <a:avLst/>
+                    </a:prstGeom>
+                  </pic:spPr>
+                </pic:pic>
+              </a:graphicData>
+            </a:graphic>
+          </wp:inline>
+        </w:drawing>
+      </w:r>
+    </w:p>
+    <w:p>
+      <w:pPr>
+        <w:pStyle w:val="Caption"/>
+        <w:rPr>
+          <w:rFonts w:ascii="Times New Roman" w:hAnsi="Times New Roman" w:cs="Times New Roman"/>
+          <w:sz w:val="26"/>
+          <w:szCs w:val="26"/>
+        </w:rPr>
+      </w:pPr>
+      <w:bookmarkStart w:id="104" w:name="_Toc235797448"/>
+      <w:r>
+        <w:rPr>
+          <w:rFonts w:ascii="Times New Roman" w:hAnsi="Times New Roman" w:cs="Times New Roman"/>
+          <w:sz w:val="26"/>
+          <w:szCs w:val="26"/>
+        </w:rPr>
+        <w:t xml:space="preserve">Hình </w:t>
+      </w:r>
+      <w:r>
+        <w:rPr>
+          <w:rFonts w:ascii="Times New Roman" w:hAnsi="Times New Roman" w:cs="Times New Roman"/>
+          <w:sz w:val="26"/>
+          <w:szCs w:val="26"/>
+        </w:rPr>
+        <w:fldChar w:fldCharType="begin"/>
+      </w:r>
+      <w:r>
+        <w:rPr>
+          <w:rFonts w:ascii="Times New Roman" w:hAnsi="Times New Roman" w:cs="Times New Roman"/>
+          <w:sz w:val="26"/>
+          <w:szCs w:val="26"/>
+        </w:rPr>
+        <w:instrText xml:space="preserve"> SEQ Hình \* ARABIC </w:instrText>
+      </w:r>
+      <w:r>
+        <w:rPr>
+          <w:rFonts w:ascii="Times New Roman" w:hAnsi="Times New Roman" w:cs="Times New Roman"/>
+          <w:sz w:val="26"/>
+          <w:szCs w:val="26"/>
+        </w:rPr>
+        <w:fldChar w:fldCharType="separate"/>
+      </w:r>
+      <w:r>
+        <w:rPr>
+          <w:rFonts w:ascii="Times New Roman" w:hAnsi="Times New Roman" w:cs="Times New Roman"/>
+          <w:noProof/>
+          <w:sz w:val="26"/>
+          <w:szCs w:val="26"/>
+        </w:rPr>
+        <w:t>19</w:t>
+      </w:r>
+      <w:r>
+        <w:rPr>
+          <w:rFonts w:ascii="Times New Roman" w:hAnsi="Times New Roman" w:cs="Times New Roman"/>
+          <w:sz w:val="26"/>
+          <w:szCs w:val="26"/>
+        </w:rPr>
+        <w:fldChar w:fldCharType="end"/>
+      </w:r>
+      <w:r>
+        <w:rPr>
+          <w:rFonts w:ascii="Times New Roman" w:hAnsi="Times New Roman" w:cs="Times New Roman"/>
+          <w:sz w:val="26"/>
+          <w:szCs w:val="26"/>
+        </w:rPr>
+        <w:t>: Dashboard doanh thu bán hàng theo từng năm</w:t>
+      </w:r>
+      <w:bookmarkEnd w:id="104"/>
+    </w:p>
+    <w:p>
+      <w:pPr>
+        <w:keepNext/>
+      </w:pPr>
+      <w:r>
+        <w:rPr>
+          <w:rFonts w:ascii="Times New Roman" w:hAnsi="Times New Roman" w:cs="Times New Roman"/>
+          <w:noProof/>
+          <w:sz w:val="26"/>
+          <w:szCs w:val="26"/>
+        </w:rPr>
+        <w:drawing>
+          <wp:inline distT="0" distB="0" distL="0" distR="0" wp14:anchorId="7430AA1E" wp14:editId="2C4825A4">
+            <wp:extent cx="5791835" cy="2803525"/>
+            <wp:effectExtent l="0" t="0" r="0" b="0"/>
+            <wp:docPr id="22" name="Picture 22"/>
+            <wp:cNvGraphicFramePr>
+              <a:graphicFrameLocks xmlns:a="http://schemas.openxmlformats.org/drawingml/2006/main" noChangeAspect="1"/>
+            </wp:cNvGraphicFramePr>
+            <a:graphic xmlns:a="http://schemas.openxmlformats.org/drawingml/2006/main">
+              <a:graphicData uri="http://schemas.openxmlformats.org/drawingml/2006/picture">
+                <pic:pic xmlns:pic="http://schemas.openxmlformats.org/drawingml/2006/picture">
+                  <pic:nvPicPr>
+                    <pic:cNvPr id="22" name="Picture 22"/>
+                    <pic:cNvPicPr/>
+                  </pic:nvPicPr>
+                  <pic:blipFill>
+                    <a:blip r:embed="rId29" cstate="print">
+                      <a:extLst>
+                        <a:ext uri="{28A0092B-C50C-407E-A947-70E740481C1C}">
+                          <a14:useLocalDpi xmlns:a14="http://schemas.microsoft.com/office/drawing/2010/main" val="0"/>
+                        </a:ext>
+                      </a:extLst>
+                    </a:blip>
+                    <a:stretch>
+                      <a:fillRect/>
+                    </a:stretch>
+                  </pic:blipFill>
+                  <pic:spPr>
+                    <a:xfrm>
+                      <a:off x="0" y="0"/>
+                      <a:ext cx="5791835" cy="2803525"/>
+                    </a:xfrm>
+                    <a:prstGeom prst="rect">
+                      <a:avLst/>
+                    </a:prstGeom>
+                  </pic:spPr>
+                </pic:pic>
+              </a:graphicData>
+            </a:graphic>
+          </wp:inline>
+        </w:drawing>
+      </w:r>
+    </w:p>
+    <w:p>
+      <w:pPr>
+        <w:pStyle w:val="Caption"/>
+        <w:rPr>
+          <w:rFonts w:ascii="Times New Roman" w:hAnsi="Times New Roman" w:cs="Times New Roman"/>
+          <w:sz w:val="26"/>
+          <w:szCs w:val="26"/>
+        </w:rPr>
+      </w:pPr>
+      <w:bookmarkStart w:id="105" w:name="_Toc235797449"/>
+      <w:r>
+        <w:rPr>
+          <w:rFonts w:ascii="Times New Roman" w:hAnsi="Times New Roman" w:cs="Times New Roman"/>
+          <w:sz w:val="26"/>
+          <w:szCs w:val="26"/>
+        </w:rPr>
+        <w:t xml:space="preserve">Hình </w:t>
+      </w:r>
+      <w:r>
+        <w:rPr>
+          <w:rFonts w:ascii="Times New Roman" w:hAnsi="Times New Roman" w:cs="Times New Roman"/>
+          <w:sz w:val="26"/>
+          <w:szCs w:val="26"/>
+        </w:rPr>
+        <w:fldChar w:fldCharType="begin"/>
+      </w:r>
+      <w:r>
+        <w:rPr>
+          <w:rFonts w:ascii="Times New Roman" w:hAnsi="Times New Roman" w:cs="Times New Roman"/>
+          <w:sz w:val="26"/>
+          <w:szCs w:val="26"/>
+        </w:rPr>
+        <w:instrText xml:space="preserve"> SEQ Hình \* ARABIC </w:instrText>
+      </w:r>
+      <w:r>
+        <w:rPr>
+          <w:rFonts w:ascii="Times New Roman" w:hAnsi="Times New Roman" w:cs="Times New Roman"/>
+          <w:sz w:val="26"/>
+          <w:szCs w:val="26"/>
+        </w:rPr>
+        <w:fldChar w:fldCharType="separate"/>
+      </w:r>
+      <w:r>
+        <w:rPr>
+          <w:rFonts w:ascii="Times New Roman" w:hAnsi="Times New Roman" w:cs="Times New Roman"/>
+          <w:noProof/>
+          <w:sz w:val="26"/>
+          <w:szCs w:val="26"/>
+        </w:rPr>
+        <w:t>20</w:t>
+      </w:r>
+      <w:r>
+        <w:rPr>
+          <w:rFonts w:ascii="Times New Roman" w:hAnsi="Times New Roman" w:cs="Times New Roman"/>
+          <w:sz w:val="26"/>
+          <w:szCs w:val="26"/>
+        </w:rPr>
+        <w:fldChar w:fldCharType="end"/>
+      </w:r>
+      <w:r>
+        <w:rPr>
+          <w:rFonts w:ascii="Times New Roman" w:hAnsi="Times New Roman" w:cs="Times New Roman"/>
+          <w:sz w:val="26"/>
+          <w:szCs w:val="26"/>
+        </w:rPr>
+        <w:t>: Dashboard tổng quan các Deal theo giai đoạn và tổng giá trị của Pipeline</w:t>
+      </w:r>
+      <w:bookmarkEnd w:id="105"/>
+    </w:p>
+    <w:p>
+      <w:pPr>
+        <w:rPr>
+          <w:rFonts w:ascii="Times New Roman" w:hAnsi="Times New Roman" w:cs="Times New Roman"/>
+          <w:sz w:val="26"/>
+          <w:szCs w:val="26"/>
+        </w:rPr>
+      </w:pPr>
+      <w:r>
+        <w:rPr>
+          <w:rFonts w:ascii="Times New Roman" w:hAnsi="Times New Roman" w:cs="Times New Roman"/>
+          <w:sz w:val="26"/>
+          <w:szCs w:val="26"/>
+        </w:rPr>
+        <w:t>Dashboard là màn hình đầu tiên khi người dùng đăng nhập vào hệ thống, giúp người dùng nhanh chóng nắm bắt tình hình hoạt động của doanh nghiệp thông qua chỉ số và biểu đồ.</w:t>
+      </w:r>
+    </w:p>
+    <w:p>
+      <w:pPr>
+        <w:keepNext/>
+      </w:pPr>
+      <w:r>
+        <w:rPr>
+          <w:rFonts w:ascii="Times New Roman" w:hAnsi="Times New Roman" w:cs="Times New Roman"/>
+          <w:noProof/>
+          <w:sz w:val="26"/>
+          <w:szCs w:val="26"/>
+        </w:rPr>
+        <w:lastRenderedPageBreak/>
+        <w:drawing>
+          <wp:inline distT="0" distB="0" distL="0" distR="0" wp14:anchorId="3DB51440" wp14:editId="062D953F">
+            <wp:extent cx="5791835" cy="1810385"/>
+            <wp:effectExtent l="0" t="0" r="0" b="0"/>
+            <wp:docPr id="23" name="Picture 23"/>
+            <wp:cNvGraphicFramePr>
+              <a:graphicFrameLocks xmlns:a="http://schemas.openxmlformats.org/drawingml/2006/main" noChangeAspect="1"/>
+            </wp:cNvGraphicFramePr>
+            <a:graphic xmlns:a="http://schemas.openxmlformats.org/drawingml/2006/main">
+              <a:graphicData uri="http://schemas.openxmlformats.org/drawingml/2006/picture">
+                <pic:pic xmlns:pic="http://schemas.openxmlformats.org/drawingml/2006/picture">
+                  <pic:nvPicPr>
+                    <pic:cNvPr id="23" name="Picture 23"/>
+                    <pic:cNvPicPr/>
+                  </pic:nvPicPr>
+                  <pic:blipFill>
+                    <a:blip r:embed="rId30" cstate="print">
+                      <a:extLst>
+                        <a:ext uri="{28A0092B-C50C-407E-A947-70E740481C1C}">
+                          <a14:useLocalDpi xmlns:a14="http://schemas.microsoft.com/office/drawing/2010/main" val="0"/>
+                        </a:ext>
+                      </a:extLst>
+                    </a:blip>
+                    <a:stretch>
+                      <a:fillRect/>
+                    </a:stretch>
+                  </pic:blipFill>
+                  <pic:spPr>
+                    <a:xfrm>
+                      <a:off x="0" y="0"/>
+                      <a:ext cx="5791835" cy="1810385"/>
+                    </a:xfrm>
+                    <a:prstGeom prst="rect">
+                      <a:avLst/>
+                    </a:prstGeom>
+                  </pic:spPr>
+                </pic:pic>
+              </a:graphicData>
+            </a:graphic>
+          </wp:inline>
+        </w:drawing>
+      </w:r>
+    </w:p>
+    <w:p>
+      <w:pPr>
+        <w:pStyle w:val="Caption"/>
+        <w:rPr>
+          <w:rFonts w:ascii="Times New Roman" w:hAnsi="Times New Roman" w:cs="Times New Roman"/>
+          <w:sz w:val="26"/>
+          <w:szCs w:val="26"/>
+        </w:rPr>
+      </w:pPr>
+      <w:bookmarkStart w:id="106" w:name="_Toc235797450"/>
+      <w:r>
+        <w:rPr>
+          <w:rFonts w:ascii="Times New Roman" w:hAnsi="Times New Roman" w:cs="Times New Roman"/>
+          <w:sz w:val="26"/>
+          <w:szCs w:val="26"/>
+        </w:rPr>
+        <w:t xml:space="preserve">Hình </w:t>
+      </w:r>
+      <w:r>
+        <w:rPr>
+          <w:rFonts w:ascii="Times New Roman" w:hAnsi="Times New Roman" w:cs="Times New Roman"/>
+          <w:sz w:val="26"/>
+          <w:szCs w:val="26"/>
+        </w:rPr>
+        <w:fldChar w:fldCharType="begin"/>
+      </w:r>
+      <w:r>
+        <w:rPr>
+          <w:rFonts w:ascii="Times New Roman" w:hAnsi="Times New Roman" w:cs="Times New Roman"/>
+          <w:sz w:val="26"/>
+          <w:szCs w:val="26"/>
+        </w:rPr>
+        <w:instrText xml:space="preserve"> SEQ Hình \* ARABIC </w:instrText>
+      </w:r>
+      <w:r>
+        <w:rPr>
+          <w:rFonts w:ascii="Times New Roman" w:hAnsi="Times New Roman" w:cs="Times New Roman"/>
+          <w:sz w:val="26"/>
+          <w:szCs w:val="26"/>
+        </w:rPr>
+        <w:fldChar w:fldCharType="separate"/>
+      </w:r>
+      <w:r>
+        <w:rPr>
+          <w:rFonts w:ascii="Times New Roman" w:hAnsi="Times New Roman" w:cs="Times New Roman"/>
+          <w:noProof/>
+          <w:sz w:val="26"/>
+          <w:szCs w:val="26"/>
+        </w:rPr>
+        <w:t>21</w:t>
+      </w:r>
+      <w:r>
+        <w:rPr>
+          <w:rFonts w:ascii="Times New Roman" w:hAnsi="Times New Roman" w:cs="Times New Roman"/>
+          <w:sz w:val="26"/>
+          <w:szCs w:val="26"/>
+        </w:rPr>
+        <w:fldChar w:fldCharType="end"/>
+      </w:r>
+      <w:r>
+        <w:rPr>
+          <w:rFonts w:ascii="Times New Roman" w:hAnsi="Times New Roman" w:cs="Times New Roman"/>
+          <w:sz w:val="26"/>
+          <w:szCs w:val="26"/>
+        </w:rPr>
+        <w:t>: Các chỉ số thống kê Lead</w:t>
+      </w:r>
+      <w:bookmarkEnd w:id="106"/>
+    </w:p>
+    <w:p>
+      <w:pPr>
+        <w:keepNext/>
+      </w:pPr>
+      <w:r>
+        <w:rPr>
+          <w:rFonts w:ascii="Times New Roman" w:hAnsi="Times New Roman" w:cs="Times New Roman"/>
+          <w:noProof/>
+          <w:sz w:val="26"/>
+          <w:szCs w:val="26"/>
+        </w:rPr>
+        <w:drawing>
+          <wp:inline distT="0" distB="0" distL="0" distR="0" wp14:anchorId="6C240E32" wp14:editId="1DC35493">
+            <wp:extent cx="5791835" cy="2846705"/>
+            <wp:effectExtent l="0" t="0" r="0" b="0"/>
+            <wp:docPr id="24" name="Picture 24"/>
+            <wp:cNvGraphicFramePr>
+              <a:graphicFrameLocks xmlns:a="http://schemas.openxmlformats.org/drawingml/2006/main" noChangeAspect="1"/>
+            </wp:cNvGraphicFramePr>
+            <a:graphic xmlns:a="http://schemas.openxmlformats.org/drawingml/2006/main">
+              <a:graphicData uri="http://schemas.openxmlformats.org/drawingml/2006/picture">
+                <pic:pic xmlns:pic="http://schemas.openxmlformats.org/drawingml/2006/picture">
+                  <pic:nvPicPr>
+                    <pic:cNvPr id="24" name="Picture 24"/>
+                    <pic:cNvPicPr/>
+                  </pic:nvPicPr>
+                  <pic:blipFill>
+                    <a:blip r:embed="rId31" cstate="print">
+                      <a:extLst>
+                        <a:ext uri="{28A0092B-C50C-407E-A947-70E740481C1C}">
+                          <a14:useLocalDpi xmlns:a14="http://schemas.microsoft.com/office/drawing/2010/main" val="0"/>
+                        </a:ext>
+                      </a:extLst>
+                    </a:blip>
+                    <a:stretch>
+                      <a:fillRect/>
+                    </a:stretch>
+                  </pic:blipFill>
+                  <pic:spPr>
+                    <a:xfrm>
+                      <a:off x="0" y="0"/>
+                      <a:ext cx="5791835" cy="2846705"/>
+                    </a:xfrm>
+                    <a:prstGeom prst="rect">
+                      <a:avLst/>
+                    </a:prstGeom>
+                  </pic:spPr>
+                </pic:pic>
+              </a:graphicData>
+            </a:graphic>
+          </wp:inline>
+        </w:drawing>
+      </w:r>
+    </w:p>
+    <w:p>
+      <w:pPr>
+        <w:pStyle w:val="Caption"/>
+        <w:rPr>
+          <w:rFonts w:ascii="Times New Roman" w:hAnsi="Times New Roman" w:cs="Times New Roman"/>
+          <w:sz w:val="26"/>
+          <w:szCs w:val="26"/>
+        </w:rPr>
+      </w:pPr>
+      <w:bookmarkStart w:id="107" w:name="_Toc235797451"/>
+      <w:r>
+        <w:rPr>
+          <w:rFonts w:ascii="Times New Roman" w:hAnsi="Times New Roman" w:cs="Times New Roman"/>
+          <w:sz w:val="26"/>
+          <w:szCs w:val="26"/>
+        </w:rPr>
+        <w:t xml:space="preserve">Hình </w:t>
+      </w:r>
+      <w:r>
+        <w:rPr>
+          <w:rFonts w:ascii="Times New Roman" w:hAnsi="Times New Roman" w:cs="Times New Roman"/>
+          <w:sz w:val="26"/>
+          <w:szCs w:val="26"/>
+        </w:rPr>
+        <w:fldChar w:fldCharType="begin"/>
+      </w:r>
+      <w:r>
+        <w:rPr>
+          <w:rFonts w:ascii="Times New Roman" w:hAnsi="Times New Roman" w:cs="Times New Roman"/>
+          <w:sz w:val="26"/>
+          <w:szCs w:val="26"/>
+        </w:rPr>
+        <w:instrText xml:space="preserve"> SEQ Hình \* ARABIC </w:instrText>
+      </w:r>
+      <w:r>
+        <w:rPr>
+          <w:rFonts w:ascii="Times New Roman" w:hAnsi="Times New Roman" w:cs="Times New Roman"/>
+          <w:sz w:val="26"/>
+          <w:szCs w:val="26"/>
+        </w:rPr>
+        <w:fldChar w:fldCharType="separate"/>
+      </w:r>
+      <w:r>
+        <w:rPr>
+          <w:rFonts w:ascii="Times New Roman" w:hAnsi="Times New Roman" w:cs="Times New Roman"/>
+          <w:noProof/>
+          <w:sz w:val="26"/>
+          <w:szCs w:val="26"/>
+        </w:rPr>
+        <w:t>22</w:t>
+      </w:r>
+      <w:r>
+        <w:rPr>
+          <w:rFonts w:ascii="Times New Roman" w:hAnsi="Times New Roman" w:cs="Times New Roman"/>
+          <w:sz w:val="26"/>
+          <w:szCs w:val="26"/>
+        </w:rPr>
+        <w:fldChar w:fldCharType="end"/>
+      </w:r>
+      <w:r>
+        <w:rPr>
+          <w:rFonts w:ascii="Times New Roman" w:hAnsi="Times New Roman" w:cs="Times New Roman"/>
+          <w:sz w:val="26"/>
+          <w:szCs w:val="26"/>
+        </w:rPr>
+        <w:t>: Danh sách Lead</w:t>
+      </w:r>
+      <w:bookmarkEnd w:id="107"/>
+    </w:p>
+    <w:p>
+      <w:pPr>
+        <w:rPr>
+          <w:rFonts w:ascii="Times New Roman" w:hAnsi="Times New Roman" w:cs="Times New Roman"/>
+          <w:sz w:val="26"/>
+          <w:szCs w:val="26"/>
+        </w:rPr>
+      </w:pPr>
+      <w:r>
+        <w:rPr>
+          <w:rFonts w:ascii="Times New Roman" w:hAnsi="Times New Roman" w:cs="Times New Roman"/>
+          <w:sz w:val="26"/>
+          <w:szCs w:val="26"/>
+        </w:rPr>
+        <w:t>Giao diện thể hiện tổng số lượng Lead đang có và số lượng theo các trạng thái của Lead. Người dùng có thể tìm kiếm Lead theo nhiều tiêu chí như tên, email</w:t>
+      </w:r>
+      <w:r>
+        <w:rPr>
+          <w:rFonts w:ascii="Times New Roman" w:hAnsi="Times New Roman" w:cs="Times New Roman"/>
+          <w:sz w:val="26"/>
+          <w:szCs w:val="26"/>
+        </w:rPr>
+        <w:t>,</w:t>
+      </w:r>
+      <w:r>
+        <w:rPr>
+          <w:rFonts w:ascii="Times New Roman" w:hAnsi="Times New Roman" w:cs="Times New Roman"/>
+          <w:sz w:val="26"/>
+          <w:szCs w:val="26"/>
+        </w:rPr>
+        <w:t xml:space="preserve"> công ty</w:t>
+      </w:r>
+      <w:r>
+        <w:rPr>
+          <w:rFonts w:ascii="Times New Roman" w:hAnsi="Times New Roman" w:cs="Times New Roman"/>
+          <w:sz w:val="26"/>
+          <w:szCs w:val="26"/>
+        </w:rPr>
+        <w:t xml:space="preserve"> hoặc là lọc danh sách Lead theo trạng thái và nguồn Lead.</w:t>
+      </w:r>
+    </w:p>
+    <w:p>
+      <w:pPr>
+        <w:keepNext/>
+      </w:pPr>
+      <w:r>
+        <w:rPr>
+          <w:rFonts w:ascii="Times New Roman" w:hAnsi="Times New Roman" w:cs="Times New Roman"/>
+          <w:noProof/>
+          <w:sz w:val="26"/>
+          <w:szCs w:val="26"/>
+        </w:rPr>
+        <w:lastRenderedPageBreak/>
+        <w:drawing>
+          <wp:inline distT="0" distB="0" distL="0" distR="0" wp14:anchorId="3758B53C" wp14:editId="378A069A">
+            <wp:extent cx="5791835" cy="2886710"/>
+            <wp:effectExtent l="0" t="0" r="0" b="8890"/>
+            <wp:docPr id="25" name="Picture 25"/>
+            <wp:cNvGraphicFramePr>
+              <a:graphicFrameLocks xmlns:a="http://schemas.openxmlformats.org/drawingml/2006/main" noChangeAspect="1"/>
+            </wp:cNvGraphicFramePr>
+            <a:graphic xmlns:a="http://schemas.openxmlformats.org/drawingml/2006/main">
+              <a:graphicData uri="http://schemas.openxmlformats.org/drawingml/2006/picture">
+                <pic:pic xmlns:pic="http://schemas.openxmlformats.org/drawingml/2006/picture">
+                  <pic:nvPicPr>
+                    <pic:cNvPr id="25" name="Picture 25"/>
+                    <pic:cNvPicPr/>
+                  </pic:nvPicPr>
+                  <pic:blipFill>
+                    <a:blip r:embed="rId32" cstate="print">
+                      <a:extLst>
+                        <a:ext uri="{28A0092B-C50C-407E-A947-70E740481C1C}">
+                          <a14:useLocalDpi xmlns:a14="http://schemas.microsoft.com/office/drawing/2010/main" val="0"/>
+                        </a:ext>
+                      </a:extLst>
+                    </a:blip>
+                    <a:stretch>
+                      <a:fillRect/>
+                    </a:stretch>
+                  </pic:blipFill>
+                  <pic:spPr>
+                    <a:xfrm>
+                      <a:off x="0" y="0"/>
+                      <a:ext cx="5791835" cy="2886710"/>
+                    </a:xfrm>
+                    <a:prstGeom prst="rect">
+                      <a:avLst/>
+                    </a:prstGeom>
+                  </pic:spPr>
+                </pic:pic>
+              </a:graphicData>
+            </a:graphic>
+          </wp:inline>
+        </w:drawing>
+      </w:r>
+    </w:p>
+    <w:p>
+      <w:pPr>
+        <w:pStyle w:val="Caption"/>
+        <w:rPr>
+          <w:rFonts w:ascii="Times New Roman" w:hAnsi="Times New Roman" w:cs="Times New Roman"/>
+          <w:sz w:val="26"/>
+          <w:szCs w:val="26"/>
+        </w:rPr>
+      </w:pPr>
+      <w:bookmarkStart w:id="108" w:name="_Toc235797452"/>
+      <w:r>
+        <w:rPr>
+          <w:rFonts w:ascii="Times New Roman" w:hAnsi="Times New Roman" w:cs="Times New Roman"/>
+          <w:sz w:val="26"/>
+          <w:szCs w:val="26"/>
+        </w:rPr>
+        <w:t xml:space="preserve">Hình </w:t>
+      </w:r>
+      <w:r>
+        <w:rPr>
+          <w:rFonts w:ascii="Times New Roman" w:hAnsi="Times New Roman" w:cs="Times New Roman"/>
+          <w:sz w:val="26"/>
+          <w:szCs w:val="26"/>
+        </w:rPr>
+        <w:fldChar w:fldCharType="begin"/>
+      </w:r>
+      <w:r>
+        <w:rPr>
+          <w:rFonts w:ascii="Times New Roman" w:hAnsi="Times New Roman" w:cs="Times New Roman"/>
+          <w:sz w:val="26"/>
+          <w:szCs w:val="26"/>
+        </w:rPr>
+        <w:instrText xml:space="preserve"> SEQ Hình \* ARABIC </w:instrText>
+      </w:r>
+      <w:r>
+        <w:rPr>
+          <w:rFonts w:ascii="Times New Roman" w:hAnsi="Times New Roman" w:cs="Times New Roman"/>
+          <w:sz w:val="26"/>
+          <w:szCs w:val="26"/>
+        </w:rPr>
+        <w:fldChar w:fldCharType="separate"/>
+      </w:r>
+      <w:r>
+        <w:rPr>
+          <w:rFonts w:ascii="Times New Roman" w:hAnsi="Times New Roman" w:cs="Times New Roman"/>
+          <w:noProof/>
+          <w:sz w:val="26"/>
+          <w:szCs w:val="26"/>
+        </w:rPr>
+        <w:t>23</w:t>
+      </w:r>
+      <w:r>
+        <w:rPr>
+          <w:rFonts w:ascii="Times New Roman" w:hAnsi="Times New Roman" w:cs="Times New Roman"/>
+          <w:sz w:val="26"/>
+          <w:szCs w:val="26"/>
+        </w:rPr>
+        <w:fldChar w:fldCharType="end"/>
+      </w:r>
+      <w:r>
+        <w:rPr>
+          <w:rFonts w:ascii="Times New Roman" w:hAnsi="Times New Roman" w:cs="Times New Roman"/>
+          <w:sz w:val="26"/>
+          <w:szCs w:val="26"/>
+        </w:rPr>
+        <w:t>: Giao diện quản lý Deal</w:t>
+      </w:r>
+      <w:bookmarkEnd w:id="108"/>
+    </w:p>
+    <w:p>
+      <w:pPr>
+        <w:rPr>
+          <w:rFonts w:ascii="Times New Roman" w:hAnsi="Times New Roman" w:cs="Times New Roman"/>
+          <w:sz w:val="26"/>
+          <w:szCs w:val="26"/>
+        </w:rPr>
+      </w:pPr>
+      <w:r>
+        <w:rPr>
+          <w:rFonts w:ascii="Times New Roman" w:hAnsi="Times New Roman" w:cs="Times New Roman"/>
+          <w:sz w:val="26"/>
+          <w:szCs w:val="26"/>
+        </w:rPr>
+        <w:t>Đây là một trong các giao diện quan trọng nhất cho phép tạo Deal mới và lọc Deal theo tên</w:t>
+      </w:r>
+      <w:r>
+        <w:rPr>
+          <w:rFonts w:ascii="Times New Roman" w:hAnsi="Times New Roman" w:cs="Times New Roman"/>
+          <w:sz w:val="26"/>
+          <w:szCs w:val="26"/>
+        </w:rPr>
+        <w:t xml:space="preserve"> của nhân viên phụ trách. Nhân viên có thể kéo – thả các Deal qua từng trạng thái trong Pipeline trong quá trình bán hàng.</w:t>
+      </w:r>
+    </w:p>
+    <w:p>
+      <w:pPr>
+        <w:keepNext/>
+      </w:pPr>
+      <w:r>
+        <w:rPr>
+          <w:rFonts w:ascii="Times New Roman" w:hAnsi="Times New Roman" w:cs="Times New Roman"/>
+          <w:noProof/>
+          <w:sz w:val="26"/>
+          <w:szCs w:val="26"/>
+        </w:rPr>
+        <w:drawing>
+          <wp:inline distT="0" distB="0" distL="0" distR="0" wp14:anchorId="7CF5C40D" wp14:editId="1952D53A">
+            <wp:extent cx="5791835" cy="2687955"/>
+            <wp:effectExtent l="0" t="0" r="0" b="0"/>
+            <wp:docPr id="26" name="Picture 26"/>
+            <wp:cNvGraphicFramePr>
+              <a:graphicFrameLocks xmlns:a="http://schemas.openxmlformats.org/drawingml/2006/main" noChangeAspect="1"/>
+            </wp:cNvGraphicFramePr>
+            <a:graphic xmlns:a="http://schemas.openxmlformats.org/drawingml/2006/main">
+              <a:graphicData uri="http://schemas.openxmlformats.org/drawingml/2006/picture">
+                <pic:pic xmlns:pic="http://schemas.openxmlformats.org/drawingml/2006/picture">
+                  <pic:nvPicPr>
+                    <pic:cNvPr id="26" name="Picture 26"/>
+                    <pic:cNvPicPr/>
+                  </pic:nvPicPr>
+                  <pic:blipFill>
+                    <a:blip r:embed="rId33" cstate="print">
+                      <a:extLst>
+                        <a:ext uri="{28A0092B-C50C-407E-A947-70E740481C1C}">
+                          <a14:useLocalDpi xmlns:a14="http://schemas.microsoft.com/office/drawing/2010/main" val="0"/>
+                        </a:ext>
+                      </a:extLst>
+                    </a:blip>
+                    <a:stretch>
+                      <a:fillRect/>
+                    </a:stretch>
+                  </pic:blipFill>
+                  <pic:spPr>
+                    <a:xfrm>
+                      <a:off x="0" y="0"/>
+                      <a:ext cx="5791835" cy="2687955"/>
+                    </a:xfrm>
+                    <a:prstGeom prst="rect">
+                      <a:avLst/>
+                    </a:prstGeom>
+                  </pic:spPr>
+                </pic:pic>
+              </a:graphicData>
+            </a:graphic>
+          </wp:inline>
+        </w:drawing>
+      </w:r>
+    </w:p>
+    <w:p>
+      <w:pPr>
+        <w:pStyle w:val="Caption"/>
+        <w:rPr>
+          <w:rFonts w:ascii="Times New Roman" w:hAnsi="Times New Roman" w:cs="Times New Roman"/>
+          <w:sz w:val="26"/>
+          <w:szCs w:val="26"/>
+        </w:rPr>
+      </w:pPr>
+      <w:bookmarkStart w:id="109" w:name="_Toc235797453"/>
+      <w:r>
+        <w:rPr>
+          <w:rFonts w:ascii="Times New Roman" w:hAnsi="Times New Roman" w:cs="Times New Roman"/>
+          <w:sz w:val="26"/>
+          <w:szCs w:val="26"/>
+        </w:rPr>
+        <w:t xml:space="preserve">Hình </w:t>
+      </w:r>
+      <w:r>
+        <w:rPr>
+          <w:rFonts w:ascii="Times New Roman" w:hAnsi="Times New Roman" w:cs="Times New Roman"/>
+          <w:sz w:val="26"/>
+          <w:szCs w:val="26"/>
+        </w:rPr>
+        <w:fldChar w:fldCharType="begin"/>
+      </w:r>
+      <w:r>
+        <w:rPr>
+          <w:rFonts w:ascii="Times New Roman" w:hAnsi="Times New Roman" w:cs="Times New Roman"/>
+          <w:sz w:val="26"/>
+          <w:szCs w:val="26"/>
+        </w:rPr>
+        <w:instrText xml:space="preserve"> SEQ Hình \* ARABIC </w:instrText>
+      </w:r>
+      <w:r>
+        <w:rPr>
+          <w:rFonts w:ascii="Times New Roman" w:hAnsi="Times New Roman" w:cs="Times New Roman"/>
+          <w:sz w:val="26"/>
+          <w:szCs w:val="26"/>
+        </w:rPr>
+        <w:fldChar w:fldCharType="separate"/>
+      </w:r>
+      <w:r>
+        <w:rPr>
+          <w:rFonts w:ascii="Times New Roman" w:hAnsi="Times New Roman" w:cs="Times New Roman"/>
+          <w:noProof/>
+          <w:sz w:val="26"/>
+          <w:szCs w:val="26"/>
+        </w:rPr>
+        <w:t>24</w:t>
+      </w:r>
+      <w:r>
+        <w:rPr>
+          <w:rFonts w:ascii="Times New Roman" w:hAnsi="Times New Roman" w:cs="Times New Roman"/>
+          <w:sz w:val="26"/>
+          <w:szCs w:val="26"/>
+        </w:rPr>
+        <w:fldChar w:fldCharType="end"/>
+      </w:r>
+      <w:r>
+        <w:rPr>
+          <w:rFonts w:ascii="Times New Roman" w:hAnsi="Times New Roman" w:cs="Times New Roman"/>
+          <w:sz w:val="26"/>
+          <w:szCs w:val="26"/>
+        </w:rPr>
+        <w:t>: Tổng quan quan lý người dùng</w:t>
+      </w:r>
+      <w:bookmarkEnd w:id="109"/>
+    </w:p>
+    <w:p>
+      <w:pPr>
+        <w:keepNext/>
+      </w:pPr>
+      <w:r>
+        <w:rPr>
+          <w:rFonts w:ascii="Times New Roman" w:hAnsi="Times New Roman" w:cs="Times New Roman"/>
+          <w:noProof/>
+          <w:sz w:val="26"/>
+          <w:szCs w:val="26"/>
+        </w:rPr>
+        <w:lastRenderedPageBreak/>
+        <w:drawing>
+          <wp:inline distT="0" distB="0" distL="0" distR="0" wp14:anchorId="796B9A62" wp14:editId="151D259C">
+            <wp:extent cx="5791835" cy="2851150"/>
+            <wp:effectExtent l="0" t="0" r="0" b="6350"/>
+            <wp:docPr id="27" name="Picture 27"/>
+            <wp:cNvGraphicFramePr>
+              <a:graphicFrameLocks xmlns:a="http://schemas.openxmlformats.org/drawingml/2006/main" noChangeAspect="1"/>
+            </wp:cNvGraphicFramePr>
+            <a:graphic xmlns:a="http://schemas.openxmlformats.org/drawingml/2006/main">
+              <a:graphicData uri="http://schemas.openxmlformats.org/drawingml/2006/picture">
+                <pic:pic xmlns:pic="http://schemas.openxmlformats.org/drawingml/2006/picture">
+                  <pic:nvPicPr>
+                    <pic:cNvPr id="27" name="Picture 27"/>
+                    <pic:cNvPicPr/>
+                  </pic:nvPicPr>
+                  <pic:blipFill>
+                    <a:blip r:embed="rId34" cstate="print">
+                      <a:extLst>
+                        <a:ext uri="{28A0092B-C50C-407E-A947-70E740481C1C}">
+                          <a14:useLocalDpi xmlns:a14="http://schemas.microsoft.com/office/drawing/2010/main" val="0"/>
+                        </a:ext>
+                      </a:extLst>
+                    </a:blip>
+                    <a:stretch>
+                      <a:fillRect/>
+                    </a:stretch>
+                  </pic:blipFill>
+                  <pic:spPr>
+                    <a:xfrm>
+                      <a:off x="0" y="0"/>
+                      <a:ext cx="5791835" cy="2851150"/>
+                    </a:xfrm>
+                    <a:prstGeom prst="rect">
+                      <a:avLst/>
+                    </a:prstGeom>
+                  </pic:spPr>
+                </pic:pic>
+              </a:graphicData>
+            </a:graphic>
+          </wp:inline>
+        </w:drawing>
+      </w:r>
+    </w:p>
+    <w:p>
+      <w:pPr>
+        <w:pStyle w:val="Caption"/>
+        <w:rPr>
+          <w:rFonts w:ascii="Times New Roman" w:hAnsi="Times New Roman" w:cs="Times New Roman"/>
+          <w:sz w:val="26"/>
+          <w:szCs w:val="26"/>
+        </w:rPr>
+      </w:pPr>
+      <w:bookmarkStart w:id="110" w:name="_Toc235797454"/>
+      <w:r>
+        <w:rPr>
+          <w:rFonts w:ascii="Times New Roman" w:hAnsi="Times New Roman" w:cs="Times New Roman"/>
+          <w:sz w:val="26"/>
+          <w:szCs w:val="26"/>
+        </w:rPr>
+        <w:t xml:space="preserve">Hình </w:t>
+      </w:r>
+      <w:r>
+        <w:rPr>
+          <w:rFonts w:ascii="Times New Roman" w:hAnsi="Times New Roman" w:cs="Times New Roman"/>
+          <w:sz w:val="26"/>
+          <w:szCs w:val="26"/>
+        </w:rPr>
+        <w:fldChar w:fldCharType="begin"/>
+      </w:r>
+      <w:r>
+        <w:rPr>
+          <w:rFonts w:ascii="Times New Roman" w:hAnsi="Times New Roman" w:cs="Times New Roman"/>
+          <w:sz w:val="26"/>
+          <w:szCs w:val="26"/>
+        </w:rPr>
+        <w:instrText xml:space="preserve"> SEQ Hình \* ARABIC </w:instrText>
+      </w:r>
+      <w:r>
+        <w:rPr>
+          <w:rFonts w:ascii="Times New Roman" w:hAnsi="Times New Roman" w:cs="Times New Roman"/>
+          <w:sz w:val="26"/>
+          <w:szCs w:val="26"/>
+        </w:rPr>
+        <w:fldChar w:fldCharType="separate"/>
+      </w:r>
+      <w:r>
+        <w:rPr>
+          <w:rFonts w:ascii="Times New Roman" w:hAnsi="Times New Roman" w:cs="Times New Roman"/>
+          <w:noProof/>
+          <w:sz w:val="26"/>
+          <w:szCs w:val="26"/>
+        </w:rPr>
+        <w:t>25</w:t>
+      </w:r>
+      <w:r>
+        <w:rPr>
+          <w:rFonts w:ascii="Times New Roman" w:hAnsi="Times New Roman" w:cs="Times New Roman"/>
+          <w:sz w:val="26"/>
+          <w:szCs w:val="26"/>
+        </w:rPr>
+        <w:fldChar w:fldCharType="end"/>
+      </w:r>
+      <w:r>
+        <w:rPr>
+          <w:rFonts w:ascii="Times New Roman" w:hAnsi="Times New Roman" w:cs="Times New Roman"/>
+          <w:sz w:val="26"/>
+          <w:szCs w:val="26"/>
+        </w:rPr>
+        <w:t>: Danh sách người dùng</w:t>
+      </w:r>
+      <w:bookmarkEnd w:id="110"/>
+    </w:p>
+    <w:p>
+      <w:pPr>
+        <w:rPr>
+          <w:rFonts w:ascii="Times New Roman" w:hAnsi="Times New Roman" w:cs="Times New Roman"/>
+          <w:sz w:val="26"/>
+          <w:szCs w:val="26"/>
+        </w:rPr>
+      </w:pPr>
+      <w:r>
+        <w:rPr>
+          <w:rFonts w:ascii="Times New Roman" w:hAnsi="Times New Roman" w:cs="Times New Roman"/>
+          <w:sz w:val="26"/>
+          <w:szCs w:val="26"/>
+        </w:rPr>
+        <w:t>Đây là giao diện dành cho Admin để quản lý tất cả người dùng trong hệ thống.</w:t>
+      </w:r>
+      <w:r>
+        <w:rPr>
+          <w:rFonts w:ascii="Times New Roman" w:hAnsi="Times New Roman" w:cs="Times New Roman"/>
+          <w:sz w:val="26"/>
+          <w:szCs w:val="26"/>
+        </w:rPr>
+        <w:t xml:space="preserve"> Đầu tiên sẽ là tổng số lượng người dùng và số lượng theo các trạng thái. Tiếp theo là danh sách người dùng hiện tại thể hiện trực quan các thuộc tính của từng người dùng. Admin có thể thay đổi thông tin của người dùng, tìm kiếm theo tên hoặc email, lọc danh sách người dùng theo vai trò hoặc trạng thái.</w:t>
+      </w:r>
       <w:r>
         <w:rPr>
           <w:rFonts w:ascii="Times New Roman" w:hAnsi="Times New Roman" w:cs="Times New Roman"/>
@@ -19528,8 +21740,8 @@
           <w:rFonts w:ascii="Times New Roman" w:hAnsi="Times New Roman" w:cs="Times New Roman"/>
         </w:rPr>
       </w:pPr>
-      <w:bookmarkStart w:id="98" w:name="_Toc235563729"/>
-      <w:bookmarkStart w:id="99" w:name="_Toc235741257"/>
+      <w:bookmarkStart w:id="111" w:name="_Toc235563729"/>
+      <w:bookmarkStart w:id="112" w:name="_Toc235800799"/>
       <w:r>
         <w:rPr>
           <w:rFonts w:ascii="Times New Roman" w:hAnsi="Times New Roman" w:cs="Times New Roman"/>
@@ -19537,8 +21749,8 @@
         <w:lastRenderedPageBreak/>
         <w:t>TÀI LIỆU THAM KHẢO</w:t>
       </w:r>
-      <w:bookmarkEnd w:id="98"/>
-      <w:bookmarkEnd w:id="99"/>
+      <w:bookmarkEnd w:id="111"/>
+      <w:bookmarkEnd w:id="112"/>
     </w:p>
     <w:p>
       <w:pPr>
@@ -19550,7 +21762,7 @@
           <w:szCs w:val="26"/>
         </w:rPr>
       </w:pPr>
-      <w:hyperlink r:id="rId26" w:history="1">
+      <w:hyperlink r:id="rId35" w:history="1">
         <w:r>
           <w:rPr>
             <w:rStyle w:val="Hyperlink"/>
@@ -19569,7 +21781,7 @@
           <w:szCs w:val="26"/>
         </w:rPr>
       </w:pPr>
-      <w:hyperlink r:id="rId27" w:history="1">
+      <w:hyperlink r:id="rId36" w:history="1">
         <w:r>
           <w:rPr>
             <w:rStyle w:val="Hyperlink"/>
@@ -19602,7 +21814,7 @@
           <w:szCs w:val="26"/>
         </w:rPr>
       </w:pPr>
-      <w:hyperlink r:id="rId28" w:history="1">
+      <w:hyperlink r:id="rId37" w:history="1">
         <w:r>
           <w:rPr>
             <w:rStyle w:val="Hyperlink"/>
@@ -19621,7 +21833,7 @@
           <w:szCs w:val="26"/>
         </w:rPr>
       </w:pPr>
-      <w:hyperlink r:id="rId29" w:history="1">
+      <w:hyperlink r:id="rId38" w:history="1">
         <w:r>
           <w:rPr>
             <w:rStyle w:val="Hyperlink"/>
@@ -19640,7 +21852,7 @@
           <w:szCs w:val="26"/>
         </w:rPr>
       </w:pPr>
-      <w:hyperlink r:id="rId30" w:history="1">
+      <w:hyperlink r:id="rId39" w:history="1">
         <w:r>
           <w:rPr>
             <w:rStyle w:val="Hyperlink"/>
@@ -19654,7 +21866,7 @@
         <w:spacing w:line="360" w:lineRule="auto"/>
         <w:ind w:left="360"/>
       </w:pPr>
-      <w:hyperlink r:id="rId31" w:history="1">
+      <w:hyperlink r:id="rId40" w:history="1">
         <w:r>
           <w:rPr>
             <w:rStyle w:val="Hyperlink"/>
@@ -19674,7 +21886,7 @@
       </w:pPr>
     </w:p>
     <w:sectPr>
-      <w:headerReference w:type="default" r:id="rId32"/>
+      <w:headerReference w:type="default" r:id="rId41"/>
       <w:pgSz w:w="12240" w:h="15840"/>
       <w:pgMar w:top="1134" w:right="1134" w:bottom="1134" w:left="1985" w:header="720" w:footer="720" w:gutter="0"/>
       <w:cols w:space="720"/>

</xml_diff>

<commit_message>
feat: Cập nhật tài liệu tham khảo và trích dẫn
</commit_message>
<xml_diff>
--- a/docs/BaoCao/BaoCao.docx
+++ b/docs/BaoCao/BaoCao.docx
@@ -103,7 +103,7 @@
           <w:sz w:val="26"/>
           <w:szCs w:val="26"/>
         </w:rPr>
-        <w:t>--------------------------------------------------------</w:t>
+        <w:t>Ngành Khoa học máy tính</w:t>
       </w:r>
     </w:p>
     <w:p>
@@ -119,12 +119,31 @@
       <w:r>
         <w:rPr>
           <w:rFonts w:ascii="Times New Roman" w:hAnsi="Times New Roman" w:cs="Times New Roman"/>
+          <w:sz w:val="26"/>
+          <w:szCs w:val="26"/>
+        </w:rPr>
+        <w:t>--------------------------------------------------------</w:t>
+      </w:r>
+    </w:p>
+    <w:p>
+      <w:pPr>
+        <w:spacing w:line="360" w:lineRule="auto"/>
+        <w:jc w:val="center"/>
+        <w:rPr>
+          <w:rFonts w:ascii="Times New Roman" w:hAnsi="Times New Roman" w:cs="Times New Roman"/>
+          <w:sz w:val="26"/>
+          <w:szCs w:val="26"/>
+        </w:rPr>
+      </w:pPr>
+      <w:r>
+        <w:rPr>
+          <w:rFonts w:ascii="Times New Roman" w:hAnsi="Times New Roman" w:cs="Times New Roman"/>
           <w:noProof/>
         </w:rPr>
         <w:drawing>
-          <wp:inline distT="0" distB="0" distL="0" distR="0" wp14:anchorId="537EAE04" wp14:editId="0DA979F8">
-            <wp:extent cx="3567545" cy="2526488"/>
-            <wp:effectExtent l="0" t="0" r="0" b="7620"/>
+          <wp:inline distT="0" distB="0" distL="0" distR="0" wp14:anchorId="537EAE04" wp14:editId="4B181157">
+            <wp:extent cx="3965781" cy="2808514"/>
+            <wp:effectExtent l="0" t="0" r="0" b="0"/>
             <wp:docPr id="1" name="Picture 1"/>
             <wp:cNvGraphicFramePr>
               <a:graphicFrameLocks xmlns:a="http://schemas.openxmlformats.org/drawingml/2006/main" noChangeAspect="1"/>
@@ -154,7 +173,7 @@
                   <pic:spPr bwMode="auto">
                     <a:xfrm>
                       <a:off x="0" y="0"/>
-                      <a:ext cx="3580113" cy="2535389"/>
+                      <a:ext cx="3996313" cy="2830136"/>
                     </a:xfrm>
                     <a:prstGeom prst="rect">
                       <a:avLst/>
@@ -179,8 +198,8 @@
           <w:rFonts w:ascii="Times New Roman" w:hAnsi="Times New Roman" w:cs="Times New Roman"/>
           <w:b/>
           <w:bCs/>
-          <w:sz w:val="36"/>
-          <w:szCs w:val="36"/>
+          <w:sz w:val="32"/>
+          <w:szCs w:val="32"/>
         </w:rPr>
       </w:pPr>
       <w:r>
@@ -188,8 +207,8 @@
           <w:rFonts w:ascii="Times New Roman" w:hAnsi="Times New Roman" w:cs="Times New Roman"/>
           <w:b/>
           <w:bCs/>
-          <w:sz w:val="36"/>
-          <w:szCs w:val="36"/>
+          <w:sz w:val="32"/>
+          <w:szCs w:val="32"/>
         </w:rPr>
         <w:t>BÁO CÁO ĐỒ ÁN NGÀNH</w:t>
       </w:r>
@@ -223,6 +242,14 @@
           <w:szCs w:val="26"/>
         </w:rPr>
       </w:pPr>
+      <w:r>
+        <w:rPr>
+          <w:rFonts w:ascii="Times New Roman" w:hAnsi="Times New Roman" w:cs="Times New Roman"/>
+          <w:sz w:val="26"/>
+          <w:szCs w:val="26"/>
+        </w:rPr>
+        <w:t>Giáo viên hướng dẫn: Võ Việt Khoa</w:t>
+      </w:r>
     </w:p>
     <w:p>
       <w:pPr>
@@ -234,6 +261,14 @@
           <w:szCs w:val="26"/>
         </w:rPr>
       </w:pPr>
+      <w:r>
+        <w:rPr>
+          <w:rFonts w:ascii="Times New Roman" w:hAnsi="Times New Roman" w:cs="Times New Roman"/>
+          <w:sz w:val="26"/>
+          <w:szCs w:val="26"/>
+        </w:rPr>
+        <w:t>Họ tên: Lê Khánh Duy</w:t>
+      </w:r>
     </w:p>
     <w:p>
       <w:pPr>
@@ -251,7 +286,7 @@
           <w:sz w:val="26"/>
           <w:szCs w:val="26"/>
         </w:rPr>
-        <w:t>Giáo viên hướng dẫn: Võ Việt Khoa</w:t>
+        <w:t>MSSV: 2351010032</w:t>
       </w:r>
     </w:p>
     <w:p>
@@ -270,7 +305,7 @@
           <w:sz w:val="26"/>
           <w:szCs w:val="26"/>
         </w:rPr>
-        <w:t>Họ tên: Lê Khánh Duy</w:t>
+        <w:t>Lớp: DH23CS02</w:t>
       </w:r>
     </w:p>
     <w:p>
@@ -289,7 +324,15 @@
           <w:sz w:val="26"/>
           <w:szCs w:val="26"/>
         </w:rPr>
-        <w:t>MSSV: 2351010032</w:t>
+        <w:t>Học kỳ III – Năm học 2025-</w:t>
+      </w:r>
+      <w:r>
+        <w:rPr>
+          <w:rFonts w:ascii="Times New Roman" w:hAnsi="Times New Roman" w:cs="Times New Roman"/>
+          <w:sz w:val="26"/>
+          <w:szCs w:val="26"/>
+        </w:rPr>
+        <w:t>2026</w:t>
       </w:r>
     </w:p>
     <w:p>
@@ -308,44 +351,34 @@
           <w:sz w:val="26"/>
           <w:szCs w:val="26"/>
         </w:rPr>
-        <w:t>Lớp: DH23CS02</w:t>
+        <w:t>Thành phố Hồ Chí Minh, năm 2026</w:t>
       </w:r>
     </w:p>
     <w:p>
       <w:pPr>
         <w:spacing w:line="360" w:lineRule="auto"/>
-        <w:jc w:val="center"/>
-        <w:rPr>
-          <w:rFonts w:ascii="Times New Roman" w:hAnsi="Times New Roman" w:cs="Times New Roman"/>
-          <w:sz w:val="26"/>
-          <w:szCs w:val="26"/>
-        </w:rPr>
-      </w:pPr>
-      <w:r>
-        <w:rPr>
-          <w:rFonts w:ascii="Times New Roman" w:hAnsi="Times New Roman" w:cs="Times New Roman"/>
-          <w:sz w:val="26"/>
-          <w:szCs w:val="26"/>
-        </w:rPr>
-        <w:t>Thành phố Hồ Chí Minh, năm 2026</w:t>
-      </w:r>
-    </w:p>
-    <w:p>
-      <w:pPr>
-        <w:spacing w:line="360" w:lineRule="auto"/>
-        <w:rPr>
-          <w:rFonts w:ascii="Times New Roman" w:hAnsi="Times New Roman" w:cs="Times New Roman"/>
-          <w:sz w:val="26"/>
-          <w:szCs w:val="26"/>
-        </w:rPr>
-      </w:pPr>
-      <w:r>
-        <w:rPr>
-          <w:rFonts w:ascii="Times New Roman" w:hAnsi="Times New Roman" w:cs="Times New Roman"/>
-          <w:sz w:val="26"/>
-          <w:szCs w:val="26"/>
-        </w:rPr>
-        <w:lastRenderedPageBreak/>
+        <w:rPr>
+          <w:rFonts w:ascii="Times New Roman" w:hAnsi="Times New Roman" w:cs="Times New Roman"/>
+          <w:sz w:val="26"/>
+          <w:szCs w:val="26"/>
+        </w:rPr>
+      </w:pPr>
+    </w:p>
+    <w:p>
+      <w:pPr>
+        <w:rPr>
+          <w:rFonts w:ascii="Times New Roman" w:eastAsiaTheme="majorEastAsia" w:hAnsi="Times New Roman" w:cs="Times New Roman"/>
+          <w:color w:val="2F5496" w:themeColor="accent1" w:themeShade="BF"/>
+          <w:sz w:val="32"/>
+          <w:szCs w:val="32"/>
+        </w:rPr>
+      </w:pPr>
+      <w:bookmarkStart w:id="0" w:name="_Toc235563698"/>
+      <w:bookmarkStart w:id="1" w:name="_Toc235807264"/>
+      <w:r>
+        <w:rPr>
+          <w:rFonts w:ascii="Times New Roman" w:hAnsi="Times New Roman" w:cs="Times New Roman"/>
+        </w:rPr>
         <w:br w:type="page"/>
       </w:r>
     </w:p>
@@ -357,8 +390,6 @@
           <w:rFonts w:ascii="Times New Roman" w:hAnsi="Times New Roman" w:cs="Times New Roman"/>
         </w:rPr>
       </w:pPr>
-      <w:bookmarkStart w:id="0" w:name="_Toc235563698"/>
-      <w:bookmarkStart w:id="1" w:name="_Toc235807264"/>
       <w:r>
         <w:rPr>
           <w:rFonts w:ascii="Times New Roman" w:hAnsi="Times New Roman" w:cs="Times New Roman"/>
@@ -1560,7 +1591,23 @@
                 <w:rFonts w:ascii="Times New Roman" w:hAnsi="Times New Roman" w:cs="Times New Roman"/>
                 <w:noProof/>
               </w:rPr>
-              <w:t>Hệ thống HubSpot CRM</w:t>
+              <w:t>Hệ thống HubSp</w:t>
+            </w:r>
+            <w:r>
+              <w:rPr>
+                <w:rStyle w:val="Hyperlink"/>
+                <w:rFonts w:ascii="Times New Roman" w:hAnsi="Times New Roman" w:cs="Times New Roman"/>
+                <w:noProof/>
+              </w:rPr>
+              <w:t>o</w:t>
+            </w:r>
+            <w:r>
+              <w:rPr>
+                <w:rStyle w:val="Hyperlink"/>
+                <w:rFonts w:ascii="Times New Roman" w:hAnsi="Times New Roman" w:cs="Times New Roman"/>
+                <w:noProof/>
+              </w:rPr>
+              <w:t>t CRM</w:t>
             </w:r>
             <w:r>
               <w:rPr>
@@ -1770,7 +1817,39 @@
                 <w:rFonts w:ascii="Times New Roman" w:hAnsi="Times New Roman" w:cs="Times New Roman"/>
                 <w:noProof/>
               </w:rPr>
-              <w:t>Sales Pipeline</w:t>
+              <w:t>Sales Pip</w:t>
+            </w:r>
+            <w:r>
+              <w:rPr>
+                <w:rStyle w:val="Hyperlink"/>
+                <w:rFonts w:ascii="Times New Roman" w:hAnsi="Times New Roman" w:cs="Times New Roman"/>
+                <w:noProof/>
+              </w:rPr>
+              <w:t>e</w:t>
+            </w:r>
+            <w:r>
+              <w:rPr>
+                <w:rStyle w:val="Hyperlink"/>
+                <w:rFonts w:ascii="Times New Roman" w:hAnsi="Times New Roman" w:cs="Times New Roman"/>
+                <w:noProof/>
+              </w:rPr>
+              <w:t>l</w:t>
+            </w:r>
+            <w:r>
+              <w:rPr>
+                <w:rStyle w:val="Hyperlink"/>
+                <w:rFonts w:ascii="Times New Roman" w:hAnsi="Times New Roman" w:cs="Times New Roman"/>
+                <w:noProof/>
+              </w:rPr>
+              <w:t>i</w:t>
+            </w:r>
+            <w:r>
+              <w:rPr>
+                <w:rStyle w:val="Hyperlink"/>
+                <w:rFonts w:ascii="Times New Roman" w:hAnsi="Times New Roman" w:cs="Times New Roman"/>
+                <w:noProof/>
+              </w:rPr>
+              <w:t>ne</w:t>
             </w:r>
             <w:r>
               <w:rPr>
@@ -1840,7 +1919,23 @@
                 <w:rFonts w:ascii="Times New Roman" w:hAnsi="Times New Roman" w:cs="Times New Roman"/>
                 <w:noProof/>
               </w:rPr>
-              <w:t>Sales Forecast</w:t>
+              <w:t>Sales Fo</w:t>
+            </w:r>
+            <w:r>
+              <w:rPr>
+                <w:rStyle w:val="Hyperlink"/>
+                <w:rFonts w:ascii="Times New Roman" w:hAnsi="Times New Roman" w:cs="Times New Roman"/>
+                <w:noProof/>
+              </w:rPr>
+              <w:t>r</w:t>
+            </w:r>
+            <w:r>
+              <w:rPr>
+                <w:rStyle w:val="Hyperlink"/>
+                <w:rFonts w:ascii="Times New Roman" w:hAnsi="Times New Roman" w:cs="Times New Roman"/>
+                <w:noProof/>
+              </w:rPr>
+              <w:t>ecast</w:t>
             </w:r>
             <w:r>
               <w:rPr>
@@ -3310,23 +3405,7 @@
                 <w:rFonts w:ascii="Times New Roman" w:hAnsi="Times New Roman" w:cs="Times New Roman"/>
                 <w:noProof/>
               </w:rPr>
-              <w:t>MA TRẬN TR</w:t>
-            </w:r>
-            <w:r>
-              <w:rPr>
-                <w:rStyle w:val="Hyperlink"/>
-                <w:rFonts w:ascii="Times New Roman" w:hAnsi="Times New Roman" w:cs="Times New Roman"/>
-                <w:noProof/>
-              </w:rPr>
-              <w:t>U</w:t>
-            </w:r>
-            <w:r>
-              <w:rPr>
-                <w:rStyle w:val="Hyperlink"/>
-                <w:rFonts w:ascii="Times New Roman" w:hAnsi="Times New Roman" w:cs="Times New Roman"/>
-                <w:noProof/>
-              </w:rPr>
-              <w:t>Y VẾT</w:t>
+              <w:t>MA TRẬN TRUY VẾT</w:t>
             </w:r>
             <w:r>
               <w:rPr>
@@ -6943,42 +7022,8 @@
       <w:r>
         <w:fldChar w:fldCharType="end"/>
       </w:r>
-      <w:r>
-        <w:fldChar w:fldCharType="begin"/>
-      </w:r>
-      <w:r>
-        <w:instrText xml:space="preserve"> TOC \h \z \c "B</w:instrText>
-      </w:r>
-      <w:r>
-        <w:instrText>ả</w:instrText>
-      </w:r>
-      <w:r>
-        <w:instrText xml:space="preserve">ng" </w:instrText>
-      </w:r>
-      <w:r>
-        <w:fldChar w:fldCharType="separate"/>
-      </w:r>
-      <w:r>
-        <w:fldChar w:fldCharType="end"/>
-      </w:r>
-      <w:r>
-        <w:fldChar w:fldCharType="begin"/>
-      </w:r>
-      <w:r>
-        <w:instrText xml:space="preserve"> TOC \h \z \c "B</w:instrText>
-      </w:r>
-      <w:r>
-        <w:instrText>ả</w:instrText>
-      </w:r>
-      <w:r>
-        <w:instrText xml:space="preserve">ng" </w:instrText>
-      </w:r>
-      <w:r>
-        <w:fldChar w:fldCharType="separate"/>
-      </w:r>
-      <w:r>
-        <w:fldChar w:fldCharType="end"/>
-      </w:r>
+      <w:fldSimple w:instr=" TOC \h \z \c &quot;Bảng&quot; "/>
+      <w:fldSimple w:instr=" TOC \h \z \c &quot;Bảng&quot; "/>
       <w:r>
         <w:br w:type="page"/>
       </w:r>
@@ -6991,10 +7036,306 @@
         <w:t>DANH MỤC TỪ VIẾT TẮT</w:t>
       </w:r>
       <w:bookmarkEnd w:id="7"/>
-      <w:r>
-        <w:rPr>
-          <w:rFonts w:ascii="Times New Roman" w:hAnsi="Times New Roman" w:cs="Times New Roman"/>
-        </w:rPr>
+    </w:p>
+    <w:p>
+      <w:pPr>
+        <w:rPr>
+          <w:rFonts w:ascii="Times New Roman" w:hAnsi="Times New Roman" w:cs="Times New Roman"/>
+          <w:sz w:val="26"/>
+          <w:szCs w:val="26"/>
+        </w:rPr>
+      </w:pPr>
+      <w:r>
+        <w:rPr>
+          <w:rFonts w:ascii="Times New Roman" w:hAnsi="Times New Roman" w:cs="Times New Roman"/>
+          <w:sz w:val="26"/>
+          <w:szCs w:val="26"/>
+        </w:rPr>
+        <w:t>CRM: Customer Relationship Management</w:t>
+      </w:r>
+    </w:p>
+    <w:p>
+      <w:pPr>
+        <w:rPr>
+          <w:rFonts w:ascii="Times New Roman" w:hAnsi="Times New Roman" w:cs="Times New Roman"/>
+          <w:sz w:val="26"/>
+          <w:szCs w:val="26"/>
+        </w:rPr>
+      </w:pPr>
+      <w:r>
+        <w:rPr>
+          <w:rFonts w:ascii="Times New Roman" w:hAnsi="Times New Roman" w:cs="Times New Roman"/>
+          <w:sz w:val="26"/>
+          <w:szCs w:val="26"/>
+        </w:rPr>
+        <w:t>API: Application Programming Interface</w:t>
+      </w:r>
+    </w:p>
+    <w:p>
+      <w:pPr>
+        <w:rPr>
+          <w:rFonts w:ascii="Times New Roman" w:hAnsi="Times New Roman" w:cs="Times New Roman"/>
+          <w:sz w:val="26"/>
+          <w:szCs w:val="26"/>
+        </w:rPr>
+      </w:pPr>
+      <w:r>
+        <w:rPr>
+          <w:rFonts w:ascii="Times New Roman" w:hAnsi="Times New Roman" w:cs="Times New Roman"/>
+          <w:sz w:val="26"/>
+          <w:szCs w:val="26"/>
+        </w:rPr>
+        <w:t>REST: Representational State Transfer</w:t>
+      </w:r>
+    </w:p>
+    <w:p>
+      <w:pPr>
+        <w:rPr>
+          <w:rFonts w:ascii="Times New Roman" w:hAnsi="Times New Roman" w:cs="Times New Roman"/>
+          <w:sz w:val="26"/>
+          <w:szCs w:val="26"/>
+        </w:rPr>
+      </w:pPr>
+      <w:r>
+        <w:rPr>
+          <w:rFonts w:ascii="Times New Roman" w:hAnsi="Times New Roman" w:cs="Times New Roman"/>
+          <w:sz w:val="26"/>
+          <w:szCs w:val="26"/>
+        </w:rPr>
+        <w:t>HTTP: HyperText Transfer Protocol</w:t>
+      </w:r>
+    </w:p>
+    <w:p>
+      <w:pPr>
+        <w:rPr>
+          <w:rFonts w:ascii="Times New Roman" w:hAnsi="Times New Roman" w:cs="Times New Roman"/>
+          <w:sz w:val="26"/>
+          <w:szCs w:val="26"/>
+        </w:rPr>
+      </w:pPr>
+      <w:r>
+        <w:rPr>
+          <w:rFonts w:ascii="Times New Roman" w:hAnsi="Times New Roman" w:cs="Times New Roman"/>
+          <w:sz w:val="26"/>
+          <w:szCs w:val="26"/>
+        </w:rPr>
+        <w:t>JSON: JavaScript Object Notation</w:t>
+      </w:r>
+    </w:p>
+    <w:p>
+      <w:pPr>
+        <w:rPr>
+          <w:rFonts w:ascii="Times New Roman" w:hAnsi="Times New Roman" w:cs="Times New Roman"/>
+          <w:sz w:val="26"/>
+          <w:szCs w:val="26"/>
+        </w:rPr>
+      </w:pPr>
+      <w:r>
+        <w:rPr>
+          <w:rFonts w:ascii="Times New Roman" w:hAnsi="Times New Roman" w:cs="Times New Roman"/>
+          <w:sz w:val="26"/>
+          <w:szCs w:val="26"/>
+        </w:rPr>
+        <w:t>URL: Uniform Resource Location</w:t>
+      </w:r>
+    </w:p>
+    <w:p>
+      <w:pPr>
+        <w:rPr>
+          <w:rFonts w:ascii="Times New Roman" w:hAnsi="Times New Roman" w:cs="Times New Roman"/>
+          <w:sz w:val="26"/>
+          <w:szCs w:val="26"/>
+        </w:rPr>
+      </w:pPr>
+      <w:r>
+        <w:rPr>
+          <w:rFonts w:ascii="Times New Roman" w:hAnsi="Times New Roman" w:cs="Times New Roman"/>
+          <w:sz w:val="26"/>
+          <w:szCs w:val="26"/>
+        </w:rPr>
+        <w:t>RBAC: Role-Based Access Control</w:t>
+      </w:r>
+    </w:p>
+    <w:p>
+      <w:pPr>
+        <w:rPr>
+          <w:rFonts w:ascii="Times New Roman" w:hAnsi="Times New Roman" w:cs="Times New Roman"/>
+          <w:sz w:val="26"/>
+          <w:szCs w:val="26"/>
+        </w:rPr>
+      </w:pPr>
+      <w:r>
+        <w:rPr>
+          <w:rFonts w:ascii="Times New Roman" w:hAnsi="Times New Roman" w:cs="Times New Roman"/>
+          <w:sz w:val="26"/>
+          <w:szCs w:val="26"/>
+        </w:rPr>
+        <w:t>ORM: Object Relational Mapping</w:t>
+      </w:r>
+    </w:p>
+    <w:p>
+      <w:pPr>
+        <w:rPr>
+          <w:rFonts w:ascii="Times New Roman" w:hAnsi="Times New Roman" w:cs="Times New Roman"/>
+          <w:sz w:val="26"/>
+          <w:szCs w:val="26"/>
+        </w:rPr>
+      </w:pPr>
+      <w:r>
+        <w:rPr>
+          <w:rFonts w:ascii="Times New Roman" w:hAnsi="Times New Roman" w:cs="Times New Roman"/>
+          <w:sz w:val="26"/>
+          <w:szCs w:val="26"/>
+        </w:rPr>
+        <w:t>SQL: Structured Query Language</w:t>
+      </w:r>
+    </w:p>
+    <w:p>
+      <w:pPr>
+        <w:rPr>
+          <w:rFonts w:ascii="Times New Roman" w:hAnsi="Times New Roman" w:cs="Times New Roman"/>
+          <w:sz w:val="26"/>
+          <w:szCs w:val="26"/>
+        </w:rPr>
+      </w:pPr>
+      <w:r>
+        <w:rPr>
+          <w:rFonts w:ascii="Times New Roman" w:hAnsi="Times New Roman" w:cs="Times New Roman"/>
+          <w:sz w:val="26"/>
+          <w:szCs w:val="26"/>
+        </w:rPr>
+        <w:t>CRUD: Create, Read, Update, Delete</w:t>
+      </w:r>
+    </w:p>
+    <w:p>
+      <w:pPr>
+        <w:rPr>
+          <w:rFonts w:ascii="Times New Roman" w:hAnsi="Times New Roman" w:cs="Times New Roman"/>
+          <w:sz w:val="26"/>
+          <w:szCs w:val="26"/>
+        </w:rPr>
+      </w:pPr>
+      <w:r>
+        <w:rPr>
+          <w:rFonts w:ascii="Times New Roman" w:hAnsi="Times New Roman" w:cs="Times New Roman"/>
+          <w:sz w:val="26"/>
+          <w:szCs w:val="26"/>
+        </w:rPr>
+        <w:t xml:space="preserve">KPI: </w:t>
+      </w:r>
+      <w:r>
+        <w:rPr>
+          <w:rFonts w:ascii="Times New Roman" w:hAnsi="Times New Roman" w:cs="Times New Roman"/>
+          <w:sz w:val="26"/>
+          <w:szCs w:val="26"/>
+        </w:rPr>
+        <w:t>Key Performance Indicator</w:t>
+      </w:r>
+    </w:p>
+    <w:p>
+      <w:pPr>
+        <w:rPr>
+          <w:rFonts w:ascii="Times New Roman" w:hAnsi="Times New Roman" w:cs="Times New Roman"/>
+          <w:sz w:val="26"/>
+          <w:szCs w:val="26"/>
+        </w:rPr>
+      </w:pPr>
+      <w:r>
+        <w:rPr>
+          <w:rFonts w:ascii="Times New Roman" w:hAnsi="Times New Roman" w:cs="Times New Roman"/>
+          <w:sz w:val="26"/>
+          <w:szCs w:val="26"/>
+        </w:rPr>
+        <w:t>SRS: Software Requirements Specification</w:t>
+      </w:r>
+    </w:p>
+    <w:p>
+      <w:pPr>
+        <w:rPr>
+          <w:rFonts w:ascii="Times New Roman" w:hAnsi="Times New Roman" w:cs="Times New Roman"/>
+          <w:sz w:val="26"/>
+          <w:szCs w:val="26"/>
+        </w:rPr>
+      </w:pPr>
+      <w:r>
+        <w:rPr>
+          <w:rFonts w:ascii="Times New Roman" w:hAnsi="Times New Roman" w:cs="Times New Roman"/>
+          <w:sz w:val="26"/>
+          <w:szCs w:val="26"/>
+        </w:rPr>
+        <w:t>UML: Unified Modeling Language</w:t>
+      </w:r>
+    </w:p>
+    <w:p>
+      <w:pPr>
+        <w:rPr>
+          <w:rFonts w:ascii="Times New Roman" w:hAnsi="Times New Roman" w:cs="Times New Roman"/>
+          <w:sz w:val="26"/>
+          <w:szCs w:val="26"/>
+        </w:rPr>
+      </w:pPr>
+      <w:r>
+        <w:rPr>
+          <w:rFonts w:ascii="Times New Roman" w:hAnsi="Times New Roman" w:cs="Times New Roman"/>
+          <w:sz w:val="26"/>
+          <w:szCs w:val="26"/>
+        </w:rPr>
+        <w:t>ERD: Entity Relationship Diagram</w:t>
+      </w:r>
+    </w:p>
+    <w:p>
+      <w:pPr>
+        <w:rPr>
+          <w:rFonts w:ascii="Times New Roman" w:hAnsi="Times New Roman" w:cs="Times New Roman"/>
+          <w:sz w:val="26"/>
+          <w:szCs w:val="26"/>
+        </w:rPr>
+      </w:pPr>
+      <w:r>
+        <w:rPr>
+          <w:rFonts w:ascii="Times New Roman" w:hAnsi="Times New Roman" w:cs="Times New Roman"/>
+          <w:sz w:val="26"/>
+          <w:szCs w:val="26"/>
+        </w:rPr>
+        <w:t>SVG: Scalable Vector Graphics</w:t>
+      </w:r>
+    </w:p>
+    <w:p>
+      <w:pPr>
+        <w:rPr>
+          <w:rFonts w:ascii="Times New Roman" w:hAnsi="Times New Roman" w:cs="Times New Roman"/>
+          <w:sz w:val="26"/>
+          <w:szCs w:val="26"/>
+        </w:rPr>
+      </w:pPr>
+      <w:r>
+        <w:rPr>
+          <w:rFonts w:ascii="Times New Roman" w:hAnsi="Times New Roman" w:cs="Times New Roman"/>
+          <w:sz w:val="26"/>
+          <w:szCs w:val="26"/>
+        </w:rPr>
+        <w:t>SSR: Server-Side Rendering</w:t>
+      </w:r>
+    </w:p>
+    <w:p>
+      <w:pPr>
+        <w:rPr>
+          <w:rFonts w:ascii="Times New Roman" w:hAnsi="Times New Roman" w:cs="Times New Roman"/>
+          <w:sz w:val="26"/>
+          <w:szCs w:val="26"/>
+        </w:rPr>
+      </w:pPr>
+      <w:r>
+        <w:rPr>
+          <w:rFonts w:ascii="Times New Roman" w:hAnsi="Times New Roman" w:cs="Times New Roman"/>
+          <w:sz w:val="26"/>
+          <w:szCs w:val="26"/>
+        </w:rPr>
+        <w:t>SSG: Static Site Generation</w:t>
+      </w:r>
+    </w:p>
+    <w:p>
+      <w:r>
         <w:br w:type="page"/>
       </w:r>
     </w:p>
@@ -9174,7 +9515,78 @@
           <w:sz w:val="26"/>
           <w:szCs w:val="26"/>
         </w:rPr>
-        <w:t>Won/Lost: Hoàn tất hoặc không hoàn tất giao dịch. Nếu hoàn tất thì sẽ chuyển khách hàng sang giai đoạn chăm sóc.</w:t>
+        <w:t>Won/Lost: Hoàn tất hoặc không hoàn tất giao dịch. Nếu hoàn tất thì sẽ chuyển khách hàng sang giai đoạn chăm sóc</w:t>
+      </w:r>
+      <w:sdt>
+        <w:sdtPr>
+          <w:rPr>
+            <w:rFonts w:ascii="Times New Roman" w:hAnsi="Times New Roman" w:cs="Times New Roman"/>
+            <w:sz w:val="26"/>
+            <w:szCs w:val="26"/>
+          </w:rPr>
+          <w:id w:val="548036211"/>
+          <w:citation/>
+        </w:sdtPr>
+        <w:sdtContent>
+          <w:r>
+            <w:rPr>
+              <w:rFonts w:ascii="Times New Roman" w:hAnsi="Times New Roman" w:cs="Times New Roman"/>
+              <w:sz w:val="26"/>
+              <w:szCs w:val="26"/>
+            </w:rPr>
+            <w:fldChar w:fldCharType="begin"/>
+          </w:r>
+          <w:r>
+            <w:rPr>
+              <w:rFonts w:ascii="Times New Roman" w:hAnsi="Times New Roman" w:cs="Times New Roman"/>
+              <w:sz w:val="26"/>
+              <w:szCs w:val="26"/>
+            </w:rPr>
+            <w:instrText xml:space="preserve">CITATION Mar25 \l 1033 </w:instrText>
+          </w:r>
+          <w:r>
+            <w:rPr>
+              <w:rFonts w:ascii="Times New Roman" w:hAnsi="Times New Roman" w:cs="Times New Roman"/>
+              <w:sz w:val="26"/>
+              <w:szCs w:val="26"/>
+            </w:rPr>
+            <w:fldChar w:fldCharType="separate"/>
+          </w:r>
+          <w:r>
+            <w:rPr>
+              <w:rFonts w:ascii="Times New Roman" w:hAnsi="Times New Roman" w:cs="Times New Roman"/>
+              <w:noProof/>
+              <w:sz w:val="26"/>
+              <w:szCs w:val="26"/>
+            </w:rPr>
+            <w:t xml:space="preserve"> </w:t>
+          </w:r>
+          <w:r>
+            <w:rPr>
+              <w:rFonts w:ascii="Times New Roman" w:hAnsi="Times New Roman" w:cs="Times New Roman"/>
+              <w:noProof/>
+              <w:sz w:val="26"/>
+              <w:szCs w:val="26"/>
+            </w:rPr>
+            <w:t>[1]</w:t>
+          </w:r>
+          <w:r>
+            <w:rPr>
+              <w:rFonts w:ascii="Times New Roman" w:hAnsi="Times New Roman" w:cs="Times New Roman"/>
+              <w:sz w:val="26"/>
+              <w:szCs w:val="26"/>
+            </w:rPr>
+            <w:fldChar w:fldCharType="end"/>
+          </w:r>
+        </w:sdtContent>
+      </w:sdt>
+      <w:r>
+        <w:rPr>
+          <w:rFonts w:ascii="Times New Roman" w:hAnsi="Times New Roman" w:cs="Times New Roman"/>
+          <w:sz w:val="26"/>
+          <w:szCs w:val="26"/>
+        </w:rPr>
+        <w:t>.</w:t>
       </w:r>
     </w:p>
     <w:p>
@@ -9213,7 +9625,78 @@
           <w:sz w:val="26"/>
           <w:szCs w:val="26"/>
         </w:rPr>
-        <w:t>Là quá trình ước tính doanh thu mà doanh nghiệp có thể đạt được trong tương lai dựa trên Deal đang có trong Sales Pipeline. Thông qua việc phân tích giá trị từng Deal và khả năng thành công, Sales Forecast giúp doanh nghiệp dự đoán doanh thu dự kiến, từ đó hỗ trợ lập kế hoạch kinh doanh, phân bổ nguồn lực và đưa ra các quyết định.</w:t>
+        <w:t>Là quá trình ước tính doanh thu mà doanh nghiệp có thể đạt được trong tương lai dựa trên Deal đang có trong Sales Pipeline. Thông qua việc phân tích giá trị từng Deal và khả năng thành công, Sales Forecast giúp doanh nghiệp dự đoán doanh thu dự kiến, từ đó hỗ trợ lập kế hoạch kinh doanh, phân bổ nguồn lực và đưa ra các quyết định</w:t>
+      </w:r>
+      <w:sdt>
+        <w:sdtPr>
+          <w:rPr>
+            <w:rFonts w:ascii="Times New Roman" w:hAnsi="Times New Roman" w:cs="Times New Roman"/>
+            <w:sz w:val="26"/>
+            <w:szCs w:val="26"/>
+          </w:rPr>
+          <w:id w:val="2136984348"/>
+          <w:citation/>
+        </w:sdtPr>
+        <w:sdtContent>
+          <w:r>
+            <w:rPr>
+              <w:rFonts w:ascii="Times New Roman" w:hAnsi="Times New Roman" w:cs="Times New Roman"/>
+              <w:sz w:val="26"/>
+              <w:szCs w:val="26"/>
+            </w:rPr>
+            <w:fldChar w:fldCharType="begin"/>
+          </w:r>
+          <w:r>
+            <w:rPr>
+              <w:rFonts w:ascii="Times New Roman" w:hAnsi="Times New Roman" w:cs="Times New Roman"/>
+              <w:sz w:val="26"/>
+              <w:szCs w:val="26"/>
+            </w:rPr>
+            <w:instrText xml:space="preserve"> CITATION Jay25 \l 1033 </w:instrText>
+          </w:r>
+          <w:r>
+            <w:rPr>
+              <w:rFonts w:ascii="Times New Roman" w:hAnsi="Times New Roman" w:cs="Times New Roman"/>
+              <w:sz w:val="26"/>
+              <w:szCs w:val="26"/>
+            </w:rPr>
+            <w:fldChar w:fldCharType="separate"/>
+          </w:r>
+          <w:r>
+            <w:rPr>
+              <w:rFonts w:ascii="Times New Roman" w:hAnsi="Times New Roman" w:cs="Times New Roman"/>
+              <w:noProof/>
+              <w:sz w:val="26"/>
+              <w:szCs w:val="26"/>
+            </w:rPr>
+            <w:t xml:space="preserve"> </w:t>
+          </w:r>
+          <w:r>
+            <w:rPr>
+              <w:rFonts w:ascii="Times New Roman" w:hAnsi="Times New Roman" w:cs="Times New Roman"/>
+              <w:noProof/>
+              <w:sz w:val="26"/>
+              <w:szCs w:val="26"/>
+            </w:rPr>
+            <w:t>[2]</w:t>
+          </w:r>
+          <w:r>
+            <w:rPr>
+              <w:rFonts w:ascii="Times New Roman" w:hAnsi="Times New Roman" w:cs="Times New Roman"/>
+              <w:sz w:val="26"/>
+              <w:szCs w:val="26"/>
+            </w:rPr>
+            <w:fldChar w:fldCharType="end"/>
+          </w:r>
+        </w:sdtContent>
+      </w:sdt>
+      <w:r>
+        <w:rPr>
+          <w:rFonts w:ascii="Times New Roman" w:hAnsi="Times New Roman" w:cs="Times New Roman"/>
+          <w:sz w:val="26"/>
+          <w:szCs w:val="26"/>
+        </w:rPr>
+        <w:t>.</w:t>
       </w:r>
     </w:p>
     <w:p>
@@ -9453,7 +9936,78 @@
           <w:sz w:val="26"/>
           <w:szCs w:val="26"/>
         </w:rPr>
-        <w:t>RBAC giúp ích rất nhiều cho hệ thống CRM, chúng giúp quản lý quyền truy cập một cách tập trung, giảm sự trùng lặp trong việc phân quyền và tăng tính bảo mật dữ liệu đối với các người dùng ngoài quyền truy cập. Ngoài ra RBAC còn hỗ trợ khả năng mở rộng hệ thống khi phát sinh thêm vai trò mới trong tương lai.</w:t>
+        <w:t>RBAC giúp ích rất nhiều cho hệ thống CRM, chúng giúp quản lý quyền truy cập một cách tập trung, giảm sự trùng lặp trong việc phân quyền và tăng tính bảo mật dữ liệu đối với các người dùng ngoài quyền truy cập. Ngoài ra RBAC còn hỗ trợ khả năng mở rộng hệ thống khi phát sinh thêm vai trò mới trong tương lai</w:t>
+      </w:r>
+      <w:sdt>
+        <w:sdtPr>
+          <w:rPr>
+            <w:rFonts w:ascii="Times New Roman" w:hAnsi="Times New Roman" w:cs="Times New Roman"/>
+            <w:sz w:val="26"/>
+            <w:szCs w:val="26"/>
+          </w:rPr>
+          <w:id w:val="-218134695"/>
+          <w:citation/>
+        </w:sdtPr>
+        <w:sdtContent>
+          <w:r>
+            <w:rPr>
+              <w:rFonts w:ascii="Times New Roman" w:hAnsi="Times New Roman" w:cs="Times New Roman"/>
+              <w:sz w:val="26"/>
+              <w:szCs w:val="26"/>
+            </w:rPr>
+            <w:fldChar w:fldCharType="begin"/>
+          </w:r>
+          <w:r>
+            <w:rPr>
+              <w:rFonts w:ascii="Times New Roman" w:hAnsi="Times New Roman" w:cs="Times New Roman"/>
+              <w:sz w:val="26"/>
+              <w:szCs w:val="26"/>
+            </w:rPr>
+            <w:instrText xml:space="preserve"> CITATION Rav96 \l 1033 </w:instrText>
+          </w:r>
+          <w:r>
+            <w:rPr>
+              <w:rFonts w:ascii="Times New Roman" w:hAnsi="Times New Roman" w:cs="Times New Roman"/>
+              <w:sz w:val="26"/>
+              <w:szCs w:val="26"/>
+            </w:rPr>
+            <w:fldChar w:fldCharType="separate"/>
+          </w:r>
+          <w:r>
+            <w:rPr>
+              <w:rFonts w:ascii="Times New Roman" w:hAnsi="Times New Roman" w:cs="Times New Roman"/>
+              <w:noProof/>
+              <w:sz w:val="26"/>
+              <w:szCs w:val="26"/>
+            </w:rPr>
+            <w:t xml:space="preserve"> </w:t>
+          </w:r>
+          <w:r>
+            <w:rPr>
+              <w:rFonts w:ascii="Times New Roman" w:hAnsi="Times New Roman" w:cs="Times New Roman"/>
+              <w:noProof/>
+              <w:sz w:val="26"/>
+              <w:szCs w:val="26"/>
+            </w:rPr>
+            <w:t>[3]</w:t>
+          </w:r>
+          <w:r>
+            <w:rPr>
+              <w:rFonts w:ascii="Times New Roman" w:hAnsi="Times New Roman" w:cs="Times New Roman"/>
+              <w:sz w:val="26"/>
+              <w:szCs w:val="26"/>
+            </w:rPr>
+            <w:fldChar w:fldCharType="end"/>
+          </w:r>
+        </w:sdtContent>
+      </w:sdt>
+      <w:r>
+        <w:rPr>
+          <w:rFonts w:ascii="Times New Roman" w:hAnsi="Times New Roman" w:cs="Times New Roman"/>
+          <w:sz w:val="26"/>
+          <w:szCs w:val="26"/>
+        </w:rPr>
+        <w:t>.</w:t>
       </w:r>
     </w:p>
     <w:p>
@@ -9520,7 +10074,78 @@
           <w:sz w:val="26"/>
           <w:szCs w:val="26"/>
         </w:rPr>
-        <w:t>RESTful API giúp tách biệt phần front-end và back-end, nhờ đó mà hai thành phần này có thể được phát triển, bảo trì và mở rộng độc lập với nhau.</w:t>
+        <w:t>RESTful API giúp tách biệt phần front-end và back-end, nhờ đó mà hai thành phần này có thể được phát triển, bảo trì và mở rộng độc lập với nhau</w:t>
+      </w:r>
+      <w:sdt>
+        <w:sdtPr>
+          <w:rPr>
+            <w:rFonts w:ascii="Times New Roman" w:hAnsi="Times New Roman" w:cs="Times New Roman"/>
+            <w:sz w:val="26"/>
+            <w:szCs w:val="26"/>
+          </w:rPr>
+          <w:id w:val="-1289196247"/>
+          <w:citation/>
+        </w:sdtPr>
+        <w:sdtContent>
+          <w:r>
+            <w:rPr>
+              <w:rFonts w:ascii="Times New Roman" w:hAnsi="Times New Roman" w:cs="Times New Roman"/>
+              <w:sz w:val="26"/>
+              <w:szCs w:val="26"/>
+            </w:rPr>
+            <w:fldChar w:fldCharType="begin"/>
+          </w:r>
+          <w:r>
+            <w:rPr>
+              <w:rFonts w:ascii="Times New Roman" w:hAnsi="Times New Roman" w:cs="Times New Roman"/>
+              <w:sz w:val="26"/>
+              <w:szCs w:val="26"/>
+            </w:rPr>
+            <w:instrText xml:space="preserve"> CITATION Roy00 \l 1033 </w:instrText>
+          </w:r>
+          <w:r>
+            <w:rPr>
+              <w:rFonts w:ascii="Times New Roman" w:hAnsi="Times New Roman" w:cs="Times New Roman"/>
+              <w:sz w:val="26"/>
+              <w:szCs w:val="26"/>
+            </w:rPr>
+            <w:fldChar w:fldCharType="separate"/>
+          </w:r>
+          <w:r>
+            <w:rPr>
+              <w:rFonts w:ascii="Times New Roman" w:hAnsi="Times New Roman" w:cs="Times New Roman"/>
+              <w:noProof/>
+              <w:sz w:val="26"/>
+              <w:szCs w:val="26"/>
+            </w:rPr>
+            <w:t xml:space="preserve"> </w:t>
+          </w:r>
+          <w:r>
+            <w:rPr>
+              <w:rFonts w:ascii="Times New Roman" w:hAnsi="Times New Roman" w:cs="Times New Roman"/>
+              <w:noProof/>
+              <w:sz w:val="26"/>
+              <w:szCs w:val="26"/>
+            </w:rPr>
+            <w:t>[4]</w:t>
+          </w:r>
+          <w:r>
+            <w:rPr>
+              <w:rFonts w:ascii="Times New Roman" w:hAnsi="Times New Roman" w:cs="Times New Roman"/>
+              <w:sz w:val="26"/>
+              <w:szCs w:val="26"/>
+            </w:rPr>
+            <w:fldChar w:fldCharType="end"/>
+          </w:r>
+        </w:sdtContent>
+      </w:sdt>
+      <w:r>
+        <w:rPr>
+          <w:rFonts w:ascii="Times New Roman" w:hAnsi="Times New Roman" w:cs="Times New Roman"/>
+          <w:sz w:val="26"/>
+          <w:szCs w:val="26"/>
+        </w:rPr>
+        <w:t>.</w:t>
       </w:r>
     </w:p>
     <w:p>
@@ -9720,7 +10345,78 @@
           <w:sz w:val="26"/>
           <w:szCs w:val="26"/>
         </w:rPr>
-        <w:t>Trong kiến trúc này, mỗi module sẽ bao gồm đầy đủ các thành phần cần thiết để xử lý nghiệp vụ của mình như Controller, Service, Repository. Các module chỉ giao tiếp với nhau thông qua các giao diện hoặc API đã được định nghĩa, giúp giảm sự phụ thuộc giữa các thành phần trong hệ thống.</w:t>
+        <w:t>Trong kiến trúc này, mỗi module sẽ bao gồm đầy đủ các thành phần cần thiết để xử lý nghiệp vụ của mình như Controller, Service, Repository. Các module chỉ giao tiếp với nhau thông qua các giao diện hoặc API đã được định nghĩa, giúp giảm sự phụ thuộc giữa các thành phần trong hệ thống</w:t>
+      </w:r>
+      <w:sdt>
+        <w:sdtPr>
+          <w:rPr>
+            <w:rFonts w:ascii="Times New Roman" w:hAnsi="Times New Roman" w:cs="Times New Roman"/>
+            <w:sz w:val="26"/>
+            <w:szCs w:val="26"/>
+          </w:rPr>
+          <w:id w:val="1396088567"/>
+          <w:citation/>
+        </w:sdtPr>
+        <w:sdtContent>
+          <w:r>
+            <w:rPr>
+              <w:rFonts w:ascii="Times New Roman" w:hAnsi="Times New Roman" w:cs="Times New Roman"/>
+              <w:sz w:val="26"/>
+              <w:szCs w:val="26"/>
+            </w:rPr>
+            <w:fldChar w:fldCharType="begin"/>
+          </w:r>
+          <w:r>
+            <w:rPr>
+              <w:rFonts w:ascii="Times New Roman" w:hAnsi="Times New Roman" w:cs="Times New Roman"/>
+              <w:sz w:val="26"/>
+              <w:szCs w:val="26"/>
+            </w:rPr>
+            <w:instrText xml:space="preserve"> CITATION Nes26 \l 1033 </w:instrText>
+          </w:r>
+          <w:r>
+            <w:rPr>
+              <w:rFonts w:ascii="Times New Roman" w:hAnsi="Times New Roman" w:cs="Times New Roman"/>
+              <w:sz w:val="26"/>
+              <w:szCs w:val="26"/>
+            </w:rPr>
+            <w:fldChar w:fldCharType="separate"/>
+          </w:r>
+          <w:r>
+            <w:rPr>
+              <w:rFonts w:ascii="Times New Roman" w:hAnsi="Times New Roman" w:cs="Times New Roman"/>
+              <w:noProof/>
+              <w:sz w:val="26"/>
+              <w:szCs w:val="26"/>
+            </w:rPr>
+            <w:t xml:space="preserve"> </w:t>
+          </w:r>
+          <w:r>
+            <w:rPr>
+              <w:rFonts w:ascii="Times New Roman" w:hAnsi="Times New Roman" w:cs="Times New Roman"/>
+              <w:noProof/>
+              <w:sz w:val="26"/>
+              <w:szCs w:val="26"/>
+            </w:rPr>
+            <w:t>[5]</w:t>
+          </w:r>
+          <w:r>
+            <w:rPr>
+              <w:rFonts w:ascii="Times New Roman" w:hAnsi="Times New Roman" w:cs="Times New Roman"/>
+              <w:sz w:val="26"/>
+              <w:szCs w:val="26"/>
+            </w:rPr>
+            <w:fldChar w:fldCharType="end"/>
+          </w:r>
+        </w:sdtContent>
+      </w:sdt>
+      <w:r>
+        <w:rPr>
+          <w:rFonts w:ascii="Times New Roman" w:hAnsi="Times New Roman" w:cs="Times New Roman"/>
+          <w:sz w:val="26"/>
+          <w:szCs w:val="26"/>
+        </w:rPr>
+        <w:t>.</w:t>
       </w:r>
     </w:p>
     <w:p>
@@ -9965,7 +10661,78 @@
           <w:sz w:val="26"/>
           <w:szCs w:val="26"/>
         </w:rPr>
-        <w:t>Next.js hoạt động dựa trên React, trong đó mỗi trang được xây dựng từ các component. Khi người dùng thực hiện một thao tác trên giao diện, Next.js sẽ gửi các yêu cầu HTTP thông qua RESTful API đến Back-end. Sau khi nhận dữ liệu phản hồi, giao diện sẽ được cập nhật tương ứng mà không cần tải lại toàn bộ trang.</w:t>
+        <w:t>Next.js hoạt động dựa trên React, trong đó mỗi trang được xây dựng từ các component. Khi người dùng thực hiện một thao tác trên giao diện, Next.js sẽ gửi các yêu cầu HTTP thông qua RESTful API đến Back-end. Sau khi nhận dữ liệu phản hồi, giao diện sẽ được cập nhật tương ứng mà không cần tải lại toàn bộ trang</w:t>
+      </w:r>
+      <w:sdt>
+        <w:sdtPr>
+          <w:rPr>
+            <w:rFonts w:ascii="Times New Roman" w:hAnsi="Times New Roman" w:cs="Times New Roman"/>
+            <w:sz w:val="26"/>
+            <w:szCs w:val="26"/>
+          </w:rPr>
+          <w:id w:val="-1977760252"/>
+          <w:citation/>
+        </w:sdtPr>
+        <w:sdtContent>
+          <w:r>
+            <w:rPr>
+              <w:rFonts w:ascii="Times New Roman" w:hAnsi="Times New Roman" w:cs="Times New Roman"/>
+              <w:sz w:val="26"/>
+              <w:szCs w:val="26"/>
+            </w:rPr>
+            <w:fldChar w:fldCharType="begin"/>
+          </w:r>
+          <w:r>
+            <w:rPr>
+              <w:rFonts w:ascii="Times New Roman" w:hAnsi="Times New Roman" w:cs="Times New Roman"/>
+              <w:sz w:val="26"/>
+              <w:szCs w:val="26"/>
+            </w:rPr>
+            <w:instrText xml:space="preserve"> CITATION Ver26 \l 1033 </w:instrText>
+          </w:r>
+          <w:r>
+            <w:rPr>
+              <w:rFonts w:ascii="Times New Roman" w:hAnsi="Times New Roman" w:cs="Times New Roman"/>
+              <w:sz w:val="26"/>
+              <w:szCs w:val="26"/>
+            </w:rPr>
+            <w:fldChar w:fldCharType="separate"/>
+          </w:r>
+          <w:r>
+            <w:rPr>
+              <w:rFonts w:ascii="Times New Roman" w:hAnsi="Times New Roman" w:cs="Times New Roman"/>
+              <w:noProof/>
+              <w:sz w:val="26"/>
+              <w:szCs w:val="26"/>
+            </w:rPr>
+            <w:t xml:space="preserve"> </w:t>
+          </w:r>
+          <w:r>
+            <w:rPr>
+              <w:rFonts w:ascii="Times New Roman" w:hAnsi="Times New Roman" w:cs="Times New Roman"/>
+              <w:noProof/>
+              <w:sz w:val="26"/>
+              <w:szCs w:val="26"/>
+            </w:rPr>
+            <w:t>[6]</w:t>
+          </w:r>
+          <w:r>
+            <w:rPr>
+              <w:rFonts w:ascii="Times New Roman" w:hAnsi="Times New Roman" w:cs="Times New Roman"/>
+              <w:sz w:val="26"/>
+              <w:szCs w:val="26"/>
+            </w:rPr>
+            <w:fldChar w:fldCharType="end"/>
+          </w:r>
+        </w:sdtContent>
+      </w:sdt>
+      <w:r>
+        <w:rPr>
+          <w:rFonts w:ascii="Times New Roman" w:hAnsi="Times New Roman" w:cs="Times New Roman"/>
+          <w:sz w:val="26"/>
+          <w:szCs w:val="26"/>
+        </w:rPr>
+        <w:t>.</w:t>
       </w:r>
     </w:p>
     <w:p>
@@ -10054,7 +10821,78 @@
           <w:sz w:val="26"/>
           <w:szCs w:val="26"/>
         </w:rPr>
-        <w:t xml:space="preserve">Sử dụng dnd-kit trong đề tài Hệ thống CRM và quản lý phễu bán hàng cho doanh nghiệp nhỏ để triển khai chức năng kéo – thả trên phễu bán hàng của Sales, hệ thống sẽ tự động cập nhật giai đoạn của Deal trong cơ sở dữ liệu thông qua RESTful API. </w:t>
+        <w:t>Sử dụng dnd-kit trong đề tài Hệ thống CRM và quản lý phễu bán hàng cho doanh nghiệp nhỏ để triển khai chức năng kéo – thả trên phễu bán hàng của Sales, hệ thống sẽ tự động cập nhật giai đoạn của Deal trong cơ sở dữ liệu thông qua RESTful API</w:t>
+      </w:r>
+      <w:sdt>
+        <w:sdtPr>
+          <w:rPr>
+            <w:rFonts w:ascii="Times New Roman" w:hAnsi="Times New Roman" w:cs="Times New Roman"/>
+            <w:sz w:val="26"/>
+            <w:szCs w:val="26"/>
+          </w:rPr>
+          <w:id w:val="-157463676"/>
+          <w:citation/>
+        </w:sdtPr>
+        <w:sdtContent>
+          <w:r>
+            <w:rPr>
+              <w:rFonts w:ascii="Times New Roman" w:hAnsi="Times New Roman" w:cs="Times New Roman"/>
+              <w:sz w:val="26"/>
+              <w:szCs w:val="26"/>
+            </w:rPr>
+            <w:fldChar w:fldCharType="begin"/>
+          </w:r>
+          <w:r>
+            <w:rPr>
+              <w:rFonts w:ascii="Times New Roman" w:hAnsi="Times New Roman" w:cs="Times New Roman"/>
+              <w:sz w:val="26"/>
+              <w:szCs w:val="26"/>
+            </w:rPr>
+            <w:instrText xml:space="preserve"> CITATION dnd26 \l 1033 </w:instrText>
+          </w:r>
+          <w:r>
+            <w:rPr>
+              <w:rFonts w:ascii="Times New Roman" w:hAnsi="Times New Roman" w:cs="Times New Roman"/>
+              <w:sz w:val="26"/>
+              <w:szCs w:val="26"/>
+            </w:rPr>
+            <w:fldChar w:fldCharType="separate"/>
+          </w:r>
+          <w:r>
+            <w:rPr>
+              <w:rFonts w:ascii="Times New Roman" w:hAnsi="Times New Roman" w:cs="Times New Roman"/>
+              <w:noProof/>
+              <w:sz w:val="26"/>
+              <w:szCs w:val="26"/>
+            </w:rPr>
+            <w:t xml:space="preserve"> </w:t>
+          </w:r>
+          <w:r>
+            <w:rPr>
+              <w:rFonts w:ascii="Times New Roman" w:hAnsi="Times New Roman" w:cs="Times New Roman"/>
+              <w:noProof/>
+              <w:sz w:val="26"/>
+              <w:szCs w:val="26"/>
+            </w:rPr>
+            <w:t>[7]</w:t>
+          </w:r>
+          <w:r>
+            <w:rPr>
+              <w:rFonts w:ascii="Times New Roman" w:hAnsi="Times New Roman" w:cs="Times New Roman"/>
+              <w:sz w:val="26"/>
+              <w:szCs w:val="26"/>
+            </w:rPr>
+            <w:fldChar w:fldCharType="end"/>
+          </w:r>
+        </w:sdtContent>
+      </w:sdt>
+      <w:r>
+        <w:rPr>
+          <w:rFonts w:ascii="Times New Roman" w:hAnsi="Times New Roman" w:cs="Times New Roman"/>
+          <w:sz w:val="26"/>
+          <w:szCs w:val="26"/>
+        </w:rPr>
+        <w:t xml:space="preserve">. </w:t>
       </w:r>
     </w:p>
     <w:p>
@@ -10134,7 +10972,78 @@
           <w:sz w:val="26"/>
           <w:szCs w:val="26"/>
         </w:rPr>
-        <w:t>Recharts được sử dụng để xây dụng Dashboard và trực quan hóa dữ liệu trong đề tài Hệ thống CRM để phục vụ việc quản lý bán hàng.</w:t>
+        <w:t>Recharts được sử dụng để xây dụng Dashboard và trực quan hóa dữ liệu trong đề tài Hệ thống CRM để phục vụ việc quản lý bán hàng</w:t>
+      </w:r>
+      <w:sdt>
+        <w:sdtPr>
+          <w:rPr>
+            <w:rFonts w:ascii="Times New Roman" w:hAnsi="Times New Roman" w:cs="Times New Roman"/>
+            <w:sz w:val="26"/>
+            <w:szCs w:val="26"/>
+          </w:rPr>
+          <w:id w:val="-1313948289"/>
+          <w:citation/>
+        </w:sdtPr>
+        <w:sdtContent>
+          <w:r>
+            <w:rPr>
+              <w:rFonts w:ascii="Times New Roman" w:hAnsi="Times New Roman" w:cs="Times New Roman"/>
+              <w:sz w:val="26"/>
+              <w:szCs w:val="26"/>
+            </w:rPr>
+            <w:fldChar w:fldCharType="begin"/>
+          </w:r>
+          <w:r>
+            <w:rPr>
+              <w:rFonts w:ascii="Times New Roman" w:hAnsi="Times New Roman" w:cs="Times New Roman"/>
+              <w:sz w:val="26"/>
+              <w:szCs w:val="26"/>
+            </w:rPr>
+            <w:instrText xml:space="preserve"> CITATION Rec26 \l 1033 </w:instrText>
+          </w:r>
+          <w:r>
+            <w:rPr>
+              <w:rFonts w:ascii="Times New Roman" w:hAnsi="Times New Roman" w:cs="Times New Roman"/>
+              <w:sz w:val="26"/>
+              <w:szCs w:val="26"/>
+            </w:rPr>
+            <w:fldChar w:fldCharType="separate"/>
+          </w:r>
+          <w:r>
+            <w:rPr>
+              <w:rFonts w:ascii="Times New Roman" w:hAnsi="Times New Roman" w:cs="Times New Roman"/>
+              <w:noProof/>
+              <w:sz w:val="26"/>
+              <w:szCs w:val="26"/>
+            </w:rPr>
+            <w:t xml:space="preserve"> </w:t>
+          </w:r>
+          <w:r>
+            <w:rPr>
+              <w:rFonts w:ascii="Times New Roman" w:hAnsi="Times New Roman" w:cs="Times New Roman"/>
+              <w:noProof/>
+              <w:sz w:val="26"/>
+              <w:szCs w:val="26"/>
+            </w:rPr>
+            <w:t>[8]</w:t>
+          </w:r>
+          <w:r>
+            <w:rPr>
+              <w:rFonts w:ascii="Times New Roman" w:hAnsi="Times New Roman" w:cs="Times New Roman"/>
+              <w:sz w:val="26"/>
+              <w:szCs w:val="26"/>
+            </w:rPr>
+            <w:fldChar w:fldCharType="end"/>
+          </w:r>
+        </w:sdtContent>
+      </w:sdt>
+      <w:r>
+        <w:rPr>
+          <w:rFonts w:ascii="Times New Roman" w:hAnsi="Times New Roman" w:cs="Times New Roman"/>
+          <w:sz w:val="26"/>
+          <w:szCs w:val="26"/>
+        </w:rPr>
+        <w:t>.</w:t>
       </w:r>
     </w:p>
     <w:p>
@@ -10311,7 +11220,78 @@
           <w:sz w:val="26"/>
           <w:szCs w:val="26"/>
         </w:rPr>
-        <w:t>thông dựa theo kiến trúc Modular.</w:t>
+        <w:t>thông dựa theo kiến trúc Modular</w:t>
+      </w:r>
+      <w:sdt>
+        <w:sdtPr>
+          <w:rPr>
+            <w:rFonts w:ascii="Times New Roman" w:hAnsi="Times New Roman" w:cs="Times New Roman"/>
+            <w:sz w:val="26"/>
+            <w:szCs w:val="26"/>
+          </w:rPr>
+          <w:id w:val="717015980"/>
+          <w:citation/>
+        </w:sdtPr>
+        <w:sdtContent>
+          <w:r>
+            <w:rPr>
+              <w:rFonts w:ascii="Times New Roman" w:hAnsi="Times New Roman" w:cs="Times New Roman"/>
+              <w:sz w:val="26"/>
+              <w:szCs w:val="26"/>
+            </w:rPr>
+            <w:fldChar w:fldCharType="begin"/>
+          </w:r>
+          <w:r>
+            <w:rPr>
+              <w:rFonts w:ascii="Times New Roman" w:hAnsi="Times New Roman" w:cs="Times New Roman"/>
+              <w:sz w:val="26"/>
+              <w:szCs w:val="26"/>
+            </w:rPr>
+            <w:instrText xml:space="preserve"> CITATION Nes261 \l 1033 </w:instrText>
+          </w:r>
+          <w:r>
+            <w:rPr>
+              <w:rFonts w:ascii="Times New Roman" w:hAnsi="Times New Roman" w:cs="Times New Roman"/>
+              <w:sz w:val="26"/>
+              <w:szCs w:val="26"/>
+            </w:rPr>
+            <w:fldChar w:fldCharType="separate"/>
+          </w:r>
+          <w:r>
+            <w:rPr>
+              <w:rFonts w:ascii="Times New Roman" w:hAnsi="Times New Roman" w:cs="Times New Roman"/>
+              <w:noProof/>
+              <w:sz w:val="26"/>
+              <w:szCs w:val="26"/>
+            </w:rPr>
+            <w:t xml:space="preserve"> </w:t>
+          </w:r>
+          <w:r>
+            <w:rPr>
+              <w:rFonts w:ascii="Times New Roman" w:hAnsi="Times New Roman" w:cs="Times New Roman"/>
+              <w:noProof/>
+              <w:sz w:val="26"/>
+              <w:szCs w:val="26"/>
+            </w:rPr>
+            <w:t>[9]</w:t>
+          </w:r>
+          <w:r>
+            <w:rPr>
+              <w:rFonts w:ascii="Times New Roman" w:hAnsi="Times New Roman" w:cs="Times New Roman"/>
+              <w:sz w:val="26"/>
+              <w:szCs w:val="26"/>
+            </w:rPr>
+            <w:fldChar w:fldCharType="end"/>
+          </w:r>
+        </w:sdtContent>
+      </w:sdt>
+      <w:r>
+        <w:rPr>
+          <w:rFonts w:ascii="Times New Roman" w:hAnsi="Times New Roman" w:cs="Times New Roman"/>
+          <w:sz w:val="26"/>
+          <w:szCs w:val="26"/>
+        </w:rPr>
+        <w:t>.</w:t>
       </w:r>
     </w:p>
     <w:p>
@@ -10495,7 +11475,78 @@
           <w:sz w:val="26"/>
           <w:szCs w:val="26"/>
         </w:rPr>
-        <w:t>như là cầu nối giao tiếp giữa NestJS và cơ sở dữ liệu PostgreSQL.</w:t>
+        <w:t>như là cầu nối giao tiếp giữa NestJS và cơ sở dữ liệu PostgreSQL</w:t>
+      </w:r>
+      <w:sdt>
+        <w:sdtPr>
+          <w:rPr>
+            <w:rFonts w:ascii="Times New Roman" w:hAnsi="Times New Roman" w:cs="Times New Roman"/>
+            <w:sz w:val="26"/>
+            <w:szCs w:val="26"/>
+          </w:rPr>
+          <w:id w:val="1532234944"/>
+          <w:citation/>
+        </w:sdtPr>
+        <w:sdtContent>
+          <w:r>
+            <w:rPr>
+              <w:rFonts w:ascii="Times New Roman" w:hAnsi="Times New Roman" w:cs="Times New Roman"/>
+              <w:sz w:val="26"/>
+              <w:szCs w:val="26"/>
+            </w:rPr>
+            <w:fldChar w:fldCharType="begin"/>
+          </w:r>
+          <w:r>
+            <w:rPr>
+              <w:rFonts w:ascii="Times New Roman" w:hAnsi="Times New Roman" w:cs="Times New Roman"/>
+              <w:sz w:val="26"/>
+              <w:szCs w:val="26"/>
+            </w:rPr>
+            <w:instrText xml:space="preserve"> CITATION Pri26 \l 1033 </w:instrText>
+          </w:r>
+          <w:r>
+            <w:rPr>
+              <w:rFonts w:ascii="Times New Roman" w:hAnsi="Times New Roman" w:cs="Times New Roman"/>
+              <w:sz w:val="26"/>
+              <w:szCs w:val="26"/>
+            </w:rPr>
+            <w:fldChar w:fldCharType="separate"/>
+          </w:r>
+          <w:r>
+            <w:rPr>
+              <w:rFonts w:ascii="Times New Roman" w:hAnsi="Times New Roman" w:cs="Times New Roman"/>
+              <w:noProof/>
+              <w:sz w:val="26"/>
+              <w:szCs w:val="26"/>
+            </w:rPr>
+            <w:t xml:space="preserve"> </w:t>
+          </w:r>
+          <w:r>
+            <w:rPr>
+              <w:rFonts w:ascii="Times New Roman" w:hAnsi="Times New Roman" w:cs="Times New Roman"/>
+              <w:noProof/>
+              <w:sz w:val="26"/>
+              <w:szCs w:val="26"/>
+            </w:rPr>
+            <w:t>[10]</w:t>
+          </w:r>
+          <w:r>
+            <w:rPr>
+              <w:rFonts w:ascii="Times New Roman" w:hAnsi="Times New Roman" w:cs="Times New Roman"/>
+              <w:sz w:val="26"/>
+              <w:szCs w:val="26"/>
+            </w:rPr>
+            <w:fldChar w:fldCharType="end"/>
+          </w:r>
+        </w:sdtContent>
+      </w:sdt>
+      <w:r>
+        <w:rPr>
+          <w:rFonts w:ascii="Times New Roman" w:hAnsi="Times New Roman" w:cs="Times New Roman"/>
+          <w:sz w:val="26"/>
+          <w:szCs w:val="26"/>
+        </w:rPr>
+        <w:t>.</w:t>
       </w:r>
     </w:p>
     <w:p>
@@ -10621,7 +11672,78 @@
           <w:sz w:val="26"/>
           <w:szCs w:val="26"/>
         </w:rPr>
-        <w:t>với toàn bộ dữ liệu của hệ thống.</w:t>
+        <w:t>với toàn bộ dữ liệu của hệ thống</w:t>
+      </w:r>
+      <w:sdt>
+        <w:sdtPr>
+          <w:rPr>
+            <w:rFonts w:ascii="Times New Roman" w:hAnsi="Times New Roman" w:cs="Times New Roman"/>
+            <w:sz w:val="26"/>
+            <w:szCs w:val="26"/>
+          </w:rPr>
+          <w:id w:val="1137682971"/>
+          <w:citation/>
+        </w:sdtPr>
+        <w:sdtContent>
+          <w:r>
+            <w:rPr>
+              <w:rFonts w:ascii="Times New Roman" w:hAnsi="Times New Roman" w:cs="Times New Roman"/>
+              <w:sz w:val="26"/>
+              <w:szCs w:val="26"/>
+            </w:rPr>
+            <w:fldChar w:fldCharType="begin"/>
+          </w:r>
+          <w:r>
+            <w:rPr>
+              <w:rFonts w:ascii="Times New Roman" w:hAnsi="Times New Roman" w:cs="Times New Roman"/>
+              <w:sz w:val="26"/>
+              <w:szCs w:val="26"/>
+            </w:rPr>
+            <w:instrText xml:space="preserve"> CITATION The26 \l 1033 </w:instrText>
+          </w:r>
+          <w:r>
+            <w:rPr>
+              <w:rFonts w:ascii="Times New Roman" w:hAnsi="Times New Roman" w:cs="Times New Roman"/>
+              <w:sz w:val="26"/>
+              <w:szCs w:val="26"/>
+            </w:rPr>
+            <w:fldChar w:fldCharType="separate"/>
+          </w:r>
+          <w:r>
+            <w:rPr>
+              <w:rFonts w:ascii="Times New Roman" w:hAnsi="Times New Roman" w:cs="Times New Roman"/>
+              <w:noProof/>
+              <w:sz w:val="26"/>
+              <w:szCs w:val="26"/>
+            </w:rPr>
+            <w:t xml:space="preserve"> </w:t>
+          </w:r>
+          <w:r>
+            <w:rPr>
+              <w:rFonts w:ascii="Times New Roman" w:hAnsi="Times New Roman" w:cs="Times New Roman"/>
+              <w:noProof/>
+              <w:sz w:val="26"/>
+              <w:szCs w:val="26"/>
+            </w:rPr>
+            <w:t>[11]</w:t>
+          </w:r>
+          <w:r>
+            <w:rPr>
+              <w:rFonts w:ascii="Times New Roman" w:hAnsi="Times New Roman" w:cs="Times New Roman"/>
+              <w:sz w:val="26"/>
+              <w:szCs w:val="26"/>
+            </w:rPr>
+            <w:fldChar w:fldCharType="end"/>
+          </w:r>
+        </w:sdtContent>
+      </w:sdt>
+      <w:r>
+        <w:rPr>
+          <w:rFonts w:ascii="Times New Roman" w:hAnsi="Times New Roman" w:cs="Times New Roman"/>
+          <w:sz w:val="26"/>
+          <w:szCs w:val="26"/>
+        </w:rPr>
+        <w:t>.</w:t>
       </w:r>
     </w:p>
     <w:p>
@@ -13895,7 +15017,6 @@
           <w:sz w:val="26"/>
           <w:szCs w:val="26"/>
         </w:rPr>
-        <w:lastRenderedPageBreak/>
         <w:t xml:space="preserve">Bảng </w:t>
       </w:r>
       <w:r>
@@ -19227,7 +20348,6 @@
                 <w:sz w:val="26"/>
                 <w:szCs w:val="26"/>
               </w:rPr>
-              <w:lastRenderedPageBreak/>
               <w:t>Luồng thay thế</w:t>
             </w:r>
           </w:p>
@@ -25499,141 +26619,796 @@
       <w:bookmarkEnd w:id="117"/>
       <w:bookmarkEnd w:id="118"/>
     </w:p>
+    <w:sdt>
+      <w:sdtPr>
+        <w:id w:val="1449190712"/>
+        <w:docPartObj>
+          <w:docPartGallery w:val="Bibliographies"/>
+          <w:docPartUnique/>
+        </w:docPartObj>
+      </w:sdtPr>
+      <w:sdtEndPr>
+        <w:rPr>
+          <w:rFonts w:asciiTheme="minorHAnsi" w:eastAsiaTheme="minorHAnsi" w:hAnsiTheme="minorHAnsi" w:cstheme="minorBidi"/>
+          <w:color w:val="auto"/>
+          <w:sz w:val="22"/>
+          <w:szCs w:val="22"/>
+        </w:rPr>
+      </w:sdtEndPr>
+      <w:sdtContent>
+        <w:p>
+          <w:pPr>
+            <w:pStyle w:val="Heading1"/>
+            <w:rPr>
+              <w:rFonts w:ascii="Times New Roman" w:hAnsi="Times New Roman" w:cs="Times New Roman"/>
+              <w:sz w:val="26"/>
+              <w:szCs w:val="26"/>
+            </w:rPr>
+          </w:pPr>
+          <w:r>
+            <w:rPr>
+              <w:rFonts w:ascii="Times New Roman" w:hAnsi="Times New Roman" w:cs="Times New Roman"/>
+              <w:sz w:val="26"/>
+              <w:szCs w:val="26"/>
+            </w:rPr>
+            <w:t>References</w:t>
+          </w:r>
+        </w:p>
+        <w:sdt>
+          <w:sdtPr>
+            <w:rPr>
+              <w:rFonts w:ascii="Times New Roman" w:hAnsi="Times New Roman" w:cs="Times New Roman"/>
+              <w:sz w:val="26"/>
+              <w:szCs w:val="26"/>
+            </w:rPr>
+            <w:id w:val="-573587230"/>
+            <w:bibliography/>
+          </w:sdtPr>
+          <w:sdtContent>
+            <w:p>
+              <w:pPr>
+                <w:rPr>
+                  <w:rFonts w:ascii="Times New Roman" w:hAnsi="Times New Roman" w:cs="Times New Roman"/>
+                  <w:noProof/>
+                  <w:sz w:val="26"/>
+                  <w:szCs w:val="26"/>
+                </w:rPr>
+              </w:pPr>
+              <w:r>
+                <w:rPr>
+                  <w:rFonts w:ascii="Times New Roman" w:hAnsi="Times New Roman" w:cs="Times New Roman"/>
+                  <w:sz w:val="26"/>
+                  <w:szCs w:val="26"/>
+                </w:rPr>
+                <w:fldChar w:fldCharType="begin"/>
+              </w:r>
+              <w:r>
+                <w:rPr>
+                  <w:rFonts w:ascii="Times New Roman" w:hAnsi="Times New Roman" w:cs="Times New Roman"/>
+                  <w:sz w:val="26"/>
+                  <w:szCs w:val="26"/>
+                </w:rPr>
+                <w:instrText xml:space="preserve"> BIBLIOGRAPHY </w:instrText>
+              </w:r>
+              <w:r>
+                <w:rPr>
+                  <w:rFonts w:ascii="Times New Roman" w:hAnsi="Times New Roman" w:cs="Times New Roman"/>
+                  <w:sz w:val="26"/>
+                  <w:szCs w:val="26"/>
+                </w:rPr>
+                <w:fldChar w:fldCharType="separate"/>
+              </w:r>
+            </w:p>
+            <w:tbl>
+              <w:tblPr>
+                <w:tblW w:w="5000" w:type="pct"/>
+                <w:tblCellSpacing w:w="15" w:type="dxa"/>
+                <w:tblCellMar>
+                  <w:top w:w="15" w:type="dxa"/>
+                  <w:left w:w="15" w:type="dxa"/>
+                  <w:bottom w:w="15" w:type="dxa"/>
+                  <w:right w:w="15" w:type="dxa"/>
+                </w:tblCellMar>
+                <w:tblLook w:val="04A0" w:firstRow="1" w:lastRow="0" w:firstColumn="1" w:lastColumn="0" w:noHBand="0" w:noVBand="1"/>
+              </w:tblPr>
+              <w:tblGrid>
+                <w:gridCol w:w="509"/>
+                <w:gridCol w:w="8612"/>
+              </w:tblGrid>
+              <w:tr>
+                <w:trPr>
+                  <w:divId w:val="1521697252"/>
+                  <w:tblCellSpacing w:w="15" w:type="dxa"/>
+                </w:trPr>
+                <w:tc>
+                  <w:tcPr>
+                    <w:tcW w:w="50" w:type="pct"/>
+                    <w:hideMark/>
+                  </w:tcPr>
+                  <w:p>
+                    <w:pPr>
+                      <w:pStyle w:val="Bibliography"/>
+                      <w:rPr>
+                        <w:rFonts w:ascii="Times New Roman" w:hAnsi="Times New Roman" w:cs="Times New Roman"/>
+                        <w:noProof/>
+                        <w:sz w:val="26"/>
+                        <w:szCs w:val="26"/>
+                      </w:rPr>
+                    </w:pPr>
+                    <w:r>
+                      <w:rPr>
+                        <w:rFonts w:ascii="Times New Roman" w:hAnsi="Times New Roman" w:cs="Times New Roman"/>
+                        <w:noProof/>
+                        <w:sz w:val="26"/>
+                        <w:szCs w:val="26"/>
+                      </w:rPr>
+                      <w:t xml:space="preserve">[1] </w:t>
+                    </w:r>
+                  </w:p>
+                </w:tc>
+                <w:tc>
+                  <w:tcPr>
+                    <w:tcW w:w="0" w:type="auto"/>
+                    <w:hideMark/>
+                  </w:tcPr>
+                  <w:p>
+                    <w:pPr>
+                      <w:pStyle w:val="Bibliography"/>
+                      <w:rPr>
+                        <w:rFonts w:ascii="Times New Roman" w:hAnsi="Times New Roman" w:cs="Times New Roman"/>
+                        <w:noProof/>
+                        <w:sz w:val="26"/>
+                        <w:szCs w:val="26"/>
+                      </w:rPr>
+                    </w:pPr>
+                    <w:r>
+                      <w:rPr>
+                        <w:rFonts w:ascii="Times New Roman" w:hAnsi="Times New Roman" w:cs="Times New Roman"/>
+                        <w:noProof/>
+                        <w:sz w:val="26"/>
+                        <w:szCs w:val="26"/>
+                      </w:rPr>
+                      <w:t>M. Burdon, "Sales pipelines: A comprehensive walkthrough for sales leaders and reps," HubSpot, 4 December 2025. [Online]. Available: https://blog.hubspot.com/sales/sales-pipeline. [Accessed 25 July 2026].</w:t>
+                    </w:r>
+                  </w:p>
+                </w:tc>
+              </w:tr>
+              <w:tr>
+                <w:trPr>
+                  <w:divId w:val="1521697252"/>
+                  <w:tblCellSpacing w:w="15" w:type="dxa"/>
+                </w:trPr>
+                <w:tc>
+                  <w:tcPr>
+                    <w:tcW w:w="50" w:type="pct"/>
+                    <w:hideMark/>
+                  </w:tcPr>
+                  <w:p>
+                    <w:pPr>
+                      <w:pStyle w:val="Bibliography"/>
+                      <w:rPr>
+                        <w:rFonts w:ascii="Times New Roman" w:hAnsi="Times New Roman" w:cs="Times New Roman"/>
+                        <w:noProof/>
+                        <w:sz w:val="26"/>
+                        <w:szCs w:val="26"/>
+                      </w:rPr>
+                    </w:pPr>
+                    <w:r>
+                      <w:rPr>
+                        <w:rFonts w:ascii="Times New Roman" w:hAnsi="Times New Roman" w:cs="Times New Roman"/>
+                        <w:noProof/>
+                        <w:sz w:val="26"/>
+                        <w:szCs w:val="26"/>
+                      </w:rPr>
+                      <w:t xml:space="preserve">[2] </w:t>
+                    </w:r>
+                  </w:p>
+                </w:tc>
+                <w:tc>
+                  <w:tcPr>
+                    <w:tcW w:w="0" w:type="auto"/>
+                    <w:hideMark/>
+                  </w:tcPr>
+                  <w:p>
+                    <w:pPr>
+                      <w:pStyle w:val="Bibliography"/>
+                      <w:rPr>
+                        <w:rFonts w:ascii="Times New Roman" w:hAnsi="Times New Roman" w:cs="Times New Roman"/>
+                        <w:noProof/>
+                        <w:sz w:val="26"/>
+                        <w:szCs w:val="26"/>
+                      </w:rPr>
+                    </w:pPr>
+                    <w:r>
+                      <w:rPr>
+                        <w:rFonts w:ascii="Times New Roman" w:hAnsi="Times New Roman" w:cs="Times New Roman"/>
+                        <w:noProof/>
+                        <w:sz w:val="26"/>
+                        <w:szCs w:val="26"/>
+                      </w:rPr>
+                      <w:t>J. Fuchs, "I Mastered Sales Forecasting, Here Are My Top Tips [+Template]," HubSpot, 1 May 2025. [Online]. Available: https://blog.hubspot.com/sales/sales-forecasting. [Accessed 25 July 2026].</w:t>
+                    </w:r>
+                  </w:p>
+                </w:tc>
+              </w:tr>
+              <w:tr>
+                <w:trPr>
+                  <w:divId w:val="1521697252"/>
+                  <w:tblCellSpacing w:w="15" w:type="dxa"/>
+                </w:trPr>
+                <w:tc>
+                  <w:tcPr>
+                    <w:tcW w:w="50" w:type="pct"/>
+                    <w:hideMark/>
+                  </w:tcPr>
+                  <w:p>
+                    <w:pPr>
+                      <w:pStyle w:val="Bibliography"/>
+                      <w:rPr>
+                        <w:rFonts w:ascii="Times New Roman" w:hAnsi="Times New Roman" w:cs="Times New Roman"/>
+                        <w:noProof/>
+                        <w:sz w:val="26"/>
+                        <w:szCs w:val="26"/>
+                      </w:rPr>
+                    </w:pPr>
+                    <w:r>
+                      <w:rPr>
+                        <w:rFonts w:ascii="Times New Roman" w:hAnsi="Times New Roman" w:cs="Times New Roman"/>
+                        <w:noProof/>
+                        <w:sz w:val="26"/>
+                        <w:szCs w:val="26"/>
+                      </w:rPr>
+                      <w:t xml:space="preserve">[3] </w:t>
+                    </w:r>
+                  </w:p>
+                </w:tc>
+                <w:tc>
+                  <w:tcPr>
+                    <w:tcW w:w="0" w:type="auto"/>
+                    <w:hideMark/>
+                  </w:tcPr>
+                  <w:p>
+                    <w:pPr>
+                      <w:pStyle w:val="Bibliography"/>
+                      <w:rPr>
+                        <w:rFonts w:ascii="Times New Roman" w:hAnsi="Times New Roman" w:cs="Times New Roman"/>
+                        <w:noProof/>
+                        <w:sz w:val="26"/>
+                        <w:szCs w:val="26"/>
+                      </w:rPr>
+                    </w:pPr>
+                    <w:r>
+                      <w:rPr>
+                        <w:rFonts w:ascii="Times New Roman" w:hAnsi="Times New Roman" w:cs="Times New Roman"/>
+                        <w:noProof/>
+                        <w:sz w:val="26"/>
+                        <w:szCs w:val="26"/>
+                      </w:rPr>
+                      <w:t xml:space="preserve">R. S. Sandhu, E. J. Coyne, H. L. Feinstein and C. E. Youman, "Role-Based Access Control Models," </w:t>
+                    </w:r>
+                    <w:r>
+                      <w:rPr>
+                        <w:rFonts w:ascii="Times New Roman" w:hAnsi="Times New Roman" w:cs="Times New Roman"/>
+                        <w:i/>
+                        <w:iCs/>
+                        <w:noProof/>
+                        <w:sz w:val="26"/>
+                        <w:szCs w:val="26"/>
+                      </w:rPr>
+                      <w:t xml:space="preserve">Computer, </w:t>
+                    </w:r>
+                    <w:r>
+                      <w:rPr>
+                        <w:rFonts w:ascii="Times New Roman" w:hAnsi="Times New Roman" w:cs="Times New Roman"/>
+                        <w:noProof/>
+                        <w:sz w:val="26"/>
+                        <w:szCs w:val="26"/>
+                      </w:rPr>
+                      <w:t xml:space="preserve">vol. 29, no. 2, pp. 38-47, 1996. </w:t>
+                    </w:r>
+                  </w:p>
+                </w:tc>
+              </w:tr>
+              <w:tr>
+                <w:trPr>
+                  <w:divId w:val="1521697252"/>
+                  <w:tblCellSpacing w:w="15" w:type="dxa"/>
+                </w:trPr>
+                <w:tc>
+                  <w:tcPr>
+                    <w:tcW w:w="50" w:type="pct"/>
+                    <w:hideMark/>
+                  </w:tcPr>
+                  <w:p>
+                    <w:pPr>
+                      <w:pStyle w:val="Bibliography"/>
+                      <w:rPr>
+                        <w:rFonts w:ascii="Times New Roman" w:hAnsi="Times New Roman" w:cs="Times New Roman"/>
+                        <w:noProof/>
+                        <w:sz w:val="26"/>
+                        <w:szCs w:val="26"/>
+                      </w:rPr>
+                    </w:pPr>
+                    <w:r>
+                      <w:rPr>
+                        <w:rFonts w:ascii="Times New Roman" w:hAnsi="Times New Roman" w:cs="Times New Roman"/>
+                        <w:noProof/>
+                        <w:sz w:val="26"/>
+                        <w:szCs w:val="26"/>
+                      </w:rPr>
+                      <w:t xml:space="preserve">[4] </w:t>
+                    </w:r>
+                  </w:p>
+                </w:tc>
+                <w:tc>
+                  <w:tcPr>
+                    <w:tcW w:w="0" w:type="auto"/>
+                    <w:hideMark/>
+                  </w:tcPr>
+                  <w:p>
+                    <w:pPr>
+                      <w:pStyle w:val="Bibliography"/>
+                      <w:rPr>
+                        <w:rFonts w:ascii="Times New Roman" w:hAnsi="Times New Roman" w:cs="Times New Roman"/>
+                        <w:noProof/>
+                        <w:sz w:val="26"/>
+                        <w:szCs w:val="26"/>
+                      </w:rPr>
+                    </w:pPr>
+                    <w:r>
+                      <w:rPr>
+                        <w:rFonts w:ascii="Times New Roman" w:hAnsi="Times New Roman" w:cs="Times New Roman"/>
+                        <w:noProof/>
+                        <w:sz w:val="26"/>
+                        <w:szCs w:val="26"/>
+                      </w:rPr>
+                      <w:t>R. T. Fielding, "Architectural Styles and the Design of Network-based Software Architectures," University of California, Irvine, Irvine, California, 2000.</w:t>
+                    </w:r>
+                  </w:p>
+                </w:tc>
+              </w:tr>
+              <w:tr>
+                <w:trPr>
+                  <w:divId w:val="1521697252"/>
+                  <w:tblCellSpacing w:w="15" w:type="dxa"/>
+                </w:trPr>
+                <w:tc>
+                  <w:tcPr>
+                    <w:tcW w:w="50" w:type="pct"/>
+                    <w:hideMark/>
+                  </w:tcPr>
+                  <w:p>
+                    <w:pPr>
+                      <w:pStyle w:val="Bibliography"/>
+                      <w:rPr>
+                        <w:rFonts w:ascii="Times New Roman" w:hAnsi="Times New Roman" w:cs="Times New Roman"/>
+                        <w:noProof/>
+                        <w:sz w:val="26"/>
+                        <w:szCs w:val="26"/>
+                      </w:rPr>
+                    </w:pPr>
+                    <w:r>
+                      <w:rPr>
+                        <w:rFonts w:ascii="Times New Roman" w:hAnsi="Times New Roman" w:cs="Times New Roman"/>
+                        <w:noProof/>
+                        <w:sz w:val="26"/>
+                        <w:szCs w:val="26"/>
+                      </w:rPr>
+                      <w:t xml:space="preserve">[5] </w:t>
+                    </w:r>
+                  </w:p>
+                </w:tc>
+                <w:tc>
+                  <w:tcPr>
+                    <w:tcW w:w="0" w:type="auto"/>
+                    <w:hideMark/>
+                  </w:tcPr>
+                  <w:p>
+                    <w:pPr>
+                      <w:pStyle w:val="Bibliography"/>
+                      <w:rPr>
+                        <w:rFonts w:ascii="Times New Roman" w:hAnsi="Times New Roman" w:cs="Times New Roman"/>
+                        <w:noProof/>
+                        <w:sz w:val="26"/>
+                        <w:szCs w:val="26"/>
+                      </w:rPr>
+                    </w:pPr>
+                    <w:r>
+                      <w:rPr>
+                        <w:rFonts w:ascii="Times New Roman" w:hAnsi="Times New Roman" w:cs="Times New Roman"/>
+                        <w:noProof/>
+                        <w:sz w:val="26"/>
+                        <w:szCs w:val="26"/>
+                      </w:rPr>
+                      <w:t>NestJS, "Modules," NestJS, [Online]. Available: https://docs.nestjs.com/modules. [Accessed 25 July 2026].</w:t>
+                    </w:r>
+                  </w:p>
+                </w:tc>
+              </w:tr>
+              <w:tr>
+                <w:trPr>
+                  <w:divId w:val="1521697252"/>
+                  <w:tblCellSpacing w:w="15" w:type="dxa"/>
+                </w:trPr>
+                <w:tc>
+                  <w:tcPr>
+                    <w:tcW w:w="50" w:type="pct"/>
+                    <w:hideMark/>
+                  </w:tcPr>
+                  <w:p>
+                    <w:pPr>
+                      <w:pStyle w:val="Bibliography"/>
+                      <w:rPr>
+                        <w:rFonts w:ascii="Times New Roman" w:hAnsi="Times New Roman" w:cs="Times New Roman"/>
+                        <w:noProof/>
+                        <w:sz w:val="26"/>
+                        <w:szCs w:val="26"/>
+                      </w:rPr>
+                    </w:pPr>
+                    <w:r>
+                      <w:rPr>
+                        <w:rFonts w:ascii="Times New Roman" w:hAnsi="Times New Roman" w:cs="Times New Roman"/>
+                        <w:noProof/>
+                        <w:sz w:val="26"/>
+                        <w:szCs w:val="26"/>
+                      </w:rPr>
+                      <w:t xml:space="preserve">[6] </w:t>
+                    </w:r>
+                  </w:p>
+                </w:tc>
+                <w:tc>
+                  <w:tcPr>
+                    <w:tcW w:w="0" w:type="auto"/>
+                    <w:hideMark/>
+                  </w:tcPr>
+                  <w:p>
+                    <w:pPr>
+                      <w:pStyle w:val="Bibliography"/>
+                      <w:rPr>
+                        <w:rFonts w:ascii="Times New Roman" w:hAnsi="Times New Roman" w:cs="Times New Roman"/>
+                        <w:noProof/>
+                        <w:sz w:val="26"/>
+                        <w:szCs w:val="26"/>
+                      </w:rPr>
+                    </w:pPr>
+                    <w:r>
+                      <w:rPr>
+                        <w:rFonts w:ascii="Times New Roman" w:hAnsi="Times New Roman" w:cs="Times New Roman"/>
+                        <w:noProof/>
+                        <w:sz w:val="26"/>
+                        <w:szCs w:val="26"/>
+                      </w:rPr>
+                      <w:t>Vercel, "Next.js Documentation," Vercel, [Online]. Available: https://nextjs.org/docs. [Accessed 25 July 2026].</w:t>
+                    </w:r>
+                  </w:p>
+                </w:tc>
+              </w:tr>
+              <w:tr>
+                <w:trPr>
+                  <w:divId w:val="1521697252"/>
+                  <w:tblCellSpacing w:w="15" w:type="dxa"/>
+                </w:trPr>
+                <w:tc>
+                  <w:tcPr>
+                    <w:tcW w:w="50" w:type="pct"/>
+                    <w:hideMark/>
+                  </w:tcPr>
+                  <w:p>
+                    <w:pPr>
+                      <w:pStyle w:val="Bibliography"/>
+                      <w:rPr>
+                        <w:rFonts w:ascii="Times New Roman" w:hAnsi="Times New Roman" w:cs="Times New Roman"/>
+                        <w:noProof/>
+                        <w:sz w:val="26"/>
+                        <w:szCs w:val="26"/>
+                      </w:rPr>
+                    </w:pPr>
+                    <w:r>
+                      <w:rPr>
+                        <w:rFonts w:ascii="Times New Roman" w:hAnsi="Times New Roman" w:cs="Times New Roman"/>
+                        <w:noProof/>
+                        <w:sz w:val="26"/>
+                        <w:szCs w:val="26"/>
+                      </w:rPr>
+                      <w:t xml:space="preserve">[7] </w:t>
+                    </w:r>
+                  </w:p>
+                </w:tc>
+                <w:tc>
+                  <w:tcPr>
+                    <w:tcW w:w="0" w:type="auto"/>
+                    <w:hideMark/>
+                  </w:tcPr>
+                  <w:p>
+                    <w:pPr>
+                      <w:pStyle w:val="Bibliography"/>
+                      <w:rPr>
+                        <w:rFonts w:ascii="Times New Roman" w:hAnsi="Times New Roman" w:cs="Times New Roman"/>
+                        <w:noProof/>
+                        <w:sz w:val="26"/>
+                        <w:szCs w:val="26"/>
+                      </w:rPr>
+                    </w:pPr>
+                    <w:r>
+                      <w:rPr>
+                        <w:rFonts w:ascii="Times New Roman" w:hAnsi="Times New Roman" w:cs="Times New Roman"/>
+                        <w:noProof/>
+                        <w:sz w:val="26"/>
+                        <w:szCs w:val="26"/>
+                      </w:rPr>
+                      <w:t>dnd-kit, "dnd-kit Documentation," dnd-kit, [Online]. Available: https://dndkit.com/. [Accessed 25 July 2026].</w:t>
+                    </w:r>
+                  </w:p>
+                </w:tc>
+              </w:tr>
+              <w:tr>
+                <w:trPr>
+                  <w:divId w:val="1521697252"/>
+                  <w:tblCellSpacing w:w="15" w:type="dxa"/>
+                </w:trPr>
+                <w:tc>
+                  <w:tcPr>
+                    <w:tcW w:w="50" w:type="pct"/>
+                    <w:hideMark/>
+                  </w:tcPr>
+                  <w:p>
+                    <w:pPr>
+                      <w:pStyle w:val="Bibliography"/>
+                      <w:rPr>
+                        <w:rFonts w:ascii="Times New Roman" w:hAnsi="Times New Roman" w:cs="Times New Roman"/>
+                        <w:noProof/>
+                        <w:sz w:val="26"/>
+                        <w:szCs w:val="26"/>
+                      </w:rPr>
+                    </w:pPr>
+                    <w:r>
+                      <w:rPr>
+                        <w:rFonts w:ascii="Times New Roman" w:hAnsi="Times New Roman" w:cs="Times New Roman"/>
+                        <w:noProof/>
+                        <w:sz w:val="26"/>
+                        <w:szCs w:val="26"/>
+                      </w:rPr>
+                      <w:t xml:space="preserve">[8] </w:t>
+                    </w:r>
+                  </w:p>
+                </w:tc>
+                <w:tc>
+                  <w:tcPr>
+                    <w:tcW w:w="0" w:type="auto"/>
+                    <w:hideMark/>
+                  </w:tcPr>
+                  <w:p>
+                    <w:pPr>
+                      <w:pStyle w:val="Bibliography"/>
+                      <w:rPr>
+                        <w:rFonts w:ascii="Times New Roman" w:hAnsi="Times New Roman" w:cs="Times New Roman"/>
+                        <w:noProof/>
+                        <w:sz w:val="26"/>
+                        <w:szCs w:val="26"/>
+                      </w:rPr>
+                    </w:pPr>
+                    <w:r>
+                      <w:rPr>
+                        <w:rFonts w:ascii="Times New Roman" w:hAnsi="Times New Roman" w:cs="Times New Roman"/>
+                        <w:noProof/>
+                        <w:sz w:val="26"/>
+                        <w:szCs w:val="26"/>
+                      </w:rPr>
+                      <w:t>Recharts Group, "Recharts Documentation," Recharts Group, [Online]. Available: https://recharts.github.io/. [Accessed 25 July 2026].</w:t>
+                    </w:r>
+                  </w:p>
+                </w:tc>
+              </w:tr>
+              <w:tr>
+                <w:trPr>
+                  <w:divId w:val="1521697252"/>
+                  <w:tblCellSpacing w:w="15" w:type="dxa"/>
+                </w:trPr>
+                <w:tc>
+                  <w:tcPr>
+                    <w:tcW w:w="50" w:type="pct"/>
+                    <w:hideMark/>
+                  </w:tcPr>
+                  <w:p>
+                    <w:pPr>
+                      <w:pStyle w:val="Bibliography"/>
+                      <w:rPr>
+                        <w:rFonts w:ascii="Times New Roman" w:hAnsi="Times New Roman" w:cs="Times New Roman"/>
+                        <w:noProof/>
+                        <w:sz w:val="26"/>
+                        <w:szCs w:val="26"/>
+                      </w:rPr>
+                    </w:pPr>
+                    <w:r>
+                      <w:rPr>
+                        <w:rFonts w:ascii="Times New Roman" w:hAnsi="Times New Roman" w:cs="Times New Roman"/>
+                        <w:noProof/>
+                        <w:sz w:val="26"/>
+                        <w:szCs w:val="26"/>
+                      </w:rPr>
+                      <w:t xml:space="preserve">[9] </w:t>
+                    </w:r>
+                  </w:p>
+                </w:tc>
+                <w:tc>
+                  <w:tcPr>
+                    <w:tcW w:w="0" w:type="auto"/>
+                    <w:hideMark/>
+                  </w:tcPr>
+                  <w:p>
+                    <w:pPr>
+                      <w:pStyle w:val="Bibliography"/>
+                      <w:rPr>
+                        <w:rFonts w:ascii="Times New Roman" w:hAnsi="Times New Roman" w:cs="Times New Roman"/>
+                        <w:noProof/>
+                        <w:sz w:val="26"/>
+                        <w:szCs w:val="26"/>
+                      </w:rPr>
+                    </w:pPr>
+                    <w:r>
+                      <w:rPr>
+                        <w:rFonts w:ascii="Times New Roman" w:hAnsi="Times New Roman" w:cs="Times New Roman"/>
+                        <w:noProof/>
+                        <w:sz w:val="26"/>
+                        <w:szCs w:val="26"/>
+                      </w:rPr>
+                      <w:t>NestJS, "NestJS Documentation," NestJS, [Online]. Available: https://docs.nestjs.com/. [Accessed 25 July 2026].</w:t>
+                    </w:r>
+                  </w:p>
+                </w:tc>
+              </w:tr>
+              <w:tr>
+                <w:trPr>
+                  <w:divId w:val="1521697252"/>
+                  <w:tblCellSpacing w:w="15" w:type="dxa"/>
+                </w:trPr>
+                <w:tc>
+                  <w:tcPr>
+                    <w:tcW w:w="50" w:type="pct"/>
+                    <w:hideMark/>
+                  </w:tcPr>
+                  <w:p>
+                    <w:pPr>
+                      <w:pStyle w:val="Bibliography"/>
+                      <w:rPr>
+                        <w:rFonts w:ascii="Times New Roman" w:hAnsi="Times New Roman" w:cs="Times New Roman"/>
+                        <w:noProof/>
+                        <w:sz w:val="26"/>
+                        <w:szCs w:val="26"/>
+                      </w:rPr>
+                    </w:pPr>
+                    <w:r>
+                      <w:rPr>
+                        <w:rFonts w:ascii="Times New Roman" w:hAnsi="Times New Roman" w:cs="Times New Roman"/>
+                        <w:noProof/>
+                        <w:sz w:val="26"/>
+                        <w:szCs w:val="26"/>
+                      </w:rPr>
+                      <w:t xml:space="preserve">[10] </w:t>
+                    </w:r>
+                  </w:p>
+                </w:tc>
+                <w:tc>
+                  <w:tcPr>
+                    <w:tcW w:w="0" w:type="auto"/>
+                    <w:hideMark/>
+                  </w:tcPr>
+                  <w:p>
+                    <w:pPr>
+                      <w:pStyle w:val="Bibliography"/>
+                      <w:rPr>
+                        <w:rFonts w:ascii="Times New Roman" w:hAnsi="Times New Roman" w:cs="Times New Roman"/>
+                        <w:noProof/>
+                        <w:sz w:val="26"/>
+                        <w:szCs w:val="26"/>
+                      </w:rPr>
+                    </w:pPr>
+                    <w:r>
+                      <w:rPr>
+                        <w:rFonts w:ascii="Times New Roman" w:hAnsi="Times New Roman" w:cs="Times New Roman"/>
+                        <w:noProof/>
+                        <w:sz w:val="26"/>
+                        <w:szCs w:val="26"/>
+                      </w:rPr>
+                      <w:t>Prisma, "Prisma Documentation," Prisma, [Online]. Available: https://www.prisma.io/docs. [Accessed 25 July 2026].</w:t>
+                    </w:r>
+                  </w:p>
+                </w:tc>
+              </w:tr>
+              <w:tr>
+                <w:trPr>
+                  <w:divId w:val="1521697252"/>
+                  <w:tblCellSpacing w:w="15" w:type="dxa"/>
+                </w:trPr>
+                <w:tc>
+                  <w:tcPr>
+                    <w:tcW w:w="50" w:type="pct"/>
+                    <w:hideMark/>
+                  </w:tcPr>
+                  <w:p>
+                    <w:pPr>
+                      <w:pStyle w:val="Bibliography"/>
+                      <w:rPr>
+                        <w:rFonts w:ascii="Times New Roman" w:hAnsi="Times New Roman" w:cs="Times New Roman"/>
+                        <w:noProof/>
+                        <w:sz w:val="26"/>
+                        <w:szCs w:val="26"/>
+                      </w:rPr>
+                    </w:pPr>
+                    <w:r>
+                      <w:rPr>
+                        <w:rFonts w:ascii="Times New Roman" w:hAnsi="Times New Roman" w:cs="Times New Roman"/>
+                        <w:noProof/>
+                        <w:sz w:val="26"/>
+                        <w:szCs w:val="26"/>
+                      </w:rPr>
+                      <w:t xml:space="preserve">[11] </w:t>
+                    </w:r>
+                  </w:p>
+                </w:tc>
+                <w:tc>
+                  <w:tcPr>
+                    <w:tcW w:w="0" w:type="auto"/>
+                    <w:hideMark/>
+                  </w:tcPr>
+                  <w:p>
+                    <w:pPr>
+                      <w:pStyle w:val="Bibliography"/>
+                      <w:rPr>
+                        <w:rFonts w:ascii="Times New Roman" w:hAnsi="Times New Roman" w:cs="Times New Roman"/>
+                        <w:noProof/>
+                        <w:sz w:val="26"/>
+                        <w:szCs w:val="26"/>
+                      </w:rPr>
+                    </w:pPr>
+                    <w:r>
+                      <w:rPr>
+                        <w:rFonts w:ascii="Times New Roman" w:hAnsi="Times New Roman" w:cs="Times New Roman"/>
+                        <w:noProof/>
+                        <w:sz w:val="26"/>
+                        <w:szCs w:val="26"/>
+                      </w:rPr>
+                      <w:t>The PostgreSQL Global Development Group, "PostgreSQL Documentation," The PostgreSQL Global Development Group, [Online]. Available: https://www.postgresql.org/docs/. [Accessed 25 July 2026].</w:t>
+                    </w:r>
+                  </w:p>
+                </w:tc>
+              </w:tr>
+            </w:tbl>
+            <w:p>
+              <w:pPr>
+                <w:divId w:val="1521697252"/>
+                <w:rPr>
+                  <w:rFonts w:ascii="Times New Roman" w:eastAsia="Times New Roman" w:hAnsi="Times New Roman" w:cs="Times New Roman"/>
+                  <w:noProof/>
+                  <w:sz w:val="26"/>
+                  <w:szCs w:val="26"/>
+                </w:rPr>
+              </w:pPr>
+            </w:p>
+            <w:p>
+              <w:r>
+                <w:rPr>
+                  <w:rFonts w:ascii="Times New Roman" w:hAnsi="Times New Roman" w:cs="Times New Roman"/>
+                  <w:b/>
+                  <w:bCs/>
+                  <w:noProof/>
+                  <w:sz w:val="26"/>
+                  <w:szCs w:val="26"/>
+                </w:rPr>
+                <w:fldChar w:fldCharType="end"/>
+              </w:r>
+            </w:p>
+          </w:sdtContent>
+        </w:sdt>
+      </w:sdtContent>
+    </w:sdt>
     <w:p>
       <w:pPr>
         <w:spacing w:line="360" w:lineRule="auto"/>
-        <w:ind w:left="360"/>
-        <w:rPr>
-          <w:rFonts w:ascii="Times New Roman" w:hAnsi="Times New Roman" w:cs="Times New Roman"/>
-          <w:sz w:val="26"/>
-          <w:szCs w:val="26"/>
-        </w:rPr>
-      </w:pPr>
-      <w:hyperlink r:id="rId35" w:history="1">
-        <w:r>
-          <w:rPr>
-            <w:rStyle w:val="Hyperlink"/>
-          </w:rPr>
-          <w:t>Next.js Docs | Next.js</w:t>
-        </w:r>
-      </w:hyperlink>
-    </w:p>
-    <w:p>
-      <w:pPr>
-        <w:spacing w:line="360" w:lineRule="auto"/>
-        <w:ind w:left="360"/>
-        <w:rPr>
-          <w:rFonts w:ascii="Times New Roman" w:hAnsi="Times New Roman" w:cs="Times New Roman"/>
-          <w:sz w:val="26"/>
-          <w:szCs w:val="26"/>
-        </w:rPr>
-      </w:pPr>
-      <w:hyperlink r:id="rId36" w:history="1">
-        <w:r>
-          <w:rPr>
-            <w:rStyle w:val="Hyperlink"/>
-          </w:rPr>
-          <w:t xml:space="preserve">clauderic/dnd-kit: The modern toolkit for building </w:t>
-        </w:r>
-        <w:proofErr w:type="gramStart"/>
-        <w:r>
-          <w:rPr>
-            <w:rStyle w:val="Hyperlink"/>
-          </w:rPr>
-          <w:t>drag</w:t>
-        </w:r>
-        <w:proofErr w:type="gramEnd"/>
-        <w:r>
-          <w:rPr>
-            <w:rStyle w:val="Hyperlink"/>
-          </w:rPr>
-          <w:t xml:space="preserve"> and drop interfaces</w:t>
-        </w:r>
-      </w:hyperlink>
-    </w:p>
-    <w:p>
-      <w:pPr>
-        <w:spacing w:line="360" w:lineRule="auto"/>
-        <w:ind w:left="360"/>
-        <w:rPr>
-          <w:rFonts w:ascii="Times New Roman" w:hAnsi="Times New Roman" w:cs="Times New Roman"/>
-          <w:sz w:val="26"/>
-          <w:szCs w:val="26"/>
-        </w:rPr>
-      </w:pPr>
-      <w:hyperlink r:id="rId37" w:history="1">
-        <w:r>
-          <w:rPr>
-            <w:rStyle w:val="Hyperlink"/>
-          </w:rPr>
-          <w:t>Installation | Recharts</w:t>
-        </w:r>
-      </w:hyperlink>
-    </w:p>
-    <w:p>
-      <w:pPr>
-        <w:spacing w:line="360" w:lineRule="auto"/>
-        <w:ind w:left="360"/>
-        <w:rPr>
-          <w:rFonts w:ascii="Times New Roman" w:hAnsi="Times New Roman" w:cs="Times New Roman"/>
-          <w:sz w:val="26"/>
-          <w:szCs w:val="26"/>
-        </w:rPr>
-      </w:pPr>
-      <w:hyperlink r:id="rId38" w:history="1">
-        <w:r>
-          <w:rPr>
-            <w:rStyle w:val="Hyperlink"/>
-          </w:rPr>
-          <w:t>Documentation | NestJS - A progressive Node.js framework</w:t>
-        </w:r>
-      </w:hyperlink>
-    </w:p>
-    <w:p>
-      <w:pPr>
-        <w:spacing w:line="360" w:lineRule="auto"/>
-        <w:ind w:left="360"/>
-        <w:rPr>
-          <w:rFonts w:ascii="Times New Roman" w:hAnsi="Times New Roman" w:cs="Times New Roman"/>
-          <w:sz w:val="26"/>
-          <w:szCs w:val="26"/>
-        </w:rPr>
-      </w:pPr>
-      <w:hyperlink r:id="rId39" w:history="1">
-        <w:r>
-          <w:rPr>
-            <w:rStyle w:val="Hyperlink"/>
-          </w:rPr>
-          <w:t>What is Prisma ORM? (Overview) | Prisma Documentation</w:t>
-        </w:r>
-      </w:hyperlink>
-    </w:p>
-    <w:p>
-      <w:pPr>
-        <w:spacing w:line="360" w:lineRule="auto"/>
-        <w:ind w:left="360"/>
-      </w:pPr>
-      <w:hyperlink r:id="rId40" w:history="1">
-        <w:r>
-          <w:rPr>
-            <w:rStyle w:val="Hyperlink"/>
-          </w:rPr>
-          <w:t>PostgreSQL: About</w:t>
-        </w:r>
-      </w:hyperlink>
-    </w:p>
-    <w:p>
-      <w:pPr>
-        <w:spacing w:line="360" w:lineRule="auto"/>
-      </w:pPr>
-    </w:p>
-    <w:p>
-      <w:pPr>
-        <w:spacing w:line="360" w:lineRule="auto"/>
       </w:pPr>
     </w:p>
     <w:sectPr>
-      <w:headerReference w:type="default" r:id="rId41"/>
+      <w:headerReference w:type="default" r:id="rId35"/>
       <w:pgSz w:w="12240" w:h="15840"/>
       <w:pgMar w:top="1134" w:right="1134" w:bottom="1134" w:left="1985" w:header="720" w:footer="720" w:gutter="0"/>
       <w:cols w:space="720"/>
@@ -30900,6 +32675,25 @@
       <w:spacing w:after="0"/>
     </w:pPr>
   </w:style>
+  <w:style w:type="character" w:styleId="Emphasis">
+    <w:name w:val="Emphasis"/>
+    <w:basedOn w:val="DefaultParagraphFont"/>
+    <w:uiPriority w:val="20"/>
+    <w:qFormat/>
+    <w:rsid w:val="001D2920"/>
+    <w:rPr>
+      <w:i/>
+      <w:iCs/>
+    </w:rPr>
+  </w:style>
+  <w:style w:type="paragraph" w:styleId="Bibliography">
+    <w:name w:val="Bibliography"/>
+    <w:basedOn w:val="Normal"/>
+    <w:next w:val="Normal"/>
+    <w:uiPriority w:val="37"/>
+    <w:unhideWhenUsed/>
+    <w:rsid w:val="009D0BFD"/>
+  </w:style>
 </w:styles>
 </file>
 
@@ -31199,11 +32993,240 @@
 </file>
 
 <file path=customXml/item1.xml><?xml version="1.0" encoding="utf-8"?>
-<b:Sources xmlns:b="http://schemas.openxmlformats.org/officeDocument/2006/bibliography" xmlns="http://schemas.openxmlformats.org/officeDocument/2006/bibliography" SelectedStyle="\APASixthEditionOfficeOnline.xsl" StyleName="APA" Version="6"/>
+<b:Sources xmlns:b="http://schemas.openxmlformats.org/officeDocument/2006/bibliography" xmlns="http://schemas.openxmlformats.org/officeDocument/2006/bibliography" SelectedStyle="\IEEE2006OfficeOnline.xsl" StyleName="IEEE" Version="2006">
+  <b:Source>
+    <b:Tag>Mar25</b:Tag>
+    <b:SourceType>InternetSite</b:SourceType>
+    <b:Guid>{C5786072-9BE6-4E6D-A89F-6D2FEE2EC546}</b:Guid>
+    <b:Title>Sales pipelines: A comprehensive walkthrough for sales leaders and reps</b:Title>
+    <b:Year>2025</b:Year>
+    <b:Author>
+      <b:Author>
+        <b:NameList>
+          <b:Person>
+            <b:Last>Burdon</b:Last>
+            <b:First>Mark</b:First>
+          </b:Person>
+        </b:NameList>
+      </b:Author>
+    </b:Author>
+    <b:ProductionCompany>HubSpot</b:ProductionCompany>
+    <b:Month>December</b:Month>
+    <b:Day>4</b:Day>
+    <b:YearAccessed>2026</b:YearAccessed>
+    <b:MonthAccessed>July</b:MonthAccessed>
+    <b:DayAccessed>25</b:DayAccessed>
+    <b:URL>https://blog.hubspot.com/sales/sales-pipeline</b:URL>
+    <b:RefOrder>1</b:RefOrder>
+  </b:Source>
+  <b:Source>
+    <b:Tag>Jay25</b:Tag>
+    <b:SourceType>InternetSite</b:SourceType>
+    <b:Guid>{DD0AC934-F657-4265-98CD-8C8544AB2E6B}</b:Guid>
+    <b:Author>
+      <b:Author>
+        <b:NameList>
+          <b:Person>
+            <b:Last>Fuchs</b:Last>
+            <b:First>Jay</b:First>
+          </b:Person>
+        </b:NameList>
+      </b:Author>
+    </b:Author>
+    <b:Title>I Mastered Sales Forecasting, Here Are My Top Tips [+Template]</b:Title>
+    <b:ProductionCompany>HubSpot</b:ProductionCompany>
+    <b:Year>2025</b:Year>
+    <b:Month>May</b:Month>
+    <b:Day>1</b:Day>
+    <b:YearAccessed>2026</b:YearAccessed>
+    <b:MonthAccessed>July</b:MonthAccessed>
+    <b:DayAccessed>25</b:DayAccessed>
+    <b:URL>https://blog.hubspot.com/sales/sales-forecasting</b:URL>
+    <b:RefOrder>2</b:RefOrder>
+  </b:Source>
+  <b:Source>
+    <b:Tag>Rav96</b:Tag>
+    <b:SourceType>JournalArticle</b:SourceType>
+    <b:Guid>{9E6621EB-883C-4293-88C1-6B5C4CDBEBE4}</b:Guid>
+    <b:Title>Role-Based Access Control Models</b:Title>
+    <b:Year>1996</b:Year>
+    <b:Author>
+      <b:Author>
+        <b:NameList>
+          <b:Person>
+            <b:Last>Sandhu</b:Last>
+            <b:First>Ravi</b:First>
+            <b:Middle>S.</b:Middle>
+          </b:Person>
+          <b:Person>
+            <b:Last>Coyne</b:Last>
+            <b:First>Edward</b:First>
+            <b:Middle>J.</b:Middle>
+          </b:Person>
+          <b:Person>
+            <b:Last>Feinstein</b:Last>
+            <b:First>Hal</b:First>
+            <b:Middle>L.</b:Middle>
+          </b:Person>
+          <b:Person>
+            <b:Last>Youman</b:Last>
+            <b:First>Charles</b:First>
+            <b:Middle>E.</b:Middle>
+          </b:Person>
+        </b:NameList>
+      </b:Author>
+    </b:Author>
+    <b:JournalName>Computer</b:JournalName>
+    <b:Pages>38-47</b:Pages>
+    <b:Volume>29</b:Volume>
+    <b:Issue>2</b:Issue>
+    <b:RefOrder>3</b:RefOrder>
+  </b:Source>
+  <b:Source>
+    <b:Tag>Roy00</b:Tag>
+    <b:SourceType>Report</b:SourceType>
+    <b:Guid>{B6483E78-9F0E-4EF9-B6C1-0131AAE0F4D2}</b:Guid>
+    <b:Title>Architectural Styles and the Design of Network-based Software Architectures</b:Title>
+    <b:Year>2000</b:Year>
+    <b:Author>
+      <b:Author>
+        <b:NameList>
+          <b:Person>
+            <b:Last>Fielding</b:Last>
+            <b:First>Roy</b:First>
+            <b:Middle>Thomas</b:Middle>
+          </b:Person>
+        </b:NameList>
+      </b:Author>
+    </b:Author>
+    <b:Publisher>University of California, Irvine</b:Publisher>
+    <b:City>Irvine, California</b:City>
+    <b:RefOrder>4</b:RefOrder>
+  </b:Source>
+  <b:Source>
+    <b:Tag>Nes26</b:Tag>
+    <b:SourceType>InternetSite</b:SourceType>
+    <b:Guid>{93C6ADC8-B655-42DC-A96C-C0BF8D9417B0}</b:Guid>
+    <b:Title>Modules</b:Title>
+    <b:Author>
+      <b:Author>
+        <b:Corporate>NestJS</b:Corporate>
+      </b:Author>
+    </b:Author>
+    <b:ProductionCompany>NestJS</b:ProductionCompany>
+    <b:YearAccessed>2026</b:YearAccessed>
+    <b:MonthAccessed>July</b:MonthAccessed>
+    <b:DayAccessed>25</b:DayAccessed>
+    <b:URL>https://docs.nestjs.com/modules</b:URL>
+    <b:RefOrder>5</b:RefOrder>
+  </b:Source>
+  <b:Source>
+    <b:Tag>Ver26</b:Tag>
+    <b:SourceType>InternetSite</b:SourceType>
+    <b:Guid>{F120C8F4-6C83-476D-B47B-B530965C6550}</b:Guid>
+    <b:Author>
+      <b:Author>
+        <b:Corporate>Vercel</b:Corporate>
+      </b:Author>
+    </b:Author>
+    <b:Title>Next.js Documentation</b:Title>
+    <b:ProductionCompany>Vercel</b:ProductionCompany>
+    <b:YearAccessed>2026</b:YearAccessed>
+    <b:MonthAccessed>July</b:MonthAccessed>
+    <b:DayAccessed>25</b:DayAccessed>
+    <b:URL>https://nextjs.org/docs</b:URL>
+    <b:RefOrder>6</b:RefOrder>
+  </b:Source>
+  <b:Source>
+    <b:Tag>dnd26</b:Tag>
+    <b:SourceType>InternetSite</b:SourceType>
+    <b:Guid>{145E5CFF-D19A-45CD-AAE2-FBCC6536C0D4}</b:Guid>
+    <b:Author>
+      <b:Author>
+        <b:Corporate>dnd-kit</b:Corporate>
+      </b:Author>
+    </b:Author>
+    <b:Title>dnd-kit Documentation</b:Title>
+    <b:ProductionCompany>dnd-kit</b:ProductionCompany>
+    <b:YearAccessed>2026</b:YearAccessed>
+    <b:MonthAccessed>July</b:MonthAccessed>
+    <b:DayAccessed>25</b:DayAccessed>
+    <b:URL>https://dndkit.com/</b:URL>
+    <b:RefOrder>7</b:RefOrder>
+  </b:Source>
+  <b:Source>
+    <b:Tag>Rec26</b:Tag>
+    <b:SourceType>InternetSite</b:SourceType>
+    <b:Guid>{C4BEF803-AE01-4C6D-A47D-99E295A940C6}</b:Guid>
+    <b:Author>
+      <b:Author>
+        <b:Corporate>Recharts Group</b:Corporate>
+      </b:Author>
+    </b:Author>
+    <b:Title>Recharts Documentation</b:Title>
+    <b:ProductionCompany>Recharts Group</b:ProductionCompany>
+    <b:YearAccessed>2026</b:YearAccessed>
+    <b:MonthAccessed>July</b:MonthAccessed>
+    <b:DayAccessed>25</b:DayAccessed>
+    <b:URL>https://recharts.github.io/</b:URL>
+    <b:RefOrder>8</b:RefOrder>
+  </b:Source>
+  <b:Source>
+    <b:Tag>Nes261</b:Tag>
+    <b:SourceType>InternetSite</b:SourceType>
+    <b:Guid>{93E05A93-2AEC-49A7-BC25-3BD401361C02}</b:Guid>
+    <b:Author>
+      <b:Author>
+        <b:Corporate>NestJS</b:Corporate>
+      </b:Author>
+    </b:Author>
+    <b:Title>NestJS Documentation</b:Title>
+    <b:ProductionCompany>NestJS</b:ProductionCompany>
+    <b:YearAccessed>2026</b:YearAccessed>
+    <b:MonthAccessed>July</b:MonthAccessed>
+    <b:DayAccessed>25</b:DayAccessed>
+    <b:URL>https://docs.nestjs.com/</b:URL>
+    <b:RefOrder>9</b:RefOrder>
+  </b:Source>
+  <b:Source>
+    <b:Tag>Pri26</b:Tag>
+    <b:SourceType>InternetSite</b:SourceType>
+    <b:Guid>{689021AF-8F77-461B-9A34-528E1875732E}</b:Guid>
+    <b:Author>
+      <b:Author>
+        <b:Corporate>Prisma</b:Corporate>
+      </b:Author>
+    </b:Author>
+    <b:Title>Prisma Documentation</b:Title>
+    <b:ProductionCompany>Prisma</b:ProductionCompany>
+    <b:YearAccessed>2026</b:YearAccessed>
+    <b:MonthAccessed>July</b:MonthAccessed>
+    <b:DayAccessed>25</b:DayAccessed>
+    <b:URL>https://www.prisma.io/docs</b:URL>
+    <b:RefOrder>10</b:RefOrder>
+  </b:Source>
+  <b:Source>
+    <b:Tag>The26</b:Tag>
+    <b:SourceType>InternetSite</b:SourceType>
+    <b:Guid>{A82C47A6-E62B-4BC5-BEDA-550CD0F2EF70}</b:Guid>
+    <b:Author>
+      <b:Author>
+        <b:Corporate>The PostgreSQL Global Development Group</b:Corporate>
+      </b:Author>
+    </b:Author>
+    <b:Title>PostgreSQL Documentation</b:Title>
+    <b:ProductionCompany>The PostgreSQL Global Development Group</b:ProductionCompany>
+    <b:YearAccessed>2026</b:YearAccessed>
+    <b:MonthAccessed>July</b:MonthAccessed>
+    <b:DayAccessed>25</b:DayAccessed>
+    <b:URL>https://www.postgresql.org/docs/</b:URL>
+    <b:RefOrder>11</b:RefOrder>
+  </b:Source>
+</b:Sources>
 </file>
 
 <file path=customXml/itemProps1.xml><?xml version="1.0" encoding="utf-8"?>
-<ds:datastoreItem xmlns:ds="http://schemas.openxmlformats.org/officeDocument/2006/customXml" ds:itemID="{537FA97E-2BA6-4F27-B690-74D80AC5CE74}">
+<ds:datastoreItem xmlns:ds="http://schemas.openxmlformats.org/officeDocument/2006/customXml" ds:itemID="{7891C6BD-9E07-4E2F-9F96-EB461861F8B0}">
   <ds:schemaRefs>
     <ds:schemaRef ds:uri="http://schemas.openxmlformats.org/officeDocument/2006/bibliography"/>
   </ds:schemaRefs>

</xml_diff>

<commit_message>
feat: cập nhật lại khổ giấy, sửa lỗi chính tả, xóa file rác, thêm nhật ký tuần 3 và sửa tên giảng viên hướng dẫn
</commit_message>
<xml_diff>
--- a/docs/BaoCao/BaoCao.docx
+++ b/docs/BaoCao/BaoCao.docx
@@ -374,11 +374,11 @@
         </w:rPr>
       </w:pPr>
       <w:bookmarkStart w:id="0" w:name="_Toc235563698"/>
-      <w:bookmarkStart w:id="1" w:name="_Toc235807264"/>
-      <w:r>
-        <w:rPr>
-          <w:rFonts w:ascii="Times New Roman" w:hAnsi="Times New Roman" w:cs="Times New Roman"/>
-        </w:rPr>
+      <w:r>
+        <w:rPr>
+          <w:rFonts w:ascii="Times New Roman" w:hAnsi="Times New Roman" w:cs="Times New Roman"/>
+        </w:rPr>
+        <w:lastRenderedPageBreak/>
         <w:br w:type="page"/>
       </w:r>
     </w:p>
@@ -390,6 +390,7 @@
           <w:rFonts w:ascii="Times New Roman" w:hAnsi="Times New Roman" w:cs="Times New Roman"/>
         </w:rPr>
       </w:pPr>
+      <w:bookmarkStart w:id="1" w:name="_Toc236150069"/>
       <w:r>
         <w:rPr>
           <w:rFonts w:ascii="Times New Roman" w:hAnsi="Times New Roman" w:cs="Times New Roman"/>
@@ -453,7 +454,23 @@
           <w:sz w:val="26"/>
           <w:szCs w:val="26"/>
         </w:rPr>
-        <w:t>Đặc biệt, em xin bày tỏ lòng biết ơn sâu sắc đến Thầy Võ Minh Khoa – giáo viên hướng dẫn, người đã tận tính hướng dẫn, góp ý và hỗ trợ em trong suốt quá trình thực hiện, thiết kế và xây dựng đề tài “Hệ thống CRM và quản lý phễu bán hàng cho doanh nghiệp nhỏ”. Những lời nhận xét của Thầy đã giúp em nắm rõ hơn về đề tài mà em nghiên cứu cả về nội dung lẫn hình thức.</w:t>
+        <w:t>Đặc biệt, em xin bày tỏ lòng biết ơn sâu sắc đến Thầy Võ</w:t>
+      </w:r>
+      <w:r>
+        <w:rPr>
+          <w:rFonts w:ascii="Times New Roman" w:hAnsi="Times New Roman" w:cs="Times New Roman"/>
+          <w:sz w:val="26"/>
+          <w:szCs w:val="26"/>
+        </w:rPr>
+        <w:t xml:space="preserve"> Việt</w:t>
+      </w:r>
+      <w:r>
+        <w:rPr>
+          <w:rFonts w:ascii="Times New Roman" w:hAnsi="Times New Roman" w:cs="Times New Roman"/>
+          <w:sz w:val="26"/>
+          <w:szCs w:val="26"/>
+        </w:rPr>
+        <w:t xml:space="preserve"> Khoa – giáo viên hướng dẫn, người đã tận tính hướng dẫn, góp ý và hỗ trợ em trong suốt quá trình thực hiện, thiết kế và xây dựng đề tài “Hệ thống CRM và quản lý phễu bán hàng cho doanh nghiệp nhỏ”. Những lời nhận xét của Thầy đã giúp em nắm rõ hơn về đề tài mà em nghiên cứu cả về nội dung lẫn hình thức.</w:t>
       </w:r>
     </w:p>
     <w:p>
@@ -545,7 +562,7 @@
         </w:rPr>
       </w:pPr>
       <w:bookmarkStart w:id="2" w:name="_Toc235563699"/>
-      <w:bookmarkStart w:id="3" w:name="_Toc235807265"/>
+      <w:bookmarkStart w:id="3" w:name="_Toc236150070"/>
       <w:r>
         <w:rPr>
           <w:rFonts w:ascii="Times New Roman" w:hAnsi="Times New Roman" w:cs="Times New Roman"/>
@@ -566,7 +583,7 @@
       <w:r>
         <w:br w:type="page"/>
       </w:r>
-      <w:bookmarkStart w:id="4" w:name="_Toc235807266"/>
+      <w:bookmarkStart w:id="4" w:name="_Toc236150071"/>
       <w:r>
         <w:rPr>
           <w:rFonts w:ascii="Times New Roman" w:hAnsi="Times New Roman" w:cs="Times New Roman"/>
@@ -643,7 +660,7 @@
           <w:pPr>
             <w:pStyle w:val="TOC1"/>
             <w:tabs>
-              <w:tab w:val="right" w:leader="dot" w:pos="9111"/>
+              <w:tab w:val="right" w:leader="dot" w:pos="9061"/>
             </w:tabs>
             <w:rPr>
               <w:rFonts w:eastAsiaTheme="minorEastAsia"/>
@@ -674,7 +691,7 @@
             </w:rPr>
             <w:fldChar w:fldCharType="separate"/>
           </w:r>
-          <w:hyperlink w:anchor="_Toc235807264" w:history="1">
+          <w:hyperlink w:anchor="_Toc236150069" w:history="1">
             <w:r>
               <w:rPr>
                 <w:rStyle w:val="Hyperlink"/>
@@ -702,7 +719,7 @@
                 <w:noProof/>
                 <w:webHidden/>
               </w:rPr>
-              <w:instrText xml:space="preserve"> PAGEREF _Toc235807264 \h </w:instrText>
+              <w:instrText xml:space="preserve"> PAGEREF _Toc236150069 \h </w:instrText>
             </w:r>
             <w:r>
               <w:rPr>
@@ -737,14 +754,14 @@
           <w:pPr>
             <w:pStyle w:val="TOC1"/>
             <w:tabs>
-              <w:tab w:val="right" w:leader="dot" w:pos="9111"/>
+              <w:tab w:val="right" w:leader="dot" w:pos="9061"/>
             </w:tabs>
             <w:rPr>
               <w:rFonts w:eastAsiaTheme="minorEastAsia"/>
               <w:noProof/>
             </w:rPr>
           </w:pPr>
-          <w:hyperlink w:anchor="_Toc235807265" w:history="1">
+          <w:hyperlink w:anchor="_Toc236150070" w:history="1">
             <w:r>
               <w:rPr>
                 <w:rStyle w:val="Hyperlink"/>
@@ -772,7 +789,7 @@
                 <w:noProof/>
                 <w:webHidden/>
               </w:rPr>
-              <w:instrText xml:space="preserve"> PAGEREF _Toc235807265 \h </w:instrText>
+              <w:instrText xml:space="preserve"> PAGEREF _Toc236150070 \h </w:instrText>
             </w:r>
             <w:r>
               <w:rPr>
@@ -807,14 +824,14 @@
           <w:pPr>
             <w:pStyle w:val="TOC1"/>
             <w:tabs>
-              <w:tab w:val="right" w:leader="dot" w:pos="9111"/>
+              <w:tab w:val="right" w:leader="dot" w:pos="9061"/>
             </w:tabs>
             <w:rPr>
               <w:rFonts w:eastAsiaTheme="minorEastAsia"/>
               <w:noProof/>
             </w:rPr>
           </w:pPr>
-          <w:hyperlink w:anchor="_Toc235807266" w:history="1">
+          <w:hyperlink w:anchor="_Toc236150071" w:history="1">
             <w:r>
               <w:rPr>
                 <w:rStyle w:val="Hyperlink"/>
@@ -842,7 +859,7 @@
                 <w:noProof/>
                 <w:webHidden/>
               </w:rPr>
-              <w:instrText xml:space="preserve"> PAGEREF _Toc235807266 \h </w:instrText>
+              <w:instrText xml:space="preserve"> PAGEREF _Toc236150071 \h </w:instrText>
             </w:r>
             <w:r>
               <w:rPr>
@@ -877,14 +894,14 @@
           <w:pPr>
             <w:pStyle w:val="TOC1"/>
             <w:tabs>
-              <w:tab w:val="right" w:leader="dot" w:pos="9111"/>
+              <w:tab w:val="right" w:leader="dot" w:pos="9061"/>
             </w:tabs>
             <w:rPr>
               <w:rFonts w:eastAsiaTheme="minorEastAsia"/>
               <w:noProof/>
             </w:rPr>
           </w:pPr>
-          <w:hyperlink w:anchor="_Toc235807267" w:history="1">
+          <w:hyperlink w:anchor="_Toc236150072" w:history="1">
             <w:r>
               <w:rPr>
                 <w:rStyle w:val="Hyperlink"/>
@@ -912,7 +929,7 @@
                 <w:noProof/>
                 <w:webHidden/>
               </w:rPr>
-              <w:instrText xml:space="preserve"> PAGEREF _Toc235807267 \h </w:instrText>
+              <w:instrText xml:space="preserve"> PAGEREF _Toc236150072 \h </w:instrText>
             </w:r>
             <w:r>
               <w:rPr>
@@ -947,14 +964,14 @@
           <w:pPr>
             <w:pStyle w:val="TOC1"/>
             <w:tabs>
-              <w:tab w:val="right" w:leader="dot" w:pos="9111"/>
+              <w:tab w:val="right" w:leader="dot" w:pos="9061"/>
             </w:tabs>
             <w:rPr>
               <w:rFonts w:eastAsiaTheme="minorEastAsia"/>
               <w:noProof/>
             </w:rPr>
           </w:pPr>
-          <w:hyperlink w:anchor="_Toc235807268" w:history="1">
+          <w:hyperlink w:anchor="_Toc236150073" w:history="1">
             <w:r>
               <w:rPr>
                 <w:rStyle w:val="Hyperlink"/>
@@ -982,7 +999,7 @@
                 <w:noProof/>
                 <w:webHidden/>
               </w:rPr>
-              <w:instrText xml:space="preserve"> PAGEREF _Toc235807268 \h </w:instrText>
+              <w:instrText xml:space="preserve"> PAGEREF _Toc236150073 \h </w:instrText>
             </w:r>
             <w:r>
               <w:rPr>
@@ -1017,14 +1034,14 @@
           <w:pPr>
             <w:pStyle w:val="TOC1"/>
             <w:tabs>
-              <w:tab w:val="right" w:leader="dot" w:pos="9111"/>
+              <w:tab w:val="right" w:leader="dot" w:pos="9061"/>
             </w:tabs>
             <w:rPr>
               <w:rFonts w:eastAsiaTheme="minorEastAsia"/>
               <w:noProof/>
             </w:rPr>
           </w:pPr>
-          <w:hyperlink w:anchor="_Toc235807269" w:history="1">
+          <w:hyperlink w:anchor="_Toc236150074" w:history="1">
             <w:r>
               <w:rPr>
                 <w:rStyle w:val="Hyperlink"/>
@@ -1052,7 +1069,7 @@
                 <w:noProof/>
                 <w:webHidden/>
               </w:rPr>
-              <w:instrText xml:space="preserve"> PAGEREF _Toc235807269 \h </w:instrText>
+              <w:instrText xml:space="preserve"> PAGEREF _Toc236150074 \h </w:instrText>
             </w:r>
             <w:r>
               <w:rPr>
@@ -1087,14 +1104,14 @@
           <w:pPr>
             <w:pStyle w:val="TOC1"/>
             <w:tabs>
-              <w:tab w:val="right" w:leader="dot" w:pos="9111"/>
+              <w:tab w:val="right" w:leader="dot" w:pos="9061"/>
             </w:tabs>
             <w:rPr>
               <w:rFonts w:eastAsiaTheme="minorEastAsia"/>
               <w:noProof/>
             </w:rPr>
           </w:pPr>
-          <w:hyperlink w:anchor="_Toc235807270" w:history="1">
+          <w:hyperlink w:anchor="_Toc236150075" w:history="1">
             <w:r>
               <w:rPr>
                 <w:rStyle w:val="Hyperlink"/>
@@ -1122,7 +1139,7 @@
                 <w:noProof/>
                 <w:webHidden/>
               </w:rPr>
-              <w:instrText xml:space="preserve"> PAGEREF _Toc235807270 \h </w:instrText>
+              <w:instrText xml:space="preserve"> PAGEREF _Toc236150075 \h </w:instrText>
             </w:r>
             <w:r>
               <w:rPr>
@@ -1157,14 +1174,14 @@
           <w:pPr>
             <w:pStyle w:val="TOC2"/>
             <w:tabs>
-              <w:tab w:val="right" w:leader="dot" w:pos="9111"/>
+              <w:tab w:val="right" w:leader="dot" w:pos="9061"/>
             </w:tabs>
             <w:rPr>
               <w:rFonts w:eastAsiaTheme="minorEastAsia"/>
               <w:noProof/>
             </w:rPr>
           </w:pPr>
-          <w:hyperlink w:anchor="_Toc235807271" w:history="1">
+          <w:hyperlink w:anchor="_Toc236150076" w:history="1">
             <w:r>
               <w:rPr>
                 <w:rStyle w:val="Hyperlink"/>
@@ -1192,7 +1209,7 @@
                 <w:noProof/>
                 <w:webHidden/>
               </w:rPr>
-              <w:instrText xml:space="preserve"> PAGEREF _Toc235807271 \h </w:instrText>
+              <w:instrText xml:space="preserve"> PAGEREF _Toc236150076 \h </w:instrText>
             </w:r>
             <w:r>
               <w:rPr>
@@ -1227,14 +1244,14 @@
           <w:pPr>
             <w:pStyle w:val="TOC2"/>
             <w:tabs>
-              <w:tab w:val="right" w:leader="dot" w:pos="9111"/>
+              <w:tab w:val="right" w:leader="dot" w:pos="9061"/>
             </w:tabs>
             <w:rPr>
               <w:rFonts w:eastAsiaTheme="minorEastAsia"/>
               <w:noProof/>
             </w:rPr>
           </w:pPr>
-          <w:hyperlink w:anchor="_Toc235807272" w:history="1">
+          <w:hyperlink w:anchor="_Toc236150077" w:history="1">
             <w:r>
               <w:rPr>
                 <w:rStyle w:val="Hyperlink"/>
@@ -1262,7 +1279,7 @@
                 <w:noProof/>
                 <w:webHidden/>
               </w:rPr>
-              <w:instrText xml:space="preserve"> PAGEREF _Toc235807272 \h </w:instrText>
+              <w:instrText xml:space="preserve"> PAGEREF _Toc236150077 \h </w:instrText>
             </w:r>
             <w:r>
               <w:rPr>
@@ -1297,14 +1314,14 @@
           <w:pPr>
             <w:pStyle w:val="TOC2"/>
             <w:tabs>
-              <w:tab w:val="right" w:leader="dot" w:pos="9111"/>
+              <w:tab w:val="right" w:leader="dot" w:pos="9061"/>
             </w:tabs>
             <w:rPr>
               <w:rFonts w:eastAsiaTheme="minorEastAsia"/>
               <w:noProof/>
             </w:rPr>
           </w:pPr>
-          <w:hyperlink w:anchor="_Toc235807273" w:history="1">
+          <w:hyperlink w:anchor="_Toc236150078" w:history="1">
             <w:r>
               <w:rPr>
                 <w:rStyle w:val="Hyperlink"/>
@@ -1332,7 +1349,7 @@
                 <w:noProof/>
                 <w:webHidden/>
               </w:rPr>
-              <w:instrText xml:space="preserve"> PAGEREF _Toc235807273 \h </w:instrText>
+              <w:instrText xml:space="preserve"> PAGEREF _Toc236150078 \h </w:instrText>
             </w:r>
             <w:r>
               <w:rPr>
@@ -1367,14 +1384,14 @@
           <w:pPr>
             <w:pStyle w:val="TOC2"/>
             <w:tabs>
-              <w:tab w:val="right" w:leader="dot" w:pos="9111"/>
+              <w:tab w:val="right" w:leader="dot" w:pos="9061"/>
             </w:tabs>
             <w:rPr>
               <w:rFonts w:eastAsiaTheme="minorEastAsia"/>
               <w:noProof/>
             </w:rPr>
           </w:pPr>
-          <w:hyperlink w:anchor="_Toc235807274" w:history="1">
+          <w:hyperlink w:anchor="_Toc236150079" w:history="1">
             <w:r>
               <w:rPr>
                 <w:rStyle w:val="Hyperlink"/>
@@ -1402,7 +1419,7 @@
                 <w:noProof/>
                 <w:webHidden/>
               </w:rPr>
-              <w:instrText xml:space="preserve"> PAGEREF _Toc235807274 \h </w:instrText>
+              <w:instrText xml:space="preserve"> PAGEREF _Toc236150079 \h </w:instrText>
             </w:r>
             <w:r>
               <w:rPr>
@@ -1437,14 +1454,14 @@
           <w:pPr>
             <w:pStyle w:val="TOC1"/>
             <w:tabs>
-              <w:tab w:val="right" w:leader="dot" w:pos="9111"/>
+              <w:tab w:val="right" w:leader="dot" w:pos="9061"/>
             </w:tabs>
             <w:rPr>
               <w:rFonts w:eastAsiaTheme="minorEastAsia"/>
               <w:noProof/>
             </w:rPr>
           </w:pPr>
-          <w:hyperlink w:anchor="_Toc235807275" w:history="1">
+          <w:hyperlink w:anchor="_Toc236150080" w:history="1">
             <w:r>
               <w:rPr>
                 <w:rStyle w:val="Hyperlink"/>
@@ -1472,7 +1489,7 @@
                 <w:noProof/>
                 <w:webHidden/>
               </w:rPr>
-              <w:instrText xml:space="preserve"> PAGEREF _Toc235807275 \h </w:instrText>
+              <w:instrText xml:space="preserve"> PAGEREF _Toc236150080 \h </w:instrText>
             </w:r>
             <w:r>
               <w:rPr>
@@ -1507,14 +1524,14 @@
           <w:pPr>
             <w:pStyle w:val="TOC2"/>
             <w:tabs>
-              <w:tab w:val="right" w:leader="dot" w:pos="9111"/>
+              <w:tab w:val="right" w:leader="dot" w:pos="9061"/>
             </w:tabs>
             <w:rPr>
               <w:rFonts w:eastAsiaTheme="minorEastAsia"/>
               <w:noProof/>
             </w:rPr>
           </w:pPr>
-          <w:hyperlink w:anchor="_Toc235807276" w:history="1">
+          <w:hyperlink w:anchor="_Toc236150081" w:history="1">
             <w:r>
               <w:rPr>
                 <w:rStyle w:val="Hyperlink"/>
@@ -1542,7 +1559,7 @@
                 <w:noProof/>
                 <w:webHidden/>
               </w:rPr>
-              <w:instrText xml:space="preserve"> PAGEREF _Toc235807276 \h </w:instrText>
+              <w:instrText xml:space="preserve"> PAGEREF _Toc236150081 \h </w:instrText>
             </w:r>
             <w:r>
               <w:rPr>
@@ -1577,37 +1594,21 @@
           <w:pPr>
             <w:pStyle w:val="TOC3"/>
             <w:tabs>
-              <w:tab w:val="right" w:leader="dot" w:pos="9111"/>
+              <w:tab w:val="right" w:leader="dot" w:pos="9061"/>
             </w:tabs>
             <w:rPr>
               <w:rFonts w:eastAsiaTheme="minorEastAsia"/>
               <w:noProof/>
             </w:rPr>
           </w:pPr>
-          <w:hyperlink w:anchor="_Toc235807277" w:history="1">
+          <w:hyperlink w:anchor="_Toc236150082" w:history="1">
             <w:r>
               <w:rPr>
                 <w:rStyle w:val="Hyperlink"/>
                 <w:rFonts w:ascii="Times New Roman" w:hAnsi="Times New Roman" w:cs="Times New Roman"/>
                 <w:noProof/>
               </w:rPr>
-              <w:t>Hệ thống HubSp</w:t>
-            </w:r>
-            <w:r>
-              <w:rPr>
-                <w:rStyle w:val="Hyperlink"/>
-                <w:rFonts w:ascii="Times New Roman" w:hAnsi="Times New Roman" w:cs="Times New Roman"/>
-                <w:noProof/>
-              </w:rPr>
-              <w:t>o</w:t>
-            </w:r>
-            <w:r>
-              <w:rPr>
-                <w:rStyle w:val="Hyperlink"/>
-                <w:rFonts w:ascii="Times New Roman" w:hAnsi="Times New Roman" w:cs="Times New Roman"/>
-                <w:noProof/>
-              </w:rPr>
-              <w:t>t CRM</w:t>
+              <w:t>Hệ thống HubSpot CRM</w:t>
             </w:r>
             <w:r>
               <w:rPr>
@@ -1628,7 +1629,7 @@
                 <w:noProof/>
                 <w:webHidden/>
               </w:rPr>
-              <w:instrText xml:space="preserve"> PAGEREF _Toc235807277 \h </w:instrText>
+              <w:instrText xml:space="preserve"> PAGEREF _Toc236150082 \h </w:instrText>
             </w:r>
             <w:r>
               <w:rPr>
@@ -1663,14 +1664,14 @@
           <w:pPr>
             <w:pStyle w:val="TOC3"/>
             <w:tabs>
-              <w:tab w:val="right" w:leader="dot" w:pos="9111"/>
+              <w:tab w:val="right" w:leader="dot" w:pos="9061"/>
             </w:tabs>
             <w:rPr>
               <w:rFonts w:eastAsiaTheme="minorEastAsia"/>
               <w:noProof/>
             </w:rPr>
           </w:pPr>
-          <w:hyperlink w:anchor="_Toc235807278" w:history="1">
+          <w:hyperlink w:anchor="_Toc236150083" w:history="1">
             <w:r>
               <w:rPr>
                 <w:rStyle w:val="Hyperlink"/>
@@ -1698,7 +1699,7 @@
                 <w:noProof/>
                 <w:webHidden/>
               </w:rPr>
-              <w:instrText xml:space="preserve"> PAGEREF _Toc235807278 \h </w:instrText>
+              <w:instrText xml:space="preserve"> PAGEREF _Toc236150083 \h </w:instrText>
             </w:r>
             <w:r>
               <w:rPr>
@@ -1733,14 +1734,14 @@
           <w:pPr>
             <w:pStyle w:val="TOC2"/>
             <w:tabs>
-              <w:tab w:val="right" w:leader="dot" w:pos="9111"/>
+              <w:tab w:val="right" w:leader="dot" w:pos="9061"/>
             </w:tabs>
             <w:rPr>
               <w:rFonts w:eastAsiaTheme="minorEastAsia"/>
               <w:noProof/>
             </w:rPr>
           </w:pPr>
-          <w:hyperlink w:anchor="_Toc235807279" w:history="1">
+          <w:hyperlink w:anchor="_Toc236150084" w:history="1">
             <w:r>
               <w:rPr>
                 <w:rStyle w:val="Hyperlink"/>
@@ -1768,7 +1769,7 @@
                 <w:noProof/>
                 <w:webHidden/>
               </w:rPr>
-              <w:instrText xml:space="preserve"> PAGEREF _Toc235807279 \h </w:instrText>
+              <w:instrText xml:space="preserve"> PAGEREF _Toc236150084 \h </w:instrText>
             </w:r>
             <w:r>
               <w:rPr>
@@ -1803,53 +1804,21 @@
           <w:pPr>
             <w:pStyle w:val="TOC3"/>
             <w:tabs>
-              <w:tab w:val="right" w:leader="dot" w:pos="9111"/>
+              <w:tab w:val="right" w:leader="dot" w:pos="9061"/>
             </w:tabs>
             <w:rPr>
               <w:rFonts w:eastAsiaTheme="minorEastAsia"/>
               <w:noProof/>
             </w:rPr>
           </w:pPr>
-          <w:hyperlink w:anchor="_Toc235807280" w:history="1">
+          <w:hyperlink w:anchor="_Toc236150085" w:history="1">
             <w:r>
               <w:rPr>
                 <w:rStyle w:val="Hyperlink"/>
                 <w:rFonts w:ascii="Times New Roman" w:hAnsi="Times New Roman" w:cs="Times New Roman"/>
                 <w:noProof/>
               </w:rPr>
-              <w:t>Sales Pip</w:t>
-            </w:r>
-            <w:r>
-              <w:rPr>
-                <w:rStyle w:val="Hyperlink"/>
-                <w:rFonts w:ascii="Times New Roman" w:hAnsi="Times New Roman" w:cs="Times New Roman"/>
-                <w:noProof/>
-              </w:rPr>
-              <w:t>e</w:t>
-            </w:r>
-            <w:r>
-              <w:rPr>
-                <w:rStyle w:val="Hyperlink"/>
-                <w:rFonts w:ascii="Times New Roman" w:hAnsi="Times New Roman" w:cs="Times New Roman"/>
-                <w:noProof/>
-              </w:rPr>
-              <w:t>l</w:t>
-            </w:r>
-            <w:r>
-              <w:rPr>
-                <w:rStyle w:val="Hyperlink"/>
-                <w:rFonts w:ascii="Times New Roman" w:hAnsi="Times New Roman" w:cs="Times New Roman"/>
-                <w:noProof/>
-              </w:rPr>
-              <w:t>i</w:t>
-            </w:r>
-            <w:r>
-              <w:rPr>
-                <w:rStyle w:val="Hyperlink"/>
-                <w:rFonts w:ascii="Times New Roman" w:hAnsi="Times New Roman" w:cs="Times New Roman"/>
-                <w:noProof/>
-              </w:rPr>
-              <w:t>ne</w:t>
+              <w:t>Sales Pipeline</w:t>
             </w:r>
             <w:r>
               <w:rPr>
@@ -1870,7 +1839,7 @@
                 <w:noProof/>
                 <w:webHidden/>
               </w:rPr>
-              <w:instrText xml:space="preserve"> PAGEREF _Toc235807280 \h </w:instrText>
+              <w:instrText xml:space="preserve"> PAGEREF _Toc236150085 \h </w:instrText>
             </w:r>
             <w:r>
               <w:rPr>
@@ -1905,37 +1874,21 @@
           <w:pPr>
             <w:pStyle w:val="TOC3"/>
             <w:tabs>
-              <w:tab w:val="right" w:leader="dot" w:pos="9111"/>
+              <w:tab w:val="right" w:leader="dot" w:pos="9061"/>
             </w:tabs>
             <w:rPr>
               <w:rFonts w:eastAsiaTheme="minorEastAsia"/>
               <w:noProof/>
             </w:rPr>
           </w:pPr>
-          <w:hyperlink w:anchor="_Toc235807281" w:history="1">
+          <w:hyperlink w:anchor="_Toc236150086" w:history="1">
             <w:r>
               <w:rPr>
                 <w:rStyle w:val="Hyperlink"/>
                 <w:rFonts w:ascii="Times New Roman" w:hAnsi="Times New Roman" w:cs="Times New Roman"/>
                 <w:noProof/>
               </w:rPr>
-              <w:t>Sales Fo</w:t>
-            </w:r>
-            <w:r>
-              <w:rPr>
-                <w:rStyle w:val="Hyperlink"/>
-                <w:rFonts w:ascii="Times New Roman" w:hAnsi="Times New Roman" w:cs="Times New Roman"/>
-                <w:noProof/>
-              </w:rPr>
-              <w:t>r</w:t>
-            </w:r>
-            <w:r>
-              <w:rPr>
-                <w:rStyle w:val="Hyperlink"/>
-                <w:rFonts w:ascii="Times New Roman" w:hAnsi="Times New Roman" w:cs="Times New Roman"/>
-                <w:noProof/>
-              </w:rPr>
-              <w:t>ecast</w:t>
+              <w:t>Sales Forecast</w:t>
             </w:r>
             <w:r>
               <w:rPr>
@@ -1956,7 +1909,7 @@
                 <w:noProof/>
                 <w:webHidden/>
               </w:rPr>
-              <w:instrText xml:space="preserve"> PAGEREF _Toc235807281 \h </w:instrText>
+              <w:instrText xml:space="preserve"> PAGEREF _Toc236150086 \h </w:instrText>
             </w:r>
             <w:r>
               <w:rPr>
@@ -1991,14 +1944,14 @@
           <w:pPr>
             <w:pStyle w:val="TOC3"/>
             <w:tabs>
-              <w:tab w:val="right" w:leader="dot" w:pos="9111"/>
+              <w:tab w:val="right" w:leader="dot" w:pos="9061"/>
             </w:tabs>
             <w:rPr>
               <w:rFonts w:eastAsiaTheme="minorEastAsia"/>
               <w:noProof/>
             </w:rPr>
           </w:pPr>
-          <w:hyperlink w:anchor="_Toc235807282" w:history="1">
+          <w:hyperlink w:anchor="_Toc236150087" w:history="1">
             <w:r>
               <w:rPr>
                 <w:rStyle w:val="Hyperlink"/>
@@ -2026,7 +1979,7 @@
                 <w:noProof/>
                 <w:webHidden/>
               </w:rPr>
-              <w:instrText xml:space="preserve"> PAGEREF _Toc235807282 \h </w:instrText>
+              <w:instrText xml:space="preserve"> PAGEREF _Toc236150087 \h </w:instrText>
             </w:r>
             <w:r>
               <w:rPr>
@@ -2046,7 +1999,7 @@
                 <w:noProof/>
                 <w:webHidden/>
               </w:rPr>
-              <w:t>16</w:t>
+              <w:t>15</w:t>
             </w:r>
             <w:r>
               <w:rPr>
@@ -2061,14 +2014,14 @@
           <w:pPr>
             <w:pStyle w:val="TOC3"/>
             <w:tabs>
-              <w:tab w:val="right" w:leader="dot" w:pos="9111"/>
+              <w:tab w:val="right" w:leader="dot" w:pos="9061"/>
             </w:tabs>
             <w:rPr>
               <w:rFonts w:eastAsiaTheme="minorEastAsia"/>
               <w:noProof/>
             </w:rPr>
           </w:pPr>
-          <w:hyperlink w:anchor="_Toc235807283" w:history="1">
+          <w:hyperlink w:anchor="_Toc236150088" w:history="1">
             <w:r>
               <w:rPr>
                 <w:rStyle w:val="Hyperlink"/>
@@ -2096,7 +2049,7 @@
                 <w:noProof/>
                 <w:webHidden/>
               </w:rPr>
-              <w:instrText xml:space="preserve"> PAGEREF _Toc235807283 \h </w:instrText>
+              <w:instrText xml:space="preserve"> PAGEREF _Toc236150088 \h </w:instrText>
             </w:r>
             <w:r>
               <w:rPr>
@@ -2131,14 +2084,14 @@
           <w:pPr>
             <w:pStyle w:val="TOC3"/>
             <w:tabs>
-              <w:tab w:val="right" w:leader="dot" w:pos="9111"/>
+              <w:tab w:val="right" w:leader="dot" w:pos="9061"/>
             </w:tabs>
             <w:rPr>
               <w:rFonts w:eastAsiaTheme="minorEastAsia"/>
               <w:noProof/>
             </w:rPr>
           </w:pPr>
-          <w:hyperlink w:anchor="_Toc235807284" w:history="1">
+          <w:hyperlink w:anchor="_Toc236150089" w:history="1">
             <w:r>
               <w:rPr>
                 <w:rStyle w:val="Hyperlink"/>
@@ -2166,7 +2119,7 @@
                 <w:noProof/>
                 <w:webHidden/>
               </w:rPr>
-              <w:instrText xml:space="preserve"> PAGEREF _Toc235807284 \h </w:instrText>
+              <w:instrText xml:space="preserve"> PAGEREF _Toc236150089 \h </w:instrText>
             </w:r>
             <w:r>
               <w:rPr>
@@ -2186,7 +2139,7 @@
                 <w:noProof/>
                 <w:webHidden/>
               </w:rPr>
-              <w:t>17</w:t>
+              <w:t>16</w:t>
             </w:r>
             <w:r>
               <w:rPr>
@@ -2201,14 +2154,14 @@
           <w:pPr>
             <w:pStyle w:val="TOC2"/>
             <w:tabs>
-              <w:tab w:val="right" w:leader="dot" w:pos="9111"/>
+              <w:tab w:val="right" w:leader="dot" w:pos="9061"/>
             </w:tabs>
             <w:rPr>
               <w:rFonts w:eastAsiaTheme="minorEastAsia"/>
               <w:noProof/>
             </w:rPr>
           </w:pPr>
-          <w:hyperlink w:anchor="_Toc235807285" w:history="1">
+          <w:hyperlink w:anchor="_Toc236150090" w:history="1">
             <w:r>
               <w:rPr>
                 <w:rStyle w:val="Hyperlink"/>
@@ -2236,7 +2189,7 @@
                 <w:noProof/>
                 <w:webHidden/>
               </w:rPr>
-              <w:instrText xml:space="preserve"> PAGEREF _Toc235807285 \h </w:instrText>
+              <w:instrText xml:space="preserve"> PAGEREF _Toc236150090 \h </w:instrText>
             </w:r>
             <w:r>
               <w:rPr>
@@ -2271,14 +2224,14 @@
           <w:pPr>
             <w:pStyle w:val="TOC3"/>
             <w:tabs>
-              <w:tab w:val="right" w:leader="dot" w:pos="9111"/>
+              <w:tab w:val="right" w:leader="dot" w:pos="9061"/>
             </w:tabs>
             <w:rPr>
               <w:rFonts w:eastAsiaTheme="minorEastAsia"/>
               <w:noProof/>
             </w:rPr>
           </w:pPr>
-          <w:hyperlink w:anchor="_Toc235807286" w:history="1">
+          <w:hyperlink w:anchor="_Toc236150091" w:history="1">
             <w:r>
               <w:rPr>
                 <w:rStyle w:val="Hyperlink"/>
@@ -2306,7 +2259,7 @@
                 <w:noProof/>
                 <w:webHidden/>
               </w:rPr>
-              <w:instrText xml:space="preserve"> PAGEREF _Toc235807286 \h </w:instrText>
+              <w:instrText xml:space="preserve"> PAGEREF _Toc236150091 \h </w:instrText>
             </w:r>
             <w:r>
               <w:rPr>
@@ -2341,14 +2294,14 @@
           <w:pPr>
             <w:pStyle w:val="TOC3"/>
             <w:tabs>
-              <w:tab w:val="right" w:leader="dot" w:pos="9111"/>
+              <w:tab w:val="right" w:leader="dot" w:pos="9061"/>
             </w:tabs>
             <w:rPr>
               <w:rFonts w:eastAsiaTheme="minorEastAsia"/>
               <w:noProof/>
             </w:rPr>
           </w:pPr>
-          <w:hyperlink w:anchor="_Toc235807287" w:history="1">
+          <w:hyperlink w:anchor="_Toc236150092" w:history="1">
             <w:r>
               <w:rPr>
                 <w:rStyle w:val="Hyperlink"/>
@@ -2376,7 +2329,7 @@
                 <w:noProof/>
                 <w:webHidden/>
               </w:rPr>
-              <w:instrText xml:space="preserve"> PAGEREF _Toc235807287 \h </w:instrText>
+              <w:instrText xml:space="preserve"> PAGEREF _Toc236150092 \h </w:instrText>
             </w:r>
             <w:r>
               <w:rPr>
@@ -2411,14 +2364,14 @@
           <w:pPr>
             <w:pStyle w:val="TOC3"/>
             <w:tabs>
-              <w:tab w:val="right" w:leader="dot" w:pos="9111"/>
+              <w:tab w:val="right" w:leader="dot" w:pos="9061"/>
             </w:tabs>
             <w:rPr>
               <w:rFonts w:eastAsiaTheme="minorEastAsia"/>
               <w:noProof/>
             </w:rPr>
           </w:pPr>
-          <w:hyperlink w:anchor="_Toc235807288" w:history="1">
+          <w:hyperlink w:anchor="_Toc236150093" w:history="1">
             <w:r>
               <w:rPr>
                 <w:rStyle w:val="Hyperlink"/>
@@ -2446,7 +2399,7 @@
                 <w:noProof/>
                 <w:webHidden/>
               </w:rPr>
-              <w:instrText xml:space="preserve"> PAGEREF _Toc235807288 \h </w:instrText>
+              <w:instrText xml:space="preserve"> PAGEREF _Toc236150093 \h </w:instrText>
             </w:r>
             <w:r>
               <w:rPr>
@@ -2481,14 +2434,14 @@
           <w:pPr>
             <w:pStyle w:val="TOC1"/>
             <w:tabs>
-              <w:tab w:val="right" w:leader="dot" w:pos="9111"/>
+              <w:tab w:val="right" w:leader="dot" w:pos="9061"/>
             </w:tabs>
             <w:rPr>
               <w:rFonts w:eastAsiaTheme="minorEastAsia"/>
               <w:noProof/>
             </w:rPr>
           </w:pPr>
-          <w:hyperlink w:anchor="_Toc235807289" w:history="1">
+          <w:hyperlink w:anchor="_Toc236150094" w:history="1">
             <w:r>
               <w:rPr>
                 <w:rStyle w:val="Hyperlink"/>
@@ -2516,7 +2469,7 @@
                 <w:noProof/>
                 <w:webHidden/>
               </w:rPr>
-              <w:instrText xml:space="preserve"> PAGEREF _Toc235807289 \h </w:instrText>
+              <w:instrText xml:space="preserve"> PAGEREF _Toc236150094 \h </w:instrText>
             </w:r>
             <w:r>
               <w:rPr>
@@ -2536,7 +2489,7 @@
                 <w:noProof/>
                 <w:webHidden/>
               </w:rPr>
-              <w:t>21</w:t>
+              <w:t>20</w:t>
             </w:r>
             <w:r>
               <w:rPr>
@@ -2551,14 +2504,14 @@
           <w:pPr>
             <w:pStyle w:val="TOC2"/>
             <w:tabs>
-              <w:tab w:val="right" w:leader="dot" w:pos="9111"/>
+              <w:tab w:val="right" w:leader="dot" w:pos="9061"/>
             </w:tabs>
             <w:rPr>
               <w:rFonts w:eastAsiaTheme="minorEastAsia"/>
               <w:noProof/>
             </w:rPr>
           </w:pPr>
-          <w:hyperlink w:anchor="_Toc235807290" w:history="1">
+          <w:hyperlink w:anchor="_Toc236150095" w:history="1">
             <w:r>
               <w:rPr>
                 <w:rStyle w:val="Hyperlink"/>
@@ -2586,7 +2539,7 @@
                 <w:noProof/>
                 <w:webHidden/>
               </w:rPr>
-              <w:instrText xml:space="preserve"> PAGEREF _Toc235807290 \h </w:instrText>
+              <w:instrText xml:space="preserve"> PAGEREF _Toc236150095 \h </w:instrText>
             </w:r>
             <w:r>
               <w:rPr>
@@ -2606,7 +2559,7 @@
                 <w:noProof/>
                 <w:webHidden/>
               </w:rPr>
-              <w:t>21</w:t>
+              <w:t>20</w:t>
             </w:r>
             <w:r>
               <w:rPr>
@@ -2621,14 +2574,14 @@
           <w:pPr>
             <w:pStyle w:val="TOC3"/>
             <w:tabs>
-              <w:tab w:val="right" w:leader="dot" w:pos="9111"/>
+              <w:tab w:val="right" w:leader="dot" w:pos="9061"/>
             </w:tabs>
             <w:rPr>
               <w:rFonts w:eastAsiaTheme="minorEastAsia"/>
               <w:noProof/>
             </w:rPr>
           </w:pPr>
-          <w:hyperlink w:anchor="_Toc235807291" w:history="1">
+          <w:hyperlink w:anchor="_Toc236150096" w:history="1">
             <w:r>
               <w:rPr>
                 <w:rStyle w:val="Hyperlink"/>
@@ -2656,7 +2609,7 @@
                 <w:noProof/>
                 <w:webHidden/>
               </w:rPr>
-              <w:instrText xml:space="preserve"> PAGEREF _Toc235807291 \h </w:instrText>
+              <w:instrText xml:space="preserve"> PAGEREF _Toc236150096 \h </w:instrText>
             </w:r>
             <w:r>
               <w:rPr>
@@ -2676,7 +2629,7 @@
                 <w:noProof/>
                 <w:webHidden/>
               </w:rPr>
-              <w:t>21</w:t>
+              <w:t>20</w:t>
             </w:r>
             <w:r>
               <w:rPr>
@@ -2691,14 +2644,14 @@
           <w:pPr>
             <w:pStyle w:val="TOC3"/>
             <w:tabs>
-              <w:tab w:val="right" w:leader="dot" w:pos="9111"/>
+              <w:tab w:val="right" w:leader="dot" w:pos="9061"/>
             </w:tabs>
             <w:rPr>
               <w:rFonts w:eastAsiaTheme="minorEastAsia"/>
               <w:noProof/>
             </w:rPr>
           </w:pPr>
-          <w:hyperlink w:anchor="_Toc235807292" w:history="1">
+          <w:hyperlink w:anchor="_Toc236150097" w:history="1">
             <w:r>
               <w:rPr>
                 <w:rStyle w:val="Hyperlink"/>
@@ -2726,7 +2679,7 @@
                 <w:noProof/>
                 <w:webHidden/>
               </w:rPr>
-              <w:instrText xml:space="preserve"> PAGEREF _Toc235807292 \h </w:instrText>
+              <w:instrText xml:space="preserve"> PAGEREF _Toc236150097 \h </w:instrText>
             </w:r>
             <w:r>
               <w:rPr>
@@ -2746,7 +2699,7 @@
                 <w:noProof/>
                 <w:webHidden/>
               </w:rPr>
-              <w:t>21</w:t>
+              <w:t>20</w:t>
             </w:r>
             <w:r>
               <w:rPr>
@@ -2761,14 +2714,14 @@
           <w:pPr>
             <w:pStyle w:val="TOC3"/>
             <w:tabs>
-              <w:tab w:val="right" w:leader="dot" w:pos="9111"/>
+              <w:tab w:val="right" w:leader="dot" w:pos="9061"/>
             </w:tabs>
             <w:rPr>
               <w:rFonts w:eastAsiaTheme="minorEastAsia"/>
               <w:noProof/>
             </w:rPr>
           </w:pPr>
-          <w:hyperlink w:anchor="_Toc235807293" w:history="1">
+          <w:hyperlink w:anchor="_Toc236150098" w:history="1">
             <w:r>
               <w:rPr>
                 <w:rStyle w:val="Hyperlink"/>
@@ -2796,7 +2749,7 @@
                 <w:noProof/>
                 <w:webHidden/>
               </w:rPr>
-              <w:instrText xml:space="preserve"> PAGEREF _Toc235807293 \h </w:instrText>
+              <w:instrText xml:space="preserve"> PAGEREF _Toc236150098 \h </w:instrText>
             </w:r>
             <w:r>
               <w:rPr>
@@ -2816,7 +2769,7 @@
                 <w:noProof/>
                 <w:webHidden/>
               </w:rPr>
-              <w:t>21</w:t>
+              <w:t>20</w:t>
             </w:r>
             <w:r>
               <w:rPr>
@@ -2831,14 +2784,14 @@
           <w:pPr>
             <w:pStyle w:val="TOC3"/>
             <w:tabs>
-              <w:tab w:val="right" w:leader="dot" w:pos="9111"/>
+              <w:tab w:val="right" w:leader="dot" w:pos="9061"/>
             </w:tabs>
             <w:rPr>
               <w:rFonts w:eastAsiaTheme="minorEastAsia"/>
               <w:noProof/>
             </w:rPr>
           </w:pPr>
-          <w:hyperlink w:anchor="_Toc235807294" w:history="1">
+          <w:hyperlink w:anchor="_Toc236150099" w:history="1">
             <w:r>
               <w:rPr>
                 <w:rStyle w:val="Hyperlink"/>
@@ -2866,7 +2819,7 @@
                 <w:noProof/>
                 <w:webHidden/>
               </w:rPr>
-              <w:instrText xml:space="preserve"> PAGEREF _Toc235807294 \h </w:instrText>
+              <w:instrText xml:space="preserve"> PAGEREF _Toc236150099 \h </w:instrText>
             </w:r>
             <w:r>
               <w:rPr>
@@ -2886,7 +2839,7 @@
                 <w:noProof/>
                 <w:webHidden/>
               </w:rPr>
-              <w:t>22</w:t>
+              <w:t>20</w:t>
             </w:r>
             <w:r>
               <w:rPr>
@@ -2901,14 +2854,14 @@
           <w:pPr>
             <w:pStyle w:val="TOC3"/>
             <w:tabs>
-              <w:tab w:val="right" w:leader="dot" w:pos="9111"/>
+              <w:tab w:val="right" w:leader="dot" w:pos="9061"/>
             </w:tabs>
             <w:rPr>
               <w:rFonts w:eastAsiaTheme="minorEastAsia"/>
               <w:noProof/>
             </w:rPr>
           </w:pPr>
-          <w:hyperlink w:anchor="_Toc235807295" w:history="1">
+          <w:hyperlink w:anchor="_Toc236150100" w:history="1">
             <w:r>
               <w:rPr>
                 <w:rStyle w:val="Hyperlink"/>
@@ -2936,7 +2889,7 @@
                 <w:noProof/>
                 <w:webHidden/>
               </w:rPr>
-              <w:instrText xml:space="preserve"> PAGEREF _Toc235807295 \h </w:instrText>
+              <w:instrText xml:space="preserve"> PAGEREF _Toc236150100 \h </w:instrText>
             </w:r>
             <w:r>
               <w:rPr>
@@ -2956,7 +2909,7 @@
                 <w:noProof/>
                 <w:webHidden/>
               </w:rPr>
-              <w:t>23</w:t>
+              <w:t>21</w:t>
             </w:r>
             <w:r>
               <w:rPr>
@@ -2971,14 +2924,14 @@
           <w:pPr>
             <w:pStyle w:val="TOC2"/>
             <w:tabs>
-              <w:tab w:val="right" w:leader="dot" w:pos="9111"/>
+              <w:tab w:val="right" w:leader="dot" w:pos="9061"/>
             </w:tabs>
             <w:rPr>
               <w:rFonts w:eastAsiaTheme="minorEastAsia"/>
               <w:noProof/>
             </w:rPr>
           </w:pPr>
-          <w:hyperlink w:anchor="_Toc235807296" w:history="1">
+          <w:hyperlink w:anchor="_Toc236150101" w:history="1">
             <w:r>
               <w:rPr>
                 <w:rStyle w:val="Hyperlink"/>
@@ -3006,7 +2959,7 @@
                 <w:noProof/>
                 <w:webHidden/>
               </w:rPr>
-              <w:instrText xml:space="preserve"> PAGEREF _Toc235807296 \h </w:instrText>
+              <w:instrText xml:space="preserve"> PAGEREF _Toc236150101 \h </w:instrText>
             </w:r>
             <w:r>
               <w:rPr>
@@ -3026,7 +2979,7 @@
                 <w:noProof/>
                 <w:webHidden/>
               </w:rPr>
-              <w:t>23</w:t>
+              <w:t>22</w:t>
             </w:r>
             <w:r>
               <w:rPr>
@@ -3041,14 +2994,14 @@
           <w:pPr>
             <w:pStyle w:val="TOC2"/>
             <w:tabs>
-              <w:tab w:val="right" w:leader="dot" w:pos="9111"/>
+              <w:tab w:val="right" w:leader="dot" w:pos="9061"/>
             </w:tabs>
             <w:rPr>
               <w:rFonts w:eastAsiaTheme="minorEastAsia"/>
               <w:noProof/>
             </w:rPr>
           </w:pPr>
-          <w:hyperlink w:anchor="_Toc235807297" w:history="1">
+          <w:hyperlink w:anchor="_Toc236150102" w:history="1">
             <w:r>
               <w:rPr>
                 <w:rStyle w:val="Hyperlink"/>
@@ -3076,7 +3029,7 @@
                 <w:noProof/>
                 <w:webHidden/>
               </w:rPr>
-              <w:instrText xml:space="preserve"> PAGEREF _Toc235807297 \h </w:instrText>
+              <w:instrText xml:space="preserve"> PAGEREF _Toc236150102 \h </w:instrText>
             </w:r>
             <w:r>
               <w:rPr>
@@ -3096,7 +3049,7 @@
                 <w:noProof/>
                 <w:webHidden/>
               </w:rPr>
-              <w:t>23</w:t>
+              <w:t>22</w:t>
             </w:r>
             <w:r>
               <w:rPr>
@@ -3111,14 +3064,14 @@
           <w:pPr>
             <w:pStyle w:val="TOC2"/>
             <w:tabs>
-              <w:tab w:val="right" w:leader="dot" w:pos="9111"/>
+              <w:tab w:val="right" w:leader="dot" w:pos="9061"/>
             </w:tabs>
             <w:rPr>
               <w:rFonts w:eastAsiaTheme="minorEastAsia"/>
               <w:noProof/>
             </w:rPr>
           </w:pPr>
-          <w:hyperlink w:anchor="_Toc235807298" w:history="1">
+          <w:hyperlink w:anchor="_Toc236150103" w:history="1">
             <w:r>
               <w:rPr>
                 <w:rStyle w:val="Hyperlink"/>
@@ -3146,7 +3099,7 @@
                 <w:noProof/>
                 <w:webHidden/>
               </w:rPr>
-              <w:instrText xml:space="preserve"> PAGEREF _Toc235807298 \h </w:instrText>
+              <w:instrText xml:space="preserve"> PAGEREF _Toc236150103 \h </w:instrText>
             </w:r>
             <w:r>
               <w:rPr>
@@ -3166,7 +3119,7 @@
                 <w:noProof/>
                 <w:webHidden/>
               </w:rPr>
-              <w:t>29</w:t>
+              <w:t>28</w:t>
             </w:r>
             <w:r>
               <w:rPr>
@@ -3181,21 +3134,21 @@
           <w:pPr>
             <w:pStyle w:val="TOC2"/>
             <w:tabs>
-              <w:tab w:val="right" w:leader="dot" w:pos="9111"/>
+              <w:tab w:val="right" w:leader="dot" w:pos="9061"/>
             </w:tabs>
             <w:rPr>
               <w:rFonts w:eastAsiaTheme="minorEastAsia"/>
               <w:noProof/>
             </w:rPr>
           </w:pPr>
-          <w:hyperlink w:anchor="_Toc235807299" w:history="1">
+          <w:hyperlink w:anchor="_Toc236150104" w:history="1">
             <w:r>
               <w:rPr>
                 <w:rStyle w:val="Hyperlink"/>
                 <w:rFonts w:ascii="Times New Roman" w:hAnsi="Times New Roman" w:cs="Times New Roman"/>
                 <w:noProof/>
               </w:rPr>
-              <w:t>SEQUECE DIAGRAM</w:t>
+              <w:t>SEQUENCE DIAGRAM</w:t>
             </w:r>
             <w:r>
               <w:rPr>
@@ -3216,7 +3169,7 @@
                 <w:noProof/>
                 <w:webHidden/>
               </w:rPr>
-              <w:instrText xml:space="preserve"> PAGEREF _Toc235807299 \h </w:instrText>
+              <w:instrText xml:space="preserve"> PAGEREF _Toc236150104 \h </w:instrText>
             </w:r>
             <w:r>
               <w:rPr>
@@ -3236,7 +3189,7 @@
                 <w:noProof/>
                 <w:webHidden/>
               </w:rPr>
-              <w:t>32</w:t>
+              <w:t>31</w:t>
             </w:r>
             <w:r>
               <w:rPr>
@@ -3251,14 +3204,14 @@
           <w:pPr>
             <w:pStyle w:val="TOC2"/>
             <w:tabs>
-              <w:tab w:val="right" w:leader="dot" w:pos="9111"/>
+              <w:tab w:val="right" w:leader="dot" w:pos="9061"/>
             </w:tabs>
             <w:rPr>
               <w:rFonts w:eastAsiaTheme="minorEastAsia"/>
               <w:noProof/>
             </w:rPr>
           </w:pPr>
-          <w:hyperlink w:anchor="_Toc235807300" w:history="1">
+          <w:hyperlink w:anchor="_Toc236150105" w:history="1">
             <w:r>
               <w:rPr>
                 <w:rStyle w:val="Hyperlink"/>
@@ -3286,7 +3239,7 @@
                 <w:noProof/>
                 <w:webHidden/>
               </w:rPr>
-              <w:instrText xml:space="preserve"> PAGEREF _Toc235807300 \h </w:instrText>
+              <w:instrText xml:space="preserve"> PAGEREF _Toc236150105 \h </w:instrText>
             </w:r>
             <w:r>
               <w:rPr>
@@ -3306,7 +3259,7 @@
                 <w:noProof/>
                 <w:webHidden/>
               </w:rPr>
-              <w:t>35</w:t>
+              <w:t>34</w:t>
             </w:r>
             <w:r>
               <w:rPr>
@@ -3321,14 +3274,14 @@
           <w:pPr>
             <w:pStyle w:val="TOC2"/>
             <w:tabs>
-              <w:tab w:val="right" w:leader="dot" w:pos="9111"/>
+              <w:tab w:val="right" w:leader="dot" w:pos="9061"/>
             </w:tabs>
             <w:rPr>
               <w:rFonts w:eastAsiaTheme="minorEastAsia"/>
               <w:noProof/>
             </w:rPr>
           </w:pPr>
-          <w:hyperlink w:anchor="_Toc235807301" w:history="1">
+          <w:hyperlink w:anchor="_Toc236150106" w:history="1">
             <w:r>
               <w:rPr>
                 <w:rStyle w:val="Hyperlink"/>
@@ -3356,7 +3309,7 @@
                 <w:noProof/>
                 <w:webHidden/>
               </w:rPr>
-              <w:instrText xml:space="preserve"> PAGEREF _Toc235807301 \h </w:instrText>
+              <w:instrText xml:space="preserve"> PAGEREF _Toc236150106 \h </w:instrText>
             </w:r>
             <w:r>
               <w:rPr>
@@ -3376,7 +3329,7 @@
                 <w:noProof/>
                 <w:webHidden/>
               </w:rPr>
-              <w:t>36</w:t>
+              <w:t>35</w:t>
             </w:r>
             <w:r>
               <w:rPr>
@@ -3391,14 +3344,14 @@
           <w:pPr>
             <w:pStyle w:val="TOC2"/>
             <w:tabs>
-              <w:tab w:val="right" w:leader="dot" w:pos="9111"/>
+              <w:tab w:val="right" w:leader="dot" w:pos="9061"/>
             </w:tabs>
             <w:rPr>
               <w:rFonts w:eastAsiaTheme="minorEastAsia"/>
               <w:noProof/>
             </w:rPr>
           </w:pPr>
-          <w:hyperlink w:anchor="_Toc235807302" w:history="1">
+          <w:hyperlink w:anchor="_Toc236150107" w:history="1">
             <w:r>
               <w:rPr>
                 <w:rStyle w:val="Hyperlink"/>
@@ -3426,7 +3379,7 @@
                 <w:noProof/>
                 <w:webHidden/>
               </w:rPr>
-              <w:instrText xml:space="preserve"> PAGEREF _Toc235807302 \h </w:instrText>
+              <w:instrText xml:space="preserve"> PAGEREF _Toc236150107 \h </w:instrText>
             </w:r>
             <w:r>
               <w:rPr>
@@ -3446,7 +3399,7 @@
                 <w:noProof/>
                 <w:webHidden/>
               </w:rPr>
-              <w:t>37</w:t>
+              <w:t>36</w:t>
             </w:r>
             <w:r>
               <w:rPr>
@@ -3461,21 +3414,21 @@
           <w:pPr>
             <w:pStyle w:val="TOC2"/>
             <w:tabs>
-              <w:tab w:val="right" w:leader="dot" w:pos="9111"/>
+              <w:tab w:val="right" w:leader="dot" w:pos="9061"/>
             </w:tabs>
             <w:rPr>
               <w:rFonts w:eastAsiaTheme="minorEastAsia"/>
               <w:noProof/>
             </w:rPr>
           </w:pPr>
-          <w:hyperlink w:anchor="_Toc235807303" w:history="1">
+          <w:hyperlink w:anchor="_Toc236150108" w:history="1">
             <w:r>
               <w:rPr>
                 <w:rStyle w:val="Hyperlink"/>
                 <w:rFonts w:ascii="Times New Roman" w:hAnsi="Times New Roman" w:cs="Times New Roman"/>
                 <w:noProof/>
               </w:rPr>
-              <w:t>KIỂN TRÚC HỆ THỐNG</w:t>
+              <w:t>KIẾN TRÚC HỆ THỐNG</w:t>
             </w:r>
             <w:r>
               <w:rPr>
@@ -3496,7 +3449,7 @@
                 <w:noProof/>
                 <w:webHidden/>
               </w:rPr>
-              <w:instrText xml:space="preserve"> PAGEREF _Toc235807303 \h </w:instrText>
+              <w:instrText xml:space="preserve"> PAGEREF _Toc236150108 \h </w:instrText>
             </w:r>
             <w:r>
               <w:rPr>
@@ -3531,14 +3484,14 @@
           <w:pPr>
             <w:pStyle w:val="TOC3"/>
             <w:tabs>
-              <w:tab w:val="right" w:leader="dot" w:pos="9111"/>
+              <w:tab w:val="right" w:leader="dot" w:pos="9061"/>
             </w:tabs>
             <w:rPr>
               <w:rFonts w:eastAsiaTheme="minorEastAsia"/>
               <w:noProof/>
             </w:rPr>
           </w:pPr>
-          <w:hyperlink w:anchor="_Toc235807304" w:history="1">
+          <w:hyperlink w:anchor="_Toc236150109" w:history="1">
             <w:r>
               <w:rPr>
                 <w:rStyle w:val="Hyperlink"/>
@@ -3566,7 +3519,7 @@
                 <w:noProof/>
                 <w:webHidden/>
               </w:rPr>
-              <w:instrText xml:space="preserve"> PAGEREF _Toc235807304 \h </w:instrText>
+              <w:instrText xml:space="preserve"> PAGEREF _Toc236150109 \h </w:instrText>
             </w:r>
             <w:r>
               <w:rPr>
@@ -3601,14 +3554,14 @@
           <w:pPr>
             <w:pStyle w:val="TOC3"/>
             <w:tabs>
-              <w:tab w:val="right" w:leader="dot" w:pos="9111"/>
+              <w:tab w:val="right" w:leader="dot" w:pos="9061"/>
             </w:tabs>
             <w:rPr>
               <w:rFonts w:eastAsiaTheme="minorEastAsia"/>
               <w:noProof/>
             </w:rPr>
           </w:pPr>
-          <w:hyperlink w:anchor="_Toc235807305" w:history="1">
+          <w:hyperlink w:anchor="_Toc236150110" w:history="1">
             <w:r>
               <w:rPr>
                 <w:rStyle w:val="Hyperlink"/>
@@ -3636,7 +3589,7 @@
                 <w:noProof/>
                 <w:webHidden/>
               </w:rPr>
-              <w:instrText xml:space="preserve"> PAGEREF _Toc235807305 \h </w:instrText>
+              <w:instrText xml:space="preserve"> PAGEREF _Toc236150110 \h </w:instrText>
             </w:r>
             <w:r>
               <w:rPr>
@@ -3656,7 +3609,7 @@
                 <w:noProof/>
                 <w:webHidden/>
               </w:rPr>
-              <w:t>38</w:t>
+              <w:t>37</w:t>
             </w:r>
             <w:r>
               <w:rPr>
@@ -3671,14 +3624,14 @@
           <w:pPr>
             <w:pStyle w:val="TOC3"/>
             <w:tabs>
-              <w:tab w:val="right" w:leader="dot" w:pos="9111"/>
+              <w:tab w:val="right" w:leader="dot" w:pos="9061"/>
             </w:tabs>
             <w:rPr>
               <w:rFonts w:eastAsiaTheme="minorEastAsia"/>
               <w:noProof/>
             </w:rPr>
           </w:pPr>
-          <w:hyperlink w:anchor="_Toc235807306" w:history="1">
+          <w:hyperlink w:anchor="_Toc236150111" w:history="1">
             <w:r>
               <w:rPr>
                 <w:rStyle w:val="Hyperlink"/>
@@ -3706,7 +3659,7 @@
                 <w:noProof/>
                 <w:webHidden/>
               </w:rPr>
-              <w:instrText xml:space="preserve"> PAGEREF _Toc235807306 \h </w:instrText>
+              <w:instrText xml:space="preserve"> PAGEREF _Toc236150111 \h </w:instrText>
             </w:r>
             <w:r>
               <w:rPr>
@@ -3741,14 +3694,14 @@
           <w:pPr>
             <w:pStyle w:val="TOC3"/>
             <w:tabs>
-              <w:tab w:val="right" w:leader="dot" w:pos="9111"/>
+              <w:tab w:val="right" w:leader="dot" w:pos="9061"/>
             </w:tabs>
             <w:rPr>
               <w:rFonts w:eastAsiaTheme="minorEastAsia"/>
               <w:noProof/>
             </w:rPr>
           </w:pPr>
-          <w:hyperlink w:anchor="_Toc235807307" w:history="1">
+          <w:hyperlink w:anchor="_Toc236150112" w:history="1">
             <w:r>
               <w:rPr>
                 <w:rStyle w:val="Hyperlink"/>
@@ -3776,7 +3729,7 @@
                 <w:noProof/>
                 <w:webHidden/>
               </w:rPr>
-              <w:instrText xml:space="preserve"> PAGEREF _Toc235807307 \h </w:instrText>
+              <w:instrText xml:space="preserve"> PAGEREF _Toc236150112 \h </w:instrText>
             </w:r>
             <w:r>
               <w:rPr>
@@ -3811,14 +3764,14 @@
           <w:pPr>
             <w:pStyle w:val="TOC2"/>
             <w:tabs>
-              <w:tab w:val="right" w:leader="dot" w:pos="9111"/>
+              <w:tab w:val="right" w:leader="dot" w:pos="9061"/>
             </w:tabs>
             <w:rPr>
               <w:rFonts w:eastAsiaTheme="minorEastAsia"/>
               <w:noProof/>
             </w:rPr>
           </w:pPr>
-          <w:hyperlink w:anchor="_Toc235807308" w:history="1">
+          <w:hyperlink w:anchor="_Toc236150113" w:history="1">
             <w:r>
               <w:rPr>
                 <w:rStyle w:val="Hyperlink"/>
@@ -3846,7 +3799,7 @@
                 <w:noProof/>
                 <w:webHidden/>
               </w:rPr>
-              <w:instrText xml:space="preserve"> PAGEREF _Toc235807308 \h </w:instrText>
+              <w:instrText xml:space="preserve"> PAGEREF _Toc236150113 \h </w:instrText>
             </w:r>
             <w:r>
               <w:rPr>
@@ -3881,14 +3834,14 @@
           <w:pPr>
             <w:pStyle w:val="TOC1"/>
             <w:tabs>
-              <w:tab w:val="right" w:leader="dot" w:pos="9111"/>
+              <w:tab w:val="right" w:leader="dot" w:pos="9061"/>
             </w:tabs>
             <w:rPr>
               <w:rFonts w:eastAsiaTheme="minorEastAsia"/>
               <w:noProof/>
             </w:rPr>
           </w:pPr>
-          <w:hyperlink w:anchor="_Toc235807309" w:history="1">
+          <w:hyperlink w:anchor="_Toc236150114" w:history="1">
             <w:r>
               <w:rPr>
                 <w:rStyle w:val="Hyperlink"/>
@@ -3916,7 +3869,77 @@
                 <w:noProof/>
                 <w:webHidden/>
               </w:rPr>
-              <w:instrText xml:space="preserve"> PAGEREF _Toc235807309 \h </w:instrText>
+              <w:instrText xml:space="preserve"> PAGEREF _Toc236150114 \h </w:instrText>
+            </w:r>
+            <w:r>
+              <w:rPr>
+                <w:noProof/>
+                <w:webHidden/>
+              </w:rPr>
+            </w:r>
+            <w:r>
+              <w:rPr>
+                <w:noProof/>
+                <w:webHidden/>
+              </w:rPr>
+              <w:fldChar w:fldCharType="separate"/>
+            </w:r>
+            <w:r>
+              <w:rPr>
+                <w:noProof/>
+                <w:webHidden/>
+              </w:rPr>
+              <w:t>45</w:t>
+            </w:r>
+            <w:r>
+              <w:rPr>
+                <w:noProof/>
+                <w:webHidden/>
+              </w:rPr>
+              <w:fldChar w:fldCharType="end"/>
+            </w:r>
+          </w:hyperlink>
+        </w:p>
+        <w:p>
+          <w:pPr>
+            <w:pStyle w:val="TOC1"/>
+            <w:tabs>
+              <w:tab w:val="right" w:leader="dot" w:pos="9061"/>
+            </w:tabs>
+            <w:rPr>
+              <w:rFonts w:eastAsiaTheme="minorEastAsia"/>
+              <w:noProof/>
+            </w:rPr>
+          </w:pPr>
+          <w:hyperlink w:anchor="_Toc236150115" w:history="1">
+            <w:r>
+              <w:rPr>
+                <w:rStyle w:val="Hyperlink"/>
+                <w:rFonts w:ascii="Times New Roman" w:hAnsi="Times New Roman" w:cs="Times New Roman"/>
+                <w:noProof/>
+              </w:rPr>
+              <w:t>References</w:t>
+            </w:r>
+            <w:r>
+              <w:rPr>
+                <w:noProof/>
+                <w:webHidden/>
+              </w:rPr>
+              <w:tab/>
+            </w:r>
+            <w:r>
+              <w:rPr>
+                <w:noProof/>
+                <w:webHidden/>
+              </w:rPr>
+              <w:fldChar w:fldCharType="begin"/>
+            </w:r>
+            <w:r>
+              <w:rPr>
+                <w:noProof/>
+                <w:webHidden/>
+              </w:rPr>
+              <w:instrText xml:space="preserve"> PAGEREF _Toc236150115 \h </w:instrText>
             </w:r>
             <w:r>
               <w:rPr>
@@ -3972,7 +3995,7 @@
       <w:r>
         <w:br w:type="page"/>
       </w:r>
-      <w:bookmarkStart w:id="5" w:name="_Toc235807267"/>
+      <w:bookmarkStart w:id="5" w:name="_Toc236150072"/>
       <w:r>
         <w:rPr>
           <w:rFonts w:ascii="Times New Roman" w:hAnsi="Times New Roman" w:cs="Times New Roman"/>
@@ -5788,7 +5811,7 @@
           <w:rFonts w:ascii="Times New Roman" w:hAnsi="Times New Roman" w:cs="Times New Roman"/>
         </w:rPr>
       </w:pPr>
-      <w:bookmarkStart w:id="6" w:name="_Toc235807268"/>
+      <w:bookmarkStart w:id="6" w:name="_Toc236150073"/>
       <w:r>
         <w:rPr>
           <w:rFonts w:ascii="Times New Roman" w:hAnsi="Times New Roman" w:cs="Times New Roman"/>
@@ -7027,7 +7050,7 @@
       <w:r>
         <w:br w:type="page"/>
       </w:r>
-      <w:bookmarkStart w:id="7" w:name="_Toc235807269"/>
+      <w:bookmarkStart w:id="7" w:name="_Toc236150074"/>
       <w:r>
         <w:rPr>
           <w:rFonts w:ascii="Times New Roman" w:hAnsi="Times New Roman" w:cs="Times New Roman"/>
@@ -7376,7 +7399,7 @@
         </w:rPr>
       </w:pPr>
       <w:bookmarkStart w:id="8" w:name="_Toc235563700"/>
-      <w:bookmarkStart w:id="9" w:name="_Toc235807270"/>
+      <w:bookmarkStart w:id="9" w:name="_Toc236150075"/>
       <w:r>
         <w:rPr>
           <w:rFonts w:ascii="Times New Roman" w:hAnsi="Times New Roman" w:cs="Times New Roman"/>
@@ -7395,7 +7418,7 @@
         </w:rPr>
       </w:pPr>
       <w:bookmarkStart w:id="10" w:name="_Toc235563701"/>
-      <w:bookmarkStart w:id="11" w:name="_Toc235807271"/>
+      <w:bookmarkStart w:id="11" w:name="_Toc236150076"/>
       <w:r>
         <w:rPr>
           <w:rFonts w:ascii="Times New Roman" w:hAnsi="Times New Roman" w:cs="Times New Roman"/>
@@ -7438,7 +7461,7 @@
         </w:rPr>
       </w:pPr>
       <w:bookmarkStart w:id="12" w:name="_Toc235563702"/>
-      <w:bookmarkStart w:id="13" w:name="_Toc235807272"/>
+      <w:bookmarkStart w:id="13" w:name="_Toc236150077"/>
       <w:r>
         <w:rPr>
           <w:rFonts w:ascii="Times New Roman" w:hAnsi="Times New Roman" w:cs="Times New Roman"/>
@@ -7475,7 +7498,7 @@
         </w:rPr>
       </w:pPr>
       <w:bookmarkStart w:id="14" w:name="_Toc235563703"/>
-      <w:bookmarkStart w:id="15" w:name="_Toc235807273"/>
+      <w:bookmarkStart w:id="15" w:name="_Toc236150078"/>
       <w:r>
         <w:rPr>
           <w:rFonts w:ascii="Times New Roman" w:hAnsi="Times New Roman" w:cs="Times New Roman"/>
@@ -7643,7 +7666,6 @@
           <w:sz w:val="26"/>
           <w:szCs w:val="26"/>
         </w:rPr>
-        <w:lastRenderedPageBreak/>
         <w:t>Hệ thống: đăng nhập, phân quyền theo vai trò, nhật ký hoạt động.</w:t>
       </w:r>
     </w:p>
@@ -7656,11 +7678,12 @@
         </w:rPr>
       </w:pPr>
       <w:bookmarkStart w:id="16" w:name="_Toc235563704"/>
-      <w:bookmarkStart w:id="17" w:name="_Toc235807274"/>
-      <w:r>
-        <w:rPr>
-          <w:rFonts w:ascii="Times New Roman" w:hAnsi="Times New Roman" w:cs="Times New Roman"/>
-        </w:rPr>
+      <w:bookmarkStart w:id="17" w:name="_Toc236150079"/>
+      <w:r>
+        <w:rPr>
+          <w:rFonts w:ascii="Times New Roman" w:hAnsi="Times New Roman" w:cs="Times New Roman"/>
+        </w:rPr>
+        <w:lastRenderedPageBreak/>
         <w:t>ĐỐI TƯỢNG</w:t>
       </w:r>
       <w:bookmarkEnd w:id="16"/>
@@ -7803,7 +7826,7 @@
         </w:rPr>
       </w:pPr>
       <w:bookmarkStart w:id="18" w:name="_Toc235563705"/>
-      <w:bookmarkStart w:id="19" w:name="_Toc235807275"/>
+      <w:bookmarkStart w:id="19" w:name="_Toc236150080"/>
       <w:r>
         <w:rPr>
           <w:rFonts w:ascii="Times New Roman" w:hAnsi="Times New Roman" w:cs="Times New Roman"/>
@@ -7823,7 +7846,7 @@
         </w:rPr>
       </w:pPr>
       <w:bookmarkStart w:id="20" w:name="_Toc235563706"/>
-      <w:bookmarkStart w:id="21" w:name="_Toc235807276"/>
+      <w:bookmarkStart w:id="21" w:name="_Toc236150081"/>
       <w:r>
         <w:rPr>
           <w:rFonts w:ascii="Times New Roman" w:hAnsi="Times New Roman" w:cs="Times New Roman"/>
@@ -7842,7 +7865,7 @@
         </w:rPr>
       </w:pPr>
       <w:bookmarkStart w:id="22" w:name="_Toc235563707"/>
-      <w:bookmarkStart w:id="23" w:name="_Toc235807277"/>
+      <w:bookmarkStart w:id="23" w:name="_Toc236150082"/>
       <w:r>
         <w:rPr>
           <w:rFonts w:ascii="Times New Roman" w:hAnsi="Times New Roman" w:cs="Times New Roman"/>
@@ -8141,7 +8164,6 @@
           <w:sz w:val="26"/>
           <w:szCs w:val="26"/>
         </w:rPr>
-        <w:lastRenderedPageBreak/>
         <w:t>Giới hạn khả năng tùy biến khi mỗi doanh nghiệp có quy trình chia hoa hồng khác nhau.</w:t>
       </w:r>
     </w:p>
@@ -8157,6 +8179,7 @@
         <w:rPr>
           <w:rFonts w:ascii="Times New Roman" w:hAnsi="Times New Roman" w:cs="Times New Roman"/>
         </w:rPr>
+        <w:lastRenderedPageBreak/>
         <w:t>Hướng khắc phục</w:t>
       </w:r>
     </w:p>
@@ -8272,7 +8295,7 @@
         </w:rPr>
       </w:pPr>
       <w:bookmarkStart w:id="24" w:name="_Toc235563708"/>
-      <w:bookmarkStart w:id="25" w:name="_Toc235807278"/>
+      <w:bookmarkStart w:id="25" w:name="_Toc236150083"/>
       <w:r>
         <w:rPr>
           <w:rFonts w:ascii="Times New Roman" w:hAnsi="Times New Roman" w:cs="Times New Roman"/>
@@ -8407,7 +8430,6 @@
         <w:rPr>
           <w:rFonts w:ascii="Times New Roman" w:hAnsi="Times New Roman" w:cs="Times New Roman"/>
         </w:rPr>
-        <w:lastRenderedPageBreak/>
         <w:t>Ưu điểm</w:t>
       </w:r>
     </w:p>
@@ -8447,6 +8469,7 @@
         <w:spacing w:line="360" w:lineRule="auto"/>
       </w:pPr>
       <w:r>
+        <w:lastRenderedPageBreak/>
         <w:t>Giao diện thân thiện với nhân viên Sales Việt Nam. Khi có lỗi hệ thống, doanh nghiệp gọi hotline có các kỹ sư VCCorp hỗ trợ tức thì thay vì phải gửi email đợi hỗ trợ như HubSpot hay Saleforce</w:t>
       </w:r>
     </w:p>
@@ -8601,9 +8624,9 @@
         <w:tblLook w:val="04A0" w:firstRow="1" w:lastRow="0" w:firstColumn="1" w:lastColumn="0" w:noHBand="0" w:noVBand="1"/>
       </w:tblPr>
       <w:tblGrid>
-        <w:gridCol w:w="1951"/>
-        <w:gridCol w:w="3583"/>
-        <w:gridCol w:w="3577"/>
+        <w:gridCol w:w="1945"/>
+        <w:gridCol w:w="3561"/>
+        <w:gridCol w:w="3555"/>
       </w:tblGrid>
       <w:tr>
         <w:tc>
@@ -8960,7 +8983,6 @@
                 <w:sz w:val="26"/>
                 <w:szCs w:val="26"/>
               </w:rPr>
-              <w:lastRenderedPageBreak/>
               <w:t>Khả năng tích hợp</w:t>
             </w:r>
           </w:p>
@@ -9165,6 +9187,7 @@
                 <w:sz w:val="26"/>
                 <w:szCs w:val="26"/>
               </w:rPr>
+              <w:lastRenderedPageBreak/>
               <w:t>Ưu điểm</w:t>
             </w:r>
           </w:p>
@@ -9360,7 +9383,7 @@
           <w:rFonts w:ascii="Times New Roman" w:hAnsi="Times New Roman" w:cs="Times New Roman"/>
         </w:rPr>
       </w:pPr>
-      <w:bookmarkStart w:id="27" w:name="_Toc235807279"/>
+      <w:bookmarkStart w:id="27" w:name="_Toc236150084"/>
       <w:r>
         <w:rPr>
           <w:rFonts w:ascii="Times New Roman" w:hAnsi="Times New Roman" w:cs="Times New Roman"/>
@@ -9376,7 +9399,7 @@
           <w:rFonts w:ascii="Times New Roman" w:hAnsi="Times New Roman" w:cs="Times New Roman"/>
         </w:rPr>
       </w:pPr>
-      <w:bookmarkStart w:id="28" w:name="_Toc235807280"/>
+      <w:bookmarkStart w:id="28" w:name="_Toc236150085"/>
       <w:r>
         <w:rPr>
           <w:rFonts w:ascii="Times New Roman" w:hAnsi="Times New Roman" w:cs="Times New Roman"/>
@@ -9527,6 +9550,7 @@
           <w:id w:val="548036211"/>
           <w:citation/>
         </w:sdtPr>
+        <w:sdtEndPr/>
         <w:sdtContent>
           <w:r>
             <w:rPr>
@@ -9596,7 +9620,7 @@
           <w:rFonts w:ascii="Times New Roman" w:hAnsi="Times New Roman" w:cs="Times New Roman"/>
         </w:rPr>
       </w:pPr>
-      <w:bookmarkStart w:id="29" w:name="_Toc235807281"/>
+      <w:bookmarkStart w:id="29" w:name="_Toc236150086"/>
       <w:r>
         <w:rPr>
           <w:rFonts w:ascii="Times New Roman" w:hAnsi="Times New Roman" w:cs="Times New Roman"/>
@@ -9637,6 +9661,7 @@
           <w:id w:val="2136984348"/>
           <w:citation/>
         </w:sdtPr>
+        <w:sdtEndPr/>
         <w:sdtContent>
           <w:r>
             <w:rPr>
@@ -9713,7 +9738,6 @@
           <w:sz w:val="26"/>
           <w:szCs w:val="26"/>
         </w:rPr>
-        <w:lastRenderedPageBreak/>
         <w:t>Mỗi Deal trong Sales Pipeline đề có Deal Value, Probability và Expected Revenue, trong đó doanh thu kỳ vọng được tính như sau:</w:t>
       </w:r>
     </w:p>
@@ -9815,7 +9839,7 @@
           <w:rFonts w:ascii="Times New Roman" w:hAnsi="Times New Roman" w:cs="Times New Roman"/>
         </w:rPr>
       </w:pPr>
-      <w:bookmarkStart w:id="30" w:name="_Toc235807282"/>
+      <w:bookmarkStart w:id="30" w:name="_Toc236150087"/>
       <w:r>
         <w:rPr>
           <w:rFonts w:ascii="Times New Roman" w:hAnsi="Times New Roman" w:cs="Times New Roman"/>
@@ -9855,6 +9879,7 @@
           <w:sz w:val="26"/>
           <w:szCs w:val="26"/>
         </w:rPr>
+        <w:lastRenderedPageBreak/>
         <w:t xml:space="preserve">RBAC hoạt động dựa trên ba thành phần chính: User, Role, Permission; với quy trình hoạt động như sau: Hệ thống xác thực tài khoản và mật khẩu </w:t>
       </w:r>
       <w:r>
@@ -9948,6 +9973,7 @@
           <w:id w:val="-218134695"/>
           <w:citation/>
         </w:sdtPr>
+        <w:sdtEndPr/>
         <w:sdtContent>
           <w:r>
             <w:rPr>
@@ -10017,7 +10043,7 @@
           <w:rFonts w:ascii="Times New Roman" w:hAnsi="Times New Roman" w:cs="Times New Roman"/>
         </w:rPr>
       </w:pPr>
-      <w:bookmarkStart w:id="31" w:name="_Toc235807283"/>
+      <w:bookmarkStart w:id="31" w:name="_Toc236150088"/>
       <w:r>
         <w:rPr>
           <w:rFonts w:ascii="Times New Roman" w:hAnsi="Times New Roman" w:cs="Times New Roman"/>
@@ -10086,6 +10112,7 @@
           <w:id w:val="-1289196247"/>
           <w:citation/>
         </w:sdtPr>
+        <w:sdtEndPr/>
         <w:sdtContent>
           <w:r>
             <w:rPr>
@@ -10304,12 +10331,11 @@
           <w:rFonts w:ascii="Times New Roman" w:hAnsi="Times New Roman" w:cs="Times New Roman"/>
         </w:rPr>
       </w:pPr>
-      <w:bookmarkStart w:id="32" w:name="_Toc235807284"/>
-      <w:r>
-        <w:rPr>
-          <w:rFonts w:ascii="Times New Roman" w:hAnsi="Times New Roman" w:cs="Times New Roman"/>
-        </w:rPr>
-        <w:lastRenderedPageBreak/>
+      <w:bookmarkStart w:id="32" w:name="_Toc236150089"/>
+      <w:r>
+        <w:rPr>
+          <w:rFonts w:ascii="Times New Roman" w:hAnsi="Times New Roman" w:cs="Times New Roman"/>
+        </w:rPr>
         <w:t>Kiến trúc Modular</w:t>
       </w:r>
       <w:bookmarkEnd w:id="32"/>
@@ -10357,6 +10383,7 @@
           <w:id w:val="1396088567"/>
           <w:citation/>
         </w:sdtPr>
+        <w:sdtEndPr/>
         <w:sdtContent>
           <w:r>
             <w:rPr>
@@ -10477,6 +10504,7 @@
           <w:sz w:val="26"/>
           <w:szCs w:val="26"/>
         </w:rPr>
+        <w:lastRenderedPageBreak/>
         <w:t>RESTful API chuyển yêu cầu đến Controller của module tương ứng.</w:t>
       </w:r>
     </w:p>
@@ -10555,7 +10583,7 @@
         </w:rPr>
       </w:pPr>
       <w:bookmarkStart w:id="33" w:name="_Toc235563709"/>
-      <w:bookmarkStart w:id="34" w:name="_Toc235807285"/>
+      <w:bookmarkStart w:id="34" w:name="_Toc236150090"/>
       <w:r>
         <w:rPr>
           <w:rFonts w:ascii="Times New Roman" w:hAnsi="Times New Roman" w:cs="Times New Roman"/>
@@ -10574,7 +10602,7 @@
         </w:rPr>
       </w:pPr>
       <w:bookmarkStart w:id="35" w:name="_Toc235563710"/>
-      <w:bookmarkStart w:id="36" w:name="_Toc235807286"/>
+      <w:bookmarkStart w:id="36" w:name="_Toc236150091"/>
       <w:r>
         <w:rPr>
           <w:rFonts w:ascii="Times New Roman" w:hAnsi="Times New Roman" w:cs="Times New Roman"/>
@@ -10673,6 +10701,7 @@
           <w:id w:val="-1977760252"/>
           <w:citation/>
         </w:sdtPr>
+        <w:sdtEndPr/>
         <w:sdtContent>
           <w:r>
             <w:rPr>
@@ -10747,7 +10776,6 @@
         <w:rPr>
           <w:rFonts w:ascii="Times New Roman" w:hAnsi="Times New Roman" w:cs="Times New Roman"/>
         </w:rPr>
-        <w:lastRenderedPageBreak/>
         <w:t>Thư viện dnd-kit</w:t>
       </w:r>
     </w:p>
@@ -10821,7 +10849,16 @@
           <w:sz w:val="26"/>
           <w:szCs w:val="26"/>
         </w:rPr>
-        <w:t>Sử dụng dnd-kit trong đề tài Hệ thống CRM và quản lý phễu bán hàng cho doanh nghiệp nhỏ để triển khai chức năng kéo – thả trên phễu bán hàng của Sales, hệ thống sẽ tự động cập nhật giai đoạn của Deal trong cơ sở dữ liệu thông qua RESTful API</w:t>
+        <w:t xml:space="preserve">Sử dụng dnd-kit trong đề tài Hệ thống CRM và quản lý phễu bán hàng cho doanh nghiệp nhỏ để triển khai chức năng kéo – thả trên phễu bán hàng của Sales, hệ </w:t>
+      </w:r>
+      <w:r>
+        <w:rPr>
+          <w:rFonts w:ascii="Times New Roman" w:hAnsi="Times New Roman" w:cs="Times New Roman"/>
+          <w:sz w:val="26"/>
+          <w:szCs w:val="26"/>
+        </w:rPr>
+        <w:lastRenderedPageBreak/>
+        <w:t>thống sẽ tự động cập nhật giai đoạn của Deal trong cơ sở dữ liệu thông qua RESTful API</w:t>
       </w:r>
       <w:sdt>
         <w:sdtPr>
@@ -10833,6 +10870,7 @@
           <w:id w:val="-157463676"/>
           <w:citation/>
         </w:sdtPr>
+        <w:sdtEndPr/>
         <w:sdtContent>
           <w:r>
             <w:rPr>
@@ -10984,6 +11022,7 @@
           <w:id w:val="-1313948289"/>
           <w:citation/>
         </w:sdtPr>
+        <w:sdtEndPr/>
         <w:sdtContent>
           <w:r>
             <w:rPr>
@@ -11055,7 +11094,7 @@
         </w:rPr>
       </w:pPr>
       <w:bookmarkStart w:id="37" w:name="_Toc235563711"/>
-      <w:bookmarkStart w:id="38" w:name="_Toc235807287"/>
+      <w:bookmarkStart w:id="38" w:name="_Toc236150092"/>
       <w:r>
         <w:rPr>
           <w:rFonts w:ascii="Times New Roman" w:hAnsi="Times New Roman" w:cs="Times New Roman"/>
@@ -11123,7 +11162,6 @@
           <w:sz w:val="26"/>
           <w:szCs w:val="26"/>
         </w:rPr>
-        <w:lastRenderedPageBreak/>
         <w:t>NestJS tổ chức hệ thống thành nhiều module độc lập, mỗi module đảm nhiệm một nhóm chức năng riêng. Mỗi module gồm ba thành phần chính:</w:t>
       </w:r>
     </w:p>
@@ -11232,6 +11270,7 @@
           <w:id w:val="717015980"/>
           <w:citation/>
         </w:sdtPr>
+        <w:sdtEndPr/>
         <w:sdtContent>
           <w:r>
             <w:rPr>
@@ -11387,6 +11426,7 @@
           <w:sz w:val="26"/>
           <w:szCs w:val="26"/>
         </w:rPr>
+        <w:lastRenderedPageBreak/>
         <w:t xml:space="preserve">Prisma hoạt động dựa trên tệp </w:t>
       </w:r>
       <w:proofErr w:type="gramStart"/>
@@ -11487,6 +11527,7 @@
           <w:id w:val="1532234944"/>
           <w:citation/>
         </w:sdtPr>
+        <w:sdtEndPr/>
         <w:sdtContent>
           <w:r>
             <w:rPr>
@@ -11558,7 +11599,7 @@
         </w:rPr>
       </w:pPr>
       <w:bookmarkStart w:id="39" w:name="_Toc235563712"/>
-      <w:bookmarkStart w:id="40" w:name="_Toc235807288"/>
+      <w:bookmarkStart w:id="40" w:name="_Toc236150093"/>
       <w:r>
         <w:rPr>
           <w:rFonts w:ascii="Times New Roman" w:hAnsi="Times New Roman" w:cs="Times New Roman"/>
@@ -11663,7 +11704,6 @@
           <w:sz w:val="26"/>
           <w:szCs w:val="26"/>
         </w:rPr>
-        <w:lastRenderedPageBreak/>
         <w:t xml:space="preserve">PostgreSQL được sử dụng làm hệ quản trị cơ sở dữ liệu để lưu trữ và thao tác </w:t>
       </w:r>
       <w:r>
@@ -11684,6 +11724,7 @@
           <w:id w:val="1137682971"/>
           <w:citation/>
         </w:sdtPr>
+        <w:sdtEndPr/>
         <w:sdtContent>
           <w:r>
             <w:rPr>
@@ -11771,7 +11812,7 @@
         </w:rPr>
       </w:pPr>
       <w:bookmarkStart w:id="41" w:name="_Toc235563713"/>
-      <w:bookmarkStart w:id="42" w:name="_Toc235807289"/>
+      <w:bookmarkStart w:id="42" w:name="_Toc236150094"/>
       <w:r>
         <w:rPr>
           <w:rFonts w:ascii="Times New Roman" w:hAnsi="Times New Roman" w:cs="Times New Roman"/>
@@ -11790,7 +11831,7 @@
         </w:rPr>
       </w:pPr>
       <w:bookmarkStart w:id="43" w:name="_Toc235563714"/>
-      <w:bookmarkStart w:id="44" w:name="_Toc235807290"/>
+      <w:bookmarkStart w:id="44" w:name="_Toc236150095"/>
       <w:r>
         <w:rPr>
           <w:rFonts w:ascii="Times New Roman" w:hAnsi="Times New Roman" w:cs="Times New Roman"/>
@@ -11808,7 +11849,7 @@
         </w:rPr>
       </w:pPr>
       <w:bookmarkStart w:id="45" w:name="_Toc235563715"/>
-      <w:bookmarkStart w:id="46" w:name="_Toc235807291"/>
+      <w:bookmarkStart w:id="46" w:name="_Toc236150096"/>
       <w:r>
         <w:rPr>
           <w:rFonts w:ascii="Times New Roman" w:hAnsi="Times New Roman" w:cs="Times New Roman"/>
@@ -11844,7 +11885,7 @@
         </w:rPr>
       </w:pPr>
       <w:bookmarkStart w:id="47" w:name="_Toc235563716"/>
-      <w:bookmarkStart w:id="48" w:name="_Toc235807292"/>
+      <w:bookmarkStart w:id="48" w:name="_Toc236150097"/>
       <w:r>
         <w:rPr>
           <w:rFonts w:ascii="Times New Roman" w:hAnsi="Times New Roman" w:cs="Times New Roman"/>
@@ -11916,7 +11957,7 @@
         </w:rPr>
       </w:pPr>
       <w:bookmarkStart w:id="49" w:name="_Toc235563717"/>
-      <w:bookmarkStart w:id="50" w:name="_Toc235807293"/>
+      <w:bookmarkStart w:id="50" w:name="_Toc236150098"/>
       <w:r>
         <w:rPr>
           <w:rFonts w:ascii="Times New Roman" w:hAnsi="Times New Roman" w:cs="Times New Roman"/>
@@ -12024,12 +12065,11 @@
         </w:rPr>
       </w:pPr>
       <w:bookmarkStart w:id="51" w:name="_Toc235563718"/>
-      <w:bookmarkStart w:id="52" w:name="_Toc235807294"/>
-      <w:r>
-        <w:rPr>
-          <w:rFonts w:ascii="Times New Roman" w:hAnsi="Times New Roman" w:cs="Times New Roman"/>
-        </w:rPr>
-        <w:lastRenderedPageBreak/>
+      <w:bookmarkStart w:id="52" w:name="_Toc236150099"/>
+      <w:r>
+        <w:rPr>
+          <w:rFonts w:ascii="Times New Roman" w:hAnsi="Times New Roman" w:cs="Times New Roman"/>
+        </w:rPr>
         <w:t>Yêu cầu chức năng</w:t>
       </w:r>
       <w:bookmarkEnd w:id="51"/>
@@ -12124,6 +12164,7 @@
           <w:sz w:val="26"/>
           <w:szCs w:val="26"/>
         </w:rPr>
+        <w:lastRenderedPageBreak/>
         <w:t>Admin quản lý các tài khoản của người dùng</w:t>
       </w:r>
     </w:p>
@@ -12917,12 +12958,11 @@
         </w:rPr>
       </w:pPr>
       <w:bookmarkStart w:id="53" w:name="_Toc235563719"/>
-      <w:bookmarkStart w:id="54" w:name="_Toc235807295"/>
-      <w:r>
-        <w:rPr>
-          <w:rFonts w:ascii="Times New Roman" w:hAnsi="Times New Roman" w:cs="Times New Roman"/>
-        </w:rPr>
-        <w:lastRenderedPageBreak/>
+      <w:bookmarkStart w:id="54" w:name="_Toc236150100"/>
+      <w:r>
+        <w:rPr>
+          <w:rFonts w:ascii="Times New Roman" w:hAnsi="Times New Roman" w:cs="Times New Roman"/>
+        </w:rPr>
         <w:t>Yêu cầu phi chức năng</w:t>
       </w:r>
       <w:bookmarkEnd w:id="53"/>
@@ -13024,11 +13064,12 @@
         </w:rPr>
       </w:pPr>
       <w:bookmarkStart w:id="55" w:name="_Toc235563720"/>
-      <w:bookmarkStart w:id="56" w:name="_Toc235807296"/>
-      <w:r>
-        <w:rPr>
-          <w:rFonts w:ascii="Times New Roman" w:hAnsi="Times New Roman" w:cs="Times New Roman"/>
-        </w:rPr>
+      <w:bookmarkStart w:id="56" w:name="_Toc236150101"/>
+      <w:r>
+        <w:rPr>
+          <w:rFonts w:ascii="Times New Roman" w:hAnsi="Times New Roman" w:cs="Times New Roman"/>
+        </w:rPr>
+        <w:lastRenderedPageBreak/>
         <w:t>USE-CASE DIAGRAM</w:t>
       </w:r>
       <w:bookmarkEnd w:id="55"/>
@@ -13164,7 +13205,7 @@
         </w:rPr>
       </w:pPr>
       <w:bookmarkStart w:id="59" w:name="_Toc235563721"/>
-      <w:bookmarkStart w:id="60" w:name="_Toc235807297"/>
+      <w:bookmarkStart w:id="60" w:name="_Toc236150102"/>
       <w:r>
         <w:rPr>
           <w:rFonts w:ascii="Times New Roman" w:hAnsi="Times New Roman" w:cs="Times New Roman"/>
@@ -13409,7 +13450,6 @@
                 <w:sz w:val="26"/>
                 <w:szCs w:val="26"/>
               </w:rPr>
-              <w:lastRenderedPageBreak/>
               <w:t>Tiền điều kiện</w:t>
             </w:r>
           </w:p>
@@ -13763,6 +13803,7 @@
           <w:sz w:val="26"/>
           <w:szCs w:val="26"/>
         </w:rPr>
+        <w:lastRenderedPageBreak/>
         <w:t>UC2: Quản lý Lead</w:t>
       </w:r>
     </w:p>
@@ -14861,7 +14902,6 @@
                 <w:sz w:val="26"/>
                 <w:szCs w:val="26"/>
               </w:rPr>
-              <w:lastRenderedPageBreak/>
               <w:t>Mở danh sách Lead</w:t>
             </w:r>
           </w:p>
@@ -15321,6 +15361,7 @@
                 <w:sz w:val="26"/>
                 <w:szCs w:val="26"/>
               </w:rPr>
+              <w:lastRenderedPageBreak/>
               <w:t>Tiều điều kiện</w:t>
             </w:r>
           </w:p>
@@ -17474,7 +17515,6 @@
                 <w:sz w:val="26"/>
                 <w:szCs w:val="26"/>
               </w:rPr>
-              <w:lastRenderedPageBreak/>
               <w:t>Luồng chính</w:t>
             </w:r>
           </w:p>
@@ -17568,6 +17608,7 @@
                 <w:sz w:val="26"/>
                 <w:szCs w:val="26"/>
               </w:rPr>
+              <w:lastRenderedPageBreak/>
               <w:t>Nhập tiêu đề và mô tả công việc</w:t>
             </w:r>
           </w:p>
@@ -17767,6 +17808,7 @@
           <w:sz w:val="26"/>
           <w:szCs w:val="26"/>
         </w:rPr>
+        <w:lastRenderedPageBreak/>
         <w:t xml:space="preserve">Bảng </w:t>
       </w:r>
       <w:r>
@@ -18735,7 +18777,6 @@
           <w:sz w:val="26"/>
           <w:szCs w:val="26"/>
         </w:rPr>
-        <w:lastRenderedPageBreak/>
         <w:t>UC11: Quản lý Users</w:t>
       </w:r>
     </w:p>
@@ -18746,8 +18787,8 @@
         <w:tblLook w:val="04A0" w:firstRow="1" w:lastRow="0" w:firstColumn="1" w:lastColumn="0" w:noHBand="0" w:noVBand="1"/>
       </w:tblPr>
       <w:tblGrid>
-        <w:gridCol w:w="1980"/>
-        <w:gridCol w:w="7131"/>
+        <w:gridCol w:w="1972"/>
+        <w:gridCol w:w="7089"/>
       </w:tblGrid>
       <w:tr>
         <w:tc>
@@ -18914,6 +18955,7 @@
                 <w:sz w:val="26"/>
                 <w:szCs w:val="26"/>
               </w:rPr>
+              <w:lastRenderedPageBreak/>
               <w:t>Actor</w:t>
             </w:r>
           </w:p>
@@ -19367,8 +19409,8 @@
         <w:tblLook w:val="04A0" w:firstRow="1" w:lastRow="0" w:firstColumn="1" w:lastColumn="0" w:noHBand="0" w:noVBand="1"/>
       </w:tblPr>
       <w:tblGrid>
-        <w:gridCol w:w="1980"/>
-        <w:gridCol w:w="7131"/>
+        <w:gridCol w:w="1972"/>
+        <w:gridCol w:w="7089"/>
       </w:tblGrid>
       <w:tr>
         <w:tc>
@@ -19950,8 +19992,8 @@
         <w:tblLook w:val="04A0" w:firstRow="1" w:lastRow="0" w:firstColumn="1" w:lastColumn="0" w:noHBand="0" w:noVBand="1"/>
       </w:tblPr>
       <w:tblGrid>
-        <w:gridCol w:w="1980"/>
-        <w:gridCol w:w="7131"/>
+        <w:gridCol w:w="1972"/>
+        <w:gridCol w:w="7089"/>
       </w:tblGrid>
       <w:tr>
         <w:tc>
@@ -20235,7 +20277,6 @@
                 <w:sz w:val="26"/>
                 <w:szCs w:val="26"/>
               </w:rPr>
-              <w:lastRenderedPageBreak/>
               <w:t>Người dùng chọn khách hàng muốn xem</w:t>
             </w:r>
           </w:p>
@@ -20488,8 +20529,8 @@
         <w:tblLook w:val="04A0" w:firstRow="1" w:lastRow="0" w:firstColumn="1" w:lastColumn="0" w:noHBand="0" w:noVBand="1"/>
       </w:tblPr>
       <w:tblGrid>
-        <w:gridCol w:w="1980"/>
-        <w:gridCol w:w="7131"/>
+        <w:gridCol w:w="1972"/>
+        <w:gridCol w:w="7089"/>
       </w:tblGrid>
       <w:tr>
         <w:tc>
@@ -20510,6 +20551,7 @@
                 <w:sz w:val="26"/>
                 <w:szCs w:val="26"/>
               </w:rPr>
+              <w:lastRenderedPageBreak/>
               <w:t>Thuộc tính</w:t>
             </w:r>
           </w:p>
@@ -20982,7 +21024,7 @@
         </w:rPr>
       </w:pPr>
       <w:bookmarkStart w:id="75" w:name="_Toc235563722"/>
-      <w:bookmarkStart w:id="76" w:name="_Toc235807298"/>
+      <w:bookmarkStart w:id="76" w:name="_Toc236150103"/>
       <w:r>
         <w:rPr>
           <w:rFonts w:ascii="Times New Roman" w:hAnsi="Times New Roman" w:cs="Times New Roman"/>
@@ -21731,13 +21773,19 @@
         </w:rPr>
       </w:pPr>
       <w:bookmarkStart w:id="82" w:name="_Toc235563723"/>
-      <w:bookmarkStart w:id="83" w:name="_Toc235807299"/>
+      <w:bookmarkStart w:id="83" w:name="_Toc236150104"/>
       <w:r>
         <w:rPr>
           <w:rFonts w:ascii="Times New Roman" w:hAnsi="Times New Roman" w:cs="Times New Roman"/>
         </w:rPr>
         <w:lastRenderedPageBreak/>
-        <w:t>SEQUECE DIAGRAM</w:t>
+        <w:t>SEQUENCE</w:t>
+      </w:r>
+      <w:r>
+        <w:rPr>
+          <w:rFonts w:ascii="Times New Roman" w:hAnsi="Times New Roman" w:cs="Times New Roman"/>
+        </w:rPr>
+        <w:t xml:space="preserve"> DIAGRAM</w:t>
       </w:r>
       <w:bookmarkEnd w:id="82"/>
       <w:bookmarkEnd w:id="83"/>
@@ -22172,7 +22220,7 @@
         </w:rPr>
       </w:pPr>
       <w:bookmarkStart w:id="87" w:name="_Toc235563724"/>
-      <w:bookmarkStart w:id="88" w:name="_Toc235807300"/>
+      <w:bookmarkStart w:id="88" w:name="_Toc236150105"/>
       <w:r>
         <w:rPr>
           <w:rFonts w:ascii="Times New Roman" w:hAnsi="Times New Roman" w:cs="Times New Roman"/>
@@ -22426,7 +22474,6 @@
           <w:sz w:val="26"/>
           <w:szCs w:val="26"/>
         </w:rPr>
-        <w:lastRenderedPageBreak/>
         <w:t>Customers – Deals: có quan hệ one-to-many vì một khách hàng có thể có nhiều cơ hội bán hàng và một cơ hội bán hàng chỉ thuộc một khách hàng.</w:t>
       </w:r>
     </w:p>
@@ -22471,6 +22518,7 @@
           <w:sz w:val="26"/>
           <w:szCs w:val="26"/>
         </w:rPr>
+        <w:lastRenderedPageBreak/>
         <w:t>Deals – Activities: quan hệ one-to-many vì một cơ hội bán hàng có nhiều hoạt động chăm sóc khách hàng.</w:t>
       </w:r>
     </w:p>
@@ -22591,7 +22639,7 @@
           <w:rFonts w:ascii="Times New Roman" w:hAnsi="Times New Roman" w:cs="Times New Roman"/>
         </w:rPr>
       </w:pPr>
-      <w:bookmarkStart w:id="90" w:name="_Toc235807301"/>
+      <w:bookmarkStart w:id="90" w:name="_Toc236150106"/>
       <w:r>
         <w:rPr>
           <w:rFonts w:ascii="Times New Roman" w:hAnsi="Times New Roman" w:cs="Times New Roman"/>
@@ -22737,25 +22785,33 @@
           <w:sz w:val="26"/>
           <w:szCs w:val="26"/>
         </w:rPr>
+        <w:t>ERD mô tả mô hình cơ sở dữ liệu hệ thống CRM. Cơ sở dữ liệu bao gồm 14 bảng được liên kết với nhau thông qua khóa chính và khóa ngoại nhằm đảm bảo tính toàn vẹn dữ liệu.</w:t>
+      </w:r>
+    </w:p>
+    <w:p>
+      <w:pPr>
+        <w:rPr>
+          <w:rFonts w:ascii="Times New Roman" w:hAnsi="Times New Roman" w:cs="Times New Roman"/>
+          <w:sz w:val="26"/>
+          <w:szCs w:val="26"/>
+        </w:rPr>
+      </w:pPr>
+      <w:r>
+        <w:rPr>
+          <w:rFonts w:ascii="Times New Roman" w:hAnsi="Times New Roman" w:cs="Times New Roman"/>
+          <w:sz w:val="26"/>
+          <w:szCs w:val="26"/>
+        </w:rPr>
+        <w:t xml:space="preserve">Trong đó, bảng Users lưu thông tin các nhân viên thực hiện các thao tác trong hệ thống và được phân quyền thông qua bảng Roles. Bảng Leads lưu thông tin khách hàng tiềm năng, sau đó sẽ được chuyển đổi thành Customer. Mỗi Customer sẽ phát sinh nhiều </w:t>
+      </w:r>
+      <w:r>
+        <w:rPr>
+          <w:rFonts w:ascii="Times New Roman" w:hAnsi="Times New Roman" w:cs="Times New Roman"/>
+          <w:sz w:val="26"/>
+          <w:szCs w:val="26"/>
+        </w:rPr>
         <w:lastRenderedPageBreak/>
-        <w:t>ERD mô tả mô hình cơ sở dữ liệu hệ thống CRM. Cơ sở dữ liệu bao gồm 14 bảng được liên kết với nhau thông qua khóa chính và khóa ngoại nhằm đảm bảo tính toàn vẹn dữ liệu.</w:t>
-      </w:r>
-    </w:p>
-    <w:p>
-      <w:pPr>
-        <w:rPr>
-          <w:rFonts w:ascii="Times New Roman" w:hAnsi="Times New Roman" w:cs="Times New Roman"/>
-          <w:sz w:val="26"/>
-          <w:szCs w:val="26"/>
-        </w:rPr>
-      </w:pPr>
-      <w:r>
-        <w:rPr>
-          <w:rFonts w:ascii="Times New Roman" w:hAnsi="Times New Roman" w:cs="Times New Roman"/>
-          <w:sz w:val="26"/>
-          <w:szCs w:val="26"/>
-        </w:rPr>
-        <w:t>Trong đó, bảng Users lưu thông tin các nhân viên thực hiện các thao tác trong hệ thống và được phân quyền thông qua bảng Roles. Bảng Leads lưu thông tin khách hàng tiềm năng, sau đó sẽ được chuyển đổi thành Customer. Mỗi Customer sẽ phát sinh nhiều Deal, mỗi Deal bao gồm Activity, Task và Quote. Báo giá được lưu trong bảng Quotes và chi tiết sản phẩm được lưu trong bảng QuoteDetails.</w:t>
+        <w:t>Deal, mỗi Deal bao gồm Activity, Task và Quote. Báo giá được lưu trong bảng Quotes và chi tiết sản phẩm được lưu trong bảng QuoteDetails.</w:t>
       </w:r>
     </w:p>
     <w:p>
@@ -22765,7 +22821,7 @@
           <w:rFonts w:ascii="Times New Roman" w:hAnsi="Times New Roman" w:cs="Times New Roman"/>
         </w:rPr>
       </w:pPr>
-      <w:bookmarkStart w:id="92" w:name="_Toc235807302"/>
+      <w:bookmarkStart w:id="92" w:name="_Toc236150107"/>
       <w:r>
         <w:rPr>
           <w:rFonts w:ascii="Times New Roman" w:hAnsi="Times New Roman" w:cs="Times New Roman"/>
@@ -22781,10 +22837,10 @@
         <w:tblLook w:val="04A0" w:firstRow="1" w:lastRow="0" w:firstColumn="1" w:lastColumn="0" w:noHBand="0" w:noVBand="1"/>
       </w:tblPr>
       <w:tblGrid>
-        <w:gridCol w:w="1129"/>
-        <w:gridCol w:w="1985"/>
-        <w:gridCol w:w="3827"/>
-        <w:gridCol w:w="2170"/>
+        <w:gridCol w:w="1125"/>
+        <w:gridCol w:w="1978"/>
+        <w:gridCol w:w="3793"/>
+        <w:gridCol w:w="2165"/>
       </w:tblGrid>
       <w:tr>
         <w:tc>
@@ -23788,13 +23844,19 @@
           <w:rFonts w:ascii="Times New Roman" w:hAnsi="Times New Roman" w:cs="Times New Roman"/>
         </w:rPr>
       </w:pPr>
-      <w:bookmarkStart w:id="94" w:name="_Toc235807303"/>
+      <w:bookmarkStart w:id="94" w:name="_Toc236150108"/>
       <w:r>
         <w:rPr>
           <w:rFonts w:ascii="Times New Roman" w:hAnsi="Times New Roman" w:cs="Times New Roman"/>
         </w:rPr>
         <w:lastRenderedPageBreak/>
-        <w:t>KIỂN TRÚC HỆ THỐNG</w:t>
+        <w:t xml:space="preserve">KIẾN </w:t>
+      </w:r>
+      <w:r>
+        <w:rPr>
+          <w:rFonts w:ascii="Times New Roman" w:hAnsi="Times New Roman" w:cs="Times New Roman"/>
+        </w:rPr>
+        <w:t>TRÚC HỆ THỐNG</w:t>
       </w:r>
       <w:bookmarkEnd w:id="94"/>
     </w:p>
@@ -23805,7 +23867,7 @@
           <w:rFonts w:ascii="Times New Roman" w:hAnsi="Times New Roman" w:cs="Times New Roman"/>
         </w:rPr>
       </w:pPr>
-      <w:bookmarkStart w:id="95" w:name="_Toc235807304"/>
+      <w:bookmarkStart w:id="95" w:name="_Toc236150109"/>
       <w:r>
         <w:rPr>
           <w:rFonts w:ascii="Times New Roman" w:hAnsi="Times New Roman" w:cs="Times New Roman"/>
@@ -24097,7 +24159,15 @@
           <w:sz w:val="26"/>
           <w:szCs w:val="26"/>
         </w:rPr>
-        <w:t>Kiển trúc tổng thể của hệ thống CRM được xây dựng theo mô hình Client – Server. Người dùng truy cập hệ thống thông qua trình duyệt web và thao tác trên giao diện được phát triển bởi Next.js. Các thao tác và yêu cầu của người dùng sẽ được gửi đến back-end thông qua RESTful API. Back-end được xây dựng bằng NestJS theo kiến trúc Modular để xử lý nghiệp vụ và sử dụng Prisma ORM để truy cập vào PostgreSQL.</w:t>
+        <w:t>Kiến</w:t>
+      </w:r>
+      <w:r>
+        <w:rPr>
+          <w:rFonts w:ascii="Times New Roman" w:hAnsi="Times New Roman" w:cs="Times New Roman"/>
+          <w:sz w:val="26"/>
+          <w:szCs w:val="26"/>
+        </w:rPr>
+        <w:t xml:space="preserve"> trúc tổng thể của hệ thống CRM được xây dựng theo mô hình Client – Server. Người dùng truy cập hệ thống thông qua trình duyệt web và thao tác trên giao diện được phát triển bởi Next.js. Các thao tác và yêu cầu của người dùng sẽ được gửi đến back-end thông qua RESTful API. Back-end được xây dựng bằng NestJS theo kiến trúc Modular để xử lý nghiệp vụ và sử dụng Prisma ORM để truy cập vào PostgreSQL.</w:t>
       </w:r>
     </w:p>
     <w:p>
@@ -24107,7 +24177,7 @@
           <w:rFonts w:ascii="Times New Roman" w:hAnsi="Times New Roman" w:cs="Times New Roman"/>
         </w:rPr>
       </w:pPr>
-      <w:bookmarkStart w:id="98" w:name="_Toc235807305"/>
+      <w:bookmarkStart w:id="98" w:name="_Toc236150110"/>
       <w:r>
         <w:rPr>
           <w:rFonts w:ascii="Times New Roman" w:hAnsi="Times New Roman" w:cs="Times New Roman"/>
@@ -24396,8 +24466,8 @@
         <w:tblLook w:val="04A0" w:firstRow="1" w:lastRow="0" w:firstColumn="1" w:lastColumn="0" w:noHBand="0" w:noVBand="1"/>
       </w:tblPr>
       <w:tblGrid>
-        <w:gridCol w:w="4566"/>
-        <w:gridCol w:w="4545"/>
+        <w:gridCol w:w="4543"/>
+        <w:gridCol w:w="4518"/>
       </w:tblGrid>
       <w:tr>
         <w:tc>
@@ -25039,7 +25109,7 @@
           <w:rFonts w:ascii="Times New Roman" w:hAnsi="Times New Roman" w:cs="Times New Roman"/>
         </w:rPr>
       </w:pPr>
-      <w:bookmarkStart w:id="102" w:name="_Toc235807306"/>
+      <w:bookmarkStart w:id="102" w:name="_Toc236150111"/>
       <w:r>
         <w:rPr>
           <w:rFonts w:ascii="Times New Roman" w:hAnsi="Times New Roman" w:cs="Times New Roman"/>
@@ -25196,7 +25266,7 @@
           <w:rFonts w:ascii="Times New Roman" w:hAnsi="Times New Roman" w:cs="Times New Roman"/>
         </w:rPr>
       </w:pPr>
-      <w:bookmarkStart w:id="104" w:name="_Toc235807307"/>
+      <w:bookmarkStart w:id="104" w:name="_Toc236150112"/>
       <w:r>
         <w:rPr>
           <w:rFonts w:ascii="Times New Roman" w:hAnsi="Times New Roman" w:cs="Times New Roman"/>
@@ -25336,7 +25406,7 @@
         </w:rPr>
       </w:pPr>
       <w:bookmarkStart w:id="106" w:name="_Toc235563727"/>
-      <w:bookmarkStart w:id="107" w:name="_Toc235807308"/>
+      <w:bookmarkStart w:id="107" w:name="_Toc236150113"/>
       <w:r>
         <w:rPr>
           <w:rFonts w:ascii="Times New Roman" w:hAnsi="Times New Roman" w:cs="Times New Roman"/>
@@ -26608,7 +26678,7 @@
         </w:rPr>
       </w:pPr>
       <w:bookmarkStart w:id="117" w:name="_Toc235563729"/>
-      <w:bookmarkStart w:id="118" w:name="_Toc235807309"/>
+      <w:bookmarkStart w:id="118" w:name="_Toc236150114"/>
       <w:r>
         <w:rPr>
           <w:rFonts w:ascii="Times New Roman" w:hAnsi="Times New Roman" w:cs="Times New Roman"/>
@@ -26619,22 +26689,22 @@
       <w:bookmarkEnd w:id="117"/>
       <w:bookmarkEnd w:id="118"/>
     </w:p>
+    <w:bookmarkStart w:id="119" w:name="_Toc236150115" w:displacedByCustomXml="next"/>
     <w:sdt>
       <w:sdtPr>
+        <w:rPr>
+          <w:rFonts w:asciiTheme="minorHAnsi" w:eastAsiaTheme="minorHAnsi" w:hAnsiTheme="minorHAnsi" w:cstheme="minorBidi"/>
+          <w:color w:val="auto"/>
+          <w:sz w:val="22"/>
+          <w:szCs w:val="22"/>
+        </w:rPr>
         <w:id w:val="1449190712"/>
         <w:docPartObj>
           <w:docPartGallery w:val="Bibliographies"/>
           <w:docPartUnique/>
         </w:docPartObj>
       </w:sdtPr>
-      <w:sdtEndPr>
-        <w:rPr>
-          <w:rFonts w:asciiTheme="minorHAnsi" w:eastAsiaTheme="minorHAnsi" w:hAnsiTheme="minorHAnsi" w:cstheme="minorBidi"/>
-          <w:color w:val="auto"/>
-          <w:sz w:val="22"/>
-          <w:szCs w:val="22"/>
-        </w:rPr>
-      </w:sdtEndPr>
+      <w:sdtEndPr/>
       <w:sdtContent>
         <w:p>
           <w:pPr>
@@ -26653,6 +26723,7 @@
             </w:rPr>
             <w:t>References</w:t>
           </w:r>
+          <w:bookmarkEnd w:id="119"/>
         </w:p>
         <w:sdt>
           <w:sdtPr>
@@ -26664,6 +26735,7 @@
             <w:id w:val="-573587230"/>
             <w:bibliography/>
           </w:sdtPr>
+          <w:sdtEndPr/>
           <w:sdtContent>
             <w:p>
               <w:pPr>
@@ -26713,7 +26785,7 @@
               </w:tblPr>
               <w:tblGrid>
                 <w:gridCol w:w="509"/>
-                <w:gridCol w:w="8612"/>
+                <w:gridCol w:w="8562"/>
               </w:tblGrid>
               <w:tr>
                 <w:trPr>
@@ -27409,8 +27481,8 @@
     </w:p>
     <w:sectPr>
       <w:headerReference w:type="default" r:id="rId35"/>
-      <w:pgSz w:w="12240" w:h="15840"/>
-      <w:pgMar w:top="1134" w:right="1134" w:bottom="1134" w:left="1985" w:header="720" w:footer="720" w:gutter="0"/>
+      <w:pgSz w:w="11906" w:h="16838" w:code="9"/>
+      <w:pgMar w:top="1134" w:right="1134" w:bottom="1134" w:left="1701" w:header="720" w:footer="720" w:gutter="0"/>
       <w:cols w:space="720"/>
       <w:docGrid w:linePitch="360"/>
     </w:sectPr>

</xml_diff>

<commit_message>
feat: cập nhật nội dung chương 1
</commit_message>
<xml_diff>
--- a/docs/BaoCao/BaoCao.docx
+++ b/docs/BaoCao/BaoCao.docx
@@ -390,7 +390,7 @@
           <w:rFonts w:ascii="Times New Roman" w:hAnsi="Times New Roman" w:cs="Times New Roman"/>
         </w:rPr>
       </w:pPr>
-      <w:bookmarkStart w:id="1" w:name="_Toc236150069"/>
+      <w:bookmarkStart w:id="1" w:name="_Toc236169775"/>
       <w:r>
         <w:rPr>
           <w:rFonts w:ascii="Times New Roman" w:hAnsi="Times New Roman" w:cs="Times New Roman"/>
@@ -562,7 +562,7 @@
         </w:rPr>
       </w:pPr>
       <w:bookmarkStart w:id="2" w:name="_Toc235563699"/>
-      <w:bookmarkStart w:id="3" w:name="_Toc236150070"/>
+      <w:bookmarkStart w:id="3" w:name="_Toc236169776"/>
       <w:r>
         <w:rPr>
           <w:rFonts w:ascii="Times New Roman" w:hAnsi="Times New Roman" w:cs="Times New Roman"/>
@@ -583,7 +583,7 @@
       <w:r>
         <w:br w:type="page"/>
       </w:r>
-      <w:bookmarkStart w:id="4" w:name="_Toc236150071"/>
+      <w:bookmarkStart w:id="4" w:name="_Toc236169777"/>
       <w:r>
         <w:rPr>
           <w:rFonts w:ascii="Times New Roman" w:hAnsi="Times New Roman" w:cs="Times New Roman"/>
@@ -691,7 +691,7 @@
             </w:rPr>
             <w:fldChar w:fldCharType="separate"/>
           </w:r>
-          <w:hyperlink w:anchor="_Toc236150069" w:history="1">
+          <w:hyperlink w:anchor="_Toc236169775" w:history="1">
             <w:r>
               <w:rPr>
                 <w:rStyle w:val="Hyperlink"/>
@@ -719,7 +719,7 @@
                 <w:noProof/>
                 <w:webHidden/>
               </w:rPr>
-              <w:instrText xml:space="preserve"> PAGEREF _Toc236150069 \h </w:instrText>
+              <w:instrText xml:space="preserve"> PAGEREF _Toc236169775 \h </w:instrText>
             </w:r>
             <w:r>
               <w:rPr>
@@ -761,7 +761,7 @@
               <w:noProof/>
             </w:rPr>
           </w:pPr>
-          <w:hyperlink w:anchor="_Toc236150070" w:history="1">
+          <w:hyperlink w:anchor="_Toc236169776" w:history="1">
             <w:r>
               <w:rPr>
                 <w:rStyle w:val="Hyperlink"/>
@@ -789,7 +789,7 @@
                 <w:noProof/>
                 <w:webHidden/>
               </w:rPr>
-              <w:instrText xml:space="preserve"> PAGEREF _Toc236150070 \h </w:instrText>
+              <w:instrText xml:space="preserve"> PAGEREF _Toc236169776 \h </w:instrText>
             </w:r>
             <w:r>
               <w:rPr>
@@ -831,7 +831,7 @@
               <w:noProof/>
             </w:rPr>
           </w:pPr>
-          <w:hyperlink w:anchor="_Toc236150071" w:history="1">
+          <w:hyperlink w:anchor="_Toc236169777" w:history="1">
             <w:r>
               <w:rPr>
                 <w:rStyle w:val="Hyperlink"/>
@@ -859,7 +859,7 @@
                 <w:noProof/>
                 <w:webHidden/>
               </w:rPr>
-              <w:instrText xml:space="preserve"> PAGEREF _Toc236150071 \h </w:instrText>
+              <w:instrText xml:space="preserve"> PAGEREF _Toc236169777 \h </w:instrText>
             </w:r>
             <w:r>
               <w:rPr>
@@ -901,7 +901,7 @@
               <w:noProof/>
             </w:rPr>
           </w:pPr>
-          <w:hyperlink w:anchor="_Toc236150072" w:history="1">
+          <w:hyperlink w:anchor="_Toc236169778" w:history="1">
             <w:r>
               <w:rPr>
                 <w:rStyle w:val="Hyperlink"/>
@@ -929,7 +929,7 @@
                 <w:noProof/>
                 <w:webHidden/>
               </w:rPr>
-              <w:instrText xml:space="preserve"> PAGEREF _Toc236150072 \h </w:instrText>
+              <w:instrText xml:space="preserve"> PAGEREF _Toc236169778 \h </w:instrText>
             </w:r>
             <w:r>
               <w:rPr>
@@ -971,7 +971,7 @@
               <w:noProof/>
             </w:rPr>
           </w:pPr>
-          <w:hyperlink w:anchor="_Toc236150073" w:history="1">
+          <w:hyperlink w:anchor="_Toc236169779" w:history="1">
             <w:r>
               <w:rPr>
                 <w:rStyle w:val="Hyperlink"/>
@@ -999,7 +999,7 @@
                 <w:noProof/>
                 <w:webHidden/>
               </w:rPr>
-              <w:instrText xml:space="preserve"> PAGEREF _Toc236150073 \h </w:instrText>
+              <w:instrText xml:space="preserve"> PAGEREF _Toc236169779 \h </w:instrText>
             </w:r>
             <w:r>
               <w:rPr>
@@ -1041,7 +1041,7 @@
               <w:noProof/>
             </w:rPr>
           </w:pPr>
-          <w:hyperlink w:anchor="_Toc236150074" w:history="1">
+          <w:hyperlink w:anchor="_Toc236169780" w:history="1">
             <w:r>
               <w:rPr>
                 <w:rStyle w:val="Hyperlink"/>
@@ -1069,7 +1069,7 @@
                 <w:noProof/>
                 <w:webHidden/>
               </w:rPr>
-              <w:instrText xml:space="preserve"> PAGEREF _Toc236150074 \h </w:instrText>
+              <w:instrText xml:space="preserve"> PAGEREF _Toc236169780 \h </w:instrText>
             </w:r>
             <w:r>
               <w:rPr>
@@ -1111,7 +1111,7 @@
               <w:noProof/>
             </w:rPr>
           </w:pPr>
-          <w:hyperlink w:anchor="_Toc236150075" w:history="1">
+          <w:hyperlink w:anchor="_Toc236169781" w:history="1">
             <w:r>
               <w:rPr>
                 <w:rStyle w:val="Hyperlink"/>
@@ -1139,7 +1139,7 @@
                 <w:noProof/>
                 <w:webHidden/>
               </w:rPr>
-              <w:instrText xml:space="preserve"> PAGEREF _Toc236150075 \h </w:instrText>
+              <w:instrText xml:space="preserve"> PAGEREF _Toc236169781 \h </w:instrText>
             </w:r>
             <w:r>
               <w:rPr>
@@ -1181,7 +1181,7 @@
               <w:noProof/>
             </w:rPr>
           </w:pPr>
-          <w:hyperlink w:anchor="_Toc236150076" w:history="1">
+          <w:hyperlink w:anchor="_Toc236169782" w:history="1">
             <w:r>
               <w:rPr>
                 <w:rStyle w:val="Hyperlink"/>
@@ -1209,7 +1209,7 @@
                 <w:noProof/>
                 <w:webHidden/>
               </w:rPr>
-              <w:instrText xml:space="preserve"> PAGEREF _Toc236150076 \h </w:instrText>
+              <w:instrText xml:space="preserve"> PAGEREF _Toc236169782 \h </w:instrText>
             </w:r>
             <w:r>
               <w:rPr>
@@ -1251,14 +1251,14 @@
               <w:noProof/>
             </w:rPr>
           </w:pPr>
-          <w:hyperlink w:anchor="_Toc236150077" w:history="1">
+          <w:hyperlink w:anchor="_Toc236169783" w:history="1">
             <w:r>
               <w:rPr>
                 <w:rStyle w:val="Hyperlink"/>
                 <w:rFonts w:ascii="Times New Roman" w:hAnsi="Times New Roman" w:cs="Times New Roman"/>
                 <w:noProof/>
               </w:rPr>
-              <w:t>Ý NGHĨA</w:t>
+              <w:t>MỤC TIÊU</w:t>
             </w:r>
             <w:r>
               <w:rPr>
@@ -1279,7 +1279,7 @@
                 <w:noProof/>
                 <w:webHidden/>
               </w:rPr>
-              <w:instrText xml:space="preserve"> PAGEREF _Toc236150077 \h </w:instrText>
+              <w:instrText xml:space="preserve"> PAGEREF _Toc236169783 \h </w:instrText>
             </w:r>
             <w:r>
               <w:rPr>
@@ -1321,14 +1321,14 @@
               <w:noProof/>
             </w:rPr>
           </w:pPr>
-          <w:hyperlink w:anchor="_Toc236150078" w:history="1">
+          <w:hyperlink w:anchor="_Toc236169784" w:history="1">
             <w:r>
               <w:rPr>
                 <w:rStyle w:val="Hyperlink"/>
                 <w:rFonts w:ascii="Times New Roman" w:hAnsi="Times New Roman" w:cs="Times New Roman"/>
                 <w:noProof/>
               </w:rPr>
-              <w:t>PHẠM VI VÀ CHỨC NĂNG CHÍNH</w:t>
+              <w:t>Ý NGHĨA</w:t>
             </w:r>
             <w:r>
               <w:rPr>
@@ -1349,7 +1349,7 @@
                 <w:noProof/>
                 <w:webHidden/>
               </w:rPr>
-              <w:instrText xml:space="preserve"> PAGEREF _Toc236150078 \h </w:instrText>
+              <w:instrText xml:space="preserve"> PAGEREF _Toc236169784 \h </w:instrText>
             </w:r>
             <w:r>
               <w:rPr>
@@ -1391,14 +1391,14 @@
               <w:noProof/>
             </w:rPr>
           </w:pPr>
-          <w:hyperlink w:anchor="_Toc236150079" w:history="1">
+          <w:hyperlink w:anchor="_Toc236169785" w:history="1">
             <w:r>
               <w:rPr>
                 <w:rStyle w:val="Hyperlink"/>
                 <w:rFonts w:ascii="Times New Roman" w:hAnsi="Times New Roman" w:cs="Times New Roman"/>
                 <w:noProof/>
               </w:rPr>
-              <w:t>ĐỐI TƯỢNG</w:t>
+              <w:t>PHẠM VI VÀ CHỨC NĂNG CHÍNH</w:t>
             </w:r>
             <w:r>
               <w:rPr>
@@ -1419,7 +1419,7 @@
                 <w:noProof/>
                 <w:webHidden/>
               </w:rPr>
-              <w:instrText xml:space="preserve"> PAGEREF _Toc236150079 \h </w:instrText>
+              <w:instrText xml:space="preserve"> PAGEREF _Toc236169785 \h </w:instrText>
             </w:r>
             <w:r>
               <w:rPr>
@@ -1439,7 +1439,303 @@
                 <w:noProof/>
                 <w:webHidden/>
               </w:rPr>
+              <w:t>10</w:t>
+            </w:r>
+            <w:r>
+              <w:rPr>
+                <w:noProof/>
+                <w:webHidden/>
+              </w:rPr>
+              <w:fldChar w:fldCharType="end"/>
+            </w:r>
+          </w:hyperlink>
+        </w:p>
+        <w:p>
+          <w:pPr>
+            <w:pStyle w:val="TOC2"/>
+            <w:tabs>
+              <w:tab w:val="right" w:leader="dot" w:pos="9061"/>
+            </w:tabs>
+            <w:rPr>
+              <w:rFonts w:eastAsiaTheme="minorEastAsia"/>
+              <w:noProof/>
+            </w:rPr>
+          </w:pPr>
+          <w:hyperlink w:anchor="_Toc236169786" w:history="1">
+            <w:r>
+              <w:rPr>
+                <w:rStyle w:val="Hyperlink"/>
+                <w:rFonts w:ascii="Times New Roman" w:hAnsi="Times New Roman" w:cs="Times New Roman"/>
+                <w:noProof/>
+              </w:rPr>
+              <w:t>PHẠM VI NGOÀI</w:t>
+            </w:r>
+            <w:r>
+              <w:rPr>
+                <w:noProof/>
+                <w:webHidden/>
+              </w:rPr>
+              <w:tab/>
+            </w:r>
+            <w:r>
+              <w:rPr>
+                <w:noProof/>
+                <w:webHidden/>
+              </w:rPr>
+              <w:fldChar w:fldCharType="begin"/>
+            </w:r>
+            <w:r>
+              <w:rPr>
+                <w:noProof/>
+                <w:webHidden/>
+              </w:rPr>
+              <w:instrText xml:space="preserve"> PAGEREF _Toc236169786 \h </w:instrText>
+            </w:r>
+            <w:r>
+              <w:rPr>
+                <w:noProof/>
+                <w:webHidden/>
+              </w:rPr>
+            </w:r>
+            <w:r>
+              <w:rPr>
+                <w:noProof/>
+                <w:webHidden/>
+              </w:rPr>
+              <w:fldChar w:fldCharType="separate"/>
+            </w:r>
+            <w:r>
+              <w:rPr>
+                <w:noProof/>
+                <w:webHidden/>
+              </w:rPr>
               <w:t>11</w:t>
+            </w:r>
+            <w:r>
+              <w:rPr>
+                <w:noProof/>
+                <w:webHidden/>
+              </w:rPr>
+              <w:fldChar w:fldCharType="end"/>
+            </w:r>
+          </w:hyperlink>
+        </w:p>
+        <w:p>
+          <w:pPr>
+            <w:pStyle w:val="TOC2"/>
+            <w:tabs>
+              <w:tab w:val="right" w:leader="dot" w:pos="9061"/>
+            </w:tabs>
+            <w:rPr>
+              <w:rFonts w:eastAsiaTheme="minorEastAsia"/>
+              <w:noProof/>
+            </w:rPr>
+          </w:pPr>
+          <w:hyperlink w:anchor="_Toc236169787" w:history="1">
+            <w:r>
+              <w:rPr>
+                <w:rStyle w:val="Hyperlink"/>
+                <w:rFonts w:ascii="Times New Roman" w:hAnsi="Times New Roman" w:cs="Times New Roman"/>
+                <w:noProof/>
+              </w:rPr>
+              <w:t>ĐỐI TƯỢ</w:t>
+            </w:r>
+            <w:r>
+              <w:rPr>
+                <w:rStyle w:val="Hyperlink"/>
+                <w:rFonts w:ascii="Times New Roman" w:hAnsi="Times New Roman" w:cs="Times New Roman"/>
+                <w:noProof/>
+              </w:rPr>
+              <w:t>N</w:t>
+            </w:r>
+            <w:r>
+              <w:rPr>
+                <w:rStyle w:val="Hyperlink"/>
+                <w:rFonts w:ascii="Times New Roman" w:hAnsi="Times New Roman" w:cs="Times New Roman"/>
+                <w:noProof/>
+              </w:rPr>
+              <w:t>G</w:t>
+            </w:r>
+            <w:r>
+              <w:rPr>
+                <w:noProof/>
+                <w:webHidden/>
+              </w:rPr>
+              <w:tab/>
+            </w:r>
+            <w:r>
+              <w:rPr>
+                <w:noProof/>
+                <w:webHidden/>
+              </w:rPr>
+              <w:fldChar w:fldCharType="begin"/>
+            </w:r>
+            <w:r>
+              <w:rPr>
+                <w:noProof/>
+                <w:webHidden/>
+              </w:rPr>
+              <w:instrText xml:space="preserve"> PAGEREF _Toc236169787 \h </w:instrText>
+            </w:r>
+            <w:r>
+              <w:rPr>
+                <w:noProof/>
+                <w:webHidden/>
+              </w:rPr>
+            </w:r>
+            <w:r>
+              <w:rPr>
+                <w:noProof/>
+                <w:webHidden/>
+              </w:rPr>
+              <w:fldChar w:fldCharType="separate"/>
+            </w:r>
+            <w:r>
+              <w:rPr>
+                <w:noProof/>
+                <w:webHidden/>
+              </w:rPr>
+              <w:t>11</w:t>
+            </w:r>
+            <w:r>
+              <w:rPr>
+                <w:noProof/>
+                <w:webHidden/>
+              </w:rPr>
+              <w:fldChar w:fldCharType="end"/>
+            </w:r>
+          </w:hyperlink>
+        </w:p>
+        <w:p>
+          <w:pPr>
+            <w:pStyle w:val="TOC2"/>
+            <w:tabs>
+              <w:tab w:val="right" w:leader="dot" w:pos="9061"/>
+            </w:tabs>
+            <w:rPr>
+              <w:rFonts w:eastAsiaTheme="minorEastAsia"/>
+              <w:noProof/>
+            </w:rPr>
+          </w:pPr>
+          <w:hyperlink w:anchor="_Toc236169788" w:history="1">
+            <w:r>
+              <w:rPr>
+                <w:rStyle w:val="Hyperlink"/>
+                <w:rFonts w:ascii="Times New Roman" w:hAnsi="Times New Roman" w:cs="Times New Roman"/>
+                <w:noProof/>
+              </w:rPr>
+              <w:t>PHƯƠNG PHÁP NGHIÊN CỨU</w:t>
+            </w:r>
+            <w:r>
+              <w:rPr>
+                <w:noProof/>
+                <w:webHidden/>
+              </w:rPr>
+              <w:tab/>
+            </w:r>
+            <w:r>
+              <w:rPr>
+                <w:noProof/>
+                <w:webHidden/>
+              </w:rPr>
+              <w:fldChar w:fldCharType="begin"/>
+            </w:r>
+            <w:r>
+              <w:rPr>
+                <w:noProof/>
+                <w:webHidden/>
+              </w:rPr>
+              <w:instrText xml:space="preserve"> PAGEREF _Toc236169788 \h </w:instrText>
+            </w:r>
+            <w:r>
+              <w:rPr>
+                <w:noProof/>
+                <w:webHidden/>
+              </w:rPr>
+            </w:r>
+            <w:r>
+              <w:rPr>
+                <w:noProof/>
+                <w:webHidden/>
+              </w:rPr>
+              <w:fldChar w:fldCharType="separate"/>
+            </w:r>
+            <w:r>
+              <w:rPr>
+                <w:noProof/>
+                <w:webHidden/>
+              </w:rPr>
+              <w:t>11</w:t>
+            </w:r>
+            <w:r>
+              <w:rPr>
+                <w:noProof/>
+                <w:webHidden/>
+              </w:rPr>
+              <w:fldChar w:fldCharType="end"/>
+            </w:r>
+          </w:hyperlink>
+        </w:p>
+        <w:p>
+          <w:pPr>
+            <w:pStyle w:val="TOC2"/>
+            <w:tabs>
+              <w:tab w:val="right" w:leader="dot" w:pos="9061"/>
+            </w:tabs>
+            <w:rPr>
+              <w:rFonts w:eastAsiaTheme="minorEastAsia"/>
+              <w:noProof/>
+            </w:rPr>
+          </w:pPr>
+          <w:hyperlink w:anchor="_Toc236169789" w:history="1">
+            <w:r>
+              <w:rPr>
+                <w:rStyle w:val="Hyperlink"/>
+                <w:rFonts w:ascii="Times New Roman" w:hAnsi="Times New Roman" w:cs="Times New Roman"/>
+                <w:noProof/>
+              </w:rPr>
+              <w:t>BỐ CỤC BÁO CÁO</w:t>
+            </w:r>
+            <w:r>
+              <w:rPr>
+                <w:noProof/>
+                <w:webHidden/>
+              </w:rPr>
+              <w:tab/>
+            </w:r>
+            <w:r>
+              <w:rPr>
+                <w:noProof/>
+                <w:webHidden/>
+              </w:rPr>
+              <w:fldChar w:fldCharType="begin"/>
+            </w:r>
+            <w:r>
+              <w:rPr>
+                <w:noProof/>
+                <w:webHidden/>
+              </w:rPr>
+              <w:instrText xml:space="preserve"> PAGEREF _Toc236169789 \h </w:instrText>
+            </w:r>
+            <w:r>
+              <w:rPr>
+                <w:noProof/>
+                <w:webHidden/>
+              </w:rPr>
+            </w:r>
+            <w:r>
+              <w:rPr>
+                <w:noProof/>
+                <w:webHidden/>
+              </w:rPr>
+              <w:fldChar w:fldCharType="separate"/>
+            </w:r>
+            <w:r>
+              <w:rPr>
+                <w:noProof/>
+                <w:webHidden/>
+              </w:rPr>
+              <w:t>12</w:t>
             </w:r>
             <w:r>
               <w:rPr>
@@ -1461,7 +1757,7 @@
               <w:noProof/>
             </w:rPr>
           </w:pPr>
-          <w:hyperlink w:anchor="_Toc236150080" w:history="1">
+          <w:hyperlink w:anchor="_Toc236169790" w:history="1">
             <w:r>
               <w:rPr>
                 <w:rStyle w:val="Hyperlink"/>
@@ -1489,7 +1785,7 @@
                 <w:noProof/>
                 <w:webHidden/>
               </w:rPr>
-              <w:instrText xml:space="preserve"> PAGEREF _Toc236150080 \h </w:instrText>
+              <w:instrText xml:space="preserve"> PAGEREF _Toc236169790 \h </w:instrText>
             </w:r>
             <w:r>
               <w:rPr>
@@ -1509,7 +1805,7 @@
                 <w:noProof/>
                 <w:webHidden/>
               </w:rPr>
-              <w:t>12</w:t>
+              <w:t>13</w:t>
             </w:r>
             <w:r>
               <w:rPr>
@@ -1531,7 +1827,7 @@
               <w:noProof/>
             </w:rPr>
           </w:pPr>
-          <w:hyperlink w:anchor="_Toc236150081" w:history="1">
+          <w:hyperlink w:anchor="_Toc236169791" w:history="1">
             <w:r>
               <w:rPr>
                 <w:rStyle w:val="Hyperlink"/>
@@ -1559,7 +1855,7 @@
                 <w:noProof/>
                 <w:webHidden/>
               </w:rPr>
-              <w:instrText xml:space="preserve"> PAGEREF _Toc236150081 \h </w:instrText>
+              <w:instrText xml:space="preserve"> PAGEREF _Toc236169791 \h </w:instrText>
             </w:r>
             <w:r>
               <w:rPr>
@@ -1579,7 +1875,7 @@
                 <w:noProof/>
                 <w:webHidden/>
               </w:rPr>
-              <w:t>12</w:t>
+              <w:t>13</w:t>
             </w:r>
             <w:r>
               <w:rPr>
@@ -1601,7 +1897,7 @@
               <w:noProof/>
             </w:rPr>
           </w:pPr>
-          <w:hyperlink w:anchor="_Toc236150082" w:history="1">
+          <w:hyperlink w:anchor="_Toc236169792" w:history="1">
             <w:r>
               <w:rPr>
                 <w:rStyle w:val="Hyperlink"/>
@@ -1629,7 +1925,7 @@
                 <w:noProof/>
                 <w:webHidden/>
               </w:rPr>
-              <w:instrText xml:space="preserve"> PAGEREF _Toc236150082 \h </w:instrText>
+              <w:instrText xml:space="preserve"> PAGEREF _Toc236169792 \h </w:instrText>
             </w:r>
             <w:r>
               <w:rPr>
@@ -1649,7 +1945,7 @@
                 <w:noProof/>
                 <w:webHidden/>
               </w:rPr>
-              <w:t>12</w:t>
+              <w:t>13</w:t>
             </w:r>
             <w:r>
               <w:rPr>
@@ -1671,7 +1967,7 @@
               <w:noProof/>
             </w:rPr>
           </w:pPr>
-          <w:hyperlink w:anchor="_Toc236150083" w:history="1">
+          <w:hyperlink w:anchor="_Toc236169793" w:history="1">
             <w:r>
               <w:rPr>
                 <w:rStyle w:val="Hyperlink"/>
@@ -1699,7 +1995,7 @@
                 <w:noProof/>
                 <w:webHidden/>
               </w:rPr>
-              <w:instrText xml:space="preserve"> PAGEREF _Toc236150083 \h </w:instrText>
+              <w:instrText xml:space="preserve"> PAGEREF _Toc236169793 \h </w:instrText>
             </w:r>
             <w:r>
               <w:rPr>
@@ -1719,7 +2015,7 @@
                 <w:noProof/>
                 <w:webHidden/>
               </w:rPr>
-              <w:t>13</w:t>
+              <w:t>14</w:t>
             </w:r>
             <w:r>
               <w:rPr>
@@ -1741,7 +2037,7 @@
               <w:noProof/>
             </w:rPr>
           </w:pPr>
-          <w:hyperlink w:anchor="_Toc236150084" w:history="1">
+          <w:hyperlink w:anchor="_Toc236169794" w:history="1">
             <w:r>
               <w:rPr>
                 <w:rStyle w:val="Hyperlink"/>
@@ -1769,7 +2065,7 @@
                 <w:noProof/>
                 <w:webHidden/>
               </w:rPr>
-              <w:instrText xml:space="preserve"> PAGEREF _Toc236150084 \h </w:instrText>
+              <w:instrText xml:space="preserve"> PAGEREF _Toc236169794 \h </w:instrText>
             </w:r>
             <w:r>
               <w:rPr>
@@ -1789,7 +2085,7 @@
                 <w:noProof/>
                 <w:webHidden/>
               </w:rPr>
-              <w:t>15</w:t>
+              <w:t>16</w:t>
             </w:r>
             <w:r>
               <w:rPr>
@@ -1811,7 +2107,7 @@
               <w:noProof/>
             </w:rPr>
           </w:pPr>
-          <w:hyperlink w:anchor="_Toc236150085" w:history="1">
+          <w:hyperlink w:anchor="_Toc236169795" w:history="1">
             <w:r>
               <w:rPr>
                 <w:rStyle w:val="Hyperlink"/>
@@ -1839,7 +2135,7 @@
                 <w:noProof/>
                 <w:webHidden/>
               </w:rPr>
-              <w:instrText xml:space="preserve"> PAGEREF _Toc236150085 \h </w:instrText>
+              <w:instrText xml:space="preserve"> PAGEREF _Toc236169795 \h </w:instrText>
             </w:r>
             <w:r>
               <w:rPr>
@@ -1859,7 +2155,7 @@
                 <w:noProof/>
                 <w:webHidden/>
               </w:rPr>
-              <w:t>15</w:t>
+              <w:t>16</w:t>
             </w:r>
             <w:r>
               <w:rPr>
@@ -1881,7 +2177,7 @@
               <w:noProof/>
             </w:rPr>
           </w:pPr>
-          <w:hyperlink w:anchor="_Toc236150086" w:history="1">
+          <w:hyperlink w:anchor="_Toc236169796" w:history="1">
             <w:r>
               <w:rPr>
                 <w:rStyle w:val="Hyperlink"/>
@@ -1909,7 +2205,7 @@
                 <w:noProof/>
                 <w:webHidden/>
               </w:rPr>
-              <w:instrText xml:space="preserve"> PAGEREF _Toc236150086 \h </w:instrText>
+              <w:instrText xml:space="preserve"> PAGEREF _Toc236169796 \h </w:instrText>
             </w:r>
             <w:r>
               <w:rPr>
@@ -1929,7 +2225,7 @@
                 <w:noProof/>
                 <w:webHidden/>
               </w:rPr>
-              <w:t>15</w:t>
+              <w:t>16</w:t>
             </w:r>
             <w:r>
               <w:rPr>
@@ -1951,7 +2247,7 @@
               <w:noProof/>
             </w:rPr>
           </w:pPr>
-          <w:hyperlink w:anchor="_Toc236150087" w:history="1">
+          <w:hyperlink w:anchor="_Toc236169797" w:history="1">
             <w:r>
               <w:rPr>
                 <w:rStyle w:val="Hyperlink"/>
@@ -1979,7 +2275,7 @@
                 <w:noProof/>
                 <w:webHidden/>
               </w:rPr>
-              <w:instrText xml:space="preserve"> PAGEREF _Toc236150087 \h </w:instrText>
+              <w:instrText xml:space="preserve"> PAGEREF _Toc236169797 \h </w:instrText>
             </w:r>
             <w:r>
               <w:rPr>
@@ -1999,7 +2295,7 @@
                 <w:noProof/>
                 <w:webHidden/>
               </w:rPr>
-              <w:t>15</w:t>
+              <w:t>16</w:t>
             </w:r>
             <w:r>
               <w:rPr>
@@ -2021,7 +2317,7 @@
               <w:noProof/>
             </w:rPr>
           </w:pPr>
-          <w:hyperlink w:anchor="_Toc236150088" w:history="1">
+          <w:hyperlink w:anchor="_Toc236169798" w:history="1">
             <w:r>
               <w:rPr>
                 <w:rStyle w:val="Hyperlink"/>
@@ -2049,7 +2345,7 @@
                 <w:noProof/>
                 <w:webHidden/>
               </w:rPr>
-              <w:instrText xml:space="preserve"> PAGEREF _Toc236150088 \h </w:instrText>
+              <w:instrText xml:space="preserve"> PAGEREF _Toc236169798 \h </w:instrText>
             </w:r>
             <w:r>
               <w:rPr>
@@ -2069,7 +2365,7 @@
                 <w:noProof/>
                 <w:webHidden/>
               </w:rPr>
-              <w:t>16</w:t>
+              <w:t>17</w:t>
             </w:r>
             <w:r>
               <w:rPr>
@@ -2091,7 +2387,7 @@
               <w:noProof/>
             </w:rPr>
           </w:pPr>
-          <w:hyperlink w:anchor="_Toc236150089" w:history="1">
+          <w:hyperlink w:anchor="_Toc236169799" w:history="1">
             <w:r>
               <w:rPr>
                 <w:rStyle w:val="Hyperlink"/>
@@ -2119,7 +2415,7 @@
                 <w:noProof/>
                 <w:webHidden/>
               </w:rPr>
-              <w:instrText xml:space="preserve"> PAGEREF _Toc236150089 \h </w:instrText>
+              <w:instrText xml:space="preserve"> PAGEREF _Toc236169799 \h </w:instrText>
             </w:r>
             <w:r>
               <w:rPr>
@@ -2139,7 +2435,7 @@
                 <w:noProof/>
                 <w:webHidden/>
               </w:rPr>
-              <w:t>16</w:t>
+              <w:t>17</w:t>
             </w:r>
             <w:r>
               <w:rPr>
@@ -2161,7 +2457,7 @@
               <w:noProof/>
             </w:rPr>
           </w:pPr>
-          <w:hyperlink w:anchor="_Toc236150090" w:history="1">
+          <w:hyperlink w:anchor="_Toc236169800" w:history="1">
             <w:r>
               <w:rPr>
                 <w:rStyle w:val="Hyperlink"/>
@@ -2189,7 +2485,7 @@
                 <w:noProof/>
                 <w:webHidden/>
               </w:rPr>
-              <w:instrText xml:space="preserve"> PAGEREF _Toc236150090 \h </w:instrText>
+              <w:instrText xml:space="preserve"> PAGEREF _Toc236169800 \h </w:instrText>
             </w:r>
             <w:r>
               <w:rPr>
@@ -2209,7 +2505,7 @@
                 <w:noProof/>
                 <w:webHidden/>
               </w:rPr>
-              <w:t>17</w:t>
+              <w:t>18</w:t>
             </w:r>
             <w:r>
               <w:rPr>
@@ -2231,7 +2527,7 @@
               <w:noProof/>
             </w:rPr>
           </w:pPr>
-          <w:hyperlink w:anchor="_Toc236150091" w:history="1">
+          <w:hyperlink w:anchor="_Toc236169801" w:history="1">
             <w:r>
               <w:rPr>
                 <w:rStyle w:val="Hyperlink"/>
@@ -2259,7 +2555,7 @@
                 <w:noProof/>
                 <w:webHidden/>
               </w:rPr>
-              <w:instrText xml:space="preserve"> PAGEREF _Toc236150091 \h </w:instrText>
+              <w:instrText xml:space="preserve"> PAGEREF _Toc236169801 \h </w:instrText>
             </w:r>
             <w:r>
               <w:rPr>
@@ -2279,7 +2575,7 @@
                 <w:noProof/>
                 <w:webHidden/>
               </w:rPr>
-              <w:t>17</w:t>
+              <w:t>18</w:t>
             </w:r>
             <w:r>
               <w:rPr>
@@ -2301,7 +2597,7 @@
               <w:noProof/>
             </w:rPr>
           </w:pPr>
-          <w:hyperlink w:anchor="_Toc236150092" w:history="1">
+          <w:hyperlink w:anchor="_Toc236169802" w:history="1">
             <w:r>
               <w:rPr>
                 <w:rStyle w:val="Hyperlink"/>
@@ -2329,7 +2625,7 @@
                 <w:noProof/>
                 <w:webHidden/>
               </w:rPr>
-              <w:instrText xml:space="preserve"> PAGEREF _Toc236150092 \h </w:instrText>
+              <w:instrText xml:space="preserve"> PAGEREF _Toc236169802 \h </w:instrText>
             </w:r>
             <w:r>
               <w:rPr>
@@ -2349,7 +2645,7 @@
                 <w:noProof/>
                 <w:webHidden/>
               </w:rPr>
-              <w:t>18</w:t>
+              <w:t>19</w:t>
             </w:r>
             <w:r>
               <w:rPr>
@@ -2371,7 +2667,7 @@
               <w:noProof/>
             </w:rPr>
           </w:pPr>
-          <w:hyperlink w:anchor="_Toc236150093" w:history="1">
+          <w:hyperlink w:anchor="_Toc236169803" w:history="1">
             <w:r>
               <w:rPr>
                 <w:rStyle w:val="Hyperlink"/>
@@ -2399,7 +2695,7 @@
                 <w:noProof/>
                 <w:webHidden/>
               </w:rPr>
-              <w:instrText xml:space="preserve"> PAGEREF _Toc236150093 \h </w:instrText>
+              <w:instrText xml:space="preserve"> PAGEREF _Toc236169803 \h </w:instrText>
             </w:r>
             <w:r>
               <w:rPr>
@@ -2419,7 +2715,7 @@
                 <w:noProof/>
                 <w:webHidden/>
               </w:rPr>
-              <w:t>19</w:t>
+              <w:t>20</w:t>
             </w:r>
             <w:r>
               <w:rPr>
@@ -2441,7 +2737,7 @@
               <w:noProof/>
             </w:rPr>
           </w:pPr>
-          <w:hyperlink w:anchor="_Toc236150094" w:history="1">
+          <w:hyperlink w:anchor="_Toc236169804" w:history="1">
             <w:r>
               <w:rPr>
                 <w:rStyle w:val="Hyperlink"/>
@@ -2469,7 +2765,7 @@
                 <w:noProof/>
                 <w:webHidden/>
               </w:rPr>
-              <w:instrText xml:space="preserve"> PAGEREF _Toc236150094 \h </w:instrText>
+              <w:instrText xml:space="preserve"> PAGEREF _Toc236169804 \h </w:instrText>
             </w:r>
             <w:r>
               <w:rPr>
@@ -2489,7 +2785,7 @@
                 <w:noProof/>
                 <w:webHidden/>
               </w:rPr>
-              <w:t>20</w:t>
+              <w:t>21</w:t>
             </w:r>
             <w:r>
               <w:rPr>
@@ -2511,7 +2807,7 @@
               <w:noProof/>
             </w:rPr>
           </w:pPr>
-          <w:hyperlink w:anchor="_Toc236150095" w:history="1">
+          <w:hyperlink w:anchor="_Toc236169805" w:history="1">
             <w:r>
               <w:rPr>
                 <w:rStyle w:val="Hyperlink"/>
@@ -2539,7 +2835,7 @@
                 <w:noProof/>
                 <w:webHidden/>
               </w:rPr>
-              <w:instrText xml:space="preserve"> PAGEREF _Toc236150095 \h </w:instrText>
+              <w:instrText xml:space="preserve"> PAGEREF _Toc236169805 \h </w:instrText>
             </w:r>
             <w:r>
               <w:rPr>
@@ -2559,7 +2855,7 @@
                 <w:noProof/>
                 <w:webHidden/>
               </w:rPr>
-              <w:t>20</w:t>
+              <w:t>21</w:t>
             </w:r>
             <w:r>
               <w:rPr>
@@ -2581,7 +2877,7 @@
               <w:noProof/>
             </w:rPr>
           </w:pPr>
-          <w:hyperlink w:anchor="_Toc236150096" w:history="1">
+          <w:hyperlink w:anchor="_Toc236169806" w:history="1">
             <w:r>
               <w:rPr>
                 <w:rStyle w:val="Hyperlink"/>
@@ -2609,7 +2905,7 @@
                 <w:noProof/>
                 <w:webHidden/>
               </w:rPr>
-              <w:instrText xml:space="preserve"> PAGEREF _Toc236150096 \h </w:instrText>
+              <w:instrText xml:space="preserve"> PAGEREF _Toc236169806 \h </w:instrText>
             </w:r>
             <w:r>
               <w:rPr>
@@ -2629,7 +2925,7 @@
                 <w:noProof/>
                 <w:webHidden/>
               </w:rPr>
-              <w:t>20</w:t>
+              <w:t>21</w:t>
             </w:r>
             <w:r>
               <w:rPr>
@@ -2651,7 +2947,7 @@
               <w:noProof/>
             </w:rPr>
           </w:pPr>
-          <w:hyperlink w:anchor="_Toc236150097" w:history="1">
+          <w:hyperlink w:anchor="_Toc236169807" w:history="1">
             <w:r>
               <w:rPr>
                 <w:rStyle w:val="Hyperlink"/>
@@ -2679,7 +2975,7 @@
                 <w:noProof/>
                 <w:webHidden/>
               </w:rPr>
-              <w:instrText xml:space="preserve"> PAGEREF _Toc236150097 \h </w:instrText>
+              <w:instrText xml:space="preserve"> PAGEREF _Toc236169807 \h </w:instrText>
             </w:r>
             <w:r>
               <w:rPr>
@@ -2699,7 +2995,7 @@
                 <w:noProof/>
                 <w:webHidden/>
               </w:rPr>
-              <w:t>20</w:t>
+              <w:t>21</w:t>
             </w:r>
             <w:r>
               <w:rPr>
@@ -2721,7 +3017,7 @@
               <w:noProof/>
             </w:rPr>
           </w:pPr>
-          <w:hyperlink w:anchor="_Toc236150098" w:history="1">
+          <w:hyperlink w:anchor="_Toc236169808" w:history="1">
             <w:r>
               <w:rPr>
                 <w:rStyle w:val="Hyperlink"/>
@@ -2749,7 +3045,7 @@
                 <w:noProof/>
                 <w:webHidden/>
               </w:rPr>
-              <w:instrText xml:space="preserve"> PAGEREF _Toc236150098 \h </w:instrText>
+              <w:instrText xml:space="preserve"> PAGEREF _Toc236169808 \h </w:instrText>
             </w:r>
             <w:r>
               <w:rPr>
@@ -2769,7 +3065,7 @@
                 <w:noProof/>
                 <w:webHidden/>
               </w:rPr>
-              <w:t>20</w:t>
+              <w:t>21</w:t>
             </w:r>
             <w:r>
               <w:rPr>
@@ -2791,7 +3087,7 @@
               <w:noProof/>
             </w:rPr>
           </w:pPr>
-          <w:hyperlink w:anchor="_Toc236150099" w:history="1">
+          <w:hyperlink w:anchor="_Toc236169809" w:history="1">
             <w:r>
               <w:rPr>
                 <w:rStyle w:val="Hyperlink"/>
@@ -2819,7 +3115,7 @@
                 <w:noProof/>
                 <w:webHidden/>
               </w:rPr>
-              <w:instrText xml:space="preserve"> PAGEREF _Toc236150099 \h </w:instrText>
+              <w:instrText xml:space="preserve"> PAGEREF _Toc236169809 \h </w:instrText>
             </w:r>
             <w:r>
               <w:rPr>
@@ -2839,7 +3135,7 @@
                 <w:noProof/>
                 <w:webHidden/>
               </w:rPr>
-              <w:t>20</w:t>
+              <w:t>21</w:t>
             </w:r>
             <w:r>
               <w:rPr>
@@ -2861,7 +3157,7 @@
               <w:noProof/>
             </w:rPr>
           </w:pPr>
-          <w:hyperlink w:anchor="_Toc236150100" w:history="1">
+          <w:hyperlink w:anchor="_Toc236169810" w:history="1">
             <w:r>
               <w:rPr>
                 <w:rStyle w:val="Hyperlink"/>
@@ -2889,7 +3185,7 @@
                 <w:noProof/>
                 <w:webHidden/>
               </w:rPr>
-              <w:instrText xml:space="preserve"> PAGEREF _Toc236150100 \h </w:instrText>
+              <w:instrText xml:space="preserve"> PAGEREF _Toc236169810 \h </w:instrText>
             </w:r>
             <w:r>
               <w:rPr>
@@ -2909,7 +3205,7 @@
                 <w:noProof/>
                 <w:webHidden/>
               </w:rPr>
-              <w:t>21</w:t>
+              <w:t>22</w:t>
             </w:r>
             <w:r>
               <w:rPr>
@@ -2931,7 +3227,7 @@
               <w:noProof/>
             </w:rPr>
           </w:pPr>
-          <w:hyperlink w:anchor="_Toc236150101" w:history="1">
+          <w:hyperlink w:anchor="_Toc236169811" w:history="1">
             <w:r>
               <w:rPr>
                 <w:rStyle w:val="Hyperlink"/>
@@ -2959,7 +3255,7 @@
                 <w:noProof/>
                 <w:webHidden/>
               </w:rPr>
-              <w:instrText xml:space="preserve"> PAGEREF _Toc236150101 \h </w:instrText>
+              <w:instrText xml:space="preserve"> PAGEREF _Toc236169811 \h </w:instrText>
             </w:r>
             <w:r>
               <w:rPr>
@@ -2979,7 +3275,7 @@
                 <w:noProof/>
                 <w:webHidden/>
               </w:rPr>
-              <w:t>22</w:t>
+              <w:t>23</w:t>
             </w:r>
             <w:r>
               <w:rPr>
@@ -3001,7 +3297,7 @@
               <w:noProof/>
             </w:rPr>
           </w:pPr>
-          <w:hyperlink w:anchor="_Toc236150102" w:history="1">
+          <w:hyperlink w:anchor="_Toc236169812" w:history="1">
             <w:r>
               <w:rPr>
                 <w:rStyle w:val="Hyperlink"/>
@@ -3029,7 +3325,7 @@
                 <w:noProof/>
                 <w:webHidden/>
               </w:rPr>
-              <w:instrText xml:space="preserve"> PAGEREF _Toc236150102 \h </w:instrText>
+              <w:instrText xml:space="preserve"> PAGEREF _Toc236169812 \h </w:instrText>
             </w:r>
             <w:r>
               <w:rPr>
@@ -3049,7 +3345,7 @@
                 <w:noProof/>
                 <w:webHidden/>
               </w:rPr>
-              <w:t>22</w:t>
+              <w:t>23</w:t>
             </w:r>
             <w:r>
               <w:rPr>
@@ -3071,7 +3367,7 @@
               <w:noProof/>
             </w:rPr>
           </w:pPr>
-          <w:hyperlink w:anchor="_Toc236150103" w:history="1">
+          <w:hyperlink w:anchor="_Toc236169813" w:history="1">
             <w:r>
               <w:rPr>
                 <w:rStyle w:val="Hyperlink"/>
@@ -3099,7 +3395,7 @@
                 <w:noProof/>
                 <w:webHidden/>
               </w:rPr>
-              <w:instrText xml:space="preserve"> PAGEREF _Toc236150103 \h </w:instrText>
+              <w:instrText xml:space="preserve"> PAGEREF _Toc236169813 \h </w:instrText>
             </w:r>
             <w:r>
               <w:rPr>
@@ -3119,7 +3415,7 @@
                 <w:noProof/>
                 <w:webHidden/>
               </w:rPr>
-              <w:t>28</w:t>
+              <w:t>29</w:t>
             </w:r>
             <w:r>
               <w:rPr>
@@ -3141,7 +3437,7 @@
               <w:noProof/>
             </w:rPr>
           </w:pPr>
-          <w:hyperlink w:anchor="_Toc236150104" w:history="1">
+          <w:hyperlink w:anchor="_Toc236169814" w:history="1">
             <w:r>
               <w:rPr>
                 <w:rStyle w:val="Hyperlink"/>
@@ -3169,7 +3465,7 @@
                 <w:noProof/>
                 <w:webHidden/>
               </w:rPr>
-              <w:instrText xml:space="preserve"> PAGEREF _Toc236150104 \h </w:instrText>
+              <w:instrText xml:space="preserve"> PAGEREF _Toc236169814 \h </w:instrText>
             </w:r>
             <w:r>
               <w:rPr>
@@ -3189,7 +3485,7 @@
                 <w:noProof/>
                 <w:webHidden/>
               </w:rPr>
-              <w:t>31</w:t>
+              <w:t>32</w:t>
             </w:r>
             <w:r>
               <w:rPr>
@@ -3211,7 +3507,7 @@
               <w:noProof/>
             </w:rPr>
           </w:pPr>
-          <w:hyperlink w:anchor="_Toc236150105" w:history="1">
+          <w:hyperlink w:anchor="_Toc236169815" w:history="1">
             <w:r>
               <w:rPr>
                 <w:rStyle w:val="Hyperlink"/>
@@ -3239,7 +3535,7 @@
                 <w:noProof/>
                 <w:webHidden/>
               </w:rPr>
-              <w:instrText xml:space="preserve"> PAGEREF _Toc236150105 \h </w:instrText>
+              <w:instrText xml:space="preserve"> PAGEREF _Toc236169815 \h </w:instrText>
             </w:r>
             <w:r>
               <w:rPr>
@@ -3259,7 +3555,7 @@
                 <w:noProof/>
                 <w:webHidden/>
               </w:rPr>
-              <w:t>34</w:t>
+              <w:t>35</w:t>
             </w:r>
             <w:r>
               <w:rPr>
@@ -3281,7 +3577,7 @@
               <w:noProof/>
             </w:rPr>
           </w:pPr>
-          <w:hyperlink w:anchor="_Toc236150106" w:history="1">
+          <w:hyperlink w:anchor="_Toc236169816" w:history="1">
             <w:r>
               <w:rPr>
                 <w:rStyle w:val="Hyperlink"/>
@@ -3309,7 +3605,7 @@
                 <w:noProof/>
                 <w:webHidden/>
               </w:rPr>
-              <w:instrText xml:space="preserve"> PAGEREF _Toc236150106 \h </w:instrText>
+              <w:instrText xml:space="preserve"> PAGEREF _Toc236169816 \h </w:instrText>
             </w:r>
             <w:r>
               <w:rPr>
@@ -3329,7 +3625,7 @@
                 <w:noProof/>
                 <w:webHidden/>
               </w:rPr>
-              <w:t>35</w:t>
+              <w:t>36</w:t>
             </w:r>
             <w:r>
               <w:rPr>
@@ -3351,7 +3647,7 @@
               <w:noProof/>
             </w:rPr>
           </w:pPr>
-          <w:hyperlink w:anchor="_Toc236150107" w:history="1">
+          <w:hyperlink w:anchor="_Toc236169817" w:history="1">
             <w:r>
               <w:rPr>
                 <w:rStyle w:val="Hyperlink"/>
@@ -3379,7 +3675,7 @@
                 <w:noProof/>
                 <w:webHidden/>
               </w:rPr>
-              <w:instrText xml:space="preserve"> PAGEREF _Toc236150107 \h </w:instrText>
+              <w:instrText xml:space="preserve"> PAGEREF _Toc236169817 \h </w:instrText>
             </w:r>
             <w:r>
               <w:rPr>
@@ -3399,7 +3695,7 @@
                 <w:noProof/>
                 <w:webHidden/>
               </w:rPr>
-              <w:t>36</w:t>
+              <w:t>37</w:t>
             </w:r>
             <w:r>
               <w:rPr>
@@ -3421,7 +3717,7 @@
               <w:noProof/>
             </w:rPr>
           </w:pPr>
-          <w:hyperlink w:anchor="_Toc236150108" w:history="1">
+          <w:hyperlink w:anchor="_Toc236169818" w:history="1">
             <w:r>
               <w:rPr>
                 <w:rStyle w:val="Hyperlink"/>
@@ -3449,7 +3745,7 @@
                 <w:noProof/>
                 <w:webHidden/>
               </w:rPr>
-              <w:instrText xml:space="preserve"> PAGEREF _Toc236150108 \h </w:instrText>
+              <w:instrText xml:space="preserve"> PAGEREF _Toc236169818 \h </w:instrText>
             </w:r>
             <w:r>
               <w:rPr>
@@ -3469,7 +3765,7 @@
                 <w:noProof/>
                 <w:webHidden/>
               </w:rPr>
-              <w:t>37</w:t>
+              <w:t>38</w:t>
             </w:r>
             <w:r>
               <w:rPr>
@@ -3491,7 +3787,7 @@
               <w:noProof/>
             </w:rPr>
           </w:pPr>
-          <w:hyperlink w:anchor="_Toc236150109" w:history="1">
+          <w:hyperlink w:anchor="_Toc236169819" w:history="1">
             <w:r>
               <w:rPr>
                 <w:rStyle w:val="Hyperlink"/>
@@ -3519,7 +3815,7 @@
                 <w:noProof/>
                 <w:webHidden/>
               </w:rPr>
-              <w:instrText xml:space="preserve"> PAGEREF _Toc236150109 \h </w:instrText>
+              <w:instrText xml:space="preserve"> PAGEREF _Toc236169819 \h </w:instrText>
             </w:r>
             <w:r>
               <w:rPr>
@@ -3539,7 +3835,7 @@
                 <w:noProof/>
                 <w:webHidden/>
               </w:rPr>
-              <w:t>37</w:t>
+              <w:t>38</w:t>
             </w:r>
             <w:r>
               <w:rPr>
@@ -3561,7 +3857,7 @@
               <w:noProof/>
             </w:rPr>
           </w:pPr>
-          <w:hyperlink w:anchor="_Toc236150110" w:history="1">
+          <w:hyperlink w:anchor="_Toc236169820" w:history="1">
             <w:r>
               <w:rPr>
                 <w:rStyle w:val="Hyperlink"/>
@@ -3589,7 +3885,7 @@
                 <w:noProof/>
                 <w:webHidden/>
               </w:rPr>
-              <w:instrText xml:space="preserve"> PAGEREF _Toc236150110 \h </w:instrText>
+              <w:instrText xml:space="preserve"> PAGEREF _Toc236169820 \h </w:instrText>
             </w:r>
             <w:r>
               <w:rPr>
@@ -3609,7 +3905,7 @@
                 <w:noProof/>
                 <w:webHidden/>
               </w:rPr>
-              <w:t>37</w:t>
+              <w:t>38</w:t>
             </w:r>
             <w:r>
               <w:rPr>
@@ -3631,7 +3927,7 @@
               <w:noProof/>
             </w:rPr>
           </w:pPr>
-          <w:hyperlink w:anchor="_Toc236150111" w:history="1">
+          <w:hyperlink w:anchor="_Toc236169821" w:history="1">
             <w:r>
               <w:rPr>
                 <w:rStyle w:val="Hyperlink"/>
@@ -3659,7 +3955,7 @@
                 <w:noProof/>
                 <w:webHidden/>
               </w:rPr>
-              <w:instrText xml:space="preserve"> PAGEREF _Toc236150111 \h </w:instrText>
+              <w:instrText xml:space="preserve"> PAGEREF _Toc236169821 \h </w:instrText>
             </w:r>
             <w:r>
               <w:rPr>
@@ -3679,7 +3975,7 @@
                 <w:noProof/>
                 <w:webHidden/>
               </w:rPr>
-              <w:t>39</w:t>
+              <w:t>40</w:t>
             </w:r>
             <w:r>
               <w:rPr>
@@ -3701,7 +3997,7 @@
               <w:noProof/>
             </w:rPr>
           </w:pPr>
-          <w:hyperlink w:anchor="_Toc236150112" w:history="1">
+          <w:hyperlink w:anchor="_Toc236169822" w:history="1">
             <w:r>
               <w:rPr>
                 <w:rStyle w:val="Hyperlink"/>
@@ -3729,7 +4025,7 @@
                 <w:noProof/>
                 <w:webHidden/>
               </w:rPr>
-              <w:instrText xml:space="preserve"> PAGEREF _Toc236150112 \h </w:instrText>
+              <w:instrText xml:space="preserve"> PAGEREF _Toc236169822 \h </w:instrText>
             </w:r>
             <w:r>
               <w:rPr>
@@ -3749,7 +4045,7 @@
                 <w:noProof/>
                 <w:webHidden/>
               </w:rPr>
-              <w:t>39</w:t>
+              <w:t>40</w:t>
             </w:r>
             <w:r>
               <w:rPr>
@@ -3771,7 +4067,7 @@
               <w:noProof/>
             </w:rPr>
           </w:pPr>
-          <w:hyperlink w:anchor="_Toc236150113" w:history="1">
+          <w:hyperlink w:anchor="_Toc236169823" w:history="1">
             <w:r>
               <w:rPr>
                 <w:rStyle w:val="Hyperlink"/>
@@ -3799,7 +4095,7 @@
                 <w:noProof/>
                 <w:webHidden/>
               </w:rPr>
-              <w:instrText xml:space="preserve"> PAGEREF _Toc236150113 \h </w:instrText>
+              <w:instrText xml:space="preserve"> PAGEREF _Toc236169823 \h </w:instrText>
             </w:r>
             <w:r>
               <w:rPr>
@@ -3819,7 +4115,7 @@
                 <w:noProof/>
                 <w:webHidden/>
               </w:rPr>
-              <w:t>40</w:t>
+              <w:t>41</w:t>
             </w:r>
             <w:r>
               <w:rPr>
@@ -3841,7 +4137,7 @@
               <w:noProof/>
             </w:rPr>
           </w:pPr>
-          <w:hyperlink w:anchor="_Toc236150114" w:history="1">
+          <w:hyperlink w:anchor="_Toc236169824" w:history="1">
             <w:r>
               <w:rPr>
                 <w:rStyle w:val="Hyperlink"/>
@@ -3869,7 +4165,7 @@
                 <w:noProof/>
                 <w:webHidden/>
               </w:rPr>
-              <w:instrText xml:space="preserve"> PAGEREF _Toc236150114 \h </w:instrText>
+              <w:instrText xml:space="preserve"> PAGEREF _Toc236169824 \h </w:instrText>
             </w:r>
             <w:r>
               <w:rPr>
@@ -3889,7 +4185,7 @@
                 <w:noProof/>
                 <w:webHidden/>
               </w:rPr>
-              <w:t>45</w:t>
+              <w:t>46</w:t>
             </w:r>
             <w:r>
               <w:rPr>
@@ -3911,7 +4207,7 @@
               <w:noProof/>
             </w:rPr>
           </w:pPr>
-          <w:hyperlink w:anchor="_Toc236150115" w:history="1">
+          <w:hyperlink w:anchor="_Toc236169825" w:history="1">
             <w:r>
               <w:rPr>
                 <w:rStyle w:val="Hyperlink"/>
@@ -3939,7 +4235,7 @@
                 <w:noProof/>
                 <w:webHidden/>
               </w:rPr>
-              <w:instrText xml:space="preserve"> PAGEREF _Toc236150115 \h </w:instrText>
+              <w:instrText xml:space="preserve"> PAGEREF _Toc236169825 \h </w:instrText>
             </w:r>
             <w:r>
               <w:rPr>
@@ -3959,7 +4255,7 @@
                 <w:noProof/>
                 <w:webHidden/>
               </w:rPr>
-              <w:t>45</w:t>
+              <w:t>46</w:t>
             </w:r>
             <w:r>
               <w:rPr>
@@ -3995,7 +4291,7 @@
       <w:r>
         <w:br w:type="page"/>
       </w:r>
-      <w:bookmarkStart w:id="5" w:name="_Toc236150072"/>
+      <w:bookmarkStart w:id="5" w:name="_Toc236169778"/>
       <w:r>
         <w:rPr>
           <w:rFonts w:ascii="Times New Roman" w:hAnsi="Times New Roman" w:cs="Times New Roman"/>
@@ -5811,7 +6107,7 @@
           <w:rFonts w:ascii="Times New Roman" w:hAnsi="Times New Roman" w:cs="Times New Roman"/>
         </w:rPr>
       </w:pPr>
-      <w:bookmarkStart w:id="6" w:name="_Toc236150073"/>
+      <w:bookmarkStart w:id="6" w:name="_Toc236169779"/>
       <w:r>
         <w:rPr>
           <w:rFonts w:ascii="Times New Roman" w:hAnsi="Times New Roman" w:cs="Times New Roman"/>
@@ -7045,12 +7341,49 @@
       <w:r>
         <w:fldChar w:fldCharType="end"/>
       </w:r>
-      <w:fldSimple w:instr=" TOC \h \z \c &quot;Bảng&quot; "/>
-      <w:fldSimple w:instr=" TOC \h \z \c &quot;Bảng&quot; "/>
+      <w:r>
+        <w:fldChar w:fldCharType="begin"/>
+      </w:r>
+      <w:r>
+        <w:instrText xml:space="preserve"> TOC \h \z \c "B</w:instrText>
+      </w:r>
+      <w:r>
+        <w:instrText>ả</w:instrText>
+      </w:r>
+      <w:r>
+        <w:instrText xml:space="preserve">ng" </w:instrText>
+      </w:r>
+      <w:r>
+        <w:fldChar w:fldCharType="separate"/>
+      </w:r>
+      <w:r>
+        <w:fldChar w:fldCharType="end"/>
+      </w:r>
+      <w:r>
+        <w:fldChar w:fldCharType="begin"/>
+      </w:r>
+      <w:r>
+        <w:instrText xml:space="preserve"> TOC</w:instrText>
+      </w:r>
+      <w:r>
+        <w:instrText xml:space="preserve"> \h \z \c "B</w:instrText>
+      </w:r>
+      <w:r>
+        <w:instrText>ả</w:instrText>
+      </w:r>
+      <w:r>
+        <w:instrText xml:space="preserve">ng" </w:instrText>
+      </w:r>
+      <w:r>
+        <w:fldChar w:fldCharType="separate"/>
+      </w:r>
+      <w:r>
+        <w:fldChar w:fldCharType="end"/>
+      </w:r>
       <w:r>
         <w:br w:type="page"/>
       </w:r>
-      <w:bookmarkStart w:id="7" w:name="_Toc236150074"/>
+      <w:bookmarkStart w:id="7" w:name="_Toc236169780"/>
       <w:r>
         <w:rPr>
           <w:rFonts w:ascii="Times New Roman" w:hAnsi="Times New Roman" w:cs="Times New Roman"/>
@@ -7399,7 +7732,7 @@
         </w:rPr>
       </w:pPr>
       <w:bookmarkStart w:id="8" w:name="_Toc235563700"/>
-      <w:bookmarkStart w:id="9" w:name="_Toc236150075"/>
+      <w:bookmarkStart w:id="9" w:name="_Toc236169781"/>
       <w:r>
         <w:rPr>
           <w:rFonts w:ascii="Times New Roman" w:hAnsi="Times New Roman" w:cs="Times New Roman"/>
@@ -7418,7 +7751,7 @@
         </w:rPr>
       </w:pPr>
       <w:bookmarkStart w:id="10" w:name="_Toc235563701"/>
-      <w:bookmarkStart w:id="11" w:name="_Toc236150076"/>
+      <w:bookmarkStart w:id="11" w:name="_Toc236169782"/>
       <w:r>
         <w:rPr>
           <w:rFonts w:ascii="Times New Roman" w:hAnsi="Times New Roman" w:cs="Times New Roman"/>
@@ -7455,38 +7788,42 @@
     <w:p>
       <w:pPr>
         <w:pStyle w:val="Heading2"/>
-        <w:spacing w:line="360" w:lineRule="auto"/>
-        <w:rPr>
-          <w:rFonts w:ascii="Times New Roman" w:hAnsi="Times New Roman" w:cs="Times New Roman"/>
-        </w:rPr>
-      </w:pPr>
-      <w:bookmarkStart w:id="12" w:name="_Toc235563702"/>
-      <w:bookmarkStart w:id="13" w:name="_Toc236150077"/>
-      <w:r>
-        <w:rPr>
-          <w:rFonts w:ascii="Times New Roman" w:hAnsi="Times New Roman" w:cs="Times New Roman"/>
-        </w:rPr>
-        <w:t>Ý NGHĨA</w:t>
+        <w:rPr>
+          <w:rFonts w:ascii="Times New Roman" w:hAnsi="Times New Roman" w:cs="Times New Roman"/>
+        </w:rPr>
+      </w:pPr>
+      <w:bookmarkStart w:id="12" w:name="_Toc236169783"/>
+      <w:r>
+        <w:rPr>
+          <w:rFonts w:ascii="Times New Roman" w:hAnsi="Times New Roman" w:cs="Times New Roman"/>
+        </w:rPr>
+        <w:t>MỤC TIÊU</w:t>
       </w:r>
       <w:bookmarkEnd w:id="12"/>
-      <w:bookmarkEnd w:id="13"/>
-    </w:p>
-    <w:p>
-      <w:pPr>
-        <w:spacing w:line="360" w:lineRule="auto"/>
-        <w:rPr>
-          <w:rFonts w:ascii="Times New Roman" w:hAnsi="Times New Roman" w:cs="Times New Roman"/>
-          <w:sz w:val="26"/>
-          <w:szCs w:val="26"/>
-        </w:rPr>
-      </w:pPr>
-      <w:r>
-        <w:rPr>
-          <w:rFonts w:ascii="Times New Roman" w:hAnsi="Times New Roman" w:cs="Times New Roman"/>
-          <w:sz w:val="26"/>
-          <w:szCs w:val="26"/>
-        </w:rPr>
-        <w:t>Hệ thống CRM giúp doanh nghiệp xây dựng trải nghiệm khách hàng bền vững và tăng khả năng giữ chân khách hàng. Sử dụng mô hình CRM tích hợp hiện đại kết nối dữ liệu từ nhiều bộ phận, việc tích hợp này rất phù hợp cho các doanh nghiệp vừa và nhỏ để tiết kiệm chi phí, rút ngắn quy trình và tăng tương tác phản hồi đối với khách hàng.</w:t>
+    </w:p>
+    <w:p>
+      <w:pPr>
+        <w:rPr>
+          <w:rFonts w:ascii="Times New Roman" w:hAnsi="Times New Roman" w:cs="Times New Roman"/>
+          <w:sz w:val="26"/>
+          <w:szCs w:val="26"/>
+        </w:rPr>
+      </w:pPr>
+      <w:r>
+        <w:rPr>
+          <w:rFonts w:ascii="Times New Roman" w:hAnsi="Times New Roman" w:cs="Times New Roman"/>
+          <w:sz w:val="26"/>
+          <w:szCs w:val="26"/>
+        </w:rPr>
+        <w:t xml:space="preserve">Xây dựng một hệ thống CRM hỗ trợ các doanh nghiệp nhỏ quản lý khách hàng, khách hàng tiềm năng, các quy trình bán hàng và báo giá nhắm nâng cao tính hiệu quả trong suốt quá trình bán hàng, can thiệp kịp thời các vấn đề mà khách hàng gặp phải. Hỗ trợ phân quyền người dùng giúp </w:t>
+      </w:r>
+      <w:r>
+        <w:rPr>
+          <w:rFonts w:ascii="Times New Roman" w:hAnsi="Times New Roman" w:cs="Times New Roman"/>
+          <w:sz w:val="26"/>
+          <w:szCs w:val="26"/>
+        </w:rPr>
+        <w:t>bảo mật thông tin và tránh bị trùng lập công việc. Xây dựng Dashboard giao diện để tổng hợp các chỉ số cho người quản lý cập nhật hiện trạng của doanh nghiệp và hỗ trợ ra quyết định.</w:t>
       </w:r>
     </w:p>
     <w:p>
@@ -7497,16 +7834,53 @@
           <w:rFonts w:ascii="Times New Roman" w:hAnsi="Times New Roman" w:cs="Times New Roman"/>
         </w:rPr>
       </w:pPr>
-      <w:bookmarkStart w:id="14" w:name="_Toc235563703"/>
-      <w:bookmarkStart w:id="15" w:name="_Toc236150078"/>
+      <w:bookmarkStart w:id="13" w:name="_Toc235563702"/>
+      <w:bookmarkStart w:id="14" w:name="_Toc236169784"/>
+      <w:r>
+        <w:rPr>
+          <w:rFonts w:ascii="Times New Roman" w:hAnsi="Times New Roman" w:cs="Times New Roman"/>
+        </w:rPr>
+        <w:t>Ý NGHĨA</w:t>
+      </w:r>
+      <w:bookmarkEnd w:id="13"/>
+      <w:bookmarkEnd w:id="14"/>
+    </w:p>
+    <w:p>
+      <w:pPr>
+        <w:spacing w:line="360" w:lineRule="auto"/>
+        <w:rPr>
+          <w:rFonts w:ascii="Times New Roman" w:hAnsi="Times New Roman" w:cs="Times New Roman"/>
+          <w:sz w:val="26"/>
+          <w:szCs w:val="26"/>
+        </w:rPr>
+      </w:pPr>
+      <w:r>
+        <w:rPr>
+          <w:rFonts w:ascii="Times New Roman" w:hAnsi="Times New Roman" w:cs="Times New Roman"/>
+          <w:sz w:val="26"/>
+          <w:szCs w:val="26"/>
+        </w:rPr>
+        <w:t>Hệ thống CRM giúp doanh nghiệp xây dựng trải nghiệm khách hàng bền vững và tăng khả năng giữ chân khách hàng. Sử dụng mô hình CRM tích hợp hiện đại kết nối dữ liệu từ nhiều bộ phận, việc tích hợp này rất phù hợp cho các doanh nghiệp vừa và nhỏ để tiết kiệm chi phí, rút ngắn quy trình và tăng tương tác phản hồi đối với khách hàng.</w:t>
+      </w:r>
+    </w:p>
+    <w:p>
+      <w:pPr>
+        <w:pStyle w:val="Heading2"/>
+        <w:spacing w:line="360" w:lineRule="auto"/>
+        <w:rPr>
+          <w:rFonts w:ascii="Times New Roman" w:hAnsi="Times New Roman" w:cs="Times New Roman"/>
+        </w:rPr>
+      </w:pPr>
+      <w:bookmarkStart w:id="15" w:name="_Toc235563703"/>
+      <w:bookmarkStart w:id="16" w:name="_Toc236169785"/>
       <w:r>
         <w:rPr>
           <w:rFonts w:ascii="Times New Roman" w:hAnsi="Times New Roman" w:cs="Times New Roman"/>
         </w:rPr>
         <w:t>PHẠM VI VÀ CHỨC NĂNG CHÍNH</w:t>
       </w:r>
-      <w:bookmarkEnd w:id="14"/>
       <w:bookmarkEnd w:id="15"/>
+      <w:bookmarkEnd w:id="16"/>
     </w:p>
     <w:p>
       <w:pPr>
@@ -7620,6 +7994,7 @@
           <w:sz w:val="26"/>
           <w:szCs w:val="26"/>
         </w:rPr>
+        <w:lastRenderedPageBreak/>
         <w:t>Nhắc việc và thông báo: nhắc lịch chăm sóc, deal sắp đến hạn, thông báo khi được phân công.</w:t>
       </w:r>
     </w:p>
@@ -7677,17 +8052,204 @@
           <w:rFonts w:ascii="Times New Roman" w:hAnsi="Times New Roman" w:cs="Times New Roman"/>
         </w:rPr>
       </w:pPr>
-      <w:bookmarkStart w:id="16" w:name="_Toc235563704"/>
-      <w:bookmarkStart w:id="17" w:name="_Toc236150079"/>
-      <w:r>
-        <w:rPr>
-          <w:rFonts w:ascii="Times New Roman" w:hAnsi="Times New Roman" w:cs="Times New Roman"/>
-        </w:rPr>
-        <w:lastRenderedPageBreak/>
+      <w:bookmarkStart w:id="17" w:name="_Toc235563704"/>
+      <w:bookmarkStart w:id="18" w:name="_Toc236169786"/>
+      <w:r>
+        <w:rPr>
+          <w:rFonts w:ascii="Times New Roman" w:hAnsi="Times New Roman" w:cs="Times New Roman"/>
+        </w:rPr>
+        <w:t>PHẠM VI NGOÀI</w:t>
+      </w:r>
+      <w:bookmarkEnd w:id="18"/>
+    </w:p>
+    <w:p>
+      <w:pPr>
+        <w:rPr>
+          <w:rFonts w:ascii="Times New Roman" w:hAnsi="Times New Roman" w:cs="Times New Roman"/>
+          <w:sz w:val="26"/>
+          <w:szCs w:val="26"/>
+        </w:rPr>
+      </w:pPr>
+      <w:r>
+        <w:rPr>
+          <w:rFonts w:ascii="Times New Roman" w:hAnsi="Times New Roman" w:cs="Times New Roman"/>
+          <w:sz w:val="26"/>
+          <w:szCs w:val="26"/>
+        </w:rPr>
+        <w:t>Hệ thống không được tích hợp các chức năng như:</w:t>
+      </w:r>
+    </w:p>
+    <w:p>
+      <w:pPr>
+        <w:pStyle w:val="ListParagraph"/>
+        <w:numPr>
+          <w:ilvl w:val="0"/>
+          <w:numId w:val="43"/>
+        </w:numPr>
+        <w:rPr>
+          <w:rFonts w:ascii="Times New Roman" w:hAnsi="Times New Roman" w:cs="Times New Roman"/>
+          <w:sz w:val="26"/>
+          <w:szCs w:val="26"/>
+        </w:rPr>
+      </w:pPr>
+      <w:r>
+        <w:rPr>
+          <w:rFonts w:ascii="Times New Roman" w:hAnsi="Times New Roman" w:cs="Times New Roman"/>
+          <w:sz w:val="26"/>
+          <w:szCs w:val="26"/>
+        </w:rPr>
+        <w:t>Thanh toán trực tuyến</w:t>
+      </w:r>
+    </w:p>
+    <w:p>
+      <w:pPr>
+        <w:pStyle w:val="ListParagraph"/>
+        <w:numPr>
+          <w:ilvl w:val="0"/>
+          <w:numId w:val="43"/>
+        </w:numPr>
+        <w:rPr>
+          <w:rFonts w:ascii="Times New Roman" w:hAnsi="Times New Roman" w:cs="Times New Roman"/>
+          <w:sz w:val="26"/>
+          <w:szCs w:val="26"/>
+        </w:rPr>
+      </w:pPr>
+      <w:r>
+        <w:rPr>
+          <w:rFonts w:ascii="Times New Roman" w:hAnsi="Times New Roman" w:cs="Times New Roman"/>
+          <w:sz w:val="26"/>
+          <w:szCs w:val="26"/>
+        </w:rPr>
+        <w:t>Tích hợp Email Marketing</w:t>
+      </w:r>
+    </w:p>
+    <w:p>
+      <w:pPr>
+        <w:pStyle w:val="ListParagraph"/>
+        <w:numPr>
+          <w:ilvl w:val="0"/>
+          <w:numId w:val="43"/>
+        </w:numPr>
+        <w:rPr>
+          <w:rFonts w:ascii="Times New Roman" w:hAnsi="Times New Roman" w:cs="Times New Roman"/>
+          <w:sz w:val="26"/>
+          <w:szCs w:val="26"/>
+        </w:rPr>
+      </w:pPr>
+      <w:r>
+        <w:rPr>
+          <w:rFonts w:ascii="Times New Roman" w:hAnsi="Times New Roman" w:cs="Times New Roman"/>
+          <w:sz w:val="26"/>
+          <w:szCs w:val="26"/>
+        </w:rPr>
+        <w:t>AI Chatbot</w:t>
+      </w:r>
+    </w:p>
+    <w:p>
+      <w:pPr>
+        <w:pStyle w:val="ListParagraph"/>
+        <w:numPr>
+          <w:ilvl w:val="0"/>
+          <w:numId w:val="43"/>
+        </w:numPr>
+        <w:rPr>
+          <w:rFonts w:ascii="Times New Roman" w:hAnsi="Times New Roman" w:cs="Times New Roman"/>
+          <w:sz w:val="26"/>
+          <w:szCs w:val="26"/>
+        </w:rPr>
+      </w:pPr>
+      <w:r>
+        <w:rPr>
+          <w:rFonts w:ascii="Times New Roman" w:hAnsi="Times New Roman" w:cs="Times New Roman"/>
+          <w:sz w:val="26"/>
+          <w:szCs w:val="26"/>
+        </w:rPr>
+        <w:t>Machine Learning dùng để dự báo doanh số</w:t>
+      </w:r>
+    </w:p>
+    <w:p>
+      <w:pPr>
+        <w:pStyle w:val="ListParagraph"/>
+        <w:numPr>
+          <w:ilvl w:val="0"/>
+          <w:numId w:val="43"/>
+        </w:numPr>
+        <w:rPr>
+          <w:rFonts w:ascii="Times New Roman" w:hAnsi="Times New Roman" w:cs="Times New Roman"/>
+          <w:sz w:val="26"/>
+          <w:szCs w:val="26"/>
+        </w:rPr>
+      </w:pPr>
+      <w:r>
+        <w:rPr>
+          <w:rFonts w:ascii="Times New Roman" w:hAnsi="Times New Roman" w:cs="Times New Roman"/>
+          <w:sz w:val="26"/>
+          <w:szCs w:val="26"/>
+        </w:rPr>
+        <w:t>Tích hợp SMS</w:t>
+      </w:r>
+    </w:p>
+    <w:p>
+      <w:pPr>
+        <w:pStyle w:val="ListParagraph"/>
+        <w:numPr>
+          <w:ilvl w:val="0"/>
+          <w:numId w:val="43"/>
+        </w:numPr>
+        <w:rPr>
+          <w:rFonts w:ascii="Times New Roman" w:hAnsi="Times New Roman" w:cs="Times New Roman"/>
+          <w:sz w:val="26"/>
+          <w:szCs w:val="26"/>
+        </w:rPr>
+      </w:pPr>
+      <w:r>
+        <w:rPr>
+          <w:rFonts w:ascii="Times New Roman" w:hAnsi="Times New Roman" w:cs="Times New Roman"/>
+          <w:sz w:val="26"/>
+          <w:szCs w:val="26"/>
+        </w:rPr>
+        <w:t>Quản lý kho</w:t>
+      </w:r>
+    </w:p>
+    <w:p>
+      <w:pPr>
+        <w:pStyle w:val="ListParagraph"/>
+        <w:numPr>
+          <w:ilvl w:val="0"/>
+          <w:numId w:val="43"/>
+        </w:numPr>
+        <w:rPr>
+          <w:rFonts w:ascii="Times New Roman" w:hAnsi="Times New Roman" w:cs="Times New Roman"/>
+          <w:sz w:val="26"/>
+          <w:szCs w:val="26"/>
+        </w:rPr>
+      </w:pPr>
+      <w:r>
+        <w:rPr>
+          <w:rFonts w:ascii="Times New Roman" w:hAnsi="Times New Roman" w:cs="Times New Roman"/>
+          <w:sz w:val="26"/>
+          <w:szCs w:val="26"/>
+        </w:rPr>
+        <w:t>Đồng bộ với CRM bên thứ ba</w:t>
+      </w:r>
+    </w:p>
+    <w:p>
+      <w:pPr>
+        <w:pStyle w:val="Heading2"/>
+        <w:spacing w:line="360" w:lineRule="auto"/>
+        <w:rPr>
+          <w:rFonts w:ascii="Times New Roman" w:hAnsi="Times New Roman" w:cs="Times New Roman"/>
+        </w:rPr>
+      </w:pPr>
+      <w:bookmarkStart w:id="19" w:name="_Toc236169787"/>
+      <w:r>
+        <w:rPr>
+          <w:rFonts w:ascii="Times New Roman" w:hAnsi="Times New Roman" w:cs="Times New Roman"/>
+        </w:rPr>
         <w:t>ĐỐI TƯỢNG</w:t>
       </w:r>
-      <w:bookmarkEnd w:id="16"/>
       <w:bookmarkEnd w:id="17"/>
+      <w:bookmarkEnd w:id="19"/>
     </w:p>
     <w:p>
       <w:pPr>
@@ -7711,6 +8273,14 @@
         </w:rPr>
         <w:t>Admin: theo dõi thống kê, lập cơ sở dữ liệu về sản phẩm, khách hàng, thiết kế phễu, lập lịch hoặc chiến lượt kinh doanh</w:t>
       </w:r>
+      <w:r>
+        <w:rPr>
+          <w:rFonts w:ascii="Times New Roman" w:hAnsi="Times New Roman" w:cs="Times New Roman"/>
+          <w:sz w:val="26"/>
+          <w:szCs w:val="26"/>
+        </w:rPr>
+        <w:t>.</w:t>
+      </w:r>
     </w:p>
     <w:p>
       <w:pPr>
@@ -7734,6 +8304,14 @@
         </w:rPr>
         <w:t>Sales: tìm kiếm và nhập thông tin khách hàng; tư vấn, giới thiệu và báo giá sản phẩm, theo dõi và cập nhật tiến độ của khách hàng, phân công deal, đặt lịch hẹn</w:t>
       </w:r>
+      <w:r>
+        <w:rPr>
+          <w:rFonts w:ascii="Times New Roman" w:hAnsi="Times New Roman" w:cs="Times New Roman"/>
+          <w:sz w:val="26"/>
+          <w:szCs w:val="26"/>
+        </w:rPr>
+        <w:t>.</w:t>
+      </w:r>
     </w:p>
     <w:p>
       <w:pPr>
@@ -7757,6 +8335,14 @@
         </w:rPr>
         <w:t>Sales manager: phân công Deal, theo dõi Pipeline, Forecast</w:t>
       </w:r>
+      <w:r>
+        <w:rPr>
+          <w:rFonts w:ascii="Times New Roman" w:hAnsi="Times New Roman" w:cs="Times New Roman"/>
+          <w:sz w:val="26"/>
+          <w:szCs w:val="26"/>
+        </w:rPr>
+        <w:t>.</w:t>
+      </w:r>
     </w:p>
     <w:p>
       <w:pPr>
@@ -7780,6 +8366,14 @@
         </w:rPr>
         <w:t>Marketing: chuyển Lead thành Customer, thêm Lead, cập nhật Lead</w:t>
       </w:r>
+      <w:r>
+        <w:rPr>
+          <w:rFonts w:ascii="Times New Roman" w:hAnsi="Times New Roman" w:cs="Times New Roman"/>
+          <w:sz w:val="26"/>
+          <w:szCs w:val="26"/>
+        </w:rPr>
+        <w:t>.</w:t>
+      </w:r>
     </w:p>
     <w:p>
       <w:pPr>
@@ -7803,6 +8397,301 @@
         </w:rPr>
         <w:t>Customer care: tiếp nhận sự cố và phản hồi của khách hàng, xử lý sự cố, chăm sóc khách hàng định kỳ</w:t>
       </w:r>
+      <w:r>
+        <w:rPr>
+          <w:rFonts w:ascii="Times New Roman" w:hAnsi="Times New Roman" w:cs="Times New Roman"/>
+          <w:sz w:val="26"/>
+          <w:szCs w:val="26"/>
+        </w:rPr>
+        <w:t>.</w:t>
+      </w:r>
+    </w:p>
+    <w:p>
+      <w:pPr>
+        <w:pStyle w:val="Heading2"/>
+        <w:rPr>
+          <w:rFonts w:ascii="Times New Roman" w:hAnsi="Times New Roman" w:cs="Times New Roman"/>
+        </w:rPr>
+      </w:pPr>
+      <w:bookmarkStart w:id="20" w:name="_Toc236169788"/>
+      <w:r>
+        <w:rPr>
+          <w:rFonts w:ascii="Times New Roman" w:hAnsi="Times New Roman" w:cs="Times New Roman"/>
+        </w:rPr>
+        <w:t>PHƯƠNG PHÁP NGHIÊN CỨU</w:t>
+      </w:r>
+      <w:bookmarkEnd w:id="20"/>
+    </w:p>
+    <w:p>
+      <w:pPr>
+        <w:spacing w:line="360" w:lineRule="auto"/>
+        <w:rPr>
+          <w:rFonts w:ascii="Times New Roman" w:hAnsi="Times New Roman" w:cs="Times New Roman"/>
+          <w:sz w:val="26"/>
+          <w:szCs w:val="26"/>
+        </w:rPr>
+      </w:pPr>
+      <w:r>
+        <w:rPr>
+          <w:rFonts w:ascii="Times New Roman" w:hAnsi="Times New Roman" w:cs="Times New Roman"/>
+          <w:sz w:val="26"/>
+          <w:szCs w:val="26"/>
+        </w:rPr>
+        <w:t xml:space="preserve">Trong quá trình nghiên cứu đề tài về hệ thống CRM, em đã tìm hiểu về hai hệ thống CRM hiện có </w:t>
+      </w:r>
+      <w:r>
+        <w:rPr>
+          <w:rFonts w:ascii="Times New Roman" w:hAnsi="Times New Roman" w:cs="Times New Roman"/>
+          <w:sz w:val="26"/>
+          <w:szCs w:val="26"/>
+        </w:rPr>
+        <w:t>là HubSpot CRM và Bizfly CRM để phân tích nghiệp vụ và xác định yêu cầu hệ thống. Sau đó em tiến hành phân tích hệ thống thông qua các cơ đồ như Use Case, Activity, Sequence, Class và ERD. Xây dựng mô hình dữ liệu trên PostgreSQL với</w:t>
+      </w:r>
+      <w:r>
+        <w:rPr>
+          <w:rFonts w:ascii="Times New Roman" w:hAnsi="Times New Roman" w:cs="Times New Roman"/>
+          <w:sz w:val="26"/>
+          <w:szCs w:val="26"/>
+        </w:rPr>
+        <w:t xml:space="preserve"> 12</w:t>
+      </w:r>
+      <w:r>
+        <w:rPr>
+          <w:rFonts w:ascii="Times New Roman" w:hAnsi="Times New Roman" w:cs="Times New Roman"/>
+          <w:sz w:val="26"/>
+          <w:szCs w:val="26"/>
+        </w:rPr>
+        <w:t xml:space="preserve"> bảng</w:t>
+      </w:r>
+      <w:r>
+        <w:rPr>
+          <w:rFonts w:ascii="Times New Roman" w:hAnsi="Times New Roman" w:cs="Times New Roman"/>
+          <w:sz w:val="26"/>
+          <w:szCs w:val="26"/>
+        </w:rPr>
+        <w:t xml:space="preserve">: </w:t>
+      </w:r>
+      <w:r>
+        <w:rPr>
+          <w:rFonts w:ascii="Times New Roman" w:hAnsi="Times New Roman" w:cs="Times New Roman"/>
+          <w:sz w:val="26"/>
+          <w:szCs w:val="26"/>
+        </w:rPr>
+        <w:t>Users, Roles, Leads, Customers, Deals, Quotes, QuoteDetails, Products, Tasks, Activities, Notifications, ActivityLogs</w:t>
+      </w:r>
+      <w:r>
+        <w:rPr>
+          <w:rFonts w:ascii="Times New Roman" w:hAnsi="Times New Roman" w:cs="Times New Roman"/>
+          <w:sz w:val="26"/>
+          <w:szCs w:val="26"/>
+        </w:rPr>
+        <w:t>.</w:t>
+      </w:r>
+    </w:p>
+    <w:p>
+      <w:pPr>
+        <w:spacing w:line="360" w:lineRule="auto"/>
+        <w:rPr>
+          <w:rFonts w:ascii="Times New Roman" w:hAnsi="Times New Roman" w:cs="Times New Roman"/>
+          <w:sz w:val="26"/>
+          <w:szCs w:val="26"/>
+        </w:rPr>
+      </w:pPr>
+      <w:r>
+        <w:rPr>
+          <w:rFonts w:ascii="Times New Roman" w:hAnsi="Times New Roman" w:cs="Times New Roman"/>
+          <w:sz w:val="26"/>
+          <w:szCs w:val="26"/>
+        </w:rPr>
+        <w:t xml:space="preserve">Hệ thống được phát triển theo </w:t>
+      </w:r>
+      <w:r>
+        <w:rPr>
+          <w:rFonts w:ascii="Times New Roman" w:hAnsi="Times New Roman" w:cs="Times New Roman"/>
+          <w:sz w:val="26"/>
+          <w:szCs w:val="26"/>
+        </w:rPr>
+        <w:t xml:space="preserve">mô hình Client – Server, trong đó giao diện được xây dựng bằng Next.js và Back-end được phát triển theo kiến trúc Modular chia hệ thống </w:t>
+      </w:r>
+      <w:r>
+        <w:rPr>
+          <w:rFonts w:ascii="Times New Roman" w:hAnsi="Times New Roman" w:cs="Times New Roman"/>
+          <w:sz w:val="26"/>
+          <w:szCs w:val="26"/>
+        </w:rPr>
+        <w:lastRenderedPageBreak/>
+        <w:t>thành các module độc lập. Dữ liệu được truy cập thông qua Prisma ORM và lưu trữ trên PostgreSQL.</w:t>
+      </w:r>
+    </w:p>
+    <w:p>
+      <w:pPr>
+        <w:pStyle w:val="Heading2"/>
+        <w:rPr>
+          <w:rFonts w:ascii="Times New Roman" w:hAnsi="Times New Roman" w:cs="Times New Roman"/>
+        </w:rPr>
+      </w:pPr>
+      <w:bookmarkStart w:id="21" w:name="_Toc236169789"/>
+      <w:r>
+        <w:rPr>
+          <w:rFonts w:ascii="Times New Roman" w:hAnsi="Times New Roman" w:cs="Times New Roman"/>
+        </w:rPr>
+        <w:t>BỐ CỤC BÁO CÁO</w:t>
+      </w:r>
+      <w:bookmarkEnd w:id="21"/>
+    </w:p>
+    <w:p>
+      <w:pPr>
+        <w:pStyle w:val="ListParagraph"/>
+        <w:numPr>
+          <w:ilvl w:val="0"/>
+          <w:numId w:val="45"/>
+        </w:numPr>
+        <w:spacing w:line="360" w:lineRule="auto"/>
+        <w:rPr>
+          <w:rFonts w:ascii="Times New Roman" w:hAnsi="Times New Roman" w:cs="Times New Roman"/>
+          <w:sz w:val="26"/>
+          <w:szCs w:val="26"/>
+        </w:rPr>
+      </w:pPr>
+      <w:r>
+        <w:rPr>
+          <w:rFonts w:ascii="Times New Roman" w:hAnsi="Times New Roman" w:cs="Times New Roman"/>
+          <w:sz w:val="26"/>
+          <w:szCs w:val="26"/>
+        </w:rPr>
+        <w:t>Chương 1: Giới thiệu đề tài, mục tiêu, phạm vì, phương pháp nghiên cứu</w:t>
+      </w:r>
+      <w:r>
+        <w:rPr>
+          <w:rFonts w:ascii="Times New Roman" w:hAnsi="Times New Roman" w:cs="Times New Roman"/>
+          <w:sz w:val="26"/>
+          <w:szCs w:val="26"/>
+        </w:rPr>
+        <w:t>.</w:t>
+      </w:r>
+    </w:p>
+    <w:p>
+      <w:pPr>
+        <w:pStyle w:val="ListParagraph"/>
+        <w:numPr>
+          <w:ilvl w:val="0"/>
+          <w:numId w:val="45"/>
+        </w:numPr>
+        <w:spacing w:line="360" w:lineRule="auto"/>
+        <w:rPr>
+          <w:rFonts w:ascii="Times New Roman" w:hAnsi="Times New Roman" w:cs="Times New Roman"/>
+          <w:sz w:val="26"/>
+          <w:szCs w:val="26"/>
+        </w:rPr>
+      </w:pPr>
+      <w:r>
+        <w:rPr>
+          <w:rFonts w:ascii="Times New Roman" w:hAnsi="Times New Roman" w:cs="Times New Roman"/>
+          <w:sz w:val="26"/>
+          <w:szCs w:val="26"/>
+        </w:rPr>
+        <w:t xml:space="preserve">Chương 2: Khảo sát hiện trạng, trình bày cơ sở lý thuyết về Sales Pipeline, Forecast, RBAC, </w:t>
+      </w:r>
+      <w:r>
+        <w:rPr>
+          <w:rFonts w:ascii="Times New Roman" w:hAnsi="Times New Roman" w:cs="Times New Roman"/>
+          <w:sz w:val="26"/>
+          <w:szCs w:val="26"/>
+        </w:rPr>
+        <w:t>RESTful API và kiến trúc Modular, các công nghệ sử dụng.</w:t>
+      </w:r>
+    </w:p>
+    <w:p>
+      <w:pPr>
+        <w:pStyle w:val="ListParagraph"/>
+        <w:numPr>
+          <w:ilvl w:val="0"/>
+          <w:numId w:val="45"/>
+        </w:numPr>
+        <w:spacing w:line="360" w:lineRule="auto"/>
+        <w:rPr>
+          <w:rFonts w:ascii="Times New Roman" w:hAnsi="Times New Roman" w:cs="Times New Roman"/>
+          <w:sz w:val="26"/>
+          <w:szCs w:val="26"/>
+        </w:rPr>
+      </w:pPr>
+      <w:r>
+        <w:rPr>
+          <w:rFonts w:ascii="Times New Roman" w:hAnsi="Times New Roman" w:cs="Times New Roman"/>
+          <w:sz w:val="26"/>
+          <w:szCs w:val="26"/>
+        </w:rPr>
+        <w:t>Chương 3: Phân tích và thiết kế hệ thống gồm: Use Case, Activity Diagram, Sequence Diagram, Class Diagram, ERD, kiến trúc hệ thống và Wireframe.</w:t>
+      </w:r>
+    </w:p>
+    <w:p>
+      <w:pPr>
+        <w:pStyle w:val="ListParagraph"/>
+        <w:numPr>
+          <w:ilvl w:val="0"/>
+          <w:numId w:val="45"/>
+        </w:numPr>
+        <w:spacing w:line="360" w:lineRule="auto"/>
+        <w:rPr>
+          <w:rFonts w:ascii="Times New Roman" w:hAnsi="Times New Roman" w:cs="Times New Roman"/>
+          <w:sz w:val="26"/>
+          <w:szCs w:val="26"/>
+        </w:rPr>
+      </w:pPr>
+      <w:r>
+        <w:rPr>
+          <w:rFonts w:ascii="Times New Roman" w:hAnsi="Times New Roman" w:cs="Times New Roman"/>
+          <w:sz w:val="26"/>
+          <w:szCs w:val="26"/>
+        </w:rPr>
+        <w:t>Chương 4: Cài đặt và triển khai, lập trình các chức năng.</w:t>
+      </w:r>
+    </w:p>
+    <w:p>
+      <w:pPr>
+        <w:pStyle w:val="ListParagraph"/>
+        <w:numPr>
+          <w:ilvl w:val="0"/>
+          <w:numId w:val="45"/>
+        </w:numPr>
+        <w:spacing w:line="360" w:lineRule="auto"/>
+        <w:rPr>
+          <w:rFonts w:ascii="Times New Roman" w:hAnsi="Times New Roman" w:cs="Times New Roman"/>
+          <w:sz w:val="26"/>
+          <w:szCs w:val="26"/>
+        </w:rPr>
+      </w:pPr>
+      <w:r>
+        <w:rPr>
+          <w:rFonts w:ascii="Times New Roman" w:hAnsi="Times New Roman" w:cs="Times New Roman"/>
+          <w:sz w:val="26"/>
+          <w:szCs w:val="26"/>
+        </w:rPr>
+        <w:t>Chương 5: Kiểm thử và đánh giá các chức năng thông qua test case.</w:t>
+      </w:r>
+    </w:p>
+    <w:p>
+      <w:pPr>
+        <w:pStyle w:val="ListParagraph"/>
+        <w:numPr>
+          <w:ilvl w:val="0"/>
+          <w:numId w:val="45"/>
+        </w:numPr>
+        <w:spacing w:line="360" w:lineRule="auto"/>
+        <w:rPr>
+          <w:rFonts w:ascii="Times New Roman" w:hAnsi="Times New Roman" w:cs="Times New Roman"/>
+          <w:sz w:val="26"/>
+          <w:szCs w:val="26"/>
+        </w:rPr>
+      </w:pPr>
+      <w:r>
+        <w:rPr>
+          <w:rFonts w:ascii="Times New Roman" w:hAnsi="Times New Roman" w:cs="Times New Roman"/>
+          <w:sz w:val="26"/>
+          <w:szCs w:val="26"/>
+        </w:rPr>
+        <w:t>Chương 6: Kết luận và hướng phát triển trong tương lai.</w:t>
+      </w:r>
     </w:p>
     <w:p>
       <w:pPr>
@@ -7825,8 +8714,8 @@
           <w:rFonts w:ascii="Times New Roman" w:hAnsi="Times New Roman" w:cs="Times New Roman"/>
         </w:rPr>
       </w:pPr>
-      <w:bookmarkStart w:id="18" w:name="_Toc235563705"/>
-      <w:bookmarkStart w:id="19" w:name="_Toc236150080"/>
+      <w:bookmarkStart w:id="22" w:name="_Toc235563705"/>
+      <w:bookmarkStart w:id="23" w:name="_Toc236169790"/>
       <w:r>
         <w:rPr>
           <w:rFonts w:ascii="Times New Roman" w:hAnsi="Times New Roman" w:cs="Times New Roman"/>
@@ -7834,8 +8723,8 @@
         <w:lastRenderedPageBreak/>
         <w:t>CHƯƠNG 2</w:t>
       </w:r>
-      <w:bookmarkEnd w:id="18"/>
-      <w:bookmarkEnd w:id="19"/>
+      <w:bookmarkEnd w:id="22"/>
+      <w:bookmarkEnd w:id="23"/>
     </w:p>
     <w:p>
       <w:pPr>
@@ -7845,16 +8734,16 @@
           <w:rFonts w:ascii="Times New Roman" w:hAnsi="Times New Roman" w:cs="Times New Roman"/>
         </w:rPr>
       </w:pPr>
-      <w:bookmarkStart w:id="20" w:name="_Toc235563706"/>
-      <w:bookmarkStart w:id="21" w:name="_Toc236150081"/>
+      <w:bookmarkStart w:id="24" w:name="_Toc235563706"/>
+      <w:bookmarkStart w:id="25" w:name="_Toc236169791"/>
       <w:r>
         <w:rPr>
           <w:rFonts w:ascii="Times New Roman" w:hAnsi="Times New Roman" w:cs="Times New Roman"/>
         </w:rPr>
         <w:t>KHẢO SÁT HIỆN TRẠNG</w:t>
       </w:r>
-      <w:bookmarkEnd w:id="20"/>
-      <w:bookmarkEnd w:id="21"/>
+      <w:bookmarkEnd w:id="24"/>
+      <w:bookmarkEnd w:id="25"/>
     </w:p>
     <w:p>
       <w:pPr>
@@ -7864,16 +8753,16 @@
           <w:rFonts w:ascii="Times New Roman" w:hAnsi="Times New Roman" w:cs="Times New Roman"/>
         </w:rPr>
       </w:pPr>
-      <w:bookmarkStart w:id="22" w:name="_Toc235563707"/>
-      <w:bookmarkStart w:id="23" w:name="_Toc236150082"/>
+      <w:bookmarkStart w:id="26" w:name="_Toc235563707"/>
+      <w:bookmarkStart w:id="27" w:name="_Toc236169792"/>
       <w:r>
         <w:rPr>
           <w:rFonts w:ascii="Times New Roman" w:hAnsi="Times New Roman" w:cs="Times New Roman"/>
         </w:rPr>
         <w:t>Hệ thống HubSpot CRM</w:t>
       </w:r>
-      <w:bookmarkEnd w:id="22"/>
-      <w:bookmarkEnd w:id="23"/>
+      <w:bookmarkEnd w:id="26"/>
+      <w:bookmarkEnd w:id="27"/>
     </w:p>
     <w:p>
       <w:pPr>
@@ -8294,16 +9183,16 @@
           <w:rFonts w:ascii="Times New Roman" w:hAnsi="Times New Roman" w:cs="Times New Roman"/>
         </w:rPr>
       </w:pPr>
-      <w:bookmarkStart w:id="24" w:name="_Toc235563708"/>
-      <w:bookmarkStart w:id="25" w:name="_Toc236150083"/>
+      <w:bookmarkStart w:id="28" w:name="_Toc235563708"/>
+      <w:bookmarkStart w:id="29" w:name="_Toc236169793"/>
       <w:r>
         <w:rPr>
           <w:rFonts w:ascii="Times New Roman" w:hAnsi="Times New Roman" w:cs="Times New Roman"/>
         </w:rPr>
         <w:t>Hệ thống Bizfly CRM</w:t>
       </w:r>
-      <w:bookmarkEnd w:id="24"/>
-      <w:bookmarkEnd w:id="25"/>
+      <w:bookmarkEnd w:id="28"/>
+      <w:bookmarkEnd w:id="29"/>
     </w:p>
     <w:p>
       <w:pPr>
@@ -9316,7 +10205,7 @@
           <w:szCs w:val="26"/>
         </w:rPr>
       </w:pPr>
-      <w:bookmarkStart w:id="26" w:name="_Toc235810180"/>
+      <w:bookmarkStart w:id="30" w:name="_Toc235810180"/>
       <w:r>
         <w:rPr>
           <w:rFonts w:ascii="Times New Roman" w:hAnsi="Times New Roman" w:cs="Times New Roman"/>
@@ -9374,7 +10263,7 @@
         </w:rPr>
         <w:t>: Bảng so sánh HubSpot và Bizfly</w:t>
       </w:r>
-      <w:bookmarkEnd w:id="26"/>
+      <w:bookmarkEnd w:id="30"/>
     </w:p>
     <w:p>
       <w:pPr>
@@ -9383,14 +10272,14 @@
           <w:rFonts w:ascii="Times New Roman" w:hAnsi="Times New Roman" w:cs="Times New Roman"/>
         </w:rPr>
       </w:pPr>
-      <w:bookmarkStart w:id="27" w:name="_Toc236150084"/>
+      <w:bookmarkStart w:id="31" w:name="_Toc236169794"/>
       <w:r>
         <w:rPr>
           <w:rFonts w:ascii="Times New Roman" w:hAnsi="Times New Roman" w:cs="Times New Roman"/>
         </w:rPr>
         <w:t>CƠ SỞ LÝ THUYẾT NGHIỆP VỤ</w:t>
       </w:r>
-      <w:bookmarkEnd w:id="27"/>
+      <w:bookmarkEnd w:id="31"/>
     </w:p>
     <w:p>
       <w:pPr>
@@ -9399,7 +10288,7 @@
           <w:rFonts w:ascii="Times New Roman" w:hAnsi="Times New Roman" w:cs="Times New Roman"/>
         </w:rPr>
       </w:pPr>
-      <w:bookmarkStart w:id="28" w:name="_Toc236150085"/>
+      <w:bookmarkStart w:id="32" w:name="_Toc236169795"/>
       <w:r>
         <w:rPr>
           <w:rFonts w:ascii="Times New Roman" w:hAnsi="Times New Roman" w:cs="Times New Roman"/>
@@ -9412,7 +10301,7 @@
         </w:rPr>
         <w:t>Pipeline</w:t>
       </w:r>
-      <w:bookmarkEnd w:id="28"/>
+      <w:bookmarkEnd w:id="32"/>
     </w:p>
     <w:p>
       <w:pPr>
@@ -9620,7 +10509,7 @@
           <w:rFonts w:ascii="Times New Roman" w:hAnsi="Times New Roman" w:cs="Times New Roman"/>
         </w:rPr>
       </w:pPr>
-      <w:bookmarkStart w:id="29" w:name="_Toc236150086"/>
+      <w:bookmarkStart w:id="33" w:name="_Toc236169796"/>
       <w:r>
         <w:rPr>
           <w:rFonts w:ascii="Times New Roman" w:hAnsi="Times New Roman" w:cs="Times New Roman"/>
@@ -9633,7 +10522,7 @@
         </w:rPr>
         <w:t>Forecast</w:t>
       </w:r>
-      <w:bookmarkEnd w:id="29"/>
+      <w:bookmarkEnd w:id="33"/>
     </w:p>
     <w:p>
       <w:pPr>
@@ -9839,14 +10728,14 @@
           <w:rFonts w:ascii="Times New Roman" w:hAnsi="Times New Roman" w:cs="Times New Roman"/>
         </w:rPr>
       </w:pPr>
-      <w:bookmarkStart w:id="30" w:name="_Toc236150087"/>
+      <w:bookmarkStart w:id="34" w:name="_Toc236169797"/>
       <w:r>
         <w:rPr>
           <w:rFonts w:ascii="Times New Roman" w:hAnsi="Times New Roman" w:cs="Times New Roman"/>
         </w:rPr>
         <w:t>RBAC</w:t>
       </w:r>
-      <w:bookmarkEnd w:id="30"/>
+      <w:bookmarkEnd w:id="34"/>
     </w:p>
     <w:p>
       <w:pPr>
@@ -10043,14 +10932,14 @@
           <w:rFonts w:ascii="Times New Roman" w:hAnsi="Times New Roman" w:cs="Times New Roman"/>
         </w:rPr>
       </w:pPr>
-      <w:bookmarkStart w:id="31" w:name="_Toc236150088"/>
+      <w:bookmarkStart w:id="35" w:name="_Toc236169798"/>
       <w:r>
         <w:rPr>
           <w:rFonts w:ascii="Times New Roman" w:hAnsi="Times New Roman" w:cs="Times New Roman"/>
         </w:rPr>
         <w:t>RESTful API</w:t>
       </w:r>
-      <w:bookmarkEnd w:id="31"/>
+      <w:bookmarkEnd w:id="35"/>
     </w:p>
     <w:p>
       <w:pPr>
@@ -10331,14 +11220,14 @@
           <w:rFonts w:ascii="Times New Roman" w:hAnsi="Times New Roman" w:cs="Times New Roman"/>
         </w:rPr>
       </w:pPr>
-      <w:bookmarkStart w:id="32" w:name="_Toc236150089"/>
+      <w:bookmarkStart w:id="36" w:name="_Toc236169799"/>
       <w:r>
         <w:rPr>
           <w:rFonts w:ascii="Times New Roman" w:hAnsi="Times New Roman" w:cs="Times New Roman"/>
         </w:rPr>
         <w:t>Kiến trúc Modular</w:t>
       </w:r>
-      <w:bookmarkEnd w:id="32"/>
+      <w:bookmarkEnd w:id="36"/>
     </w:p>
     <w:p>
       <w:pPr>
@@ -10582,16 +11471,16 @@
           <w:rFonts w:ascii="Times New Roman" w:hAnsi="Times New Roman" w:cs="Times New Roman"/>
         </w:rPr>
       </w:pPr>
-      <w:bookmarkStart w:id="33" w:name="_Toc235563709"/>
-      <w:bookmarkStart w:id="34" w:name="_Toc236150090"/>
+      <w:bookmarkStart w:id="37" w:name="_Toc235563709"/>
+      <w:bookmarkStart w:id="38" w:name="_Toc236169800"/>
       <w:r>
         <w:rPr>
           <w:rFonts w:ascii="Times New Roman" w:hAnsi="Times New Roman" w:cs="Times New Roman"/>
         </w:rPr>
         <w:t>CÔNG NGHỆ SỬ DỤNG</w:t>
       </w:r>
-      <w:bookmarkEnd w:id="33"/>
-      <w:bookmarkEnd w:id="34"/>
+      <w:bookmarkEnd w:id="37"/>
+      <w:bookmarkEnd w:id="38"/>
     </w:p>
     <w:p>
       <w:pPr>
@@ -10601,16 +11490,16 @@
           <w:rFonts w:ascii="Times New Roman" w:hAnsi="Times New Roman" w:cs="Times New Roman"/>
         </w:rPr>
       </w:pPr>
-      <w:bookmarkStart w:id="35" w:name="_Toc235563710"/>
-      <w:bookmarkStart w:id="36" w:name="_Toc236150091"/>
+      <w:bookmarkStart w:id="39" w:name="_Toc235563710"/>
+      <w:bookmarkStart w:id="40" w:name="_Toc236169801"/>
       <w:r>
         <w:rPr>
           <w:rFonts w:ascii="Times New Roman" w:hAnsi="Times New Roman" w:cs="Times New Roman"/>
         </w:rPr>
         <w:t>Frontend</w:t>
       </w:r>
-      <w:bookmarkEnd w:id="35"/>
-      <w:bookmarkEnd w:id="36"/>
+      <w:bookmarkEnd w:id="39"/>
+      <w:bookmarkEnd w:id="40"/>
     </w:p>
     <w:p>
       <w:pPr>
@@ -11093,16 +11982,16 @@
           <w:rFonts w:ascii="Times New Roman" w:hAnsi="Times New Roman" w:cs="Times New Roman"/>
         </w:rPr>
       </w:pPr>
-      <w:bookmarkStart w:id="37" w:name="_Toc235563711"/>
-      <w:bookmarkStart w:id="38" w:name="_Toc236150092"/>
+      <w:bookmarkStart w:id="41" w:name="_Toc235563711"/>
+      <w:bookmarkStart w:id="42" w:name="_Toc236169802"/>
       <w:r>
         <w:rPr>
           <w:rFonts w:ascii="Times New Roman" w:hAnsi="Times New Roman" w:cs="Times New Roman"/>
         </w:rPr>
         <w:t>Backend</w:t>
       </w:r>
-      <w:bookmarkEnd w:id="37"/>
-      <w:bookmarkEnd w:id="38"/>
+      <w:bookmarkEnd w:id="41"/>
+      <w:bookmarkEnd w:id="42"/>
     </w:p>
     <w:p>
       <w:pPr>
@@ -11427,16 +12316,7 @@
           <w:szCs w:val="26"/>
         </w:rPr>
         <w:lastRenderedPageBreak/>
-        <w:t xml:space="preserve">Prisma hoạt động dựa trên tệp </w:t>
-      </w:r>
-      <w:proofErr w:type="gramStart"/>
-      <w:r>
-        <w:rPr>
-          <w:rFonts w:ascii="Times New Roman" w:hAnsi="Times New Roman" w:cs="Times New Roman"/>
-          <w:sz w:val="26"/>
-          <w:szCs w:val="26"/>
-        </w:rPr>
-        <w:t>schema.pri</w:t>
+        <w:t>Prisma hoạt động dựa trên tệp schema.pri</w:t>
       </w:r>
       <w:r>
         <w:rPr>
@@ -11452,16 +12332,7 @@
           <w:sz w:val="26"/>
           <w:szCs w:val="26"/>
         </w:rPr>
-        <w:t>ma</w:t>
-      </w:r>
-      <w:proofErr w:type="gramEnd"/>
-      <w:r>
-        <w:rPr>
-          <w:rFonts w:ascii="Times New Roman" w:hAnsi="Times New Roman" w:cs="Times New Roman"/>
-          <w:sz w:val="26"/>
-          <w:szCs w:val="26"/>
-        </w:rPr>
-        <w:t xml:space="preserve"> nơi định nghĩa các Model và thông tin kết nối đến cơ sở dữ liệu. Dựa trên tệp này, Prisma sẽ sinh ra </w:t>
+        <w:t xml:space="preserve">ma nơi định nghĩa các Model và thông tin kết nối đến cơ sở dữ liệu. Dựa trên tệp này, Prisma sẽ sinh ra </w:t>
       </w:r>
       <w:r>
         <w:rPr>
@@ -11598,8 +12469,8 @@
           <w:rFonts w:ascii="Times New Roman" w:hAnsi="Times New Roman" w:cs="Times New Roman"/>
         </w:rPr>
       </w:pPr>
-      <w:bookmarkStart w:id="39" w:name="_Toc235563712"/>
-      <w:bookmarkStart w:id="40" w:name="_Toc236150093"/>
+      <w:bookmarkStart w:id="43" w:name="_Toc235563712"/>
+      <w:bookmarkStart w:id="44" w:name="_Toc236169803"/>
       <w:r>
         <w:rPr>
           <w:rFonts w:ascii="Times New Roman" w:hAnsi="Times New Roman" w:cs="Times New Roman"/>
@@ -11612,8 +12483,8 @@
         </w:rPr>
         <w:t xml:space="preserve"> PostgreSQL</w:t>
       </w:r>
-      <w:bookmarkEnd w:id="39"/>
-      <w:bookmarkEnd w:id="40"/>
+      <w:bookmarkEnd w:id="43"/>
+      <w:bookmarkEnd w:id="44"/>
     </w:p>
     <w:p>
       <w:pPr>
@@ -11811,8 +12682,8 @@
           <w:rFonts w:ascii="Times New Roman" w:hAnsi="Times New Roman" w:cs="Times New Roman"/>
         </w:rPr>
       </w:pPr>
-      <w:bookmarkStart w:id="41" w:name="_Toc235563713"/>
-      <w:bookmarkStart w:id="42" w:name="_Toc236150094"/>
+      <w:bookmarkStart w:id="45" w:name="_Toc235563713"/>
+      <w:bookmarkStart w:id="46" w:name="_Toc236169804"/>
       <w:r>
         <w:rPr>
           <w:rFonts w:ascii="Times New Roman" w:hAnsi="Times New Roman" w:cs="Times New Roman"/>
@@ -11820,149 +12691,41 @@
         <w:lastRenderedPageBreak/>
         <w:t>CHƯƠNG 3</w:t>
       </w:r>
-      <w:bookmarkEnd w:id="41"/>
-      <w:bookmarkEnd w:id="42"/>
-    </w:p>
-    <w:p>
-      <w:pPr>
-        <w:pStyle w:val="Heading2"/>
-        <w:rPr>
-          <w:rFonts w:ascii="Times New Roman" w:hAnsi="Times New Roman" w:cs="Times New Roman"/>
-        </w:rPr>
-      </w:pPr>
-      <w:bookmarkStart w:id="43" w:name="_Toc235563714"/>
-      <w:bookmarkStart w:id="44" w:name="_Toc236150095"/>
-      <w:r>
-        <w:rPr>
-          <w:rFonts w:ascii="Times New Roman" w:hAnsi="Times New Roman" w:cs="Times New Roman"/>
-        </w:rPr>
-        <w:t>SOFTWARE REQUIREMENT SPECIFICATION</w:t>
-      </w:r>
-      <w:bookmarkEnd w:id="43"/>
-      <w:bookmarkEnd w:id="44"/>
-    </w:p>
-    <w:p>
-      <w:pPr>
-        <w:pStyle w:val="Heading3"/>
-        <w:rPr>
-          <w:rFonts w:ascii="Times New Roman" w:hAnsi="Times New Roman" w:cs="Times New Roman"/>
-        </w:rPr>
-      </w:pPr>
-      <w:bookmarkStart w:id="45" w:name="_Toc235563715"/>
-      <w:bookmarkStart w:id="46" w:name="_Toc236150096"/>
-      <w:r>
-        <w:rPr>
-          <w:rFonts w:ascii="Times New Roman" w:hAnsi="Times New Roman" w:cs="Times New Roman"/>
-        </w:rPr>
-        <w:t>Mục đích</w:t>
-      </w:r>
       <w:bookmarkEnd w:id="45"/>
       <w:bookmarkEnd w:id="46"/>
     </w:p>
     <w:p>
       <w:pPr>
-        <w:ind w:left="360"/>
-        <w:rPr>
-          <w:rFonts w:ascii="Times New Roman" w:hAnsi="Times New Roman" w:cs="Times New Roman"/>
-          <w:sz w:val="26"/>
-          <w:szCs w:val="26"/>
-        </w:rPr>
-      </w:pPr>
-      <w:r>
-        <w:rPr>
-          <w:rFonts w:ascii="Times New Roman" w:hAnsi="Times New Roman" w:cs="Times New Roman"/>
-          <w:sz w:val="26"/>
-          <w:szCs w:val="26"/>
-        </w:rPr>
-        <w:t>Software Requirement Specification nhằm mô tả các yêu cầu chức năng và yêu cầu phi chức năng của Hệ thống CRM. SRS là cơ sở để phân tích nghiệp vụ, thiết kế hệ thống và tạo cơ sở dữ liệu, đồng thời SRS cũng giúp thống nhất yêu cầu giữa nhà cung cấp và người sử dụng, giúp đảm bảo hệ thống được xây dựng sát với mục tiêu đã được đề ra.</w:t>
-      </w:r>
-    </w:p>
-    <w:p>
-      <w:pPr>
-        <w:pStyle w:val="Heading3"/>
-        <w:rPr>
-          <w:rFonts w:ascii="Times New Roman" w:hAnsi="Times New Roman" w:cs="Times New Roman"/>
-        </w:rPr>
-      </w:pPr>
-      <w:bookmarkStart w:id="47" w:name="_Toc235563716"/>
-      <w:bookmarkStart w:id="48" w:name="_Toc236150097"/>
-      <w:r>
-        <w:rPr>
-          <w:rFonts w:ascii="Times New Roman" w:hAnsi="Times New Roman" w:cs="Times New Roman"/>
-        </w:rPr>
-        <w:t>Phạm vi hệ thống</w:t>
+        <w:pStyle w:val="Heading2"/>
+        <w:rPr>
+          <w:rFonts w:ascii="Times New Roman" w:hAnsi="Times New Roman" w:cs="Times New Roman"/>
+        </w:rPr>
+      </w:pPr>
+      <w:bookmarkStart w:id="47" w:name="_Toc235563714"/>
+      <w:bookmarkStart w:id="48" w:name="_Toc236169805"/>
+      <w:r>
+        <w:rPr>
+          <w:rFonts w:ascii="Times New Roman" w:hAnsi="Times New Roman" w:cs="Times New Roman"/>
+        </w:rPr>
+        <w:t>SOFTWARE REQUIREMENT SPECIFICATION</w:t>
       </w:r>
       <w:bookmarkEnd w:id="47"/>
       <w:bookmarkEnd w:id="48"/>
     </w:p>
     <w:p>
       <w:pPr>
-        <w:ind w:left="360"/>
-        <w:rPr>
-          <w:rFonts w:ascii="Times New Roman" w:hAnsi="Times New Roman" w:cs="Times New Roman"/>
-          <w:sz w:val="26"/>
-          <w:szCs w:val="26"/>
-        </w:rPr>
-      </w:pPr>
-      <w:r>
-        <w:rPr>
-          <w:rFonts w:ascii="Times New Roman" w:hAnsi="Times New Roman" w:cs="Times New Roman"/>
-          <w:sz w:val="26"/>
-          <w:szCs w:val="26"/>
-        </w:rPr>
-        <w:t>Hệ thống CRM và quản lý phễu bán hàng cho doanh nghiệp nhỏ giúp hỗ trợ các doanh nghiệp quản lý các quy trình bán hàng, quản lý khách hàng từ lúc vừa tiếp nhận khách hàng tiềm năng đến khi khách hàng có nhu cầu và trở thành khách hàng chính thức, quản lý các cơ hội bán hàng và tiến độ bán hàng thông qua kéo – thả trạng thái của Pipeline và quản lý các khách hàng cần chăm sóc sau khi bán hàng. Hệ thống này giúp tập trung lưu trữ thông tin khách hàng một cách nhất quán, hỗ trợ các vai trò nhân viên hoạt động làm việc nhịp nhàng và nâng cao hiệu quả quản lý, quản lý và theo dõi tình hình kinh doanh thông qua các báo cáo và dự báo doanh thu.</w:t>
-      </w:r>
-    </w:p>
-    <w:p>
-      <w:pPr>
-        <w:ind w:left="360"/>
-        <w:rPr>
-          <w:rFonts w:ascii="Times New Roman" w:hAnsi="Times New Roman" w:cs="Times New Roman"/>
-          <w:sz w:val="26"/>
-          <w:szCs w:val="26"/>
-        </w:rPr>
-      </w:pPr>
-      <w:r>
-        <w:rPr>
-          <w:rFonts w:ascii="Times New Roman" w:hAnsi="Times New Roman" w:cs="Times New Roman"/>
-          <w:sz w:val="26"/>
-          <w:szCs w:val="26"/>
-        </w:rPr>
-        <w:t>Trong dự án CRM này được phát triển dưới dạng ứng dụng web kết hợp với kiến trúc Modular, sử dụng RESTful API để trao đổi dữ liệu giữa giao diện người dùng và cơ sở dữ liệu. Hệ thống bao gồm các đối tượng chính là Admin, Sale Manager, Sales, Marketing, Customer Care.</w:t>
-      </w:r>
-    </w:p>
-    <w:p>
-      <w:pPr>
-        <w:ind w:left="360"/>
-        <w:rPr>
-          <w:rFonts w:ascii="Times New Roman" w:hAnsi="Times New Roman" w:cs="Times New Roman"/>
-          <w:sz w:val="26"/>
-          <w:szCs w:val="26"/>
-        </w:rPr>
-      </w:pPr>
-      <w:r>
-        <w:rPr>
-          <w:rFonts w:ascii="Times New Roman" w:hAnsi="Times New Roman" w:cs="Times New Roman"/>
-          <w:sz w:val="26"/>
-          <w:szCs w:val="26"/>
-        </w:rPr>
-        <w:t>Trong phạm vi đồ án về hệ thống CRM chỉ tập trung vào việc hỗ trợ quy trình bán hàng trong doanh nghiệp. Các chức năng như Chatbot, Tiếp thị qua tin nhắn, thanh toán trực tuyến và tích hợp với bên thứ ba vẫn chưa được phát triển và được xem là hướng phát triển trong tương lai.</w:t>
-      </w:r>
-    </w:p>
-    <w:p>
-      <w:pPr>
         <w:pStyle w:val="Heading3"/>
         <w:rPr>
           <w:rFonts w:ascii="Times New Roman" w:hAnsi="Times New Roman" w:cs="Times New Roman"/>
         </w:rPr>
       </w:pPr>
-      <w:bookmarkStart w:id="49" w:name="_Toc235563717"/>
-      <w:bookmarkStart w:id="50" w:name="_Toc236150098"/>
-      <w:r>
-        <w:rPr>
-          <w:rFonts w:ascii="Times New Roman" w:hAnsi="Times New Roman" w:cs="Times New Roman"/>
-        </w:rPr>
-        <w:t>Đối tượng sử dụng</w:t>
+      <w:bookmarkStart w:id="49" w:name="_Toc235563715"/>
+      <w:bookmarkStart w:id="50" w:name="_Toc236169806"/>
+      <w:r>
+        <w:rPr>
+          <w:rFonts w:ascii="Times New Roman" w:hAnsi="Times New Roman" w:cs="Times New Roman"/>
+        </w:rPr>
+        <w:t>Mục đích</w:t>
       </w:r>
       <w:bookmarkEnd w:id="49"/>
       <w:bookmarkEnd w:id="50"/>
@@ -11982,79 +12745,7 @@
           <w:sz w:val="26"/>
           <w:szCs w:val="26"/>
         </w:rPr>
-        <w:t>Admin: quản trị hệ thống, phân quyền nhân viên, cấu hình phễu, theo dõi Dashboard và Forecast.</w:t>
-      </w:r>
-    </w:p>
-    <w:p>
-      <w:pPr>
-        <w:ind w:left="360"/>
-        <w:rPr>
-          <w:rFonts w:ascii="Times New Roman" w:hAnsi="Times New Roman" w:cs="Times New Roman"/>
-          <w:sz w:val="26"/>
-          <w:szCs w:val="26"/>
-        </w:rPr>
-      </w:pPr>
-      <w:r>
-        <w:rPr>
-          <w:rFonts w:ascii="Times New Roman" w:hAnsi="Times New Roman" w:cs="Times New Roman"/>
-          <w:sz w:val="26"/>
-          <w:szCs w:val="26"/>
-        </w:rPr>
-        <w:t xml:space="preserve"> Sales Manager: quản lý nhân viên Sales, phân công Deal, theo dõi doanh thu và hiệu suất bán hàng.</w:t>
-      </w:r>
-    </w:p>
-    <w:p>
-      <w:pPr>
-        <w:ind w:left="360"/>
-        <w:rPr>
-          <w:rFonts w:ascii="Times New Roman" w:hAnsi="Times New Roman" w:cs="Times New Roman"/>
-          <w:sz w:val="26"/>
-          <w:szCs w:val="26"/>
-        </w:rPr>
-      </w:pPr>
-      <w:r>
-        <w:rPr>
-          <w:rFonts w:ascii="Times New Roman" w:hAnsi="Times New Roman" w:cs="Times New Roman"/>
-          <w:sz w:val="26"/>
-          <w:szCs w:val="26"/>
-        </w:rPr>
-        <w:t>Sales: quản lý Lead, Customer, Deal, báo giá cho khách hàng và lên lịch hẹn.</w:t>
-      </w:r>
-    </w:p>
-    <w:p>
-      <w:pPr>
-        <w:ind w:left="360"/>
-        <w:rPr>
-          <w:rFonts w:ascii="Times New Roman" w:hAnsi="Times New Roman" w:cs="Times New Roman"/>
-          <w:sz w:val="26"/>
-          <w:szCs w:val="26"/>
-        </w:rPr>
-      </w:pPr>
-      <w:r>
-        <w:rPr>
-          <w:rFonts w:ascii="Times New Roman" w:hAnsi="Times New Roman" w:cs="Times New Roman"/>
-          <w:sz w:val="26"/>
-          <w:szCs w:val="26"/>
-        </w:rPr>
-        <w:t>Marketing: Thu thập thông tin khách hàng thông qua LeadSource, cập nhật và chuyển đối Lead thành Customer.</w:t>
-      </w:r>
-    </w:p>
-    <w:p>
-      <w:pPr>
-        <w:ind w:left="360"/>
-        <w:rPr>
-          <w:rFonts w:ascii="Times New Roman" w:hAnsi="Times New Roman" w:cs="Times New Roman"/>
-          <w:sz w:val="26"/>
-          <w:szCs w:val="26"/>
-        </w:rPr>
-      </w:pPr>
-      <w:r>
-        <w:rPr>
-          <w:rFonts w:ascii="Times New Roman" w:hAnsi="Times New Roman" w:cs="Times New Roman"/>
-          <w:sz w:val="26"/>
-          <w:szCs w:val="26"/>
-        </w:rPr>
-        <w:t>Customer Care: Theo dõi lịch chăm sóc khách hàng, ghi nhận kết quả chăm sóc và xử lý phản hồi hay góc ý của khách hàng.</w:t>
+        <w:t>Software Requirement Specification nhằm mô tả các yêu cầu chức năng và yêu cầu phi chức năng của Hệ thống CRM. SRS là cơ sở để phân tích nghiệp vụ, thiết kế hệ thống và tạo cơ sở dữ liệu, đồng thời SRS cũng giúp thống nhất yêu cầu giữa nhà cung cấp và người sử dụng, giúp đảm bảo hệ thống được xây dựng sát với mục tiêu đã được đề ra.</w:t>
       </w:r>
     </w:p>
     <w:p>
@@ -12064,16 +12755,196 @@
           <w:rFonts w:ascii="Times New Roman" w:hAnsi="Times New Roman" w:cs="Times New Roman"/>
         </w:rPr>
       </w:pPr>
-      <w:bookmarkStart w:id="51" w:name="_Toc235563718"/>
-      <w:bookmarkStart w:id="52" w:name="_Toc236150099"/>
-      <w:r>
-        <w:rPr>
-          <w:rFonts w:ascii="Times New Roman" w:hAnsi="Times New Roman" w:cs="Times New Roman"/>
-        </w:rPr>
-        <w:t>Yêu cầu chức năng</w:t>
+      <w:bookmarkStart w:id="51" w:name="_Toc235563716"/>
+      <w:bookmarkStart w:id="52" w:name="_Toc236169807"/>
+      <w:r>
+        <w:rPr>
+          <w:rFonts w:ascii="Times New Roman" w:hAnsi="Times New Roman" w:cs="Times New Roman"/>
+        </w:rPr>
+        <w:t>Phạm vi hệ thống</w:t>
       </w:r>
       <w:bookmarkEnd w:id="51"/>
       <w:bookmarkEnd w:id="52"/>
+    </w:p>
+    <w:p>
+      <w:pPr>
+        <w:ind w:left="360"/>
+        <w:rPr>
+          <w:rFonts w:ascii="Times New Roman" w:hAnsi="Times New Roman" w:cs="Times New Roman"/>
+          <w:sz w:val="26"/>
+          <w:szCs w:val="26"/>
+        </w:rPr>
+      </w:pPr>
+      <w:r>
+        <w:rPr>
+          <w:rFonts w:ascii="Times New Roman" w:hAnsi="Times New Roman" w:cs="Times New Roman"/>
+          <w:sz w:val="26"/>
+          <w:szCs w:val="26"/>
+        </w:rPr>
+        <w:t>Hệ thống CRM và quản lý phễu bán hàng cho doanh nghiệp nhỏ giúp hỗ trợ các doanh nghiệp quản lý các quy trình bán hàng, quản lý khách hàng từ lúc vừa tiếp nhận khách hàng tiềm năng đến khi khách hàng có nhu cầu và trở thành khách hàng chính thức, quản lý các cơ hội bán hàng và tiến độ bán hàng thông qua kéo – thả trạng thái của Pipeline và quản lý các khách hàng cần chăm sóc sau khi bán hàng. Hệ thống này giúp tập trung lưu trữ thông tin khách hàng một cách nhất quán, hỗ trợ các vai trò nhân viên hoạt động làm việc nhịp nhàng và nâng cao hiệu quả quản lý, quản lý và theo dõi tình hình kinh doanh thông qua các báo cáo và dự báo doanh thu.</w:t>
+      </w:r>
+    </w:p>
+    <w:p>
+      <w:pPr>
+        <w:ind w:left="360"/>
+        <w:rPr>
+          <w:rFonts w:ascii="Times New Roman" w:hAnsi="Times New Roman" w:cs="Times New Roman"/>
+          <w:sz w:val="26"/>
+          <w:szCs w:val="26"/>
+        </w:rPr>
+      </w:pPr>
+      <w:r>
+        <w:rPr>
+          <w:rFonts w:ascii="Times New Roman" w:hAnsi="Times New Roman" w:cs="Times New Roman"/>
+          <w:sz w:val="26"/>
+          <w:szCs w:val="26"/>
+        </w:rPr>
+        <w:t>Trong dự án CRM này được phát triển dưới dạng ứng dụng web kết hợp với kiến trúc Modular, sử dụng RESTful API để trao đổi dữ liệu giữa giao diện người dùng và cơ sở dữ liệu. Hệ thống bao gồm các đối tượng chính là Admin, Sale Manager, Sales, Marketing, Customer Care.</w:t>
+      </w:r>
+    </w:p>
+    <w:p>
+      <w:pPr>
+        <w:ind w:left="360"/>
+        <w:rPr>
+          <w:rFonts w:ascii="Times New Roman" w:hAnsi="Times New Roman" w:cs="Times New Roman"/>
+          <w:sz w:val="26"/>
+          <w:szCs w:val="26"/>
+        </w:rPr>
+      </w:pPr>
+      <w:r>
+        <w:rPr>
+          <w:rFonts w:ascii="Times New Roman" w:hAnsi="Times New Roman" w:cs="Times New Roman"/>
+          <w:sz w:val="26"/>
+          <w:szCs w:val="26"/>
+        </w:rPr>
+        <w:t>Trong phạm vi đồ án về hệ thống CRM chỉ tập trung vào việc hỗ trợ quy trình bán hàng trong doanh nghiệp. Các chức năng như Chatbot, Tiếp thị qua tin nhắn, thanh toán trực tuyến và tích hợp với bên thứ ba vẫn chưa được phát triển và được xem là hướng phát triển trong tương lai.</w:t>
+      </w:r>
+    </w:p>
+    <w:p>
+      <w:pPr>
+        <w:pStyle w:val="Heading3"/>
+        <w:rPr>
+          <w:rFonts w:ascii="Times New Roman" w:hAnsi="Times New Roman" w:cs="Times New Roman"/>
+        </w:rPr>
+      </w:pPr>
+      <w:bookmarkStart w:id="53" w:name="_Toc235563717"/>
+      <w:bookmarkStart w:id="54" w:name="_Toc236169808"/>
+      <w:r>
+        <w:rPr>
+          <w:rFonts w:ascii="Times New Roman" w:hAnsi="Times New Roman" w:cs="Times New Roman"/>
+        </w:rPr>
+        <w:t>Đối tượng sử dụng</w:t>
+      </w:r>
+      <w:bookmarkEnd w:id="53"/>
+      <w:bookmarkEnd w:id="54"/>
+    </w:p>
+    <w:p>
+      <w:pPr>
+        <w:ind w:left="360"/>
+        <w:rPr>
+          <w:rFonts w:ascii="Times New Roman" w:hAnsi="Times New Roman" w:cs="Times New Roman"/>
+          <w:sz w:val="26"/>
+          <w:szCs w:val="26"/>
+        </w:rPr>
+      </w:pPr>
+      <w:r>
+        <w:rPr>
+          <w:rFonts w:ascii="Times New Roman" w:hAnsi="Times New Roman" w:cs="Times New Roman"/>
+          <w:sz w:val="26"/>
+          <w:szCs w:val="26"/>
+        </w:rPr>
+        <w:t>Admin: quản trị hệ thống, phân quyền nhân viên, cấu hình phễu, theo dõi Dashboard và Forecast.</w:t>
+      </w:r>
+    </w:p>
+    <w:p>
+      <w:pPr>
+        <w:ind w:left="360"/>
+        <w:rPr>
+          <w:rFonts w:ascii="Times New Roman" w:hAnsi="Times New Roman" w:cs="Times New Roman"/>
+          <w:sz w:val="26"/>
+          <w:szCs w:val="26"/>
+        </w:rPr>
+      </w:pPr>
+      <w:r>
+        <w:rPr>
+          <w:rFonts w:ascii="Times New Roman" w:hAnsi="Times New Roman" w:cs="Times New Roman"/>
+          <w:sz w:val="26"/>
+          <w:szCs w:val="26"/>
+        </w:rPr>
+        <w:t xml:space="preserve"> Sales Manager: quản lý nhân viên Sales, phân công Deal, theo dõi doanh thu và hiệu suất bán hàng.</w:t>
+      </w:r>
+    </w:p>
+    <w:p>
+      <w:pPr>
+        <w:ind w:left="360"/>
+        <w:rPr>
+          <w:rFonts w:ascii="Times New Roman" w:hAnsi="Times New Roman" w:cs="Times New Roman"/>
+          <w:sz w:val="26"/>
+          <w:szCs w:val="26"/>
+        </w:rPr>
+      </w:pPr>
+      <w:r>
+        <w:rPr>
+          <w:rFonts w:ascii="Times New Roman" w:hAnsi="Times New Roman" w:cs="Times New Roman"/>
+          <w:sz w:val="26"/>
+          <w:szCs w:val="26"/>
+        </w:rPr>
+        <w:t>Sales: quản lý Lead, Customer, Deal, báo giá cho khách hàng và lên lịch hẹn.</w:t>
+      </w:r>
+    </w:p>
+    <w:p>
+      <w:pPr>
+        <w:ind w:left="360"/>
+        <w:rPr>
+          <w:rFonts w:ascii="Times New Roman" w:hAnsi="Times New Roman" w:cs="Times New Roman"/>
+          <w:sz w:val="26"/>
+          <w:szCs w:val="26"/>
+        </w:rPr>
+      </w:pPr>
+      <w:r>
+        <w:rPr>
+          <w:rFonts w:ascii="Times New Roman" w:hAnsi="Times New Roman" w:cs="Times New Roman"/>
+          <w:sz w:val="26"/>
+          <w:szCs w:val="26"/>
+        </w:rPr>
+        <w:t>Marketing: Thu thập thông tin khách hàng thông qua LeadSource, cập nhật và chuyển đối Lead thành Customer.</w:t>
+      </w:r>
+    </w:p>
+    <w:p>
+      <w:pPr>
+        <w:ind w:left="360"/>
+        <w:rPr>
+          <w:rFonts w:ascii="Times New Roman" w:hAnsi="Times New Roman" w:cs="Times New Roman"/>
+          <w:sz w:val="26"/>
+          <w:szCs w:val="26"/>
+        </w:rPr>
+      </w:pPr>
+      <w:r>
+        <w:rPr>
+          <w:rFonts w:ascii="Times New Roman" w:hAnsi="Times New Roman" w:cs="Times New Roman"/>
+          <w:sz w:val="26"/>
+          <w:szCs w:val="26"/>
+        </w:rPr>
+        <w:t>Customer Care: Theo dõi lịch chăm sóc khách hàng, ghi nhận kết quả chăm sóc và xử lý phản hồi hay góc ý của khách hàng.</w:t>
+      </w:r>
+    </w:p>
+    <w:p>
+      <w:pPr>
+        <w:pStyle w:val="Heading3"/>
+        <w:rPr>
+          <w:rFonts w:ascii="Times New Roman" w:hAnsi="Times New Roman" w:cs="Times New Roman"/>
+        </w:rPr>
+      </w:pPr>
+      <w:bookmarkStart w:id="55" w:name="_Toc235563718"/>
+      <w:bookmarkStart w:id="56" w:name="_Toc236169809"/>
+      <w:r>
+        <w:rPr>
+          <w:rFonts w:ascii="Times New Roman" w:hAnsi="Times New Roman" w:cs="Times New Roman"/>
+        </w:rPr>
+        <w:t>Yêu cầu chức năng</w:t>
+      </w:r>
+      <w:bookmarkEnd w:id="55"/>
+      <w:bookmarkEnd w:id="56"/>
     </w:p>
     <w:p>
       <w:pPr>
@@ -12957,16 +13828,16 @@
           <w:rFonts w:ascii="Times New Roman" w:hAnsi="Times New Roman" w:cs="Times New Roman"/>
         </w:rPr>
       </w:pPr>
-      <w:bookmarkStart w:id="53" w:name="_Toc235563719"/>
-      <w:bookmarkStart w:id="54" w:name="_Toc236150100"/>
+      <w:bookmarkStart w:id="57" w:name="_Toc235563719"/>
+      <w:bookmarkStart w:id="58" w:name="_Toc236169810"/>
       <w:r>
         <w:rPr>
           <w:rFonts w:ascii="Times New Roman" w:hAnsi="Times New Roman" w:cs="Times New Roman"/>
         </w:rPr>
         <w:t>Yêu cầu phi chức năng</w:t>
       </w:r>
-      <w:bookmarkEnd w:id="53"/>
-      <w:bookmarkEnd w:id="54"/>
+      <w:bookmarkEnd w:id="57"/>
+      <w:bookmarkEnd w:id="58"/>
     </w:p>
     <w:p>
       <w:pPr>
@@ -13063,8 +13934,8 @@
           <w:rFonts w:ascii="Times New Roman" w:hAnsi="Times New Roman" w:cs="Times New Roman"/>
         </w:rPr>
       </w:pPr>
-      <w:bookmarkStart w:id="55" w:name="_Toc235563720"/>
-      <w:bookmarkStart w:id="56" w:name="_Toc236150101"/>
+      <w:bookmarkStart w:id="59" w:name="_Toc235563720"/>
+      <w:bookmarkStart w:id="60" w:name="_Toc236169811"/>
       <w:r>
         <w:rPr>
           <w:rFonts w:ascii="Times New Roman" w:hAnsi="Times New Roman" w:cs="Times New Roman"/>
@@ -13072,8 +13943,8 @@
         <w:lastRenderedPageBreak/>
         <w:t>USE-CASE DIAGRAM</w:t>
       </w:r>
-      <w:bookmarkEnd w:id="55"/>
-      <w:bookmarkEnd w:id="56"/>
+      <w:bookmarkEnd w:id="59"/>
+      <w:bookmarkEnd w:id="60"/>
     </w:p>
     <w:p>
       <w:pPr>
@@ -13135,8 +14006,8 @@
           <w:szCs w:val="26"/>
         </w:rPr>
       </w:pPr>
-      <w:bookmarkStart w:id="57" w:name="_Toc235641387"/>
-      <w:bookmarkStart w:id="58" w:name="_Toc235797430"/>
+      <w:bookmarkStart w:id="61" w:name="_Toc235641387"/>
+      <w:bookmarkStart w:id="62" w:name="_Toc235797430"/>
       <w:r>
         <w:rPr>
           <w:rFonts w:ascii="Times New Roman" w:hAnsi="Times New Roman" w:cs="Times New Roman"/>
@@ -13194,8 +14065,8 @@
         </w:rPr>
         <w:t>: Use Case Diagram</w:t>
       </w:r>
-      <w:bookmarkEnd w:id="57"/>
-      <w:bookmarkEnd w:id="58"/>
+      <w:bookmarkEnd w:id="61"/>
+      <w:bookmarkEnd w:id="62"/>
     </w:p>
     <w:p>
       <w:pPr>
@@ -13204,16 +14075,16 @@
           <w:rFonts w:ascii="Times New Roman" w:hAnsi="Times New Roman" w:cs="Times New Roman"/>
         </w:rPr>
       </w:pPr>
-      <w:bookmarkStart w:id="59" w:name="_Toc235563721"/>
-      <w:bookmarkStart w:id="60" w:name="_Toc236150102"/>
+      <w:bookmarkStart w:id="63" w:name="_Toc235563721"/>
+      <w:bookmarkStart w:id="64" w:name="_Toc236169812"/>
       <w:r>
         <w:rPr>
           <w:rFonts w:ascii="Times New Roman" w:hAnsi="Times New Roman" w:cs="Times New Roman"/>
         </w:rPr>
         <w:t>ĐẶC TẢ USE-CASE</w:t>
       </w:r>
-      <w:bookmarkEnd w:id="59"/>
-      <w:bookmarkEnd w:id="60"/>
+      <w:bookmarkEnd w:id="63"/>
+      <w:bookmarkEnd w:id="64"/>
     </w:p>
     <w:p>
       <w:pPr>
@@ -13724,7 +14595,7 @@
           <w:szCs w:val="26"/>
         </w:rPr>
       </w:pPr>
-      <w:bookmarkStart w:id="61" w:name="_Toc235810181"/>
+      <w:bookmarkStart w:id="65" w:name="_Toc235810181"/>
       <w:r>
         <w:rPr>
           <w:rFonts w:ascii="Times New Roman" w:hAnsi="Times New Roman" w:cs="Times New Roman"/>
@@ -13782,7 +14653,7 @@
         </w:rPr>
         <w:t>: UC1: Đăng nhập hệ thống</w:t>
       </w:r>
-      <w:bookmarkEnd w:id="61"/>
+      <w:bookmarkEnd w:id="65"/>
     </w:p>
     <w:p>
       <w:pPr>
@@ -14426,7 +15297,7 @@
           <w:szCs w:val="26"/>
         </w:rPr>
       </w:pPr>
-      <w:bookmarkStart w:id="62" w:name="_Toc235810182"/>
+      <w:bookmarkStart w:id="66" w:name="_Toc235810182"/>
       <w:r>
         <w:rPr>
           <w:rFonts w:ascii="Times New Roman" w:hAnsi="Times New Roman" w:cs="Times New Roman"/>
@@ -14524,7 +15395,7 @@
         </w:rPr>
         <w:t>Quản lý Lead</w:t>
       </w:r>
-      <w:bookmarkEnd w:id="62"/>
+      <w:bookmarkEnd w:id="66"/>
     </w:p>
     <w:p>
       <w:pPr>
@@ -15050,7 +15921,7 @@
           <w:szCs w:val="26"/>
         </w:rPr>
       </w:pPr>
-      <w:bookmarkStart w:id="63" w:name="_Toc235810183"/>
+      <w:bookmarkStart w:id="67" w:name="_Toc235810183"/>
       <w:r>
         <w:rPr>
           <w:rFonts w:ascii="Times New Roman" w:hAnsi="Times New Roman" w:cs="Times New Roman"/>
@@ -15124,7 +15995,7 @@
         </w:rPr>
         <w:t>Chuyển Lead thành Customer</w:t>
       </w:r>
-      <w:bookmarkEnd w:id="63"/>
+      <w:bookmarkEnd w:id="67"/>
     </w:p>
     <w:p>
       <w:pPr>
@@ -15695,7 +16566,7 @@
           <w:szCs w:val="26"/>
         </w:rPr>
       </w:pPr>
-      <w:bookmarkStart w:id="64" w:name="_Toc235810184"/>
+      <w:bookmarkStart w:id="68" w:name="_Toc235810184"/>
       <w:r>
         <w:rPr>
           <w:rFonts w:ascii="Times New Roman" w:hAnsi="Times New Roman" w:cs="Times New Roman"/>
@@ -15753,7 +16624,7 @@
         </w:rPr>
         <w:t>: UC4: Quản lý Deal</w:t>
       </w:r>
-      <w:bookmarkEnd w:id="64"/>
+      <w:bookmarkEnd w:id="68"/>
     </w:p>
     <w:p>
       <w:pPr>
@@ -16145,7 +17016,7 @@
           <w:szCs w:val="26"/>
         </w:rPr>
       </w:pPr>
-      <w:bookmarkStart w:id="65" w:name="_Toc235810185"/>
+      <w:bookmarkStart w:id="69" w:name="_Toc235810185"/>
       <w:r>
         <w:rPr>
           <w:rFonts w:ascii="Times New Roman" w:hAnsi="Times New Roman" w:cs="Times New Roman"/>
@@ -16203,7 +17074,7 @@
         </w:rPr>
         <w:t>: UC5: Phân công Deal</w:t>
       </w:r>
-      <w:bookmarkEnd w:id="65"/>
+      <w:bookmarkEnd w:id="69"/>
     </w:p>
     <w:p>
       <w:pPr>
@@ -16592,7 +17463,7 @@
           <w:szCs w:val="26"/>
         </w:rPr>
       </w:pPr>
-      <w:bookmarkStart w:id="66" w:name="_Toc235810186"/>
+      <w:bookmarkStart w:id="70" w:name="_Toc235810186"/>
       <w:r>
         <w:rPr>
           <w:rFonts w:ascii="Times New Roman" w:hAnsi="Times New Roman" w:cs="Times New Roman"/>
@@ -16650,7 +17521,7 @@
         </w:rPr>
         <w:t>: UC6: Thay đổi trạng thái Pipeline</w:t>
       </w:r>
-      <w:bookmarkEnd w:id="66"/>
+      <w:bookmarkEnd w:id="70"/>
     </w:p>
     <w:p>
       <w:pPr>
@@ -17174,7 +18045,7 @@
           <w:szCs w:val="26"/>
         </w:rPr>
       </w:pPr>
-      <w:bookmarkStart w:id="67" w:name="_Toc235810187"/>
+      <w:bookmarkStart w:id="71" w:name="_Toc235810187"/>
       <w:r>
         <w:rPr>
           <w:rFonts w:ascii="Times New Roman" w:hAnsi="Times New Roman" w:cs="Times New Roman"/>
@@ -17232,7 +18103,7 @@
         </w:rPr>
         <w:t>: UC7: Tạo Quote</w:t>
       </w:r>
-      <w:bookmarkEnd w:id="67"/>
+      <w:bookmarkEnd w:id="71"/>
     </w:p>
     <w:p>
       <w:pPr>
@@ -17801,7 +18672,7 @@
           <w:szCs w:val="26"/>
         </w:rPr>
       </w:pPr>
-      <w:bookmarkStart w:id="68" w:name="_Toc235810188"/>
+      <w:bookmarkStart w:id="72" w:name="_Toc235810188"/>
       <w:r>
         <w:rPr>
           <w:rFonts w:ascii="Times New Roman" w:hAnsi="Times New Roman" w:cs="Times New Roman"/>
@@ -17860,7 +18731,7 @@
         </w:rPr>
         <w:t>: UC8: Quản lý Task</w:t>
       </w:r>
-      <w:bookmarkEnd w:id="68"/>
+      <w:bookmarkEnd w:id="72"/>
     </w:p>
     <w:p>
       <w:pPr>
@@ -18272,7 +19143,7 @@
           <w:szCs w:val="26"/>
         </w:rPr>
       </w:pPr>
-      <w:bookmarkStart w:id="69" w:name="_Toc235810189"/>
+      <w:bookmarkStart w:id="73" w:name="_Toc235810189"/>
       <w:r>
         <w:rPr>
           <w:rFonts w:ascii="Times New Roman" w:hAnsi="Times New Roman" w:cs="Times New Roman"/>
@@ -18330,7 +19201,7 @@
         </w:rPr>
         <w:t>: UC9: Dashboard</w:t>
       </w:r>
-      <w:bookmarkEnd w:id="69"/>
+      <w:bookmarkEnd w:id="73"/>
     </w:p>
     <w:p>
       <w:pPr>
@@ -18698,7 +19569,7 @@
           <w:szCs w:val="26"/>
         </w:rPr>
       </w:pPr>
-      <w:bookmarkStart w:id="70" w:name="_Toc235810190"/>
+      <w:bookmarkStart w:id="74" w:name="_Toc235810190"/>
       <w:r>
         <w:rPr>
           <w:rFonts w:ascii="Times New Roman" w:hAnsi="Times New Roman" w:cs="Times New Roman"/>
@@ -18756,7 +19627,7 @@
         </w:rPr>
         <w:t>: UC10: Xem Activity Log</w:t>
       </w:r>
-      <w:bookmarkEnd w:id="70"/>
+      <w:bookmarkEnd w:id="74"/>
     </w:p>
     <w:p>
       <w:pPr>
@@ -19320,7 +20191,7 @@
           <w:szCs w:val="26"/>
         </w:rPr>
       </w:pPr>
-      <w:bookmarkStart w:id="71" w:name="_Toc235810191"/>
+      <w:bookmarkStart w:id="75" w:name="_Toc235810191"/>
       <w:r>
         <w:rPr>
           <w:rFonts w:ascii="Times New Roman" w:hAnsi="Times New Roman" w:cs="Times New Roman"/>
@@ -19378,7 +20249,7 @@
         </w:rPr>
         <w:t>: UC11: Quản lý Users</w:t>
       </w:r>
-      <w:bookmarkEnd w:id="71"/>
+      <w:bookmarkEnd w:id="75"/>
     </w:p>
     <w:p>
       <w:pPr>
@@ -19887,7 +20758,7 @@
           <w:szCs w:val="26"/>
         </w:rPr>
       </w:pPr>
-      <w:bookmarkStart w:id="72" w:name="_Toc235810192"/>
+      <w:bookmarkStart w:id="76" w:name="_Toc235810192"/>
       <w:r>
         <w:rPr>
           <w:rFonts w:ascii="Times New Roman" w:hAnsi="Times New Roman" w:cs="Times New Roman"/>
@@ -19961,7 +20832,7 @@
         </w:rPr>
         <w:t>Quản lý chăm sóc khách hàng</w:t>
       </w:r>
-      <w:bookmarkEnd w:id="72"/>
+      <w:bookmarkEnd w:id="76"/>
     </w:p>
     <w:p>
       <w:pPr>
@@ -20432,7 +21303,7 @@
           <w:szCs w:val="26"/>
         </w:rPr>
       </w:pPr>
-      <w:bookmarkStart w:id="73" w:name="_Toc235810193"/>
+      <w:bookmarkStart w:id="77" w:name="_Toc235810193"/>
       <w:r>
         <w:rPr>
           <w:rFonts w:ascii="Times New Roman" w:hAnsi="Times New Roman" w:cs="Times New Roman"/>
@@ -20490,7 +21361,7 @@
         </w:rPr>
         <w:t>: UC13: Quản lý Customer</w:t>
       </w:r>
-      <w:bookmarkEnd w:id="73"/>
+      <w:bookmarkEnd w:id="77"/>
     </w:p>
     <w:p>
       <w:pPr>
@@ -20956,7 +21827,7 @@
           <w:szCs w:val="26"/>
         </w:rPr>
       </w:pPr>
-      <w:bookmarkStart w:id="74" w:name="_Toc235810194"/>
+      <w:bookmarkStart w:id="78" w:name="_Toc235810194"/>
       <w:r>
         <w:rPr>
           <w:rFonts w:ascii="Times New Roman" w:hAnsi="Times New Roman" w:cs="Times New Roman"/>
@@ -21014,7 +21885,7 @@
         </w:rPr>
         <w:t>: UC15: Quản lý sản phẩm</w:t>
       </w:r>
-      <w:bookmarkEnd w:id="74"/>
+      <w:bookmarkEnd w:id="78"/>
     </w:p>
     <w:p>
       <w:pPr>
@@ -21023,16 +21894,16 @@
           <w:rFonts w:ascii="Times New Roman" w:hAnsi="Times New Roman" w:cs="Times New Roman"/>
         </w:rPr>
       </w:pPr>
-      <w:bookmarkStart w:id="75" w:name="_Toc235563722"/>
-      <w:bookmarkStart w:id="76" w:name="_Toc236150103"/>
+      <w:bookmarkStart w:id="79" w:name="_Toc235563722"/>
+      <w:bookmarkStart w:id="80" w:name="_Toc236169813"/>
       <w:r>
         <w:rPr>
           <w:rFonts w:ascii="Times New Roman" w:hAnsi="Times New Roman" w:cs="Times New Roman"/>
         </w:rPr>
         <w:t>ACTIVITY DIAGRAM</w:t>
       </w:r>
-      <w:bookmarkEnd w:id="75"/>
-      <w:bookmarkEnd w:id="76"/>
+      <w:bookmarkEnd w:id="79"/>
+      <w:bookmarkEnd w:id="80"/>
     </w:p>
     <w:p>
       <w:pPr>
@@ -21097,7 +21968,7 @@
           <w:szCs w:val="26"/>
         </w:rPr>
       </w:pPr>
-      <w:bookmarkStart w:id="77" w:name="_Toc235797431"/>
+      <w:bookmarkStart w:id="81" w:name="_Toc235797431"/>
       <w:r>
         <w:rPr>
           <w:rFonts w:ascii="Times New Roman" w:hAnsi="Times New Roman" w:cs="Times New Roman"/>
@@ -21171,7 +22042,7 @@
         </w:rPr>
         <w:t>mô tả đăng nhập hệ thống</w:t>
       </w:r>
-      <w:bookmarkEnd w:id="77"/>
+      <w:bookmarkEnd w:id="81"/>
     </w:p>
     <w:p>
       <w:pPr>
@@ -21251,7 +22122,7 @@
           <w:szCs w:val="26"/>
         </w:rPr>
       </w:pPr>
-      <w:bookmarkStart w:id="78" w:name="_Toc235797432"/>
+      <w:bookmarkStart w:id="82" w:name="_Toc235797432"/>
       <w:r>
         <w:rPr>
           <w:rFonts w:ascii="Times New Roman" w:hAnsi="Times New Roman" w:cs="Times New Roman"/>
@@ -21309,7 +22180,7 @@
         </w:rPr>
         <w:t>: Activity Diagram mô tả Chuyển Lead thành Customer</w:t>
       </w:r>
-      <w:bookmarkEnd w:id="78"/>
+      <w:bookmarkEnd w:id="82"/>
     </w:p>
     <w:p>
       <w:pPr>
@@ -21391,7 +22262,7 @@
           <w:szCs w:val="26"/>
         </w:rPr>
       </w:pPr>
-      <w:bookmarkStart w:id="79" w:name="_Toc235797433"/>
+      <w:bookmarkStart w:id="83" w:name="_Toc235797433"/>
       <w:r>
         <w:rPr>
           <w:rFonts w:ascii="Times New Roman" w:hAnsi="Times New Roman" w:cs="Times New Roman"/>
@@ -21449,7 +22320,7 @@
         </w:rPr>
         <w:t>: Activity Diagram mô tả tạo Deal</w:t>
       </w:r>
-      <w:bookmarkEnd w:id="79"/>
+      <w:bookmarkEnd w:id="83"/>
     </w:p>
     <w:p>
       <w:pPr>
@@ -21540,7 +22411,7 @@
           <w:szCs w:val="26"/>
         </w:rPr>
       </w:pPr>
-      <w:bookmarkStart w:id="80" w:name="_Toc235797434"/>
+      <w:bookmarkStart w:id="84" w:name="_Toc235797434"/>
       <w:r>
         <w:rPr>
           <w:rFonts w:ascii="Times New Roman" w:hAnsi="Times New Roman" w:cs="Times New Roman"/>
@@ -21598,7 +22469,7 @@
         </w:rPr>
         <w:t>: Activity Diagram mô tả tạo báo giá</w:t>
       </w:r>
-      <w:bookmarkEnd w:id="80"/>
+      <w:bookmarkEnd w:id="84"/>
     </w:p>
     <w:p>
       <w:pPr>
@@ -21688,7 +22559,7 @@
           <w:szCs w:val="26"/>
         </w:rPr>
       </w:pPr>
-      <w:bookmarkStart w:id="81" w:name="_Toc235797435"/>
+      <w:bookmarkStart w:id="85" w:name="_Toc235797435"/>
       <w:r>
         <w:rPr>
           <w:rFonts w:ascii="Times New Roman" w:hAnsi="Times New Roman" w:cs="Times New Roman"/>
@@ -21746,7 +22617,7 @@
         </w:rPr>
         <w:t>: Activity Diagram mô tả chuyển đổi giai đoạn Pipeline</w:t>
       </w:r>
-      <w:bookmarkEnd w:id="81"/>
+      <w:bookmarkEnd w:id="85"/>
     </w:p>
     <w:p>
       <w:pPr>
@@ -21772,8 +22643,8 @@
           <w:rFonts w:ascii="Times New Roman" w:hAnsi="Times New Roman" w:cs="Times New Roman"/>
         </w:rPr>
       </w:pPr>
-      <w:bookmarkStart w:id="82" w:name="_Toc235563723"/>
-      <w:bookmarkStart w:id="83" w:name="_Toc236150104"/>
+      <w:bookmarkStart w:id="86" w:name="_Toc235563723"/>
+      <w:bookmarkStart w:id="87" w:name="_Toc236169814"/>
       <w:r>
         <w:rPr>
           <w:rFonts w:ascii="Times New Roman" w:hAnsi="Times New Roman" w:cs="Times New Roman"/>
@@ -21787,8 +22658,8 @@
         </w:rPr>
         <w:t xml:space="preserve"> DIAGRAM</w:t>
       </w:r>
-      <w:bookmarkEnd w:id="82"/>
-      <w:bookmarkEnd w:id="83"/>
+      <w:bookmarkEnd w:id="86"/>
+      <w:bookmarkEnd w:id="87"/>
     </w:p>
     <w:p>
       <w:pPr>
@@ -21853,7 +22724,7 @@
           <w:szCs w:val="26"/>
         </w:rPr>
       </w:pPr>
-      <w:bookmarkStart w:id="84" w:name="_Toc235797436"/>
+      <w:bookmarkStart w:id="88" w:name="_Toc235797436"/>
       <w:r>
         <w:rPr>
           <w:rFonts w:ascii="Times New Roman" w:hAnsi="Times New Roman" w:cs="Times New Roman"/>
@@ -21911,7 +22782,7 @@
         </w:rPr>
         <w:t>: Sequence Diagram mô tả quy trình chuyển Lead thành Customer</w:t>
       </w:r>
-      <w:bookmarkEnd w:id="84"/>
+      <w:bookmarkEnd w:id="88"/>
     </w:p>
     <w:p>
       <w:pPr>
@@ -21994,7 +22865,7 @@
           <w:szCs w:val="26"/>
         </w:rPr>
       </w:pPr>
-      <w:bookmarkStart w:id="85" w:name="_Toc235797437"/>
+      <w:bookmarkStart w:id="89" w:name="_Toc235797437"/>
       <w:r>
         <w:rPr>
           <w:rFonts w:ascii="Times New Roman" w:hAnsi="Times New Roman" w:cs="Times New Roman"/>
@@ -22052,7 +22923,7 @@
         </w:rPr>
         <w:t>: Sequence Diagram mô tả quy trình tạo Deal mới</w:t>
       </w:r>
-      <w:bookmarkEnd w:id="85"/>
+      <w:bookmarkEnd w:id="89"/>
     </w:p>
     <w:p>
       <w:pPr>
@@ -22135,7 +23006,7 @@
           <w:szCs w:val="26"/>
         </w:rPr>
       </w:pPr>
-      <w:bookmarkStart w:id="86" w:name="_Toc235797438"/>
+      <w:bookmarkStart w:id="90" w:name="_Toc235797438"/>
       <w:r>
         <w:rPr>
           <w:rFonts w:ascii="Times New Roman" w:hAnsi="Times New Roman" w:cs="Times New Roman"/>
@@ -22193,7 +23064,7 @@
         </w:rPr>
         <w:t>: Sequence Diagram mô tả quy trình thay đổi trạng thái trang Pipeline</w:t>
       </w:r>
-      <w:bookmarkEnd w:id="86"/>
+      <w:bookmarkEnd w:id="90"/>
     </w:p>
     <w:p>
       <w:pPr>
@@ -22219,8 +23090,8 @@
           <w:rFonts w:ascii="Times New Roman" w:hAnsi="Times New Roman" w:cs="Times New Roman"/>
         </w:rPr>
       </w:pPr>
-      <w:bookmarkStart w:id="87" w:name="_Toc235563724"/>
-      <w:bookmarkStart w:id="88" w:name="_Toc236150105"/>
+      <w:bookmarkStart w:id="91" w:name="_Toc235563724"/>
+      <w:bookmarkStart w:id="92" w:name="_Toc236169815"/>
       <w:r>
         <w:rPr>
           <w:rFonts w:ascii="Times New Roman" w:hAnsi="Times New Roman" w:cs="Times New Roman"/>
@@ -22228,8 +23099,8 @@
         <w:lastRenderedPageBreak/>
         <w:t>CLASS DIAGRAM</w:t>
       </w:r>
-      <w:bookmarkEnd w:id="87"/>
-      <w:bookmarkEnd w:id="88"/>
+      <w:bookmarkEnd w:id="91"/>
+      <w:bookmarkEnd w:id="92"/>
     </w:p>
     <w:p>
       <w:pPr>
@@ -22294,7 +23165,7 @@
           <w:szCs w:val="26"/>
         </w:rPr>
       </w:pPr>
-      <w:bookmarkStart w:id="89" w:name="_Toc235797439"/>
+      <w:bookmarkStart w:id="93" w:name="_Toc235797439"/>
       <w:r>
         <w:rPr>
           <w:rFonts w:ascii="Times New Roman" w:hAnsi="Times New Roman" w:cs="Times New Roman"/>
@@ -22352,7 +23223,7 @@
         </w:rPr>
         <w:t>: Class Diagram</w:t>
       </w:r>
-      <w:bookmarkEnd w:id="89"/>
+      <w:bookmarkEnd w:id="93"/>
     </w:p>
     <w:p>
       <w:pPr>
@@ -22434,25 +23305,7 @@
           <w:sz w:val="26"/>
           <w:szCs w:val="26"/>
         </w:rPr>
-        <w:t>Leads – Customers: quan hệ 1-</w:t>
-      </w:r>
-      <w:proofErr w:type="gramStart"/>
-      <w:r>
-        <w:rPr>
-          <w:rFonts w:ascii="Times New Roman" w:hAnsi="Times New Roman" w:cs="Times New Roman"/>
-          <w:sz w:val="26"/>
-          <w:szCs w:val="26"/>
-        </w:rPr>
-        <w:t>0..</w:t>
-      </w:r>
-      <w:proofErr w:type="gramEnd"/>
-      <w:r>
-        <w:rPr>
-          <w:rFonts w:ascii="Times New Roman" w:hAnsi="Times New Roman" w:cs="Times New Roman"/>
-          <w:sz w:val="26"/>
-          <w:szCs w:val="26"/>
-        </w:rPr>
-        <w:t>1, một khách hàng tiềm năng có thể được chuyển thành một khách hàng hoặc không.</w:t>
+        <w:t>Leads – Customers: quan hệ 1-0..1, một khách hàng tiềm năng có thể được chuyển thành một khách hàng hoặc không.</w:t>
       </w:r>
     </w:p>
     <w:p>
@@ -22639,14 +23492,14 @@
           <w:rFonts w:ascii="Times New Roman" w:hAnsi="Times New Roman" w:cs="Times New Roman"/>
         </w:rPr>
       </w:pPr>
-      <w:bookmarkStart w:id="90" w:name="_Toc236150106"/>
+      <w:bookmarkStart w:id="94" w:name="_Toc236169816"/>
       <w:r>
         <w:rPr>
           <w:rFonts w:ascii="Times New Roman" w:hAnsi="Times New Roman" w:cs="Times New Roman"/>
         </w:rPr>
         <w:t>ENTITY RELATIONSHIP DIAGRAM</w:t>
       </w:r>
-      <w:bookmarkEnd w:id="90"/>
+      <w:bookmarkEnd w:id="94"/>
     </w:p>
     <w:p>
       <w:pPr>
@@ -22711,7 +23564,7 @@
           <w:szCs w:val="26"/>
         </w:rPr>
       </w:pPr>
-      <w:bookmarkStart w:id="91" w:name="_Toc235797440"/>
+      <w:bookmarkStart w:id="95" w:name="_Toc235797440"/>
       <w:r>
         <w:rPr>
           <w:rFonts w:ascii="Times New Roman" w:hAnsi="Times New Roman" w:cs="Times New Roman"/>
@@ -22769,7 +23622,7 @@
         </w:rPr>
         <w:t>: Entity Relationshop Diagram</w:t>
       </w:r>
-      <w:bookmarkEnd w:id="91"/>
+      <w:bookmarkEnd w:id="95"/>
     </w:p>
     <w:p>
       <w:pPr>
@@ -22821,14 +23674,14 @@
           <w:rFonts w:ascii="Times New Roman" w:hAnsi="Times New Roman" w:cs="Times New Roman"/>
         </w:rPr>
       </w:pPr>
-      <w:bookmarkStart w:id="92" w:name="_Toc236150107"/>
+      <w:bookmarkStart w:id="96" w:name="_Toc236169817"/>
       <w:r>
         <w:rPr>
           <w:rFonts w:ascii="Times New Roman" w:hAnsi="Times New Roman" w:cs="Times New Roman"/>
         </w:rPr>
         <w:t>MA TRẬN TRUY VẾT</w:t>
       </w:r>
-      <w:bookmarkEnd w:id="92"/>
+      <w:bookmarkEnd w:id="96"/>
     </w:p>
     <w:tbl>
       <w:tblPr>
@@ -23777,7 +24630,7 @@
           <w:szCs w:val="26"/>
         </w:rPr>
       </w:pPr>
-      <w:bookmarkStart w:id="93" w:name="_Toc235810195"/>
+      <w:bookmarkStart w:id="97" w:name="_Toc235810195"/>
       <w:r>
         <w:rPr>
           <w:rFonts w:ascii="Times New Roman" w:hAnsi="Times New Roman" w:cs="Times New Roman"/>
@@ -23835,7 +24688,7 @@
         </w:rPr>
         <w:t>: Ma trận truy vết</w:t>
       </w:r>
-      <w:bookmarkEnd w:id="93"/>
+      <w:bookmarkEnd w:id="97"/>
     </w:p>
     <w:p>
       <w:pPr>
@@ -23844,7 +24697,7 @@
           <w:rFonts w:ascii="Times New Roman" w:hAnsi="Times New Roman" w:cs="Times New Roman"/>
         </w:rPr>
       </w:pPr>
-      <w:bookmarkStart w:id="94" w:name="_Toc236150108"/>
+      <w:bookmarkStart w:id="98" w:name="_Toc236169818"/>
       <w:r>
         <w:rPr>
           <w:rFonts w:ascii="Times New Roman" w:hAnsi="Times New Roman" w:cs="Times New Roman"/>
@@ -23858,7 +24711,7 @@
         </w:rPr>
         <w:t>TRÚC HỆ THỐNG</w:t>
       </w:r>
-      <w:bookmarkEnd w:id="94"/>
+      <w:bookmarkEnd w:id="98"/>
     </w:p>
     <w:p>
       <w:pPr>
@@ -23867,14 +24720,14 @@
           <w:rFonts w:ascii="Times New Roman" w:hAnsi="Times New Roman" w:cs="Times New Roman"/>
         </w:rPr>
       </w:pPr>
-      <w:bookmarkStart w:id="95" w:name="_Toc236150109"/>
+      <w:bookmarkStart w:id="99" w:name="_Toc236169819"/>
       <w:r>
         <w:rPr>
           <w:rFonts w:ascii="Times New Roman" w:hAnsi="Times New Roman" w:cs="Times New Roman"/>
         </w:rPr>
         <w:t>Kiến trúc tổng thể</w:t>
       </w:r>
-      <w:bookmarkEnd w:id="95"/>
+      <w:bookmarkEnd w:id="99"/>
     </w:p>
     <w:p>
       <w:pPr>
@@ -23935,7 +24788,7 @@
                                 <w:szCs w:val="26"/>
                               </w:rPr>
                             </w:pPr>
-                            <w:bookmarkStart w:id="96" w:name="_Toc235797441"/>
+                            <w:bookmarkStart w:id="100" w:name="_Toc235797441"/>
                             <w:r>
                               <w:rPr>
                                 <w:rFonts w:ascii="Times New Roman" w:hAnsi="Times New Roman" w:cs="Times New Roman"/>
@@ -23993,7 +24846,7 @@
                               </w:rPr>
                               <w:t>: Kiến trúc tổng thể</w:t>
                             </w:r>
-                            <w:bookmarkEnd w:id="96"/>
+                            <w:bookmarkEnd w:id="100"/>
                           </w:p>
                         </w:txbxContent>
                       </wps:txbx>
@@ -24028,7 +24881,7 @@
                           <w:szCs w:val="26"/>
                         </w:rPr>
                       </w:pPr>
-                      <w:bookmarkStart w:id="97" w:name="_Toc235797441"/>
+                      <w:bookmarkStart w:id="101" w:name="_Toc235797441"/>
                       <w:r>
                         <w:rPr>
                           <w:rFonts w:ascii="Times New Roman" w:hAnsi="Times New Roman" w:cs="Times New Roman"/>
@@ -24086,7 +24939,7 @@
                         </w:rPr>
                         <w:t>: Kiến trúc tổng thể</w:t>
                       </w:r>
-                      <w:bookmarkEnd w:id="97"/>
+                      <w:bookmarkEnd w:id="101"/>
                     </w:p>
                   </w:txbxContent>
                 </v:textbox>
@@ -24177,14 +25030,14 @@
           <w:rFonts w:ascii="Times New Roman" w:hAnsi="Times New Roman" w:cs="Times New Roman"/>
         </w:rPr>
       </w:pPr>
-      <w:bookmarkStart w:id="98" w:name="_Toc236150110"/>
+      <w:bookmarkStart w:id="102" w:name="_Toc236169820"/>
       <w:r>
         <w:rPr>
           <w:rFonts w:ascii="Times New Roman" w:hAnsi="Times New Roman" w:cs="Times New Roman"/>
         </w:rPr>
         <w:t>Kiến trúc Modular</w:t>
       </w:r>
-      <w:bookmarkEnd w:id="98"/>
+      <w:bookmarkEnd w:id="102"/>
     </w:p>
     <w:p>
       <w:pPr>
@@ -24249,7 +25102,7 @@
           <w:szCs w:val="26"/>
         </w:rPr>
       </w:pPr>
-      <w:bookmarkStart w:id="99" w:name="_Toc235797442"/>
+      <w:bookmarkStart w:id="103" w:name="_Toc235797442"/>
       <w:r>
         <w:rPr>
           <w:rFonts w:ascii="Times New Roman" w:hAnsi="Times New Roman" w:cs="Times New Roman"/>
@@ -24307,7 +25160,7 @@
         </w:rPr>
         <w:t>: Kiến trúc Modular</w:t>
       </w:r>
-      <w:bookmarkEnd w:id="99"/>
+      <w:bookmarkEnd w:id="103"/>
     </w:p>
     <w:p>
       <w:pPr>
@@ -24382,7 +25235,7 @@
           <w:szCs w:val="26"/>
         </w:rPr>
       </w:pPr>
-      <w:bookmarkStart w:id="100" w:name="_Toc235797443"/>
+      <w:bookmarkStart w:id="104" w:name="_Toc235797443"/>
       <w:r>
         <w:rPr>
           <w:rFonts w:ascii="Times New Roman" w:hAnsi="Times New Roman" w:cs="Times New Roman"/>
@@ -24440,7 +25293,7 @@
         </w:rPr>
         <w:t>: Kiến trúc của một Module</w:t>
       </w:r>
-      <w:bookmarkEnd w:id="100"/>
+      <w:bookmarkEnd w:id="104"/>
     </w:p>
     <w:p>
       <w:pPr>
@@ -25042,7 +25895,7 @@
           <w:szCs w:val="26"/>
         </w:rPr>
       </w:pPr>
-      <w:bookmarkStart w:id="101" w:name="_Toc235810196"/>
+      <w:bookmarkStart w:id="105" w:name="_Toc235810196"/>
       <w:r>
         <w:rPr>
           <w:rFonts w:ascii="Times New Roman" w:hAnsi="Times New Roman" w:cs="Times New Roman"/>
@@ -25100,7 +25953,7 @@
         </w:rPr>
         <w:t>: Chức năng của từng Module</w:t>
       </w:r>
-      <w:bookmarkEnd w:id="101"/>
+      <w:bookmarkEnd w:id="105"/>
     </w:p>
     <w:p>
       <w:pPr>
@@ -25109,7 +25962,7 @@
           <w:rFonts w:ascii="Times New Roman" w:hAnsi="Times New Roman" w:cs="Times New Roman"/>
         </w:rPr>
       </w:pPr>
-      <w:bookmarkStart w:id="102" w:name="_Toc236150111"/>
+      <w:bookmarkStart w:id="106" w:name="_Toc236169821"/>
       <w:r>
         <w:rPr>
           <w:rFonts w:ascii="Times New Roman" w:hAnsi="Times New Roman" w:cs="Times New Roman"/>
@@ -25117,7 +25970,7 @@
         <w:lastRenderedPageBreak/>
         <w:t>RESTful API</w:t>
       </w:r>
-      <w:bookmarkEnd w:id="102"/>
+      <w:bookmarkEnd w:id="106"/>
     </w:p>
     <w:p>
       <w:pPr>
@@ -25182,7 +26035,7 @@
           <w:szCs w:val="26"/>
         </w:rPr>
       </w:pPr>
-      <w:bookmarkStart w:id="103" w:name="_Toc235797444"/>
+      <w:bookmarkStart w:id="107" w:name="_Toc235797444"/>
       <w:r>
         <w:rPr>
           <w:rFonts w:ascii="Times New Roman" w:hAnsi="Times New Roman" w:cs="Times New Roman"/>
@@ -25240,7 +26093,7 @@
         </w:rPr>
         <w:t>: Luồng xử lý yêu cầu đăng nhập thông qua RESTful API</w:t>
       </w:r>
-      <w:bookmarkEnd w:id="103"/>
+      <w:bookmarkEnd w:id="107"/>
     </w:p>
     <w:p>
       <w:pPr>
@@ -25266,14 +26119,14 @@
           <w:rFonts w:ascii="Times New Roman" w:hAnsi="Times New Roman" w:cs="Times New Roman"/>
         </w:rPr>
       </w:pPr>
-      <w:bookmarkStart w:id="104" w:name="_Toc236150112"/>
+      <w:bookmarkStart w:id="108" w:name="_Toc236169822"/>
       <w:r>
         <w:rPr>
           <w:rFonts w:ascii="Times New Roman" w:hAnsi="Times New Roman" w:cs="Times New Roman"/>
         </w:rPr>
         <w:t>Luồng xử lý dữ liệu</w:t>
       </w:r>
-      <w:bookmarkEnd w:id="104"/>
+      <w:bookmarkEnd w:id="108"/>
     </w:p>
     <w:p>
       <w:pPr>
@@ -25338,7 +26191,7 @@
           <w:szCs w:val="26"/>
         </w:rPr>
       </w:pPr>
-      <w:bookmarkStart w:id="105" w:name="_Toc235797445"/>
+      <w:bookmarkStart w:id="109" w:name="_Toc235797445"/>
       <w:r>
         <w:rPr>
           <w:rFonts w:ascii="Times New Roman" w:hAnsi="Times New Roman" w:cs="Times New Roman"/>
@@ -25396,7 +26249,7 @@
         </w:rPr>
         <w:t>: Luồng xử lý dữ liệu</w:t>
       </w:r>
-      <w:bookmarkEnd w:id="105"/>
+      <w:bookmarkEnd w:id="109"/>
     </w:p>
     <w:p>
       <w:pPr>
@@ -25405,8 +26258,8 @@
           <w:rFonts w:ascii="Times New Roman" w:hAnsi="Times New Roman" w:cs="Times New Roman"/>
         </w:rPr>
       </w:pPr>
-      <w:bookmarkStart w:id="106" w:name="_Toc235563727"/>
-      <w:bookmarkStart w:id="107" w:name="_Toc236150113"/>
+      <w:bookmarkStart w:id="110" w:name="_Toc235563727"/>
+      <w:bookmarkStart w:id="111" w:name="_Toc236169823"/>
       <w:r>
         <w:rPr>
           <w:rFonts w:ascii="Times New Roman" w:hAnsi="Times New Roman" w:cs="Times New Roman"/>
@@ -25414,8 +26267,8 @@
         <w:lastRenderedPageBreak/>
         <w:t>WIREFRAME</w:t>
       </w:r>
-      <w:bookmarkEnd w:id="106"/>
-      <w:bookmarkEnd w:id="107"/>
+      <w:bookmarkEnd w:id="110"/>
+      <w:bookmarkEnd w:id="111"/>
     </w:p>
     <w:p>
       <w:pPr>
@@ -25480,7 +26333,7 @@
           <w:szCs w:val="26"/>
         </w:rPr>
       </w:pPr>
-      <w:bookmarkStart w:id="108" w:name="_Toc235797446"/>
+      <w:bookmarkStart w:id="112" w:name="_Toc235797446"/>
       <w:r>
         <w:rPr>
           <w:rFonts w:ascii="Times New Roman" w:hAnsi="Times New Roman" w:cs="Times New Roman"/>
@@ -25538,7 +26391,7 @@
         </w:rPr>
         <w:t>: Wireframe đăng nhập hệ thống</w:t>
       </w:r>
-      <w:bookmarkEnd w:id="108"/>
+      <w:bookmarkEnd w:id="112"/>
     </w:p>
     <w:p>
       <w:pPr>
@@ -25628,7 +26481,7 @@
           <w:szCs w:val="26"/>
         </w:rPr>
       </w:pPr>
-      <w:bookmarkStart w:id="109" w:name="_Toc235797447"/>
+      <w:bookmarkStart w:id="113" w:name="_Toc235797447"/>
       <w:r>
         <w:rPr>
           <w:rFonts w:ascii="Times New Roman" w:hAnsi="Times New Roman" w:cs="Times New Roman"/>
@@ -25686,7 +26539,7 @@
         </w:rPr>
         <w:t>: Giao diện Dashboard tổng quan</w:t>
       </w:r>
-      <w:bookmarkEnd w:id="109"/>
+      <w:bookmarkEnd w:id="113"/>
     </w:p>
     <w:p>
       <w:pPr>
@@ -25752,7 +26605,7 @@
           <w:szCs w:val="26"/>
         </w:rPr>
       </w:pPr>
-      <w:bookmarkStart w:id="110" w:name="_Toc235797448"/>
+      <w:bookmarkStart w:id="114" w:name="_Toc235797448"/>
       <w:r>
         <w:rPr>
           <w:rFonts w:ascii="Times New Roman" w:hAnsi="Times New Roman" w:cs="Times New Roman"/>
@@ -25810,7 +26663,7 @@
         </w:rPr>
         <w:t>: Dashboard doanh thu bán hàng theo từng năm</w:t>
       </w:r>
-      <w:bookmarkEnd w:id="110"/>
+      <w:bookmarkEnd w:id="114"/>
     </w:p>
     <w:p>
       <w:pPr>
@@ -25875,7 +26728,7 @@
           <w:szCs w:val="26"/>
         </w:rPr>
       </w:pPr>
-      <w:bookmarkStart w:id="111" w:name="_Toc235797449"/>
+      <w:bookmarkStart w:id="115" w:name="_Toc235797449"/>
       <w:r>
         <w:rPr>
           <w:rFonts w:ascii="Times New Roman" w:hAnsi="Times New Roman" w:cs="Times New Roman"/>
@@ -25933,7 +26786,7 @@
         </w:rPr>
         <w:t>: Dashboard tổng quan các Deal theo giai đoạn và tổng giá trị của Pipeline</w:t>
       </w:r>
-      <w:bookmarkEnd w:id="111"/>
+      <w:bookmarkEnd w:id="115"/>
     </w:p>
     <w:p>
       <w:pPr>
@@ -26016,7 +26869,7 @@
           <w:szCs w:val="26"/>
         </w:rPr>
       </w:pPr>
-      <w:bookmarkStart w:id="112" w:name="_Toc235797450"/>
+      <w:bookmarkStart w:id="116" w:name="_Toc235797450"/>
       <w:r>
         <w:rPr>
           <w:rFonts w:ascii="Times New Roman" w:hAnsi="Times New Roman" w:cs="Times New Roman"/>
@@ -26074,7 +26927,7 @@
         </w:rPr>
         <w:t>: Các chỉ số thống kê Lead</w:t>
       </w:r>
-      <w:bookmarkEnd w:id="112"/>
+      <w:bookmarkEnd w:id="116"/>
     </w:p>
     <w:p>
       <w:pPr>
@@ -26139,7 +26992,7 @@
           <w:szCs w:val="26"/>
         </w:rPr>
       </w:pPr>
-      <w:bookmarkStart w:id="113" w:name="_Toc235797451"/>
+      <w:bookmarkStart w:id="117" w:name="_Toc235797451"/>
       <w:r>
         <w:rPr>
           <w:rFonts w:ascii="Times New Roman" w:hAnsi="Times New Roman" w:cs="Times New Roman"/>
@@ -26197,7 +27050,7 @@
         </w:rPr>
         <w:t>: Danh sách Lead</w:t>
       </w:r>
-      <w:bookmarkEnd w:id="113"/>
+      <w:bookmarkEnd w:id="117"/>
     </w:p>
     <w:p>
       <w:pPr>
@@ -26304,7 +27157,7 @@
           <w:szCs w:val="26"/>
         </w:rPr>
       </w:pPr>
-      <w:bookmarkStart w:id="114" w:name="_Toc235797452"/>
+      <w:bookmarkStart w:id="118" w:name="_Toc235797452"/>
       <w:r>
         <w:rPr>
           <w:rFonts w:ascii="Times New Roman" w:hAnsi="Times New Roman" w:cs="Times New Roman"/>
@@ -26362,7 +27215,7 @@
         </w:rPr>
         <w:t>: Giao diện quản lý Deal</w:t>
       </w:r>
-      <w:bookmarkEnd w:id="114"/>
+      <w:bookmarkEnd w:id="118"/>
     </w:p>
     <w:p>
       <w:pPr>
@@ -26452,7 +27305,7 @@
           <w:szCs w:val="26"/>
         </w:rPr>
       </w:pPr>
-      <w:bookmarkStart w:id="115" w:name="_Toc235797453"/>
+      <w:bookmarkStart w:id="119" w:name="_Toc235797453"/>
       <w:r>
         <w:rPr>
           <w:rFonts w:ascii="Times New Roman" w:hAnsi="Times New Roman" w:cs="Times New Roman"/>
@@ -26510,7 +27363,7 @@
         </w:rPr>
         <w:t>: Tổng quan quan lý người dùng</w:t>
       </w:r>
-      <w:bookmarkEnd w:id="115"/>
+      <w:bookmarkEnd w:id="119"/>
     </w:p>
     <w:p>
       <w:pPr>
@@ -26576,7 +27429,7 @@
           <w:szCs w:val="26"/>
         </w:rPr>
       </w:pPr>
-      <w:bookmarkStart w:id="116" w:name="_Toc235797454"/>
+      <w:bookmarkStart w:id="120" w:name="_Toc235797454"/>
       <w:r>
         <w:rPr>
           <w:rFonts w:ascii="Times New Roman" w:hAnsi="Times New Roman" w:cs="Times New Roman"/>
@@ -26634,7 +27487,7 @@
         </w:rPr>
         <w:t>: Danh sách người dùng</w:t>
       </w:r>
-      <w:bookmarkEnd w:id="116"/>
+      <w:bookmarkEnd w:id="120"/>
     </w:p>
     <w:p>
       <w:pPr>
@@ -26677,8 +27530,8 @@
           <w:rFonts w:ascii="Times New Roman" w:hAnsi="Times New Roman" w:cs="Times New Roman"/>
         </w:rPr>
       </w:pPr>
-      <w:bookmarkStart w:id="117" w:name="_Toc235563729"/>
-      <w:bookmarkStart w:id="118" w:name="_Toc236150114"/>
+      <w:bookmarkStart w:id="121" w:name="_Toc235563729"/>
+      <w:bookmarkStart w:id="122" w:name="_Toc236169824"/>
       <w:r>
         <w:rPr>
           <w:rFonts w:ascii="Times New Roman" w:hAnsi="Times New Roman" w:cs="Times New Roman"/>
@@ -26686,10 +27539,10 @@
         <w:lastRenderedPageBreak/>
         <w:t>TÀI LIỆU THAM KHẢO</w:t>
       </w:r>
-      <w:bookmarkEnd w:id="117"/>
-      <w:bookmarkEnd w:id="118"/>
-    </w:p>
-    <w:bookmarkStart w:id="119" w:name="_Toc236150115" w:displacedByCustomXml="next"/>
+      <w:bookmarkEnd w:id="121"/>
+      <w:bookmarkEnd w:id="122"/>
+    </w:p>
+    <w:bookmarkStart w:id="123" w:name="_Toc236169825" w:displacedByCustomXml="next"/>
     <w:sdt>
       <w:sdtPr>
         <w:rPr>
@@ -26723,7 +27576,7 @@
             </w:rPr>
             <w:t>References</w:t>
           </w:r>
-          <w:bookmarkEnd w:id="119"/>
+          <w:bookmarkEnd w:id="123"/>
         </w:p>
         <w:sdt>
           <w:sdtPr>
@@ -28751,6 +29604,118 @@
     </w:lvl>
   </w:abstractNum>
   <w:abstractNum w:abstractNumId="11" w15:restartNumberingAfterBreak="0">
+    <w:nsid w:val="269262C4"/>
+    <w:multiLevelType w:val="hybridMultilevel"/>
+    <w:tmpl w:val="374232AE"/>
+    <w:lvl w:ilvl="0" w:tplc="7B4CA234">
+      <w:numFmt w:val="bullet"/>
+      <w:lvlText w:val="-"/>
+      <w:lvlJc w:val="left"/>
+      <w:pPr>
+        <w:ind w:left="720" w:hanging="360"/>
+      </w:pPr>
+      <w:rPr>
+        <w:rFonts w:ascii="Times New Roman" w:eastAsiaTheme="minorHAnsi" w:hAnsi="Times New Roman" w:cs="Times New Roman" w:hint="default"/>
+      </w:rPr>
+    </w:lvl>
+    <w:lvl w:ilvl="1" w:tplc="04090003" w:tentative="1">
+      <w:start w:val="1"/>
+      <w:numFmt w:val="bullet"/>
+      <w:lvlText w:val="o"/>
+      <w:lvlJc w:val="left"/>
+      <w:pPr>
+        <w:ind w:left="1440" w:hanging="360"/>
+      </w:pPr>
+      <w:rPr>
+        <w:rFonts w:ascii="Courier New" w:hAnsi="Courier New" w:cs="Courier New" w:hint="default"/>
+      </w:rPr>
+    </w:lvl>
+    <w:lvl w:ilvl="2" w:tplc="04090005" w:tentative="1">
+      <w:start w:val="1"/>
+      <w:numFmt w:val="bullet"/>
+      <w:lvlText w:val=""/>
+      <w:lvlJc w:val="left"/>
+      <w:pPr>
+        <w:ind w:left="2160" w:hanging="360"/>
+      </w:pPr>
+      <w:rPr>
+        <w:rFonts w:ascii="Wingdings" w:hAnsi="Wingdings" w:hint="default"/>
+      </w:rPr>
+    </w:lvl>
+    <w:lvl w:ilvl="3" w:tplc="04090001" w:tentative="1">
+      <w:start w:val="1"/>
+      <w:numFmt w:val="bullet"/>
+      <w:lvlText w:val=""/>
+      <w:lvlJc w:val="left"/>
+      <w:pPr>
+        <w:ind w:left="2880" w:hanging="360"/>
+      </w:pPr>
+      <w:rPr>
+        <w:rFonts w:ascii="Symbol" w:hAnsi="Symbol" w:hint="default"/>
+      </w:rPr>
+    </w:lvl>
+    <w:lvl w:ilvl="4" w:tplc="04090003" w:tentative="1">
+      <w:start w:val="1"/>
+      <w:numFmt w:val="bullet"/>
+      <w:lvlText w:val="o"/>
+      <w:lvlJc w:val="left"/>
+      <w:pPr>
+        <w:ind w:left="3600" w:hanging="360"/>
+      </w:pPr>
+      <w:rPr>
+        <w:rFonts w:ascii="Courier New" w:hAnsi="Courier New" w:cs="Courier New" w:hint="default"/>
+      </w:rPr>
+    </w:lvl>
+    <w:lvl w:ilvl="5" w:tplc="04090005" w:tentative="1">
+      <w:start w:val="1"/>
+      <w:numFmt w:val="bullet"/>
+      <w:lvlText w:val=""/>
+      <w:lvlJc w:val="left"/>
+      <w:pPr>
+        <w:ind w:left="4320" w:hanging="360"/>
+      </w:pPr>
+      <w:rPr>
+        <w:rFonts w:ascii="Wingdings" w:hAnsi="Wingdings" w:hint="default"/>
+      </w:rPr>
+    </w:lvl>
+    <w:lvl w:ilvl="6" w:tplc="04090001" w:tentative="1">
+      <w:start w:val="1"/>
+      <w:numFmt w:val="bullet"/>
+      <w:lvlText w:val=""/>
+      <w:lvlJc w:val="left"/>
+      <w:pPr>
+        <w:ind w:left="5040" w:hanging="360"/>
+      </w:pPr>
+      <w:rPr>
+        <w:rFonts w:ascii="Symbol" w:hAnsi="Symbol" w:hint="default"/>
+      </w:rPr>
+    </w:lvl>
+    <w:lvl w:ilvl="7" w:tplc="04090003" w:tentative="1">
+      <w:start w:val="1"/>
+      <w:numFmt w:val="bullet"/>
+      <w:lvlText w:val="o"/>
+      <w:lvlJc w:val="left"/>
+      <w:pPr>
+        <w:ind w:left="5760" w:hanging="360"/>
+      </w:pPr>
+      <w:rPr>
+        <w:rFonts w:ascii="Courier New" w:hAnsi="Courier New" w:cs="Courier New" w:hint="default"/>
+      </w:rPr>
+    </w:lvl>
+    <w:lvl w:ilvl="8" w:tplc="04090005" w:tentative="1">
+      <w:start w:val="1"/>
+      <w:numFmt w:val="bullet"/>
+      <w:lvlText w:val=""/>
+      <w:lvlJc w:val="left"/>
+      <w:pPr>
+        <w:ind w:left="6480" w:hanging="360"/>
+      </w:pPr>
+      <w:rPr>
+        <w:rFonts w:ascii="Wingdings" w:hAnsi="Wingdings" w:hint="default"/>
+      </w:rPr>
+    </w:lvl>
+  </w:abstractNum>
+  <w:abstractNum w:abstractNumId="12" w15:restartNumberingAfterBreak="0">
     <w:nsid w:val="27384C94"/>
     <w:multiLevelType w:val="hybridMultilevel"/>
     <w:tmpl w:val="19D69EA4"/>
@@ -28839,7 +29804,7 @@
       </w:pPr>
     </w:lvl>
   </w:abstractNum>
-  <w:abstractNum w:abstractNumId="12" w15:restartNumberingAfterBreak="0">
+  <w:abstractNum w:abstractNumId="13" w15:restartNumberingAfterBreak="0">
     <w:nsid w:val="2A4A0E14"/>
     <w:multiLevelType w:val="hybridMultilevel"/>
     <w:tmpl w:val="8788FAD0"/>
@@ -28952,7 +29917,7 @@
       </w:rPr>
     </w:lvl>
   </w:abstractNum>
-  <w:abstractNum w:abstractNumId="13" w15:restartNumberingAfterBreak="0">
+  <w:abstractNum w:abstractNumId="14" w15:restartNumberingAfterBreak="0">
     <w:nsid w:val="2D8C22DF"/>
     <w:multiLevelType w:val="hybridMultilevel"/>
     <w:tmpl w:val="FD00B4F0"/>
@@ -29041,7 +30006,93 @@
       </w:pPr>
     </w:lvl>
   </w:abstractNum>
-  <w:abstractNum w:abstractNumId="14" w15:restartNumberingAfterBreak="0">
+  <w:abstractNum w:abstractNumId="15" w15:restartNumberingAfterBreak="0">
+    <w:nsid w:val="2E93099D"/>
+    <w:multiLevelType w:val="hybridMultilevel"/>
+    <w:tmpl w:val="EC32BFC4"/>
+    <w:lvl w:ilvl="0" w:tplc="0409000F">
+      <w:start w:val="1"/>
+      <w:numFmt w:val="decimal"/>
+      <w:lvlText w:val="%1."/>
+      <w:lvlJc w:val="left"/>
+      <w:pPr>
+        <w:ind w:left="720" w:hanging="360"/>
+      </w:pPr>
+    </w:lvl>
+    <w:lvl w:ilvl="1" w:tplc="04090019" w:tentative="1">
+      <w:start w:val="1"/>
+      <w:numFmt w:val="lowerLetter"/>
+      <w:lvlText w:val="%2."/>
+      <w:lvlJc w:val="left"/>
+      <w:pPr>
+        <w:ind w:left="1440" w:hanging="360"/>
+      </w:pPr>
+    </w:lvl>
+    <w:lvl w:ilvl="2" w:tplc="0409001B" w:tentative="1">
+      <w:start w:val="1"/>
+      <w:numFmt w:val="lowerRoman"/>
+      <w:lvlText w:val="%3."/>
+      <w:lvlJc w:val="right"/>
+      <w:pPr>
+        <w:ind w:left="2160" w:hanging="180"/>
+      </w:pPr>
+    </w:lvl>
+    <w:lvl w:ilvl="3" w:tplc="0409000F" w:tentative="1">
+      <w:start w:val="1"/>
+      <w:numFmt w:val="decimal"/>
+      <w:lvlText w:val="%4."/>
+      <w:lvlJc w:val="left"/>
+      <w:pPr>
+        <w:ind w:left="2880" w:hanging="360"/>
+      </w:pPr>
+    </w:lvl>
+    <w:lvl w:ilvl="4" w:tplc="04090019" w:tentative="1">
+      <w:start w:val="1"/>
+      <w:numFmt w:val="lowerLetter"/>
+      <w:lvlText w:val="%5."/>
+      <w:lvlJc w:val="left"/>
+      <w:pPr>
+        <w:ind w:left="3600" w:hanging="360"/>
+      </w:pPr>
+    </w:lvl>
+    <w:lvl w:ilvl="5" w:tplc="0409001B" w:tentative="1">
+      <w:start w:val="1"/>
+      <w:numFmt w:val="lowerRoman"/>
+      <w:lvlText w:val="%6."/>
+      <w:lvlJc w:val="right"/>
+      <w:pPr>
+        <w:ind w:left="4320" w:hanging="180"/>
+      </w:pPr>
+    </w:lvl>
+    <w:lvl w:ilvl="6" w:tplc="0409000F" w:tentative="1">
+      <w:start w:val="1"/>
+      <w:numFmt w:val="decimal"/>
+      <w:lvlText w:val="%7."/>
+      <w:lvlJc w:val="left"/>
+      <w:pPr>
+        <w:ind w:left="5040" w:hanging="360"/>
+      </w:pPr>
+    </w:lvl>
+    <w:lvl w:ilvl="7" w:tplc="04090019" w:tentative="1">
+      <w:start w:val="1"/>
+      <w:numFmt w:val="lowerLetter"/>
+      <w:lvlText w:val="%8."/>
+      <w:lvlJc w:val="left"/>
+      <w:pPr>
+        <w:ind w:left="5760" w:hanging="360"/>
+      </w:pPr>
+    </w:lvl>
+    <w:lvl w:ilvl="8" w:tplc="0409001B" w:tentative="1">
+      <w:start w:val="1"/>
+      <w:numFmt w:val="lowerRoman"/>
+      <w:lvlText w:val="%9."/>
+      <w:lvlJc w:val="right"/>
+      <w:pPr>
+        <w:ind w:left="6480" w:hanging="180"/>
+      </w:pPr>
+    </w:lvl>
+  </w:abstractNum>
+  <w:abstractNum w:abstractNumId="16" w15:restartNumberingAfterBreak="0">
     <w:nsid w:val="2F352F1E"/>
     <w:multiLevelType w:val="hybridMultilevel"/>
     <w:tmpl w:val="96B666D4"/>
@@ -29154,7 +30205,7 @@
       </w:rPr>
     </w:lvl>
   </w:abstractNum>
-  <w:abstractNum w:abstractNumId="15" w15:restartNumberingAfterBreak="0">
+  <w:abstractNum w:abstractNumId="17" w15:restartNumberingAfterBreak="0">
     <w:nsid w:val="37CA7FC7"/>
     <w:multiLevelType w:val="hybridMultilevel"/>
     <w:tmpl w:val="6E7E6A18"/>
@@ -29267,7 +30318,7 @@
       </w:rPr>
     </w:lvl>
   </w:abstractNum>
-  <w:abstractNum w:abstractNumId="16" w15:restartNumberingAfterBreak="0">
+  <w:abstractNum w:abstractNumId="18" w15:restartNumberingAfterBreak="0">
     <w:nsid w:val="384B62F5"/>
     <w:multiLevelType w:val="hybridMultilevel"/>
     <w:tmpl w:val="0FE401CE"/>
@@ -29356,7 +30407,7 @@
       </w:pPr>
     </w:lvl>
   </w:abstractNum>
-  <w:abstractNum w:abstractNumId="17" w15:restartNumberingAfterBreak="0">
+  <w:abstractNum w:abstractNumId="19" w15:restartNumberingAfterBreak="0">
     <w:nsid w:val="3A7C639E"/>
     <w:multiLevelType w:val="hybridMultilevel"/>
     <w:tmpl w:val="CEEEFD42"/>
@@ -29469,7 +30520,7 @@
       </w:rPr>
     </w:lvl>
   </w:abstractNum>
-  <w:abstractNum w:abstractNumId="18" w15:restartNumberingAfterBreak="0">
+  <w:abstractNum w:abstractNumId="20" w15:restartNumberingAfterBreak="0">
     <w:nsid w:val="3B097DE7"/>
     <w:multiLevelType w:val="hybridMultilevel"/>
     <w:tmpl w:val="74FE8F7A"/>
@@ -29558,7 +30609,7 @@
       </w:pPr>
     </w:lvl>
   </w:abstractNum>
-  <w:abstractNum w:abstractNumId="19" w15:restartNumberingAfterBreak="0">
+  <w:abstractNum w:abstractNumId="21" w15:restartNumberingAfterBreak="0">
     <w:nsid w:val="3BDB019E"/>
     <w:multiLevelType w:val="hybridMultilevel"/>
     <w:tmpl w:val="EA9C07B0"/>
@@ -29671,7 +30722,7 @@
       </w:rPr>
     </w:lvl>
   </w:abstractNum>
-  <w:abstractNum w:abstractNumId="20" w15:restartNumberingAfterBreak="0">
+  <w:abstractNum w:abstractNumId="22" w15:restartNumberingAfterBreak="0">
     <w:nsid w:val="414C4452"/>
     <w:multiLevelType w:val="hybridMultilevel"/>
     <w:tmpl w:val="475CE3AE"/>
@@ -29784,7 +30835,7 @@
       </w:rPr>
     </w:lvl>
   </w:abstractNum>
-  <w:abstractNum w:abstractNumId="21" w15:restartNumberingAfterBreak="0">
+  <w:abstractNum w:abstractNumId="23" w15:restartNumberingAfterBreak="0">
     <w:nsid w:val="4755410C"/>
     <w:multiLevelType w:val="hybridMultilevel"/>
     <w:tmpl w:val="C1C67CA8"/>
@@ -29896,7 +30947,7 @@
       </w:rPr>
     </w:lvl>
   </w:abstractNum>
-  <w:abstractNum w:abstractNumId="22" w15:restartNumberingAfterBreak="0">
+  <w:abstractNum w:abstractNumId="24" w15:restartNumberingAfterBreak="0">
     <w:nsid w:val="475E131C"/>
     <w:multiLevelType w:val="hybridMultilevel"/>
     <w:tmpl w:val="4AA870B8"/>
@@ -29985,7 +31036,7 @@
       </w:pPr>
     </w:lvl>
   </w:abstractNum>
-  <w:abstractNum w:abstractNumId="23" w15:restartNumberingAfterBreak="0">
+  <w:abstractNum w:abstractNumId="25" w15:restartNumberingAfterBreak="0">
     <w:nsid w:val="4A4D3EFA"/>
     <w:multiLevelType w:val="hybridMultilevel"/>
     <w:tmpl w:val="F768D43C"/>
@@ -30074,7 +31125,7 @@
       </w:pPr>
     </w:lvl>
   </w:abstractNum>
-  <w:abstractNum w:abstractNumId="24" w15:restartNumberingAfterBreak="0">
+  <w:abstractNum w:abstractNumId="26" w15:restartNumberingAfterBreak="0">
     <w:nsid w:val="4D962741"/>
     <w:multiLevelType w:val="hybridMultilevel"/>
     <w:tmpl w:val="9F1EC26C"/>
@@ -30163,7 +31214,7 @@
       </w:pPr>
     </w:lvl>
   </w:abstractNum>
-  <w:abstractNum w:abstractNumId="25" w15:restartNumberingAfterBreak="0">
+  <w:abstractNum w:abstractNumId="27" w15:restartNumberingAfterBreak="0">
     <w:nsid w:val="4FE4300C"/>
     <w:multiLevelType w:val="hybridMultilevel"/>
     <w:tmpl w:val="C08098B2"/>
@@ -30252,7 +31303,7 @@
       </w:pPr>
     </w:lvl>
   </w:abstractNum>
-  <w:abstractNum w:abstractNumId="26" w15:restartNumberingAfterBreak="0">
+  <w:abstractNum w:abstractNumId="28" w15:restartNumberingAfterBreak="0">
     <w:nsid w:val="501E5C7A"/>
     <w:multiLevelType w:val="hybridMultilevel"/>
     <w:tmpl w:val="B0484AC6"/>
@@ -30341,7 +31392,7 @@
       </w:pPr>
     </w:lvl>
   </w:abstractNum>
-  <w:abstractNum w:abstractNumId="27" w15:restartNumberingAfterBreak="0">
+  <w:abstractNum w:abstractNumId="29" w15:restartNumberingAfterBreak="0">
     <w:nsid w:val="5309357D"/>
     <w:multiLevelType w:val="hybridMultilevel"/>
     <w:tmpl w:val="01B0FBFA"/>
@@ -30453,7 +31504,7 @@
       </w:rPr>
     </w:lvl>
   </w:abstractNum>
-  <w:abstractNum w:abstractNumId="28" w15:restartNumberingAfterBreak="0">
+  <w:abstractNum w:abstractNumId="30" w15:restartNumberingAfterBreak="0">
     <w:nsid w:val="53E42323"/>
     <w:multiLevelType w:val="hybridMultilevel"/>
     <w:tmpl w:val="41A0FD70"/>
@@ -30566,7 +31617,7 @@
       </w:rPr>
     </w:lvl>
   </w:abstractNum>
-  <w:abstractNum w:abstractNumId="29" w15:restartNumberingAfterBreak="0">
+  <w:abstractNum w:abstractNumId="31" w15:restartNumberingAfterBreak="0">
     <w:nsid w:val="5F0C2A9F"/>
     <w:multiLevelType w:val="hybridMultilevel"/>
     <w:tmpl w:val="1E5AD8A4"/>
@@ -30655,7 +31706,7 @@
       </w:pPr>
     </w:lvl>
   </w:abstractNum>
-  <w:abstractNum w:abstractNumId="30" w15:restartNumberingAfterBreak="0">
+  <w:abstractNum w:abstractNumId="32" w15:restartNumberingAfterBreak="0">
     <w:nsid w:val="61694E65"/>
     <w:multiLevelType w:val="hybridMultilevel"/>
     <w:tmpl w:val="9BD49816"/>
@@ -30768,7 +31819,96 @@
       </w:rPr>
     </w:lvl>
   </w:abstractNum>
-  <w:abstractNum w:abstractNumId="31" w15:restartNumberingAfterBreak="0">
+  <w:abstractNum w:abstractNumId="33" w15:restartNumberingAfterBreak="0">
+    <w:nsid w:val="62720567"/>
+    <w:multiLevelType w:val="hybridMultilevel"/>
+    <w:tmpl w:val="CB8EB606"/>
+    <w:lvl w:ilvl="0" w:tplc="0409000B">
+      <w:start w:val="1"/>
+      <w:numFmt w:val="bullet"/>
+      <w:lvlText w:val=""/>
+      <w:lvlJc w:val="left"/>
+      <w:pPr>
+        <w:ind w:left="720" w:hanging="360"/>
+      </w:pPr>
+      <w:rPr>
+        <w:rFonts w:ascii="Wingdings" w:hAnsi="Wingdings" w:hint="default"/>
+      </w:rPr>
+    </w:lvl>
+    <w:lvl w:ilvl="1" w:tplc="FFFFFFFF" w:tentative="1">
+      <w:start w:val="1"/>
+      <w:numFmt w:val="lowerLetter"/>
+      <w:lvlText w:val="%2."/>
+      <w:lvlJc w:val="left"/>
+      <w:pPr>
+        <w:ind w:left="1440" w:hanging="360"/>
+      </w:pPr>
+    </w:lvl>
+    <w:lvl w:ilvl="2" w:tplc="FFFFFFFF" w:tentative="1">
+      <w:start w:val="1"/>
+      <w:numFmt w:val="lowerRoman"/>
+      <w:lvlText w:val="%3."/>
+      <w:lvlJc w:val="right"/>
+      <w:pPr>
+        <w:ind w:left="2160" w:hanging="180"/>
+      </w:pPr>
+    </w:lvl>
+    <w:lvl w:ilvl="3" w:tplc="FFFFFFFF" w:tentative="1">
+      <w:start w:val="1"/>
+      <w:numFmt w:val="decimal"/>
+      <w:lvlText w:val="%4."/>
+      <w:lvlJc w:val="left"/>
+      <w:pPr>
+        <w:ind w:left="2880" w:hanging="360"/>
+      </w:pPr>
+    </w:lvl>
+    <w:lvl w:ilvl="4" w:tplc="FFFFFFFF" w:tentative="1">
+      <w:start w:val="1"/>
+      <w:numFmt w:val="lowerLetter"/>
+      <w:lvlText w:val="%5."/>
+      <w:lvlJc w:val="left"/>
+      <w:pPr>
+        <w:ind w:left="3600" w:hanging="360"/>
+      </w:pPr>
+    </w:lvl>
+    <w:lvl w:ilvl="5" w:tplc="FFFFFFFF" w:tentative="1">
+      <w:start w:val="1"/>
+      <w:numFmt w:val="lowerRoman"/>
+      <w:lvlText w:val="%6."/>
+      <w:lvlJc w:val="right"/>
+      <w:pPr>
+        <w:ind w:left="4320" w:hanging="180"/>
+      </w:pPr>
+    </w:lvl>
+    <w:lvl w:ilvl="6" w:tplc="FFFFFFFF" w:tentative="1">
+      <w:start w:val="1"/>
+      <w:numFmt w:val="decimal"/>
+      <w:lvlText w:val="%7."/>
+      <w:lvlJc w:val="left"/>
+      <w:pPr>
+        <w:ind w:left="5040" w:hanging="360"/>
+      </w:pPr>
+    </w:lvl>
+    <w:lvl w:ilvl="7" w:tplc="FFFFFFFF" w:tentative="1">
+      <w:start w:val="1"/>
+      <w:numFmt w:val="lowerLetter"/>
+      <w:lvlText w:val="%8."/>
+      <w:lvlJc w:val="left"/>
+      <w:pPr>
+        <w:ind w:left="5760" w:hanging="360"/>
+      </w:pPr>
+    </w:lvl>
+    <w:lvl w:ilvl="8" w:tplc="FFFFFFFF" w:tentative="1">
+      <w:start w:val="1"/>
+      <w:numFmt w:val="lowerRoman"/>
+      <w:lvlText w:val="%9."/>
+      <w:lvlJc w:val="right"/>
+      <w:pPr>
+        <w:ind w:left="6480" w:hanging="180"/>
+      </w:pPr>
+    </w:lvl>
+  </w:abstractNum>
+  <w:abstractNum w:abstractNumId="34" w15:restartNumberingAfterBreak="0">
     <w:nsid w:val="6372595E"/>
     <w:multiLevelType w:val="hybridMultilevel"/>
     <w:tmpl w:val="73C85C36"/>
@@ -30857,7 +31997,7 @@
       </w:pPr>
     </w:lvl>
   </w:abstractNum>
-  <w:abstractNum w:abstractNumId="32" w15:restartNumberingAfterBreak="0">
+  <w:abstractNum w:abstractNumId="35" w15:restartNumberingAfterBreak="0">
     <w:nsid w:val="6882040F"/>
     <w:multiLevelType w:val="multilevel"/>
     <w:tmpl w:val="40E4C784"/>
@@ -30978,7 +32118,7 @@
       </w:rPr>
     </w:lvl>
   </w:abstractNum>
-  <w:abstractNum w:abstractNumId="33" w15:restartNumberingAfterBreak="0">
+  <w:abstractNum w:abstractNumId="36" w15:restartNumberingAfterBreak="0">
     <w:nsid w:val="6BF5699A"/>
     <w:multiLevelType w:val="hybridMultilevel"/>
     <w:tmpl w:val="B70242AC"/>
@@ -31067,7 +32207,7 @@
       </w:pPr>
     </w:lvl>
   </w:abstractNum>
-  <w:abstractNum w:abstractNumId="34" w15:restartNumberingAfterBreak="0">
+  <w:abstractNum w:abstractNumId="37" w15:restartNumberingAfterBreak="0">
     <w:nsid w:val="6CE84068"/>
     <w:multiLevelType w:val="hybridMultilevel"/>
     <w:tmpl w:val="8FECEE7C"/>
@@ -31156,7 +32296,7 @@
       </w:pPr>
     </w:lvl>
   </w:abstractNum>
-  <w:abstractNum w:abstractNumId="35" w15:restartNumberingAfterBreak="0">
+  <w:abstractNum w:abstractNumId="38" w15:restartNumberingAfterBreak="0">
     <w:nsid w:val="7B1A71C9"/>
     <w:multiLevelType w:val="hybridMultilevel"/>
     <w:tmpl w:val="8C8A09F2"/>
@@ -31245,7 +32385,7 @@
       </w:pPr>
     </w:lvl>
   </w:abstractNum>
-  <w:abstractNum w:abstractNumId="36" w15:restartNumberingAfterBreak="0">
+  <w:abstractNum w:abstractNumId="39" w15:restartNumberingAfterBreak="0">
     <w:nsid w:val="7B2040A2"/>
     <w:multiLevelType w:val="hybridMultilevel"/>
     <w:tmpl w:val="D98A1B86"/>
@@ -31334,7 +32474,7 @@
       </w:pPr>
     </w:lvl>
   </w:abstractNum>
-  <w:abstractNum w:abstractNumId="37" w15:restartNumberingAfterBreak="0">
+  <w:abstractNum w:abstractNumId="40" w15:restartNumberingAfterBreak="0">
     <w:nsid w:val="7BCD3D14"/>
     <w:multiLevelType w:val="hybridMultilevel"/>
     <w:tmpl w:val="67AA612E"/>
@@ -31423,7 +32563,7 @@
       </w:pPr>
     </w:lvl>
   </w:abstractNum>
-  <w:abstractNum w:abstractNumId="38" w15:restartNumberingAfterBreak="0">
+  <w:abstractNum w:abstractNumId="41" w15:restartNumberingAfterBreak="0">
     <w:nsid w:val="7CEF2B35"/>
     <w:multiLevelType w:val="hybridMultilevel"/>
     <w:tmpl w:val="06A655B8"/>
@@ -31512,7 +32652,7 @@
       </w:pPr>
     </w:lvl>
   </w:abstractNum>
-  <w:abstractNum w:abstractNumId="39" w15:restartNumberingAfterBreak="0">
+  <w:abstractNum w:abstractNumId="42" w15:restartNumberingAfterBreak="0">
     <w:nsid w:val="7D5D3AE7"/>
     <w:multiLevelType w:val="hybridMultilevel"/>
     <w:tmpl w:val="F9EA4898"/>
@@ -31625,7 +32765,7 @@
       </w:rPr>
     </w:lvl>
   </w:abstractNum>
-  <w:abstractNum w:abstractNumId="40" w15:restartNumberingAfterBreak="0">
+  <w:abstractNum w:abstractNumId="43" w15:restartNumberingAfterBreak="0">
     <w:nsid w:val="7D76744D"/>
     <w:multiLevelType w:val="hybridMultilevel"/>
     <w:tmpl w:val="E8AEDA8C"/>
@@ -31738,7 +32878,7 @@
       </w:rPr>
     </w:lvl>
   </w:abstractNum>
-  <w:abstractNum w:abstractNumId="41" w15:restartNumberingAfterBreak="0">
+  <w:abstractNum w:abstractNumId="44" w15:restartNumberingAfterBreak="0">
     <w:nsid w:val="7ECE01C0"/>
     <w:multiLevelType w:val="hybridMultilevel"/>
     <w:tmpl w:val="A88233C2"/>
@@ -31852,46 +32992,46 @@
     </w:lvl>
   </w:abstractNum>
   <w:num w:numId="1">
-    <w:abstractNumId w:val="27"/>
+    <w:abstractNumId w:val="29"/>
   </w:num>
   <w:num w:numId="2">
-    <w:abstractNumId w:val="14"/>
+    <w:abstractNumId w:val="16"/>
   </w:num>
   <w:num w:numId="3">
     <w:abstractNumId w:val="1"/>
   </w:num>
   <w:num w:numId="4">
-    <w:abstractNumId w:val="32"/>
+    <w:abstractNumId w:val="35"/>
   </w:num>
   <w:num w:numId="5">
-    <w:abstractNumId w:val="15"/>
+    <w:abstractNumId w:val="17"/>
   </w:num>
   <w:num w:numId="6">
     <w:abstractNumId w:val="5"/>
   </w:num>
   <w:num w:numId="7">
-    <w:abstractNumId w:val="39"/>
+    <w:abstractNumId w:val="42"/>
   </w:num>
   <w:num w:numId="8">
-    <w:abstractNumId w:val="12"/>
+    <w:abstractNumId w:val="13"/>
   </w:num>
   <w:num w:numId="9">
     <w:abstractNumId w:val="4"/>
   </w:num>
   <w:num w:numId="10">
+    <w:abstractNumId w:val="32"/>
+  </w:num>
+  <w:num w:numId="11">
     <w:abstractNumId w:val="30"/>
   </w:num>
-  <w:num w:numId="11">
-    <w:abstractNumId w:val="28"/>
-  </w:num>
   <w:num w:numId="12">
-    <w:abstractNumId w:val="41"/>
+    <w:abstractNumId w:val="44"/>
   </w:num>
   <w:num w:numId="13">
-    <w:abstractNumId w:val="40"/>
+    <w:abstractNumId w:val="43"/>
   </w:num>
   <w:num w:numId="14">
-    <w:abstractNumId w:val="18"/>
+    <w:abstractNumId w:val="20"/>
   </w:num>
   <w:num w:numId="15">
     <w:abstractNumId w:val="0"/>
@@ -31906,76 +33046,85 @@
     <w:abstractNumId w:val="7"/>
   </w:num>
   <w:num w:numId="19">
-    <w:abstractNumId w:val="21"/>
+    <w:abstractNumId w:val="23"/>
   </w:num>
   <w:num w:numId="20">
-    <w:abstractNumId w:val="17"/>
+    <w:abstractNumId w:val="19"/>
   </w:num>
   <w:num w:numId="21">
-    <w:abstractNumId w:val="33"/>
+    <w:abstractNumId w:val="36"/>
   </w:num>
   <w:num w:numId="22">
-    <w:abstractNumId w:val="26"/>
+    <w:abstractNumId w:val="28"/>
   </w:num>
   <w:num w:numId="23">
-    <w:abstractNumId w:val="16"/>
+    <w:abstractNumId w:val="18"/>
   </w:num>
   <w:num w:numId="24">
     <w:abstractNumId w:val="8"/>
   </w:num>
   <w:num w:numId="25">
-    <w:abstractNumId w:val="29"/>
+    <w:abstractNumId w:val="31"/>
   </w:num>
   <w:num w:numId="26">
-    <w:abstractNumId w:val="22"/>
+    <w:abstractNumId w:val="24"/>
   </w:num>
   <w:num w:numId="27">
-    <w:abstractNumId w:val="23"/>
+    <w:abstractNumId w:val="25"/>
   </w:num>
   <w:num w:numId="28">
-    <w:abstractNumId w:val="38"/>
+    <w:abstractNumId w:val="41"/>
   </w:num>
   <w:num w:numId="29">
-    <w:abstractNumId w:val="11"/>
+    <w:abstractNumId w:val="12"/>
   </w:num>
   <w:num w:numId="30">
-    <w:abstractNumId w:val="13"/>
+    <w:abstractNumId w:val="14"/>
   </w:num>
   <w:num w:numId="31">
-    <w:abstractNumId w:val="24"/>
+    <w:abstractNumId w:val="26"/>
   </w:num>
   <w:num w:numId="32">
     <w:abstractNumId w:val="9"/>
   </w:num>
   <w:num w:numId="33">
-    <w:abstractNumId w:val="20"/>
+    <w:abstractNumId w:val="22"/>
   </w:num>
   <w:num w:numId="34">
     <w:abstractNumId w:val="3"/>
   </w:num>
   <w:num w:numId="35">
+    <w:abstractNumId w:val="37"/>
+  </w:num>
+  <w:num w:numId="36">
+    <w:abstractNumId w:val="21"/>
+  </w:num>
+  <w:num w:numId="37">
     <w:abstractNumId w:val="34"/>
   </w:num>
-  <w:num w:numId="36">
-    <w:abstractNumId w:val="19"/>
-  </w:num>
-  <w:num w:numId="37">
-    <w:abstractNumId w:val="31"/>
-  </w:num>
   <w:num w:numId="38">
-    <w:abstractNumId w:val="36"/>
+    <w:abstractNumId w:val="39"/>
   </w:num>
   <w:num w:numId="39">
-    <w:abstractNumId w:val="25"/>
+    <w:abstractNumId w:val="27"/>
   </w:num>
   <w:num w:numId="40">
-    <w:abstractNumId w:val="35"/>
+    <w:abstractNumId w:val="38"/>
   </w:num>
   <w:num w:numId="41">
     <w:abstractNumId w:val="6"/>
   </w:num>
   <w:num w:numId="42">
-    <w:abstractNumId w:val="37"/>
+    <w:abstractNumId w:val="40"/>
+  </w:num>
+  <w:num w:numId="43">
+    <w:abstractNumId w:val="11"/>
+  </w:num>
+  <w:num w:numId="44">
+    <w:abstractNumId w:val="15"/>
+  </w:num>
+  <w:num w:numId="45">
+    <w:abstractNumId w:val="33"/>
   </w:num>
 </w:numbering>
 </file>

</xml_diff>

<commit_message>
feat: Cập nhật sơ đồ kiến trúc hệ thống, viết nhật ký Tuan04
</commit_message>
<xml_diff>
--- a/docs/BaoCao/BaoCao.docx
+++ b/docs/BaoCao/BaoCao.docx
@@ -4359,7 +4359,7 @@
       <w:pPr>
         <w:pStyle w:val="TableofFigures"/>
         <w:tabs>
-          <w:tab w:val="right" w:leader="dot" w:pos="9111"/>
+          <w:tab w:val="right" w:leader="dot" w:pos="9061"/>
         </w:tabs>
         <w:rPr>
           <w:rFonts w:eastAsiaTheme="minorEastAsia"/>
@@ -4390,7 +4390,7 @@
         </w:rPr>
         <w:fldChar w:fldCharType="separate"/>
       </w:r>
-      <w:hyperlink w:anchor="_Toc235797430" w:history="1">
+      <w:hyperlink w:anchor="_Toc236469866" w:history="1">
         <w:r>
           <w:rPr>
             <w:rStyle w:val="Hyperlink"/>
@@ -4418,7 +4418,7 @@
             <w:noProof/>
             <w:webHidden/>
           </w:rPr>
-          <w:instrText xml:space="preserve"> PAGEREF _Toc235797430 \h </w:instrText>
+          <w:instrText xml:space="preserve"> PAGEREF _Toc236469866 \h </w:instrText>
         </w:r>
         <w:r>
           <w:rPr>
@@ -4438,7 +4438,7 @@
             <w:noProof/>
             <w:webHidden/>
           </w:rPr>
-          <w:t>23</w:t>
+          <w:t>24</w:t>
         </w:r>
         <w:r>
           <w:rPr>
@@ -4453,14 +4453,14 @@
       <w:pPr>
         <w:pStyle w:val="TableofFigures"/>
         <w:tabs>
-          <w:tab w:val="right" w:leader="dot" w:pos="9111"/>
+          <w:tab w:val="right" w:leader="dot" w:pos="9061"/>
         </w:tabs>
         <w:rPr>
           <w:rFonts w:eastAsiaTheme="minorEastAsia"/>
           <w:noProof/>
         </w:rPr>
       </w:pPr>
-      <w:hyperlink w:anchor="_Toc235797431" w:history="1">
+      <w:hyperlink w:anchor="_Toc236469867" w:history="1">
         <w:r>
           <w:rPr>
             <w:rStyle w:val="Hyperlink"/>
@@ -4488,427 +4488,7 @@
             <w:noProof/>
             <w:webHidden/>
           </w:rPr>
-          <w:instrText xml:space="preserve"> PAGEREF _Toc235797431 \h </w:instrText>
-        </w:r>
-        <w:r>
-          <w:rPr>
-            <w:noProof/>
-            <w:webHidden/>
-          </w:rPr>
-        </w:r>
-        <w:r>
-          <w:rPr>
-            <w:noProof/>
-            <w:webHidden/>
-          </w:rPr>
-          <w:fldChar w:fldCharType="separate"/>
-        </w:r>
-        <w:r>
-          <w:rPr>
-            <w:noProof/>
-            <w:webHidden/>
-          </w:rPr>
-          <w:t>28</w:t>
-        </w:r>
-        <w:r>
-          <w:rPr>
-            <w:noProof/>
-            <w:webHidden/>
-          </w:rPr>
-          <w:fldChar w:fldCharType="end"/>
-        </w:r>
-      </w:hyperlink>
-    </w:p>
-    <w:p>
-      <w:pPr>
-        <w:pStyle w:val="TableofFigures"/>
-        <w:tabs>
-          <w:tab w:val="right" w:leader="dot" w:pos="9111"/>
-        </w:tabs>
-        <w:rPr>
-          <w:rFonts w:eastAsiaTheme="minorEastAsia"/>
-          <w:noProof/>
-        </w:rPr>
-      </w:pPr>
-      <w:hyperlink w:anchor="_Toc235797432" w:history="1">
-        <w:r>
-          <w:rPr>
-            <w:rStyle w:val="Hyperlink"/>
-            <w:rFonts w:ascii="Times New Roman" w:hAnsi="Times New Roman" w:cs="Times New Roman"/>
-            <w:noProof/>
-          </w:rPr>
-          <w:t>Hình 3: Activity Diagram mô tả Chuyển Lead thành Customer</w:t>
-        </w:r>
-        <w:r>
-          <w:rPr>
-            <w:noProof/>
-            <w:webHidden/>
-          </w:rPr>
-          <w:tab/>
-        </w:r>
-        <w:r>
-          <w:rPr>
-            <w:noProof/>
-            <w:webHidden/>
-          </w:rPr>
-          <w:fldChar w:fldCharType="begin"/>
-        </w:r>
-        <w:r>
-          <w:rPr>
-            <w:noProof/>
-            <w:webHidden/>
-          </w:rPr>
-          <w:instrText xml:space="preserve"> PAGEREF _Toc235797432 \h </w:instrText>
-        </w:r>
-        <w:r>
-          <w:rPr>
-            <w:noProof/>
-            <w:webHidden/>
-          </w:rPr>
-        </w:r>
-        <w:r>
-          <w:rPr>
-            <w:noProof/>
-            <w:webHidden/>
-          </w:rPr>
-          <w:fldChar w:fldCharType="separate"/>
-        </w:r>
-        <w:r>
-          <w:rPr>
-            <w:noProof/>
-            <w:webHidden/>
-          </w:rPr>
-          <w:t>28</w:t>
-        </w:r>
-        <w:r>
-          <w:rPr>
-            <w:noProof/>
-            <w:webHidden/>
-          </w:rPr>
-          <w:fldChar w:fldCharType="end"/>
-        </w:r>
-      </w:hyperlink>
-    </w:p>
-    <w:p>
-      <w:pPr>
-        <w:pStyle w:val="TableofFigures"/>
-        <w:tabs>
-          <w:tab w:val="right" w:leader="dot" w:pos="9111"/>
-        </w:tabs>
-        <w:rPr>
-          <w:rFonts w:eastAsiaTheme="minorEastAsia"/>
-          <w:noProof/>
-        </w:rPr>
-      </w:pPr>
-      <w:hyperlink w:anchor="_Toc235797433" w:history="1">
-        <w:r>
-          <w:rPr>
-            <w:rStyle w:val="Hyperlink"/>
-            <w:rFonts w:ascii="Times New Roman" w:hAnsi="Times New Roman" w:cs="Times New Roman"/>
-            <w:noProof/>
-          </w:rPr>
-          <w:t>Hình 4: Activity Diagram mô tả tạo Deal</w:t>
-        </w:r>
-        <w:r>
-          <w:rPr>
-            <w:noProof/>
-            <w:webHidden/>
-          </w:rPr>
-          <w:tab/>
-        </w:r>
-        <w:r>
-          <w:rPr>
-            <w:noProof/>
-            <w:webHidden/>
-          </w:rPr>
-          <w:fldChar w:fldCharType="begin"/>
-        </w:r>
-        <w:r>
-          <w:rPr>
-            <w:noProof/>
-            <w:webHidden/>
-          </w:rPr>
-          <w:instrText xml:space="preserve"> PAGEREF _Toc235797433 \h </w:instrText>
-        </w:r>
-        <w:r>
-          <w:rPr>
-            <w:noProof/>
-            <w:webHidden/>
-          </w:rPr>
-        </w:r>
-        <w:r>
-          <w:rPr>
-            <w:noProof/>
-            <w:webHidden/>
-          </w:rPr>
-          <w:fldChar w:fldCharType="separate"/>
-        </w:r>
-        <w:r>
-          <w:rPr>
-            <w:noProof/>
-            <w:webHidden/>
-          </w:rPr>
-          <w:t>29</w:t>
-        </w:r>
-        <w:r>
-          <w:rPr>
-            <w:noProof/>
-            <w:webHidden/>
-          </w:rPr>
-          <w:fldChar w:fldCharType="end"/>
-        </w:r>
-      </w:hyperlink>
-    </w:p>
-    <w:p>
-      <w:pPr>
-        <w:pStyle w:val="TableofFigures"/>
-        <w:tabs>
-          <w:tab w:val="right" w:leader="dot" w:pos="9111"/>
-        </w:tabs>
-        <w:rPr>
-          <w:rFonts w:eastAsiaTheme="minorEastAsia"/>
-          <w:noProof/>
-        </w:rPr>
-      </w:pPr>
-      <w:hyperlink w:anchor="_Toc235797434" w:history="1">
-        <w:r>
-          <w:rPr>
-            <w:rStyle w:val="Hyperlink"/>
-            <w:rFonts w:ascii="Times New Roman" w:hAnsi="Times New Roman" w:cs="Times New Roman"/>
-            <w:noProof/>
-          </w:rPr>
-          <w:t>Hình 5: Activity Diagram mô tả tạo báo giá</w:t>
-        </w:r>
-        <w:r>
-          <w:rPr>
-            <w:noProof/>
-            <w:webHidden/>
-          </w:rPr>
-          <w:tab/>
-        </w:r>
-        <w:r>
-          <w:rPr>
-            <w:noProof/>
-            <w:webHidden/>
-          </w:rPr>
-          <w:fldChar w:fldCharType="begin"/>
-        </w:r>
-        <w:r>
-          <w:rPr>
-            <w:noProof/>
-            <w:webHidden/>
-          </w:rPr>
-          <w:instrText xml:space="preserve"> PAGEREF _Toc235797434 \h </w:instrText>
-        </w:r>
-        <w:r>
-          <w:rPr>
-            <w:noProof/>
-            <w:webHidden/>
-          </w:rPr>
-        </w:r>
-        <w:r>
-          <w:rPr>
-            <w:noProof/>
-            <w:webHidden/>
-          </w:rPr>
-          <w:fldChar w:fldCharType="separate"/>
-        </w:r>
-        <w:r>
-          <w:rPr>
-            <w:noProof/>
-            <w:webHidden/>
-          </w:rPr>
-          <w:t>29</w:t>
-        </w:r>
-        <w:r>
-          <w:rPr>
-            <w:noProof/>
-            <w:webHidden/>
-          </w:rPr>
-          <w:fldChar w:fldCharType="end"/>
-        </w:r>
-      </w:hyperlink>
-    </w:p>
-    <w:p>
-      <w:pPr>
-        <w:pStyle w:val="TableofFigures"/>
-        <w:tabs>
-          <w:tab w:val="right" w:leader="dot" w:pos="9111"/>
-        </w:tabs>
-        <w:rPr>
-          <w:rFonts w:eastAsiaTheme="minorEastAsia"/>
-          <w:noProof/>
-        </w:rPr>
-      </w:pPr>
-      <w:hyperlink w:anchor="_Toc235797435" w:history="1">
-        <w:r>
-          <w:rPr>
-            <w:rStyle w:val="Hyperlink"/>
-            <w:rFonts w:ascii="Times New Roman" w:hAnsi="Times New Roman" w:cs="Times New Roman"/>
-            <w:noProof/>
-          </w:rPr>
-          <w:t>Hình 6: Activity Diagram mô tả chuyển đổi giai đoạn Pipeline</w:t>
-        </w:r>
-        <w:r>
-          <w:rPr>
-            <w:noProof/>
-            <w:webHidden/>
-          </w:rPr>
-          <w:tab/>
-        </w:r>
-        <w:r>
-          <w:rPr>
-            <w:noProof/>
-            <w:webHidden/>
-          </w:rPr>
-          <w:fldChar w:fldCharType="begin"/>
-        </w:r>
-        <w:r>
-          <w:rPr>
-            <w:noProof/>
-            <w:webHidden/>
-          </w:rPr>
-          <w:instrText xml:space="preserve"> PAGEREF _Toc235797435 \h </w:instrText>
-        </w:r>
-        <w:r>
-          <w:rPr>
-            <w:noProof/>
-            <w:webHidden/>
-          </w:rPr>
-        </w:r>
-        <w:r>
-          <w:rPr>
-            <w:noProof/>
-            <w:webHidden/>
-          </w:rPr>
-          <w:fldChar w:fldCharType="separate"/>
-        </w:r>
-        <w:r>
-          <w:rPr>
-            <w:noProof/>
-            <w:webHidden/>
-          </w:rPr>
-          <w:t>30</w:t>
-        </w:r>
-        <w:r>
-          <w:rPr>
-            <w:noProof/>
-            <w:webHidden/>
-          </w:rPr>
-          <w:fldChar w:fldCharType="end"/>
-        </w:r>
-      </w:hyperlink>
-    </w:p>
-    <w:p>
-      <w:pPr>
-        <w:pStyle w:val="TableofFigures"/>
-        <w:tabs>
-          <w:tab w:val="right" w:leader="dot" w:pos="9111"/>
-        </w:tabs>
-        <w:rPr>
-          <w:rFonts w:eastAsiaTheme="minorEastAsia"/>
-          <w:noProof/>
-        </w:rPr>
-      </w:pPr>
-      <w:hyperlink w:anchor="_Toc235797436" w:history="1">
-        <w:r>
-          <w:rPr>
-            <w:rStyle w:val="Hyperlink"/>
-            <w:rFonts w:ascii="Times New Roman" w:hAnsi="Times New Roman" w:cs="Times New Roman"/>
-            <w:noProof/>
-          </w:rPr>
-          <w:t>Hình 7: Sequence Diagram mô tả quy trình chuyển Lead thành Customer</w:t>
-        </w:r>
-        <w:r>
-          <w:rPr>
-            <w:noProof/>
-            <w:webHidden/>
-          </w:rPr>
-          <w:tab/>
-        </w:r>
-        <w:r>
-          <w:rPr>
-            <w:noProof/>
-            <w:webHidden/>
-          </w:rPr>
-          <w:fldChar w:fldCharType="begin"/>
-        </w:r>
-        <w:r>
-          <w:rPr>
-            <w:noProof/>
-            <w:webHidden/>
-          </w:rPr>
-          <w:instrText xml:space="preserve"> PAGEREF _Toc235797436 \h </w:instrText>
-        </w:r>
-        <w:r>
-          <w:rPr>
-            <w:noProof/>
-            <w:webHidden/>
-          </w:rPr>
-        </w:r>
-        <w:r>
-          <w:rPr>
-            <w:noProof/>
-            <w:webHidden/>
-          </w:rPr>
-          <w:fldChar w:fldCharType="separate"/>
-        </w:r>
-        <w:r>
-          <w:rPr>
-            <w:noProof/>
-            <w:webHidden/>
-          </w:rPr>
-          <w:t>31</w:t>
-        </w:r>
-        <w:r>
-          <w:rPr>
-            <w:noProof/>
-            <w:webHidden/>
-          </w:rPr>
-          <w:fldChar w:fldCharType="end"/>
-        </w:r>
-      </w:hyperlink>
-    </w:p>
-    <w:p>
-      <w:pPr>
-        <w:pStyle w:val="TableofFigures"/>
-        <w:tabs>
-          <w:tab w:val="right" w:leader="dot" w:pos="9111"/>
-        </w:tabs>
-        <w:rPr>
-          <w:rFonts w:eastAsiaTheme="minorEastAsia"/>
-          <w:noProof/>
-        </w:rPr>
-      </w:pPr>
-      <w:hyperlink w:anchor="_Toc235797437" w:history="1">
-        <w:r>
-          <w:rPr>
-            <w:rStyle w:val="Hyperlink"/>
-            <w:rFonts w:ascii="Times New Roman" w:hAnsi="Times New Roman" w:cs="Times New Roman"/>
-            <w:noProof/>
-          </w:rPr>
-          <w:t>Hình 8: Sequence Diagram mô tả quy trình tạo Deal mới</w:t>
-        </w:r>
-        <w:r>
-          <w:rPr>
-            <w:noProof/>
-            <w:webHidden/>
-          </w:rPr>
-          <w:tab/>
-        </w:r>
-        <w:r>
-          <w:rPr>
-            <w:noProof/>
-            <w:webHidden/>
-          </w:rPr>
-          <w:fldChar w:fldCharType="begin"/>
-        </w:r>
-        <w:r>
-          <w:rPr>
-            <w:noProof/>
-            <w:webHidden/>
-          </w:rPr>
-          <w:instrText xml:space="preserve"> PAGEREF _Toc235797437 \h </w:instrText>
+          <w:instrText xml:space="preserve"> PAGEREF _Toc236469867 \h </w:instrText>
         </w:r>
         <w:r>
           <w:rPr>
@@ -4943,21 +4523,21 @@
       <w:pPr>
         <w:pStyle w:val="TableofFigures"/>
         <w:tabs>
-          <w:tab w:val="right" w:leader="dot" w:pos="9111"/>
+          <w:tab w:val="right" w:leader="dot" w:pos="9061"/>
         </w:tabs>
         <w:rPr>
           <w:rFonts w:eastAsiaTheme="minorEastAsia"/>
           <w:noProof/>
         </w:rPr>
       </w:pPr>
-      <w:hyperlink w:anchor="_Toc235797438" w:history="1">
+      <w:hyperlink w:anchor="_Toc236469868" w:history="1">
         <w:r>
           <w:rPr>
             <w:rStyle w:val="Hyperlink"/>
             <w:rFonts w:ascii="Times New Roman" w:hAnsi="Times New Roman" w:cs="Times New Roman"/>
             <w:noProof/>
           </w:rPr>
-          <w:t>Hình 9: Sequence Diagram mô tả quy trình thay đổi trạng thái trang Pipeline</w:t>
+          <w:t>Hình 3: Activity Diagram mô tả Chuyển Lead thành Customer</w:t>
         </w:r>
         <w:r>
           <w:rPr>
@@ -4978,7 +4558,77 @@
             <w:noProof/>
             <w:webHidden/>
           </w:rPr>
-          <w:instrText xml:space="preserve"> PAGEREF _Toc235797438 \h </w:instrText>
+          <w:instrText xml:space="preserve"> PAGEREF _Toc236469868 \h </w:instrText>
+        </w:r>
+        <w:r>
+          <w:rPr>
+            <w:noProof/>
+            <w:webHidden/>
+          </w:rPr>
+        </w:r>
+        <w:r>
+          <w:rPr>
+            <w:noProof/>
+            <w:webHidden/>
+          </w:rPr>
+          <w:fldChar w:fldCharType="separate"/>
+        </w:r>
+        <w:r>
+          <w:rPr>
+            <w:noProof/>
+            <w:webHidden/>
+          </w:rPr>
+          <w:t>32</w:t>
+        </w:r>
+        <w:r>
+          <w:rPr>
+            <w:noProof/>
+            <w:webHidden/>
+          </w:rPr>
+          <w:fldChar w:fldCharType="end"/>
+        </w:r>
+      </w:hyperlink>
+    </w:p>
+    <w:p>
+      <w:pPr>
+        <w:pStyle w:val="TableofFigures"/>
+        <w:tabs>
+          <w:tab w:val="right" w:leader="dot" w:pos="9061"/>
+        </w:tabs>
+        <w:rPr>
+          <w:rFonts w:eastAsiaTheme="minorEastAsia"/>
+          <w:noProof/>
+        </w:rPr>
+      </w:pPr>
+      <w:hyperlink w:anchor="_Toc236469869" w:history="1">
+        <w:r>
+          <w:rPr>
+            <w:rStyle w:val="Hyperlink"/>
+            <w:rFonts w:ascii="Times New Roman" w:hAnsi="Times New Roman" w:cs="Times New Roman"/>
+            <w:noProof/>
+          </w:rPr>
+          <w:t>Hình 4: Activity Diagram mô tả tạo Deal</w:t>
+        </w:r>
+        <w:r>
+          <w:rPr>
+            <w:noProof/>
+            <w:webHidden/>
+          </w:rPr>
+          <w:tab/>
+        </w:r>
+        <w:r>
+          <w:rPr>
+            <w:noProof/>
+            <w:webHidden/>
+          </w:rPr>
+          <w:fldChar w:fldCharType="begin"/>
+        </w:r>
+        <w:r>
+          <w:rPr>
+            <w:noProof/>
+            <w:webHidden/>
+          </w:rPr>
+          <w:instrText xml:space="preserve"> PAGEREF _Toc236469869 \h </w:instrText>
         </w:r>
         <w:r>
           <w:rPr>
@@ -5013,21 +4663,21 @@
       <w:pPr>
         <w:pStyle w:val="TableofFigures"/>
         <w:tabs>
-          <w:tab w:val="right" w:leader="dot" w:pos="9111"/>
+          <w:tab w:val="right" w:leader="dot" w:pos="9061"/>
         </w:tabs>
         <w:rPr>
           <w:rFonts w:eastAsiaTheme="minorEastAsia"/>
           <w:noProof/>
         </w:rPr>
       </w:pPr>
-      <w:hyperlink w:anchor="_Toc235797439" w:history="1">
+      <w:hyperlink w:anchor="_Toc236469870" w:history="1">
         <w:r>
           <w:rPr>
             <w:rStyle w:val="Hyperlink"/>
             <w:rFonts w:ascii="Times New Roman" w:hAnsi="Times New Roman" w:cs="Times New Roman"/>
             <w:noProof/>
           </w:rPr>
-          <w:t>Hình 10: Class Diagram</w:t>
+          <w:t>Hình 5: Activity Diagram mô tả tạo báo giá</w:t>
         </w:r>
         <w:r>
           <w:rPr>
@@ -5048,7 +4698,77 @@
             <w:noProof/>
             <w:webHidden/>
           </w:rPr>
-          <w:instrText xml:space="preserve"> PAGEREF _Toc235797439 \h </w:instrText>
+          <w:instrText xml:space="preserve"> PAGEREF _Toc236469870 \h </w:instrText>
+        </w:r>
+        <w:r>
+          <w:rPr>
+            <w:noProof/>
+            <w:webHidden/>
+          </w:rPr>
+        </w:r>
+        <w:r>
+          <w:rPr>
+            <w:noProof/>
+            <w:webHidden/>
+          </w:rPr>
+          <w:fldChar w:fldCharType="separate"/>
+        </w:r>
+        <w:r>
+          <w:rPr>
+            <w:noProof/>
+            <w:webHidden/>
+          </w:rPr>
+          <w:t>33</w:t>
+        </w:r>
+        <w:r>
+          <w:rPr>
+            <w:noProof/>
+            <w:webHidden/>
+          </w:rPr>
+          <w:fldChar w:fldCharType="end"/>
+        </w:r>
+      </w:hyperlink>
+    </w:p>
+    <w:p>
+      <w:pPr>
+        <w:pStyle w:val="TableofFigures"/>
+        <w:tabs>
+          <w:tab w:val="right" w:leader="dot" w:pos="9061"/>
+        </w:tabs>
+        <w:rPr>
+          <w:rFonts w:eastAsiaTheme="minorEastAsia"/>
+          <w:noProof/>
+        </w:rPr>
+      </w:pPr>
+      <w:hyperlink w:anchor="_Toc236469871" w:history="1">
+        <w:r>
+          <w:rPr>
+            <w:rStyle w:val="Hyperlink"/>
+            <w:rFonts w:ascii="Times New Roman" w:hAnsi="Times New Roman" w:cs="Times New Roman"/>
+            <w:noProof/>
+          </w:rPr>
+          <w:t>Hình 6: Activity Diagram mô tả chuyển đổi giai đoạn Pipeline</w:t>
+        </w:r>
+        <w:r>
+          <w:rPr>
+            <w:noProof/>
+            <w:webHidden/>
+          </w:rPr>
+          <w:tab/>
+        </w:r>
+        <w:r>
+          <w:rPr>
+            <w:noProof/>
+            <w:webHidden/>
+          </w:rPr>
+          <w:fldChar w:fldCharType="begin"/>
+        </w:r>
+        <w:r>
+          <w:rPr>
+            <w:noProof/>
+            <w:webHidden/>
+          </w:rPr>
+          <w:instrText xml:space="preserve"> PAGEREF _Toc236469871 \h </w:instrText>
         </w:r>
         <w:r>
           <w:rPr>
@@ -5083,21 +4803,21 @@
       <w:pPr>
         <w:pStyle w:val="TableofFigures"/>
         <w:tabs>
-          <w:tab w:val="right" w:leader="dot" w:pos="9111"/>
+          <w:tab w:val="right" w:leader="dot" w:pos="9061"/>
         </w:tabs>
         <w:rPr>
           <w:rFonts w:eastAsiaTheme="minorEastAsia"/>
           <w:noProof/>
         </w:rPr>
       </w:pPr>
-      <w:hyperlink w:anchor="_Toc235797440" w:history="1">
+      <w:hyperlink w:anchor="_Toc236469872" w:history="1">
         <w:r>
           <w:rPr>
             <w:rStyle w:val="Hyperlink"/>
             <w:rFonts w:ascii="Times New Roman" w:hAnsi="Times New Roman" w:cs="Times New Roman"/>
             <w:noProof/>
           </w:rPr>
-          <w:t>Hình 11: Entity Relationshop Diagram</w:t>
+          <w:t>Hình 7: Sequence Diagram mô tả quy trình chuyển Lead thành Customer</w:t>
         </w:r>
         <w:r>
           <w:rPr>
@@ -5118,7 +4838,7 @@
             <w:noProof/>
             <w:webHidden/>
           </w:rPr>
-          <w:instrText xml:space="preserve"> PAGEREF _Toc235797440 \h </w:instrText>
+          <w:instrText xml:space="preserve"> PAGEREF _Toc236469872 \h </w:instrText>
         </w:r>
         <w:r>
           <w:rPr>
@@ -5153,21 +4873,21 @@
       <w:pPr>
         <w:pStyle w:val="TableofFigures"/>
         <w:tabs>
-          <w:tab w:val="right" w:leader="dot" w:pos="9111"/>
+          <w:tab w:val="right" w:leader="dot" w:pos="9061"/>
         </w:tabs>
         <w:rPr>
           <w:rFonts w:eastAsiaTheme="minorEastAsia"/>
           <w:noProof/>
         </w:rPr>
       </w:pPr>
-      <w:hyperlink r:id="rId9" w:anchor="_Toc235797441" w:history="1">
+      <w:hyperlink w:anchor="_Toc236469873" w:history="1">
         <w:r>
           <w:rPr>
             <w:rStyle w:val="Hyperlink"/>
             <w:rFonts w:ascii="Times New Roman" w:hAnsi="Times New Roman" w:cs="Times New Roman"/>
             <w:noProof/>
           </w:rPr>
-          <w:t>Hình 12: Kiến trúc tổng thể</w:t>
+          <w:t>Hình 8: Sequence Diagram mô tả quy trình tạo Deal mới</w:t>
         </w:r>
         <w:r>
           <w:rPr>
@@ -5188,7 +4908,7 @@
             <w:noProof/>
             <w:webHidden/>
           </w:rPr>
-          <w:instrText xml:space="preserve"> PAGEREF _Toc235797441 \h </w:instrText>
+          <w:instrText xml:space="preserve"> PAGEREF _Toc236469873 \h </w:instrText>
         </w:r>
         <w:r>
           <w:rPr>
@@ -5223,21 +4943,21 @@
       <w:pPr>
         <w:pStyle w:val="TableofFigures"/>
         <w:tabs>
-          <w:tab w:val="right" w:leader="dot" w:pos="9111"/>
+          <w:tab w:val="right" w:leader="dot" w:pos="9061"/>
         </w:tabs>
         <w:rPr>
           <w:rFonts w:eastAsiaTheme="minorEastAsia"/>
           <w:noProof/>
         </w:rPr>
       </w:pPr>
-      <w:hyperlink w:anchor="_Toc235797442" w:history="1">
+      <w:hyperlink w:anchor="_Toc236469874" w:history="1">
         <w:r>
           <w:rPr>
             <w:rStyle w:val="Hyperlink"/>
             <w:rFonts w:ascii="Times New Roman" w:hAnsi="Times New Roman" w:cs="Times New Roman"/>
             <w:noProof/>
           </w:rPr>
-          <w:t>Hình 13: Kiến trúc Modular</w:t>
+          <w:t>Hình 9: Sequence Diagram mô tả quy trình thay đổi trạng thái trang Pipeline</w:t>
         </w:r>
         <w:r>
           <w:rPr>
@@ -5258,7 +4978,7 @@
             <w:noProof/>
             <w:webHidden/>
           </w:rPr>
-          <w:instrText xml:space="preserve"> PAGEREF _Toc235797442 \h </w:instrText>
+          <w:instrText xml:space="preserve"> PAGEREF _Toc236469874 \h </w:instrText>
         </w:r>
         <w:r>
           <w:rPr>
@@ -5293,21 +5013,21 @@
       <w:pPr>
         <w:pStyle w:val="TableofFigures"/>
         <w:tabs>
-          <w:tab w:val="right" w:leader="dot" w:pos="9111"/>
+          <w:tab w:val="right" w:leader="dot" w:pos="9061"/>
         </w:tabs>
         <w:rPr>
           <w:rFonts w:eastAsiaTheme="minorEastAsia"/>
           <w:noProof/>
         </w:rPr>
       </w:pPr>
-      <w:hyperlink w:anchor="_Toc235797443" w:history="1">
+      <w:hyperlink w:anchor="_Toc236469875" w:history="1">
         <w:r>
           <w:rPr>
             <w:rStyle w:val="Hyperlink"/>
             <w:rFonts w:ascii="Times New Roman" w:hAnsi="Times New Roman" w:cs="Times New Roman"/>
             <w:noProof/>
           </w:rPr>
-          <w:t>Hình 14: Kiến trúc của một Module</w:t>
+          <w:t>Hình 10: Class Diagram</w:t>
         </w:r>
         <w:r>
           <w:rPr>
@@ -5328,77 +5048,7 @@
             <w:noProof/>
             <w:webHidden/>
           </w:rPr>
-          <w:instrText xml:space="preserve"> PAGEREF _Toc235797443 \h </w:instrText>
-        </w:r>
-        <w:r>
-          <w:rPr>
-            <w:noProof/>
-            <w:webHidden/>
-          </w:rPr>
-        </w:r>
-        <w:r>
-          <w:rPr>
-            <w:noProof/>
-            <w:webHidden/>
-          </w:rPr>
-          <w:fldChar w:fldCharType="separate"/>
-        </w:r>
-        <w:r>
-          <w:rPr>
-            <w:noProof/>
-            <w:webHidden/>
-          </w:rPr>
-          <w:t>37</w:t>
-        </w:r>
-        <w:r>
-          <w:rPr>
-            <w:noProof/>
-            <w:webHidden/>
-          </w:rPr>
-          <w:fldChar w:fldCharType="end"/>
-        </w:r>
-      </w:hyperlink>
-    </w:p>
-    <w:p>
-      <w:pPr>
-        <w:pStyle w:val="TableofFigures"/>
-        <w:tabs>
-          <w:tab w:val="right" w:leader="dot" w:pos="9111"/>
-        </w:tabs>
-        <w:rPr>
-          <w:rFonts w:eastAsiaTheme="minorEastAsia"/>
-          <w:noProof/>
-        </w:rPr>
-      </w:pPr>
-      <w:hyperlink w:anchor="_Toc235797444" w:history="1">
-        <w:r>
-          <w:rPr>
-            <w:rStyle w:val="Hyperlink"/>
-            <w:rFonts w:ascii="Times New Roman" w:hAnsi="Times New Roman" w:cs="Times New Roman"/>
-            <w:noProof/>
-          </w:rPr>
-          <w:t>Hình 15: Luồng xử lý yêu cầu đăng nhập thông qua RESTful API</w:t>
-        </w:r>
-        <w:r>
-          <w:rPr>
-            <w:noProof/>
-            <w:webHidden/>
-          </w:rPr>
-          <w:tab/>
-        </w:r>
-        <w:r>
-          <w:rPr>
-            <w:noProof/>
-            <w:webHidden/>
-          </w:rPr>
-          <w:fldChar w:fldCharType="begin"/>
-        </w:r>
-        <w:r>
-          <w:rPr>
-            <w:noProof/>
-            <w:webHidden/>
-          </w:rPr>
-          <w:instrText xml:space="preserve"> PAGEREF _Toc235797444 \h </w:instrText>
+          <w:instrText xml:space="preserve"> PAGEREF _Toc236469875 \h </w:instrText>
         </w:r>
         <w:r>
           <w:rPr>
@@ -5433,21 +5083,21 @@
       <w:pPr>
         <w:pStyle w:val="TableofFigures"/>
         <w:tabs>
-          <w:tab w:val="right" w:leader="dot" w:pos="9111"/>
+          <w:tab w:val="right" w:leader="dot" w:pos="9061"/>
         </w:tabs>
         <w:rPr>
           <w:rFonts w:eastAsiaTheme="minorEastAsia"/>
           <w:noProof/>
         </w:rPr>
       </w:pPr>
-      <w:hyperlink w:anchor="_Toc235797445" w:history="1">
+      <w:hyperlink w:anchor="_Toc236469876" w:history="1">
         <w:r>
           <w:rPr>
             <w:rStyle w:val="Hyperlink"/>
             <w:rFonts w:ascii="Times New Roman" w:hAnsi="Times New Roman" w:cs="Times New Roman"/>
             <w:noProof/>
           </w:rPr>
-          <w:t>Hình 16: Luồng xử lý dữ liệu</w:t>
+          <w:t>Hình 11: Entity Relationshop Diagram</w:t>
         </w:r>
         <w:r>
           <w:rPr>
@@ -5468,77 +5118,7 @@
             <w:noProof/>
             <w:webHidden/>
           </w:rPr>
-          <w:instrText xml:space="preserve"> PAGEREF _Toc235797445 \h </w:instrText>
-        </w:r>
-        <w:r>
-          <w:rPr>
-            <w:noProof/>
-            <w:webHidden/>
-          </w:rPr>
-        </w:r>
-        <w:r>
-          <w:rPr>
-            <w:noProof/>
-            <w:webHidden/>
-          </w:rPr>
-          <w:fldChar w:fldCharType="separate"/>
-        </w:r>
-        <w:r>
-          <w:rPr>
-            <w:noProof/>
-            <w:webHidden/>
-          </w:rPr>
-          <w:t>38</w:t>
-        </w:r>
-        <w:r>
-          <w:rPr>
-            <w:noProof/>
-            <w:webHidden/>
-          </w:rPr>
-          <w:fldChar w:fldCharType="end"/>
-        </w:r>
-      </w:hyperlink>
-    </w:p>
-    <w:p>
-      <w:pPr>
-        <w:pStyle w:val="TableofFigures"/>
-        <w:tabs>
-          <w:tab w:val="right" w:leader="dot" w:pos="9111"/>
-        </w:tabs>
-        <w:rPr>
-          <w:rFonts w:eastAsiaTheme="minorEastAsia"/>
-          <w:noProof/>
-        </w:rPr>
-      </w:pPr>
-      <w:hyperlink w:anchor="_Toc235797446" w:history="1">
-        <w:r>
-          <w:rPr>
-            <w:rStyle w:val="Hyperlink"/>
-            <w:rFonts w:ascii="Times New Roman" w:hAnsi="Times New Roman" w:cs="Times New Roman"/>
-            <w:noProof/>
-          </w:rPr>
-          <w:t>Hình 17: Wireframe đăng nhập hệ thống</w:t>
-        </w:r>
-        <w:r>
-          <w:rPr>
-            <w:noProof/>
-            <w:webHidden/>
-          </w:rPr>
-          <w:tab/>
-        </w:r>
-        <w:r>
-          <w:rPr>
-            <w:noProof/>
-            <w:webHidden/>
-          </w:rPr>
-          <w:fldChar w:fldCharType="begin"/>
-        </w:r>
-        <w:r>
-          <w:rPr>
-            <w:noProof/>
-            <w:webHidden/>
-          </w:rPr>
-          <w:instrText xml:space="preserve"> PAGEREF _Toc235797446 \h </w:instrText>
+          <w:instrText xml:space="preserve"> PAGEREF _Toc236469876 \h </w:instrText>
         </w:r>
         <w:r>
           <w:rPr>
@@ -5573,21 +5153,21 @@
       <w:pPr>
         <w:pStyle w:val="TableofFigures"/>
         <w:tabs>
-          <w:tab w:val="right" w:leader="dot" w:pos="9111"/>
+          <w:tab w:val="right" w:leader="dot" w:pos="9061"/>
         </w:tabs>
         <w:rPr>
           <w:rFonts w:eastAsiaTheme="minorEastAsia"/>
           <w:noProof/>
         </w:rPr>
       </w:pPr>
-      <w:hyperlink w:anchor="_Toc235797447" w:history="1">
+      <w:hyperlink w:anchor="_Toc236469877" w:history="1">
         <w:r>
           <w:rPr>
             <w:rStyle w:val="Hyperlink"/>
             <w:rFonts w:ascii="Times New Roman" w:hAnsi="Times New Roman" w:cs="Times New Roman"/>
             <w:noProof/>
           </w:rPr>
-          <w:t>Hình 18: Giao diện Dashboard tổng quan</w:t>
+          <w:t>Hình 12: Kiến trúc tổng thể</w:t>
         </w:r>
         <w:r>
           <w:rPr>
@@ -5608,217 +5188,7 @@
             <w:noProof/>
             <w:webHidden/>
           </w:rPr>
-          <w:instrText xml:space="preserve"> PAGEREF _Toc235797447 \h </w:instrText>
-        </w:r>
-        <w:r>
-          <w:rPr>
-            <w:noProof/>
-            <w:webHidden/>
-          </w:rPr>
-        </w:r>
-        <w:r>
-          <w:rPr>
-            <w:noProof/>
-            <w:webHidden/>
-          </w:rPr>
-          <w:fldChar w:fldCharType="separate"/>
-        </w:r>
-        <w:r>
-          <w:rPr>
-            <w:noProof/>
-            <w:webHidden/>
-          </w:rPr>
-          <w:t>39</w:t>
-        </w:r>
-        <w:r>
-          <w:rPr>
-            <w:noProof/>
-            <w:webHidden/>
-          </w:rPr>
-          <w:fldChar w:fldCharType="end"/>
-        </w:r>
-      </w:hyperlink>
-    </w:p>
-    <w:p>
-      <w:pPr>
-        <w:pStyle w:val="TableofFigures"/>
-        <w:tabs>
-          <w:tab w:val="right" w:leader="dot" w:pos="9111"/>
-        </w:tabs>
-        <w:rPr>
-          <w:rFonts w:eastAsiaTheme="minorEastAsia"/>
-          <w:noProof/>
-        </w:rPr>
-      </w:pPr>
-      <w:hyperlink w:anchor="_Toc235797448" w:history="1">
-        <w:r>
-          <w:rPr>
-            <w:rStyle w:val="Hyperlink"/>
-            <w:rFonts w:ascii="Times New Roman" w:hAnsi="Times New Roman" w:cs="Times New Roman"/>
-            <w:noProof/>
-          </w:rPr>
-          <w:t>Hình 19: Dashboard doanh thu bán hàng theo từng năm</w:t>
-        </w:r>
-        <w:r>
-          <w:rPr>
-            <w:noProof/>
-            <w:webHidden/>
-          </w:rPr>
-          <w:tab/>
-        </w:r>
-        <w:r>
-          <w:rPr>
-            <w:noProof/>
-            <w:webHidden/>
-          </w:rPr>
-          <w:fldChar w:fldCharType="begin"/>
-        </w:r>
-        <w:r>
-          <w:rPr>
-            <w:noProof/>
-            <w:webHidden/>
-          </w:rPr>
-          <w:instrText xml:space="preserve"> PAGEREF _Toc235797448 \h </w:instrText>
-        </w:r>
-        <w:r>
-          <w:rPr>
-            <w:noProof/>
-            <w:webHidden/>
-          </w:rPr>
-        </w:r>
-        <w:r>
-          <w:rPr>
-            <w:noProof/>
-            <w:webHidden/>
-          </w:rPr>
-          <w:fldChar w:fldCharType="separate"/>
-        </w:r>
-        <w:r>
-          <w:rPr>
-            <w:noProof/>
-            <w:webHidden/>
-          </w:rPr>
-          <w:t>40</w:t>
-        </w:r>
-        <w:r>
-          <w:rPr>
-            <w:noProof/>
-            <w:webHidden/>
-          </w:rPr>
-          <w:fldChar w:fldCharType="end"/>
-        </w:r>
-      </w:hyperlink>
-    </w:p>
-    <w:p>
-      <w:pPr>
-        <w:pStyle w:val="TableofFigures"/>
-        <w:tabs>
-          <w:tab w:val="right" w:leader="dot" w:pos="9111"/>
-        </w:tabs>
-        <w:rPr>
-          <w:rFonts w:eastAsiaTheme="minorEastAsia"/>
-          <w:noProof/>
-        </w:rPr>
-      </w:pPr>
-      <w:hyperlink w:anchor="_Toc235797449" w:history="1">
-        <w:r>
-          <w:rPr>
-            <w:rStyle w:val="Hyperlink"/>
-            <w:rFonts w:ascii="Times New Roman" w:hAnsi="Times New Roman" w:cs="Times New Roman"/>
-            <w:noProof/>
-          </w:rPr>
-          <w:t>Hình 20: Dashboard tổng quan các Deal theo giai đoạn và tổng giá trị của Pipeline</w:t>
-        </w:r>
-        <w:r>
-          <w:rPr>
-            <w:noProof/>
-            <w:webHidden/>
-          </w:rPr>
-          <w:tab/>
-        </w:r>
-        <w:r>
-          <w:rPr>
-            <w:noProof/>
-            <w:webHidden/>
-          </w:rPr>
-          <w:fldChar w:fldCharType="begin"/>
-        </w:r>
-        <w:r>
-          <w:rPr>
-            <w:noProof/>
-            <w:webHidden/>
-          </w:rPr>
-          <w:instrText xml:space="preserve"> PAGEREF _Toc235797449 \h </w:instrText>
-        </w:r>
-        <w:r>
-          <w:rPr>
-            <w:noProof/>
-            <w:webHidden/>
-          </w:rPr>
-        </w:r>
-        <w:r>
-          <w:rPr>
-            <w:noProof/>
-            <w:webHidden/>
-          </w:rPr>
-          <w:fldChar w:fldCharType="separate"/>
-        </w:r>
-        <w:r>
-          <w:rPr>
-            <w:noProof/>
-            <w:webHidden/>
-          </w:rPr>
-          <w:t>40</w:t>
-        </w:r>
-        <w:r>
-          <w:rPr>
-            <w:noProof/>
-            <w:webHidden/>
-          </w:rPr>
-          <w:fldChar w:fldCharType="end"/>
-        </w:r>
-      </w:hyperlink>
-    </w:p>
-    <w:p>
-      <w:pPr>
-        <w:pStyle w:val="TableofFigures"/>
-        <w:tabs>
-          <w:tab w:val="right" w:leader="dot" w:pos="9111"/>
-        </w:tabs>
-        <w:rPr>
-          <w:rFonts w:eastAsiaTheme="minorEastAsia"/>
-          <w:noProof/>
-        </w:rPr>
-      </w:pPr>
-      <w:hyperlink w:anchor="_Toc235797450" w:history="1">
-        <w:r>
-          <w:rPr>
-            <w:rStyle w:val="Hyperlink"/>
-            <w:rFonts w:ascii="Times New Roman" w:hAnsi="Times New Roman" w:cs="Times New Roman"/>
-            <w:noProof/>
-          </w:rPr>
-          <w:t>Hình 21: Các chỉ số thống kê Lead</w:t>
-        </w:r>
-        <w:r>
-          <w:rPr>
-            <w:noProof/>
-            <w:webHidden/>
-          </w:rPr>
-          <w:tab/>
-        </w:r>
-        <w:r>
-          <w:rPr>
-            <w:noProof/>
-            <w:webHidden/>
-          </w:rPr>
-          <w:fldChar w:fldCharType="begin"/>
-        </w:r>
-        <w:r>
-          <w:rPr>
-            <w:noProof/>
-            <w:webHidden/>
-          </w:rPr>
-          <w:instrText xml:space="preserve"> PAGEREF _Toc235797450 \h </w:instrText>
+          <w:instrText xml:space="preserve"> PAGEREF _Toc236469877 \h </w:instrText>
         </w:r>
         <w:r>
           <w:rPr>
@@ -5853,21 +5223,21 @@
       <w:pPr>
         <w:pStyle w:val="TableofFigures"/>
         <w:tabs>
-          <w:tab w:val="right" w:leader="dot" w:pos="9111"/>
+          <w:tab w:val="right" w:leader="dot" w:pos="9061"/>
         </w:tabs>
         <w:rPr>
           <w:rFonts w:eastAsiaTheme="minorEastAsia"/>
           <w:noProof/>
         </w:rPr>
       </w:pPr>
-      <w:hyperlink w:anchor="_Toc235797451" w:history="1">
+      <w:hyperlink w:anchor="_Toc236469878" w:history="1">
         <w:r>
           <w:rPr>
             <w:rStyle w:val="Hyperlink"/>
             <w:rFonts w:ascii="Times New Roman" w:hAnsi="Times New Roman" w:cs="Times New Roman"/>
             <w:noProof/>
           </w:rPr>
-          <w:t>Hình 22: Danh sách Lead</w:t>
+          <w:t>Hình 13: Kiến trúc Modular</w:t>
         </w:r>
         <w:r>
           <w:rPr>
@@ -5888,7 +5258,7 @@
             <w:noProof/>
             <w:webHidden/>
           </w:rPr>
-          <w:instrText xml:space="preserve"> PAGEREF _Toc235797451 \h </w:instrText>
+          <w:instrText xml:space="preserve"> PAGEREF _Toc236469878 \h </w:instrText>
         </w:r>
         <w:r>
           <w:rPr>
@@ -5923,21 +5293,21 @@
       <w:pPr>
         <w:pStyle w:val="TableofFigures"/>
         <w:tabs>
-          <w:tab w:val="right" w:leader="dot" w:pos="9111"/>
+          <w:tab w:val="right" w:leader="dot" w:pos="9061"/>
         </w:tabs>
         <w:rPr>
           <w:rFonts w:eastAsiaTheme="minorEastAsia"/>
           <w:noProof/>
         </w:rPr>
       </w:pPr>
-      <w:hyperlink w:anchor="_Toc235797452" w:history="1">
+      <w:hyperlink w:anchor="_Toc236469879" w:history="1">
         <w:r>
           <w:rPr>
             <w:rStyle w:val="Hyperlink"/>
             <w:rFonts w:ascii="Times New Roman" w:hAnsi="Times New Roman" w:cs="Times New Roman"/>
             <w:noProof/>
           </w:rPr>
-          <w:t>Hình 23: Giao diện quản lý Deal</w:t>
+          <w:t>Hình 14: Kiến trúc của một Module</w:t>
         </w:r>
         <w:r>
           <w:rPr>
@@ -5958,7 +5328,7 @@
             <w:noProof/>
             <w:webHidden/>
           </w:rPr>
-          <w:instrText xml:space="preserve"> PAGEREF _Toc235797452 \h </w:instrText>
+          <w:instrText xml:space="preserve"> PAGEREF _Toc236469879 \h </w:instrText>
         </w:r>
         <w:r>
           <w:rPr>
@@ -5993,14 +5363,644 @@
       <w:pPr>
         <w:pStyle w:val="TableofFigures"/>
         <w:tabs>
-          <w:tab w:val="right" w:leader="dot" w:pos="9111"/>
+          <w:tab w:val="right" w:leader="dot" w:pos="9061"/>
         </w:tabs>
         <w:rPr>
           <w:rFonts w:eastAsiaTheme="minorEastAsia"/>
           <w:noProof/>
         </w:rPr>
       </w:pPr>
-      <w:hyperlink w:anchor="_Toc235797453" w:history="1">
+      <w:hyperlink w:anchor="_Toc236469880" w:history="1">
+        <w:r>
+          <w:rPr>
+            <w:rStyle w:val="Hyperlink"/>
+            <w:rFonts w:ascii="Times New Roman" w:hAnsi="Times New Roman" w:cs="Times New Roman"/>
+            <w:noProof/>
+          </w:rPr>
+          <w:t>Hình 15: Luồng xử lý yêu cầu đăng nhập thông qua RESTful API</w:t>
+        </w:r>
+        <w:r>
+          <w:rPr>
+            <w:noProof/>
+            <w:webHidden/>
+          </w:rPr>
+          <w:tab/>
+        </w:r>
+        <w:r>
+          <w:rPr>
+            <w:noProof/>
+            <w:webHidden/>
+          </w:rPr>
+          <w:fldChar w:fldCharType="begin"/>
+        </w:r>
+        <w:r>
+          <w:rPr>
+            <w:noProof/>
+            <w:webHidden/>
+          </w:rPr>
+          <w:instrText xml:space="preserve"> PAGEREF _Toc236469880 \h </w:instrText>
+        </w:r>
+        <w:r>
+          <w:rPr>
+            <w:noProof/>
+            <w:webHidden/>
+          </w:rPr>
+        </w:r>
+        <w:r>
+          <w:rPr>
+            <w:noProof/>
+            <w:webHidden/>
+          </w:rPr>
+          <w:fldChar w:fldCharType="separate"/>
+        </w:r>
+        <w:r>
+          <w:rPr>
+            <w:noProof/>
+            <w:webHidden/>
+          </w:rPr>
+          <w:t>43</w:t>
+        </w:r>
+        <w:r>
+          <w:rPr>
+            <w:noProof/>
+            <w:webHidden/>
+          </w:rPr>
+          <w:fldChar w:fldCharType="end"/>
+        </w:r>
+      </w:hyperlink>
+    </w:p>
+    <w:p>
+      <w:pPr>
+        <w:pStyle w:val="TableofFigures"/>
+        <w:tabs>
+          <w:tab w:val="right" w:leader="dot" w:pos="9061"/>
+        </w:tabs>
+        <w:rPr>
+          <w:rFonts w:eastAsiaTheme="minorEastAsia"/>
+          <w:noProof/>
+        </w:rPr>
+      </w:pPr>
+      <w:hyperlink w:anchor="_Toc236469881" w:history="1">
+        <w:r>
+          <w:rPr>
+            <w:rStyle w:val="Hyperlink"/>
+            <w:rFonts w:ascii="Times New Roman" w:hAnsi="Times New Roman" w:cs="Times New Roman"/>
+            <w:noProof/>
+          </w:rPr>
+          <w:t>Hình 16: Luồng xử lý dữ liệu</w:t>
+        </w:r>
+        <w:r>
+          <w:rPr>
+            <w:noProof/>
+            <w:webHidden/>
+          </w:rPr>
+          <w:tab/>
+        </w:r>
+        <w:r>
+          <w:rPr>
+            <w:noProof/>
+            <w:webHidden/>
+          </w:rPr>
+          <w:fldChar w:fldCharType="begin"/>
+        </w:r>
+        <w:r>
+          <w:rPr>
+            <w:noProof/>
+            <w:webHidden/>
+          </w:rPr>
+          <w:instrText xml:space="preserve"> PAGEREF _Toc236469881 \h </w:instrText>
+        </w:r>
+        <w:r>
+          <w:rPr>
+            <w:noProof/>
+            <w:webHidden/>
+          </w:rPr>
+        </w:r>
+        <w:r>
+          <w:rPr>
+            <w:noProof/>
+            <w:webHidden/>
+          </w:rPr>
+          <w:fldChar w:fldCharType="separate"/>
+        </w:r>
+        <w:r>
+          <w:rPr>
+            <w:noProof/>
+            <w:webHidden/>
+          </w:rPr>
+          <w:t>43</w:t>
+        </w:r>
+        <w:r>
+          <w:rPr>
+            <w:noProof/>
+            <w:webHidden/>
+          </w:rPr>
+          <w:fldChar w:fldCharType="end"/>
+        </w:r>
+      </w:hyperlink>
+    </w:p>
+    <w:p>
+      <w:pPr>
+        <w:pStyle w:val="TableofFigures"/>
+        <w:tabs>
+          <w:tab w:val="right" w:leader="dot" w:pos="9061"/>
+        </w:tabs>
+        <w:rPr>
+          <w:rFonts w:eastAsiaTheme="minorEastAsia"/>
+          <w:noProof/>
+        </w:rPr>
+      </w:pPr>
+      <w:hyperlink w:anchor="_Toc236469882" w:history="1">
+        <w:r>
+          <w:rPr>
+            <w:rStyle w:val="Hyperlink"/>
+            <w:rFonts w:ascii="Times New Roman" w:hAnsi="Times New Roman" w:cs="Times New Roman"/>
+            <w:noProof/>
+          </w:rPr>
+          <w:t>Hình 17: Wireframe đăng nhập hệ thống</w:t>
+        </w:r>
+        <w:r>
+          <w:rPr>
+            <w:noProof/>
+            <w:webHidden/>
+          </w:rPr>
+          <w:tab/>
+        </w:r>
+        <w:r>
+          <w:rPr>
+            <w:noProof/>
+            <w:webHidden/>
+          </w:rPr>
+          <w:fldChar w:fldCharType="begin"/>
+        </w:r>
+        <w:r>
+          <w:rPr>
+            <w:noProof/>
+            <w:webHidden/>
+          </w:rPr>
+          <w:instrText xml:space="preserve"> PAGEREF _Toc236469882 \h </w:instrText>
+        </w:r>
+        <w:r>
+          <w:rPr>
+            <w:noProof/>
+            <w:webHidden/>
+          </w:rPr>
+        </w:r>
+        <w:r>
+          <w:rPr>
+            <w:noProof/>
+            <w:webHidden/>
+          </w:rPr>
+          <w:fldChar w:fldCharType="separate"/>
+        </w:r>
+        <w:r>
+          <w:rPr>
+            <w:noProof/>
+            <w:webHidden/>
+          </w:rPr>
+          <w:t>44</w:t>
+        </w:r>
+        <w:r>
+          <w:rPr>
+            <w:noProof/>
+            <w:webHidden/>
+          </w:rPr>
+          <w:fldChar w:fldCharType="end"/>
+        </w:r>
+      </w:hyperlink>
+    </w:p>
+    <w:p>
+      <w:pPr>
+        <w:pStyle w:val="TableofFigures"/>
+        <w:tabs>
+          <w:tab w:val="right" w:leader="dot" w:pos="9061"/>
+        </w:tabs>
+        <w:rPr>
+          <w:rFonts w:eastAsiaTheme="minorEastAsia"/>
+          <w:noProof/>
+        </w:rPr>
+      </w:pPr>
+      <w:hyperlink w:anchor="_Toc236469883" w:history="1">
+        <w:r>
+          <w:rPr>
+            <w:rStyle w:val="Hyperlink"/>
+            <w:rFonts w:ascii="Times New Roman" w:hAnsi="Times New Roman" w:cs="Times New Roman"/>
+            <w:noProof/>
+          </w:rPr>
+          <w:t>Hình 18: Giao diện Dashboard tổng quan</w:t>
+        </w:r>
+        <w:r>
+          <w:rPr>
+            <w:noProof/>
+            <w:webHidden/>
+          </w:rPr>
+          <w:tab/>
+        </w:r>
+        <w:r>
+          <w:rPr>
+            <w:noProof/>
+            <w:webHidden/>
+          </w:rPr>
+          <w:fldChar w:fldCharType="begin"/>
+        </w:r>
+        <w:r>
+          <w:rPr>
+            <w:noProof/>
+            <w:webHidden/>
+          </w:rPr>
+          <w:instrText xml:space="preserve"> PAGEREF _Toc236469883 \h </w:instrText>
+        </w:r>
+        <w:r>
+          <w:rPr>
+            <w:noProof/>
+            <w:webHidden/>
+          </w:rPr>
+        </w:r>
+        <w:r>
+          <w:rPr>
+            <w:noProof/>
+            <w:webHidden/>
+          </w:rPr>
+          <w:fldChar w:fldCharType="separate"/>
+        </w:r>
+        <w:r>
+          <w:rPr>
+            <w:noProof/>
+            <w:webHidden/>
+          </w:rPr>
+          <w:t>44</w:t>
+        </w:r>
+        <w:r>
+          <w:rPr>
+            <w:noProof/>
+            <w:webHidden/>
+          </w:rPr>
+          <w:fldChar w:fldCharType="end"/>
+        </w:r>
+      </w:hyperlink>
+    </w:p>
+    <w:p>
+      <w:pPr>
+        <w:pStyle w:val="TableofFigures"/>
+        <w:tabs>
+          <w:tab w:val="right" w:leader="dot" w:pos="9061"/>
+        </w:tabs>
+        <w:rPr>
+          <w:rFonts w:eastAsiaTheme="minorEastAsia"/>
+          <w:noProof/>
+        </w:rPr>
+      </w:pPr>
+      <w:hyperlink w:anchor="_Toc236469884" w:history="1">
+        <w:r>
+          <w:rPr>
+            <w:rStyle w:val="Hyperlink"/>
+            <w:rFonts w:ascii="Times New Roman" w:hAnsi="Times New Roman" w:cs="Times New Roman"/>
+            <w:noProof/>
+          </w:rPr>
+          <w:t>Hình 19: Dashboard doanh thu bán hàng theo từng năm</w:t>
+        </w:r>
+        <w:r>
+          <w:rPr>
+            <w:noProof/>
+            <w:webHidden/>
+          </w:rPr>
+          <w:tab/>
+        </w:r>
+        <w:r>
+          <w:rPr>
+            <w:noProof/>
+            <w:webHidden/>
+          </w:rPr>
+          <w:fldChar w:fldCharType="begin"/>
+        </w:r>
+        <w:r>
+          <w:rPr>
+            <w:noProof/>
+            <w:webHidden/>
+          </w:rPr>
+          <w:instrText xml:space="preserve"> PAGEREF _Toc236469884 \h </w:instrText>
+        </w:r>
+        <w:r>
+          <w:rPr>
+            <w:noProof/>
+            <w:webHidden/>
+          </w:rPr>
+        </w:r>
+        <w:r>
+          <w:rPr>
+            <w:noProof/>
+            <w:webHidden/>
+          </w:rPr>
+          <w:fldChar w:fldCharType="separate"/>
+        </w:r>
+        <w:r>
+          <w:rPr>
+            <w:noProof/>
+            <w:webHidden/>
+          </w:rPr>
+          <w:t>45</w:t>
+        </w:r>
+        <w:r>
+          <w:rPr>
+            <w:noProof/>
+            <w:webHidden/>
+          </w:rPr>
+          <w:fldChar w:fldCharType="end"/>
+        </w:r>
+      </w:hyperlink>
+    </w:p>
+    <w:p>
+      <w:pPr>
+        <w:pStyle w:val="TableofFigures"/>
+        <w:tabs>
+          <w:tab w:val="right" w:leader="dot" w:pos="9061"/>
+        </w:tabs>
+        <w:rPr>
+          <w:rFonts w:eastAsiaTheme="minorEastAsia"/>
+          <w:noProof/>
+        </w:rPr>
+      </w:pPr>
+      <w:hyperlink w:anchor="_Toc236469885" w:history="1">
+        <w:r>
+          <w:rPr>
+            <w:rStyle w:val="Hyperlink"/>
+            <w:rFonts w:ascii="Times New Roman" w:hAnsi="Times New Roman" w:cs="Times New Roman"/>
+            <w:noProof/>
+          </w:rPr>
+          <w:t>Hình 20: Dashboard tổng quan các Deal theo giai đoạn và tổng giá trị của Pipeline</w:t>
+        </w:r>
+        <w:r>
+          <w:rPr>
+            <w:noProof/>
+            <w:webHidden/>
+          </w:rPr>
+          <w:tab/>
+        </w:r>
+        <w:r>
+          <w:rPr>
+            <w:noProof/>
+            <w:webHidden/>
+          </w:rPr>
+          <w:fldChar w:fldCharType="begin"/>
+        </w:r>
+        <w:r>
+          <w:rPr>
+            <w:noProof/>
+            <w:webHidden/>
+          </w:rPr>
+          <w:instrText xml:space="preserve"> PAGEREF _Toc236469885 \h </w:instrText>
+        </w:r>
+        <w:r>
+          <w:rPr>
+            <w:noProof/>
+            <w:webHidden/>
+          </w:rPr>
+        </w:r>
+        <w:r>
+          <w:rPr>
+            <w:noProof/>
+            <w:webHidden/>
+          </w:rPr>
+          <w:fldChar w:fldCharType="separate"/>
+        </w:r>
+        <w:r>
+          <w:rPr>
+            <w:noProof/>
+            <w:webHidden/>
+          </w:rPr>
+          <w:t>45</w:t>
+        </w:r>
+        <w:r>
+          <w:rPr>
+            <w:noProof/>
+            <w:webHidden/>
+          </w:rPr>
+          <w:fldChar w:fldCharType="end"/>
+        </w:r>
+      </w:hyperlink>
+    </w:p>
+    <w:p>
+      <w:pPr>
+        <w:pStyle w:val="TableofFigures"/>
+        <w:tabs>
+          <w:tab w:val="right" w:leader="dot" w:pos="9061"/>
+        </w:tabs>
+        <w:rPr>
+          <w:rFonts w:eastAsiaTheme="minorEastAsia"/>
+          <w:noProof/>
+        </w:rPr>
+      </w:pPr>
+      <w:hyperlink w:anchor="_Toc236469886" w:history="1">
+        <w:r>
+          <w:rPr>
+            <w:rStyle w:val="Hyperlink"/>
+            <w:rFonts w:ascii="Times New Roman" w:hAnsi="Times New Roman" w:cs="Times New Roman"/>
+            <w:noProof/>
+          </w:rPr>
+          <w:t>Hình 21: Các chỉ số thống kê Lead</w:t>
+        </w:r>
+        <w:r>
+          <w:rPr>
+            <w:noProof/>
+            <w:webHidden/>
+          </w:rPr>
+          <w:tab/>
+        </w:r>
+        <w:r>
+          <w:rPr>
+            <w:noProof/>
+            <w:webHidden/>
+          </w:rPr>
+          <w:fldChar w:fldCharType="begin"/>
+        </w:r>
+        <w:r>
+          <w:rPr>
+            <w:noProof/>
+            <w:webHidden/>
+          </w:rPr>
+          <w:instrText xml:space="preserve"> PAGEREF _Toc236469886 \h </w:instrText>
+        </w:r>
+        <w:r>
+          <w:rPr>
+            <w:noProof/>
+            <w:webHidden/>
+          </w:rPr>
+        </w:r>
+        <w:r>
+          <w:rPr>
+            <w:noProof/>
+            <w:webHidden/>
+          </w:rPr>
+          <w:fldChar w:fldCharType="separate"/>
+        </w:r>
+        <w:r>
+          <w:rPr>
+            <w:noProof/>
+            <w:webHidden/>
+          </w:rPr>
+          <w:t>46</w:t>
+        </w:r>
+        <w:r>
+          <w:rPr>
+            <w:noProof/>
+            <w:webHidden/>
+          </w:rPr>
+          <w:fldChar w:fldCharType="end"/>
+        </w:r>
+      </w:hyperlink>
+    </w:p>
+    <w:p>
+      <w:pPr>
+        <w:pStyle w:val="TableofFigures"/>
+        <w:tabs>
+          <w:tab w:val="right" w:leader="dot" w:pos="9061"/>
+        </w:tabs>
+        <w:rPr>
+          <w:rFonts w:eastAsiaTheme="minorEastAsia"/>
+          <w:noProof/>
+        </w:rPr>
+      </w:pPr>
+      <w:hyperlink w:anchor="_Toc236469887" w:history="1">
+        <w:r>
+          <w:rPr>
+            <w:rStyle w:val="Hyperlink"/>
+            <w:rFonts w:ascii="Times New Roman" w:hAnsi="Times New Roman" w:cs="Times New Roman"/>
+            <w:noProof/>
+          </w:rPr>
+          <w:t>Hình 22: Danh sách Lead</w:t>
+        </w:r>
+        <w:r>
+          <w:rPr>
+            <w:noProof/>
+            <w:webHidden/>
+          </w:rPr>
+          <w:tab/>
+        </w:r>
+        <w:r>
+          <w:rPr>
+            <w:noProof/>
+            <w:webHidden/>
+          </w:rPr>
+          <w:fldChar w:fldCharType="begin"/>
+        </w:r>
+        <w:r>
+          <w:rPr>
+            <w:noProof/>
+            <w:webHidden/>
+          </w:rPr>
+          <w:instrText xml:space="preserve"> PAGEREF _Toc236469887 \h </w:instrText>
+        </w:r>
+        <w:r>
+          <w:rPr>
+            <w:noProof/>
+            <w:webHidden/>
+          </w:rPr>
+        </w:r>
+        <w:r>
+          <w:rPr>
+            <w:noProof/>
+            <w:webHidden/>
+          </w:rPr>
+          <w:fldChar w:fldCharType="separate"/>
+        </w:r>
+        <w:r>
+          <w:rPr>
+            <w:noProof/>
+            <w:webHidden/>
+          </w:rPr>
+          <w:t>46</w:t>
+        </w:r>
+        <w:r>
+          <w:rPr>
+            <w:noProof/>
+            <w:webHidden/>
+          </w:rPr>
+          <w:fldChar w:fldCharType="end"/>
+        </w:r>
+      </w:hyperlink>
+    </w:p>
+    <w:p>
+      <w:pPr>
+        <w:pStyle w:val="TableofFigures"/>
+        <w:tabs>
+          <w:tab w:val="right" w:leader="dot" w:pos="9061"/>
+        </w:tabs>
+        <w:rPr>
+          <w:rFonts w:eastAsiaTheme="minorEastAsia"/>
+          <w:noProof/>
+        </w:rPr>
+      </w:pPr>
+      <w:hyperlink w:anchor="_Toc236469888" w:history="1">
+        <w:r>
+          <w:rPr>
+            <w:rStyle w:val="Hyperlink"/>
+            <w:rFonts w:ascii="Times New Roman" w:hAnsi="Times New Roman" w:cs="Times New Roman"/>
+            <w:noProof/>
+          </w:rPr>
+          <w:t>Hình 23: Giao diện quản lý Deal</w:t>
+        </w:r>
+        <w:r>
+          <w:rPr>
+            <w:noProof/>
+            <w:webHidden/>
+          </w:rPr>
+          <w:tab/>
+        </w:r>
+        <w:r>
+          <w:rPr>
+            <w:noProof/>
+            <w:webHidden/>
+          </w:rPr>
+          <w:fldChar w:fldCharType="begin"/>
+        </w:r>
+        <w:r>
+          <w:rPr>
+            <w:noProof/>
+            <w:webHidden/>
+          </w:rPr>
+          <w:instrText xml:space="preserve"> PAGEREF _Toc236469888 \h </w:instrText>
+        </w:r>
+        <w:r>
+          <w:rPr>
+            <w:noProof/>
+            <w:webHidden/>
+          </w:rPr>
+        </w:r>
+        <w:r>
+          <w:rPr>
+            <w:noProof/>
+            <w:webHidden/>
+          </w:rPr>
+          <w:fldChar w:fldCharType="separate"/>
+        </w:r>
+        <w:r>
+          <w:rPr>
+            <w:noProof/>
+            <w:webHidden/>
+          </w:rPr>
+          <w:t>47</w:t>
+        </w:r>
+        <w:r>
+          <w:rPr>
+            <w:noProof/>
+            <w:webHidden/>
+          </w:rPr>
+          <w:fldChar w:fldCharType="end"/>
+        </w:r>
+      </w:hyperlink>
+    </w:p>
+    <w:p>
+      <w:pPr>
+        <w:pStyle w:val="TableofFigures"/>
+        <w:tabs>
+          <w:tab w:val="right" w:leader="dot" w:pos="9061"/>
+        </w:tabs>
+        <w:rPr>
+          <w:rFonts w:eastAsiaTheme="minorEastAsia"/>
+          <w:noProof/>
+        </w:rPr>
+      </w:pPr>
+      <w:hyperlink w:anchor="_Toc236469889" w:history="1">
         <w:r>
           <w:rPr>
             <w:rStyle w:val="Hyperlink"/>
@@ -6028,7 +6028,7 @@
             <w:noProof/>
             <w:webHidden/>
           </w:rPr>
-          <w:instrText xml:space="preserve"> PAGEREF _Toc235797453 \h </w:instrText>
+          <w:instrText xml:space="preserve"> PAGEREF _Toc236469889 \h </w:instrText>
         </w:r>
         <w:r>
           <w:rPr>
@@ -6048,7 +6048,7 @@
             <w:noProof/>
             <w:webHidden/>
           </w:rPr>
-          <w:t>42</w:t>
+          <w:t>47</w:t>
         </w:r>
         <w:r>
           <w:rPr>
@@ -6063,14 +6063,14 @@
       <w:pPr>
         <w:pStyle w:val="TableofFigures"/>
         <w:tabs>
-          <w:tab w:val="right" w:leader="dot" w:pos="9111"/>
+          <w:tab w:val="right" w:leader="dot" w:pos="9061"/>
         </w:tabs>
         <w:rPr>
           <w:rFonts w:eastAsiaTheme="minorEastAsia"/>
           <w:noProof/>
         </w:rPr>
       </w:pPr>
-      <w:hyperlink w:anchor="_Toc235797454" w:history="1">
+      <w:hyperlink w:anchor="_Toc236469890" w:history="1">
         <w:r>
           <w:rPr>
             <w:rStyle w:val="Hyperlink"/>
@@ -6098,7 +6098,7 @@
             <w:noProof/>
             <w:webHidden/>
           </w:rPr>
-          <w:instrText xml:space="preserve"> PAGEREF _Toc235797454 \h </w:instrText>
+          <w:instrText xml:space="preserve"> PAGEREF _Toc236469890 \h </w:instrText>
         </w:r>
         <w:r>
           <w:rPr>
@@ -6118,7 +6118,7 @@
             <w:noProof/>
             <w:webHidden/>
           </w:rPr>
-          <w:t>43</w:t>
+          <w:t>48</w:t>
         </w:r>
         <w:r>
           <w:rPr>
@@ -7465,8 +7465,42 @@
       <w:r>
         <w:fldChar w:fldCharType="end"/>
       </w:r>
-      <w:fldSimple w:instr=" TOC \h \z \c &quot;Bảng&quot; "/>
-      <w:fldSimple w:instr=" TOC \h \z \c &quot;Bảng&quot; "/>
+      <w:r>
+        <w:fldChar w:fldCharType="begin"/>
+      </w:r>
+      <w:r>
+        <w:instrText xml:space="preserve"> TOC \h \z \c "B</w:instrText>
+      </w:r>
+      <w:r>
+        <w:instrText>ả</w:instrText>
+      </w:r>
+      <w:r>
+        <w:instrText xml:space="preserve">ng" </w:instrText>
+      </w:r>
+      <w:r>
+        <w:fldChar w:fldCharType="separate"/>
+      </w:r>
+      <w:r>
+        <w:fldChar w:fldCharType="end"/>
+      </w:r>
+      <w:r>
+        <w:fldChar w:fldCharType="begin"/>
+      </w:r>
+      <w:r>
+        <w:instrText xml:space="preserve"> TOC \h \z \c "B</w:instrText>
+      </w:r>
+      <w:r>
+        <w:instrText>ả</w:instrText>
+      </w:r>
+      <w:r>
+        <w:instrText xml:space="preserve">ng" </w:instrText>
+      </w:r>
+      <w:r>
+        <w:fldChar w:fldCharType="separate"/>
+      </w:r>
+      <w:r>
+        <w:fldChar w:fldCharType="end"/>
+      </w:r>
       <w:r>
         <w:br w:type="page"/>
       </w:r>
@@ -8139,15 +8173,15 @@
           <w:rFonts w:ascii="Times New Roman" w:hAnsi="Times New Roman" w:cs="Times New Roman"/>
         </w:rPr>
       </w:pPr>
-      <w:bookmarkStart w:id="17" w:name="_Toc235563704"/>
-      <w:bookmarkStart w:id="18" w:name="_Toc236288458"/>
+      <w:bookmarkStart w:id="17" w:name="_Toc236288458"/>
+      <w:bookmarkStart w:id="18" w:name="_Toc235563704"/>
       <w:r>
         <w:rPr>
           <w:rFonts w:ascii="Times New Roman" w:hAnsi="Times New Roman" w:cs="Times New Roman"/>
         </w:rPr>
         <w:t>PHẠM VI NGOÀI</w:t>
       </w:r>
-      <w:bookmarkEnd w:id="18"/>
+      <w:bookmarkEnd w:id="17"/>
     </w:p>
     <w:p>
       <w:pPr>
@@ -8335,7 +8369,7 @@
         </w:rPr>
         <w:t>ĐỐI TƯỢNG</w:t>
       </w:r>
-      <w:bookmarkEnd w:id="17"/>
+      <w:bookmarkEnd w:id="18"/>
       <w:bookmarkEnd w:id="19"/>
     </w:p>
     <w:p>
@@ -14135,8 +14169,8 @@
           <w:rFonts w:ascii="Times New Roman" w:hAnsi="Times New Roman" w:cs="Times New Roman"/>
         </w:rPr>
       </w:pPr>
-      <w:bookmarkStart w:id="59" w:name="_Toc235563720"/>
-      <w:bookmarkStart w:id="60" w:name="_Toc236288483"/>
+      <w:bookmarkStart w:id="59" w:name="_Toc236288483"/>
+      <w:bookmarkStart w:id="60" w:name="_Toc235563720"/>
       <w:r>
         <w:rPr>
           <w:rFonts w:ascii="Times New Roman" w:hAnsi="Times New Roman" w:cs="Times New Roman"/>
@@ -14144,7 +14178,7 @@
         <w:lastRenderedPageBreak/>
         <w:t>QUY TẮC NGHIỆP VỤ</w:t>
       </w:r>
-      <w:bookmarkEnd w:id="60"/>
+      <w:bookmarkEnd w:id="59"/>
     </w:p>
     <w:tbl>
       <w:tblPr>
@@ -15242,7 +15276,7 @@
         <w:lastRenderedPageBreak/>
         <w:t>USE-CASE DIAGRAM</w:t>
       </w:r>
-      <w:bookmarkEnd w:id="59"/>
+      <w:bookmarkEnd w:id="60"/>
       <w:bookmarkEnd w:id="62"/>
     </w:p>
     <w:p>
@@ -15269,7 +15303,7 @@
                     <pic:cNvPicPr/>
                   </pic:nvPicPr>
                   <pic:blipFill>
-                    <a:blip r:embed="rId10">
+                    <a:blip r:embed="rId9">
                       <a:extLst>
                         <a:ext uri="{28A0092B-C50C-407E-A947-70E740481C1C}">
                           <a14:useLocalDpi xmlns:a14="http://schemas.microsoft.com/office/drawing/2010/main" val="0"/>
@@ -15306,7 +15340,7 @@
         </w:rPr>
       </w:pPr>
       <w:bookmarkStart w:id="63" w:name="_Toc235641387"/>
-      <w:bookmarkStart w:id="64" w:name="_Toc235797430"/>
+      <w:bookmarkStart w:id="64" w:name="_Toc236469866"/>
       <w:r>
         <w:rPr>
           <w:rFonts w:ascii="Times New Roman" w:hAnsi="Times New Roman" w:cs="Times New Roman"/>
@@ -26515,7 +26549,7 @@
                     <pic:cNvPicPr/>
                   </pic:nvPicPr>
                   <pic:blipFill>
-                    <a:blip r:embed="rId11">
+                    <a:blip r:embed="rId10">
                       <a:extLst>
                         <a:ext uri="{28A0092B-C50C-407E-A947-70E740481C1C}">
                           <a14:useLocalDpi xmlns:a14="http://schemas.microsoft.com/office/drawing/2010/main" val="0"/>
@@ -26551,7 +26585,7 @@
           <w:szCs w:val="26"/>
         </w:rPr>
       </w:pPr>
-      <w:bookmarkStart w:id="83" w:name="_Toc235797431"/>
+      <w:bookmarkStart w:id="83" w:name="_Toc236469867"/>
       <w:r>
         <w:rPr>
           <w:rFonts w:ascii="Times New Roman" w:hAnsi="Times New Roman" w:cs="Times New Roman"/>
@@ -26668,7 +26702,7 @@
                     <pic:cNvPicPr/>
                   </pic:nvPicPr>
                   <pic:blipFill>
-                    <a:blip r:embed="rId12">
+                    <a:blip r:embed="rId11">
                       <a:extLst>
                         <a:ext uri="{28A0092B-C50C-407E-A947-70E740481C1C}">
                           <a14:useLocalDpi xmlns:a14="http://schemas.microsoft.com/office/drawing/2010/main" val="0"/>
@@ -26704,7 +26738,7 @@
           <w:szCs w:val="26"/>
         </w:rPr>
       </w:pPr>
-      <w:bookmarkStart w:id="84" w:name="_Toc235797432"/>
+      <w:bookmarkStart w:id="84" w:name="_Toc236469868"/>
       <w:r>
         <w:rPr>
           <w:rFonts w:ascii="Times New Roman" w:hAnsi="Times New Roman" w:cs="Times New Roman"/>
@@ -26809,7 +26843,7 @@
                     <pic:cNvPicPr/>
                   </pic:nvPicPr>
                   <pic:blipFill>
-                    <a:blip r:embed="rId13">
+                    <a:blip r:embed="rId12">
                       <a:extLst>
                         <a:ext uri="{28A0092B-C50C-407E-A947-70E740481C1C}">
                           <a14:useLocalDpi xmlns:a14="http://schemas.microsoft.com/office/drawing/2010/main" val="0"/>
@@ -26845,7 +26879,7 @@
           <w:szCs w:val="26"/>
         </w:rPr>
       </w:pPr>
-      <w:bookmarkStart w:id="85" w:name="_Toc235797433"/>
+      <w:bookmarkStart w:id="85" w:name="_Toc236469869"/>
       <w:r>
         <w:rPr>
           <w:rFonts w:ascii="Times New Roman" w:hAnsi="Times New Roman" w:cs="Times New Roman"/>
@@ -26957,7 +26991,7 @@
                     <pic:cNvPicPr/>
                   </pic:nvPicPr>
                   <pic:blipFill>
-                    <a:blip r:embed="rId14">
+                    <a:blip r:embed="rId13">
                       <a:extLst>
                         <a:ext uri="{28A0092B-C50C-407E-A947-70E740481C1C}">
                           <a14:useLocalDpi xmlns:a14="http://schemas.microsoft.com/office/drawing/2010/main" val="0"/>
@@ -26993,7 +27027,7 @@
           <w:szCs w:val="26"/>
         </w:rPr>
       </w:pPr>
-      <w:bookmarkStart w:id="86" w:name="_Toc235797434"/>
+      <w:bookmarkStart w:id="86" w:name="_Toc236469870"/>
       <w:r>
         <w:rPr>
           <w:rFonts w:ascii="Times New Roman" w:hAnsi="Times New Roman" w:cs="Times New Roman"/>
@@ -27122,7 +27156,7 @@
                     <pic:cNvPicPr/>
                   </pic:nvPicPr>
                   <pic:blipFill>
-                    <a:blip r:embed="rId15">
+                    <a:blip r:embed="rId14">
                       <a:extLst>
                         <a:ext uri="{28A0092B-C50C-407E-A947-70E740481C1C}">
                           <a14:useLocalDpi xmlns:a14="http://schemas.microsoft.com/office/drawing/2010/main" val="0"/>
@@ -27158,7 +27192,7 @@
           <w:szCs w:val="26"/>
         </w:rPr>
       </w:pPr>
-      <w:bookmarkStart w:id="87" w:name="_Toc235797435"/>
+      <w:bookmarkStart w:id="87" w:name="_Toc236469871"/>
       <w:r>
         <w:rPr>
           <w:rFonts w:ascii="Times New Roman" w:hAnsi="Times New Roman" w:cs="Times New Roman"/>
@@ -27287,7 +27321,7 @@
                     <pic:cNvPicPr/>
                   </pic:nvPicPr>
                   <pic:blipFill>
-                    <a:blip r:embed="rId16" cstate="print">
+                    <a:blip r:embed="rId15" cstate="print">
                       <a:extLst>
                         <a:ext uri="{28A0092B-C50C-407E-A947-70E740481C1C}">
                           <a14:useLocalDpi xmlns:a14="http://schemas.microsoft.com/office/drawing/2010/main" val="0"/>
@@ -27323,7 +27357,7 @@
           <w:szCs w:val="26"/>
         </w:rPr>
       </w:pPr>
-      <w:bookmarkStart w:id="90" w:name="_Toc235797436"/>
+      <w:bookmarkStart w:id="90" w:name="_Toc236469872"/>
       <w:r>
         <w:rPr>
           <w:rFonts w:ascii="Times New Roman" w:hAnsi="Times New Roman" w:cs="Times New Roman"/>
@@ -27428,7 +27462,7 @@
                     <pic:cNvPicPr/>
                   </pic:nvPicPr>
                   <pic:blipFill>
-                    <a:blip r:embed="rId17" cstate="print">
+                    <a:blip r:embed="rId16" cstate="print">
                       <a:extLst>
                         <a:ext uri="{28A0092B-C50C-407E-A947-70E740481C1C}">
                           <a14:useLocalDpi xmlns:a14="http://schemas.microsoft.com/office/drawing/2010/main" val="0"/>
@@ -27464,7 +27498,7 @@
           <w:szCs w:val="26"/>
         </w:rPr>
       </w:pPr>
-      <w:bookmarkStart w:id="91" w:name="_Toc235797437"/>
+      <w:bookmarkStart w:id="91" w:name="_Toc236469873"/>
       <w:r>
         <w:rPr>
           <w:rFonts w:ascii="Times New Roman" w:hAnsi="Times New Roman" w:cs="Times New Roman"/>
@@ -27569,7 +27603,7 @@
                     <pic:cNvPicPr/>
                   </pic:nvPicPr>
                   <pic:blipFill>
-                    <a:blip r:embed="rId18" cstate="print">
+                    <a:blip r:embed="rId17" cstate="print">
                       <a:extLst>
                         <a:ext uri="{28A0092B-C50C-407E-A947-70E740481C1C}">
                           <a14:useLocalDpi xmlns:a14="http://schemas.microsoft.com/office/drawing/2010/main" val="0"/>
@@ -27605,7 +27639,7 @@
           <w:szCs w:val="26"/>
         </w:rPr>
       </w:pPr>
-      <w:bookmarkStart w:id="92" w:name="_Toc235797438"/>
+      <w:bookmarkStart w:id="92" w:name="_Toc236469874"/>
       <w:r>
         <w:rPr>
           <w:rFonts w:ascii="Times New Roman" w:hAnsi="Times New Roman" w:cs="Times New Roman"/>
@@ -27728,7 +27762,7 @@
                     <pic:cNvPicPr/>
                   </pic:nvPicPr>
                   <pic:blipFill>
-                    <a:blip r:embed="rId19">
+                    <a:blip r:embed="rId18">
                       <a:extLst>
                         <a:ext uri="{28A0092B-C50C-407E-A947-70E740481C1C}">
                           <a14:useLocalDpi xmlns:a14="http://schemas.microsoft.com/office/drawing/2010/main" val="0"/>
@@ -27764,7 +27798,7 @@
           <w:szCs w:val="26"/>
         </w:rPr>
       </w:pPr>
-      <w:bookmarkStart w:id="95" w:name="_Toc235797439"/>
+      <w:bookmarkStart w:id="95" w:name="_Toc236469875"/>
       <w:r>
         <w:rPr>
           <w:rFonts w:ascii="Times New Roman" w:hAnsi="Times New Roman" w:cs="Times New Roman"/>
@@ -28145,7 +28179,7 @@
                     <pic:cNvPicPr/>
                   </pic:nvPicPr>
                   <pic:blipFill>
-                    <a:blip r:embed="rId20" cstate="print">
+                    <a:blip r:embed="rId19" cstate="print">
                       <a:extLst>
                         <a:ext uri="{28A0092B-C50C-407E-A947-70E740481C1C}">
                           <a14:useLocalDpi xmlns:a14="http://schemas.microsoft.com/office/drawing/2010/main" val="0"/>
@@ -28181,7 +28215,7 @@
           <w:szCs w:val="26"/>
         </w:rPr>
       </w:pPr>
-      <w:bookmarkStart w:id="97" w:name="_Toc235797440"/>
+      <w:bookmarkStart w:id="97" w:name="_Toc236469876"/>
       <w:r>
         <w:rPr>
           <w:rFonts w:ascii="Times New Roman" w:hAnsi="Times New Roman" w:cs="Times New Roman"/>
@@ -29319,273 +29353,74 @@
         <w:rPr>
           <w:rFonts w:ascii="Times New Roman" w:hAnsi="Times New Roman" w:cs="Times New Roman"/>
         </w:rPr>
+        <w:t xml:space="preserve">KIẾN </w:t>
+      </w:r>
+      <w:r>
+        <w:rPr>
+          <w:rFonts w:ascii="Times New Roman" w:hAnsi="Times New Roman" w:cs="Times New Roman"/>
+        </w:rPr>
+        <w:t>TRÚC HỆ THỐNG</w:t>
+      </w:r>
+      <w:bookmarkEnd w:id="100"/>
+    </w:p>
+    <w:p>
+      <w:pPr>
+        <w:pStyle w:val="Heading3"/>
+        <w:rPr>
+          <w:rFonts w:ascii="Times New Roman" w:hAnsi="Times New Roman" w:cs="Times New Roman"/>
+        </w:rPr>
+      </w:pPr>
+      <w:bookmarkStart w:id="101" w:name="_Toc236288492"/>
+      <w:r>
+        <w:rPr>
+          <w:rFonts w:ascii="Times New Roman" w:hAnsi="Times New Roman" w:cs="Times New Roman"/>
+        </w:rPr>
+        <w:t>Kiến trúc tổng thể</w:t>
+      </w:r>
+      <w:bookmarkEnd w:id="101"/>
+    </w:p>
+    <w:p>
+      <w:pPr>
+        <w:rPr>
+          <w:rFonts w:ascii="Times New Roman" w:hAnsi="Times New Roman" w:cs="Times New Roman"/>
+          <w:sz w:val="26"/>
+          <w:szCs w:val="26"/>
+        </w:rPr>
+      </w:pPr>
+      <w:r>
+        <w:rPr>
+          <w:rFonts w:ascii="Times New Roman" w:hAnsi="Times New Roman" w:cs="Times New Roman"/>
+          <w:sz w:val="26"/>
+          <w:szCs w:val="26"/>
+        </w:rPr>
+        <w:t>Kiến</w:t>
+      </w:r>
+      <w:r>
+        <w:rPr>
+          <w:rFonts w:ascii="Times New Roman" w:hAnsi="Times New Roman" w:cs="Times New Roman"/>
+          <w:sz w:val="26"/>
+          <w:szCs w:val="26"/>
+        </w:rPr>
+        <w:t xml:space="preserve"> trúc tổng thể của hệ thống CRM được xây dựng theo mô hình Client – Server. Người dùng truy cập hệ thống thông qua trình duyệt web và thao tác trên giao diện được phát triển bởi Next.js. Các thao tác và yêu cầu của người dùng sẽ được gửi đến back-end thông qua RESTful API. Back-end được xây dựng bằng NestJS theo kiến trúc Modular để xử lý nghiệp vụ và sử dụng Prisma ORM để truy cập vào PostgreSQL.</w:t>
+      </w:r>
+    </w:p>
+    <w:p>
+      <w:pPr>
+        <w:keepNext/>
+      </w:pPr>
+      <w:r>
+        <w:rPr>
+          <w:rFonts w:ascii="Times New Roman" w:hAnsi="Times New Roman" w:cs="Times New Roman"/>
+          <w:noProof/>
+          <w:sz w:val="26"/>
+          <w:szCs w:val="26"/>
+        </w:rPr>
         <w:lastRenderedPageBreak/>
-        <w:t xml:space="preserve">KIẾN </w:t>
-      </w:r>
-      <w:r>
-        <w:rPr>
-          <w:rFonts w:ascii="Times New Roman" w:hAnsi="Times New Roman" w:cs="Times New Roman"/>
-        </w:rPr>
-        <w:t>TRÚC HỆ THỐNG</w:t>
-      </w:r>
-      <w:bookmarkEnd w:id="100"/>
-    </w:p>
-    <w:p>
-      <w:pPr>
-        <w:pStyle w:val="Heading3"/>
-        <w:rPr>
-          <w:rFonts w:ascii="Times New Roman" w:hAnsi="Times New Roman" w:cs="Times New Roman"/>
-        </w:rPr>
-      </w:pPr>
-      <w:bookmarkStart w:id="101" w:name="_Toc236288492"/>
-      <w:r>
-        <w:rPr>
-          <w:rFonts w:ascii="Times New Roman" w:hAnsi="Times New Roman" w:cs="Times New Roman"/>
-        </w:rPr>
-        <w:t>Kiến trúc tổng thể</w:t>
-      </w:r>
-      <w:bookmarkEnd w:id="101"/>
-    </w:p>
-    <w:p>
-      <w:pPr>
-        <w:rPr>
-          <w:rFonts w:ascii="Times New Roman" w:hAnsi="Times New Roman" w:cs="Times New Roman"/>
-          <w:sz w:val="26"/>
-          <w:szCs w:val="26"/>
-        </w:rPr>
-      </w:pPr>
-      <w:r>
-        <w:rPr>
-          <w:noProof/>
-        </w:rPr>
-        <mc:AlternateContent>
-          <mc:Choice Requires="wps">
-            <w:drawing>
-              <wp:anchor distT="0" distB="0" distL="114300" distR="114300" simplePos="0" relativeHeight="251660288" behindDoc="0" locked="0" layoutInCell="1" allowOverlap="1" wp14:anchorId="0FD8DF74" wp14:editId="5E41F144">
-                <wp:simplePos x="0" y="0"/>
-                <wp:positionH relativeFrom="column">
-                  <wp:posOffset>1187450</wp:posOffset>
-                </wp:positionH>
-                <wp:positionV relativeFrom="paragraph">
-                  <wp:posOffset>5329555</wp:posOffset>
-                </wp:positionV>
-                <wp:extent cx="2876550" cy="635"/>
-                <wp:effectExtent l="0" t="0" r="0" b="0"/>
-                <wp:wrapTopAndBottom/>
-                <wp:docPr id="11" name="Text Box 11"/>
-                <wp:cNvGraphicFramePr/>
-                <a:graphic xmlns:a="http://schemas.openxmlformats.org/drawingml/2006/main">
-                  <a:graphicData uri="http://schemas.microsoft.com/office/word/2010/wordprocessingShape">
-                    <wps:wsp>
-                      <wps:cNvSpPr txBox="1"/>
-                      <wps:spPr>
-                        <a:xfrm>
-                          <a:off x="0" y="0"/>
-                          <a:ext cx="2876550" cy="635"/>
-                        </a:xfrm>
-                        <a:prstGeom prst="rect">
-                          <a:avLst/>
-                        </a:prstGeom>
-                        <a:solidFill>
-                          <a:prstClr val="white"/>
-                        </a:solidFill>
-                        <a:ln>
-                          <a:noFill/>
-                        </a:ln>
-                      </wps:spPr>
-                      <wps:txbx>
-                        <w:txbxContent>
-                          <w:p>
-                            <w:pPr>
-                              <w:pStyle w:val="Caption"/>
-                              <w:rPr>
-                                <w:rFonts w:ascii="Times New Roman" w:hAnsi="Times New Roman" w:cs="Times New Roman"/>
-                                <w:noProof/>
-                                <w:sz w:val="26"/>
-                                <w:szCs w:val="26"/>
-                              </w:rPr>
-                            </w:pPr>
-                            <w:bookmarkStart w:id="102" w:name="_Toc235797441"/>
-                            <w:r>
-                              <w:rPr>
-                                <w:rFonts w:ascii="Times New Roman" w:hAnsi="Times New Roman" w:cs="Times New Roman"/>
-                                <w:sz w:val="26"/>
-                                <w:szCs w:val="26"/>
-                              </w:rPr>
-                              <w:t xml:space="preserve">Hình </w:t>
-                            </w:r>
-                            <w:r>
-                              <w:rPr>
-                                <w:rFonts w:ascii="Times New Roman" w:hAnsi="Times New Roman" w:cs="Times New Roman"/>
-                                <w:sz w:val="26"/>
-                                <w:szCs w:val="26"/>
-                              </w:rPr>
-                              <w:fldChar w:fldCharType="begin"/>
-                            </w:r>
-                            <w:r>
-                              <w:rPr>
-                                <w:rFonts w:ascii="Times New Roman" w:hAnsi="Times New Roman" w:cs="Times New Roman"/>
-                                <w:sz w:val="26"/>
-                                <w:szCs w:val="26"/>
-                              </w:rPr>
-                              <w:instrText xml:space="preserve"> SEQ Hình \* ARABIC </w:instrText>
-                            </w:r>
-                            <w:r>
-                              <w:rPr>
-                                <w:rFonts w:ascii="Times New Roman" w:hAnsi="Times New Roman" w:cs="Times New Roman"/>
-                                <w:sz w:val="26"/>
-                                <w:szCs w:val="26"/>
-                              </w:rPr>
-                              <w:fldChar w:fldCharType="separate"/>
-                            </w:r>
-                            <w:r>
-                              <w:rPr>
-                                <w:rFonts w:ascii="Times New Roman" w:hAnsi="Times New Roman" w:cs="Times New Roman"/>
-                                <w:noProof/>
-                                <w:sz w:val="26"/>
-                                <w:szCs w:val="26"/>
-                              </w:rPr>
-                              <w:t>12</w:t>
-                            </w:r>
-                            <w:r>
-                              <w:rPr>
-                                <w:rFonts w:ascii="Times New Roman" w:hAnsi="Times New Roman" w:cs="Times New Roman"/>
-                                <w:sz w:val="26"/>
-                                <w:szCs w:val="26"/>
-                              </w:rPr>
-                              <w:fldChar w:fldCharType="end"/>
-                            </w:r>
-                            <w:r>
-                              <w:rPr>
-                                <w:rFonts w:ascii="Times New Roman" w:hAnsi="Times New Roman" w:cs="Times New Roman"/>
-                                <w:sz w:val="26"/>
-                                <w:szCs w:val="26"/>
-                              </w:rPr>
-                              <w:t>: Kiến trúc tổng thể</w:t>
-                            </w:r>
-                            <w:bookmarkEnd w:id="102"/>
-                          </w:p>
-                        </w:txbxContent>
-                      </wps:txbx>
-                      <wps:bodyPr rot="0" spcFirstLastPara="0" vertOverflow="overflow" horzOverflow="overflow" vert="horz" wrap="square" lIns="0" tIns="0" rIns="0" bIns="0" numCol="1" spcCol="0" rtlCol="0" fromWordArt="0" anchor="t" anchorCtr="0" forceAA="0" compatLnSpc="1">
-                        <a:prstTxWarp prst="textNoShape">
-                          <a:avLst/>
-                        </a:prstTxWarp>
-                        <a:spAutoFit/>
-                      </wps:bodyPr>
-                    </wps:wsp>
-                  </a:graphicData>
-                </a:graphic>
-              </wp:anchor>
-            </w:drawing>
-          </mc:Choice>
-          <mc:Fallback>
-            <w:pict>
-              <v:shapetype w14:anchorId="0FD8DF74" id="_x0000_t202" coordsize="21600,21600" o:spt="202" path="m,l,21600r21600,l21600,xe">
-                <v:stroke joinstyle="miter"/>
-                <v:path gradientshapeok="t" o:connecttype="rect"/>
-              </v:shapetype>
-              <v:shape id="Text Box 11" o:spid="_x0000_s1026" type="#_x0000_t202" style="position:absolute;margin-left:93.5pt;margin-top:419.65pt;width:226.5pt;height:.05pt;z-index:251660288;visibility:visible;mso-wrap-style:square;mso-wrap-distance-left:9pt;mso-wrap-distance-top:0;mso-wrap-distance-right:9pt;mso-wrap-distance-bottom:0;mso-position-horizontal:absolute;mso-position-horizontal-relative:text;mso-position-vertical:absolute;mso-position-vertical-relative:text;v-text-anchor:top" o:gfxdata="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" stroked="f">
-                <v:textbox style="mso-fit-shape-to-text:t" inset="0,0,0,0">
-                  <w:txbxContent>
-                    <w:p>
-                      <w:pPr>
-                        <w:pStyle w:val="Caption"/>
-                        <w:rPr>
-                          <w:rFonts w:ascii="Times New Roman" w:hAnsi="Times New Roman" w:cs="Times New Roman"/>
-                          <w:noProof/>
-                          <w:sz w:val="26"/>
-                          <w:szCs w:val="26"/>
-                        </w:rPr>
-                      </w:pPr>
-                      <w:bookmarkStart w:id="103" w:name="_Toc235797441"/>
-                      <w:r>
-                        <w:rPr>
-                          <w:rFonts w:ascii="Times New Roman" w:hAnsi="Times New Roman" w:cs="Times New Roman"/>
-                          <w:sz w:val="26"/>
-                          <w:szCs w:val="26"/>
-                        </w:rPr>
-                        <w:t xml:space="preserve">Hình </w:t>
-                      </w:r>
-                      <w:r>
-                        <w:rPr>
-                          <w:rFonts w:ascii="Times New Roman" w:hAnsi="Times New Roman" w:cs="Times New Roman"/>
-                          <w:sz w:val="26"/>
-                          <w:szCs w:val="26"/>
-                        </w:rPr>
-                        <w:fldChar w:fldCharType="begin"/>
-                      </w:r>
-                      <w:r>
-                        <w:rPr>
-                          <w:rFonts w:ascii="Times New Roman" w:hAnsi="Times New Roman" w:cs="Times New Roman"/>
-                          <w:sz w:val="26"/>
-                          <w:szCs w:val="26"/>
-                        </w:rPr>
-                        <w:instrText xml:space="preserve"> SEQ Hình \* ARABIC </w:instrText>
-                      </w:r>
-                      <w:r>
-                        <w:rPr>
-                          <w:rFonts w:ascii="Times New Roman" w:hAnsi="Times New Roman" w:cs="Times New Roman"/>
-                          <w:sz w:val="26"/>
-                          <w:szCs w:val="26"/>
-                        </w:rPr>
-                        <w:fldChar w:fldCharType="separate"/>
-                      </w:r>
-                      <w:r>
-                        <w:rPr>
-                          <w:rFonts w:ascii="Times New Roman" w:hAnsi="Times New Roman" w:cs="Times New Roman"/>
-                          <w:noProof/>
-                          <w:sz w:val="26"/>
-                          <w:szCs w:val="26"/>
-                        </w:rPr>
-                        <w:t>12</w:t>
-                      </w:r>
-                      <w:r>
-                        <w:rPr>
-                          <w:rFonts w:ascii="Times New Roman" w:hAnsi="Times New Roman" w:cs="Times New Roman"/>
-                          <w:sz w:val="26"/>
-                          <w:szCs w:val="26"/>
-                        </w:rPr>
-                        <w:fldChar w:fldCharType="end"/>
-                      </w:r>
-                      <w:r>
-                        <w:rPr>
-                          <w:rFonts w:ascii="Times New Roman" w:hAnsi="Times New Roman" w:cs="Times New Roman"/>
-                          <w:sz w:val="26"/>
-                          <w:szCs w:val="26"/>
-                        </w:rPr>
-                        <w:t>: Kiến trúc tổng thể</w:t>
-                      </w:r>
-                      <w:bookmarkEnd w:id="103"/>
-                    </w:p>
-                  </w:txbxContent>
-                </v:textbox>
-                <w10:wrap type="topAndBottom"/>
-              </v:shape>
-            </w:pict>
-          </mc:Fallback>
-        </mc:AlternateContent>
-      </w:r>
-      <w:r>
-        <w:rPr>
-          <w:rFonts w:ascii="Times New Roman" w:hAnsi="Times New Roman" w:cs="Times New Roman"/>
-          <w:noProof/>
-          <w:sz w:val="26"/>
-          <w:szCs w:val="26"/>
-        </w:rPr>
         <w:drawing>
-          <wp:anchor distT="0" distB="0" distL="114300" distR="114300" simplePos="0" relativeHeight="251658240" behindDoc="1" locked="0" layoutInCell="1" allowOverlap="1" wp14:anchorId="12CA03A8" wp14:editId="227065EC">
-            <wp:simplePos x="0" y="0"/>
-            <wp:positionH relativeFrom="page">
-              <wp:align>center</wp:align>
-            </wp:positionH>
-            <wp:positionV relativeFrom="paragraph">
-              <wp:posOffset>1157605</wp:posOffset>
-            </wp:positionV>
-            <wp:extent cx="2876550" cy="4114800"/>
-            <wp:effectExtent l="0" t="0" r="0" b="0"/>
-            <wp:wrapTopAndBottom/>
-            <wp:docPr id="6" name="Picture 6"/>
+          <wp:inline distT="0" distB="0" distL="0" distR="0" wp14:anchorId="43E9F6F3" wp14:editId="53676FB0">
+            <wp:extent cx="3703641" cy="7254869"/>
+            <wp:effectExtent l="0" t="0" r="0" b="3810"/>
+            <wp:docPr id="29" name="Picture 29"/>
             <wp:cNvGraphicFramePr>
               <a:graphicFrameLocks xmlns:a="http://schemas.openxmlformats.org/drawingml/2006/main" noChangeAspect="1"/>
             </wp:cNvGraphicFramePr>
@@ -29593,11 +29428,11 @@
               <a:graphicData uri="http://schemas.openxmlformats.org/drawingml/2006/picture">
                 <pic:pic xmlns:pic="http://schemas.openxmlformats.org/drawingml/2006/picture">
                   <pic:nvPicPr>
-                    <pic:cNvPr id="6" name="Picture 6"/>
+                    <pic:cNvPr id="29" name="Picture 29"/>
                     <pic:cNvPicPr/>
                   </pic:nvPicPr>
                   <pic:blipFill>
-                    <a:blip r:embed="rId21">
+                    <a:blip r:embed="rId20">
                       <a:extLst>
                         <a:ext uri="{28A0092B-C50C-407E-A947-70E740481C1C}">
                           <a14:useLocalDpi xmlns:a14="http://schemas.microsoft.com/office/drawing/2010/main" val="0"/>
@@ -29611,7 +29446,7 @@
                   <pic:spPr>
                     <a:xfrm>
                       <a:off x="0" y="0"/>
-                      <a:ext cx="2876550" cy="4114800"/>
+                      <a:ext cx="3703641" cy="7254869"/>
                     </a:xfrm>
                     <a:prstGeom prst="rect">
                       <a:avLst/>
@@ -29620,25 +29455,78 @@
                 </pic:pic>
               </a:graphicData>
             </a:graphic>
-          </wp:anchor>
+          </wp:inline>
         </w:drawing>
       </w:r>
-      <w:r>
-        <w:rPr>
-          <w:rFonts w:ascii="Times New Roman" w:hAnsi="Times New Roman" w:cs="Times New Roman"/>
-          <w:sz w:val="26"/>
-          <w:szCs w:val="26"/>
-        </w:rPr>
-        <w:t>Kiến</w:t>
-      </w:r>
-      <w:r>
-        <w:rPr>
-          <w:rFonts w:ascii="Times New Roman" w:hAnsi="Times New Roman" w:cs="Times New Roman"/>
-          <w:sz w:val="26"/>
-          <w:szCs w:val="26"/>
-        </w:rPr>
-        <w:t xml:space="preserve"> trúc tổng thể của hệ thống CRM được xây dựng theo mô hình Client – Server. Người dùng truy cập hệ thống thông qua trình duyệt web và thao tác trên giao diện được phát triển bởi Next.js. Các thao tác và yêu cầu của người dùng sẽ được gửi đến back-end thông qua RESTful API. Back-end được xây dựng bằng NestJS theo kiến trúc Modular để xử lý nghiệp vụ và sử dụng Prisma ORM để truy cập vào PostgreSQL.</w:t>
-      </w:r>
+    </w:p>
+    <w:p>
+      <w:pPr>
+        <w:pStyle w:val="Caption"/>
+        <w:rPr>
+          <w:rFonts w:ascii="Times New Roman" w:hAnsi="Times New Roman" w:cs="Times New Roman"/>
+          <w:sz w:val="26"/>
+          <w:szCs w:val="26"/>
+        </w:rPr>
+      </w:pPr>
+      <w:bookmarkStart w:id="102" w:name="_Toc236469877"/>
+      <w:r>
+        <w:rPr>
+          <w:rFonts w:ascii="Times New Roman" w:hAnsi="Times New Roman" w:cs="Times New Roman"/>
+          <w:sz w:val="26"/>
+          <w:szCs w:val="26"/>
+        </w:rPr>
+        <w:t xml:space="preserve">Hình </w:t>
+      </w:r>
+      <w:r>
+        <w:rPr>
+          <w:rFonts w:ascii="Times New Roman" w:hAnsi="Times New Roman" w:cs="Times New Roman"/>
+          <w:sz w:val="26"/>
+          <w:szCs w:val="26"/>
+        </w:rPr>
+        <w:fldChar w:fldCharType="begin"/>
+      </w:r>
+      <w:r>
+        <w:rPr>
+          <w:rFonts w:ascii="Times New Roman" w:hAnsi="Times New Roman" w:cs="Times New Roman"/>
+          <w:sz w:val="26"/>
+          <w:szCs w:val="26"/>
+        </w:rPr>
+        <w:instrText xml:space="preserve"> SEQ Hình \* ARABIC </w:instrText>
+      </w:r>
+      <w:r>
+        <w:rPr>
+          <w:rFonts w:ascii="Times New Roman" w:hAnsi="Times New Roman" w:cs="Times New Roman"/>
+          <w:sz w:val="26"/>
+          <w:szCs w:val="26"/>
+        </w:rPr>
+        <w:fldChar w:fldCharType="separate"/>
+      </w:r>
+      <w:r>
+        <w:rPr>
+          <w:rFonts w:ascii="Times New Roman" w:hAnsi="Times New Roman" w:cs="Times New Roman"/>
+          <w:noProof/>
+          <w:sz w:val="26"/>
+          <w:szCs w:val="26"/>
+        </w:rPr>
+        <w:t>12</w:t>
+      </w:r>
+      <w:r>
+        <w:rPr>
+          <w:rFonts w:ascii="Times New Roman" w:hAnsi="Times New Roman" w:cs="Times New Roman"/>
+          <w:sz w:val="26"/>
+          <w:szCs w:val="26"/>
+        </w:rPr>
+        <w:fldChar w:fldCharType="end"/>
+      </w:r>
+      <w:r>
+        <w:rPr>
+          <w:rFonts w:ascii="Times New Roman" w:hAnsi="Times New Roman" w:cs="Times New Roman"/>
+          <w:sz w:val="26"/>
+          <w:szCs w:val="26"/>
+        </w:rPr>
+        <w:t>: Kiến trúc tổng thể</w:t>
+      </w:r>
+      <w:bookmarkEnd w:id="102"/>
     </w:p>
     <w:p>
       <w:pPr>
@@ -29647,14 +29535,14 @@
           <w:rFonts w:ascii="Times New Roman" w:hAnsi="Times New Roman" w:cs="Times New Roman"/>
         </w:rPr>
       </w:pPr>
-      <w:bookmarkStart w:id="104" w:name="_Toc236288493"/>
+      <w:bookmarkStart w:id="103" w:name="_Toc236288493"/>
       <w:r>
         <w:rPr>
           <w:rFonts w:ascii="Times New Roman" w:hAnsi="Times New Roman" w:cs="Times New Roman"/>
         </w:rPr>
         <w:t>Kiến trúc Modular</w:t>
       </w:r>
-      <w:bookmarkEnd w:id="104"/>
+      <w:bookmarkEnd w:id="103"/>
     </w:p>
     <w:p>
       <w:pPr>
@@ -29683,7 +29571,7 @@
                     <pic:cNvPicPr/>
                   </pic:nvPicPr>
                   <pic:blipFill>
-                    <a:blip r:embed="rId22" cstate="print">
+                    <a:blip r:embed="rId21" cstate="print">
                       <a:extLst>
                         <a:ext uri="{28A0092B-C50C-407E-A947-70E740481C1C}">
                           <a14:useLocalDpi xmlns:a14="http://schemas.microsoft.com/office/drawing/2010/main" val="0"/>
@@ -29719,7 +29607,7 @@
           <w:szCs w:val="26"/>
         </w:rPr>
       </w:pPr>
-      <w:bookmarkStart w:id="105" w:name="_Toc235797442"/>
+      <w:bookmarkStart w:id="104" w:name="_Toc236469878"/>
       <w:r>
         <w:rPr>
           <w:rFonts w:ascii="Times New Roman" w:hAnsi="Times New Roman" w:cs="Times New Roman"/>
@@ -29777,7 +29665,7 @@
         </w:rPr>
         <w:t>: Kiến trúc Modular</w:t>
       </w:r>
-      <w:bookmarkEnd w:id="105"/>
+      <w:bookmarkEnd w:id="104"/>
     </w:p>
     <w:p>
       <w:pPr>
@@ -29816,7 +29704,7 @@
                     <pic:cNvPicPr/>
                   </pic:nvPicPr>
                   <pic:blipFill>
-                    <a:blip r:embed="rId23" cstate="print">
+                    <a:blip r:embed="rId22" cstate="print">
                       <a:extLst>
                         <a:ext uri="{28A0092B-C50C-407E-A947-70E740481C1C}">
                           <a14:useLocalDpi xmlns:a14="http://schemas.microsoft.com/office/drawing/2010/main" val="0"/>
@@ -29852,7 +29740,7 @@
           <w:szCs w:val="26"/>
         </w:rPr>
       </w:pPr>
-      <w:bookmarkStart w:id="106" w:name="_Toc235797443"/>
+      <w:bookmarkStart w:id="105" w:name="_Toc236469879"/>
       <w:r>
         <w:rPr>
           <w:rFonts w:ascii="Times New Roman" w:hAnsi="Times New Roman" w:cs="Times New Roman"/>
@@ -29910,7 +29798,7 @@
         </w:rPr>
         <w:t>: Kiến trúc của một Module</w:t>
       </w:r>
-      <w:bookmarkEnd w:id="106"/>
+      <w:bookmarkEnd w:id="105"/>
     </w:p>
     <w:p>
       <w:pPr>
@@ -30512,7 +30400,7 @@
           <w:szCs w:val="26"/>
         </w:rPr>
       </w:pPr>
-      <w:bookmarkStart w:id="107" w:name="_Toc236288516"/>
+      <w:bookmarkStart w:id="106" w:name="_Toc236288516"/>
       <w:r>
         <w:rPr>
           <w:rFonts w:ascii="Times New Roman" w:hAnsi="Times New Roman" w:cs="Times New Roman"/>
@@ -30570,7 +30458,7 @@
         </w:rPr>
         <w:t>: Chức năng của từng Module</w:t>
       </w:r>
-      <w:bookmarkEnd w:id="107"/>
+      <w:bookmarkEnd w:id="106"/>
     </w:p>
     <w:p>
       <w:pPr>
@@ -30579,7 +30467,7 @@
           <w:rFonts w:ascii="Times New Roman" w:hAnsi="Times New Roman" w:cs="Times New Roman"/>
         </w:rPr>
       </w:pPr>
-      <w:bookmarkStart w:id="108" w:name="_Toc236288494"/>
+      <w:bookmarkStart w:id="107" w:name="_Toc236288494"/>
       <w:r>
         <w:rPr>
           <w:rFonts w:ascii="Times New Roman" w:hAnsi="Times New Roman" w:cs="Times New Roman"/>
@@ -30587,7 +30475,7 @@
         <w:lastRenderedPageBreak/>
         <w:t>RESTful API</w:t>
       </w:r>
-      <w:bookmarkEnd w:id="108"/>
+      <w:bookmarkEnd w:id="107"/>
     </w:p>
     <w:p>
       <w:pPr>
@@ -30616,7 +30504,7 @@
                     <pic:cNvPicPr/>
                   </pic:nvPicPr>
                   <pic:blipFill>
-                    <a:blip r:embed="rId24" cstate="print">
+                    <a:blip r:embed="rId23" cstate="print">
                       <a:extLst>
                         <a:ext uri="{28A0092B-C50C-407E-A947-70E740481C1C}">
                           <a14:useLocalDpi xmlns:a14="http://schemas.microsoft.com/office/drawing/2010/main" val="0"/>
@@ -30652,7 +30540,7 @@
           <w:szCs w:val="26"/>
         </w:rPr>
       </w:pPr>
-      <w:bookmarkStart w:id="109" w:name="_Toc235797444"/>
+      <w:bookmarkStart w:id="108" w:name="_Toc236469880"/>
       <w:r>
         <w:rPr>
           <w:rFonts w:ascii="Times New Roman" w:hAnsi="Times New Roman" w:cs="Times New Roman"/>
@@ -30710,40 +30598,40 @@
         </w:rPr>
         <w:t>: Luồng xử lý yêu cầu đăng nhập thông qua RESTful API</w:t>
       </w:r>
+      <w:bookmarkEnd w:id="108"/>
+    </w:p>
+    <w:p>
+      <w:pPr>
+        <w:rPr>
+          <w:rFonts w:ascii="Times New Roman" w:hAnsi="Times New Roman" w:cs="Times New Roman"/>
+          <w:sz w:val="26"/>
+          <w:szCs w:val="26"/>
+        </w:rPr>
+      </w:pPr>
+      <w:r>
+        <w:rPr>
+          <w:rFonts w:ascii="Times New Roman" w:hAnsi="Times New Roman" w:cs="Times New Roman"/>
+          <w:sz w:val="26"/>
+          <w:szCs w:val="26"/>
+        </w:rPr>
+        <w:t>Hệ thống CRM sử dụng RESTful API làm cơ chế giao tiếp giữa Front-end và Back-end. Mỗi thao tác từ giao diện người dùng được gửi đến Controller thông qua các phương thức HTTP như GET, POST, PUT, DELETE. Controller tiếp nhận và chuyển cho Service xử lý nghiệp vụ. Khi hoàn tất, dữ liệu được trả về dưới dạng JSON để giao diện cập nhật lại mà không cần tải lại trang.</w:t>
+      </w:r>
+    </w:p>
+    <w:p>
+      <w:pPr>
+        <w:pStyle w:val="Heading3"/>
+        <w:rPr>
+          <w:rFonts w:ascii="Times New Roman" w:hAnsi="Times New Roman" w:cs="Times New Roman"/>
+        </w:rPr>
+      </w:pPr>
+      <w:bookmarkStart w:id="109" w:name="_Toc236288495"/>
+      <w:r>
+        <w:rPr>
+          <w:rFonts w:ascii="Times New Roman" w:hAnsi="Times New Roman" w:cs="Times New Roman"/>
+        </w:rPr>
+        <w:t>Luồng xử lý dữ liệu</w:t>
+      </w:r>
       <w:bookmarkEnd w:id="109"/>
-    </w:p>
-    <w:p>
-      <w:pPr>
-        <w:rPr>
-          <w:rFonts w:ascii="Times New Roman" w:hAnsi="Times New Roman" w:cs="Times New Roman"/>
-          <w:sz w:val="26"/>
-          <w:szCs w:val="26"/>
-        </w:rPr>
-      </w:pPr>
-      <w:r>
-        <w:rPr>
-          <w:rFonts w:ascii="Times New Roman" w:hAnsi="Times New Roman" w:cs="Times New Roman"/>
-          <w:sz w:val="26"/>
-          <w:szCs w:val="26"/>
-        </w:rPr>
-        <w:t>Hệ thống CRM sử dụng RESTful API làm cơ chế giao tiếp giữa Front-end và Back-end. Mỗi thao tác từ giao diện người dùng được gửi đến Controller thông qua các phương thức HTTP như GET, POST, PUT, DELETE. Controller tiếp nhận và chuyển cho Service xử lý nghiệp vụ. Khi hoàn tất, dữ liệu được trả về dưới dạng JSON để giao diện cập nhật lại mà không cần tải lại trang.</w:t>
-      </w:r>
-    </w:p>
-    <w:p>
-      <w:pPr>
-        <w:pStyle w:val="Heading3"/>
-        <w:rPr>
-          <w:rFonts w:ascii="Times New Roman" w:hAnsi="Times New Roman" w:cs="Times New Roman"/>
-        </w:rPr>
-      </w:pPr>
-      <w:bookmarkStart w:id="110" w:name="_Toc236288495"/>
-      <w:r>
-        <w:rPr>
-          <w:rFonts w:ascii="Times New Roman" w:hAnsi="Times New Roman" w:cs="Times New Roman"/>
-        </w:rPr>
-        <w:t>Luồng xử lý dữ liệu</w:t>
-      </w:r>
-      <w:bookmarkEnd w:id="110"/>
     </w:p>
     <w:p>
       <w:pPr>
@@ -30772,7 +30660,7 @@
                     <pic:cNvPicPr/>
                   </pic:nvPicPr>
                   <pic:blipFill>
-                    <a:blip r:embed="rId25" cstate="print">
+                    <a:blip r:embed="rId24" cstate="print">
                       <a:extLst>
                         <a:ext uri="{28A0092B-C50C-407E-A947-70E740481C1C}">
                           <a14:useLocalDpi xmlns:a14="http://schemas.microsoft.com/office/drawing/2010/main" val="0"/>
@@ -30808,7 +30696,7 @@
           <w:szCs w:val="26"/>
         </w:rPr>
       </w:pPr>
-      <w:bookmarkStart w:id="111" w:name="_Toc235797445"/>
+      <w:bookmarkStart w:id="110" w:name="_Toc236469881"/>
       <w:r>
         <w:rPr>
           <w:rFonts w:ascii="Times New Roman" w:hAnsi="Times New Roman" w:cs="Times New Roman"/>
@@ -30866,7 +30754,7 @@
         </w:rPr>
         <w:t>: Luồng xử lý dữ liệu</w:t>
       </w:r>
-      <w:bookmarkEnd w:id="111"/>
+      <w:bookmarkEnd w:id="110"/>
     </w:p>
     <w:p>
       <w:pPr>
@@ -30875,8 +30763,8 @@
           <w:rFonts w:ascii="Times New Roman" w:hAnsi="Times New Roman" w:cs="Times New Roman"/>
         </w:rPr>
       </w:pPr>
-      <w:bookmarkStart w:id="112" w:name="_Toc235563727"/>
-      <w:bookmarkStart w:id="113" w:name="_Toc236288496"/>
+      <w:bookmarkStart w:id="111" w:name="_Toc235563727"/>
+      <w:bookmarkStart w:id="112" w:name="_Toc236288496"/>
       <w:r>
         <w:rPr>
           <w:rFonts w:ascii="Times New Roman" w:hAnsi="Times New Roman" w:cs="Times New Roman"/>
@@ -30884,8 +30772,8 @@
         <w:lastRenderedPageBreak/>
         <w:t>WIREFRAME</w:t>
       </w:r>
+      <w:bookmarkEnd w:id="111"/>
       <w:bookmarkEnd w:id="112"/>
-      <w:bookmarkEnd w:id="113"/>
     </w:p>
     <w:p>
       <w:pPr>
@@ -30914,7 +30802,7 @@
                     <pic:cNvPicPr/>
                   </pic:nvPicPr>
                   <pic:blipFill>
-                    <a:blip r:embed="rId26" cstate="print">
+                    <a:blip r:embed="rId25" cstate="print">
                       <a:extLst>
                         <a:ext uri="{28A0092B-C50C-407E-A947-70E740481C1C}">
                           <a14:useLocalDpi xmlns:a14="http://schemas.microsoft.com/office/drawing/2010/main" val="0"/>
@@ -30950,7 +30838,7 @@
           <w:szCs w:val="26"/>
         </w:rPr>
       </w:pPr>
-      <w:bookmarkStart w:id="114" w:name="_Toc235797446"/>
+      <w:bookmarkStart w:id="113" w:name="_Toc236469882"/>
       <w:r>
         <w:rPr>
           <w:rFonts w:ascii="Times New Roman" w:hAnsi="Times New Roman" w:cs="Times New Roman"/>
@@ -31008,7 +30896,7 @@
         </w:rPr>
         <w:t>: Wireframe đăng nhập hệ thống</w:t>
       </w:r>
-      <w:bookmarkEnd w:id="114"/>
+      <w:bookmarkEnd w:id="113"/>
     </w:p>
     <w:p>
       <w:pPr>
@@ -31062,7 +30950,7 @@
                     <pic:cNvPicPr/>
                   </pic:nvPicPr>
                   <pic:blipFill>
-                    <a:blip r:embed="rId27" cstate="print">
+                    <a:blip r:embed="rId26" cstate="print">
                       <a:extLst>
                         <a:ext uri="{28A0092B-C50C-407E-A947-70E740481C1C}">
                           <a14:useLocalDpi xmlns:a14="http://schemas.microsoft.com/office/drawing/2010/main" val="0"/>
@@ -31098,7 +30986,7 @@
           <w:szCs w:val="26"/>
         </w:rPr>
       </w:pPr>
-      <w:bookmarkStart w:id="115" w:name="_Toc235797447"/>
+      <w:bookmarkStart w:id="114" w:name="_Toc236469883"/>
       <w:r>
         <w:rPr>
           <w:rFonts w:ascii="Times New Roman" w:hAnsi="Times New Roman" w:cs="Times New Roman"/>
@@ -31156,7 +31044,7 @@
         </w:rPr>
         <w:t>: Giao diện Dashboard tổng quan</w:t>
       </w:r>
-      <w:bookmarkEnd w:id="115"/>
+      <w:bookmarkEnd w:id="114"/>
     </w:p>
     <w:p>
       <w:pPr>
@@ -31186,7 +31074,7 @@
                     <pic:cNvPicPr/>
                   </pic:nvPicPr>
                   <pic:blipFill>
-                    <a:blip r:embed="rId28" cstate="print">
+                    <a:blip r:embed="rId27" cstate="print">
                       <a:extLst>
                         <a:ext uri="{28A0092B-C50C-407E-A947-70E740481C1C}">
                           <a14:useLocalDpi xmlns:a14="http://schemas.microsoft.com/office/drawing/2010/main" val="0"/>
@@ -31222,7 +31110,7 @@
           <w:szCs w:val="26"/>
         </w:rPr>
       </w:pPr>
-      <w:bookmarkStart w:id="116" w:name="_Toc235797448"/>
+      <w:bookmarkStart w:id="115" w:name="_Toc236469884"/>
       <w:r>
         <w:rPr>
           <w:rFonts w:ascii="Times New Roman" w:hAnsi="Times New Roman" w:cs="Times New Roman"/>
@@ -31280,7 +31168,7 @@
         </w:rPr>
         <w:t>: Dashboard doanh thu bán hàng theo từng năm</w:t>
       </w:r>
-      <w:bookmarkEnd w:id="116"/>
+      <w:bookmarkEnd w:id="115"/>
     </w:p>
     <w:p>
       <w:pPr>
@@ -31309,7 +31197,7 @@
                     <pic:cNvPicPr/>
                   </pic:nvPicPr>
                   <pic:blipFill>
-                    <a:blip r:embed="rId29" cstate="print">
+                    <a:blip r:embed="rId28" cstate="print">
                       <a:extLst>
                         <a:ext uri="{28A0092B-C50C-407E-A947-70E740481C1C}">
                           <a14:useLocalDpi xmlns:a14="http://schemas.microsoft.com/office/drawing/2010/main" val="0"/>
@@ -31345,7 +31233,7 @@
           <w:szCs w:val="26"/>
         </w:rPr>
       </w:pPr>
-      <w:bookmarkStart w:id="117" w:name="_Toc235797449"/>
+      <w:bookmarkStart w:id="116" w:name="_Toc236469885"/>
       <w:r>
         <w:rPr>
           <w:rFonts w:ascii="Times New Roman" w:hAnsi="Times New Roman" w:cs="Times New Roman"/>
@@ -31403,7 +31291,7 @@
         </w:rPr>
         <w:t>: Dashboard tổng quan các Deal theo giai đoạn và tổng giá trị của Pipeline</w:t>
       </w:r>
-      <w:bookmarkEnd w:id="117"/>
+      <w:bookmarkEnd w:id="116"/>
     </w:p>
     <w:p>
       <w:pPr>
@@ -31450,7 +31338,7 @@
                     <pic:cNvPicPr/>
                   </pic:nvPicPr>
                   <pic:blipFill>
-                    <a:blip r:embed="rId30" cstate="print">
+                    <a:blip r:embed="rId29" cstate="print">
                       <a:extLst>
                         <a:ext uri="{28A0092B-C50C-407E-A947-70E740481C1C}">
                           <a14:useLocalDpi xmlns:a14="http://schemas.microsoft.com/office/drawing/2010/main" val="0"/>
@@ -31486,7 +31374,7 @@
           <w:szCs w:val="26"/>
         </w:rPr>
       </w:pPr>
-      <w:bookmarkStart w:id="118" w:name="_Toc235797450"/>
+      <w:bookmarkStart w:id="117" w:name="_Toc236469886"/>
       <w:r>
         <w:rPr>
           <w:rFonts w:ascii="Times New Roman" w:hAnsi="Times New Roman" w:cs="Times New Roman"/>
@@ -31544,7 +31432,7 @@
         </w:rPr>
         <w:t>: Các chỉ số thống kê Lead</w:t>
       </w:r>
-      <w:bookmarkEnd w:id="118"/>
+      <w:bookmarkEnd w:id="117"/>
     </w:p>
     <w:p>
       <w:pPr>
@@ -31573,7 +31461,7 @@
                     <pic:cNvPicPr/>
                   </pic:nvPicPr>
                   <pic:blipFill>
-                    <a:blip r:embed="rId31" cstate="print">
+                    <a:blip r:embed="rId30" cstate="print">
                       <a:extLst>
                         <a:ext uri="{28A0092B-C50C-407E-A947-70E740481C1C}">
                           <a14:useLocalDpi xmlns:a14="http://schemas.microsoft.com/office/drawing/2010/main" val="0"/>
@@ -31609,7 +31497,7 @@
           <w:szCs w:val="26"/>
         </w:rPr>
       </w:pPr>
-      <w:bookmarkStart w:id="119" w:name="_Toc235797451"/>
+      <w:bookmarkStart w:id="118" w:name="_Toc236469887"/>
       <w:r>
         <w:rPr>
           <w:rFonts w:ascii="Times New Roman" w:hAnsi="Times New Roman" w:cs="Times New Roman"/>
@@ -31667,7 +31555,7 @@
         </w:rPr>
         <w:t>: Danh sách Lead</w:t>
       </w:r>
-      <w:bookmarkEnd w:id="119"/>
+      <w:bookmarkEnd w:id="118"/>
     </w:p>
     <w:p>
       <w:pPr>
@@ -31738,7 +31626,7 @@
                     <pic:cNvPicPr/>
                   </pic:nvPicPr>
                   <pic:blipFill>
-                    <a:blip r:embed="rId32" cstate="print">
+                    <a:blip r:embed="rId31" cstate="print">
                       <a:extLst>
                         <a:ext uri="{28A0092B-C50C-407E-A947-70E740481C1C}">
                           <a14:useLocalDpi xmlns:a14="http://schemas.microsoft.com/office/drawing/2010/main" val="0"/>
@@ -31774,7 +31662,7 @@
           <w:szCs w:val="26"/>
         </w:rPr>
       </w:pPr>
-      <w:bookmarkStart w:id="120" w:name="_Toc235797452"/>
+      <w:bookmarkStart w:id="119" w:name="_Toc236469888"/>
       <w:r>
         <w:rPr>
           <w:rFonts w:ascii="Times New Roman" w:hAnsi="Times New Roman" w:cs="Times New Roman"/>
@@ -31832,7 +31720,7 @@
         </w:rPr>
         <w:t>: Giao diện quản lý Deal</w:t>
       </w:r>
-      <w:bookmarkEnd w:id="120"/>
+      <w:bookmarkEnd w:id="119"/>
     </w:p>
     <w:p>
       <w:pPr>
@@ -31886,7 +31774,7 @@
                     <pic:cNvPicPr/>
                   </pic:nvPicPr>
                   <pic:blipFill>
-                    <a:blip r:embed="rId33" cstate="print">
+                    <a:blip r:embed="rId32" cstate="print">
                       <a:extLst>
                         <a:ext uri="{28A0092B-C50C-407E-A947-70E740481C1C}">
                           <a14:useLocalDpi xmlns:a14="http://schemas.microsoft.com/office/drawing/2010/main" val="0"/>
@@ -31922,7 +31810,7 @@
           <w:szCs w:val="26"/>
         </w:rPr>
       </w:pPr>
-      <w:bookmarkStart w:id="121" w:name="_Toc235797453"/>
+      <w:bookmarkStart w:id="120" w:name="_Toc236469889"/>
       <w:r>
         <w:rPr>
           <w:rFonts w:ascii="Times New Roman" w:hAnsi="Times New Roman" w:cs="Times New Roman"/>
@@ -31980,7 +31868,7 @@
         </w:rPr>
         <w:t>: Tổng quan quan lý người dùng</w:t>
       </w:r>
-      <w:bookmarkEnd w:id="121"/>
+      <w:bookmarkEnd w:id="120"/>
     </w:p>
     <w:p>
       <w:pPr>
@@ -32010,7 +31898,7 @@
                     <pic:cNvPicPr/>
                   </pic:nvPicPr>
                   <pic:blipFill>
-                    <a:blip r:embed="rId34" cstate="print">
+                    <a:blip r:embed="rId33" cstate="print">
                       <a:extLst>
                         <a:ext uri="{28A0092B-C50C-407E-A947-70E740481C1C}">
                           <a14:useLocalDpi xmlns:a14="http://schemas.microsoft.com/office/drawing/2010/main" val="0"/>
@@ -32046,7 +31934,7 @@
           <w:szCs w:val="26"/>
         </w:rPr>
       </w:pPr>
-      <w:bookmarkStart w:id="122" w:name="_Toc235797454"/>
+      <w:bookmarkStart w:id="121" w:name="_Toc236469890"/>
       <w:r>
         <w:rPr>
           <w:rFonts w:ascii="Times New Roman" w:hAnsi="Times New Roman" w:cs="Times New Roman"/>
@@ -32104,7 +31992,7 @@
         </w:rPr>
         <w:t>: Danh sách người dùng</w:t>
       </w:r>
-      <w:bookmarkEnd w:id="122"/>
+      <w:bookmarkEnd w:id="121"/>
     </w:p>
     <w:p>
       <w:pPr>
@@ -32147,8 +32035,8 @@
           <w:rFonts w:ascii="Times New Roman" w:hAnsi="Times New Roman" w:cs="Times New Roman"/>
         </w:rPr>
       </w:pPr>
-      <w:bookmarkStart w:id="123" w:name="_Toc235563729"/>
-      <w:bookmarkStart w:id="124" w:name="_Toc236288497"/>
+      <w:bookmarkStart w:id="122" w:name="_Toc235563729"/>
+      <w:bookmarkStart w:id="123" w:name="_Toc236288497"/>
       <w:r>
         <w:rPr>
           <w:rFonts w:ascii="Times New Roman" w:hAnsi="Times New Roman" w:cs="Times New Roman"/>
@@ -32156,10 +32044,10 @@
         <w:lastRenderedPageBreak/>
         <w:t>TÀI LIỆU THAM KHẢO</w:t>
       </w:r>
+      <w:bookmarkEnd w:id="122"/>
       <w:bookmarkEnd w:id="123"/>
-      <w:bookmarkEnd w:id="124"/>
-    </w:p>
-    <w:bookmarkStart w:id="125" w:name="_Toc236288498" w:displacedByCustomXml="next"/>
+    </w:p>
+    <w:bookmarkStart w:id="124" w:name="_Toc236288498" w:displacedByCustomXml="next"/>
     <w:sdt>
       <w:sdtPr>
         <w:rPr>
@@ -32193,7 +32081,7 @@
             </w:rPr>
             <w:t>References</w:t>
           </w:r>
-          <w:bookmarkEnd w:id="125"/>
+          <w:bookmarkEnd w:id="124"/>
         </w:p>
         <w:sdt>
           <w:sdtPr>
@@ -32950,7 +32838,7 @@
       </w:pPr>
     </w:p>
     <w:sectPr>
-      <w:headerReference w:type="default" r:id="rId35"/>
+      <w:headerReference w:type="default" r:id="rId34"/>
       <w:pgSz w:w="11906" w:h="16838" w:code="9"/>
       <w:pgMar w:top="1134" w:right="1134" w:bottom="1134" w:left="1701" w:header="720" w:footer="720" w:gutter="0"/>
       <w:cols w:space="720"/>

</xml_diff>

<commit_message>
feat: chức năng kéo thả giai đoạn pipeline
</commit_message>
<xml_diff>
--- a/docs/BaoCao/BaoCao.docx
+++ b/docs/BaoCao/BaoCao.docx
@@ -12469,16 +12469,7 @@
           <w:szCs w:val="26"/>
         </w:rPr>
         <w:lastRenderedPageBreak/>
-        <w:t xml:space="preserve">Prisma hoạt động dựa trên tệp </w:t>
-      </w:r>
-      <w:proofErr w:type="gramStart"/>
-      <w:r>
-        <w:rPr>
-          <w:rFonts w:ascii="Times New Roman" w:hAnsi="Times New Roman" w:cs="Times New Roman"/>
-          <w:sz w:val="26"/>
-          <w:szCs w:val="26"/>
-        </w:rPr>
-        <w:t>schema.pri</w:t>
+        <w:t>Prisma hoạt động dựa trên tệp schema.pri</w:t>
       </w:r>
       <w:r>
         <w:rPr>
@@ -12494,16 +12485,7 @@
           <w:sz w:val="26"/>
           <w:szCs w:val="26"/>
         </w:rPr>
-        <w:t>ma</w:t>
-      </w:r>
-      <w:proofErr w:type="gramEnd"/>
-      <w:r>
-        <w:rPr>
-          <w:rFonts w:ascii="Times New Roman" w:hAnsi="Times New Roman" w:cs="Times New Roman"/>
-          <w:sz w:val="26"/>
-          <w:szCs w:val="26"/>
-        </w:rPr>
-        <w:t xml:space="preserve"> nơi định nghĩa các Model và thông tin kết nối đến cơ sở dữ liệu. Dựa trên tệp này, Prisma sẽ sinh ra </w:t>
+        <w:t xml:space="preserve">ma nơi định nghĩa các Model và thông tin kết nối đến cơ sở dữ liệu. Dựa trên tệp này, Prisma sẽ sinh ra </w:t>
       </w:r>
       <w:r>
         <w:rPr>
@@ -15191,6 +15173,53 @@
           </w:p>
         </w:tc>
       </w:tr>
+      <w:tr>
+        <w:tc>
+          <w:tcPr>
+            <w:tcW w:w="1696" w:type="dxa"/>
+          </w:tcPr>
+          <w:p>
+            <w:pPr>
+              <w:rPr>
+                <w:rFonts w:ascii="Times New Roman" w:hAnsi="Times New Roman" w:cs="Times New Roman"/>
+                <w:sz w:val="26"/>
+                <w:szCs w:val="26"/>
+              </w:rPr>
+            </w:pPr>
+            <w:r>
+              <w:rPr>
+                <w:rFonts w:ascii="Times New Roman" w:hAnsi="Times New Roman" w:cs="Times New Roman"/>
+                <w:sz w:val="26"/>
+                <w:szCs w:val="26"/>
+              </w:rPr>
+              <w:t>BR21</w:t>
+            </w:r>
+          </w:p>
+        </w:tc>
+        <w:tc>
+          <w:tcPr>
+            <w:tcW w:w="7365" w:type="dxa"/>
+          </w:tcPr>
+          <w:p>
+            <w:pPr>
+              <w:keepNext/>
+              <w:rPr>
+                <w:rFonts w:ascii="Times New Roman" w:hAnsi="Times New Roman" w:cs="Times New Roman"/>
+                <w:sz w:val="26"/>
+                <w:szCs w:val="26"/>
+              </w:rPr>
+            </w:pPr>
+            <w:r>
+              <w:rPr>
+                <w:rFonts w:ascii="Times New Roman" w:hAnsi="Times New Roman" w:cs="Times New Roman"/>
+                <w:sz w:val="26"/>
+                <w:szCs w:val="26"/>
+              </w:rPr>
+              <w:t>Deal đang ở giai đoạn Proposal hoặc negotiation mới được phép tạo báo giá. Các giai đoạn còn lại thì không được tạo.</w:t>
+            </w:r>
+          </w:p>
+        </w:tc>
+      </w:tr>
     </w:tbl>
     <w:p>
       <w:pPr>
@@ -20305,6 +20334,14 @@
               </w:rPr>
               <w:t>, Sales có quyền trên Deal đó</w:t>
             </w:r>
+            <w:r>
+              <w:rPr>
+                <w:rFonts w:ascii="Times New Roman" w:hAnsi="Times New Roman" w:cs="Times New Roman"/>
+                <w:sz w:val="26"/>
+                <w:szCs w:val="26"/>
+              </w:rPr>
+              <w:t>, Deal ở giai đoạn Proposal hoặc Negotiation.</w:t>
+            </w:r>
           </w:p>
         </w:tc>
       </w:tr>
@@ -20397,6 +20434,14 @@
               </w:rPr>
               <w:t>BR11, BR12, BR17, BR18</w:t>
             </w:r>
+            <w:r>
+              <w:rPr>
+                <w:rFonts w:ascii="Times New Roman" w:hAnsi="Times New Roman" w:cs="Times New Roman"/>
+                <w:sz w:val="26"/>
+                <w:szCs w:val="26"/>
+              </w:rPr>
+              <w:t>, BR21</w:t>
+            </w:r>
           </w:p>
         </w:tc>
       </w:tr>
@@ -20638,6 +20683,7 @@
                 <w:sz w:val="26"/>
                 <w:szCs w:val="26"/>
               </w:rPr>
+              <w:lastRenderedPageBreak/>
               <w:t>Hệ thống lưu từng sản phẩm vào QuoteDetails</w:t>
             </w:r>
           </w:p>
@@ -20661,7 +20707,6 @@
                 <w:sz w:val="26"/>
                 <w:szCs w:val="26"/>
               </w:rPr>
-              <w:lastRenderedPageBreak/>
               <w:t>Ghi Activity Log</w:t>
             </w:r>
           </w:p>
@@ -21177,6 +21222,14 @@
                 <w:szCs w:val="26"/>
               </w:rPr>
               <w:t>Có Role là Sales Manager để phân Task hoặc là Customer Care để tự tạo Task</w:t>
+            </w:r>
+            <w:r>
+              <w:rPr>
+                <w:rFonts w:ascii="Times New Roman" w:hAnsi="Times New Roman" w:cs="Times New Roman"/>
+                <w:sz w:val="26"/>
+                <w:szCs w:val="26"/>
+              </w:rPr>
+              <w:t>.</w:t>
             </w:r>
           </w:p>
         </w:tc>
@@ -27938,25 +27991,7 @@
           <w:sz w:val="26"/>
           <w:szCs w:val="26"/>
         </w:rPr>
-        <w:t>Leads – Customers: quan hệ 1-</w:t>
-      </w:r>
-      <w:proofErr w:type="gramStart"/>
-      <w:r>
-        <w:rPr>
-          <w:rFonts w:ascii="Times New Roman" w:hAnsi="Times New Roman" w:cs="Times New Roman"/>
-          <w:sz w:val="26"/>
-          <w:szCs w:val="26"/>
-        </w:rPr>
-        <w:t>0..</w:t>
-      </w:r>
-      <w:proofErr w:type="gramEnd"/>
-      <w:r>
-        <w:rPr>
-          <w:rFonts w:ascii="Times New Roman" w:hAnsi="Times New Roman" w:cs="Times New Roman"/>
-          <w:sz w:val="26"/>
-          <w:szCs w:val="26"/>
-        </w:rPr>
-        <w:t>1, một khách hàng tiềm năng có thể được chuyển thành một khách hàng hoặc không.</w:t>
+        <w:t>Leads – Customers: quan hệ 1-0..1, một khách hàng tiềm năng có thể được chuyển thành một khách hàng hoặc không.</w:t>
       </w:r>
     </w:p>
     <w:p>

</xml_diff>

<commit_message>
feat: chức năng tạo báo giá cho Sales
</commit_message>
<xml_diff>
--- a/docs/BaoCao/BaoCao.docx
+++ b/docs/BaoCao/BaoCao.docx
@@ -7465,42 +7465,8 @@
       <w:r>
         <w:fldChar w:fldCharType="end"/>
       </w:r>
-      <w:r>
-        <w:fldChar w:fldCharType="begin"/>
-      </w:r>
-      <w:r>
-        <w:instrText xml:space="preserve"> TOC \h \z \c "B</w:instrText>
-      </w:r>
-      <w:r>
-        <w:instrText>ả</w:instrText>
-      </w:r>
-      <w:r>
-        <w:instrText xml:space="preserve">ng" </w:instrText>
-      </w:r>
-      <w:r>
-        <w:fldChar w:fldCharType="separate"/>
-      </w:r>
-      <w:r>
-        <w:fldChar w:fldCharType="end"/>
-      </w:r>
-      <w:r>
-        <w:fldChar w:fldCharType="begin"/>
-      </w:r>
-      <w:r>
-        <w:instrText xml:space="preserve"> TOC \h \z \c "B</w:instrText>
-      </w:r>
-      <w:r>
-        <w:instrText>ả</w:instrText>
-      </w:r>
-      <w:r>
-        <w:instrText xml:space="preserve">ng" </w:instrText>
-      </w:r>
-      <w:r>
-        <w:fldChar w:fldCharType="separate"/>
-      </w:r>
-      <w:r>
-        <w:fldChar w:fldCharType="end"/>
-      </w:r>
+      <w:fldSimple w:instr=" TOC \h \z \c &quot;Bảng&quot; "/>
+      <w:fldSimple w:instr=" TOC \h \z \c &quot;Bảng&quot; "/>
       <w:r>
         <w:br w:type="page"/>
       </w:r>
@@ -15216,6 +15182,147 @@
                 <w:szCs w:val="26"/>
               </w:rPr>
               <w:t>Deal đang ở giai đoạn Proposal hoặc negotiation mới được phép tạo báo giá. Các giai đoạn còn lại thì không được tạo.</w:t>
+            </w:r>
+          </w:p>
+        </w:tc>
+      </w:tr>
+      <w:tr>
+        <w:tc>
+          <w:tcPr>
+            <w:tcW w:w="1696" w:type="dxa"/>
+          </w:tcPr>
+          <w:p>
+            <w:pPr>
+              <w:rPr>
+                <w:rFonts w:ascii="Times New Roman" w:hAnsi="Times New Roman" w:cs="Times New Roman"/>
+                <w:sz w:val="26"/>
+                <w:szCs w:val="26"/>
+              </w:rPr>
+            </w:pPr>
+            <w:r>
+              <w:rPr>
+                <w:rFonts w:ascii="Times New Roman" w:hAnsi="Times New Roman" w:cs="Times New Roman"/>
+                <w:sz w:val="26"/>
+                <w:szCs w:val="26"/>
+              </w:rPr>
+              <w:t>BR22</w:t>
+            </w:r>
+          </w:p>
+        </w:tc>
+        <w:tc>
+          <w:tcPr>
+            <w:tcW w:w="7365" w:type="dxa"/>
+          </w:tcPr>
+          <w:p>
+            <w:pPr>
+              <w:keepNext/>
+              <w:rPr>
+                <w:rFonts w:ascii="Times New Roman" w:hAnsi="Times New Roman" w:cs="Times New Roman"/>
+                <w:sz w:val="26"/>
+                <w:szCs w:val="26"/>
+              </w:rPr>
+            </w:pPr>
+            <w:r>
+              <w:rPr>
+                <w:rFonts w:ascii="Times New Roman" w:hAnsi="Times New Roman" w:cs="Times New Roman"/>
+                <w:sz w:val="26"/>
+                <w:szCs w:val="26"/>
+              </w:rPr>
+              <w:t>Báo giá ở trạng thái Draft mới được phép chỉnh sửa nội dung.</w:t>
+            </w:r>
+          </w:p>
+        </w:tc>
+      </w:tr>
+      <w:tr>
+        <w:tc>
+          <w:tcPr>
+            <w:tcW w:w="1696" w:type="dxa"/>
+          </w:tcPr>
+          <w:p>
+            <w:pPr>
+              <w:rPr>
+                <w:rFonts w:ascii="Times New Roman" w:hAnsi="Times New Roman" w:cs="Times New Roman"/>
+                <w:sz w:val="26"/>
+                <w:szCs w:val="26"/>
+              </w:rPr>
+            </w:pPr>
+            <w:r>
+              <w:rPr>
+                <w:rFonts w:ascii="Times New Roman" w:hAnsi="Times New Roman" w:cs="Times New Roman"/>
+                <w:sz w:val="26"/>
+                <w:szCs w:val="26"/>
+              </w:rPr>
+              <w:t>BR23</w:t>
+            </w:r>
+          </w:p>
+        </w:tc>
+        <w:tc>
+          <w:tcPr>
+            <w:tcW w:w="7365" w:type="dxa"/>
+          </w:tcPr>
+          <w:p>
+            <w:pPr>
+              <w:keepNext/>
+              <w:rPr>
+                <w:rFonts w:ascii="Times New Roman" w:hAnsi="Times New Roman" w:cs="Times New Roman"/>
+                <w:sz w:val="26"/>
+                <w:szCs w:val="26"/>
+              </w:rPr>
+            </w:pPr>
+            <w:r>
+              <w:rPr>
+                <w:rFonts w:ascii="Times New Roman" w:hAnsi="Times New Roman" w:cs="Times New Roman"/>
+                <w:sz w:val="26"/>
+                <w:szCs w:val="26"/>
+              </w:rPr>
+              <w:t>Báo giá ở trạng thái Confirmed thì không được chỉnh sửa, hủy hoặc chuyển về trạng thái trước đó.</w:t>
+            </w:r>
+          </w:p>
+        </w:tc>
+      </w:tr>
+      <w:tr>
+        <w:tc>
+          <w:tcPr>
+            <w:tcW w:w="1696" w:type="dxa"/>
+          </w:tcPr>
+          <w:p>
+            <w:pPr>
+              <w:rPr>
+                <w:rFonts w:ascii="Times New Roman" w:hAnsi="Times New Roman" w:cs="Times New Roman"/>
+                <w:sz w:val="26"/>
+                <w:szCs w:val="26"/>
+              </w:rPr>
+            </w:pPr>
+            <w:r>
+              <w:rPr>
+                <w:rFonts w:ascii="Times New Roman" w:hAnsi="Times New Roman" w:cs="Times New Roman"/>
+                <w:sz w:val="26"/>
+                <w:szCs w:val="26"/>
+              </w:rPr>
+              <w:t>BR24</w:t>
+            </w:r>
+          </w:p>
+        </w:tc>
+        <w:tc>
+          <w:tcPr>
+            <w:tcW w:w="7365" w:type="dxa"/>
+          </w:tcPr>
+          <w:p>
+            <w:pPr>
+              <w:keepNext/>
+              <w:rPr>
+                <w:rFonts w:ascii="Times New Roman" w:hAnsi="Times New Roman" w:cs="Times New Roman"/>
+                <w:sz w:val="26"/>
+                <w:szCs w:val="26"/>
+              </w:rPr>
+            </w:pPr>
+            <w:r>
+              <w:rPr>
+                <w:rFonts w:ascii="Times New Roman" w:hAnsi="Times New Roman" w:cs="Times New Roman"/>
+                <w:sz w:val="26"/>
+                <w:szCs w:val="26"/>
+              </w:rPr>
+              <w:t>Báo giá không được xóa vật lý, ở trạng thái Draft khi không sử dụng thì chỉ được chuyển sang trạng thái Cancelled.</w:t>
             </w:r>
           </w:p>
         </w:tc>

</xml_diff>

<commit_message>
feat: chức năng quản lý task cho sales manager, customer care; chức năng phân công task cho sales manager, cho phép sales xem task
</commit_message>
<xml_diff>
--- a/docs/BaoCao/BaoCao.docx
+++ b/docs/BaoCao/BaoCao.docx
@@ -6283,7 +6283,23 @@
             <w:rFonts w:ascii="Times New Roman" w:hAnsi="Times New Roman" w:cs="Times New Roman"/>
             <w:noProof/>
           </w:rPr>
-          <w:t>Bảng 2: Quy tắc nghiệp vụ</w:t>
+          <w:t>Bảng 2: Quy tắc nghiệp</w:t>
+        </w:r>
+        <w:r>
+          <w:rPr>
+            <w:rStyle w:val="Hyperlink"/>
+            <w:rFonts w:ascii="Times New Roman" w:hAnsi="Times New Roman" w:cs="Times New Roman"/>
+            <w:noProof/>
+          </w:rPr>
+          <w:t xml:space="preserve"> </w:t>
+        </w:r>
+        <w:r>
+          <w:rPr>
+            <w:rStyle w:val="Hyperlink"/>
+            <w:rFonts w:ascii="Times New Roman" w:hAnsi="Times New Roman" w:cs="Times New Roman"/>
+            <w:noProof/>
+          </w:rPr>
+          <w:t>vụ</w:t>
         </w:r>
         <w:r>
           <w:rPr>
@@ -6773,7 +6789,23 @@
             <w:rFonts w:ascii="Times New Roman" w:hAnsi="Times New Roman" w:cs="Times New Roman"/>
             <w:noProof/>
           </w:rPr>
-          <w:t>Bảng 9: UC7: Tạo Quote</w:t>
+          <w:t>Bảng 9: UC7: Tạo Q</w:t>
+        </w:r>
+        <w:r>
+          <w:rPr>
+            <w:rStyle w:val="Hyperlink"/>
+            <w:rFonts w:ascii="Times New Roman" w:hAnsi="Times New Roman" w:cs="Times New Roman"/>
+            <w:noProof/>
+          </w:rPr>
+          <w:t>u</w:t>
+        </w:r>
+        <w:r>
+          <w:rPr>
+            <w:rStyle w:val="Hyperlink"/>
+            <w:rFonts w:ascii="Times New Roman" w:hAnsi="Times New Roman" w:cs="Times New Roman"/>
+            <w:noProof/>
+          </w:rPr>
+          <w:t>ote</w:t>
         </w:r>
         <w:r>
           <w:rPr>
@@ -7465,8 +7497,42 @@
       <w:r>
         <w:fldChar w:fldCharType="end"/>
       </w:r>
-      <w:fldSimple w:instr=" TOC \h \z \c &quot;Bảng&quot; "/>
-      <w:fldSimple w:instr=" TOC \h \z \c &quot;Bảng&quot; "/>
+      <w:r>
+        <w:fldChar w:fldCharType="begin"/>
+      </w:r>
+      <w:r>
+        <w:instrText xml:space="preserve"> TOC \h \z \c "B</w:instrText>
+      </w:r>
+      <w:r>
+        <w:instrText>ả</w:instrText>
+      </w:r>
+      <w:r>
+        <w:instrText xml:space="preserve">ng" </w:instrText>
+      </w:r>
+      <w:r>
+        <w:fldChar w:fldCharType="separate"/>
+      </w:r>
+      <w:r>
+        <w:fldChar w:fldCharType="end"/>
+      </w:r>
+      <w:r>
+        <w:fldChar w:fldCharType="begin"/>
+      </w:r>
+      <w:r>
+        <w:instrText xml:space="preserve"> TOC \h \z \c "B</w:instrText>
+      </w:r>
+      <w:r>
+        <w:instrText>ả</w:instrText>
+      </w:r>
+      <w:r>
+        <w:instrText xml:space="preserve">ng" </w:instrText>
+      </w:r>
+      <w:r>
+        <w:fldChar w:fldCharType="separate"/>
+      </w:r>
+      <w:r>
+        <w:fldChar w:fldCharType="end"/>
+      </w:r>
       <w:r>
         <w:br w:type="page"/>
       </w:r>
@@ -20548,6 +20614,14 @@
                 <w:szCs w:val="26"/>
               </w:rPr>
               <w:t>, BR21</w:t>
+            </w:r>
+            <w:r>
+              <w:rPr>
+                <w:rFonts w:ascii="Times New Roman" w:hAnsi="Times New Roman" w:cs="Times New Roman"/>
+                <w:sz w:val="26"/>
+                <w:szCs w:val="26"/>
+              </w:rPr>
+              <w:t>, BR22, BR23, BR24</w:t>
             </w:r>
           </w:p>
         </w:tc>

</xml_diff>

<commit_message>
feat: chức năng phân công Lead
</commit_message>
<xml_diff>
--- a/docs/BaoCao/BaoCao.docx
+++ b/docs/BaoCao/BaoCao.docx
@@ -6206,7 +6206,7 @@
         </w:rPr>
         <w:fldChar w:fldCharType="separate"/>
       </w:r>
-      <w:hyperlink w:anchor="_Toc236288499" w:history="1">
+      <w:hyperlink w:anchor="_Toc238208003" w:history="1">
         <w:r>
           <w:rPr>
             <w:rStyle w:val="Hyperlink"/>
@@ -6234,7 +6234,7 @@
             <w:noProof/>
             <w:webHidden/>
           </w:rPr>
-          <w:instrText xml:space="preserve"> PAGEREF _Toc236288499 \h </w:instrText>
+          <w:instrText xml:space="preserve"> PAGEREF _Toc238208003 \h </w:instrText>
         </w:r>
         <w:r>
           <w:rPr>
@@ -6276,30 +6276,14 @@
           <w:noProof/>
         </w:rPr>
       </w:pPr>
-      <w:hyperlink w:anchor="_Toc236288500" w:history="1">
+      <w:hyperlink w:anchor="_Toc238208004" w:history="1">
         <w:r>
           <w:rPr>
             <w:rStyle w:val="Hyperlink"/>
             <w:rFonts w:ascii="Times New Roman" w:hAnsi="Times New Roman" w:cs="Times New Roman"/>
             <w:noProof/>
           </w:rPr>
-          <w:t>Bảng 2: Quy tắc nghiệp</w:t>
-        </w:r>
-        <w:r>
-          <w:rPr>
-            <w:rStyle w:val="Hyperlink"/>
-            <w:rFonts w:ascii="Times New Roman" w:hAnsi="Times New Roman" w:cs="Times New Roman"/>
-            <w:noProof/>
-          </w:rPr>
-          <w:t xml:space="preserve"> </w:t>
-        </w:r>
-        <w:r>
-          <w:rPr>
-            <w:rStyle w:val="Hyperlink"/>
-            <w:rFonts w:ascii="Times New Roman" w:hAnsi="Times New Roman" w:cs="Times New Roman"/>
-            <w:noProof/>
-          </w:rPr>
-          <w:t>vụ</w:t>
+          <w:t>Bảng 2: Quy tắc nghiệp vụ</w:t>
         </w:r>
         <w:r>
           <w:rPr>
@@ -6320,77 +6304,7 @@
             <w:noProof/>
             <w:webHidden/>
           </w:rPr>
-          <w:instrText xml:space="preserve"> PAGEREF _Toc236288500 \h </w:instrText>
-        </w:r>
-        <w:r>
-          <w:rPr>
-            <w:noProof/>
-            <w:webHidden/>
-          </w:rPr>
-        </w:r>
-        <w:r>
-          <w:rPr>
-            <w:noProof/>
-            <w:webHidden/>
-          </w:rPr>
-          <w:fldChar w:fldCharType="separate"/>
-        </w:r>
-        <w:r>
-          <w:rPr>
-            <w:noProof/>
-            <w:webHidden/>
-          </w:rPr>
-          <w:t>23</w:t>
-        </w:r>
-        <w:r>
-          <w:rPr>
-            <w:noProof/>
-            <w:webHidden/>
-          </w:rPr>
-          <w:fldChar w:fldCharType="end"/>
-        </w:r>
-      </w:hyperlink>
-    </w:p>
-    <w:p>
-      <w:pPr>
-        <w:pStyle w:val="TableofFigures"/>
-        <w:tabs>
-          <w:tab w:val="right" w:leader="dot" w:pos="9061"/>
-        </w:tabs>
-        <w:rPr>
-          <w:rFonts w:eastAsiaTheme="minorEastAsia"/>
-          <w:noProof/>
-        </w:rPr>
-      </w:pPr>
-      <w:hyperlink w:anchor="_Toc236288501" w:history="1">
-        <w:r>
-          <w:rPr>
-            <w:rStyle w:val="Hyperlink"/>
-            <w:rFonts w:ascii="Times New Roman" w:hAnsi="Times New Roman" w:cs="Times New Roman"/>
-            <w:noProof/>
-          </w:rPr>
-          <w:t>Bảng 3: UC1: Đăng nhập hệ thống</w:t>
-        </w:r>
-        <w:r>
-          <w:rPr>
-            <w:noProof/>
-            <w:webHidden/>
-          </w:rPr>
-          <w:tab/>
-        </w:r>
-        <w:r>
-          <w:rPr>
-            <w:noProof/>
-            <w:webHidden/>
-          </w:rPr>
-          <w:fldChar w:fldCharType="begin"/>
-        </w:r>
-        <w:r>
-          <w:rPr>
-            <w:noProof/>
-            <w:webHidden/>
-          </w:rPr>
-          <w:instrText xml:space="preserve"> PAGEREF _Toc236288501 \h </w:instrText>
+          <w:instrText xml:space="preserve"> PAGEREF _Toc238208004 \h </w:instrText>
         </w:r>
         <w:r>
           <w:rPr>
@@ -6432,14 +6346,14 @@
           <w:noProof/>
         </w:rPr>
       </w:pPr>
-      <w:hyperlink w:anchor="_Toc236288502" w:history="1">
+      <w:hyperlink w:anchor="_Toc238208005" w:history="1">
         <w:r>
           <w:rPr>
             <w:rStyle w:val="Hyperlink"/>
             <w:rFonts w:ascii="Times New Roman" w:hAnsi="Times New Roman" w:cs="Times New Roman"/>
             <w:noProof/>
           </w:rPr>
-          <w:t>Bảng 4: UC2: Quản lý Lead</w:t>
+          <w:t>Bảng 3: UC1: Đăng nhập hệ thống</w:t>
         </w:r>
         <w:r>
           <w:rPr>
@@ -6460,7 +6374,7 @@
             <w:noProof/>
             <w:webHidden/>
           </w:rPr>
-          <w:instrText xml:space="preserve"> PAGEREF _Toc236288502 \h </w:instrText>
+          <w:instrText xml:space="preserve"> PAGEREF _Toc238208005 \h </w:instrText>
         </w:r>
         <w:r>
           <w:rPr>
@@ -6502,7 +6416,77 @@
           <w:noProof/>
         </w:rPr>
       </w:pPr>
-      <w:hyperlink w:anchor="_Toc236288503" w:history="1">
+      <w:hyperlink w:anchor="_Toc238208006" w:history="1">
+        <w:r>
+          <w:rPr>
+            <w:rStyle w:val="Hyperlink"/>
+            <w:rFonts w:ascii="Times New Roman" w:hAnsi="Times New Roman" w:cs="Times New Roman"/>
+            <w:noProof/>
+          </w:rPr>
+          <w:t>Bảng 4: UC2: Quản lý Lead</w:t>
+        </w:r>
+        <w:r>
+          <w:rPr>
+            <w:noProof/>
+            <w:webHidden/>
+          </w:rPr>
+          <w:tab/>
+        </w:r>
+        <w:r>
+          <w:rPr>
+            <w:noProof/>
+            <w:webHidden/>
+          </w:rPr>
+          <w:fldChar w:fldCharType="begin"/>
+        </w:r>
+        <w:r>
+          <w:rPr>
+            <w:noProof/>
+            <w:webHidden/>
+          </w:rPr>
+          <w:instrText xml:space="preserve"> PAGEREF _Toc238208006 \h </w:instrText>
+        </w:r>
+        <w:r>
+          <w:rPr>
+            <w:noProof/>
+            <w:webHidden/>
+          </w:rPr>
+        </w:r>
+        <w:r>
+          <w:rPr>
+            <w:noProof/>
+            <w:webHidden/>
+          </w:rPr>
+          <w:fldChar w:fldCharType="separate"/>
+        </w:r>
+        <w:r>
+          <w:rPr>
+            <w:noProof/>
+            <w:webHidden/>
+          </w:rPr>
+          <w:t>25</w:t>
+        </w:r>
+        <w:r>
+          <w:rPr>
+            <w:noProof/>
+            <w:webHidden/>
+          </w:rPr>
+          <w:fldChar w:fldCharType="end"/>
+        </w:r>
+      </w:hyperlink>
+    </w:p>
+    <w:p>
+      <w:pPr>
+        <w:pStyle w:val="TableofFigures"/>
+        <w:tabs>
+          <w:tab w:val="right" w:leader="dot" w:pos="9061"/>
+        </w:tabs>
+        <w:rPr>
+          <w:rFonts w:eastAsiaTheme="minorEastAsia"/>
+          <w:noProof/>
+        </w:rPr>
+      </w:pPr>
+      <w:hyperlink w:anchor="_Toc238208007" w:history="1">
         <w:r>
           <w:rPr>
             <w:rStyle w:val="Hyperlink"/>
@@ -6530,7 +6514,7 @@
             <w:noProof/>
             <w:webHidden/>
           </w:rPr>
-          <w:instrText xml:space="preserve"> PAGEREF _Toc236288503 \h </w:instrText>
+          <w:instrText xml:space="preserve"> PAGEREF _Toc238208007 \h </w:instrText>
         </w:r>
         <w:r>
           <w:rPr>
@@ -6572,7 +6556,7 @@
           <w:noProof/>
         </w:rPr>
       </w:pPr>
-      <w:hyperlink w:anchor="_Toc236288504" w:history="1">
+      <w:hyperlink w:anchor="_Toc238208008" w:history="1">
         <w:r>
           <w:rPr>
             <w:rStyle w:val="Hyperlink"/>
@@ -6600,7 +6584,7 @@
             <w:noProof/>
             <w:webHidden/>
           </w:rPr>
-          <w:instrText xml:space="preserve"> PAGEREF _Toc236288504 \h </w:instrText>
+          <w:instrText xml:space="preserve"> PAGEREF _Toc238208008 \h </w:instrText>
         </w:r>
         <w:r>
           <w:rPr>
@@ -6642,7 +6626,7 @@
           <w:noProof/>
         </w:rPr>
       </w:pPr>
-      <w:hyperlink w:anchor="_Toc236288505" w:history="1">
+      <w:hyperlink w:anchor="_Toc238208009" w:history="1">
         <w:r>
           <w:rPr>
             <w:rStyle w:val="Hyperlink"/>
@@ -6670,7 +6654,7 @@
             <w:noProof/>
             <w:webHidden/>
           </w:rPr>
-          <w:instrText xml:space="preserve"> PAGEREF _Toc236288505 \h </w:instrText>
+          <w:instrText xml:space="preserve"> PAGEREF _Toc238208009 \h </w:instrText>
         </w:r>
         <w:r>
           <w:rPr>
@@ -6712,7 +6696,7 @@
           <w:noProof/>
         </w:rPr>
       </w:pPr>
-      <w:hyperlink w:anchor="_Toc236288506" w:history="1">
+      <w:hyperlink w:anchor="_Toc238208010" w:history="1">
         <w:r>
           <w:rPr>
             <w:rStyle w:val="Hyperlink"/>
@@ -6740,7 +6724,7 @@
             <w:noProof/>
             <w:webHidden/>
           </w:rPr>
-          <w:instrText xml:space="preserve"> PAGEREF _Toc236288506 \h </w:instrText>
+          <w:instrText xml:space="preserve"> PAGEREF _Toc238208010 \h </w:instrText>
         </w:r>
         <w:r>
           <w:rPr>
@@ -6782,30 +6766,14 @@
           <w:noProof/>
         </w:rPr>
       </w:pPr>
-      <w:hyperlink w:anchor="_Toc236288507" w:history="1">
+      <w:hyperlink w:anchor="_Toc238208011" w:history="1">
         <w:r>
           <w:rPr>
             <w:rStyle w:val="Hyperlink"/>
             <w:rFonts w:ascii="Times New Roman" w:hAnsi="Times New Roman" w:cs="Times New Roman"/>
             <w:noProof/>
           </w:rPr>
-          <w:t>Bảng 9: UC7: Tạo Q</w:t>
-        </w:r>
-        <w:r>
-          <w:rPr>
-            <w:rStyle w:val="Hyperlink"/>
-            <w:rFonts w:ascii="Times New Roman" w:hAnsi="Times New Roman" w:cs="Times New Roman"/>
-            <w:noProof/>
-          </w:rPr>
-          <w:t>u</w:t>
-        </w:r>
-        <w:r>
-          <w:rPr>
-            <w:rStyle w:val="Hyperlink"/>
-            <w:rFonts w:ascii="Times New Roman" w:hAnsi="Times New Roman" w:cs="Times New Roman"/>
-            <w:noProof/>
-          </w:rPr>
-          <w:t>ote</w:t>
+          <w:t>Bảng 9: UC7: Tạo Quote</w:t>
         </w:r>
         <w:r>
           <w:rPr>
@@ -6826,7 +6794,7 @@
             <w:noProof/>
             <w:webHidden/>
           </w:rPr>
-          <w:instrText xml:space="preserve"> PAGEREF _Toc236288507 \h </w:instrText>
+          <w:instrText xml:space="preserve"> PAGEREF _Toc238208011 \h </w:instrText>
         </w:r>
         <w:r>
           <w:rPr>
@@ -6868,7 +6836,7 @@
           <w:noProof/>
         </w:rPr>
       </w:pPr>
-      <w:hyperlink w:anchor="_Toc236288508" w:history="1">
+      <w:hyperlink w:anchor="_Toc238208012" w:history="1">
         <w:r>
           <w:rPr>
             <w:rStyle w:val="Hyperlink"/>
@@ -6896,7 +6864,7 @@
             <w:noProof/>
             <w:webHidden/>
           </w:rPr>
-          <w:instrText xml:space="preserve"> PAGEREF _Toc236288508 \h </w:instrText>
+          <w:instrText xml:space="preserve"> PAGEREF _Toc238208012 \h </w:instrText>
         </w:r>
         <w:r>
           <w:rPr>
@@ -6938,7 +6906,7 @@
           <w:noProof/>
         </w:rPr>
       </w:pPr>
-      <w:hyperlink w:anchor="_Toc236288509" w:history="1">
+      <w:hyperlink w:anchor="_Toc238208013" w:history="1">
         <w:r>
           <w:rPr>
             <w:rStyle w:val="Hyperlink"/>
@@ -6966,7 +6934,7 @@
             <w:noProof/>
             <w:webHidden/>
           </w:rPr>
-          <w:instrText xml:space="preserve"> PAGEREF _Toc236288509 \h </w:instrText>
+          <w:instrText xml:space="preserve"> PAGEREF _Toc238208013 \h </w:instrText>
         </w:r>
         <w:r>
           <w:rPr>
@@ -7008,7 +6976,7 @@
           <w:noProof/>
         </w:rPr>
       </w:pPr>
-      <w:hyperlink w:anchor="_Toc236288510" w:history="1">
+      <w:hyperlink w:anchor="_Toc238208014" w:history="1">
         <w:r>
           <w:rPr>
             <w:rStyle w:val="Hyperlink"/>
@@ -7036,7 +7004,7 @@
             <w:noProof/>
             <w:webHidden/>
           </w:rPr>
-          <w:instrText xml:space="preserve"> PAGEREF _Toc236288510 \h </w:instrText>
+          <w:instrText xml:space="preserve"> PAGEREF _Toc238208014 \h </w:instrText>
         </w:r>
         <w:r>
           <w:rPr>
@@ -7078,7 +7046,7 @@
           <w:noProof/>
         </w:rPr>
       </w:pPr>
-      <w:hyperlink w:anchor="_Toc236288511" w:history="1">
+      <w:hyperlink w:anchor="_Toc238208015" w:history="1">
         <w:r>
           <w:rPr>
             <w:rStyle w:val="Hyperlink"/>
@@ -7106,7 +7074,7 @@
             <w:noProof/>
             <w:webHidden/>
           </w:rPr>
-          <w:instrText xml:space="preserve"> PAGEREF _Toc236288511 \h </w:instrText>
+          <w:instrText xml:space="preserve"> PAGEREF _Toc238208015 \h </w:instrText>
         </w:r>
         <w:r>
           <w:rPr>
@@ -7148,7 +7116,7 @@
           <w:noProof/>
         </w:rPr>
       </w:pPr>
-      <w:hyperlink w:anchor="_Toc236288512" w:history="1">
+      <w:hyperlink w:anchor="_Toc238208016" w:history="1">
         <w:r>
           <w:rPr>
             <w:rStyle w:val="Hyperlink"/>
@@ -7176,7 +7144,7 @@
             <w:noProof/>
             <w:webHidden/>
           </w:rPr>
-          <w:instrText xml:space="preserve"> PAGEREF _Toc236288512 \h </w:instrText>
+          <w:instrText xml:space="preserve"> PAGEREF _Toc238208016 \h </w:instrText>
         </w:r>
         <w:r>
           <w:rPr>
@@ -7218,7 +7186,7 @@
           <w:noProof/>
         </w:rPr>
       </w:pPr>
-      <w:hyperlink w:anchor="_Toc236288513" w:history="1">
+      <w:hyperlink w:anchor="_Toc238208017" w:history="1">
         <w:r>
           <w:rPr>
             <w:rStyle w:val="Hyperlink"/>
@@ -7246,7 +7214,7 @@
             <w:noProof/>
             <w:webHidden/>
           </w:rPr>
-          <w:instrText xml:space="preserve"> PAGEREF _Toc236288513 \h </w:instrText>
+          <w:instrText xml:space="preserve"> PAGEREF _Toc238208017 \h </w:instrText>
         </w:r>
         <w:r>
           <w:rPr>
@@ -7288,7 +7256,7 @@
           <w:noProof/>
         </w:rPr>
       </w:pPr>
-      <w:hyperlink w:anchor="_Toc236288514" w:history="1">
+      <w:hyperlink w:anchor="_Toc238208018" w:history="1">
         <w:r>
           <w:rPr>
             <w:rStyle w:val="Hyperlink"/>
@@ -7316,7 +7284,7 @@
             <w:noProof/>
             <w:webHidden/>
           </w:rPr>
-          <w:instrText xml:space="preserve"> PAGEREF _Toc236288514 \h </w:instrText>
+          <w:instrText xml:space="preserve"> PAGEREF _Toc238208018 \h </w:instrText>
         </w:r>
         <w:r>
           <w:rPr>
@@ -7358,14 +7326,14 @@
           <w:noProof/>
         </w:rPr>
       </w:pPr>
-      <w:hyperlink w:anchor="_Toc236288515" w:history="1">
+      <w:hyperlink w:anchor="_Toc238208019" w:history="1">
         <w:r>
           <w:rPr>
             <w:rStyle w:val="Hyperlink"/>
             <w:rFonts w:ascii="Times New Roman" w:hAnsi="Times New Roman" w:cs="Times New Roman"/>
             <w:noProof/>
           </w:rPr>
-          <w:t>Bảng 17: Ma trận truy vết</w:t>
+          <w:t>Bảng 17: UC15: Phân công Lead</w:t>
         </w:r>
         <w:r>
           <w:rPr>
@@ -7386,7 +7354,77 @@
             <w:noProof/>
             <w:webHidden/>
           </w:rPr>
-          <w:instrText xml:space="preserve"> PAGEREF _Toc236288515 \h </w:instrText>
+          <w:instrText xml:space="preserve"> PAGEREF _Toc238208019 \h </w:instrText>
+        </w:r>
+        <w:r>
+          <w:rPr>
+            <w:noProof/>
+            <w:webHidden/>
+          </w:rPr>
+        </w:r>
+        <w:r>
+          <w:rPr>
+            <w:noProof/>
+            <w:webHidden/>
+          </w:rPr>
+          <w:fldChar w:fldCharType="separate"/>
+        </w:r>
+        <w:r>
+          <w:rPr>
+            <w:noProof/>
+            <w:webHidden/>
+          </w:rPr>
+          <w:t>32</w:t>
+        </w:r>
+        <w:r>
+          <w:rPr>
+            <w:noProof/>
+            <w:webHidden/>
+          </w:rPr>
+          <w:fldChar w:fldCharType="end"/>
+        </w:r>
+      </w:hyperlink>
+    </w:p>
+    <w:p>
+      <w:pPr>
+        <w:pStyle w:val="TableofFigures"/>
+        <w:tabs>
+          <w:tab w:val="right" w:leader="dot" w:pos="9061"/>
+        </w:tabs>
+        <w:rPr>
+          <w:rFonts w:eastAsiaTheme="minorEastAsia"/>
+          <w:noProof/>
+        </w:rPr>
+      </w:pPr>
+      <w:hyperlink w:anchor="_Toc238208020" w:history="1">
+        <w:r>
+          <w:rPr>
+            <w:rStyle w:val="Hyperlink"/>
+            <w:rFonts w:ascii="Times New Roman" w:hAnsi="Times New Roman" w:cs="Times New Roman"/>
+            <w:noProof/>
+          </w:rPr>
+          <w:t>Bảng 18: Ma trận truy vết</w:t>
+        </w:r>
+        <w:r>
+          <w:rPr>
+            <w:noProof/>
+            <w:webHidden/>
+          </w:rPr>
+          <w:tab/>
+        </w:r>
+        <w:r>
+          <w:rPr>
+            <w:noProof/>
+            <w:webHidden/>
+          </w:rPr>
+          <w:fldChar w:fldCharType="begin"/>
+        </w:r>
+        <w:r>
+          <w:rPr>
+            <w:noProof/>
+            <w:webHidden/>
+          </w:rPr>
+          <w:instrText xml:space="preserve"> PAGEREF _Toc238208020 \h </w:instrText>
         </w:r>
         <w:r>
           <w:rPr>
@@ -7428,14 +7466,14 @@
           <w:noProof/>
         </w:rPr>
       </w:pPr>
-      <w:hyperlink w:anchor="_Toc236288516" w:history="1">
+      <w:hyperlink w:anchor="_Toc238208021" w:history="1">
         <w:r>
           <w:rPr>
             <w:rStyle w:val="Hyperlink"/>
             <w:rFonts w:ascii="Times New Roman" w:hAnsi="Times New Roman" w:cs="Times New Roman"/>
             <w:noProof/>
           </w:rPr>
-          <w:t>Bảng 18: Chức năng của từng Module</w:t>
+          <w:t>Bảng 19: Chức năng của từng Module</w:t>
         </w:r>
         <w:r>
           <w:rPr>
@@ -7456,7 +7494,7 @@
             <w:noProof/>
             <w:webHidden/>
           </w:rPr>
-          <w:instrText xml:space="preserve"> PAGEREF _Toc236288516 \h </w:instrText>
+          <w:instrText xml:space="preserve"> PAGEREF _Toc238208021 \h </w:instrText>
         </w:r>
         <w:r>
           <w:rPr>
@@ -8455,7 +8493,7 @@
           <w:sz w:val="26"/>
           <w:szCs w:val="26"/>
         </w:rPr>
-        <w:t>Sales: tìm kiếm và nhập thông tin khách hàng; tư vấn, giới thiệu và báo giá sản phẩm, theo dõi và cập nhật tiến độ của khách hàng, phân công deal, đặt lịch hẹn</w:t>
+        <w:t>Sales: tìm kiếm và nhập thông tin khách hàng; tư vấn, giới thiệu và báo giá sản phẩm, theo dõi và cập nhật tiến độ của khách hàng, đặt lịch hẹn</w:t>
       </w:r>
       <w:r>
         <w:rPr>
@@ -8486,7 +8524,23 @@
           <w:sz w:val="26"/>
           <w:szCs w:val="26"/>
         </w:rPr>
-        <w:t>Sales manager: phân công Deal, theo dõi Pipeline, Forecast</w:t>
+        <w:t xml:space="preserve">Sales manager: phân công Deal, </w:t>
+      </w:r>
+      <w:r>
+        <w:rPr>
+          <w:rFonts w:ascii="Times New Roman" w:hAnsi="Times New Roman" w:cs="Times New Roman"/>
+          <w:sz w:val="26"/>
+          <w:szCs w:val="26"/>
+        </w:rPr>
+        <w:t xml:space="preserve">phân công leads, </w:t>
+      </w:r>
+      <w:r>
+        <w:rPr>
+          <w:rFonts w:ascii="Times New Roman" w:hAnsi="Times New Roman" w:cs="Times New Roman"/>
+          <w:sz w:val="26"/>
+          <w:szCs w:val="26"/>
+        </w:rPr>
+        <w:t>theo dõi Pipeline, Forecast</w:t>
       </w:r>
       <w:r>
         <w:rPr>
@@ -10366,7 +10420,7 @@
           <w:szCs w:val="26"/>
         </w:rPr>
       </w:pPr>
-      <w:bookmarkStart w:id="30" w:name="_Toc236288499"/>
+      <w:bookmarkStart w:id="30" w:name="_Toc238208003"/>
       <w:r>
         <w:rPr>
           <w:rFonts w:ascii="Times New Roman" w:hAnsi="Times New Roman" w:cs="Times New Roman"/>
@@ -14923,7 +14977,23 @@
                 <w:sz w:val="26"/>
                 <w:szCs w:val="26"/>
               </w:rPr>
-              <w:t>Khi Deal và Task được phân công, hệ thống tạo thông báo và gửi cho nhân viên được giao.</w:t>
+              <w:t>Khi</w:t>
+            </w:r>
+            <w:r>
+              <w:rPr>
+                <w:rFonts w:ascii="Times New Roman" w:hAnsi="Times New Roman" w:cs="Times New Roman"/>
+                <w:sz w:val="26"/>
+                <w:szCs w:val="26"/>
+              </w:rPr>
+              <w:t xml:space="preserve"> Lead,</w:t>
+            </w:r>
+            <w:r>
+              <w:rPr>
+                <w:rFonts w:ascii="Times New Roman" w:hAnsi="Times New Roman" w:cs="Times New Roman"/>
+                <w:sz w:val="26"/>
+                <w:szCs w:val="26"/>
+              </w:rPr>
+              <w:t xml:space="preserve"> Deal và Task được phân công, hệ thống tạo thông báo và gửi cho nhân viên được giao.</w:t>
             </w:r>
           </w:p>
         </w:tc>
@@ -15393,6 +15463,195 @@
           </w:p>
         </w:tc>
       </w:tr>
+      <w:tr>
+        <w:tc>
+          <w:tcPr>
+            <w:tcW w:w="1696" w:type="dxa"/>
+          </w:tcPr>
+          <w:p>
+            <w:pPr>
+              <w:rPr>
+                <w:rFonts w:ascii="Times New Roman" w:hAnsi="Times New Roman" w:cs="Times New Roman"/>
+                <w:sz w:val="26"/>
+                <w:szCs w:val="26"/>
+              </w:rPr>
+            </w:pPr>
+            <w:r>
+              <w:rPr>
+                <w:rFonts w:ascii="Times New Roman" w:hAnsi="Times New Roman" w:cs="Times New Roman"/>
+                <w:sz w:val="26"/>
+                <w:szCs w:val="26"/>
+              </w:rPr>
+              <w:t>BR25</w:t>
+            </w:r>
+          </w:p>
+        </w:tc>
+        <w:tc>
+          <w:tcPr>
+            <w:tcW w:w="7365" w:type="dxa"/>
+          </w:tcPr>
+          <w:p>
+            <w:pPr>
+              <w:keepNext/>
+              <w:rPr>
+                <w:rFonts w:ascii="Times New Roman" w:hAnsi="Times New Roman" w:cs="Times New Roman"/>
+                <w:sz w:val="26"/>
+                <w:szCs w:val="26"/>
+              </w:rPr>
+            </w:pPr>
+            <w:r>
+              <w:rPr>
+                <w:rFonts w:ascii="Times New Roman" w:hAnsi="Times New Roman" w:cs="Times New Roman"/>
+                <w:sz w:val="26"/>
+                <w:szCs w:val="26"/>
+              </w:rPr>
+              <w:t>Chỉ Sales Manager được phép phân công Sales phụ trách Lead.</w:t>
+            </w:r>
+          </w:p>
+        </w:tc>
+      </w:tr>
+      <w:tr>
+        <w:tc>
+          <w:tcPr>
+            <w:tcW w:w="1696" w:type="dxa"/>
+          </w:tcPr>
+          <w:p>
+            <w:pPr>
+              <w:rPr>
+                <w:rFonts w:ascii="Times New Roman" w:hAnsi="Times New Roman" w:cs="Times New Roman"/>
+                <w:sz w:val="26"/>
+                <w:szCs w:val="26"/>
+              </w:rPr>
+            </w:pPr>
+            <w:r>
+              <w:rPr>
+                <w:rFonts w:ascii="Times New Roman" w:hAnsi="Times New Roman" w:cs="Times New Roman"/>
+                <w:sz w:val="26"/>
+                <w:szCs w:val="26"/>
+              </w:rPr>
+              <w:lastRenderedPageBreak/>
+              <w:t>BR26</w:t>
+            </w:r>
+          </w:p>
+        </w:tc>
+        <w:tc>
+          <w:tcPr>
+            <w:tcW w:w="7365" w:type="dxa"/>
+          </w:tcPr>
+          <w:p>
+            <w:pPr>
+              <w:keepNext/>
+              <w:rPr>
+                <w:rFonts w:ascii="Times New Roman" w:hAnsi="Times New Roman" w:cs="Times New Roman"/>
+                <w:sz w:val="26"/>
+                <w:szCs w:val="26"/>
+              </w:rPr>
+            </w:pPr>
+            <w:r>
+              <w:rPr>
+                <w:rFonts w:ascii="Times New Roman" w:hAnsi="Times New Roman" w:cs="Times New Roman"/>
+                <w:sz w:val="26"/>
+                <w:szCs w:val="26"/>
+              </w:rPr>
+              <w:t>Lead chỉ được phân công cho Sales đang hoạt động.</w:t>
+            </w:r>
+          </w:p>
+        </w:tc>
+      </w:tr>
+      <w:tr>
+        <w:tc>
+          <w:tcPr>
+            <w:tcW w:w="1696" w:type="dxa"/>
+          </w:tcPr>
+          <w:p>
+            <w:pPr>
+              <w:rPr>
+                <w:rFonts w:ascii="Times New Roman" w:hAnsi="Times New Roman" w:cs="Times New Roman"/>
+                <w:sz w:val="26"/>
+                <w:szCs w:val="26"/>
+              </w:rPr>
+            </w:pPr>
+            <w:r>
+              <w:rPr>
+                <w:rFonts w:ascii="Times New Roman" w:hAnsi="Times New Roman" w:cs="Times New Roman"/>
+                <w:sz w:val="26"/>
+                <w:szCs w:val="26"/>
+              </w:rPr>
+              <w:t>BR27</w:t>
+            </w:r>
+          </w:p>
+        </w:tc>
+        <w:tc>
+          <w:tcPr>
+            <w:tcW w:w="7365" w:type="dxa"/>
+          </w:tcPr>
+          <w:p>
+            <w:pPr>
+              <w:keepNext/>
+              <w:rPr>
+                <w:rFonts w:ascii="Times New Roman" w:hAnsi="Times New Roman" w:cs="Times New Roman"/>
+                <w:sz w:val="26"/>
+                <w:szCs w:val="26"/>
+              </w:rPr>
+            </w:pPr>
+            <w:r>
+              <w:rPr>
+                <w:rFonts w:ascii="Times New Roman" w:hAnsi="Times New Roman" w:cs="Times New Roman"/>
+                <w:sz w:val="26"/>
+                <w:szCs w:val="26"/>
+              </w:rPr>
+              <w:t>Sales chỉ được xem và xử lý các Lead mình phụ trách.</w:t>
+            </w:r>
+          </w:p>
+        </w:tc>
+      </w:tr>
+      <w:tr>
+        <w:tc>
+          <w:tcPr>
+            <w:tcW w:w="1696" w:type="dxa"/>
+          </w:tcPr>
+          <w:p>
+            <w:pPr>
+              <w:rPr>
+                <w:rFonts w:ascii="Times New Roman" w:hAnsi="Times New Roman" w:cs="Times New Roman"/>
+                <w:sz w:val="26"/>
+                <w:szCs w:val="26"/>
+              </w:rPr>
+            </w:pPr>
+            <w:r>
+              <w:rPr>
+                <w:rFonts w:ascii="Times New Roman" w:hAnsi="Times New Roman" w:cs="Times New Roman"/>
+                <w:sz w:val="26"/>
+                <w:szCs w:val="26"/>
+              </w:rPr>
+              <w:t>BR28</w:t>
+            </w:r>
+          </w:p>
+        </w:tc>
+        <w:tc>
+          <w:tcPr>
+            <w:tcW w:w="7365" w:type="dxa"/>
+          </w:tcPr>
+          <w:p>
+            <w:pPr>
+              <w:keepNext/>
+              <w:rPr>
+                <w:rFonts w:ascii="Times New Roman" w:hAnsi="Times New Roman" w:cs="Times New Roman"/>
+                <w:sz w:val="26"/>
+                <w:szCs w:val="26"/>
+              </w:rPr>
+            </w:pPr>
+            <w:r>
+              <w:rPr>
+                <w:rFonts w:ascii="Times New Roman" w:hAnsi="Times New Roman" w:cs="Times New Roman"/>
+                <w:sz w:val="26"/>
+                <w:szCs w:val="26"/>
+              </w:rPr>
+              <w:t>Lead đã chuyển đổi thành Customer không được phân công lại.</w:t>
+            </w:r>
+          </w:p>
+        </w:tc>
+      </w:tr>
     </w:tbl>
     <w:p>
       <w:pPr>
@@ -15403,7 +15662,7 @@
           <w:szCs w:val="26"/>
         </w:rPr>
       </w:pPr>
-      <w:bookmarkStart w:id="61" w:name="_Toc236288500"/>
+      <w:bookmarkStart w:id="61" w:name="_Toc238208004"/>
       <w:r>
         <w:rPr>
           <w:rFonts w:ascii="Times New Roman" w:hAnsi="Times New Roman" w:cs="Times New Roman"/>
@@ -15475,7 +15734,6 @@
         <w:rPr>
           <w:rFonts w:ascii="Times New Roman" w:hAnsi="Times New Roman" w:cs="Times New Roman"/>
         </w:rPr>
-        <w:lastRenderedPageBreak/>
         <w:t>USE-CASE DIAGRAM</w:t>
       </w:r>
       <w:bookmarkEnd w:id="60"/>
@@ -16087,6 +16345,7 @@
                 <w:sz w:val="26"/>
                 <w:szCs w:val="26"/>
               </w:rPr>
+              <w:lastRenderedPageBreak/>
               <w:t>Nếu hợp lệ thì tạo phiên đăng nhập</w:t>
             </w:r>
           </w:p>
@@ -16133,6 +16392,7 @@
                 <w:sz w:val="26"/>
                 <w:szCs w:val="26"/>
               </w:rPr>
+              <w:lastRenderedPageBreak/>
               <w:t>Luồng thay thế</w:t>
             </w:r>
           </w:p>
@@ -16198,7 +16458,7 @@
           <w:szCs w:val="26"/>
         </w:rPr>
       </w:pPr>
-      <w:bookmarkStart w:id="67" w:name="_Toc236288501"/>
+      <w:bookmarkStart w:id="67" w:name="_Toc238208005"/>
       <w:r>
         <w:rPr>
           <w:rFonts w:ascii="Times New Roman" w:hAnsi="Times New Roman" w:cs="Times New Roman"/>
@@ -16277,7 +16537,6 @@
           <w:sz w:val="26"/>
           <w:szCs w:val="26"/>
         </w:rPr>
-        <w:lastRenderedPageBreak/>
         <w:t>UC2: Quản lý Lead</w:t>
       </w:r>
     </w:p>
@@ -16946,7 +17205,7 @@
           <w:szCs w:val="26"/>
         </w:rPr>
       </w:pPr>
-      <w:bookmarkStart w:id="68" w:name="_Toc236288502"/>
+      <w:bookmarkStart w:id="68" w:name="_Toc238208006"/>
       <w:r>
         <w:rPr>
           <w:rFonts w:ascii="Times New Roman" w:hAnsi="Times New Roman" w:cs="Times New Roman"/>
@@ -17641,6 +17900,7 @@
                 <w:sz w:val="26"/>
                 <w:szCs w:val="26"/>
               </w:rPr>
+              <w:lastRenderedPageBreak/>
               <w:t>Luồng thay thế</w:t>
             </w:r>
           </w:p>
@@ -17752,7 +18012,6 @@
                 <w:sz w:val="26"/>
                 <w:szCs w:val="26"/>
               </w:rPr>
-              <w:lastRenderedPageBreak/>
               <w:t xml:space="preserve">Chuyển đổi Customer thất bại </w:t>
             </w:r>
             <w:r>
@@ -17784,14 +18043,13 @@
           <w:szCs w:val="26"/>
         </w:rPr>
       </w:pPr>
-      <w:bookmarkStart w:id="69" w:name="_Toc236288503"/>
-      <w:r>
-        <w:rPr>
-          <w:rFonts w:ascii="Times New Roman" w:hAnsi="Times New Roman" w:cs="Times New Roman"/>
-          <w:sz w:val="26"/>
-          <w:szCs w:val="26"/>
-        </w:rPr>
-        <w:lastRenderedPageBreak/>
+      <w:bookmarkStart w:id="69" w:name="_Toc238208007"/>
+      <w:r>
+        <w:rPr>
+          <w:rFonts w:ascii="Times New Roman" w:hAnsi="Times New Roman" w:cs="Times New Roman"/>
+          <w:sz w:val="26"/>
+          <w:szCs w:val="26"/>
+        </w:rPr>
         <w:t xml:space="preserve">Bảng </w:t>
       </w:r>
       <w:r>
@@ -18682,7 +18940,7 @@
           <w:szCs w:val="26"/>
         </w:rPr>
       </w:pPr>
-      <w:bookmarkStart w:id="70" w:name="_Toc236288504"/>
+      <w:bookmarkStart w:id="70" w:name="_Toc238208008"/>
       <w:r>
         <w:rPr>
           <w:rFonts w:ascii="Times New Roman" w:hAnsi="Times New Roman" w:cs="Times New Roman"/>
@@ -19313,6 +19571,7 @@
                 <w:sz w:val="26"/>
                 <w:szCs w:val="26"/>
               </w:rPr>
+              <w:lastRenderedPageBreak/>
               <w:t>Ghi Activity Log</w:t>
             </w:r>
           </w:p>
@@ -19337,6 +19596,7 @@
                 <w:sz w:val="26"/>
                 <w:szCs w:val="26"/>
               </w:rPr>
+              <w:lastRenderedPageBreak/>
               <w:t>Luồng thay thế</w:t>
             </w:r>
           </w:p>
@@ -19440,7 +19700,6 @@
                 <w:sz w:val="26"/>
                 <w:szCs w:val="26"/>
               </w:rPr>
-              <w:lastRenderedPageBreak/>
               <w:t xml:space="preserve">Deal không tồn tại </w:t>
             </w:r>
             <w:r>
@@ -19472,14 +19731,13 @@
           <w:szCs w:val="26"/>
         </w:rPr>
       </w:pPr>
-      <w:bookmarkStart w:id="71" w:name="_Toc236288505"/>
-      <w:r>
-        <w:rPr>
-          <w:rFonts w:ascii="Times New Roman" w:hAnsi="Times New Roman" w:cs="Times New Roman"/>
-          <w:sz w:val="26"/>
-          <w:szCs w:val="26"/>
-        </w:rPr>
-        <w:lastRenderedPageBreak/>
+      <w:bookmarkStart w:id="71" w:name="_Toc238208009"/>
+      <w:r>
+        <w:rPr>
+          <w:rFonts w:ascii="Times New Roman" w:hAnsi="Times New Roman" w:cs="Times New Roman"/>
+          <w:sz w:val="26"/>
+          <w:szCs w:val="26"/>
+        </w:rPr>
         <w:t xml:space="preserve">Bảng </w:t>
       </w:r>
       <w:r>
@@ -20180,7 +20438,7 @@
           <w:szCs w:val="26"/>
         </w:rPr>
       </w:pPr>
-      <w:bookmarkStart w:id="72" w:name="_Toc236288506"/>
+      <w:bookmarkStart w:id="72" w:name="_Toc238208010"/>
       <w:r>
         <w:rPr>
           <w:rFonts w:ascii="Times New Roman" w:hAnsi="Times New Roman" w:cs="Times New Roman"/>
@@ -20798,6 +21056,7 @@
                 <w:sz w:val="26"/>
                 <w:szCs w:val="26"/>
               </w:rPr>
+              <w:lastRenderedPageBreak/>
               <w:t>Hệ thống tính thành tiền cho từng sản phẩm và tổng tiền</w:t>
             </w:r>
           </w:p>
@@ -20864,7 +21123,6 @@
                 <w:sz w:val="26"/>
                 <w:szCs w:val="26"/>
               </w:rPr>
-              <w:lastRenderedPageBreak/>
               <w:t>Hệ thống lưu từng sản phẩm vào QuoteDetails</w:t>
             </w:r>
           </w:p>
@@ -21085,7 +21343,7 @@
           <w:szCs w:val="26"/>
         </w:rPr>
       </w:pPr>
-      <w:bookmarkStart w:id="73" w:name="_Toc236288507"/>
+      <w:bookmarkStart w:id="73" w:name="_Toc238208011"/>
       <w:r>
         <w:rPr>
           <w:rFonts w:ascii="Times New Roman" w:hAnsi="Times New Roman" w:cs="Times New Roman"/>
@@ -21970,7 +22228,7 @@
           <w:szCs w:val="26"/>
         </w:rPr>
       </w:pPr>
-      <w:bookmarkStart w:id="74" w:name="_Toc236288508"/>
+      <w:bookmarkStart w:id="74" w:name="_Toc238208012"/>
       <w:r>
         <w:rPr>
           <w:rFonts w:ascii="Times New Roman" w:hAnsi="Times New Roman" w:cs="Times New Roman"/>
@@ -22173,6 +22431,7 @@
                 <w:sz w:val="26"/>
                 <w:szCs w:val="26"/>
               </w:rPr>
+              <w:lastRenderedPageBreak/>
               <w:t>Mô tả</w:t>
             </w:r>
           </w:p>
@@ -22311,7 +22570,6 @@
                 <w:sz w:val="26"/>
                 <w:szCs w:val="26"/>
               </w:rPr>
-              <w:lastRenderedPageBreak/>
               <w:t>Hậu điều kiện</w:t>
             </w:r>
           </w:p>
@@ -22730,7 +22988,7 @@
           <w:szCs w:val="26"/>
         </w:rPr>
       </w:pPr>
-      <w:bookmarkStart w:id="75" w:name="_Toc236288509"/>
+      <w:bookmarkStart w:id="75" w:name="_Toc238208013"/>
       <w:r>
         <w:rPr>
           <w:rFonts w:ascii="Times New Roman" w:hAnsi="Times New Roman" w:cs="Times New Roman"/>
@@ -23415,7 +23673,7 @@
           <w:szCs w:val="26"/>
         </w:rPr>
       </w:pPr>
-      <w:bookmarkStart w:id="76" w:name="_Toc236288510"/>
+      <w:bookmarkStart w:id="76" w:name="_Toc238208014"/>
       <w:r>
         <w:rPr>
           <w:rFonts w:ascii="Times New Roman" w:hAnsi="Times New Roman" w:cs="Times New Roman"/>
@@ -23672,6 +23930,7 @@
                 <w:sz w:val="26"/>
                 <w:szCs w:val="26"/>
               </w:rPr>
+              <w:lastRenderedPageBreak/>
               <w:t>Actor</w:t>
             </w:r>
           </w:p>
@@ -23826,7 +24085,6 @@
                 <w:sz w:val="26"/>
                 <w:szCs w:val="26"/>
               </w:rPr>
-              <w:lastRenderedPageBreak/>
               <w:t>Quy tắc nghiệp vụ</w:t>
             </w:r>
           </w:p>
@@ -24225,7 +24483,7 @@
           <w:szCs w:val="26"/>
         </w:rPr>
       </w:pPr>
-      <w:bookmarkStart w:id="77" w:name="_Toc236288511"/>
+      <w:bookmarkStart w:id="77" w:name="_Toc238208015"/>
       <w:r>
         <w:rPr>
           <w:rFonts w:ascii="Times New Roman" w:hAnsi="Times New Roman" w:cs="Times New Roman"/>
@@ -24994,7 +25252,7 @@
           <w:szCs w:val="26"/>
         </w:rPr>
       </w:pPr>
-      <w:bookmarkStart w:id="78" w:name="_Toc236288512"/>
+      <w:bookmarkStart w:id="78" w:name="_Toc238208016"/>
       <w:r>
         <w:rPr>
           <w:rFonts w:ascii="Times New Roman" w:hAnsi="Times New Roman" w:cs="Times New Roman"/>
@@ -25329,6 +25587,7 @@
                 <w:sz w:val="26"/>
                 <w:szCs w:val="26"/>
               </w:rPr>
+              <w:lastRenderedPageBreak/>
               <w:t>Tiền điều kiện</w:t>
             </w:r>
           </w:p>
@@ -25475,7 +25734,6 @@
                 <w:sz w:val="26"/>
                 <w:szCs w:val="26"/>
               </w:rPr>
-              <w:lastRenderedPageBreak/>
               <w:t>Luồng chính</w:t>
             </w:r>
           </w:p>
@@ -25859,7 +26117,7 @@
           <w:szCs w:val="26"/>
         </w:rPr>
       </w:pPr>
-      <w:bookmarkStart w:id="79" w:name="_Toc236288513"/>
+      <w:bookmarkStart w:id="79" w:name="_Toc238208017"/>
       <w:r>
         <w:rPr>
           <w:rFonts w:ascii="Times New Roman" w:hAnsi="Times New Roman" w:cs="Times New Roman"/>
@@ -26661,7 +26919,7 @@
           <w:szCs w:val="26"/>
         </w:rPr>
       </w:pPr>
-      <w:bookmarkStart w:id="80" w:name="_Toc236288514"/>
+      <w:bookmarkStart w:id="80" w:name="_Toc238208018"/>
       <w:r>
         <w:rPr>
           <w:rFonts w:ascii="Times New Roman" w:hAnsi="Times New Roman" w:cs="Times New Roman"/>
@@ -26739,22 +26997,773 @@
     </w:p>
     <w:p>
       <w:pPr>
+        <w:pStyle w:val="ListParagraph"/>
+        <w:numPr>
+          <w:ilvl w:val="0"/>
+          <w:numId w:val="49"/>
+        </w:numPr>
+        <w:rPr>
+          <w:rFonts w:ascii="Times New Roman" w:hAnsi="Times New Roman" w:cs="Times New Roman"/>
+          <w:sz w:val="26"/>
+          <w:szCs w:val="26"/>
+        </w:rPr>
+      </w:pPr>
+      <w:r>
+        <w:rPr>
+          <w:rFonts w:ascii="Times New Roman" w:hAnsi="Times New Roman" w:cs="Times New Roman"/>
+          <w:sz w:val="26"/>
+          <w:szCs w:val="26"/>
+        </w:rPr>
+        <w:t>UC15: Phân công Leads</w:t>
+      </w:r>
+    </w:p>
+    <w:tbl>
+      <w:tblPr>
+        <w:tblStyle w:val="TableGrid"/>
+        <w:tblW w:w="0" w:type="auto"/>
+        <w:tblLook w:val="04A0" w:firstRow="1" w:lastRow="0" w:firstColumn="1" w:lastColumn="0" w:noHBand="0" w:noVBand="1"/>
+      </w:tblPr>
+      <w:tblGrid>
+        <w:gridCol w:w="2263"/>
+        <w:gridCol w:w="6798"/>
+      </w:tblGrid>
+      <w:tr>
+        <w:tc>
+          <w:tcPr>
+            <w:tcW w:w="2263" w:type="dxa"/>
+          </w:tcPr>
+          <w:p>
+            <w:pPr>
+              <w:rPr>
+                <w:rFonts w:ascii="Times New Roman" w:hAnsi="Times New Roman" w:cs="Times New Roman"/>
+                <w:sz w:val="26"/>
+                <w:szCs w:val="26"/>
+              </w:rPr>
+            </w:pPr>
+            <w:r>
+              <w:rPr>
+                <w:rFonts w:ascii="Times New Roman" w:hAnsi="Times New Roman" w:cs="Times New Roman"/>
+                <w:sz w:val="26"/>
+                <w:szCs w:val="26"/>
+              </w:rPr>
+              <w:t>Thuộc tính</w:t>
+            </w:r>
+          </w:p>
+        </w:tc>
+        <w:tc>
+          <w:tcPr>
+            <w:tcW w:w="6798" w:type="dxa"/>
+          </w:tcPr>
+          <w:p>
+            <w:pPr>
+              <w:rPr>
+                <w:rFonts w:ascii="Times New Roman" w:hAnsi="Times New Roman" w:cs="Times New Roman"/>
+                <w:sz w:val="26"/>
+                <w:szCs w:val="26"/>
+              </w:rPr>
+            </w:pPr>
+            <w:r>
+              <w:rPr>
+                <w:rFonts w:ascii="Times New Roman" w:hAnsi="Times New Roman" w:cs="Times New Roman"/>
+                <w:sz w:val="26"/>
+                <w:szCs w:val="26"/>
+              </w:rPr>
+              <w:t>Nội dung</w:t>
+            </w:r>
+          </w:p>
+        </w:tc>
+      </w:tr>
+      <w:tr>
+        <w:tc>
+          <w:tcPr>
+            <w:tcW w:w="2263" w:type="dxa"/>
+          </w:tcPr>
+          <w:p>
+            <w:pPr>
+              <w:rPr>
+                <w:rFonts w:ascii="Times New Roman" w:hAnsi="Times New Roman" w:cs="Times New Roman"/>
+                <w:sz w:val="26"/>
+                <w:szCs w:val="26"/>
+              </w:rPr>
+            </w:pPr>
+            <w:r>
+              <w:rPr>
+                <w:rFonts w:ascii="Times New Roman" w:hAnsi="Times New Roman" w:cs="Times New Roman"/>
+                <w:sz w:val="26"/>
+                <w:szCs w:val="26"/>
+              </w:rPr>
+              <w:t>Mã Use Case</w:t>
+            </w:r>
+          </w:p>
+        </w:tc>
+        <w:tc>
+          <w:tcPr>
+            <w:tcW w:w="6798" w:type="dxa"/>
+          </w:tcPr>
+          <w:p>
+            <w:pPr>
+              <w:rPr>
+                <w:rFonts w:ascii="Times New Roman" w:hAnsi="Times New Roman" w:cs="Times New Roman"/>
+                <w:sz w:val="26"/>
+                <w:szCs w:val="26"/>
+              </w:rPr>
+            </w:pPr>
+            <w:r>
+              <w:rPr>
+                <w:rFonts w:ascii="Times New Roman" w:hAnsi="Times New Roman" w:cs="Times New Roman"/>
+                <w:sz w:val="26"/>
+                <w:szCs w:val="26"/>
+              </w:rPr>
+              <w:t>UC15</w:t>
+            </w:r>
+          </w:p>
+        </w:tc>
+      </w:tr>
+      <w:tr>
+        <w:tc>
+          <w:tcPr>
+            <w:tcW w:w="2263" w:type="dxa"/>
+          </w:tcPr>
+          <w:p>
+            <w:pPr>
+              <w:rPr>
+                <w:rFonts w:ascii="Times New Roman" w:hAnsi="Times New Roman" w:cs="Times New Roman"/>
+                <w:sz w:val="26"/>
+                <w:szCs w:val="26"/>
+              </w:rPr>
+            </w:pPr>
+            <w:r>
+              <w:rPr>
+                <w:rFonts w:ascii="Times New Roman" w:hAnsi="Times New Roman" w:cs="Times New Roman"/>
+                <w:sz w:val="26"/>
+                <w:szCs w:val="26"/>
+              </w:rPr>
+              <w:t>Mô tả</w:t>
+            </w:r>
+          </w:p>
+        </w:tc>
+        <w:tc>
+          <w:tcPr>
+            <w:tcW w:w="6798" w:type="dxa"/>
+          </w:tcPr>
+          <w:p>
+            <w:pPr>
+              <w:rPr>
+                <w:rFonts w:ascii="Times New Roman" w:hAnsi="Times New Roman" w:cs="Times New Roman"/>
+                <w:sz w:val="26"/>
+                <w:szCs w:val="26"/>
+              </w:rPr>
+            </w:pPr>
+            <w:r>
+              <w:rPr>
+                <w:rFonts w:ascii="Times New Roman" w:hAnsi="Times New Roman" w:cs="Times New Roman"/>
+                <w:sz w:val="26"/>
+                <w:szCs w:val="26"/>
+              </w:rPr>
+              <w:t>Sales Manager phân công Lead mới cho Sales</w:t>
+            </w:r>
+          </w:p>
+        </w:tc>
+      </w:tr>
+      <w:tr>
+        <w:tc>
+          <w:tcPr>
+            <w:tcW w:w="2263" w:type="dxa"/>
+          </w:tcPr>
+          <w:p>
+            <w:pPr>
+              <w:rPr>
+                <w:rFonts w:ascii="Times New Roman" w:hAnsi="Times New Roman" w:cs="Times New Roman"/>
+                <w:sz w:val="26"/>
+                <w:szCs w:val="26"/>
+              </w:rPr>
+            </w:pPr>
+            <w:r>
+              <w:rPr>
+                <w:rFonts w:ascii="Times New Roman" w:hAnsi="Times New Roman" w:cs="Times New Roman"/>
+                <w:sz w:val="26"/>
+                <w:szCs w:val="26"/>
+              </w:rPr>
+              <w:lastRenderedPageBreak/>
+              <w:t>Actor</w:t>
+            </w:r>
+          </w:p>
+        </w:tc>
+        <w:tc>
+          <w:tcPr>
+            <w:tcW w:w="6798" w:type="dxa"/>
+          </w:tcPr>
+          <w:p>
+            <w:pPr>
+              <w:rPr>
+                <w:rFonts w:ascii="Times New Roman" w:hAnsi="Times New Roman" w:cs="Times New Roman"/>
+                <w:sz w:val="26"/>
+                <w:szCs w:val="26"/>
+              </w:rPr>
+            </w:pPr>
+            <w:r>
+              <w:rPr>
+                <w:rFonts w:ascii="Times New Roman" w:hAnsi="Times New Roman" w:cs="Times New Roman"/>
+                <w:sz w:val="26"/>
+                <w:szCs w:val="26"/>
+              </w:rPr>
+              <w:t>Sales Manager</w:t>
+            </w:r>
+          </w:p>
+        </w:tc>
+      </w:tr>
+      <w:tr>
+        <w:tc>
+          <w:tcPr>
+            <w:tcW w:w="2263" w:type="dxa"/>
+          </w:tcPr>
+          <w:p>
+            <w:pPr>
+              <w:rPr>
+                <w:rFonts w:ascii="Times New Roman" w:hAnsi="Times New Roman" w:cs="Times New Roman"/>
+                <w:sz w:val="26"/>
+                <w:szCs w:val="26"/>
+              </w:rPr>
+            </w:pPr>
+            <w:r>
+              <w:rPr>
+                <w:rFonts w:ascii="Times New Roman" w:hAnsi="Times New Roman" w:cs="Times New Roman"/>
+                <w:sz w:val="26"/>
+                <w:szCs w:val="26"/>
+              </w:rPr>
+              <w:t>Tiền điều kiện</w:t>
+            </w:r>
+          </w:p>
+        </w:tc>
+        <w:tc>
+          <w:tcPr>
+            <w:tcW w:w="6798" w:type="dxa"/>
+          </w:tcPr>
+          <w:p>
+            <w:pPr>
+              <w:rPr>
+                <w:rFonts w:ascii="Times New Roman" w:hAnsi="Times New Roman" w:cs="Times New Roman"/>
+                <w:sz w:val="26"/>
+                <w:szCs w:val="26"/>
+              </w:rPr>
+            </w:pPr>
+            <w:r>
+              <w:rPr>
+                <w:rFonts w:ascii="Times New Roman" w:hAnsi="Times New Roman" w:cs="Times New Roman"/>
+                <w:sz w:val="26"/>
+                <w:szCs w:val="26"/>
+              </w:rPr>
+              <w:t>Sales Manager đăng nhập vào hệ thống, Lead đã tồn tại trước đó, Sales ở trạng thái hoạt động</w:t>
+            </w:r>
+          </w:p>
+        </w:tc>
+      </w:tr>
+      <w:tr>
+        <w:tc>
+          <w:tcPr>
+            <w:tcW w:w="2263" w:type="dxa"/>
+          </w:tcPr>
+          <w:p>
+            <w:pPr>
+              <w:rPr>
+                <w:rFonts w:ascii="Times New Roman" w:hAnsi="Times New Roman" w:cs="Times New Roman"/>
+                <w:sz w:val="26"/>
+                <w:szCs w:val="26"/>
+              </w:rPr>
+            </w:pPr>
+            <w:r>
+              <w:rPr>
+                <w:rFonts w:ascii="Times New Roman" w:hAnsi="Times New Roman" w:cs="Times New Roman"/>
+                <w:sz w:val="26"/>
+                <w:szCs w:val="26"/>
+              </w:rPr>
+              <w:t>Hậu điều kiện</w:t>
+            </w:r>
+          </w:p>
+        </w:tc>
+        <w:tc>
+          <w:tcPr>
+            <w:tcW w:w="6798" w:type="dxa"/>
+          </w:tcPr>
+          <w:p>
+            <w:pPr>
+              <w:rPr>
+                <w:rFonts w:ascii="Times New Roman" w:hAnsi="Times New Roman" w:cs="Times New Roman"/>
+                <w:sz w:val="26"/>
+                <w:szCs w:val="26"/>
+              </w:rPr>
+            </w:pPr>
+            <w:r>
+              <w:rPr>
+                <w:rFonts w:ascii="Times New Roman" w:hAnsi="Times New Roman" w:cs="Times New Roman"/>
+                <w:sz w:val="26"/>
+                <w:szCs w:val="26"/>
+              </w:rPr>
+              <w:t>Lead được gán cho Sales, Sales chịu trách nhiệm có thể xem và thao tác trên Lead đó.</w:t>
+            </w:r>
+          </w:p>
+        </w:tc>
+      </w:tr>
+      <w:tr>
+        <w:tc>
+          <w:tcPr>
+            <w:tcW w:w="2263" w:type="dxa"/>
+          </w:tcPr>
+          <w:p>
+            <w:pPr>
+              <w:rPr>
+                <w:rFonts w:ascii="Times New Roman" w:hAnsi="Times New Roman" w:cs="Times New Roman"/>
+                <w:sz w:val="26"/>
+                <w:szCs w:val="26"/>
+              </w:rPr>
+            </w:pPr>
+            <w:r>
+              <w:rPr>
+                <w:rFonts w:ascii="Times New Roman" w:hAnsi="Times New Roman" w:cs="Times New Roman"/>
+                <w:sz w:val="26"/>
+                <w:szCs w:val="26"/>
+              </w:rPr>
+              <w:t>Quy tắc nghiệp vụ</w:t>
+            </w:r>
+          </w:p>
+        </w:tc>
+        <w:tc>
+          <w:tcPr>
+            <w:tcW w:w="6798" w:type="dxa"/>
+          </w:tcPr>
+          <w:p>
+            <w:pPr>
+              <w:rPr>
+                <w:rFonts w:ascii="Times New Roman" w:hAnsi="Times New Roman" w:cs="Times New Roman"/>
+                <w:sz w:val="26"/>
+                <w:szCs w:val="26"/>
+              </w:rPr>
+            </w:pPr>
+            <w:r>
+              <w:rPr>
+                <w:rFonts w:ascii="Times New Roman" w:hAnsi="Times New Roman" w:cs="Times New Roman"/>
+                <w:sz w:val="26"/>
+                <w:szCs w:val="26"/>
+              </w:rPr>
+              <w:t>BR14,</w:t>
+            </w:r>
+            <w:r>
+              <w:rPr>
+                <w:rFonts w:ascii="Times New Roman" w:hAnsi="Times New Roman" w:cs="Times New Roman"/>
+                <w:sz w:val="26"/>
+                <w:szCs w:val="26"/>
+              </w:rPr>
+              <w:t xml:space="preserve"> BR18,</w:t>
+            </w:r>
+            <w:r>
+              <w:rPr>
+                <w:rFonts w:ascii="Times New Roman" w:hAnsi="Times New Roman" w:cs="Times New Roman"/>
+                <w:sz w:val="26"/>
+                <w:szCs w:val="26"/>
+              </w:rPr>
+              <w:t xml:space="preserve"> BR25, BR26, BR27, BR28</w:t>
+            </w:r>
+          </w:p>
+        </w:tc>
+      </w:tr>
+      <w:tr>
+        <w:tc>
+          <w:tcPr>
+            <w:tcW w:w="2263" w:type="dxa"/>
+          </w:tcPr>
+          <w:p>
+            <w:pPr>
+              <w:rPr>
+                <w:rFonts w:ascii="Times New Roman" w:hAnsi="Times New Roman" w:cs="Times New Roman"/>
+                <w:sz w:val="26"/>
+                <w:szCs w:val="26"/>
+              </w:rPr>
+            </w:pPr>
+            <w:r>
+              <w:rPr>
+                <w:rFonts w:ascii="Times New Roman" w:hAnsi="Times New Roman" w:cs="Times New Roman"/>
+                <w:sz w:val="26"/>
+                <w:szCs w:val="26"/>
+              </w:rPr>
+              <w:t>Luồng chính</w:t>
+            </w:r>
+          </w:p>
+        </w:tc>
+        <w:tc>
+          <w:tcPr>
+            <w:tcW w:w="6798" w:type="dxa"/>
+          </w:tcPr>
+          <w:p>
+            <w:pPr>
+              <w:pStyle w:val="ListParagraph"/>
+              <w:numPr>
+                <w:ilvl w:val="0"/>
+                <w:numId w:val="50"/>
+              </w:numPr>
+              <w:rPr>
+                <w:rFonts w:ascii="Times New Roman" w:hAnsi="Times New Roman" w:cs="Times New Roman"/>
+                <w:sz w:val="26"/>
+                <w:szCs w:val="26"/>
+              </w:rPr>
+            </w:pPr>
+            <w:r>
+              <w:rPr>
+                <w:rFonts w:ascii="Times New Roman" w:hAnsi="Times New Roman" w:cs="Times New Roman"/>
+                <w:sz w:val="26"/>
+                <w:szCs w:val="26"/>
+              </w:rPr>
+              <w:t>Sales Manager đăng nhập vào hệ thống.</w:t>
+            </w:r>
+          </w:p>
+          <w:p>
+            <w:pPr>
+              <w:pStyle w:val="ListParagraph"/>
+              <w:numPr>
+                <w:ilvl w:val="0"/>
+                <w:numId w:val="50"/>
+              </w:numPr>
+              <w:rPr>
+                <w:rFonts w:ascii="Times New Roman" w:hAnsi="Times New Roman" w:cs="Times New Roman"/>
+                <w:sz w:val="26"/>
+                <w:szCs w:val="26"/>
+              </w:rPr>
+            </w:pPr>
+            <w:r>
+              <w:rPr>
+                <w:rFonts w:ascii="Times New Roman" w:hAnsi="Times New Roman" w:cs="Times New Roman"/>
+                <w:sz w:val="26"/>
+                <w:szCs w:val="26"/>
+              </w:rPr>
+              <w:t>Sales Manager mở danh sách Lead.</w:t>
+            </w:r>
+          </w:p>
+          <w:p>
+            <w:pPr>
+              <w:pStyle w:val="ListParagraph"/>
+              <w:numPr>
+                <w:ilvl w:val="0"/>
+                <w:numId w:val="50"/>
+              </w:numPr>
+              <w:rPr>
+                <w:rFonts w:ascii="Times New Roman" w:hAnsi="Times New Roman" w:cs="Times New Roman"/>
+                <w:sz w:val="26"/>
+                <w:szCs w:val="26"/>
+              </w:rPr>
+            </w:pPr>
+            <w:r>
+              <w:rPr>
+                <w:rFonts w:ascii="Times New Roman" w:hAnsi="Times New Roman" w:cs="Times New Roman"/>
+                <w:sz w:val="26"/>
+                <w:szCs w:val="26"/>
+              </w:rPr>
+              <w:t>Sales Manager chọn Lead cần phân công và bấm nút phân công.</w:t>
+            </w:r>
+          </w:p>
+          <w:p>
+            <w:pPr>
+              <w:pStyle w:val="ListParagraph"/>
+              <w:numPr>
+                <w:ilvl w:val="0"/>
+                <w:numId w:val="50"/>
+              </w:numPr>
+              <w:rPr>
+                <w:rFonts w:ascii="Times New Roman" w:hAnsi="Times New Roman" w:cs="Times New Roman"/>
+                <w:sz w:val="26"/>
+                <w:szCs w:val="26"/>
+              </w:rPr>
+            </w:pPr>
+            <w:r>
+              <w:rPr>
+                <w:rFonts w:ascii="Times New Roman" w:hAnsi="Times New Roman" w:cs="Times New Roman"/>
+                <w:sz w:val="26"/>
+                <w:szCs w:val="26"/>
+              </w:rPr>
+              <w:t>Hệ thống hiển thị danh sách Sales.</w:t>
+            </w:r>
+          </w:p>
+          <w:p>
+            <w:pPr>
+              <w:pStyle w:val="ListParagraph"/>
+              <w:numPr>
+                <w:ilvl w:val="0"/>
+                <w:numId w:val="50"/>
+              </w:numPr>
+              <w:rPr>
+                <w:rFonts w:ascii="Times New Roman" w:hAnsi="Times New Roman" w:cs="Times New Roman"/>
+                <w:sz w:val="26"/>
+                <w:szCs w:val="26"/>
+              </w:rPr>
+            </w:pPr>
+            <w:r>
+              <w:rPr>
+                <w:rFonts w:ascii="Times New Roman" w:hAnsi="Times New Roman" w:cs="Times New Roman"/>
+                <w:sz w:val="26"/>
+                <w:szCs w:val="26"/>
+              </w:rPr>
+              <w:t>Sales Manager chọn Sales phụ trách.</w:t>
+            </w:r>
+          </w:p>
+          <w:p>
+            <w:pPr>
+              <w:pStyle w:val="ListParagraph"/>
+              <w:numPr>
+                <w:ilvl w:val="0"/>
+                <w:numId w:val="50"/>
+              </w:numPr>
+              <w:rPr>
+                <w:rFonts w:ascii="Times New Roman" w:hAnsi="Times New Roman" w:cs="Times New Roman"/>
+                <w:sz w:val="26"/>
+                <w:szCs w:val="26"/>
+              </w:rPr>
+            </w:pPr>
+            <w:r>
+              <w:rPr>
+                <w:rFonts w:ascii="Times New Roman" w:hAnsi="Times New Roman" w:cs="Times New Roman"/>
+                <w:sz w:val="26"/>
+                <w:szCs w:val="26"/>
+              </w:rPr>
+              <w:t>Hệ thống cập nhật người phụ trách Lead.</w:t>
+            </w:r>
+          </w:p>
+          <w:p>
+            <w:pPr>
+              <w:pStyle w:val="ListParagraph"/>
+              <w:numPr>
+                <w:ilvl w:val="0"/>
+                <w:numId w:val="50"/>
+              </w:numPr>
+              <w:rPr>
+                <w:rFonts w:ascii="Times New Roman" w:hAnsi="Times New Roman" w:cs="Times New Roman"/>
+                <w:sz w:val="26"/>
+                <w:szCs w:val="26"/>
+              </w:rPr>
+            </w:pPr>
+            <w:r>
+              <w:rPr>
+                <w:rFonts w:ascii="Times New Roman" w:hAnsi="Times New Roman" w:cs="Times New Roman"/>
+                <w:sz w:val="26"/>
+                <w:szCs w:val="26"/>
+              </w:rPr>
+              <w:t>Hệ thống thông báo phân công thành công.</w:t>
+            </w:r>
+          </w:p>
+          <w:p>
+            <w:pPr>
+              <w:pStyle w:val="ListParagraph"/>
+              <w:numPr>
+                <w:ilvl w:val="0"/>
+                <w:numId w:val="50"/>
+              </w:numPr>
+              <w:rPr>
+                <w:rFonts w:ascii="Times New Roman" w:hAnsi="Times New Roman" w:cs="Times New Roman"/>
+                <w:sz w:val="26"/>
+                <w:szCs w:val="26"/>
+              </w:rPr>
+            </w:pPr>
+            <w:r>
+              <w:rPr>
+                <w:rFonts w:ascii="Times New Roman" w:hAnsi="Times New Roman" w:cs="Times New Roman"/>
+                <w:sz w:val="26"/>
+                <w:szCs w:val="26"/>
+              </w:rPr>
+              <w:t>Hệ thống ghi nhật ký vào Activity Logs.</w:t>
+            </w:r>
+          </w:p>
+        </w:tc>
+      </w:tr>
+      <w:tr>
+        <w:tc>
+          <w:tcPr>
+            <w:tcW w:w="2263" w:type="dxa"/>
+          </w:tcPr>
+          <w:p>
+            <w:pPr>
+              <w:rPr>
+                <w:rFonts w:ascii="Times New Roman" w:hAnsi="Times New Roman" w:cs="Times New Roman"/>
+                <w:sz w:val="26"/>
+                <w:szCs w:val="26"/>
+              </w:rPr>
+            </w:pPr>
+            <w:r>
+              <w:rPr>
+                <w:rFonts w:ascii="Times New Roman" w:hAnsi="Times New Roman" w:cs="Times New Roman"/>
+                <w:sz w:val="26"/>
+                <w:szCs w:val="26"/>
+              </w:rPr>
+              <w:t>Luồng thay thế</w:t>
+            </w:r>
+          </w:p>
+        </w:tc>
+        <w:tc>
+          <w:tcPr>
+            <w:tcW w:w="6798" w:type="dxa"/>
+          </w:tcPr>
+          <w:p>
+            <w:pPr>
+              <w:pStyle w:val="ListParagraph"/>
+              <w:numPr>
+                <w:ilvl w:val="0"/>
+                <w:numId w:val="51"/>
+              </w:numPr>
+              <w:rPr>
+                <w:rFonts w:ascii="Times New Roman" w:hAnsi="Times New Roman" w:cs="Times New Roman"/>
+                <w:sz w:val="26"/>
+                <w:szCs w:val="26"/>
+              </w:rPr>
+            </w:pPr>
+            <w:r>
+              <w:rPr>
+                <w:rFonts w:ascii="Times New Roman" w:hAnsi="Times New Roman" w:cs="Times New Roman"/>
+                <w:sz w:val="26"/>
+                <w:szCs w:val="26"/>
+              </w:rPr>
+              <w:t xml:space="preserve">Sales bị khóa </w:t>
+            </w:r>
+            <w:r>
+              <w:rPr>
+                <w:rFonts w:ascii="Times New Roman" w:hAnsi="Times New Roman" w:cs="Times New Roman"/>
+                <w:sz w:val="26"/>
+                <w:szCs w:val="26"/>
+              </w:rPr>
+              <w:sym w:font="Wingdings" w:char="F0E0"/>
+            </w:r>
+            <w:r>
+              <w:rPr>
+                <w:rFonts w:ascii="Times New Roman" w:hAnsi="Times New Roman" w:cs="Times New Roman"/>
+                <w:sz w:val="26"/>
+                <w:szCs w:val="26"/>
+              </w:rPr>
+              <w:t xml:space="preserve"> Không cho phép phân công.</w:t>
+            </w:r>
+          </w:p>
+          <w:p>
+            <w:pPr>
+              <w:pStyle w:val="ListParagraph"/>
+              <w:keepNext/>
+              <w:numPr>
+                <w:ilvl w:val="0"/>
+                <w:numId w:val="51"/>
+              </w:numPr>
+              <w:rPr>
+                <w:rFonts w:ascii="Times New Roman" w:hAnsi="Times New Roman" w:cs="Times New Roman"/>
+                <w:sz w:val="26"/>
+                <w:szCs w:val="26"/>
+              </w:rPr>
+            </w:pPr>
+            <w:r>
+              <w:rPr>
+                <w:rFonts w:ascii="Times New Roman" w:hAnsi="Times New Roman" w:cs="Times New Roman"/>
+                <w:sz w:val="26"/>
+                <w:szCs w:val="26"/>
+              </w:rPr>
+              <w:t xml:space="preserve">Lead ở trạng thái Comverted </w:t>
+            </w:r>
+            <w:r>
+              <w:rPr>
+                <w:rFonts w:ascii="Times New Roman" w:hAnsi="Times New Roman" w:cs="Times New Roman"/>
+                <w:sz w:val="26"/>
+                <w:szCs w:val="26"/>
+              </w:rPr>
+              <w:sym w:font="Wingdings" w:char="F0E0"/>
+            </w:r>
+            <w:r>
+              <w:rPr>
+                <w:rFonts w:ascii="Times New Roman" w:hAnsi="Times New Roman" w:cs="Times New Roman"/>
+                <w:sz w:val="26"/>
+                <w:szCs w:val="26"/>
+              </w:rPr>
+              <w:t xml:space="preserve"> Không cho phép phân công lại.</w:t>
+            </w:r>
+          </w:p>
+        </w:tc>
+      </w:tr>
+    </w:tbl>
+    <w:p>
+      <w:pPr>
+        <w:pStyle w:val="Caption"/>
+        <w:rPr>
+          <w:rFonts w:ascii="Times New Roman" w:hAnsi="Times New Roman" w:cs="Times New Roman"/>
+          <w:sz w:val="26"/>
+          <w:szCs w:val="26"/>
+        </w:rPr>
+      </w:pPr>
+      <w:bookmarkStart w:id="81" w:name="_Toc238208019"/>
+      <w:r>
+        <w:rPr>
+          <w:rFonts w:ascii="Times New Roman" w:hAnsi="Times New Roman" w:cs="Times New Roman"/>
+          <w:sz w:val="26"/>
+          <w:szCs w:val="26"/>
+        </w:rPr>
+        <w:t xml:space="preserve">Bảng </w:t>
+      </w:r>
+      <w:r>
+        <w:rPr>
+          <w:rFonts w:ascii="Times New Roman" w:hAnsi="Times New Roman" w:cs="Times New Roman"/>
+          <w:sz w:val="26"/>
+          <w:szCs w:val="26"/>
+        </w:rPr>
+        <w:fldChar w:fldCharType="begin"/>
+      </w:r>
+      <w:r>
+        <w:rPr>
+          <w:rFonts w:ascii="Times New Roman" w:hAnsi="Times New Roman" w:cs="Times New Roman"/>
+          <w:sz w:val="26"/>
+          <w:szCs w:val="26"/>
+        </w:rPr>
+        <w:instrText xml:space="preserve"> SEQ Bảng \* ARABIC </w:instrText>
+      </w:r>
+      <w:r>
+        <w:rPr>
+          <w:rFonts w:ascii="Times New Roman" w:hAnsi="Times New Roman" w:cs="Times New Roman"/>
+          <w:sz w:val="26"/>
+          <w:szCs w:val="26"/>
+        </w:rPr>
+        <w:fldChar w:fldCharType="separate"/>
+      </w:r>
+      <w:r>
+        <w:rPr>
+          <w:rFonts w:ascii="Times New Roman" w:hAnsi="Times New Roman" w:cs="Times New Roman"/>
+          <w:noProof/>
+          <w:sz w:val="26"/>
+          <w:szCs w:val="26"/>
+        </w:rPr>
+        <w:t>17</w:t>
+      </w:r>
+      <w:r>
+        <w:rPr>
+          <w:rFonts w:ascii="Times New Roman" w:hAnsi="Times New Roman" w:cs="Times New Roman"/>
+          <w:sz w:val="26"/>
+          <w:szCs w:val="26"/>
+        </w:rPr>
+        <w:fldChar w:fldCharType="end"/>
+      </w:r>
+      <w:r>
+        <w:rPr>
+          <w:rFonts w:ascii="Times New Roman" w:hAnsi="Times New Roman" w:cs="Times New Roman"/>
+          <w:sz w:val="26"/>
+          <w:szCs w:val="26"/>
+        </w:rPr>
+        <w:t>: UC15: Phân công Lead</w:t>
+      </w:r>
+      <w:bookmarkEnd w:id="81"/>
+    </w:p>
+    <w:p>
+      <w:pPr>
         <w:pStyle w:val="Heading2"/>
         <w:rPr>
           <w:rFonts w:ascii="Times New Roman" w:hAnsi="Times New Roman" w:cs="Times New Roman"/>
         </w:rPr>
       </w:pPr>
-      <w:bookmarkStart w:id="81" w:name="_Toc235563722"/>
-      <w:bookmarkStart w:id="82" w:name="_Toc236288486"/>
-      <w:r>
-        <w:rPr>
-          <w:rFonts w:ascii="Times New Roman" w:hAnsi="Times New Roman" w:cs="Times New Roman"/>
-        </w:rPr>
-        <w:lastRenderedPageBreak/>
+      <w:bookmarkStart w:id="82" w:name="_Toc235563722"/>
+      <w:bookmarkStart w:id="83" w:name="_Toc236288486"/>
+      <w:r>
+        <w:rPr>
+          <w:rFonts w:ascii="Times New Roman" w:hAnsi="Times New Roman" w:cs="Times New Roman"/>
+        </w:rPr>
         <w:t>ACTIVITY DIAGRAM</w:t>
       </w:r>
-      <w:bookmarkEnd w:id="81"/>
       <w:bookmarkEnd w:id="82"/>
+      <w:bookmarkEnd w:id="83"/>
     </w:p>
     <w:p>
       <w:pPr>
@@ -26819,7 +27828,7 @@
           <w:szCs w:val="26"/>
         </w:rPr>
       </w:pPr>
-      <w:bookmarkStart w:id="83" w:name="_Toc236469867"/>
+      <w:bookmarkStart w:id="84" w:name="_Toc236469867"/>
       <w:r>
         <w:rPr>
           <w:rFonts w:ascii="Times New Roman" w:hAnsi="Times New Roman" w:cs="Times New Roman"/>
@@ -26893,7 +27902,7 @@
         </w:rPr>
         <w:t>mô tả đăng nhập hệ thống</w:t>
       </w:r>
-      <w:bookmarkEnd w:id="83"/>
+      <w:bookmarkEnd w:id="84"/>
     </w:p>
     <w:p>
       <w:pPr>
@@ -26920,6 +27929,7 @@
         <w:rPr>
           <w:noProof/>
         </w:rPr>
+        <w:lastRenderedPageBreak/>
         <w:drawing>
           <wp:inline distT="0" distB="0" distL="0" distR="0" wp14:anchorId="32AD9F75" wp14:editId="098CD108">
             <wp:extent cx="5791835" cy="2533015"/>
@@ -26972,7 +27982,7 @@
           <w:szCs w:val="26"/>
         </w:rPr>
       </w:pPr>
-      <w:bookmarkStart w:id="84" w:name="_Toc236469868"/>
+      <w:bookmarkStart w:id="85" w:name="_Toc236469868"/>
       <w:r>
         <w:rPr>
           <w:rFonts w:ascii="Times New Roman" w:hAnsi="Times New Roman" w:cs="Times New Roman"/>
@@ -27030,7 +28040,7 @@
         </w:rPr>
         <w:t>: Activity Diagram mô tả Chuyển Lead thành Customer</w:t>
       </w:r>
-      <w:bookmarkEnd w:id="84"/>
+      <w:bookmarkEnd w:id="85"/>
     </w:p>
     <w:p>
       <w:pPr>
@@ -27060,7 +28070,6 @@
           <w:sz w:val="26"/>
           <w:szCs w:val="26"/>
         </w:rPr>
-        <w:lastRenderedPageBreak/>
         <w:drawing>
           <wp:inline distT="0" distB="0" distL="0" distR="0" wp14:anchorId="624132DA" wp14:editId="2EAAEE01">
             <wp:extent cx="5791835" cy="2430145"/>
@@ -27113,7 +28122,7 @@
           <w:szCs w:val="26"/>
         </w:rPr>
       </w:pPr>
-      <w:bookmarkStart w:id="85" w:name="_Toc236469869"/>
+      <w:bookmarkStart w:id="86" w:name="_Toc236469869"/>
       <w:r>
         <w:rPr>
           <w:rFonts w:ascii="Times New Roman" w:hAnsi="Times New Roman" w:cs="Times New Roman"/>
@@ -27171,7 +28180,7 @@
         </w:rPr>
         <w:t>: Activity Diagram mô tả tạo Deal</w:t>
       </w:r>
-      <w:bookmarkEnd w:id="85"/>
+      <w:bookmarkEnd w:id="86"/>
     </w:p>
     <w:p>
       <w:pPr>
@@ -27209,6 +28218,7 @@
           <w:sz w:val="26"/>
           <w:szCs w:val="26"/>
         </w:rPr>
+        <w:lastRenderedPageBreak/>
         <w:drawing>
           <wp:inline distT="0" distB="0" distL="0" distR="0" wp14:anchorId="1BDB0F67" wp14:editId="07751B62">
             <wp:extent cx="5791835" cy="2178685"/>
@@ -27261,7 +28271,7 @@
           <w:szCs w:val="26"/>
         </w:rPr>
       </w:pPr>
-      <w:bookmarkStart w:id="86" w:name="_Toc236469870"/>
+      <w:bookmarkStart w:id="87" w:name="_Toc236469870"/>
       <w:r>
         <w:rPr>
           <w:rFonts w:ascii="Times New Roman" w:hAnsi="Times New Roman" w:cs="Times New Roman"/>
@@ -27319,7 +28329,7 @@
         </w:rPr>
         <w:t>: Activity Diagram mô tả tạo báo giá</w:t>
       </w:r>
-      <w:bookmarkEnd w:id="86"/>
+      <w:bookmarkEnd w:id="87"/>
     </w:p>
     <w:p>
       <w:pPr>
@@ -27373,7 +28383,6 @@
           <w:sz w:val="26"/>
           <w:szCs w:val="26"/>
         </w:rPr>
-        <w:lastRenderedPageBreak/>
         <w:drawing>
           <wp:inline distT="0" distB="0" distL="0" distR="0" wp14:anchorId="1639577D" wp14:editId="62F22A0A">
             <wp:extent cx="5791835" cy="2414905"/>
@@ -27426,7 +28435,7 @@
           <w:szCs w:val="26"/>
         </w:rPr>
       </w:pPr>
-      <w:bookmarkStart w:id="87" w:name="_Toc236469871"/>
+      <w:bookmarkStart w:id="88" w:name="_Toc236469871"/>
       <w:r>
         <w:rPr>
           <w:rFonts w:ascii="Times New Roman" w:hAnsi="Times New Roman" w:cs="Times New Roman"/>
@@ -27484,7 +28493,7 @@
         </w:rPr>
         <w:t>: Activity Diagram mô tả chuyển đổi giai đoạn Pipeline</w:t>
       </w:r>
-      <w:bookmarkEnd w:id="87"/>
+      <w:bookmarkEnd w:id="88"/>
     </w:p>
     <w:p>
       <w:pPr>
@@ -27510,8 +28519,8 @@
           <w:rFonts w:ascii="Times New Roman" w:hAnsi="Times New Roman" w:cs="Times New Roman"/>
         </w:rPr>
       </w:pPr>
-      <w:bookmarkStart w:id="88" w:name="_Toc235563723"/>
-      <w:bookmarkStart w:id="89" w:name="_Toc236288487"/>
+      <w:bookmarkStart w:id="89" w:name="_Toc235563723"/>
+      <w:bookmarkStart w:id="90" w:name="_Toc236288487"/>
       <w:r>
         <w:rPr>
           <w:rFonts w:ascii="Times New Roman" w:hAnsi="Times New Roman" w:cs="Times New Roman"/>
@@ -27525,8 +28534,8 @@
         </w:rPr>
         <w:t xml:space="preserve"> DIAGRAM</w:t>
       </w:r>
-      <w:bookmarkEnd w:id="88"/>
       <w:bookmarkEnd w:id="89"/>
+      <w:bookmarkEnd w:id="90"/>
     </w:p>
     <w:p>
       <w:pPr>
@@ -27591,7 +28600,7 @@
           <w:szCs w:val="26"/>
         </w:rPr>
       </w:pPr>
-      <w:bookmarkStart w:id="90" w:name="_Toc236469872"/>
+      <w:bookmarkStart w:id="91" w:name="_Toc236469872"/>
       <w:r>
         <w:rPr>
           <w:rFonts w:ascii="Times New Roman" w:hAnsi="Times New Roman" w:cs="Times New Roman"/>
@@ -27649,7 +28658,7 @@
         </w:rPr>
         <w:t>: Sequence Diagram mô tả quy trình chuyển Lead thành Customer</w:t>
       </w:r>
-      <w:bookmarkEnd w:id="90"/>
+      <w:bookmarkEnd w:id="91"/>
     </w:p>
     <w:p>
       <w:pPr>
@@ -27732,7 +28741,7 @@
           <w:szCs w:val="26"/>
         </w:rPr>
       </w:pPr>
-      <w:bookmarkStart w:id="91" w:name="_Toc236469873"/>
+      <w:bookmarkStart w:id="92" w:name="_Toc236469873"/>
       <w:r>
         <w:rPr>
           <w:rFonts w:ascii="Times New Roman" w:hAnsi="Times New Roman" w:cs="Times New Roman"/>
@@ -27790,7 +28799,7 @@
         </w:rPr>
         <w:t>: Sequence Diagram mô tả quy trình tạo Deal mới</w:t>
       </w:r>
-      <w:bookmarkEnd w:id="91"/>
+      <w:bookmarkEnd w:id="92"/>
     </w:p>
     <w:p>
       <w:pPr>
@@ -27873,7 +28882,7 @@
           <w:szCs w:val="26"/>
         </w:rPr>
       </w:pPr>
-      <w:bookmarkStart w:id="92" w:name="_Toc236469874"/>
+      <w:bookmarkStart w:id="93" w:name="_Toc236469874"/>
       <w:r>
         <w:rPr>
           <w:rFonts w:ascii="Times New Roman" w:hAnsi="Times New Roman" w:cs="Times New Roman"/>
@@ -27931,7 +28940,7 @@
         </w:rPr>
         <w:t>: Sequence Diagram mô tả quy trình thay đổi trạng thái trang Pipeline</w:t>
       </w:r>
-      <w:bookmarkEnd w:id="92"/>
+      <w:bookmarkEnd w:id="93"/>
     </w:p>
     <w:p>
       <w:pPr>
@@ -27957,8 +28966,8 @@
           <w:rFonts w:ascii="Times New Roman" w:hAnsi="Times New Roman" w:cs="Times New Roman"/>
         </w:rPr>
       </w:pPr>
-      <w:bookmarkStart w:id="93" w:name="_Toc235563724"/>
-      <w:bookmarkStart w:id="94" w:name="_Toc236288488"/>
+      <w:bookmarkStart w:id="94" w:name="_Toc235563724"/>
+      <w:bookmarkStart w:id="95" w:name="_Toc236288488"/>
       <w:r>
         <w:rPr>
           <w:rFonts w:ascii="Times New Roman" w:hAnsi="Times New Roman" w:cs="Times New Roman"/>
@@ -27966,8 +28975,8 @@
         <w:lastRenderedPageBreak/>
         <w:t>CLASS DIAGRAM</w:t>
       </w:r>
-      <w:bookmarkEnd w:id="93"/>
       <w:bookmarkEnd w:id="94"/>
+      <w:bookmarkEnd w:id="95"/>
     </w:p>
     <w:p>
       <w:pPr>
@@ -28032,7 +29041,7 @@
           <w:szCs w:val="26"/>
         </w:rPr>
       </w:pPr>
-      <w:bookmarkStart w:id="95" w:name="_Toc236469875"/>
+      <w:bookmarkStart w:id="96" w:name="_Toc236469875"/>
       <w:r>
         <w:rPr>
           <w:rFonts w:ascii="Times New Roman" w:hAnsi="Times New Roman" w:cs="Times New Roman"/>
@@ -28090,7 +29099,7 @@
         </w:rPr>
         <w:t>: Class Diagram</w:t>
       </w:r>
-      <w:bookmarkEnd w:id="95"/>
+      <w:bookmarkEnd w:id="96"/>
     </w:p>
     <w:p>
       <w:pPr>
@@ -28359,14 +29368,14 @@
           <w:rFonts w:ascii="Times New Roman" w:hAnsi="Times New Roman" w:cs="Times New Roman"/>
         </w:rPr>
       </w:pPr>
-      <w:bookmarkStart w:id="96" w:name="_Toc236288489"/>
+      <w:bookmarkStart w:id="97" w:name="_Toc236288489"/>
       <w:r>
         <w:rPr>
           <w:rFonts w:ascii="Times New Roman" w:hAnsi="Times New Roman" w:cs="Times New Roman"/>
         </w:rPr>
         <w:t>ENTITY RELATIONSHIP DIAGRAM</w:t>
       </w:r>
-      <w:bookmarkEnd w:id="96"/>
+      <w:bookmarkEnd w:id="97"/>
     </w:p>
     <w:p>
       <w:pPr>
@@ -28431,7 +29440,7 @@
           <w:szCs w:val="26"/>
         </w:rPr>
       </w:pPr>
-      <w:bookmarkStart w:id="97" w:name="_Toc236469876"/>
+      <w:bookmarkStart w:id="98" w:name="_Toc236469876"/>
       <w:r>
         <w:rPr>
           <w:rFonts w:ascii="Times New Roman" w:hAnsi="Times New Roman" w:cs="Times New Roman"/>
@@ -28489,7 +29498,7 @@
         </w:rPr>
         <w:t>: Entity Relationshop Diagram</w:t>
       </w:r>
-      <w:bookmarkEnd w:id="97"/>
+      <w:bookmarkEnd w:id="98"/>
     </w:p>
     <w:p>
       <w:pPr>
@@ -28541,14 +29550,14 @@
           <w:rFonts w:ascii="Times New Roman" w:hAnsi="Times New Roman" w:cs="Times New Roman"/>
         </w:rPr>
       </w:pPr>
-      <w:bookmarkStart w:id="98" w:name="_Toc236288490"/>
+      <w:bookmarkStart w:id="99" w:name="_Toc236288490"/>
       <w:r>
         <w:rPr>
           <w:rFonts w:ascii="Times New Roman" w:hAnsi="Times New Roman" w:cs="Times New Roman"/>
         </w:rPr>
         <w:t>MA TRẬN TRUY VẾT</w:t>
       </w:r>
-      <w:bookmarkEnd w:id="98"/>
+      <w:bookmarkEnd w:id="99"/>
     </w:p>
     <w:tbl>
       <w:tblPr>
@@ -29085,6 +30094,23 @@
               <w:t>UC13: Quản lý Customer</w:t>
             </w:r>
           </w:p>
+          <w:p>
+            <w:pPr>
+              <w:rPr>
+                <w:rFonts w:ascii="Times New Roman" w:hAnsi="Times New Roman" w:cs="Times New Roman"/>
+                <w:sz w:val="26"/>
+                <w:szCs w:val="26"/>
+              </w:rPr>
+            </w:pPr>
+            <w:r>
+              <w:rPr>
+                <w:rFonts w:ascii="Times New Roman" w:hAnsi="Times New Roman" w:cs="Times New Roman"/>
+                <w:sz w:val="26"/>
+                <w:szCs w:val="26"/>
+              </w:rPr>
+              <w:t>UC15: Phân công Lead</w:t>
+            </w:r>
+          </w:p>
         </w:tc>
         <w:tc>
           <w:tcPr>
@@ -29105,6 +30131,31 @@
                 <w:szCs w:val="26"/>
               </w:rPr>
               <w:t>LeadSources, Leads, Customers, Users, ActivityLogs</w:t>
+            </w:r>
+            <w:r>
+              <w:rPr>
+                <w:rFonts w:ascii="Times New Roman" w:hAnsi="Times New Roman" w:cs="Times New Roman"/>
+                <w:sz w:val="26"/>
+                <w:szCs w:val="26"/>
+              </w:rPr>
+              <w:t>,</w:t>
+            </w:r>
+          </w:p>
+          <w:p>
+            <w:pPr>
+              <w:rPr>
+                <w:rFonts w:ascii="Times New Roman" w:hAnsi="Times New Roman" w:cs="Times New Roman"/>
+                <w:sz w:val="26"/>
+                <w:szCs w:val="26"/>
+              </w:rPr>
+            </w:pPr>
+            <w:r>
+              <w:rPr>
+                <w:rFonts w:ascii="Times New Roman" w:hAnsi="Times New Roman" w:cs="Times New Roman"/>
+                <w:sz w:val="26"/>
+                <w:szCs w:val="26"/>
+              </w:rPr>
+              <w:t>Notifications</w:t>
             </w:r>
           </w:p>
         </w:tc>
@@ -29497,7 +30548,7 @@
           <w:szCs w:val="26"/>
         </w:rPr>
       </w:pPr>
-      <w:bookmarkStart w:id="99" w:name="_Toc236288515"/>
+      <w:bookmarkStart w:id="100" w:name="_Toc238208020"/>
       <w:r>
         <w:rPr>
           <w:rFonts w:ascii="Times New Roman" w:hAnsi="Times New Roman" w:cs="Times New Roman"/>
@@ -29537,7 +30588,7 @@
           <w:sz w:val="26"/>
           <w:szCs w:val="26"/>
         </w:rPr>
-        <w:t>17</w:t>
+        <w:t>18</w:t>
       </w:r>
       <w:r>
         <w:rPr>
@@ -29555,7 +30606,7 @@
         </w:rPr>
         <w:t>: Ma trận truy vết</w:t>
       </w:r>
-      <w:bookmarkEnd w:id="99"/>
+      <w:bookmarkEnd w:id="100"/>
     </w:p>
     <w:p>
       <w:pPr>
@@ -29564,7 +30615,7 @@
           <w:rFonts w:ascii="Times New Roman" w:hAnsi="Times New Roman" w:cs="Times New Roman"/>
         </w:rPr>
       </w:pPr>
-      <w:bookmarkStart w:id="100" w:name="_Toc236288491"/>
+      <w:bookmarkStart w:id="101" w:name="_Toc236288491"/>
       <w:r>
         <w:rPr>
           <w:rFonts w:ascii="Times New Roman" w:hAnsi="Times New Roman" w:cs="Times New Roman"/>
@@ -29577,7 +30628,7 @@
         </w:rPr>
         <w:t>TRÚC HỆ THỐNG</w:t>
       </w:r>
-      <w:bookmarkEnd w:id="100"/>
+      <w:bookmarkEnd w:id="101"/>
     </w:p>
     <w:p>
       <w:pPr>
@@ -29586,14 +30637,14 @@
           <w:rFonts w:ascii="Times New Roman" w:hAnsi="Times New Roman" w:cs="Times New Roman"/>
         </w:rPr>
       </w:pPr>
-      <w:bookmarkStart w:id="101" w:name="_Toc236288492"/>
+      <w:bookmarkStart w:id="102" w:name="_Toc236288492"/>
       <w:r>
         <w:rPr>
           <w:rFonts w:ascii="Times New Roman" w:hAnsi="Times New Roman" w:cs="Times New Roman"/>
         </w:rPr>
         <w:t>Kiến trúc tổng thể</w:t>
       </w:r>
-      <w:bookmarkEnd w:id="101"/>
+      <w:bookmarkEnd w:id="102"/>
     </w:p>
     <w:p>
       <w:pPr>
@@ -29684,7 +30735,7 @@
           <w:szCs w:val="26"/>
         </w:rPr>
       </w:pPr>
-      <w:bookmarkStart w:id="102" w:name="_Toc236469877"/>
+      <w:bookmarkStart w:id="103" w:name="_Toc236469877"/>
       <w:r>
         <w:rPr>
           <w:rFonts w:ascii="Times New Roman" w:hAnsi="Times New Roman" w:cs="Times New Roman"/>
@@ -29742,7 +30793,7 @@
         </w:rPr>
         <w:t>: Kiến trúc tổng thể</w:t>
       </w:r>
-      <w:bookmarkEnd w:id="102"/>
+      <w:bookmarkEnd w:id="103"/>
     </w:p>
     <w:p>
       <w:pPr>
@@ -29751,14 +30802,14 @@
           <w:rFonts w:ascii="Times New Roman" w:hAnsi="Times New Roman" w:cs="Times New Roman"/>
         </w:rPr>
       </w:pPr>
-      <w:bookmarkStart w:id="103" w:name="_Toc236288493"/>
+      <w:bookmarkStart w:id="104" w:name="_Toc236288493"/>
       <w:r>
         <w:rPr>
           <w:rFonts w:ascii="Times New Roman" w:hAnsi="Times New Roman" w:cs="Times New Roman"/>
         </w:rPr>
         <w:t>Kiến trúc Modular</w:t>
       </w:r>
-      <w:bookmarkEnd w:id="103"/>
+      <w:bookmarkEnd w:id="104"/>
     </w:p>
     <w:p>
       <w:pPr>
@@ -29823,7 +30874,7 @@
           <w:szCs w:val="26"/>
         </w:rPr>
       </w:pPr>
-      <w:bookmarkStart w:id="104" w:name="_Toc236469878"/>
+      <w:bookmarkStart w:id="105" w:name="_Toc236469878"/>
       <w:r>
         <w:rPr>
           <w:rFonts w:ascii="Times New Roman" w:hAnsi="Times New Roman" w:cs="Times New Roman"/>
@@ -29881,7 +30932,7 @@
         </w:rPr>
         <w:t>: Kiến trúc Modular</w:t>
       </w:r>
-      <w:bookmarkEnd w:id="104"/>
+      <w:bookmarkEnd w:id="105"/>
     </w:p>
     <w:p>
       <w:pPr>
@@ -29956,7 +31007,7 @@
           <w:szCs w:val="26"/>
         </w:rPr>
       </w:pPr>
-      <w:bookmarkStart w:id="105" w:name="_Toc236469879"/>
+      <w:bookmarkStart w:id="106" w:name="_Toc236469879"/>
       <w:r>
         <w:rPr>
           <w:rFonts w:ascii="Times New Roman" w:hAnsi="Times New Roman" w:cs="Times New Roman"/>
@@ -30014,7 +31065,7 @@
         </w:rPr>
         <w:t>: Kiến trúc của một Module</w:t>
       </w:r>
-      <w:bookmarkEnd w:id="105"/>
+      <w:bookmarkEnd w:id="106"/>
     </w:p>
     <w:p>
       <w:pPr>
@@ -30616,7 +31667,7 @@
           <w:szCs w:val="26"/>
         </w:rPr>
       </w:pPr>
-      <w:bookmarkStart w:id="106" w:name="_Toc236288516"/>
+      <w:bookmarkStart w:id="107" w:name="_Toc238208021"/>
       <w:r>
         <w:rPr>
           <w:rFonts w:ascii="Times New Roman" w:hAnsi="Times New Roman" w:cs="Times New Roman"/>
@@ -30656,7 +31707,7 @@
           <w:sz w:val="26"/>
           <w:szCs w:val="26"/>
         </w:rPr>
-        <w:t>18</w:t>
+        <w:t>19</w:t>
       </w:r>
       <w:r>
         <w:rPr>
@@ -30674,7 +31725,7 @@
         </w:rPr>
         <w:t>: Chức năng của từng Module</w:t>
       </w:r>
-      <w:bookmarkEnd w:id="106"/>
+      <w:bookmarkEnd w:id="107"/>
     </w:p>
     <w:p>
       <w:pPr>
@@ -30683,7 +31734,7 @@
           <w:rFonts w:ascii="Times New Roman" w:hAnsi="Times New Roman" w:cs="Times New Roman"/>
         </w:rPr>
       </w:pPr>
-      <w:bookmarkStart w:id="107" w:name="_Toc236288494"/>
+      <w:bookmarkStart w:id="108" w:name="_Toc236288494"/>
       <w:r>
         <w:rPr>
           <w:rFonts w:ascii="Times New Roman" w:hAnsi="Times New Roman" w:cs="Times New Roman"/>
@@ -30691,7 +31742,7 @@
         <w:lastRenderedPageBreak/>
         <w:t>RESTful API</w:t>
       </w:r>
-      <w:bookmarkEnd w:id="107"/>
+      <w:bookmarkEnd w:id="108"/>
     </w:p>
     <w:p>
       <w:pPr>
@@ -30756,7 +31807,7 @@
           <w:szCs w:val="26"/>
         </w:rPr>
       </w:pPr>
-      <w:bookmarkStart w:id="108" w:name="_Toc236469880"/>
+      <w:bookmarkStart w:id="109" w:name="_Toc236469880"/>
       <w:r>
         <w:rPr>
           <w:rFonts w:ascii="Times New Roman" w:hAnsi="Times New Roman" w:cs="Times New Roman"/>
@@ -30814,7 +31865,7 @@
         </w:rPr>
         <w:t>: Luồng xử lý yêu cầu đăng nhập thông qua RESTful API</w:t>
       </w:r>
-      <w:bookmarkEnd w:id="108"/>
+      <w:bookmarkEnd w:id="109"/>
     </w:p>
     <w:p>
       <w:pPr>
@@ -30840,14 +31891,14 @@
           <w:rFonts w:ascii="Times New Roman" w:hAnsi="Times New Roman" w:cs="Times New Roman"/>
         </w:rPr>
       </w:pPr>
-      <w:bookmarkStart w:id="109" w:name="_Toc236288495"/>
+      <w:bookmarkStart w:id="110" w:name="_Toc236288495"/>
       <w:r>
         <w:rPr>
           <w:rFonts w:ascii="Times New Roman" w:hAnsi="Times New Roman" w:cs="Times New Roman"/>
         </w:rPr>
         <w:t>Luồng xử lý dữ liệu</w:t>
       </w:r>
-      <w:bookmarkEnd w:id="109"/>
+      <w:bookmarkEnd w:id="110"/>
     </w:p>
     <w:p>
       <w:pPr>
@@ -30912,7 +31963,7 @@
           <w:szCs w:val="26"/>
         </w:rPr>
       </w:pPr>
-      <w:bookmarkStart w:id="110" w:name="_Toc236469881"/>
+      <w:bookmarkStart w:id="111" w:name="_Toc236469881"/>
       <w:r>
         <w:rPr>
           <w:rFonts w:ascii="Times New Roman" w:hAnsi="Times New Roman" w:cs="Times New Roman"/>
@@ -30970,7 +32021,7 @@
         </w:rPr>
         <w:t>: Luồng xử lý dữ liệu</w:t>
       </w:r>
-      <w:bookmarkEnd w:id="110"/>
+      <w:bookmarkEnd w:id="111"/>
     </w:p>
     <w:p>
       <w:pPr>
@@ -30979,8 +32030,8 @@
           <w:rFonts w:ascii="Times New Roman" w:hAnsi="Times New Roman" w:cs="Times New Roman"/>
         </w:rPr>
       </w:pPr>
-      <w:bookmarkStart w:id="111" w:name="_Toc235563727"/>
-      <w:bookmarkStart w:id="112" w:name="_Toc236288496"/>
+      <w:bookmarkStart w:id="112" w:name="_Toc235563727"/>
+      <w:bookmarkStart w:id="113" w:name="_Toc236288496"/>
       <w:r>
         <w:rPr>
           <w:rFonts w:ascii="Times New Roman" w:hAnsi="Times New Roman" w:cs="Times New Roman"/>
@@ -30988,8 +32039,8 @@
         <w:lastRenderedPageBreak/>
         <w:t>WIREFRAME</w:t>
       </w:r>
-      <w:bookmarkEnd w:id="111"/>
       <w:bookmarkEnd w:id="112"/>
+      <w:bookmarkEnd w:id="113"/>
     </w:p>
     <w:p>
       <w:pPr>
@@ -31054,7 +32105,7 @@
           <w:szCs w:val="26"/>
         </w:rPr>
       </w:pPr>
-      <w:bookmarkStart w:id="113" w:name="_Toc236469882"/>
+      <w:bookmarkStart w:id="114" w:name="_Toc236469882"/>
       <w:r>
         <w:rPr>
           <w:rFonts w:ascii="Times New Roman" w:hAnsi="Times New Roman" w:cs="Times New Roman"/>
@@ -31112,7 +32163,7 @@
         </w:rPr>
         <w:t>: Wireframe đăng nhập hệ thống</w:t>
       </w:r>
-      <w:bookmarkEnd w:id="113"/>
+      <w:bookmarkEnd w:id="114"/>
     </w:p>
     <w:p>
       <w:pPr>
@@ -31202,7 +32253,7 @@
           <w:szCs w:val="26"/>
         </w:rPr>
       </w:pPr>
-      <w:bookmarkStart w:id="114" w:name="_Toc236469883"/>
+      <w:bookmarkStart w:id="115" w:name="_Toc236469883"/>
       <w:r>
         <w:rPr>
           <w:rFonts w:ascii="Times New Roman" w:hAnsi="Times New Roman" w:cs="Times New Roman"/>
@@ -31260,7 +32311,7 @@
         </w:rPr>
         <w:t>: Giao diện Dashboard tổng quan</w:t>
       </w:r>
-      <w:bookmarkEnd w:id="114"/>
+      <w:bookmarkEnd w:id="115"/>
     </w:p>
     <w:p>
       <w:pPr>
@@ -31326,7 +32377,7 @@
           <w:szCs w:val="26"/>
         </w:rPr>
       </w:pPr>
-      <w:bookmarkStart w:id="115" w:name="_Toc236469884"/>
+      <w:bookmarkStart w:id="116" w:name="_Toc236469884"/>
       <w:r>
         <w:rPr>
           <w:rFonts w:ascii="Times New Roman" w:hAnsi="Times New Roman" w:cs="Times New Roman"/>
@@ -31384,7 +32435,7 @@
         </w:rPr>
         <w:t>: Dashboard doanh thu bán hàng theo từng năm</w:t>
       </w:r>
-      <w:bookmarkEnd w:id="115"/>
+      <w:bookmarkEnd w:id="116"/>
     </w:p>
     <w:p>
       <w:pPr>
@@ -31449,7 +32500,7 @@
           <w:szCs w:val="26"/>
         </w:rPr>
       </w:pPr>
-      <w:bookmarkStart w:id="116" w:name="_Toc236469885"/>
+      <w:bookmarkStart w:id="117" w:name="_Toc236469885"/>
       <w:r>
         <w:rPr>
           <w:rFonts w:ascii="Times New Roman" w:hAnsi="Times New Roman" w:cs="Times New Roman"/>
@@ -31507,7 +32558,7 @@
         </w:rPr>
         <w:t>: Dashboard tổng quan các Deal theo giai đoạn và tổng giá trị của Pipeline</w:t>
       </w:r>
-      <w:bookmarkEnd w:id="116"/>
+      <w:bookmarkEnd w:id="117"/>
     </w:p>
     <w:p>
       <w:pPr>
@@ -31590,7 +32641,7 @@
           <w:szCs w:val="26"/>
         </w:rPr>
       </w:pPr>
-      <w:bookmarkStart w:id="117" w:name="_Toc236469886"/>
+      <w:bookmarkStart w:id="118" w:name="_Toc236469886"/>
       <w:r>
         <w:rPr>
           <w:rFonts w:ascii="Times New Roman" w:hAnsi="Times New Roman" w:cs="Times New Roman"/>
@@ -31648,7 +32699,7 @@
         </w:rPr>
         <w:t>: Các chỉ số thống kê Lead</w:t>
       </w:r>
-      <w:bookmarkEnd w:id="117"/>
+      <w:bookmarkEnd w:id="118"/>
     </w:p>
     <w:p>
       <w:pPr>
@@ -31713,7 +32764,7 @@
           <w:szCs w:val="26"/>
         </w:rPr>
       </w:pPr>
-      <w:bookmarkStart w:id="118" w:name="_Toc236469887"/>
+      <w:bookmarkStart w:id="119" w:name="_Toc236469887"/>
       <w:r>
         <w:rPr>
           <w:rFonts w:ascii="Times New Roman" w:hAnsi="Times New Roman" w:cs="Times New Roman"/>
@@ -31771,7 +32822,7 @@
         </w:rPr>
         <w:t>: Danh sách Lead</w:t>
       </w:r>
-      <w:bookmarkEnd w:id="118"/>
+      <w:bookmarkEnd w:id="119"/>
     </w:p>
     <w:p>
       <w:pPr>
@@ -31878,7 +32929,7 @@
           <w:szCs w:val="26"/>
         </w:rPr>
       </w:pPr>
-      <w:bookmarkStart w:id="119" w:name="_Toc236469888"/>
+      <w:bookmarkStart w:id="120" w:name="_Toc236469888"/>
       <w:r>
         <w:rPr>
           <w:rFonts w:ascii="Times New Roman" w:hAnsi="Times New Roman" w:cs="Times New Roman"/>
@@ -31936,7 +32987,7 @@
         </w:rPr>
         <w:t>: Giao diện quản lý Deal</w:t>
       </w:r>
-      <w:bookmarkEnd w:id="119"/>
+      <w:bookmarkEnd w:id="120"/>
     </w:p>
     <w:p>
       <w:pPr>
@@ -32026,7 +33077,7 @@
           <w:szCs w:val="26"/>
         </w:rPr>
       </w:pPr>
-      <w:bookmarkStart w:id="120" w:name="_Toc236469889"/>
+      <w:bookmarkStart w:id="121" w:name="_Toc236469889"/>
       <w:r>
         <w:rPr>
           <w:rFonts w:ascii="Times New Roman" w:hAnsi="Times New Roman" w:cs="Times New Roman"/>
@@ -32084,7 +33135,7 @@
         </w:rPr>
         <w:t>: Tổng quan quan lý người dùng</w:t>
       </w:r>
-      <w:bookmarkEnd w:id="120"/>
+      <w:bookmarkEnd w:id="121"/>
     </w:p>
     <w:p>
       <w:pPr>
@@ -32150,7 +33201,7 @@
           <w:szCs w:val="26"/>
         </w:rPr>
       </w:pPr>
-      <w:bookmarkStart w:id="121" w:name="_Toc236469890"/>
+      <w:bookmarkStart w:id="122" w:name="_Toc236469890"/>
       <w:r>
         <w:rPr>
           <w:rFonts w:ascii="Times New Roman" w:hAnsi="Times New Roman" w:cs="Times New Roman"/>
@@ -32208,7 +33259,7 @@
         </w:rPr>
         <w:t>: Danh sách người dùng</w:t>
       </w:r>
-      <w:bookmarkEnd w:id="121"/>
+      <w:bookmarkEnd w:id="122"/>
     </w:p>
     <w:p>
       <w:pPr>
@@ -32251,8 +33302,8 @@
           <w:rFonts w:ascii="Times New Roman" w:hAnsi="Times New Roman" w:cs="Times New Roman"/>
         </w:rPr>
       </w:pPr>
-      <w:bookmarkStart w:id="122" w:name="_Toc235563729"/>
-      <w:bookmarkStart w:id="123" w:name="_Toc236288497"/>
+      <w:bookmarkStart w:id="123" w:name="_Toc235563729"/>
+      <w:bookmarkStart w:id="124" w:name="_Toc236288497"/>
       <w:r>
         <w:rPr>
           <w:rFonts w:ascii="Times New Roman" w:hAnsi="Times New Roman" w:cs="Times New Roman"/>
@@ -32260,10 +33311,10 @@
         <w:lastRenderedPageBreak/>
         <w:t>TÀI LIỆU THAM KHẢO</w:t>
       </w:r>
-      <w:bookmarkEnd w:id="122"/>
       <w:bookmarkEnd w:id="123"/>
-    </w:p>
-    <w:bookmarkStart w:id="124" w:name="_Toc236288498" w:displacedByCustomXml="next"/>
+      <w:bookmarkEnd w:id="124"/>
+    </w:p>
+    <w:bookmarkStart w:id="125" w:name="_Toc236288498" w:displacedByCustomXml="next"/>
     <w:sdt>
       <w:sdtPr>
         <w:rPr>
@@ -32297,7 +33348,7 @@
             </w:rPr>
             <w:t>References</w:t>
           </w:r>
-          <w:bookmarkEnd w:id="124"/>
+          <w:bookmarkEnd w:id="125"/>
         </w:p>
         <w:sdt>
           <w:sdtPr>
@@ -33170,6 +34221,184 @@
 <file path=word/numbering.xml><?xml version="1.0" encoding="utf-8"?>
 <w:numbering xmlns:wpc="http://schemas.microsoft.com/office/word/2010/wordprocessingCanvas" xmlns:cx="http://schemas.microsoft.com/office/drawing/2014/chartex" xmlns:cx1="http://schemas.microsoft.com/office/drawing/2015/9/8/chartex" xmlns:cx2="http://schemas.microsoft.com/office/drawing/2015/10/21/chartex" xmlns:cx3="http://schemas.microsoft.com/office/drawing/2016/5/9/chartex" xmlns:cx4="http://schemas.microsoft.com/office/drawing/2016/5/10/chartex" xmlns:cx5="http://schemas.microsoft.com/office/drawing/2016/5/11/chartex" xmlns:cx6="http://schemas.microsoft.com/office/drawing/2016/5/12/chartex" xmlns:cx7="http://schemas.microsoft.com/office/drawing/2016/5/13/chartex" xmlns:cx8="http://schemas.microsoft.com/office/drawing/2016/5/14/chartex" xmlns:mc="http://schemas.openxmlformats.org/markup-compatibility/2006" xmlns:aink="http://schemas.microsoft.com/office/drawing/2016/ink" xmlns:am3d="http://schemas.microsoft.com/office/drawing/2017/model3d" xmlns:o="urn:schemas-microsoft-com:office:office" xmlns:r="http://schemas.openxmlformats.org/officeDocument/2006/relationships" xmlns:m="http://schemas.openxmlformats.org/officeDocument/2006/math" xmlns:v="urn:schemas-microsoft-com:vml" xmlns:wp14="http://schemas.microsoft.com/office/word/2010/wordprocessingDrawing" xmlns:wp="http://schemas.openxmlformats.org/drawingml/2006/wordprocessingDrawing" xmlns:w10="urn:schemas-microsoft-com:office:word" xmlns:w="http://schemas.openxmlformats.org/wordprocessingml/2006/main" xmlns:w14="http://schemas.microsoft.com/office/word/2010/wordml" xmlns:w15="http://schemas.microsoft.com/office/word/2012/wordml" xmlns:w16cex="http://schemas.microsoft.com/office/word/2018/wordml/cex" xmlns:w16cid="http://schemas.microsoft.com/office/word/2016/wordml/cid" xmlns:w16="http://schemas.microsoft.com/office/word/2018/wordml" xmlns:w16sdtdh="http://schemas.microsoft.com/office/word/2020/wordml/sdtdatahash" xmlns:w16se="http://schemas.microsoft.com/office/word/2015/wordml/symex" xmlns:wpg="http://schemas.microsoft.com/office/word/2010/wordprocessingGroup" xmlns:wpi="http://schemas.microsoft.com/office/word/2010/wordprocessingInk" xmlns:wne="http://schemas.microsoft.com/office/word/2006/wordml" xmlns:wps="http://schemas.microsoft.com/office/word/2010/wordprocessingShape" mc:Ignorable="w14 w15 w16se w16cid w16 w16cex w16sdtdh wp14">
   <w:abstractNum w:abstractNumId="0" w15:restartNumberingAfterBreak="0">
+    <w:nsid w:val="04461481"/>
+    <w:multiLevelType w:val="hybridMultilevel"/>
+    <w:tmpl w:val="E9506A52"/>
+    <w:lvl w:ilvl="0" w:tplc="0409000F">
+      <w:start w:val="1"/>
+      <w:numFmt w:val="decimal"/>
+      <w:lvlText w:val="%1."/>
+      <w:lvlJc w:val="left"/>
+      <w:pPr>
+        <w:ind w:left="720" w:hanging="360"/>
+      </w:pPr>
+      <w:rPr>
+        <w:rFonts w:hint="default"/>
+      </w:rPr>
+    </w:lvl>
+    <w:lvl w:ilvl="1" w:tplc="04090019" w:tentative="1">
+      <w:start w:val="1"/>
+      <w:numFmt w:val="lowerLetter"/>
+      <w:lvlText w:val="%2."/>
+      <w:lvlJc w:val="left"/>
+      <w:pPr>
+        <w:ind w:left="1440" w:hanging="360"/>
+      </w:pPr>
+    </w:lvl>
+    <w:lvl w:ilvl="2" w:tplc="0409001B" w:tentative="1">
+      <w:start w:val="1"/>
+      <w:numFmt w:val="lowerRoman"/>
+      <w:lvlText w:val="%3."/>
+      <w:lvlJc w:val="right"/>
+      <w:pPr>
+        <w:ind w:left="2160" w:hanging="180"/>
+      </w:pPr>
+    </w:lvl>
+    <w:lvl w:ilvl="3" w:tplc="0409000F" w:tentative="1">
+      <w:start w:val="1"/>
+      <w:numFmt w:val="decimal"/>
+      <w:lvlText w:val="%4."/>
+      <w:lvlJc w:val="left"/>
+      <w:pPr>
+        <w:ind w:left="2880" w:hanging="360"/>
+      </w:pPr>
+    </w:lvl>
+    <w:lvl w:ilvl="4" w:tplc="04090019" w:tentative="1">
+      <w:start w:val="1"/>
+      <w:numFmt w:val="lowerLetter"/>
+      <w:lvlText w:val="%5."/>
+      <w:lvlJc w:val="left"/>
+      <w:pPr>
+        <w:ind w:left="3600" w:hanging="360"/>
+      </w:pPr>
+    </w:lvl>
+    <w:lvl w:ilvl="5" w:tplc="0409001B" w:tentative="1">
+      <w:start w:val="1"/>
+      <w:numFmt w:val="lowerRoman"/>
+      <w:lvlText w:val="%6."/>
+      <w:lvlJc w:val="right"/>
+      <w:pPr>
+        <w:ind w:left="4320" w:hanging="180"/>
+      </w:pPr>
+    </w:lvl>
+    <w:lvl w:ilvl="6" w:tplc="0409000F" w:tentative="1">
+      <w:start w:val="1"/>
+      <w:numFmt w:val="decimal"/>
+      <w:lvlText w:val="%7."/>
+      <w:lvlJc w:val="left"/>
+      <w:pPr>
+        <w:ind w:left="5040" w:hanging="360"/>
+      </w:pPr>
+    </w:lvl>
+    <w:lvl w:ilvl="7" w:tplc="04090019" w:tentative="1">
+      <w:start w:val="1"/>
+      <w:numFmt w:val="lowerLetter"/>
+      <w:lvlText w:val="%8."/>
+      <w:lvlJc w:val="left"/>
+      <w:pPr>
+        <w:ind w:left="5760" w:hanging="360"/>
+      </w:pPr>
+    </w:lvl>
+    <w:lvl w:ilvl="8" w:tplc="0409001B" w:tentative="1">
+      <w:start w:val="1"/>
+      <w:numFmt w:val="lowerRoman"/>
+      <w:lvlText w:val="%9."/>
+      <w:lvlJc w:val="right"/>
+      <w:pPr>
+        <w:ind w:left="6480" w:hanging="180"/>
+      </w:pPr>
+    </w:lvl>
+  </w:abstractNum>
+  <w:abstractNum w:abstractNumId="1" w15:restartNumberingAfterBreak="0">
+    <w:nsid w:val="086B2427"/>
+    <w:multiLevelType w:val="hybridMultilevel"/>
+    <w:tmpl w:val="5B9011C6"/>
+    <w:lvl w:ilvl="0" w:tplc="0409000F">
+      <w:start w:val="1"/>
+      <w:numFmt w:val="decimal"/>
+      <w:lvlText w:val="%1."/>
+      <w:lvlJc w:val="left"/>
+      <w:pPr>
+        <w:ind w:left="720" w:hanging="360"/>
+      </w:pPr>
+      <w:rPr>
+        <w:rFonts w:hint="default"/>
+      </w:rPr>
+    </w:lvl>
+    <w:lvl w:ilvl="1" w:tplc="04090019" w:tentative="1">
+      <w:start w:val="1"/>
+      <w:numFmt w:val="lowerLetter"/>
+      <w:lvlText w:val="%2."/>
+      <w:lvlJc w:val="left"/>
+      <w:pPr>
+        <w:ind w:left="1440" w:hanging="360"/>
+      </w:pPr>
+    </w:lvl>
+    <w:lvl w:ilvl="2" w:tplc="0409001B" w:tentative="1">
+      <w:start w:val="1"/>
+      <w:numFmt w:val="lowerRoman"/>
+      <w:lvlText w:val="%3."/>
+      <w:lvlJc w:val="right"/>
+      <w:pPr>
+        <w:ind w:left="2160" w:hanging="180"/>
+      </w:pPr>
+    </w:lvl>
+    <w:lvl w:ilvl="3" w:tplc="0409000F" w:tentative="1">
+      <w:start w:val="1"/>
+      <w:numFmt w:val="decimal"/>
+      <w:lvlText w:val="%4."/>
+      <w:lvlJc w:val="left"/>
+      <w:pPr>
+        <w:ind w:left="2880" w:hanging="360"/>
+      </w:pPr>
+    </w:lvl>
+    <w:lvl w:ilvl="4" w:tplc="04090019" w:tentative="1">
+      <w:start w:val="1"/>
+      <w:numFmt w:val="lowerLetter"/>
+      <w:lvlText w:val="%5."/>
+      <w:lvlJc w:val="left"/>
+      <w:pPr>
+        <w:ind w:left="3600" w:hanging="360"/>
+      </w:pPr>
+    </w:lvl>
+    <w:lvl w:ilvl="5" w:tplc="0409001B" w:tentative="1">
+      <w:start w:val="1"/>
+      <w:numFmt w:val="lowerRoman"/>
+      <w:lvlText w:val="%6."/>
+      <w:lvlJc w:val="right"/>
+      <w:pPr>
+        <w:ind w:left="4320" w:hanging="180"/>
+      </w:pPr>
+    </w:lvl>
+    <w:lvl w:ilvl="6" w:tplc="0409000F" w:tentative="1">
+      <w:start w:val="1"/>
+      <w:numFmt w:val="decimal"/>
+      <w:lvlText w:val="%7."/>
+      <w:lvlJc w:val="left"/>
+      <w:pPr>
+        <w:ind w:left="5040" w:hanging="360"/>
+      </w:pPr>
+    </w:lvl>
+    <w:lvl w:ilvl="7" w:tplc="04090019" w:tentative="1">
+      <w:start w:val="1"/>
+      <w:numFmt w:val="lowerLetter"/>
+      <w:lvlText w:val="%8."/>
+      <w:lvlJc w:val="left"/>
+      <w:pPr>
+        <w:ind w:left="5760" w:hanging="360"/>
+      </w:pPr>
+    </w:lvl>
+    <w:lvl w:ilvl="8" w:tplc="0409001B" w:tentative="1">
+      <w:start w:val="1"/>
+      <w:numFmt w:val="lowerRoman"/>
+      <w:lvlText w:val="%9."/>
+      <w:lvlJc w:val="right"/>
+      <w:pPr>
+        <w:ind w:left="6480" w:hanging="180"/>
+      </w:pPr>
+    </w:lvl>
+  </w:abstractNum>
+  <w:abstractNum w:abstractNumId="2" w15:restartNumberingAfterBreak="0">
     <w:nsid w:val="0D831EB0"/>
     <w:multiLevelType w:val="hybridMultilevel"/>
     <w:tmpl w:val="E6665C88"/>
@@ -33282,7 +34511,7 @@
       </w:rPr>
     </w:lvl>
   </w:abstractNum>
-  <w:abstractNum w:abstractNumId="1" w15:restartNumberingAfterBreak="0">
+  <w:abstractNum w:abstractNumId="3" w15:restartNumberingAfterBreak="0">
     <w:nsid w:val="0EA90C90"/>
     <w:multiLevelType w:val="hybridMultilevel"/>
     <w:tmpl w:val="4F4A5DBE"/>
@@ -33395,7 +34624,7 @@
       </w:rPr>
     </w:lvl>
   </w:abstractNum>
-  <w:abstractNum w:abstractNumId="2" w15:restartNumberingAfterBreak="0">
+  <w:abstractNum w:abstractNumId="4" w15:restartNumberingAfterBreak="0">
     <w:nsid w:val="0EBE492C"/>
     <w:multiLevelType w:val="hybridMultilevel"/>
     <w:tmpl w:val="E6E8F99E"/>
@@ -33484,7 +34713,7 @@
       </w:pPr>
     </w:lvl>
   </w:abstractNum>
-  <w:abstractNum w:abstractNumId="3" w15:restartNumberingAfterBreak="0">
+  <w:abstractNum w:abstractNumId="5" w15:restartNumberingAfterBreak="0">
     <w:nsid w:val="125B4F15"/>
     <w:multiLevelType w:val="hybridMultilevel"/>
     <w:tmpl w:val="71543E8A"/>
@@ -33573,7 +34802,7 @@
       </w:pPr>
     </w:lvl>
   </w:abstractNum>
-  <w:abstractNum w:abstractNumId="4" w15:restartNumberingAfterBreak="0">
+  <w:abstractNum w:abstractNumId="6" w15:restartNumberingAfterBreak="0">
     <w:nsid w:val="13E61E91"/>
     <w:multiLevelType w:val="hybridMultilevel"/>
     <w:tmpl w:val="A2DC4C94"/>
@@ -33686,7 +34915,7 @@
       </w:rPr>
     </w:lvl>
   </w:abstractNum>
-  <w:abstractNum w:abstractNumId="5" w15:restartNumberingAfterBreak="0">
+  <w:abstractNum w:abstractNumId="7" w15:restartNumberingAfterBreak="0">
     <w:nsid w:val="175C5B0D"/>
     <w:multiLevelType w:val="hybridMultilevel"/>
     <w:tmpl w:val="816219B6"/>
@@ -33775,7 +35004,7 @@
       </w:pPr>
     </w:lvl>
   </w:abstractNum>
-  <w:abstractNum w:abstractNumId="6" w15:restartNumberingAfterBreak="0">
+  <w:abstractNum w:abstractNumId="8" w15:restartNumberingAfterBreak="0">
     <w:nsid w:val="1AFE2D77"/>
     <w:multiLevelType w:val="hybridMultilevel"/>
     <w:tmpl w:val="0D6A1AEC"/>
@@ -33864,7 +35093,7 @@
       </w:pPr>
     </w:lvl>
   </w:abstractNum>
-  <w:abstractNum w:abstractNumId="7" w15:restartNumberingAfterBreak="0">
+  <w:abstractNum w:abstractNumId="9" w15:restartNumberingAfterBreak="0">
     <w:nsid w:val="1B0D6835"/>
     <w:multiLevelType w:val="hybridMultilevel"/>
     <w:tmpl w:val="1766E44C"/>
@@ -33977,7 +35206,7 @@
       </w:rPr>
     </w:lvl>
   </w:abstractNum>
-  <w:abstractNum w:abstractNumId="8" w15:restartNumberingAfterBreak="0">
+  <w:abstractNum w:abstractNumId="10" w15:restartNumberingAfterBreak="0">
     <w:nsid w:val="1F0F412D"/>
     <w:multiLevelType w:val="hybridMultilevel"/>
     <w:tmpl w:val="2C0C22AA"/>
@@ -34066,7 +35295,7 @@
       </w:pPr>
     </w:lvl>
   </w:abstractNum>
-  <w:abstractNum w:abstractNumId="9" w15:restartNumberingAfterBreak="0">
+  <w:abstractNum w:abstractNumId="11" w15:restartNumberingAfterBreak="0">
     <w:nsid w:val="235529F1"/>
     <w:multiLevelType w:val="hybridMultilevel"/>
     <w:tmpl w:val="234A2202"/>
@@ -34155,7 +35384,7 @@
       </w:pPr>
     </w:lvl>
   </w:abstractNum>
-  <w:abstractNum w:abstractNumId="10" w15:restartNumberingAfterBreak="0">
+  <w:abstractNum w:abstractNumId="12" w15:restartNumberingAfterBreak="0">
     <w:nsid w:val="24A8041E"/>
     <w:multiLevelType w:val="hybridMultilevel"/>
     <w:tmpl w:val="F27868B8"/>
@@ -34244,7 +35473,7 @@
       </w:pPr>
     </w:lvl>
   </w:abstractNum>
-  <w:abstractNum w:abstractNumId="11" w15:restartNumberingAfterBreak="0">
+  <w:abstractNum w:abstractNumId="13" w15:restartNumberingAfterBreak="0">
     <w:nsid w:val="254166A3"/>
     <w:multiLevelType w:val="hybridMultilevel"/>
     <w:tmpl w:val="96BE7B16"/>
@@ -34357,7 +35586,7 @@
       </w:rPr>
     </w:lvl>
   </w:abstractNum>
-  <w:abstractNum w:abstractNumId="12" w15:restartNumberingAfterBreak="0">
+  <w:abstractNum w:abstractNumId="14" w15:restartNumberingAfterBreak="0">
     <w:nsid w:val="269262C4"/>
     <w:multiLevelType w:val="hybridMultilevel"/>
     <w:tmpl w:val="374232AE"/>
@@ -34469,7 +35698,7 @@
       </w:rPr>
     </w:lvl>
   </w:abstractNum>
-  <w:abstractNum w:abstractNumId="13" w15:restartNumberingAfterBreak="0">
+  <w:abstractNum w:abstractNumId="15" w15:restartNumberingAfterBreak="0">
     <w:nsid w:val="27384C94"/>
     <w:multiLevelType w:val="hybridMultilevel"/>
     <w:tmpl w:val="19D69EA4"/>
@@ -34558,7 +35787,7 @@
       </w:pPr>
     </w:lvl>
   </w:abstractNum>
-  <w:abstractNum w:abstractNumId="14" w15:restartNumberingAfterBreak="0">
+  <w:abstractNum w:abstractNumId="16" w15:restartNumberingAfterBreak="0">
     <w:nsid w:val="2A4A0E14"/>
     <w:multiLevelType w:val="hybridMultilevel"/>
     <w:tmpl w:val="8788FAD0"/>
@@ -34671,7 +35900,7 @@
       </w:rPr>
     </w:lvl>
   </w:abstractNum>
-  <w:abstractNum w:abstractNumId="15" w15:restartNumberingAfterBreak="0">
+  <w:abstractNum w:abstractNumId="17" w15:restartNumberingAfterBreak="0">
     <w:nsid w:val="2C8A5437"/>
     <w:multiLevelType w:val="hybridMultilevel"/>
     <w:tmpl w:val="5F2CA66C"/>
@@ -34760,7 +35989,7 @@
       </w:pPr>
     </w:lvl>
   </w:abstractNum>
-  <w:abstractNum w:abstractNumId="16" w15:restartNumberingAfterBreak="0">
+  <w:abstractNum w:abstractNumId="18" w15:restartNumberingAfterBreak="0">
     <w:nsid w:val="2D8C22DF"/>
     <w:multiLevelType w:val="hybridMultilevel"/>
     <w:tmpl w:val="FD00B4F0"/>
@@ -34849,7 +36078,7 @@
       </w:pPr>
     </w:lvl>
   </w:abstractNum>
-  <w:abstractNum w:abstractNumId="17" w15:restartNumberingAfterBreak="0">
+  <w:abstractNum w:abstractNumId="19" w15:restartNumberingAfterBreak="0">
     <w:nsid w:val="2F352F1E"/>
     <w:multiLevelType w:val="hybridMultilevel"/>
     <w:tmpl w:val="96B666D4"/>
@@ -34962,7 +36191,7 @@
       </w:rPr>
     </w:lvl>
   </w:abstractNum>
-  <w:abstractNum w:abstractNumId="18" w15:restartNumberingAfterBreak="0">
+  <w:abstractNum w:abstractNumId="20" w15:restartNumberingAfterBreak="0">
     <w:nsid w:val="37CA7FC7"/>
     <w:multiLevelType w:val="hybridMultilevel"/>
     <w:tmpl w:val="6E7E6A18"/>
@@ -35075,7 +36304,7 @@
       </w:rPr>
     </w:lvl>
   </w:abstractNum>
-  <w:abstractNum w:abstractNumId="19" w15:restartNumberingAfterBreak="0">
+  <w:abstractNum w:abstractNumId="21" w15:restartNumberingAfterBreak="0">
     <w:nsid w:val="384B62F5"/>
     <w:multiLevelType w:val="hybridMultilevel"/>
     <w:tmpl w:val="0FE401CE"/>
@@ -35164,7 +36393,7 @@
       </w:pPr>
     </w:lvl>
   </w:abstractNum>
-  <w:abstractNum w:abstractNumId="20" w15:restartNumberingAfterBreak="0">
+  <w:abstractNum w:abstractNumId="22" w15:restartNumberingAfterBreak="0">
     <w:nsid w:val="3A7C639E"/>
     <w:multiLevelType w:val="hybridMultilevel"/>
     <w:tmpl w:val="CEEEFD42"/>
@@ -35277,7 +36506,7 @@
       </w:rPr>
     </w:lvl>
   </w:abstractNum>
-  <w:abstractNum w:abstractNumId="21" w15:restartNumberingAfterBreak="0">
+  <w:abstractNum w:abstractNumId="23" w15:restartNumberingAfterBreak="0">
     <w:nsid w:val="3BDB019E"/>
     <w:multiLevelType w:val="hybridMultilevel"/>
     <w:tmpl w:val="EA9C07B0"/>
@@ -35390,7 +36619,7 @@
       </w:rPr>
     </w:lvl>
   </w:abstractNum>
-  <w:abstractNum w:abstractNumId="22" w15:restartNumberingAfterBreak="0">
+  <w:abstractNum w:abstractNumId="24" w15:restartNumberingAfterBreak="0">
     <w:nsid w:val="414C4452"/>
     <w:multiLevelType w:val="hybridMultilevel"/>
     <w:tmpl w:val="475CE3AE"/>
@@ -35503,7 +36732,7 @@
       </w:rPr>
     </w:lvl>
   </w:abstractNum>
-  <w:abstractNum w:abstractNumId="23" w15:restartNumberingAfterBreak="0">
+  <w:abstractNum w:abstractNumId="25" w15:restartNumberingAfterBreak="0">
     <w:nsid w:val="4755410C"/>
     <w:multiLevelType w:val="hybridMultilevel"/>
     <w:tmpl w:val="C1C67CA8"/>
@@ -35615,7 +36844,7 @@
       </w:rPr>
     </w:lvl>
   </w:abstractNum>
-  <w:abstractNum w:abstractNumId="24" w15:restartNumberingAfterBreak="0">
+  <w:abstractNum w:abstractNumId="26" w15:restartNumberingAfterBreak="0">
     <w:nsid w:val="475E131C"/>
     <w:multiLevelType w:val="hybridMultilevel"/>
     <w:tmpl w:val="4AA870B8"/>
@@ -35704,7 +36933,7 @@
       </w:pPr>
     </w:lvl>
   </w:abstractNum>
-  <w:abstractNum w:abstractNumId="25" w15:restartNumberingAfterBreak="0">
+  <w:abstractNum w:abstractNumId="27" w15:restartNumberingAfterBreak="0">
     <w:nsid w:val="4A4D3EFA"/>
     <w:multiLevelType w:val="hybridMultilevel"/>
     <w:tmpl w:val="F768D43C"/>
@@ -35793,7 +37022,7 @@
       </w:pPr>
     </w:lvl>
   </w:abstractNum>
-  <w:abstractNum w:abstractNumId="26" w15:restartNumberingAfterBreak="0">
+  <w:abstractNum w:abstractNumId="28" w15:restartNumberingAfterBreak="0">
     <w:nsid w:val="4D962741"/>
     <w:multiLevelType w:val="hybridMultilevel"/>
     <w:tmpl w:val="9F1EC26C"/>
@@ -35882,7 +37111,7 @@
       </w:pPr>
     </w:lvl>
   </w:abstractNum>
-  <w:abstractNum w:abstractNumId="27" w15:restartNumberingAfterBreak="0">
+  <w:abstractNum w:abstractNumId="29" w15:restartNumberingAfterBreak="0">
     <w:nsid w:val="4DCC51D9"/>
     <w:multiLevelType w:val="hybridMultilevel"/>
     <w:tmpl w:val="D69E01FE"/>
@@ -35971,7 +37200,7 @@
       </w:pPr>
     </w:lvl>
   </w:abstractNum>
-  <w:abstractNum w:abstractNumId="28" w15:restartNumberingAfterBreak="0">
+  <w:abstractNum w:abstractNumId="30" w15:restartNumberingAfterBreak="0">
     <w:nsid w:val="4FE4300C"/>
     <w:multiLevelType w:val="hybridMultilevel"/>
     <w:tmpl w:val="C08098B2"/>
@@ -36060,7 +37289,7 @@
       </w:pPr>
     </w:lvl>
   </w:abstractNum>
-  <w:abstractNum w:abstractNumId="29" w15:restartNumberingAfterBreak="0">
+  <w:abstractNum w:abstractNumId="31" w15:restartNumberingAfterBreak="0">
     <w:nsid w:val="501E5C7A"/>
     <w:multiLevelType w:val="hybridMultilevel"/>
     <w:tmpl w:val="B0484AC6"/>
@@ -36149,7 +37378,7 @@
       </w:pPr>
     </w:lvl>
   </w:abstractNum>
-  <w:abstractNum w:abstractNumId="30" w15:restartNumberingAfterBreak="0">
+  <w:abstractNum w:abstractNumId="32" w15:restartNumberingAfterBreak="0">
     <w:nsid w:val="5309357D"/>
     <w:multiLevelType w:val="hybridMultilevel"/>
     <w:tmpl w:val="01B0FBFA"/>
@@ -36261,7 +37490,7 @@
       </w:rPr>
     </w:lvl>
   </w:abstractNum>
-  <w:abstractNum w:abstractNumId="31" w15:restartNumberingAfterBreak="0">
+  <w:abstractNum w:abstractNumId="33" w15:restartNumberingAfterBreak="0">
     <w:nsid w:val="53E42323"/>
     <w:multiLevelType w:val="hybridMultilevel"/>
     <w:tmpl w:val="41A0FD70"/>
@@ -36374,7 +37603,120 @@
       </w:rPr>
     </w:lvl>
   </w:abstractNum>
-  <w:abstractNum w:abstractNumId="32" w15:restartNumberingAfterBreak="0">
+  <w:abstractNum w:abstractNumId="34" w15:restartNumberingAfterBreak="0">
+    <w:nsid w:val="5C6E30AD"/>
+    <w:multiLevelType w:val="hybridMultilevel"/>
+    <w:tmpl w:val="4148BB86"/>
+    <w:lvl w:ilvl="0" w:tplc="0409000B">
+      <w:start w:val="1"/>
+      <w:numFmt w:val="bullet"/>
+      <w:lvlText w:val=""/>
+      <w:lvlJc w:val="left"/>
+      <w:pPr>
+        <w:ind w:left="720" w:hanging="360"/>
+      </w:pPr>
+      <w:rPr>
+        <w:rFonts w:ascii="Wingdings" w:hAnsi="Wingdings" w:hint="default"/>
+      </w:rPr>
+    </w:lvl>
+    <w:lvl w:ilvl="1" w:tplc="04090003" w:tentative="1">
+      <w:start w:val="1"/>
+      <w:numFmt w:val="bullet"/>
+      <w:lvlText w:val="o"/>
+      <w:lvlJc w:val="left"/>
+      <w:pPr>
+        <w:ind w:left="1440" w:hanging="360"/>
+      </w:pPr>
+      <w:rPr>
+        <w:rFonts w:ascii="Courier New" w:hAnsi="Courier New" w:cs="Courier New" w:hint="default"/>
+      </w:rPr>
+    </w:lvl>
+    <w:lvl w:ilvl="2" w:tplc="04090005" w:tentative="1">
+      <w:start w:val="1"/>
+      <w:numFmt w:val="bullet"/>
+      <w:lvlText w:val=""/>
+      <w:lvlJc w:val="left"/>
+      <w:pPr>
+        <w:ind w:left="2160" w:hanging="360"/>
+      </w:pPr>
+      <w:rPr>
+        <w:rFonts w:ascii="Wingdings" w:hAnsi="Wingdings" w:hint="default"/>
+      </w:rPr>
+    </w:lvl>
+    <w:lvl w:ilvl="3" w:tplc="04090001" w:tentative="1">
+      <w:start w:val="1"/>
+      <w:numFmt w:val="bullet"/>
+      <w:lvlText w:val=""/>
+      <w:lvlJc w:val="left"/>
+      <w:pPr>
+        <w:ind w:left="2880" w:hanging="360"/>
+      </w:pPr>
+      <w:rPr>
+        <w:rFonts w:ascii="Symbol" w:hAnsi="Symbol" w:hint="default"/>
+      </w:rPr>
+    </w:lvl>
+    <w:lvl w:ilvl="4" w:tplc="04090003" w:tentative="1">
+      <w:start w:val="1"/>
+      <w:numFmt w:val="bullet"/>
+      <w:lvlText w:val="o"/>
+      <w:lvlJc w:val="left"/>
+      <w:pPr>
+        <w:ind w:left="3600" w:hanging="360"/>
+      </w:pPr>
+      <w:rPr>
+        <w:rFonts w:ascii="Courier New" w:hAnsi="Courier New" w:cs="Courier New" w:hint="default"/>
+      </w:rPr>
+    </w:lvl>
+    <w:lvl w:ilvl="5" w:tplc="04090005" w:tentative="1">
+      <w:start w:val="1"/>
+      <w:numFmt w:val="bullet"/>
+      <w:lvlText w:val=""/>
+      <w:lvlJc w:val="left"/>
+      <w:pPr>
+        <w:ind w:left="4320" w:hanging="360"/>
+      </w:pPr>
+      <w:rPr>
+        <w:rFonts w:ascii="Wingdings" w:hAnsi="Wingdings" w:hint="default"/>
+      </w:rPr>
+    </w:lvl>
+    <w:lvl w:ilvl="6" w:tplc="04090001" w:tentative="1">
+      <w:start w:val="1"/>
+      <w:numFmt w:val="bullet"/>
+      <w:lvlText w:val=""/>
+      <w:lvlJc w:val="left"/>
+      <w:pPr>
+        <w:ind w:left="5040" w:hanging="360"/>
+      </w:pPr>
+      <w:rPr>
+        <w:rFonts w:ascii="Symbol" w:hAnsi="Symbol" w:hint="default"/>
+      </w:rPr>
+    </w:lvl>
+    <w:lvl w:ilvl="7" w:tplc="04090003" w:tentative="1">
+      <w:start w:val="1"/>
+      <w:numFmt w:val="bullet"/>
+      <w:lvlText w:val="o"/>
+      <w:lvlJc w:val="left"/>
+      <w:pPr>
+        <w:ind w:left="5760" w:hanging="360"/>
+      </w:pPr>
+      <w:rPr>
+        <w:rFonts w:ascii="Courier New" w:hAnsi="Courier New" w:cs="Courier New" w:hint="default"/>
+      </w:rPr>
+    </w:lvl>
+    <w:lvl w:ilvl="8" w:tplc="04090005" w:tentative="1">
+      <w:start w:val="1"/>
+      <w:numFmt w:val="bullet"/>
+      <w:lvlText w:val=""/>
+      <w:lvlJc w:val="left"/>
+      <w:pPr>
+        <w:ind w:left="6480" w:hanging="360"/>
+      </w:pPr>
+      <w:rPr>
+        <w:rFonts w:ascii="Wingdings" w:hAnsi="Wingdings" w:hint="default"/>
+      </w:rPr>
+    </w:lvl>
+  </w:abstractNum>
+  <w:abstractNum w:abstractNumId="35" w15:restartNumberingAfterBreak="0">
     <w:nsid w:val="5F0C2A9F"/>
     <w:multiLevelType w:val="hybridMultilevel"/>
     <w:tmpl w:val="1E5AD8A4"/>
@@ -36463,7 +37805,7 @@
       </w:pPr>
     </w:lvl>
   </w:abstractNum>
-  <w:abstractNum w:abstractNumId="33" w15:restartNumberingAfterBreak="0">
+  <w:abstractNum w:abstractNumId="36" w15:restartNumberingAfterBreak="0">
     <w:nsid w:val="61694E65"/>
     <w:multiLevelType w:val="hybridMultilevel"/>
     <w:tmpl w:val="9BD49816"/>
@@ -36576,7 +37918,7 @@
       </w:rPr>
     </w:lvl>
   </w:abstractNum>
-  <w:abstractNum w:abstractNumId="34" w15:restartNumberingAfterBreak="0">
+  <w:abstractNum w:abstractNumId="37" w15:restartNumberingAfterBreak="0">
     <w:nsid w:val="62720567"/>
     <w:multiLevelType w:val="hybridMultilevel"/>
     <w:tmpl w:val="CB8EB606"/>
@@ -36665,7 +38007,7 @@
       </w:pPr>
     </w:lvl>
   </w:abstractNum>
-  <w:abstractNum w:abstractNumId="35" w15:restartNumberingAfterBreak="0">
+  <w:abstractNum w:abstractNumId="38" w15:restartNumberingAfterBreak="0">
     <w:nsid w:val="6372595E"/>
     <w:multiLevelType w:val="hybridMultilevel"/>
     <w:tmpl w:val="73C85C36"/>
@@ -36754,7 +38096,7 @@
       </w:pPr>
     </w:lvl>
   </w:abstractNum>
-  <w:abstractNum w:abstractNumId="36" w15:restartNumberingAfterBreak="0">
+  <w:abstractNum w:abstractNumId="39" w15:restartNumberingAfterBreak="0">
     <w:nsid w:val="657F0423"/>
     <w:multiLevelType w:val="hybridMultilevel"/>
     <w:tmpl w:val="9A4E50BE"/>
@@ -36843,7 +38185,7 @@
       </w:pPr>
     </w:lvl>
   </w:abstractNum>
-  <w:abstractNum w:abstractNumId="37" w15:restartNumberingAfterBreak="0">
+  <w:abstractNum w:abstractNumId="40" w15:restartNumberingAfterBreak="0">
     <w:nsid w:val="6BF5699A"/>
     <w:multiLevelType w:val="hybridMultilevel"/>
     <w:tmpl w:val="B70242AC"/>
@@ -36932,7 +38274,7 @@
       </w:pPr>
     </w:lvl>
   </w:abstractNum>
-  <w:abstractNum w:abstractNumId="38" w15:restartNumberingAfterBreak="0">
+  <w:abstractNum w:abstractNumId="41" w15:restartNumberingAfterBreak="0">
     <w:nsid w:val="6CE84068"/>
     <w:multiLevelType w:val="hybridMultilevel"/>
     <w:tmpl w:val="8FECEE7C"/>
@@ -37021,7 +38363,7 @@
       </w:pPr>
     </w:lvl>
   </w:abstractNum>
-  <w:abstractNum w:abstractNumId="39" w15:restartNumberingAfterBreak="0">
+  <w:abstractNum w:abstractNumId="42" w15:restartNumberingAfterBreak="0">
     <w:nsid w:val="7B1A71C9"/>
     <w:multiLevelType w:val="hybridMultilevel"/>
     <w:tmpl w:val="8C8A09F2"/>
@@ -37110,7 +38452,7 @@
       </w:pPr>
     </w:lvl>
   </w:abstractNum>
-  <w:abstractNum w:abstractNumId="40" w15:restartNumberingAfterBreak="0">
+  <w:abstractNum w:abstractNumId="43" w15:restartNumberingAfterBreak="0">
     <w:nsid w:val="7B2040A2"/>
     <w:multiLevelType w:val="hybridMultilevel"/>
     <w:tmpl w:val="D98A1B86"/>
@@ -37199,7 +38541,7 @@
       </w:pPr>
     </w:lvl>
   </w:abstractNum>
-  <w:abstractNum w:abstractNumId="41" w15:restartNumberingAfterBreak="0">
+  <w:abstractNum w:abstractNumId="44" w15:restartNumberingAfterBreak="0">
     <w:nsid w:val="7BCD3D14"/>
     <w:multiLevelType w:val="hybridMultilevel"/>
     <w:tmpl w:val="67AA612E"/>
@@ -37288,7 +38630,7 @@
       </w:pPr>
     </w:lvl>
   </w:abstractNum>
-  <w:abstractNum w:abstractNumId="42" w15:restartNumberingAfterBreak="0">
+  <w:abstractNum w:abstractNumId="45" w15:restartNumberingAfterBreak="0">
     <w:nsid w:val="7C0D4087"/>
     <w:multiLevelType w:val="hybridMultilevel"/>
     <w:tmpl w:val="627CA122"/>
@@ -37377,7 +38719,7 @@
       </w:pPr>
     </w:lvl>
   </w:abstractNum>
-  <w:abstractNum w:abstractNumId="43" w15:restartNumberingAfterBreak="0">
+  <w:abstractNum w:abstractNumId="46" w15:restartNumberingAfterBreak="0">
     <w:nsid w:val="7CEF2B35"/>
     <w:multiLevelType w:val="hybridMultilevel"/>
     <w:tmpl w:val="06A655B8"/>
@@ -37466,7 +38808,7 @@
       </w:pPr>
     </w:lvl>
   </w:abstractNum>
-  <w:abstractNum w:abstractNumId="44" w15:restartNumberingAfterBreak="0">
+  <w:abstractNum w:abstractNumId="47" w15:restartNumberingAfterBreak="0">
     <w:nsid w:val="7D5D3AE7"/>
     <w:multiLevelType w:val="hybridMultilevel"/>
     <w:tmpl w:val="F9EA4898"/>
@@ -37579,7 +38921,7 @@
       </w:rPr>
     </w:lvl>
   </w:abstractNum>
-  <w:abstractNum w:abstractNumId="45" w15:restartNumberingAfterBreak="0">
+  <w:abstractNum w:abstractNumId="48" w15:restartNumberingAfterBreak="0">
     <w:nsid w:val="7D76744D"/>
     <w:multiLevelType w:val="hybridMultilevel"/>
     <w:tmpl w:val="E8AEDA8C"/>
@@ -37692,7 +39034,7 @@
       </w:rPr>
     </w:lvl>
   </w:abstractNum>
-  <w:abstractNum w:abstractNumId="46" w15:restartNumberingAfterBreak="0">
+  <w:abstractNum w:abstractNumId="49" w15:restartNumberingAfterBreak="0">
     <w:nsid w:val="7DD93F30"/>
     <w:multiLevelType w:val="hybridMultilevel"/>
     <w:tmpl w:val="02C810C8"/>
@@ -37781,7 +39123,7 @@
       </w:pPr>
     </w:lvl>
   </w:abstractNum>
-  <w:abstractNum w:abstractNumId="47" w15:restartNumberingAfterBreak="0">
+  <w:abstractNum w:abstractNumId="50" w15:restartNumberingAfterBreak="0">
     <w:nsid w:val="7ECE01C0"/>
     <w:multiLevelType w:val="hybridMultilevel"/>
     <w:tmpl w:val="A88233C2"/>
@@ -37895,148 +39237,157 @@
     </w:lvl>
   </w:abstractNum>
   <w:num w:numId="1">
+    <w:abstractNumId w:val="32"/>
+  </w:num>
+  <w:num w:numId="2">
+    <w:abstractNumId w:val="19"/>
+  </w:num>
+  <w:num w:numId="3">
+    <w:abstractNumId w:val="2"/>
+  </w:num>
+  <w:num w:numId="4">
+    <w:abstractNumId w:val="20"/>
+  </w:num>
+  <w:num w:numId="5">
+    <w:abstractNumId w:val="9"/>
+  </w:num>
+  <w:num w:numId="6">
+    <w:abstractNumId w:val="47"/>
+  </w:num>
+  <w:num w:numId="7">
+    <w:abstractNumId w:val="16"/>
+  </w:num>
+  <w:num w:numId="8">
+    <w:abstractNumId w:val="6"/>
+  </w:num>
+  <w:num w:numId="9">
+    <w:abstractNumId w:val="36"/>
+  </w:num>
+  <w:num w:numId="10">
+    <w:abstractNumId w:val="33"/>
+  </w:num>
+  <w:num w:numId="11">
+    <w:abstractNumId w:val="50"/>
+  </w:num>
+  <w:num w:numId="12">
+    <w:abstractNumId w:val="48"/>
+  </w:num>
+  <w:num w:numId="13">
+    <w:abstractNumId w:val="13"/>
+  </w:num>
+  <w:num w:numId="14">
+    <w:abstractNumId w:val="3"/>
+  </w:num>
+  <w:num w:numId="15">
+    <w:abstractNumId w:val="25"/>
+  </w:num>
+  <w:num w:numId="16">
+    <w:abstractNumId w:val="22"/>
+  </w:num>
+  <w:num w:numId="17">
+    <w:abstractNumId w:val="40"/>
+  </w:num>
+  <w:num w:numId="18">
+    <w:abstractNumId w:val="31"/>
+  </w:num>
+  <w:num w:numId="19">
+    <w:abstractNumId w:val="21"/>
+  </w:num>
+  <w:num w:numId="20">
+    <w:abstractNumId w:val="11"/>
+  </w:num>
+  <w:num w:numId="21">
+    <w:abstractNumId w:val="35"/>
+  </w:num>
+  <w:num w:numId="22">
+    <w:abstractNumId w:val="26"/>
+  </w:num>
+  <w:num w:numId="23">
+    <w:abstractNumId w:val="27"/>
+  </w:num>
+  <w:num w:numId="24">
+    <w:abstractNumId w:val="46"/>
+  </w:num>
+  <w:num w:numId="25">
+    <w:abstractNumId w:val="15"/>
+  </w:num>
+  <w:num w:numId="26">
+    <w:abstractNumId w:val="18"/>
+  </w:num>
+  <w:num w:numId="27">
+    <w:abstractNumId w:val="28"/>
+  </w:num>
+  <w:num w:numId="28">
+    <w:abstractNumId w:val="12"/>
+  </w:num>
+  <w:num w:numId="29">
+    <w:abstractNumId w:val="24"/>
+  </w:num>
+  <w:num w:numId="30">
+    <w:abstractNumId w:val="4"/>
+  </w:num>
+  <w:num w:numId="31">
+    <w:abstractNumId w:val="41"/>
+  </w:num>
+  <w:num w:numId="32">
+    <w:abstractNumId w:val="23"/>
+  </w:num>
+  <w:num w:numId="33">
+    <w:abstractNumId w:val="38"/>
+  </w:num>
+  <w:num w:numId="34">
+    <w:abstractNumId w:val="43"/>
+  </w:num>
+  <w:num w:numId="35">
     <w:abstractNumId w:val="30"/>
   </w:num>
-  <w:num w:numId="2">
+  <w:num w:numId="36">
+    <w:abstractNumId w:val="42"/>
+  </w:num>
+  <w:num w:numId="37">
+    <w:abstractNumId w:val="10"/>
+  </w:num>
+  <w:num w:numId="38">
+    <w:abstractNumId w:val="44"/>
+  </w:num>
+  <w:num w:numId="39">
+    <w:abstractNumId w:val="14"/>
+  </w:num>
+  <w:num w:numId="40">
+    <w:abstractNumId w:val="37"/>
+  </w:num>
+  <w:num w:numId="41">
+    <w:abstractNumId w:val="5"/>
+  </w:num>
+  <w:num w:numId="42">
+    <w:abstractNumId w:val="8"/>
+  </w:num>
+  <w:num w:numId="43">
+    <w:abstractNumId w:val="7"/>
+  </w:num>
+  <w:num w:numId="44">
+    <w:abstractNumId w:val="45"/>
+  </w:num>
+  <w:num w:numId="45">
+    <w:abstractNumId w:val="29"/>
+  </w:num>
+  <w:num w:numId="46">
+    <w:abstractNumId w:val="39"/>
+  </w:num>
+  <w:num w:numId="47">
     <w:abstractNumId w:val="17"/>
   </w:num>
-  <w:num w:numId="3">
+  <w:num w:numId="48">
+    <w:abstractNumId w:val="49"/>
+  </w:num>
+  <w:num w:numId="49">
+    <w:abstractNumId w:val="34"/>
+  </w:num>
+  <w:num w:numId="50">
     <w:abstractNumId w:val="0"/>
   </w:num>
-  <w:num w:numId="4">
-    <w:abstractNumId w:val="18"/>
-  </w:num>
-  <w:num w:numId="5">
-    <w:abstractNumId w:val="7"/>
-  </w:num>
-  <w:num w:numId="6">
-    <w:abstractNumId w:val="44"/>
-  </w:num>
-  <w:num w:numId="7">
-    <w:abstractNumId w:val="14"/>
-  </w:num>
-  <w:num w:numId="8">
-    <w:abstractNumId w:val="4"/>
-  </w:num>
-  <w:num w:numId="9">
-    <w:abstractNumId w:val="33"/>
-  </w:num>
-  <w:num w:numId="10">
-    <w:abstractNumId w:val="31"/>
-  </w:num>
-  <w:num w:numId="11">
-    <w:abstractNumId w:val="47"/>
-  </w:num>
-  <w:num w:numId="12">
-    <w:abstractNumId w:val="45"/>
-  </w:num>
-  <w:num w:numId="13">
-    <w:abstractNumId w:val="11"/>
-  </w:num>
-  <w:num w:numId="14">
+  <w:num w:numId="51">
     <w:abstractNumId w:val="1"/>
-  </w:num>
-  <w:num w:numId="15">
-    <w:abstractNumId w:val="23"/>
-  </w:num>
-  <w:num w:numId="16">
-    <w:abstractNumId w:val="20"/>
-  </w:num>
-  <w:num w:numId="17">
-    <w:abstractNumId w:val="37"/>
-  </w:num>
-  <w:num w:numId="18">
-    <w:abstractNumId w:val="29"/>
-  </w:num>
-  <w:num w:numId="19">
-    <w:abstractNumId w:val="19"/>
-  </w:num>
-  <w:num w:numId="20">
-    <w:abstractNumId w:val="9"/>
-  </w:num>
-  <w:num w:numId="21">
-    <w:abstractNumId w:val="32"/>
-  </w:num>
-  <w:num w:numId="22">
-    <w:abstractNumId w:val="24"/>
-  </w:num>
-  <w:num w:numId="23">
-    <w:abstractNumId w:val="25"/>
-  </w:num>
-  <w:num w:numId="24">
-    <w:abstractNumId w:val="43"/>
-  </w:num>
-  <w:num w:numId="25">
-    <w:abstractNumId w:val="13"/>
-  </w:num>
-  <w:num w:numId="26">
-    <w:abstractNumId w:val="16"/>
-  </w:num>
-  <w:num w:numId="27">
-    <w:abstractNumId w:val="26"/>
-  </w:num>
-  <w:num w:numId="28">
-    <w:abstractNumId w:val="10"/>
-  </w:num>
-  <w:num w:numId="29">
-    <w:abstractNumId w:val="22"/>
-  </w:num>
-  <w:num w:numId="30">
-    <w:abstractNumId w:val="2"/>
-  </w:num>
-  <w:num w:numId="31">
-    <w:abstractNumId w:val="38"/>
-  </w:num>
-  <w:num w:numId="32">
-    <w:abstractNumId w:val="21"/>
-  </w:num>
-  <w:num w:numId="33">
-    <w:abstractNumId w:val="35"/>
-  </w:num>
-  <w:num w:numId="34">
-    <w:abstractNumId w:val="40"/>
-  </w:num>
-  <w:num w:numId="35">
-    <w:abstractNumId w:val="28"/>
-  </w:num>
-  <w:num w:numId="36">
-    <w:abstractNumId w:val="39"/>
-  </w:num>
-  <w:num w:numId="37">
-    <w:abstractNumId w:val="8"/>
-  </w:num>
-  <w:num w:numId="38">
-    <w:abstractNumId w:val="41"/>
-  </w:num>
-  <w:num w:numId="39">
-    <w:abstractNumId w:val="12"/>
-  </w:num>
-  <w:num w:numId="40">
-    <w:abstractNumId w:val="34"/>
-  </w:num>
-  <w:num w:numId="41">
-    <w:abstractNumId w:val="3"/>
-  </w:num>
-  <w:num w:numId="42">
-    <w:abstractNumId w:val="6"/>
-  </w:num>
-  <w:num w:numId="43">
-    <w:abstractNumId w:val="5"/>
-  </w:num>
-  <w:num w:numId="44">
-    <w:abstractNumId w:val="42"/>
-  </w:num>
-  <w:num w:numId="45">
-    <w:abstractNumId w:val="27"/>
-  </w:num>
-  <w:num w:numId="46">
-    <w:abstractNumId w:val="36"/>
-  </w:num>
-  <w:num w:numId="47">
-    <w:abstractNumId w:val="15"/>
-  </w:num>
-  <w:num w:numId="48">
-    <w:abstractNumId w:val="46"/>
   </w:num>
   <w:numIdMacAtCleanup w:val="48"/>
 </w:numbering>

</xml_diff>

<commit_message>
feat: Thêm chức năng phân công và quản lý Deal cho Sales Manager, tạo test case cho quản lý Deal và Pipeline, cập nhật lại file unit-test-backend
</commit_message>
<xml_diff>
--- a/docs/BaoCao/BaoCao.docx
+++ b/docs/BaoCao/BaoCao.docx
@@ -6633,7 +6633,23 @@
             <w:rFonts w:ascii="Times New Roman" w:hAnsi="Times New Roman" w:cs="Times New Roman"/>
             <w:noProof/>
           </w:rPr>
-          <w:t>Bảng 7: UC5: Phân công Deal</w:t>
+          <w:t>Bảng 7: UC5: Phân c</w:t>
+        </w:r>
+        <w:r>
+          <w:rPr>
+            <w:rStyle w:val="Hyperlink"/>
+            <w:rFonts w:ascii="Times New Roman" w:hAnsi="Times New Roman" w:cs="Times New Roman"/>
+            <w:noProof/>
+          </w:rPr>
+          <w:t>ô</w:t>
+        </w:r>
+        <w:r>
+          <w:rPr>
+            <w:rStyle w:val="Hyperlink"/>
+            <w:rFonts w:ascii="Times New Roman" w:hAnsi="Times New Roman" w:cs="Times New Roman"/>
+            <w:noProof/>
+          </w:rPr>
+          <w:t>ng Deal</w:t>
         </w:r>
         <w:r>
           <w:rPr>
@@ -7535,42 +7551,8 @@
       <w:r>
         <w:fldChar w:fldCharType="end"/>
       </w:r>
-      <w:r>
-        <w:fldChar w:fldCharType="begin"/>
-      </w:r>
-      <w:r>
-        <w:instrText xml:space="preserve"> TOC \h \z \c "B</w:instrText>
-      </w:r>
-      <w:r>
-        <w:instrText>ả</w:instrText>
-      </w:r>
-      <w:r>
-        <w:instrText xml:space="preserve">ng" </w:instrText>
-      </w:r>
-      <w:r>
-        <w:fldChar w:fldCharType="separate"/>
-      </w:r>
-      <w:r>
-        <w:fldChar w:fldCharType="end"/>
-      </w:r>
-      <w:r>
-        <w:fldChar w:fldCharType="begin"/>
-      </w:r>
-      <w:r>
-        <w:instrText xml:space="preserve"> TOC \h \z \c "B</w:instrText>
-      </w:r>
-      <w:r>
-        <w:instrText>ả</w:instrText>
-      </w:r>
-      <w:r>
-        <w:instrText xml:space="preserve">ng" </w:instrText>
-      </w:r>
-      <w:r>
-        <w:fldChar w:fldCharType="separate"/>
-      </w:r>
-      <w:r>
-        <w:fldChar w:fldCharType="end"/>
-      </w:r>
+      <w:fldSimple w:instr=" TOC \h \z \c &quot;Bảng&quot; "/>
+      <w:fldSimple w:instr=" TOC \h \z \c &quot;Bảng&quot; "/>
       <w:r>
         <w:br w:type="page"/>
       </w:r>
@@ -12555,7 +12537,16 @@
           <w:szCs w:val="26"/>
         </w:rPr>
         <w:lastRenderedPageBreak/>
-        <w:t>Prisma hoạt động dựa trên tệp schema.pri</w:t>
+        <w:t xml:space="preserve">Prisma hoạt động dựa trên tệp </w:t>
+      </w:r>
+      <w:proofErr w:type="gramStart"/>
+      <w:r>
+        <w:rPr>
+          <w:rFonts w:ascii="Times New Roman" w:hAnsi="Times New Roman" w:cs="Times New Roman"/>
+          <w:sz w:val="26"/>
+          <w:szCs w:val="26"/>
+        </w:rPr>
+        <w:t>schema.pri</w:t>
       </w:r>
       <w:r>
         <w:rPr>
@@ -12571,7 +12562,16 @@
           <w:sz w:val="26"/>
           <w:szCs w:val="26"/>
         </w:rPr>
-        <w:t xml:space="preserve">ma nơi định nghĩa các Model và thông tin kết nối đến cơ sở dữ liệu. Dựa trên tệp này, Prisma sẽ sinh ra </w:t>
+        <w:t>ma</w:t>
+      </w:r>
+      <w:proofErr w:type="gramEnd"/>
+      <w:r>
+        <w:rPr>
+          <w:rFonts w:ascii="Times New Roman" w:hAnsi="Times New Roman" w:cs="Times New Roman"/>
+          <w:sz w:val="26"/>
+          <w:szCs w:val="26"/>
+        </w:rPr>
+        <w:t xml:space="preserve"> nơi định nghĩa các Model và thông tin kết nối đến cơ sở dữ liệu. Dựa trên tệp này, Prisma sẽ sinh ra </w:t>
       </w:r>
       <w:r>
         <w:rPr>
@@ -15652,6 +15652,53 @@
           </w:p>
         </w:tc>
       </w:tr>
+      <w:tr>
+        <w:tc>
+          <w:tcPr>
+            <w:tcW w:w="1696" w:type="dxa"/>
+          </w:tcPr>
+          <w:p>
+            <w:pPr>
+              <w:rPr>
+                <w:rFonts w:ascii="Times New Roman" w:hAnsi="Times New Roman" w:cs="Times New Roman"/>
+                <w:sz w:val="26"/>
+                <w:szCs w:val="26"/>
+              </w:rPr>
+            </w:pPr>
+            <w:r>
+              <w:rPr>
+                <w:rFonts w:ascii="Times New Roman" w:hAnsi="Times New Roman" w:cs="Times New Roman"/>
+                <w:sz w:val="26"/>
+                <w:szCs w:val="26"/>
+              </w:rPr>
+              <w:t>BR29</w:t>
+            </w:r>
+          </w:p>
+        </w:tc>
+        <w:tc>
+          <w:tcPr>
+            <w:tcW w:w="7365" w:type="dxa"/>
+          </w:tcPr>
+          <w:p>
+            <w:pPr>
+              <w:keepNext/>
+              <w:rPr>
+                <w:rFonts w:ascii="Times New Roman" w:hAnsi="Times New Roman" w:cs="Times New Roman"/>
+                <w:sz w:val="26"/>
+                <w:szCs w:val="26"/>
+              </w:rPr>
+            </w:pPr>
+            <w:r>
+              <w:rPr>
+                <w:rFonts w:ascii="Times New Roman" w:hAnsi="Times New Roman" w:cs="Times New Roman"/>
+                <w:sz w:val="26"/>
+                <w:szCs w:val="26"/>
+              </w:rPr>
+              <w:t>Khi Sales tạo Deal, hệ thống tự động gán Sales đó làm người phụ trách, còn Sales Manager tạo Deal thì Sales Manager phải chọn một Sales làm người phụ trách.</w:t>
+            </w:r>
+          </w:p>
+        </w:tc>
+      </w:tr>
     </w:tbl>
     <w:p>
       <w:pPr>
@@ -16252,6 +16299,7 @@
                 <w:sz w:val="26"/>
                 <w:szCs w:val="26"/>
               </w:rPr>
+              <w:lastRenderedPageBreak/>
               <w:t>Luồng chính</w:t>
             </w:r>
           </w:p>
@@ -16345,7 +16393,6 @@
                 <w:sz w:val="26"/>
                 <w:szCs w:val="26"/>
               </w:rPr>
-              <w:lastRenderedPageBreak/>
               <w:t>Nếu hợp lệ thì tạo phiên đăng nhập</w:t>
             </w:r>
           </w:p>
@@ -16392,7 +16439,6 @@
                 <w:sz w:val="26"/>
                 <w:szCs w:val="26"/>
               </w:rPr>
-              <w:lastRenderedPageBreak/>
               <w:t>Luồng thay thế</w:t>
             </w:r>
           </w:p>
@@ -17831,6 +17877,7 @@
                 <w:sz w:val="26"/>
                 <w:szCs w:val="26"/>
               </w:rPr>
+              <w:lastRenderedPageBreak/>
               <w:t>Hệ thống tạo ra một Customer mới</w:t>
             </w:r>
           </w:p>
@@ -18348,6 +18395,14 @@
               </w:rPr>
               <w:t>Sales</w:t>
             </w:r>
+            <w:r>
+              <w:rPr>
+                <w:rFonts w:ascii="Times New Roman" w:hAnsi="Times New Roman" w:cs="Times New Roman"/>
+                <w:sz w:val="26"/>
+                <w:szCs w:val="26"/>
+              </w:rPr>
+              <w:t>, Sales Manager</w:t>
+            </w:r>
           </w:p>
         </w:tc>
       </w:tr>
@@ -18504,19 +18559,18 @@
           </w:tcPr>
           <w:p>
             <w:pPr>
-              <w:rPr>
-                <w:rFonts w:ascii="Times New Roman" w:hAnsi="Times New Roman" w:cs="Times New Roman"/>
-                <w:sz w:val="26"/>
-                <w:szCs w:val="26"/>
-              </w:rPr>
-            </w:pPr>
-            <w:r>
-              <w:rPr>
-                <w:rFonts w:ascii="Times New Roman" w:hAnsi="Times New Roman" w:cs="Times New Roman"/>
-                <w:sz w:val="26"/>
-                <w:szCs w:val="26"/>
-              </w:rPr>
-              <w:t>BR06, BR08, BR09, BR18, BR20</w:t>
+              <w:pStyle w:val="NormalWeb"/>
+              <w:rPr>
+                <w:sz w:val="26"/>
+                <w:szCs w:val="26"/>
+              </w:rPr>
+            </w:pPr>
+            <w:r>
+              <w:rPr>
+                <w:sz w:val="26"/>
+                <w:szCs w:val="26"/>
+              </w:rPr>
+              <w:t>BR06, BR07, BR08, BR09, BR14, BR18, BR20, BR29</w:t>
             </w:r>
           </w:p>
         </w:tc>
@@ -19437,6 +19491,7 @@
                 <w:sz w:val="26"/>
                 <w:szCs w:val="26"/>
               </w:rPr>
+              <w:lastRenderedPageBreak/>
               <w:t>Luồng chính</w:t>
             </w:r>
           </w:p>
@@ -19571,7 +19626,6 @@
                 <w:sz w:val="26"/>
                 <w:szCs w:val="26"/>
               </w:rPr>
-              <w:lastRenderedPageBreak/>
               <w:t>Ghi Activity Log</w:t>
             </w:r>
           </w:p>
@@ -19596,7 +19650,6 @@
                 <w:sz w:val="26"/>
                 <w:szCs w:val="26"/>
               </w:rPr>
-              <w:lastRenderedPageBreak/>
               <w:t>Luồng thay thế</w:t>
             </w:r>
           </w:p>
@@ -20990,6 +21043,7 @@
                 <w:sz w:val="26"/>
                 <w:szCs w:val="26"/>
               </w:rPr>
+              <w:lastRenderedPageBreak/>
               <w:t>Chọn Deal cần báo giá</w:t>
             </w:r>
           </w:p>
@@ -21056,7 +21110,6 @@
                 <w:sz w:val="26"/>
                 <w:szCs w:val="26"/>
               </w:rPr>
-              <w:lastRenderedPageBreak/>
               <w:t>Hệ thống tính thành tiền cho từng sản phẩm và tổng tiền</w:t>
             </w:r>
           </w:p>
@@ -22307,6 +22360,7 @@
           <w:sz w:val="26"/>
           <w:szCs w:val="26"/>
         </w:rPr>
+        <w:lastRenderedPageBreak/>
         <w:t>UC9: Dashboard</w:t>
       </w:r>
     </w:p>
@@ -22431,7 +22485,6 @@
                 <w:sz w:val="26"/>
                 <w:szCs w:val="26"/>
               </w:rPr>
-              <w:lastRenderedPageBreak/>
               <w:t>Mô tả</w:t>
             </w:r>
           </w:p>
@@ -23784,6 +23837,7 @@
                 <w:sz w:val="26"/>
                 <w:szCs w:val="26"/>
               </w:rPr>
+              <w:lastRenderedPageBreak/>
               <w:t>Thuộc tính</w:t>
             </w:r>
           </w:p>
@@ -23930,7 +23984,6 @@
                 <w:sz w:val="26"/>
                 <w:szCs w:val="26"/>
               </w:rPr>
-              <w:lastRenderedPageBreak/>
               <w:t>Actor</w:t>
             </w:r>
           </w:p>
@@ -25441,6 +25494,7 @@
                 <w:sz w:val="26"/>
                 <w:szCs w:val="26"/>
               </w:rPr>
+              <w:lastRenderedPageBreak/>
               <w:t>Mã Use Case</w:t>
             </w:r>
           </w:p>
@@ -25587,7 +25641,6 @@
                 <w:sz w:val="26"/>
                 <w:szCs w:val="26"/>
               </w:rPr>
-              <w:lastRenderedPageBreak/>
               <w:t>Tiền điều kiện</w:t>
             </w:r>
           </w:p>
@@ -27046,6 +27099,7 @@
                 <w:sz w:val="26"/>
                 <w:szCs w:val="26"/>
               </w:rPr>
+              <w:lastRenderedPageBreak/>
               <w:t>Thuộc tính</w:t>
             </w:r>
           </w:p>
@@ -27184,7 +27238,6 @@
                 <w:sz w:val="26"/>
                 <w:szCs w:val="26"/>
               </w:rPr>
-              <w:lastRenderedPageBreak/>
               <w:t>Actor</w:t>
             </w:r>
           </w:p>
@@ -29181,7 +29234,25 @@
           <w:sz w:val="26"/>
           <w:szCs w:val="26"/>
         </w:rPr>
-        <w:t>Leads – Customers: quan hệ 1-0..1, một khách hàng tiềm năng có thể được chuyển thành một khách hàng hoặc không.</w:t>
+        <w:t>Leads – Customers: quan hệ 1-</w:t>
+      </w:r>
+      <w:proofErr w:type="gramStart"/>
+      <w:r>
+        <w:rPr>
+          <w:rFonts w:ascii="Times New Roman" w:hAnsi="Times New Roman" w:cs="Times New Roman"/>
+          <w:sz w:val="26"/>
+          <w:szCs w:val="26"/>
+        </w:rPr>
+        <w:t>0..</w:t>
+      </w:r>
+      <w:proofErr w:type="gramEnd"/>
+      <w:r>
+        <w:rPr>
+          <w:rFonts w:ascii="Times New Roman" w:hAnsi="Times New Roman" w:cs="Times New Roman"/>
+          <w:sz w:val="26"/>
+          <w:szCs w:val="26"/>
+        </w:rPr>
+        <w:t>1, một khách hàng tiềm năng có thể được chuyển thành một khách hàng hoặc không.</w:t>
       </w:r>
     </w:p>
     <w:p>
@@ -40179,6 +40250,21 @@
     <w:unhideWhenUsed/>
     <w:rsid w:val="009D0BFD"/>
   </w:style>
+  <w:style w:type="paragraph" w:styleId="NormalWeb">
+    <w:name w:val="Normal (Web)"/>
+    <w:basedOn w:val="Normal"/>
+    <w:uiPriority w:val="99"/>
+    <w:unhideWhenUsed/>
+    <w:rsid w:val="002D69FD"/>
+    <w:pPr>
+      <w:spacing w:before="100" w:beforeAutospacing="1" w:after="100" w:afterAutospacing="1" w:line="240" w:lineRule="auto"/>
+    </w:pPr>
+    <w:rPr>
+      <w:rFonts w:ascii="Times New Roman" w:eastAsia="Times New Roman" w:hAnsi="Times New Roman" w:cs="Times New Roman"/>
+      <w:sz w:val="24"/>
+      <w:szCs w:val="24"/>
+    </w:rPr>
+  </w:style>
 </w:styles>
 </file>
 

</xml_diff>

<commit_message>
feat: frontend cho quản lý Activities, test case cho chức năng quản lý Activities
</commit_message>
<xml_diff>
--- a/docs/BaoCao/BaoCao.docx
+++ b/docs/BaoCao/BaoCao.docx
@@ -6633,23 +6633,7 @@
             <w:rFonts w:ascii="Times New Roman" w:hAnsi="Times New Roman" w:cs="Times New Roman"/>
             <w:noProof/>
           </w:rPr>
-          <w:t>Bảng 7: UC5: Phân c</w:t>
-        </w:r>
-        <w:r>
-          <w:rPr>
-            <w:rStyle w:val="Hyperlink"/>
-            <w:rFonts w:ascii="Times New Roman" w:hAnsi="Times New Roman" w:cs="Times New Roman"/>
-            <w:noProof/>
-          </w:rPr>
-          <w:t>ô</w:t>
-        </w:r>
-        <w:r>
-          <w:rPr>
-            <w:rStyle w:val="Hyperlink"/>
-            <w:rFonts w:ascii="Times New Roman" w:hAnsi="Times New Roman" w:cs="Times New Roman"/>
-            <w:noProof/>
-          </w:rPr>
-          <w:t>ng Deal</w:t>
+          <w:t>Bảng 7: UC5: Phân công Deal</w:t>
         </w:r>
         <w:r>
           <w:rPr>
@@ -7551,8 +7535,42 @@
       <w:r>
         <w:fldChar w:fldCharType="end"/>
       </w:r>
-      <w:fldSimple w:instr=" TOC \h \z \c &quot;Bảng&quot; "/>
-      <w:fldSimple w:instr=" TOC \h \z \c &quot;Bảng&quot; "/>
+      <w:r>
+        <w:fldChar w:fldCharType="begin"/>
+      </w:r>
+      <w:r>
+        <w:instrText xml:space="preserve"> TOC \h \z \c "B</w:instrText>
+      </w:r>
+      <w:r>
+        <w:instrText>ả</w:instrText>
+      </w:r>
+      <w:r>
+        <w:instrText xml:space="preserve">ng" </w:instrText>
+      </w:r>
+      <w:r>
+        <w:fldChar w:fldCharType="separate"/>
+      </w:r>
+      <w:r>
+        <w:fldChar w:fldCharType="end"/>
+      </w:r>
+      <w:r>
+        <w:fldChar w:fldCharType="begin"/>
+      </w:r>
+      <w:r>
+        <w:instrText xml:space="preserve"> TOC \h \z \c "B</w:instrText>
+      </w:r>
+      <w:r>
+        <w:instrText>ả</w:instrText>
+      </w:r>
+      <w:r>
+        <w:instrText xml:space="preserve">ng" </w:instrText>
+      </w:r>
+      <w:r>
+        <w:fldChar w:fldCharType="separate"/>
+      </w:r>
+      <w:r>
+        <w:fldChar w:fldCharType="end"/>
+      </w:r>
       <w:r>
         <w:br w:type="page"/>
       </w:r>
@@ -15699,6 +15717,300 @@
           </w:p>
         </w:tc>
       </w:tr>
+      <w:tr>
+        <w:tc>
+          <w:tcPr>
+            <w:tcW w:w="1696" w:type="dxa"/>
+          </w:tcPr>
+          <w:p>
+            <w:pPr>
+              <w:rPr>
+                <w:rFonts w:ascii="Times New Roman" w:hAnsi="Times New Roman" w:cs="Times New Roman"/>
+                <w:sz w:val="26"/>
+                <w:szCs w:val="26"/>
+              </w:rPr>
+            </w:pPr>
+            <w:r>
+              <w:rPr>
+                <w:rFonts w:ascii="Times New Roman" w:hAnsi="Times New Roman" w:cs="Times New Roman"/>
+                <w:sz w:val="26"/>
+                <w:szCs w:val="26"/>
+              </w:rPr>
+              <w:t>BR30</w:t>
+            </w:r>
+          </w:p>
+        </w:tc>
+        <w:tc>
+          <w:tcPr>
+            <w:tcW w:w="7365" w:type="dxa"/>
+          </w:tcPr>
+          <w:p>
+            <w:pPr>
+              <w:keepNext/>
+              <w:rPr>
+                <w:rFonts w:ascii="Times New Roman" w:hAnsi="Times New Roman" w:cs="Times New Roman"/>
+                <w:sz w:val="26"/>
+                <w:szCs w:val="26"/>
+              </w:rPr>
+            </w:pPr>
+            <w:r>
+              <w:rPr>
+                <w:rFonts w:ascii="Times New Roman" w:hAnsi="Times New Roman" w:cs="Times New Roman"/>
+                <w:sz w:val="26"/>
+                <w:szCs w:val="26"/>
+              </w:rPr>
+              <w:t xml:space="preserve">Sales chỉ được thao tác Activity thuộc Deal mình phụ trách; Customer Care chỉ được tạo Activity cho Deal mà mình có Task đang hoạt động. Task </w:t>
+            </w:r>
+            <w:r>
+              <w:rPr>
+                <w:rStyle w:val="HTMLCode"/>
+                <w:rFonts w:ascii="Times New Roman" w:eastAsiaTheme="minorHAnsi" w:hAnsi="Times New Roman" w:cs="Times New Roman"/>
+                <w:sz w:val="26"/>
+                <w:szCs w:val="26"/>
+              </w:rPr>
+              <w:t>Completed</w:t>
+            </w:r>
+            <w:r>
+              <w:rPr>
+                <w:rFonts w:ascii="Times New Roman" w:hAnsi="Times New Roman" w:cs="Times New Roman"/>
+                <w:sz w:val="26"/>
+                <w:szCs w:val="26"/>
+              </w:rPr>
+              <w:t xml:space="preserve"> hoặc </w:t>
+            </w:r>
+            <w:r>
+              <w:rPr>
+                <w:rStyle w:val="HTMLCode"/>
+                <w:rFonts w:ascii="Times New Roman" w:eastAsiaTheme="minorHAnsi" w:hAnsi="Times New Roman" w:cs="Times New Roman"/>
+                <w:sz w:val="26"/>
+                <w:szCs w:val="26"/>
+              </w:rPr>
+              <w:t>Cancelled</w:t>
+            </w:r>
+            <w:r>
+              <w:rPr>
+                <w:rFonts w:ascii="Times New Roman" w:hAnsi="Times New Roman" w:cs="Times New Roman"/>
+                <w:sz w:val="26"/>
+                <w:szCs w:val="26"/>
+              </w:rPr>
+              <w:t xml:space="preserve"> không được xem là Task đang hoạt động.</w:t>
+            </w:r>
+          </w:p>
+        </w:tc>
+      </w:tr>
+      <w:tr>
+        <w:tc>
+          <w:tcPr>
+            <w:tcW w:w="1696" w:type="dxa"/>
+          </w:tcPr>
+          <w:p>
+            <w:pPr>
+              <w:rPr>
+                <w:rFonts w:ascii="Times New Roman" w:hAnsi="Times New Roman" w:cs="Times New Roman"/>
+                <w:sz w:val="26"/>
+                <w:szCs w:val="26"/>
+              </w:rPr>
+            </w:pPr>
+            <w:r>
+              <w:rPr>
+                <w:rFonts w:ascii="Times New Roman" w:hAnsi="Times New Roman" w:cs="Times New Roman"/>
+                <w:sz w:val="26"/>
+                <w:szCs w:val="26"/>
+              </w:rPr>
+              <w:t>BR31</w:t>
+            </w:r>
+          </w:p>
+        </w:tc>
+        <w:tc>
+          <w:tcPr>
+            <w:tcW w:w="7365" w:type="dxa"/>
+          </w:tcPr>
+          <w:p>
+            <w:pPr>
+              <w:keepNext/>
+              <w:rPr>
+                <w:rFonts w:ascii="Times New Roman" w:hAnsi="Times New Roman" w:cs="Times New Roman"/>
+                <w:sz w:val="26"/>
+                <w:szCs w:val="26"/>
+              </w:rPr>
+            </w:pPr>
+            <w:r>
+              <w:rPr>
+                <w:rFonts w:ascii="Times New Roman" w:hAnsi="Times New Roman" w:cs="Times New Roman"/>
+                <w:sz w:val="26"/>
+                <w:szCs w:val="26"/>
+              </w:rPr>
+              <w:t xml:space="preserve">Activity mới được tạo ở trạng thái </w:t>
+            </w:r>
+            <w:r>
+              <w:rPr>
+                <w:rStyle w:val="HTMLCode"/>
+                <w:rFonts w:ascii="Times New Roman" w:eastAsiaTheme="minorHAnsi" w:hAnsi="Times New Roman" w:cs="Times New Roman"/>
+                <w:sz w:val="26"/>
+                <w:szCs w:val="26"/>
+              </w:rPr>
+              <w:t>Pending</w:t>
+            </w:r>
+            <w:r>
+              <w:rPr>
+                <w:rFonts w:ascii="Times New Roman" w:hAnsi="Times New Roman" w:cs="Times New Roman"/>
+                <w:sz w:val="26"/>
+                <w:szCs w:val="26"/>
+              </w:rPr>
+              <w:t xml:space="preserve">; khi cập nhật kết quả thì chuyển sang </w:t>
+            </w:r>
+            <w:r>
+              <w:rPr>
+                <w:rStyle w:val="HTMLCode"/>
+                <w:rFonts w:ascii="Times New Roman" w:eastAsiaTheme="minorHAnsi" w:hAnsi="Times New Roman" w:cs="Times New Roman"/>
+                <w:sz w:val="26"/>
+                <w:szCs w:val="26"/>
+              </w:rPr>
+              <w:t>Completed</w:t>
+            </w:r>
+            <w:r>
+              <w:rPr>
+                <w:rFonts w:ascii="Times New Roman" w:hAnsi="Times New Roman" w:cs="Times New Roman"/>
+                <w:sz w:val="26"/>
+                <w:szCs w:val="26"/>
+              </w:rPr>
+              <w:t xml:space="preserve">; khi hủy thì chuyển sang </w:t>
+            </w:r>
+            <w:r>
+              <w:rPr>
+                <w:rStyle w:val="HTMLCode"/>
+                <w:rFonts w:ascii="Times New Roman" w:eastAsiaTheme="minorHAnsi" w:hAnsi="Times New Roman" w:cs="Times New Roman"/>
+                <w:sz w:val="26"/>
+                <w:szCs w:val="26"/>
+              </w:rPr>
+              <w:t>Cancelled</w:t>
+            </w:r>
+            <w:r>
+              <w:rPr>
+                <w:rFonts w:ascii="Times New Roman" w:hAnsi="Times New Roman" w:cs="Times New Roman"/>
+                <w:sz w:val="26"/>
+                <w:szCs w:val="26"/>
+              </w:rPr>
+              <w:t xml:space="preserve">. Activity </w:t>
+            </w:r>
+            <w:r>
+              <w:rPr>
+                <w:rStyle w:val="HTMLCode"/>
+                <w:rFonts w:ascii="Times New Roman" w:eastAsiaTheme="minorHAnsi" w:hAnsi="Times New Roman" w:cs="Times New Roman"/>
+                <w:sz w:val="26"/>
+                <w:szCs w:val="26"/>
+              </w:rPr>
+              <w:t>Cancelled</w:t>
+            </w:r>
+            <w:r>
+              <w:rPr>
+                <w:rFonts w:ascii="Times New Roman" w:hAnsi="Times New Roman" w:cs="Times New Roman"/>
+                <w:sz w:val="26"/>
+                <w:szCs w:val="26"/>
+              </w:rPr>
+              <w:t xml:space="preserve"> không được cập nhật kết quả; Activity </w:t>
+            </w:r>
+            <w:r>
+              <w:rPr>
+                <w:rStyle w:val="HTMLCode"/>
+                <w:rFonts w:ascii="Times New Roman" w:eastAsiaTheme="minorHAnsi" w:hAnsi="Times New Roman" w:cs="Times New Roman"/>
+                <w:sz w:val="26"/>
+                <w:szCs w:val="26"/>
+              </w:rPr>
+              <w:t>Completed</w:t>
+            </w:r>
+            <w:r>
+              <w:rPr>
+                <w:rFonts w:ascii="Times New Roman" w:hAnsi="Times New Roman" w:cs="Times New Roman"/>
+                <w:sz w:val="26"/>
+                <w:szCs w:val="26"/>
+              </w:rPr>
+              <w:t xml:space="preserve"> không được hủy; Activity </w:t>
+            </w:r>
+            <w:r>
+              <w:rPr>
+                <w:rStyle w:val="HTMLCode"/>
+                <w:rFonts w:ascii="Times New Roman" w:eastAsiaTheme="minorHAnsi" w:hAnsi="Times New Roman" w:cs="Times New Roman"/>
+                <w:sz w:val="26"/>
+                <w:szCs w:val="26"/>
+              </w:rPr>
+              <w:t>Cancelled</w:t>
+            </w:r>
+            <w:r>
+              <w:rPr>
+                <w:rFonts w:ascii="Times New Roman" w:hAnsi="Times New Roman" w:cs="Times New Roman"/>
+                <w:sz w:val="26"/>
+                <w:szCs w:val="26"/>
+              </w:rPr>
+              <w:t xml:space="preserve"> không được hủy lại.</w:t>
+            </w:r>
+          </w:p>
+        </w:tc>
+      </w:tr>
+      <w:tr>
+        <w:tc>
+          <w:tcPr>
+            <w:tcW w:w="1696" w:type="dxa"/>
+          </w:tcPr>
+          <w:p>
+            <w:pPr>
+              <w:rPr>
+                <w:rFonts w:ascii="Times New Roman" w:hAnsi="Times New Roman" w:cs="Times New Roman"/>
+                <w:sz w:val="26"/>
+                <w:szCs w:val="26"/>
+              </w:rPr>
+            </w:pPr>
+            <w:r>
+              <w:rPr>
+                <w:rFonts w:ascii="Times New Roman" w:hAnsi="Times New Roman" w:cs="Times New Roman"/>
+                <w:sz w:val="26"/>
+                <w:szCs w:val="26"/>
+              </w:rPr>
+              <w:t>BR32</w:t>
+            </w:r>
+          </w:p>
+        </w:tc>
+        <w:tc>
+          <w:tcPr>
+            <w:tcW w:w="7365" w:type="dxa"/>
+          </w:tcPr>
+          <w:p>
+            <w:pPr>
+              <w:keepNext/>
+              <w:rPr>
+                <w:rFonts w:ascii="Times New Roman" w:hAnsi="Times New Roman" w:cs="Times New Roman"/>
+                <w:sz w:val="26"/>
+                <w:szCs w:val="26"/>
+              </w:rPr>
+            </w:pPr>
+            <w:r>
+              <w:rPr>
+                <w:rFonts w:ascii="Times New Roman" w:hAnsi="Times New Roman" w:cs="Times New Roman"/>
+                <w:sz w:val="26"/>
+                <w:szCs w:val="26"/>
+              </w:rPr>
+              <w:t xml:space="preserve">thao tác hủy Activity chỉ chuyển trạng thái sang </w:t>
+            </w:r>
+            <w:r>
+              <w:rPr>
+                <w:rStyle w:val="HTMLCode"/>
+                <w:rFonts w:ascii="Times New Roman" w:eastAsiaTheme="minorHAnsi" w:hAnsi="Times New Roman" w:cs="Times New Roman"/>
+                <w:sz w:val="26"/>
+                <w:szCs w:val="26"/>
+              </w:rPr>
+              <w:t>Cancelled</w:t>
+            </w:r>
+            <w:r>
+              <w:rPr>
+                <w:rFonts w:ascii="Times New Roman" w:hAnsi="Times New Roman" w:cs="Times New Roman"/>
+                <w:sz w:val="26"/>
+                <w:szCs w:val="26"/>
+              </w:rPr>
+              <w:t>, bản ghi vẫn được giữ lại để bảo toàn lịch sử chăm sóc khách hàng.</w:t>
+            </w:r>
+          </w:p>
+        </w:tc>
+      </w:tr>
     </w:tbl>
     <w:p>
       <w:pPr>
@@ -15977,6 +16289,7 @@
                 <w:sz w:val="26"/>
                 <w:szCs w:val="26"/>
               </w:rPr>
+              <w:lastRenderedPageBreak/>
               <w:t>Thuộc tính</w:t>
             </w:r>
           </w:p>
@@ -16299,7 +16612,6 @@
                 <w:sz w:val="26"/>
                 <w:szCs w:val="26"/>
               </w:rPr>
-              <w:lastRenderedPageBreak/>
               <w:t>Luồng chính</w:t>
             </w:r>
           </w:p>
@@ -17540,6 +17852,7 @@
                 <w:sz w:val="26"/>
                 <w:szCs w:val="26"/>
               </w:rPr>
+              <w:lastRenderedPageBreak/>
               <w:t>Actor</w:t>
             </w:r>
           </w:p>
@@ -17877,7 +18190,6 @@
                 <w:sz w:val="26"/>
                 <w:szCs w:val="26"/>
               </w:rPr>
-              <w:lastRenderedPageBreak/>
               <w:t>Hệ thống tạo ra một Customer mới</w:t>
             </w:r>
           </w:p>
@@ -17947,7 +18259,6 @@
                 <w:sz w:val="26"/>
                 <w:szCs w:val="26"/>
               </w:rPr>
-              <w:lastRenderedPageBreak/>
               <w:t>Luồng thay thế</w:t>
             </w:r>
           </w:p>
@@ -19073,6 +19384,7 @@
           <w:sz w:val="26"/>
           <w:szCs w:val="26"/>
         </w:rPr>
+        <w:lastRenderedPageBreak/>
         <w:t>UC5: Phân công Deal</w:t>
       </w:r>
     </w:p>
@@ -19491,7 +19803,6 @@
                 <w:sz w:val="26"/>
                 <w:szCs w:val="26"/>
               </w:rPr>
-              <w:lastRenderedPageBreak/>
               <w:t>Luồng chính</w:t>
             </w:r>
           </w:p>
@@ -20694,6 +21005,7 @@
                 <w:sz w:val="26"/>
                 <w:szCs w:val="26"/>
               </w:rPr>
+              <w:lastRenderedPageBreak/>
               <w:t>Mô tả</w:t>
             </w:r>
           </w:p>
@@ -21043,7 +21355,6 @@
                 <w:sz w:val="26"/>
                 <w:szCs w:val="26"/>
               </w:rPr>
-              <w:lastRenderedPageBreak/>
               <w:t>Chọn Deal cần báo giá</w:t>
             </w:r>
           </w:p>
@@ -21223,7 +21534,6 @@
                 <w:sz w:val="26"/>
                 <w:szCs w:val="26"/>
               </w:rPr>
-              <w:lastRenderedPageBreak/>
               <w:t>Luồng thay thế</w:t>
             </w:r>
           </w:p>
@@ -22062,6 +22372,7 @@
                 <w:sz w:val="26"/>
                 <w:szCs w:val="26"/>
               </w:rPr>
+              <w:lastRenderedPageBreak/>
               <w:t>Hệ thống lưu thông tin vào cơ sở dữ liệu</w:t>
             </w:r>
           </w:p>
@@ -22147,6 +22458,7 @@
                 <w:sz w:val="26"/>
                 <w:szCs w:val="26"/>
               </w:rPr>
+              <w:lastRenderedPageBreak/>
               <w:t>Luồng thay thế</w:t>
             </w:r>
           </w:p>
@@ -22360,7 +22672,6 @@
           <w:sz w:val="26"/>
           <w:szCs w:val="26"/>
         </w:rPr>
-        <w:lastRenderedPageBreak/>
         <w:t>UC9: Dashboard</w:t>
       </w:r>
     </w:p>
@@ -23561,6 +23872,7 @@
                 <w:sz w:val="26"/>
                 <w:szCs w:val="26"/>
               </w:rPr>
+              <w:lastRenderedPageBreak/>
               <w:t>Hệ thống hiển thị danh sách nhật ký</w:t>
             </w:r>
           </w:p>
@@ -23630,6 +23942,7 @@
                 <w:sz w:val="26"/>
                 <w:szCs w:val="26"/>
               </w:rPr>
+              <w:lastRenderedPageBreak/>
               <w:t>Luồng thay thế</w:t>
             </w:r>
           </w:p>
@@ -23837,7 +24150,6 @@
                 <w:sz w:val="26"/>
                 <w:szCs w:val="26"/>
               </w:rPr>
-              <w:lastRenderedPageBreak/>
               <w:t>Thuộc tính</w:t>
             </w:r>
           </w:p>
@@ -25092,6 +25404,7 @@
                 <w:sz w:val="26"/>
                 <w:szCs w:val="26"/>
               </w:rPr>
+              <w:lastRenderedPageBreak/>
               <w:t>Nhân viên nhấn lưu thông tin</w:t>
             </w:r>
           </w:p>
@@ -25160,6 +25473,7 @@
                 <w:sz w:val="26"/>
                 <w:szCs w:val="26"/>
               </w:rPr>
+              <w:lastRenderedPageBreak/>
               <w:t>Luồng thay thế</w:t>
             </w:r>
           </w:p>
@@ -25494,7 +25808,6 @@
                 <w:sz w:val="26"/>
                 <w:szCs w:val="26"/>
               </w:rPr>
-              <w:lastRenderedPageBreak/>
               <w:t>Mã Use Case</w:t>
             </w:r>
           </w:p>
@@ -26742,6 +27055,7 @@
                 <w:sz w:val="26"/>
                 <w:szCs w:val="26"/>
               </w:rPr>
+              <w:lastRenderedPageBreak/>
               <w:t>Admin nhấn lưu</w:t>
             </w:r>
           </w:p>
@@ -26788,6 +27102,7 @@
                 <w:sz w:val="26"/>
                 <w:szCs w:val="26"/>
               </w:rPr>
+              <w:lastRenderedPageBreak/>
               <w:t>Luồng thay thế</w:t>
             </w:r>
           </w:p>
@@ -27099,7 +27414,6 @@
                 <w:sz w:val="26"/>
                 <w:szCs w:val="26"/>
               </w:rPr>
-              <w:lastRenderedPageBreak/>
               <w:t>Thuộc tính</w:t>
             </w:r>
           </w:p>
@@ -27813,6 +28127,7 @@
         <w:rPr>
           <w:rFonts w:ascii="Times New Roman" w:hAnsi="Times New Roman" w:cs="Times New Roman"/>
         </w:rPr>
+        <w:lastRenderedPageBreak/>
         <w:t>ACTIVITY DIAGRAM</w:t>
       </w:r>
       <w:bookmarkEnd w:id="82"/>
@@ -27982,7 +28297,6 @@
         <w:rPr>
           <w:noProof/>
         </w:rPr>
-        <w:lastRenderedPageBreak/>
         <w:drawing>
           <wp:inline distT="0" distB="0" distL="0" distR="0" wp14:anchorId="32AD9F75" wp14:editId="098CD108">
             <wp:extent cx="5791835" cy="2533015"/>
@@ -28123,6 +28437,7 @@
           <w:sz w:val="26"/>
           <w:szCs w:val="26"/>
         </w:rPr>
+        <w:lastRenderedPageBreak/>
         <w:drawing>
           <wp:inline distT="0" distB="0" distL="0" distR="0" wp14:anchorId="624132DA" wp14:editId="2EAAEE01">
             <wp:extent cx="5791835" cy="2430145"/>
@@ -28271,7 +28586,6 @@
           <w:sz w:val="26"/>
           <w:szCs w:val="26"/>
         </w:rPr>
-        <w:lastRenderedPageBreak/>
         <w:drawing>
           <wp:inline distT="0" distB="0" distL="0" distR="0" wp14:anchorId="1BDB0F67" wp14:editId="07751B62">
             <wp:extent cx="5791835" cy="2178685"/>
@@ -28436,6 +28750,7 @@
           <w:sz w:val="26"/>
           <w:szCs w:val="26"/>
         </w:rPr>
+        <w:lastRenderedPageBreak/>
         <w:drawing>
           <wp:inline distT="0" distB="0" distL="0" distR="0" wp14:anchorId="1639577D" wp14:editId="62F22A0A">
             <wp:extent cx="5791835" cy="2414905"/>

</xml_diff>

<commit_message>
feat: thêm forecast cho Admin và Sales Manager
</commit_message>
<xml_diff>
--- a/docs/BaoCao/BaoCao.docx
+++ b/docs/BaoCao/BaoCao.docx
@@ -7535,42 +7535,8 @@
       <w:r>
         <w:fldChar w:fldCharType="end"/>
       </w:r>
-      <w:r>
-        <w:fldChar w:fldCharType="begin"/>
-      </w:r>
-      <w:r>
-        <w:instrText xml:space="preserve"> TOC \h \z \c "B</w:instrText>
-      </w:r>
-      <w:r>
-        <w:instrText>ả</w:instrText>
-      </w:r>
-      <w:r>
-        <w:instrText xml:space="preserve">ng" </w:instrText>
-      </w:r>
-      <w:r>
-        <w:fldChar w:fldCharType="separate"/>
-      </w:r>
-      <w:r>
-        <w:fldChar w:fldCharType="end"/>
-      </w:r>
-      <w:r>
-        <w:fldChar w:fldCharType="begin"/>
-      </w:r>
-      <w:r>
-        <w:instrText xml:space="preserve"> TOC \h \z \c "B</w:instrText>
-      </w:r>
-      <w:r>
-        <w:instrText>ả</w:instrText>
-      </w:r>
-      <w:r>
-        <w:instrText xml:space="preserve">ng" </w:instrText>
-      </w:r>
-      <w:r>
-        <w:fldChar w:fldCharType="separate"/>
-      </w:r>
-      <w:r>
-        <w:fldChar w:fldCharType="end"/>
-      </w:r>
+      <w:fldSimple w:instr=" TOC \h \z \c &quot;Bảng&quot; "/>
+      <w:fldSimple w:instr=" TOC \h \z \c &quot;Bảng&quot; "/>
       <w:r>
         <w:br w:type="page"/>
       </w:r>
@@ -14813,6 +14779,14 @@
               </w:rPr>
               <w:t>Deal ở trạng thái Won hoặc Lost thì không được chuyển đổi về các giai đoạn trước đó.</w:t>
             </w:r>
+            <w:r>
+              <w:rPr>
+                <w:rFonts w:ascii="Times New Roman" w:hAnsi="Times New Roman" w:cs="Times New Roman"/>
+                <w:sz w:val="26"/>
+                <w:szCs w:val="26"/>
+              </w:rPr>
+              <w:t xml:space="preserve"> Khi chuyển Deal sang trạng thái Lost, người dùng bắt buộc phải nhập lý do thất bại.</w:t>
+            </w:r>
           </w:p>
         </w:tc>
       </w:tr>
@@ -15500,6 +15474,7 @@
                 <w:sz w:val="26"/>
                 <w:szCs w:val="26"/>
               </w:rPr>
+              <w:lastRenderedPageBreak/>
               <w:t>BR25</w:t>
             </w:r>
           </w:p>
@@ -15547,7 +15522,6 @@
                 <w:sz w:val="26"/>
                 <w:szCs w:val="26"/>
               </w:rPr>
-              <w:lastRenderedPageBreak/>
               <w:t>BR26</w:t>
             </w:r>
           </w:p>
@@ -15989,7 +15963,15 @@
                 <w:sz w:val="26"/>
                 <w:szCs w:val="26"/>
               </w:rPr>
-              <w:t xml:space="preserve">thao tác hủy Activity chỉ chuyển trạng thái sang </w:t>
+              <w:t>Thao</w:t>
+            </w:r>
+            <w:r>
+              <w:rPr>
+                <w:rFonts w:ascii="Times New Roman" w:hAnsi="Times New Roman" w:cs="Times New Roman"/>
+                <w:sz w:val="26"/>
+                <w:szCs w:val="26"/>
+              </w:rPr>
+              <w:t xml:space="preserve"> tác hủy Activity chỉ chuyển trạng thái sang </w:t>
             </w:r>
             <w:r>
               <w:rPr>
@@ -16011,6 +15993,100 @@
           </w:p>
         </w:tc>
       </w:tr>
+      <w:tr>
+        <w:tc>
+          <w:tcPr>
+            <w:tcW w:w="1696" w:type="dxa"/>
+          </w:tcPr>
+          <w:p>
+            <w:pPr>
+              <w:rPr>
+                <w:rFonts w:ascii="Times New Roman" w:hAnsi="Times New Roman" w:cs="Times New Roman"/>
+                <w:sz w:val="26"/>
+                <w:szCs w:val="26"/>
+              </w:rPr>
+            </w:pPr>
+            <w:r>
+              <w:rPr>
+                <w:rFonts w:ascii="Times New Roman" w:hAnsi="Times New Roman" w:cs="Times New Roman"/>
+                <w:sz w:val="26"/>
+                <w:szCs w:val="26"/>
+              </w:rPr>
+              <w:t>BR33</w:t>
+            </w:r>
+          </w:p>
+        </w:tc>
+        <w:tc>
+          <w:tcPr>
+            <w:tcW w:w="7365" w:type="dxa"/>
+          </w:tcPr>
+          <w:p>
+            <w:pPr>
+              <w:keepNext/>
+              <w:rPr>
+                <w:rFonts w:ascii="Times New Roman" w:hAnsi="Times New Roman" w:cs="Times New Roman"/>
+                <w:sz w:val="26"/>
+                <w:szCs w:val="26"/>
+              </w:rPr>
+            </w:pPr>
+            <w:r>
+              <w:rPr>
+                <w:rFonts w:ascii="Times New Roman" w:hAnsi="Times New Roman" w:cs="Times New Roman"/>
+                <w:sz w:val="26"/>
+                <w:szCs w:val="26"/>
+              </w:rPr>
+              <w:t>Chỉ nhân viên Sales đang phụ trách Deal hoặc Sales Manager/Admin mới được phép thay đổi giai đoạn Pipeline hoặc đóng Deal ở trạng thái Won hoặc Lost.</w:t>
+            </w:r>
+          </w:p>
+        </w:tc>
+      </w:tr>
+      <w:tr>
+        <w:tc>
+          <w:tcPr>
+            <w:tcW w:w="1696" w:type="dxa"/>
+          </w:tcPr>
+          <w:p>
+            <w:pPr>
+              <w:rPr>
+                <w:rFonts w:ascii="Times New Roman" w:hAnsi="Times New Roman" w:cs="Times New Roman"/>
+                <w:sz w:val="26"/>
+                <w:szCs w:val="26"/>
+              </w:rPr>
+            </w:pPr>
+            <w:r>
+              <w:rPr>
+                <w:rFonts w:ascii="Times New Roman" w:hAnsi="Times New Roman" w:cs="Times New Roman"/>
+                <w:sz w:val="26"/>
+                <w:szCs w:val="26"/>
+              </w:rPr>
+              <w:t>BR34</w:t>
+            </w:r>
+          </w:p>
+        </w:tc>
+        <w:tc>
+          <w:tcPr>
+            <w:tcW w:w="7365" w:type="dxa"/>
+          </w:tcPr>
+          <w:p>
+            <w:pPr>
+              <w:keepNext/>
+              <w:rPr>
+                <w:rFonts w:ascii="Times New Roman" w:hAnsi="Times New Roman" w:cs="Times New Roman"/>
+                <w:sz w:val="26"/>
+                <w:szCs w:val="26"/>
+              </w:rPr>
+            </w:pPr>
+            <w:r>
+              <w:rPr>
+                <w:rFonts w:ascii="Times New Roman" w:hAnsi="Times New Roman" w:cs="Times New Roman"/>
+                <w:sz w:val="26"/>
+                <w:szCs w:val="26"/>
+              </w:rPr>
+              <w:t>Forecast tính bằng tổng Expected Revenue của tất cả Deal đang mở có Expected Close Date nằm trong khoảng thời gian mà Admin hoặc Sales Manager chọn. Deal ở trạng thái Won hoặc Lost không được tính vào.</w:t>
+            </w:r>
+          </w:p>
+        </w:tc>
+      </w:tr>
     </w:tbl>
     <w:p>
       <w:pPr>
@@ -16093,6 +16169,7 @@
         <w:rPr>
           <w:rFonts w:ascii="Times New Roman" w:hAnsi="Times New Roman" w:cs="Times New Roman"/>
         </w:rPr>
+        <w:lastRenderedPageBreak/>
         <w:t>USE-CASE DIAGRAM</w:t>
       </w:r>
       <w:bookmarkEnd w:id="60"/>
@@ -16289,7 +16366,6 @@
                 <w:sz w:val="26"/>
                 <w:szCs w:val="26"/>
               </w:rPr>
-              <w:lastRenderedPageBreak/>
               <w:t>Thuộc tính</w:t>
             </w:r>
           </w:p>
@@ -16895,6 +16971,7 @@
           <w:sz w:val="26"/>
           <w:szCs w:val="26"/>
         </w:rPr>
+        <w:lastRenderedPageBreak/>
         <w:t>UC2: Quản lý Lead</w:t>
       </w:r>
     </w:p>
@@ -17852,7 +17929,6 @@
                 <w:sz w:val="26"/>
                 <w:szCs w:val="26"/>
               </w:rPr>
-              <w:lastRenderedPageBreak/>
               <w:t>Actor</w:t>
             </w:r>
           </w:p>
@@ -18370,6 +18446,7 @@
                 <w:sz w:val="26"/>
                 <w:szCs w:val="26"/>
               </w:rPr>
+              <w:lastRenderedPageBreak/>
               <w:t xml:space="preserve">Chuyển đổi Customer thất bại </w:t>
             </w:r>
             <w:r>
@@ -18408,6 +18485,7 @@
           <w:sz w:val="26"/>
           <w:szCs w:val="26"/>
         </w:rPr>
+        <w:lastRenderedPageBreak/>
         <w:t xml:space="preserve">Bảng </w:t>
       </w:r>
       <w:r>
@@ -19384,7 +19462,6 @@
           <w:sz w:val="26"/>
           <w:szCs w:val="26"/>
         </w:rPr>
-        <w:lastRenderedPageBreak/>
         <w:t>UC5: Phân công Deal</w:t>
       </w:r>
     </w:p>
@@ -20064,6 +20141,7 @@
                 <w:sz w:val="26"/>
                 <w:szCs w:val="26"/>
               </w:rPr>
+              <w:lastRenderedPageBreak/>
               <w:t xml:space="preserve">Deal không tồn tại </w:t>
             </w:r>
             <w:r>
@@ -20102,6 +20180,7 @@
           <w:sz w:val="26"/>
           <w:szCs w:val="26"/>
         </w:rPr>
+        <w:lastRenderedPageBreak/>
         <w:t xml:space="preserve">Bảng </w:t>
       </w:r>
       <w:r>
@@ -21005,7 +21084,6 @@
                 <w:sz w:val="26"/>
                 <w:szCs w:val="26"/>
               </w:rPr>
-              <w:lastRenderedPageBreak/>
               <w:t>Mô tả</w:t>
             </w:r>
           </w:p>
@@ -21487,6 +21565,7 @@
                 <w:sz w:val="26"/>
                 <w:szCs w:val="26"/>
               </w:rPr>
+              <w:lastRenderedPageBreak/>
               <w:t>Hệ thống lưu từng sản phẩm vào QuoteDetails</w:t>
             </w:r>
           </w:p>
@@ -21534,6 +21613,7 @@
                 <w:sz w:val="26"/>
                 <w:szCs w:val="26"/>
               </w:rPr>
+              <w:lastRenderedPageBreak/>
               <w:t>Luồng thay thế</w:t>
             </w:r>
           </w:p>
@@ -22372,7 +22452,6 @@
                 <w:sz w:val="26"/>
                 <w:szCs w:val="26"/>
               </w:rPr>
-              <w:lastRenderedPageBreak/>
               <w:t>Hệ thống lưu thông tin vào cơ sở dữ liệu</w:t>
             </w:r>
           </w:p>
@@ -22458,7 +22537,6 @@
                 <w:sz w:val="26"/>
                 <w:szCs w:val="26"/>
               </w:rPr>
-              <w:lastRenderedPageBreak/>
               <w:t>Luồng thay thế</w:t>
             </w:r>
           </w:p>
@@ -22934,6 +23012,7 @@
                 <w:sz w:val="26"/>
                 <w:szCs w:val="26"/>
               </w:rPr>
+              <w:lastRenderedPageBreak/>
               <w:t>Hậu điều kiện</w:t>
             </w:r>
           </w:p>
@@ -22956,7 +23035,23 @@
                 <w:sz w:val="26"/>
                 <w:szCs w:val="26"/>
               </w:rPr>
-              <w:t>Các doanh thu, Pipiline, hiệu suất và Forecast được tổng hợp và hiển thị dựa vào quyền của người truy cập vào.</w:t>
+              <w:t xml:space="preserve">Các doanh thu, </w:t>
+            </w:r>
+            <w:r>
+              <w:rPr>
+                <w:rFonts w:ascii="Times New Roman" w:hAnsi="Times New Roman" w:cs="Times New Roman"/>
+                <w:sz w:val="26"/>
+                <w:szCs w:val="26"/>
+              </w:rPr>
+              <w:t>Pipeline</w:t>
+            </w:r>
+            <w:r>
+              <w:rPr>
+                <w:rFonts w:ascii="Times New Roman" w:hAnsi="Times New Roman" w:cs="Times New Roman"/>
+                <w:sz w:val="26"/>
+                <w:szCs w:val="26"/>
+              </w:rPr>
+              <w:t>, hiệu suất và Forecast được tổng hợp và hiển thị dựa vào quyền của người truy cập vào.</w:t>
             </w:r>
           </w:p>
         </w:tc>
@@ -23003,6 +23098,14 @@
                 <w:szCs w:val="26"/>
               </w:rPr>
               <w:t>BR02, BR09, BR19</w:t>
+            </w:r>
+            <w:r>
+              <w:rPr>
+                <w:rFonts w:ascii="Times New Roman" w:hAnsi="Times New Roman" w:cs="Times New Roman"/>
+                <w:sz w:val="26"/>
+                <w:szCs w:val="26"/>
+              </w:rPr>
+              <w:t>, BR34</w:t>
             </w:r>
           </w:p>
         </w:tc>
@@ -23119,7 +23222,23 @@
                 <w:sz w:val="26"/>
                 <w:szCs w:val="26"/>
               </w:rPr>
-              <w:t>Hệ thống thống kế số lượng Deal, Customer, Lead, doanh thu</w:t>
+              <w:t xml:space="preserve">Hệ thống thống </w:t>
+            </w:r>
+            <w:r>
+              <w:rPr>
+                <w:rFonts w:ascii="Times New Roman" w:hAnsi="Times New Roman" w:cs="Times New Roman"/>
+                <w:sz w:val="26"/>
+                <w:szCs w:val="26"/>
+              </w:rPr>
+              <w:t>kê</w:t>
+            </w:r>
+            <w:r>
+              <w:rPr>
+                <w:rFonts w:ascii="Times New Roman" w:hAnsi="Times New Roman" w:cs="Times New Roman"/>
+                <w:sz w:val="26"/>
+                <w:szCs w:val="26"/>
+              </w:rPr>
+              <w:t xml:space="preserve"> số lượng Deal, Customer, Lead, doanh thu</w:t>
             </w:r>
           </w:p>
           <w:p>
@@ -23142,6 +23261,28 @@
                 <w:szCs w:val="26"/>
               </w:rPr>
               <w:t xml:space="preserve">Hệ thống tính doanh thu kỳ vọng </w:t>
+            </w:r>
+          </w:p>
+          <w:p>
+            <w:pPr>
+              <w:pStyle w:val="ListParagraph"/>
+              <w:numPr>
+                <w:ilvl w:val="0"/>
+                <w:numId w:val="27"/>
+              </w:numPr>
+              <w:rPr>
+                <w:rFonts w:ascii="Times New Roman" w:hAnsi="Times New Roman" w:cs="Times New Roman"/>
+                <w:sz w:val="26"/>
+                <w:szCs w:val="26"/>
+              </w:rPr>
+            </w:pPr>
+            <w:r>
+              <w:rPr>
+                <w:rFonts w:ascii="Times New Roman" w:hAnsi="Times New Roman" w:cs="Times New Roman"/>
+                <w:sz w:val="26"/>
+                <w:szCs w:val="26"/>
+              </w:rPr>
+              <w:t>Admin hoặc Sales Manager chọn ngày bắt đầu và kết thúc cần dự báo</w:t>
             </w:r>
           </w:p>
           <w:p>
@@ -23338,6 +23479,44 @@
                 <w:szCs w:val="26"/>
               </w:rPr>
               <w:t>Không hiển thị biểu đồ hoặc hiển thị giá trị 0</w:t>
+            </w:r>
+          </w:p>
+          <w:p>
+            <w:pPr>
+              <w:pStyle w:val="ListParagraph"/>
+              <w:numPr>
+                <w:ilvl w:val="0"/>
+                <w:numId w:val="47"/>
+              </w:numPr>
+              <w:rPr>
+                <w:rFonts w:ascii="Times New Roman" w:hAnsi="Times New Roman" w:cs="Times New Roman"/>
+                <w:sz w:val="26"/>
+                <w:szCs w:val="26"/>
+              </w:rPr>
+            </w:pPr>
+            <w:r>
+              <w:rPr>
+                <w:rFonts w:ascii="Times New Roman" w:hAnsi="Times New Roman" w:cs="Times New Roman"/>
+                <w:sz w:val="26"/>
+                <w:szCs w:val="26"/>
+              </w:rPr>
+              <w:t xml:space="preserve">Ngày bắt đầu lớn hơn ngày kết thúc </w:t>
+            </w:r>
+            <w:r>
+              <w:rPr>
+                <w:rFonts w:ascii="Times New Roman" w:hAnsi="Times New Roman" w:cs="Times New Roman"/>
+                <w:sz w:val="26"/>
+                <w:szCs w:val="26"/>
+              </w:rPr>
+              <w:sym w:font="Wingdings" w:char="F0E0"/>
+            </w:r>
+            <w:r>
+              <w:rPr>
+                <w:rFonts w:ascii="Times New Roman" w:hAnsi="Times New Roman" w:cs="Times New Roman"/>
+                <w:sz w:val="26"/>
+                <w:szCs w:val="26"/>
+              </w:rPr>
+              <w:t xml:space="preserve"> Thông báo Ngày bắt đầu không được sau ngày kết thúc</w:t>
             </w:r>
           </w:p>
         </w:tc>
@@ -23872,7 +24051,6 @@
                 <w:sz w:val="26"/>
                 <w:szCs w:val="26"/>
               </w:rPr>
-              <w:lastRenderedPageBreak/>
               <w:t>Hệ thống hiển thị danh sách nhật ký</w:t>
             </w:r>
           </w:p>
@@ -23942,7 +24120,6 @@
                 <w:sz w:val="26"/>
                 <w:szCs w:val="26"/>
               </w:rPr>
-              <w:lastRenderedPageBreak/>
               <w:t>Luồng thay thế</w:t>
             </w:r>
           </w:p>
@@ -24296,6 +24473,7 @@
                 <w:sz w:val="26"/>
                 <w:szCs w:val="26"/>
               </w:rPr>
+              <w:lastRenderedPageBreak/>
               <w:t>Actor</w:t>
             </w:r>
           </w:p>
@@ -25404,7 +25582,6 @@
                 <w:sz w:val="26"/>
                 <w:szCs w:val="26"/>
               </w:rPr>
-              <w:lastRenderedPageBreak/>
               <w:t>Nhân viên nhấn lưu thông tin</w:t>
             </w:r>
           </w:p>
@@ -25473,7 +25650,6 @@
                 <w:sz w:val="26"/>
                 <w:szCs w:val="26"/>
               </w:rPr>
-              <w:lastRenderedPageBreak/>
               <w:t>Luồng thay thế</w:t>
             </w:r>
           </w:p>
@@ -25954,6 +26130,7 @@
                 <w:sz w:val="26"/>
                 <w:szCs w:val="26"/>
               </w:rPr>
+              <w:lastRenderedPageBreak/>
               <w:t>Tiền điều kiện</w:t>
             </w:r>
           </w:p>
@@ -27055,7 +27232,6 @@
                 <w:sz w:val="26"/>
                 <w:szCs w:val="26"/>
               </w:rPr>
-              <w:lastRenderedPageBreak/>
               <w:t>Admin nhấn lưu</w:t>
             </w:r>
           </w:p>
@@ -27102,7 +27278,6 @@
                 <w:sz w:val="26"/>
                 <w:szCs w:val="26"/>
               </w:rPr>
-              <w:lastRenderedPageBreak/>
               <w:t>Luồng thay thế</w:t>
             </w:r>
           </w:p>
@@ -27552,6 +27727,7 @@
                 <w:sz w:val="26"/>
                 <w:szCs w:val="26"/>
               </w:rPr>
+              <w:lastRenderedPageBreak/>
               <w:t>Actor</w:t>
             </w:r>
           </w:p>
@@ -28127,7 +28303,6 @@
         <w:rPr>
           <w:rFonts w:ascii="Times New Roman" w:hAnsi="Times New Roman" w:cs="Times New Roman"/>
         </w:rPr>
-        <w:lastRenderedPageBreak/>
         <w:t>ACTIVITY DIAGRAM</w:t>
       </w:r>
       <w:bookmarkEnd w:id="82"/>
@@ -28297,6 +28472,7 @@
         <w:rPr>
           <w:noProof/>
         </w:rPr>
+        <w:lastRenderedPageBreak/>
         <w:drawing>
           <wp:inline distT="0" distB="0" distL="0" distR="0" wp14:anchorId="32AD9F75" wp14:editId="098CD108">
             <wp:extent cx="5791835" cy="2533015"/>
@@ -28437,7 +28613,6 @@
           <w:sz w:val="26"/>
           <w:szCs w:val="26"/>
         </w:rPr>
-        <w:lastRenderedPageBreak/>
         <w:drawing>
           <wp:inline distT="0" distB="0" distL="0" distR="0" wp14:anchorId="624132DA" wp14:editId="2EAAEE01">
             <wp:extent cx="5791835" cy="2430145"/>
@@ -28586,6 +28761,7 @@
           <w:sz w:val="26"/>
           <w:szCs w:val="26"/>
         </w:rPr>
+        <w:lastRenderedPageBreak/>
         <w:drawing>
           <wp:inline distT="0" distB="0" distL="0" distR="0" wp14:anchorId="1BDB0F67" wp14:editId="07751B62">
             <wp:extent cx="5791835" cy="2178685"/>
@@ -28750,7 +28926,6 @@
           <w:sz w:val="26"/>
           <w:szCs w:val="26"/>
         </w:rPr>
-        <w:lastRenderedPageBreak/>
         <w:drawing>
           <wp:inline distT="0" distB="0" distL="0" distR="0" wp14:anchorId="1639577D" wp14:editId="62F22A0A">
             <wp:extent cx="5791835" cy="2414905"/>

</xml_diff>